<commit_message>
Corregido problema de visualización de imágenes.
Se añade el FileStorageService
</commit_message>
<xml_diff>
--- a/src/main/resources/static/docs/Memoria_aplicacion.docx
+++ b/src/main/resources/static/docs/Memoria_aplicacion.docx
@@ -1539,31 +1539,7 @@
           <w:szCs w:val="20"/>
           <w:shd w:val="clear" w:color="auto" w:fill="FFFFFF"/>
         </w:rPr>
-        <w:t>"*{</w:t>
-      </w:r>
-      <w:r>
-        <w:rPr>
-          <w:rFonts w:ascii="Consolas" w:hAnsi="Consolas"/>
-          <w:i/>
-          <w:iCs/>
-          <w:color w:val="2A00FF"/>
-          <w:sz w:val="20"/>
-          <w:szCs w:val="20"/>
-          <w:shd w:val="clear" w:color="auto" w:fill="FFFFFF"/>
-        </w:rPr>
-        <w:t>atributo1</w:t>
-      </w:r>
-      <w:r>
-        <w:rPr>
-          <w:rFonts w:ascii="Consolas" w:hAnsi="Consolas"/>
-          <w:i/>
-          <w:iCs/>
-          <w:color w:val="2A00FF"/>
-          <w:sz w:val="20"/>
-          <w:szCs w:val="20"/>
-          <w:shd w:val="clear" w:color="auto" w:fill="FFFFFF"/>
-        </w:rPr>
-        <w:t>}"</w:t>
+        <w:t>"*{atributo1}"</w:t>
       </w:r>
       <w:r>
         <w:rPr>
@@ -2854,34 +2830,16 @@
           <w:sz w:val="20"/>
           <w:szCs w:val="20"/>
         </w:rPr>
-        <w:t>model</w:t>
-      </w:r>
-      <w:r>
-        <w:rPr>
-          <w:rFonts w:ascii="Consolas" w:hAnsi="Consolas"/>
-          <w:color w:val="0000C0"/>
-          <w:sz w:val="20"/>
-          <w:szCs w:val="20"/>
-        </w:rPr>
-        <w:t>Service</w:t>
-      </w:r>
-      <w:r>
-        <w:rPr>
-          <w:rFonts w:ascii="Consolas" w:hAnsi="Consolas"/>
-          <w:color w:val="000000"/>
-          <w:sz w:val="20"/>
-          <w:szCs w:val="20"/>
-        </w:rPr>
-        <w:t>.</w:t>
-      </w:r>
-      <w:r>
-        <w:rPr>
-          <w:rFonts w:ascii="Consolas" w:hAnsi="Consolas"/>
-          <w:color w:val="000000"/>
-          <w:sz w:val="20"/>
-          <w:szCs w:val="20"/>
-        </w:rPr>
-        <w:t>grabaDatos(</w:t>
+        <w:t>modelService</w:t>
+      </w:r>
+      <w:r>
+        <w:rPr>
+          <w:rFonts w:ascii="Consolas" w:hAnsi="Consolas"/>
+          <w:color w:val="000000"/>
+          <w:sz w:val="20"/>
+          <w:szCs w:val="20"/>
+        </w:rPr>
+        <w:t>.grabaDatos(</w:t>
       </w:r>
       <w:r>
         <w:rPr>
@@ -3022,16 +2980,7 @@
           <w:sz w:val="20"/>
           <w:szCs w:val="20"/>
         </w:rPr>
-        <w:t xml:space="preserve">, </w:t>
-      </w:r>
-      <w:r>
-        <w:rPr>
-          <w:rFonts w:ascii="Consolas" w:hAnsi="Consolas"/>
-          <w:color w:val="000000"/>
-          <w:sz w:val="20"/>
-          <w:szCs w:val="20"/>
-        </w:rPr>
-        <w:t xml:space="preserve"> </w:t>
+        <w:t xml:space="preserve">,  </w:t>
       </w:r>
       <w:r>
         <w:rPr>
@@ -3040,25 +2989,7 @@
           <w:sz w:val="20"/>
           <w:szCs w:val="20"/>
         </w:rPr>
-        <w:t>"error.</w:t>
-      </w:r>
-      <w:r>
-        <w:rPr>
-          <w:rFonts w:ascii="Consolas" w:hAnsi="Consolas"/>
-          <w:color w:val="2A00FF"/>
-          <w:sz w:val="20"/>
-          <w:szCs w:val="20"/>
-        </w:rPr>
-        <w:t>en properties</w:t>
-      </w:r>
-      <w:r>
-        <w:rPr>
-          <w:rFonts w:ascii="Consolas" w:hAnsi="Consolas"/>
-          <w:color w:val="2A00FF"/>
-          <w:sz w:val="20"/>
-          <w:szCs w:val="20"/>
-        </w:rPr>
-        <w:t>"</w:t>
+        <w:t>"error.en properties"</w:t>
       </w:r>
       <w:r>
         <w:rPr>
@@ -3263,25 +3194,7 @@
           <w:sz w:val="20"/>
           <w:szCs w:val="20"/>
         </w:rPr>
-        <w:t>"error.</w:t>
-      </w:r>
-      <w:r>
-        <w:rPr>
-          <w:rFonts w:ascii="Consolas" w:hAnsi="Consolas"/>
-          <w:color w:val="2A00FF"/>
-          <w:sz w:val="20"/>
-          <w:szCs w:val="20"/>
-        </w:rPr>
-        <w:t>enproperties</w:t>
-      </w:r>
-      <w:r>
-        <w:rPr>
-          <w:rFonts w:ascii="Consolas" w:hAnsi="Consolas"/>
-          <w:color w:val="2A00FF"/>
-          <w:sz w:val="20"/>
-          <w:szCs w:val="20"/>
-        </w:rPr>
-        <w:t>"</w:t>
+        <w:t>"error.enproperties"</w:t>
       </w:r>
       <w:r>
         <w:rPr>
@@ -3429,7 +3342,207 @@
       </w:r>
     </w:p>
     <w:p/>
+    <w:p>
+      <w:r>
+        <w:t>FileStorageService</w:t>
+      </w:r>
+    </w:p>
+    <w:p>
+      <w:pPr>
+        <w:rPr>
+          <w:b/>
+          <w:bCs/>
+        </w:rPr>
+      </w:pPr>
+      <w:r>
+        <w:rPr>
+          <w:b/>
+          <w:bCs/>
+        </w:rPr>
+        <w:t>Descripción general del servicio</w:t>
+      </w:r>
+    </w:p>
+    <w:p>
+      <w:r>
+        <w:t xml:space="preserve">FileStorageService es un servicio encargado de gestionar el almacenamiento físico de archivos en el sistema de ficheros del servidor. Su responsabilidad principal es </w:t>
+      </w:r>
+      <w:r>
+        <w:rPr>
+          <w:b/>
+          <w:bCs/>
+        </w:rPr>
+        <w:t>guardar imágenes y documentos</w:t>
+      </w:r>
+      <w:r>
+        <w:t xml:space="preserve"> asociados a entidades </w:t>
+      </w:r>
+      <w:r>
+        <w:t xml:space="preserve">tales como </w:t>
+      </w:r>
+      <w:r>
+        <w:t xml:space="preserve"> </w:t>
+      </w:r>
+      <w:r>
+        <w:t>Curso o de EstudianteCuros</w:t>
+      </w:r>
+      <w:r>
+        <w:t>dominio, manteniendo una arquitectura desacoplada y fácilmente testeable.</w:t>
+      </w:r>
+    </w:p>
+    <w:p>
+      <w:r>
+        <w:t>Este servicio centraliza:</w:t>
+      </w:r>
+    </w:p>
+    <w:p>
+      <w:pPr>
+        <w:numPr>
+          <w:ilvl w:val="0"/>
+          <w:numId w:val="1"/>
+        </w:numPr>
+      </w:pPr>
+      <w:r>
+        <w:t>Creación automática de directorios externos</w:t>
+      </w:r>
+    </w:p>
+    <w:p>
+      <w:pPr>
+        <w:numPr>
+          <w:ilvl w:val="0"/>
+          <w:numId w:val="1"/>
+        </w:numPr>
+      </w:pPr>
+      <w:r>
+        <w:t>Generación de nombres únicos</w:t>
+      </w:r>
+    </w:p>
+    <w:p>
+      <w:pPr>
+        <w:numPr>
+          <w:ilvl w:val="0"/>
+          <w:numId w:val="1"/>
+        </w:numPr>
+      </w:pPr>
+      <w:r>
+        <w:t>Validación básica del archivo</w:t>
+      </w:r>
+    </w:p>
+    <w:p>
+      <w:pPr>
+        <w:numPr>
+          <w:ilvl w:val="0"/>
+          <w:numId w:val="1"/>
+        </w:numPr>
+      </w:pPr>
+      <w:r>
+        <w:t>Copia segura al sistema de ficheros</w:t>
+      </w:r>
+    </w:p>
+    <w:p>
+      <w:pPr>
+        <w:numPr>
+          <w:ilvl w:val="0"/>
+          <w:numId w:val="1"/>
+        </w:numPr>
+      </w:pPr>
+      <w:r>
+        <w:t>Devolución de la ruta o nombre final almacenado</w:t>
+      </w:r>
+    </w:p>
+    <w:p>
+      <w:r>
+        <w:t>El servicio utiliza las rutas configuradas en AppProperties, evitando valores hardcodeados y permitiendo despliegues portables.</w:t>
+      </w:r>
+    </w:p>
     <w:p/>
+    <w:p>
+      <w:pPr>
+        <w:rPr>
+          <w:b/>
+          <w:bCs/>
+        </w:rPr>
+      </w:pPr>
+      <w:r>
+        <w:rPr>
+          <w:b/>
+          <w:bCs/>
+        </w:rPr>
+        <w:t>AppProperties</w:t>
+      </w:r>
+    </w:p>
+    <w:p>
+      <w:r>
+        <w:t>Clase utilitaria para encapsular los valores del fichero</w:t>
+      </w:r>
+      <w:r>
+        <w:t xml:space="preserve"> </w:t>
+      </w:r>
+      <w:r>
+        <w:t xml:space="preserve"> de configuración application.properties</w:t>
+      </w:r>
+      <w:r>
+        <w:t>.</w:t>
+      </w:r>
+    </w:p>
+    <w:p>
+      <w:r>
+        <w:t>Nos permite injectar en las clases que lo necesiten los valores definidos en la configuración que podrá y normalmente lo es, diferente entre los diferentes entornos (loca/desarrollo, contenedores (Docker, etc) y Producción si fuera necesario.</w:t>
+      </w:r>
+    </w:p>
+    <w:p/>
+    <w:p>
+      <w:pPr>
+        <w:rPr>
+          <w:b/>
+          <w:bCs/>
+        </w:rPr>
+      </w:pPr>
+      <w:r>
+        <w:rPr>
+          <w:b/>
+          <w:bCs/>
+        </w:rPr>
+        <w:t>  Cambiar rutas sin tocar código</w:t>
+      </w:r>
+    </w:p>
+    <w:p>
+      <w:pPr>
+        <w:rPr>
+          <w:b/>
+          <w:bCs/>
+        </w:rPr>
+      </w:pPr>
+      <w:r>
+        <w:rPr>
+          <w:b/>
+          <w:bCs/>
+        </w:rPr>
+        <w:t>  Configurar rutas distintas por entorno (dev, prod)</w:t>
+      </w:r>
+    </w:p>
+    <w:p>
+      <w:pPr>
+        <w:rPr>
+          <w:b/>
+          <w:bCs/>
+        </w:rPr>
+      </w:pPr>
+      <w:r>
+        <w:rPr>
+          <w:b/>
+          <w:bCs/>
+        </w:rPr>
+        <w:t>  Mantener el código limpio y portable</w:t>
+      </w:r>
+    </w:p>
+    <w:p>
+      <w:pPr>
+        <w:rPr>
+          <w:b/>
+          <w:bCs/>
+        </w:rPr>
+      </w:pPr>
+    </w:p>
     <w:sectPr>
       <w:pgSz w:w="11906" w:h="16838"/>
       <w:pgMar w:top="1417" w:right="1701" w:bottom="1417" w:left="1701" w:header="708" w:footer="708" w:gutter="0"/>
@@ -3438,6 +3551,163 @@
     </w:sectPr>
   </w:body>
 </w:document>
+</file>
+
+<file path=word/numbering.xml><?xml version="1.0" encoding="utf-8"?>
+<w:numbering xmlns:wpc="http://schemas.microsoft.com/office/word/2010/wordprocessingCanvas" xmlns:cx="http://schemas.microsoft.com/office/drawing/2014/chartex" xmlns:cx1="http://schemas.microsoft.com/office/drawing/2015/9/8/chartex" xmlns:cx2="http://schemas.microsoft.com/office/drawing/2015/10/21/chartex" xmlns:cx3="http://schemas.microsoft.com/office/drawing/2016/5/9/chartex" xmlns:cx4="http://schemas.microsoft.com/office/drawing/2016/5/10/chartex" xmlns:cx5="http://schemas.microsoft.com/office/drawing/2016/5/11/chartex" xmlns:cx6="http://schemas.microsoft.com/office/drawing/2016/5/12/chartex" xmlns:cx7="http://schemas.microsoft.com/office/drawing/2016/5/13/chartex" xmlns:cx8="http://schemas.microsoft.com/office/drawing/2016/5/14/chartex" xmlns:mc="http://schemas.openxmlformats.org/markup-compatibility/2006" xmlns:aink="http://schemas.microsoft.com/office/drawing/2016/ink" xmlns:am3d="http://schemas.microsoft.com/office/drawing/2017/model3d" xmlns:o="urn:schemas-microsoft-com:office:office" xmlns:oel="http://schemas.microsoft.com/office/2019/extlst" xmlns:r="http://schemas.openxmlformats.org/officeDocument/2006/relationships" xmlns:m="http://schemas.openxmlformats.org/officeDocument/2006/math" xmlns:v="urn:schemas-microsoft-com:vml" xmlns:wp14="http://schemas.microsoft.com/office/word/2010/wordprocessingDrawing" xmlns:wp="http://schemas.openxmlformats.org/drawingml/2006/wordprocessingDrawing" xmlns:w10="urn:schemas-microsoft-com:office:word" xmlns:w="http://schemas.openxmlformats.org/wordprocessingml/2006/main" xmlns:w14="http://schemas.microsoft.com/office/word/2010/wordml" xmlns:w15="http://schemas.microsoft.com/office/word/2012/wordml" xmlns:w16cex="http://schemas.microsoft.com/office/word/2018/wordml/cex" xmlns:w16cid="http://schemas.microsoft.com/office/word/2016/wordml/cid" xmlns:w16="http://schemas.microsoft.com/office/word/2018/wordml" xmlns:w16du="http://schemas.microsoft.com/office/word/2023/wordml/word16du" xmlns:w16sdtdh="http://schemas.microsoft.com/office/word/2020/wordml/sdtdatahash" xmlns:w16sdtfl="http://schemas.microsoft.com/office/word/2024/wordml/sdtformatlock" xmlns:w16se="http://schemas.microsoft.com/office/word/2015/wordml/symex" xmlns:wpg="http://schemas.microsoft.com/office/word/2010/wordprocessingGroup" xmlns:wpi="http://schemas.microsoft.com/office/word/2010/wordprocessingInk" xmlns:wne="http://schemas.microsoft.com/office/word/2006/wordml" xmlns:wps="http://schemas.microsoft.com/office/word/2010/wordprocessingShape" mc:Ignorable="w14 w15 w16se w16cid w16 w16cex w16sdtdh w16sdtfl w16du wp14">
+  <w:abstractNum w:abstractNumId="0" w15:restartNumberingAfterBreak="0">
+    <w:nsid w:val="2AF817A6"/>
+    <w:multiLevelType w:val="multilevel"/>
+    <w:tmpl w:val="BE101650"/>
+    <w:lvl w:ilvl="0">
+      <w:start w:val="1"/>
+      <w:numFmt w:val="bullet"/>
+      <w:lvlText w:val=""/>
+      <w:lvlJc w:val="left"/>
+      <w:pPr>
+        <w:tabs>
+          <w:tab w:val="num" w:pos="720"/>
+        </w:tabs>
+        <w:ind w:left="720" w:hanging="360"/>
+      </w:pPr>
+      <w:rPr>
+        <w:rFonts w:ascii="Symbol" w:hAnsi="Symbol" w:hint="default"/>
+        <w:sz w:val="20"/>
+      </w:rPr>
+    </w:lvl>
+    <w:lvl w:ilvl="1" w:tentative="1">
+      <w:start w:val="1"/>
+      <w:numFmt w:val="bullet"/>
+      <w:lvlText w:val="o"/>
+      <w:lvlJc w:val="left"/>
+      <w:pPr>
+        <w:tabs>
+          <w:tab w:val="num" w:pos="1440"/>
+        </w:tabs>
+        <w:ind w:left="1440" w:hanging="360"/>
+      </w:pPr>
+      <w:rPr>
+        <w:rFonts w:ascii="Courier New" w:hAnsi="Courier New" w:hint="default"/>
+        <w:sz w:val="20"/>
+      </w:rPr>
+    </w:lvl>
+    <w:lvl w:ilvl="2" w:tentative="1">
+      <w:start w:val="1"/>
+      <w:numFmt w:val="bullet"/>
+      <w:lvlText w:val=""/>
+      <w:lvlJc w:val="left"/>
+      <w:pPr>
+        <w:tabs>
+          <w:tab w:val="num" w:pos="2160"/>
+        </w:tabs>
+        <w:ind w:left="2160" w:hanging="360"/>
+      </w:pPr>
+      <w:rPr>
+        <w:rFonts w:ascii="Wingdings" w:hAnsi="Wingdings" w:hint="default"/>
+        <w:sz w:val="20"/>
+      </w:rPr>
+    </w:lvl>
+    <w:lvl w:ilvl="3" w:tentative="1">
+      <w:start w:val="1"/>
+      <w:numFmt w:val="bullet"/>
+      <w:lvlText w:val=""/>
+      <w:lvlJc w:val="left"/>
+      <w:pPr>
+        <w:tabs>
+          <w:tab w:val="num" w:pos="2880"/>
+        </w:tabs>
+        <w:ind w:left="2880" w:hanging="360"/>
+      </w:pPr>
+      <w:rPr>
+        <w:rFonts w:ascii="Wingdings" w:hAnsi="Wingdings" w:hint="default"/>
+        <w:sz w:val="20"/>
+      </w:rPr>
+    </w:lvl>
+    <w:lvl w:ilvl="4" w:tentative="1">
+      <w:start w:val="1"/>
+      <w:numFmt w:val="bullet"/>
+      <w:lvlText w:val=""/>
+      <w:lvlJc w:val="left"/>
+      <w:pPr>
+        <w:tabs>
+          <w:tab w:val="num" w:pos="3600"/>
+        </w:tabs>
+        <w:ind w:left="3600" w:hanging="360"/>
+      </w:pPr>
+      <w:rPr>
+        <w:rFonts w:ascii="Wingdings" w:hAnsi="Wingdings" w:hint="default"/>
+        <w:sz w:val="20"/>
+      </w:rPr>
+    </w:lvl>
+    <w:lvl w:ilvl="5" w:tentative="1">
+      <w:start w:val="1"/>
+      <w:numFmt w:val="bullet"/>
+      <w:lvlText w:val=""/>
+      <w:lvlJc w:val="left"/>
+      <w:pPr>
+        <w:tabs>
+          <w:tab w:val="num" w:pos="4320"/>
+        </w:tabs>
+        <w:ind w:left="4320" w:hanging="360"/>
+      </w:pPr>
+      <w:rPr>
+        <w:rFonts w:ascii="Wingdings" w:hAnsi="Wingdings" w:hint="default"/>
+        <w:sz w:val="20"/>
+      </w:rPr>
+    </w:lvl>
+    <w:lvl w:ilvl="6" w:tentative="1">
+      <w:start w:val="1"/>
+      <w:numFmt w:val="bullet"/>
+      <w:lvlText w:val=""/>
+      <w:lvlJc w:val="left"/>
+      <w:pPr>
+        <w:tabs>
+          <w:tab w:val="num" w:pos="5040"/>
+        </w:tabs>
+        <w:ind w:left="5040" w:hanging="360"/>
+      </w:pPr>
+      <w:rPr>
+        <w:rFonts w:ascii="Wingdings" w:hAnsi="Wingdings" w:hint="default"/>
+        <w:sz w:val="20"/>
+      </w:rPr>
+    </w:lvl>
+    <w:lvl w:ilvl="7" w:tentative="1">
+      <w:start w:val="1"/>
+      <w:numFmt w:val="bullet"/>
+      <w:lvlText w:val=""/>
+      <w:lvlJc w:val="left"/>
+      <w:pPr>
+        <w:tabs>
+          <w:tab w:val="num" w:pos="5760"/>
+        </w:tabs>
+        <w:ind w:left="5760" w:hanging="360"/>
+      </w:pPr>
+      <w:rPr>
+        <w:rFonts w:ascii="Wingdings" w:hAnsi="Wingdings" w:hint="default"/>
+        <w:sz w:val="20"/>
+      </w:rPr>
+    </w:lvl>
+    <w:lvl w:ilvl="8" w:tentative="1">
+      <w:start w:val="1"/>
+      <w:numFmt w:val="bullet"/>
+      <w:lvlText w:val=""/>
+      <w:lvlJc w:val="left"/>
+      <w:pPr>
+        <w:tabs>
+          <w:tab w:val="num" w:pos="6480"/>
+        </w:tabs>
+        <w:ind w:left="6480" w:hanging="360"/>
+      </w:pPr>
+      <w:rPr>
+        <w:rFonts w:ascii="Wingdings" w:hAnsi="Wingdings" w:hint="default"/>
+        <w:sz w:val="20"/>
+      </w:rPr>
+    </w:lvl>
+  </w:abstractNum>
+  <w:num w:numId="1" w16cid:durableId="611132744">
+    <w:abstractNumId w:val="0"/>
+  </w:num>
+</w:numbering>
 </file>
 
 <file path=word/styles.xml><?xml version="1.0" encoding="utf-8"?>

</xml_diff>

<commit_message>
Se reconfigura el @GlobalAdvice
Se genera uno nuevo para lo  @ModelAttributes
Se deja el de excepciones sólo para eso.

Prototipo de paginador lateral para la Home.
</commit_message>
<xml_diff>
--- a/src/main/resources/static/docs/Memoria_aplicacion.docx
+++ b/src/main/resources/static/docs/Memoria_aplicacion.docx
@@ -1,6 +1,6 @@
 
 <file path=word/document.xml><?xml version="1.0" encoding="utf-8"?>
-<w:document xmlns:wpc="http://schemas.microsoft.com/office/word/2010/wordprocessingCanvas" xmlns:cx="http://schemas.microsoft.com/office/drawing/2014/chartex" xmlns:cx1="http://schemas.microsoft.com/office/drawing/2015/9/8/chartex" xmlns:cx2="http://schemas.microsoft.com/office/drawing/2015/10/21/chartex" xmlns:cx3="http://schemas.microsoft.com/office/drawing/2016/5/9/chartex" xmlns:cx4="http://schemas.microsoft.com/office/drawing/2016/5/10/chartex" xmlns:cx5="http://schemas.microsoft.com/office/drawing/2016/5/11/chartex" xmlns:cx6="http://schemas.microsoft.com/office/drawing/2016/5/12/chartex" xmlns:cx7="http://schemas.microsoft.com/office/drawing/2016/5/13/chartex" xmlns:cx8="http://schemas.microsoft.com/office/drawing/2016/5/14/chartex" xmlns:mc="http://schemas.openxmlformats.org/markup-compatibility/2006" xmlns:aink="http://schemas.microsoft.com/office/drawing/2016/ink" xmlns:am3d="http://schemas.microsoft.com/office/drawing/2017/model3d" xmlns:o="urn:schemas-microsoft-com:office:office" xmlns:oel="http://schemas.microsoft.com/office/2019/extlst" xmlns:r="http://schemas.openxmlformats.org/officeDocument/2006/relationships" xmlns:m="http://schemas.openxmlformats.org/officeDocument/2006/math" xmlns:v="urn:schemas-microsoft-com:vml" xmlns:wp14="http://schemas.microsoft.com/office/word/2010/wordprocessingDrawing" xmlns:wp="http://schemas.openxmlformats.org/drawingml/2006/wordprocessingDrawing" xmlns:w10="urn:schemas-microsoft-com:office:word" xmlns:w="http://schemas.openxmlformats.org/wordprocessingml/2006/main" xmlns:w14="http://schemas.microsoft.com/office/word/2010/wordml" xmlns:w15="http://schemas.microsoft.com/office/word/2012/wordml" xmlns:w16cex="http://schemas.microsoft.com/office/word/2018/wordml/cex" xmlns:w16cid="http://schemas.microsoft.com/office/word/2016/wordml/cid" xmlns:w16="http://schemas.microsoft.com/office/word/2018/wordml" xmlns:w16du="http://schemas.microsoft.com/office/word/2023/wordml/word16du" xmlns:w16sdtdh="http://schemas.microsoft.com/office/word/2020/wordml/sdtdatahash" xmlns:w16sdtfl="http://schemas.microsoft.com/office/word/2024/wordml/sdtformatlock" xmlns:w16se="http://schemas.microsoft.com/office/word/2015/wordml/symex" xmlns:wpg="http://schemas.microsoft.com/office/word/2010/wordprocessingGroup" xmlns:wpi="http://schemas.microsoft.com/office/word/2010/wordprocessingInk" xmlns:wne="http://schemas.microsoft.com/office/word/2006/wordml" xmlns:wps="http://schemas.microsoft.com/office/word/2010/wordprocessingShape" mc:Ignorable="w14 w15 w16se w16cid w16 w16cex w16sdtdh w16sdtfl w16du wp14">
+<w:document xmlns:wpc="http://schemas.microsoft.com/office/word/2010/wordprocessingCanvas" xmlns:cx="http://schemas.microsoft.com/office/drawing/2014/chartex" xmlns:cx1="http://schemas.microsoft.com/office/drawing/2015/9/8/chartex" xmlns:cx2="http://schemas.microsoft.com/office/drawing/2015/10/21/chartex" xmlns:cx3="http://schemas.microsoft.com/office/drawing/2016/5/9/chartex" xmlns:cx4="http://schemas.microsoft.com/office/drawing/2016/5/10/chartex" xmlns:cx5="http://schemas.microsoft.com/office/drawing/2016/5/11/chartex" xmlns:cx6="http://schemas.microsoft.com/office/drawing/2016/5/12/chartex" xmlns:cx7="http://schemas.microsoft.com/office/drawing/2016/5/13/chartex" xmlns:cx8="http://schemas.microsoft.com/office/drawing/2016/5/14/chartex" xmlns:mc="http://schemas.openxmlformats.org/markup-compatibility/2006" xmlns:aink="http://schemas.microsoft.com/office/drawing/2016/ink" xmlns:am3d="http://schemas.microsoft.com/office/drawing/2017/model3d" xmlns:o="urn:schemas-microsoft-com:office:office" xmlns:r="http://schemas.openxmlformats.org/officeDocument/2006/relationships" xmlns:m="http://schemas.openxmlformats.org/officeDocument/2006/math" xmlns:v="urn:schemas-microsoft-com:vml" xmlns:wp14="http://schemas.microsoft.com/office/word/2010/wordprocessingDrawing" xmlns:wp="http://schemas.openxmlformats.org/drawingml/2006/wordprocessingDrawing" xmlns:w10="urn:schemas-microsoft-com:office:word" xmlns:w="http://schemas.openxmlformats.org/wordprocessingml/2006/main" xmlns:w14="http://schemas.microsoft.com/office/word/2010/wordml" xmlns:w15="http://schemas.microsoft.com/office/word/2012/wordml" xmlns:w16cex="http://schemas.microsoft.com/office/word/2018/wordml/cex" xmlns:w16cid="http://schemas.microsoft.com/office/word/2016/wordml/cid" xmlns:w16="http://schemas.microsoft.com/office/word/2018/wordml" xmlns:w16sdtdh="http://schemas.microsoft.com/office/word/2020/wordml/sdtdatahash" xmlns:w16se="http://schemas.microsoft.com/office/word/2015/wordml/symex" xmlns:wpg="http://schemas.microsoft.com/office/word/2010/wordprocessingGroup" xmlns:wpi="http://schemas.microsoft.com/office/word/2010/wordprocessingInk" xmlns:wne="http://schemas.microsoft.com/office/word/2006/wordml" xmlns:wps="http://schemas.microsoft.com/office/word/2010/wordprocessingShape" mc:Ignorable="w14 w15 w16se w16cid w16 w16cex w16sdtdh wp14">
   <w:body>
     <w:p>
       <w:r>
@@ -349,17 +349,22 @@
     <w:p/>
     <w:p>
       <w:r>
-        <w:t>Excepciones:</w:t>
-      </w:r>
-    </w:p>
-    <w:p>
-      <w:r>
+        <w:t>Validación de datos y excepciones</w:t>
+      </w:r>
+    </w:p>
+    <w:p>
+      <w:r>
+        <w:t>Se implementa la validación de datos en las vis</w:t>
+      </w:r>
+    </w:p>
+    <w:p>
+      <w:r>
+        <w:lastRenderedPageBreak/>
         <w:t>Errores en vistas</w:t>
       </w:r>
     </w:p>
     <w:p>
       <w:r>
-        <w:lastRenderedPageBreak/>
         <w:t>Errores específicos</w:t>
       </w:r>
     </w:p>
@@ -939,19 +944,167 @@
     </w:p>
     <w:p>
       <w:pPr>
-        <w:rPr>
-          <w:b/>
-          <w:bCs/>
-        </w:rPr>
-      </w:pPr>
+        <w:ind w:left="709"/>
+        <w:rPr>
+          <w:b/>
+          <w:bCs/>
+        </w:rPr>
+      </w:pPr>
+      <w:r>
+        <w:t xml:space="preserve">En las clases editables en los formularios </w:t>
+      </w:r>
+      <w:r>
+        <w:t xml:space="preserve">DTO, </w:t>
+      </w:r>
+      <w:r>
+        <w:t xml:space="preserve">se generan validaciones </w:t>
+      </w:r>
+      <w:r>
+        <w:t>a nivel de campo/atributo</w:t>
+      </w:r>
+      <w:r>
+        <w:t xml:space="preserve"> mediante anotaciones “</w:t>
+      </w:r>
+      <w:r>
+        <w:t>jakarta.validation.constraints</w:t>
+      </w:r>
+      <w:r>
+        <w:t>”</w:t>
+      </w:r>
+      <w:r>
+        <w:t>, del paquete “jakarta.validation.api”</w:t>
+      </w:r>
+      <w:r>
+        <w:t xml:space="preserve"> que incorporan las más utilizadas</w:t>
+      </w:r>
+      <w:r>
+        <w:t>.</w:t>
+      </w:r>
+    </w:p>
+    <w:p>
       <w:r>
         <w:rPr>
           <w:b/>
           <w:bCs/>
         </w:rPr>
         <w:tab/>
-        <w:t xml:space="preserve">En las clases editables en los formularios se generan validaciones </w:t>
-      </w:r>
+        <w:t>@NotBlank</w:t>
+      </w:r>
+      <w:r>
+        <w:t xml:space="preserve"> Para campos String, controla si es nulo o sólo espacios en blanco.</w:t>
+      </w:r>
+    </w:p>
+    <w:p>
+      <w:r>
+        <w:tab/>
+      </w:r>
+      <w:r>
+        <w:rPr>
+          <w:b/>
+          <w:bCs/>
+        </w:rPr>
+        <w:t>@NotNull</w:t>
+      </w:r>
+      <w:r>
+        <w:t xml:space="preserve">    Para campos numéricos y de fecha.</w:t>
+      </w:r>
+    </w:p>
+    <w:p>
+      <w:r>
+        <w:tab/>
+      </w:r>
+      <w:r>
+        <w:rPr>
+          <w:b/>
+          <w:bCs/>
+        </w:rPr>
+        <w:t>@Size</w:t>
+      </w:r>
+      <w:r>
+        <w:tab/>
+        <w:t>Tamaño, mínimo ó máximo.</w:t>
+      </w:r>
+    </w:p>
+    <w:p>
+      <w:pPr>
+        <w:ind w:firstLine="708"/>
+      </w:pPr>
+      <w:r>
+        <w:rPr>
+          <w:b/>
+          <w:bCs/>
+        </w:rPr>
+        <w:t>@Email</w:t>
+      </w:r>
+      <w:r>
+        <w:rPr>
+          <w:rFonts w:ascii="Consolas" w:hAnsi="Consolas"/>
+          <w:color w:val="646464"/>
+          <w:shd w:val="clear" w:color="auto" w:fill="FFFFFF"/>
+        </w:rPr>
+        <w:t xml:space="preserve"> </w:t>
+      </w:r>
+      <w:r>
+        <w:t>Comprueba si el formato es un correo electrónico.</w:t>
+      </w:r>
+    </w:p>
+    <w:p>
+      <w:pPr>
+        <w:ind w:firstLine="708"/>
+      </w:pPr>
+      <w:r>
+        <w:rPr>
+          <w:b/>
+          <w:bCs/>
+        </w:rPr>
+        <w:t>@Positive</w:t>
+      </w:r>
+      <w:r>
+        <w:t xml:space="preserve"> Número positivo</w:t>
+      </w:r>
+    </w:p>
+    <w:p>
+      <w:pPr>
+        <w:ind w:firstLine="708"/>
+      </w:pPr>
+      <w:r>
+        <w:rPr>
+          <w:b/>
+          <w:bCs/>
+        </w:rPr>
+        <w:lastRenderedPageBreak/>
+        <w:t>@</w:t>
+      </w:r>
+      <w:r>
+        <w:rPr>
+          <w:b/>
+          <w:bCs/>
+        </w:rPr>
+        <w:t>PositivoOrZero</w:t>
+      </w:r>
+      <w:r>
+        <w:t xml:space="preserve"> Positivo ó cero.</w:t>
+      </w:r>
+    </w:p>
+    <w:p>
+      <w:pPr>
+        <w:ind w:firstLine="708"/>
+      </w:pPr>
+      <w:r>
+        <w:rPr>
+          <w:b/>
+          <w:bCs/>
+        </w:rPr>
+        <w:t>@FutureOrPresent</w:t>
+      </w:r>
+      <w:r>
+        <w:t xml:space="preserve"> Para fechas, que el valor sea mayor o igual al día de hoy.</w:t>
+      </w:r>
+    </w:p>
+    <w:p>
+      <w:pPr>
+        <w:ind w:firstLine="708"/>
+      </w:pPr>
     </w:p>
     <w:p>
       <w:pPr>
@@ -1222,7 +1375,17 @@
           <w:szCs w:val="18"/>
           <w:u w:val="single"/>
         </w:rPr>
-        <w:t>NotBlank</w:t>
+        <w:t>Not</w:t>
+      </w:r>
+      <w:r>
+        <w:rPr>
+          <w:rFonts w:ascii="Consolas" w:hAnsi="Consolas"/>
+          <w:color w:val="000000"/>
+          <w:sz w:val="18"/>
+          <w:szCs w:val="18"/>
+          <w:u w:val="single"/>
+        </w:rPr>
+        <w:t>Null</w:t>
       </w:r>
       <w:r>
         <w:rPr>
@@ -1310,7 +1473,25 @@
           <w:sz w:val="18"/>
           <w:szCs w:val="18"/>
         </w:rPr>
-        <w:t xml:space="preserve"> String </w:t>
+        <w:t xml:space="preserve"> </w:t>
+      </w:r>
+      <w:r>
+        <w:rPr>
+          <w:rFonts w:ascii="Consolas" w:hAnsi="Consolas"/>
+          <w:color w:val="000000"/>
+          <w:sz w:val="18"/>
+          <w:szCs w:val="18"/>
+        </w:rPr>
+        <w:t>Integer</w:t>
+      </w:r>
+      <w:r>
+        <w:rPr>
+          <w:rFonts w:ascii="Consolas" w:hAnsi="Consolas"/>
+          <w:color w:val="000000"/>
+          <w:sz w:val="18"/>
+          <w:szCs w:val="18"/>
+        </w:rPr>
+        <w:t xml:space="preserve"> </w:t>
       </w:r>
       <w:r>
         <w:rPr>
@@ -1375,7 +1556,16 @@
           <w:sz w:val="18"/>
           <w:szCs w:val="18"/>
         </w:rPr>
-        <w:t>// getters y setters</w:t>
+        <w:t xml:space="preserve">// </w:t>
+      </w:r>
+      <w:r>
+        <w:rPr>
+          <w:rFonts w:ascii="Consolas" w:hAnsi="Consolas"/>
+          <w:color w:val="3F7F5F"/>
+          <w:sz w:val="18"/>
+          <w:szCs w:val="18"/>
+        </w:rPr>
+        <w:t>Resto de código</w:t>
       </w:r>
     </w:p>
     <w:p>
@@ -1403,6 +1593,39 @@
     </w:p>
     <w:p>
       <w:pPr>
+        <w:ind w:firstLine="708"/>
+      </w:pPr>
+    </w:p>
+    <w:p>
+      <w:pPr>
+        <w:ind w:firstLine="708"/>
+      </w:pPr>
+      <w:r>
+        <w:t>Esta implementación nos facilita las comprobaciones y los valores condicionales en nuestro código, permitiéndonos definir nuestro mensaje mediante claves de mensajes que incluiremos en los ficheros de “internacionalización (i18n)</w:t>
+      </w:r>
+      <w:r>
+        <w:t xml:space="preserve"> definidos. Sólo</w:t>
+      </w:r>
+      <w:r>
+        <w:t xml:space="preserve"> algunos valores “no anotados” </w:t>
+      </w:r>
+      <w:r>
+        <w:t>deberán comprobarse en nuestro código (normalmente en el “Controller”), de forma m</w:t>
+      </w:r>
+      <w:r>
+        <w:t>anual.</w:t>
+      </w:r>
+    </w:p>
+    <w:p>
+      <w:pPr>
+        <w:ind w:firstLine="708"/>
+      </w:pPr>
+      <w:r>
+        <w:t>La validación se realiza mediante dos mecanismos:</w:t>
+      </w:r>
+    </w:p>
+    <w:p>
+      <w:pPr>
         <w:pStyle w:val="NormalWeb"/>
         <w:shd w:val="clear" w:color="auto" w:fill="FFFFFF"/>
         <w:spacing w:before="0" w:beforeAutospacing="0" w:after="0" w:afterAutospacing="0"/>
@@ -1410,17 +1633,24 @@
         <w:rPr>
           <w:rFonts w:ascii="Consolas" w:hAnsi="Consolas"/>
           <w:color w:val="000000"/>
-          <w:sz w:val="28"/>
-          <w:szCs w:val="28"/>
-        </w:rPr>
-      </w:pPr>
-    </w:p>
-    <w:p>
-      <w:pPr>
-        <w:ind w:left="709"/>
-      </w:pPr>
-      <w:r>
-        <w:t>Que nos devuelven los mensajes a la vista, cada mensaje se identifica con el nombre del campo, en la vista si, existen errores se muestran de la forma:</w:t>
+          <w:u w:val="single"/>
+        </w:rPr>
+      </w:pPr>
+      <w:r>
+        <w:rPr>
+          <w:rFonts w:ascii="Consolas" w:hAnsi="Consolas"/>
+          <w:color w:val="000000"/>
+          <w:u w:val="single"/>
+        </w:rPr>
+        <w:t>Jakarta.validation.valid</w:t>
+      </w:r>
+    </w:p>
+    <w:p>
+      <w:pPr>
+        <w:ind w:firstLine="708"/>
+      </w:pPr>
+      <w:r>
+        <w:t>Se anota el atributo del DTO que llega desde el formulario como @Valid</w:t>
       </w:r>
     </w:p>
     <w:p>
@@ -1432,6 +1662,1972 @@
         <w:rPr>
           <w:rFonts w:ascii="Consolas" w:hAnsi="Consolas"/>
           <w:color w:val="000000"/>
+          <w:sz w:val="18"/>
+          <w:szCs w:val="18"/>
+        </w:rPr>
+      </w:pPr>
+      <w:r>
+        <w:rPr>
+          <w:rFonts w:ascii="Consolas" w:hAnsi="Consolas"/>
+          <w:color w:val="646464"/>
+          <w:sz w:val="18"/>
+          <w:szCs w:val="18"/>
+        </w:rPr>
+        <w:t>@PostMapping</w:t>
+      </w:r>
+      <w:r>
+        <w:rPr>
+          <w:rFonts w:ascii="Consolas" w:hAnsi="Consolas"/>
+          <w:color w:val="000000"/>
+          <w:sz w:val="18"/>
+          <w:szCs w:val="18"/>
+        </w:rPr>
+        <w:t>(</w:t>
+      </w:r>
+      <w:r>
+        <w:rPr>
+          <w:rFonts w:ascii="Consolas" w:hAnsi="Consolas"/>
+          <w:color w:val="2A00FF"/>
+          <w:sz w:val="18"/>
+          <w:szCs w:val="18"/>
+        </w:rPr>
+        <w:t>"/</w:t>
+      </w:r>
+      <w:r>
+        <w:rPr>
+          <w:rFonts w:ascii="Consolas" w:hAnsi="Consolas"/>
+          <w:color w:val="2A00FF"/>
+          <w:sz w:val="18"/>
+          <w:szCs w:val="18"/>
+        </w:rPr>
+        <w:t>accion</w:t>
+      </w:r>
+      <w:r>
+        <w:rPr>
+          <w:rFonts w:ascii="Consolas" w:hAnsi="Consolas"/>
+          <w:color w:val="2A00FF"/>
+          <w:sz w:val="18"/>
+          <w:szCs w:val="18"/>
+        </w:rPr>
+        <w:t>"</w:t>
+      </w:r>
+      <w:r>
+        <w:rPr>
+          <w:rFonts w:ascii="Consolas" w:hAnsi="Consolas"/>
+          <w:color w:val="000000"/>
+          <w:sz w:val="18"/>
+          <w:szCs w:val="18"/>
+        </w:rPr>
+        <w:t>)</w:t>
+      </w:r>
+    </w:p>
+    <w:p>
+      <w:pPr>
+        <w:pStyle w:val="NormalWeb"/>
+        <w:shd w:val="clear" w:color="auto" w:fill="FFFFFF"/>
+        <w:spacing w:before="0" w:beforeAutospacing="0" w:after="0" w:afterAutospacing="0"/>
+        <w:rPr>
+          <w:rFonts w:ascii="Consolas" w:hAnsi="Consolas"/>
+          <w:color w:val="000000"/>
+          <w:sz w:val="18"/>
+          <w:szCs w:val="18"/>
+        </w:rPr>
+      </w:pPr>
+      <w:r>
+        <w:rPr>
+          <w:rFonts w:ascii="Consolas" w:hAnsi="Consolas"/>
+          <w:color w:val="000000"/>
+          <w:sz w:val="18"/>
+          <w:szCs w:val="18"/>
+        </w:rPr>
+        <w:tab/>
+      </w:r>
+      <w:r>
+        <w:rPr>
+          <w:rFonts w:ascii="Consolas" w:hAnsi="Consolas"/>
+          <w:b/>
+          <w:bCs/>
+          <w:color w:val="7F0055"/>
+          <w:sz w:val="18"/>
+          <w:szCs w:val="18"/>
+        </w:rPr>
+        <w:t>public</w:t>
+      </w:r>
+      <w:r>
+        <w:rPr>
+          <w:rFonts w:ascii="Consolas" w:hAnsi="Consolas"/>
+          <w:color w:val="000000"/>
+          <w:sz w:val="18"/>
+          <w:szCs w:val="18"/>
+        </w:rPr>
+        <w:t xml:space="preserve"> String </w:t>
+      </w:r>
+      <w:r>
+        <w:rPr>
+          <w:rFonts w:ascii="Consolas" w:hAnsi="Consolas"/>
+          <w:color w:val="000000"/>
+          <w:sz w:val="18"/>
+          <w:szCs w:val="18"/>
+        </w:rPr>
+        <w:t>guardarDatos</w:t>
+      </w:r>
+      <w:r>
+        <w:rPr>
+          <w:rFonts w:ascii="Consolas" w:hAnsi="Consolas"/>
+          <w:color w:val="000000"/>
+          <w:sz w:val="18"/>
+          <w:szCs w:val="18"/>
+        </w:rPr>
+        <w:t>(</w:t>
+      </w:r>
+      <w:r>
+        <w:rPr>
+          <w:rFonts w:ascii="Consolas" w:hAnsi="Consolas"/>
+          <w:color w:val="646464"/>
+          <w:sz w:val="18"/>
+          <w:szCs w:val="18"/>
+        </w:rPr>
+        <w:t>@AuthenticationPrincipal</w:t>
+      </w:r>
+      <w:r>
+        <w:rPr>
+          <w:rFonts w:ascii="Consolas" w:hAnsi="Consolas"/>
+          <w:color w:val="000000"/>
+          <w:sz w:val="18"/>
+          <w:szCs w:val="18"/>
+        </w:rPr>
+        <w:t xml:space="preserve"> UserDetails </w:t>
+      </w:r>
+      <w:r>
+        <w:rPr>
+          <w:rFonts w:ascii="Consolas" w:hAnsi="Consolas"/>
+          <w:color w:val="6A3E3E"/>
+          <w:sz w:val="18"/>
+          <w:szCs w:val="18"/>
+        </w:rPr>
+        <w:t>userDetails</w:t>
+      </w:r>
+      <w:r>
+        <w:rPr>
+          <w:rFonts w:ascii="Consolas" w:hAnsi="Consolas"/>
+          <w:color w:val="000000"/>
+          <w:sz w:val="18"/>
+          <w:szCs w:val="18"/>
+        </w:rPr>
+        <w:t>,</w:t>
+      </w:r>
+    </w:p>
+    <w:p>
+      <w:pPr>
+        <w:pStyle w:val="NormalWeb"/>
+        <w:shd w:val="clear" w:color="auto" w:fill="FFFFFF"/>
+        <w:spacing w:before="0" w:beforeAutospacing="0" w:after="0" w:afterAutospacing="0"/>
+        <w:rPr>
+          <w:rFonts w:ascii="Consolas" w:hAnsi="Consolas"/>
+          <w:color w:val="000000"/>
+          <w:sz w:val="18"/>
+          <w:szCs w:val="18"/>
+        </w:rPr>
+      </w:pPr>
+      <w:r>
+        <w:rPr>
+          <w:rFonts w:ascii="Consolas" w:hAnsi="Consolas"/>
+          <w:color w:val="000000"/>
+          <w:sz w:val="18"/>
+          <w:szCs w:val="18"/>
+        </w:rPr>
+        <w:tab/>
+        <w:t xml:space="preserve">                             </w:t>
+      </w:r>
+      <w:r>
+        <w:rPr>
+          <w:rFonts w:ascii="Consolas" w:hAnsi="Consolas"/>
+          <w:color w:val="646464"/>
+          <w:sz w:val="18"/>
+          <w:szCs w:val="18"/>
+          <w:highlight w:val="yellow"/>
+        </w:rPr>
+        <w:t>@Valid</w:t>
+      </w:r>
+      <w:r>
+        <w:rPr>
+          <w:rFonts w:ascii="Consolas" w:hAnsi="Consolas"/>
+          <w:color w:val="000000"/>
+          <w:sz w:val="18"/>
+          <w:szCs w:val="18"/>
+        </w:rPr>
+        <w:t xml:space="preserve"> </w:t>
+      </w:r>
+      <w:r>
+        <w:rPr>
+          <w:rFonts w:ascii="Consolas" w:hAnsi="Consolas"/>
+          <w:color w:val="646464"/>
+          <w:sz w:val="18"/>
+          <w:szCs w:val="18"/>
+        </w:rPr>
+        <w:t>@ModelAttribute</w:t>
+      </w:r>
+      <w:r>
+        <w:rPr>
+          <w:rFonts w:ascii="Consolas" w:hAnsi="Consolas"/>
+          <w:color w:val="000000"/>
+          <w:sz w:val="18"/>
+          <w:szCs w:val="18"/>
+        </w:rPr>
+        <w:t xml:space="preserve"> </w:t>
+      </w:r>
+      <w:r>
+        <w:rPr>
+          <w:rFonts w:ascii="Consolas" w:hAnsi="Consolas"/>
+          <w:color w:val="000000"/>
+          <w:sz w:val="18"/>
+          <w:szCs w:val="18"/>
+        </w:rPr>
+        <w:t>Clase</w:t>
+      </w:r>
+      <w:r>
+        <w:rPr>
+          <w:rFonts w:ascii="Consolas" w:hAnsi="Consolas"/>
+          <w:color w:val="000000"/>
+          <w:sz w:val="18"/>
+          <w:szCs w:val="18"/>
+        </w:rPr>
+        <w:t xml:space="preserve">DTO </w:t>
+      </w:r>
+      <w:r>
+        <w:rPr>
+          <w:rFonts w:ascii="Consolas" w:hAnsi="Consolas"/>
+          <w:color w:val="6A3E3E"/>
+          <w:sz w:val="18"/>
+          <w:szCs w:val="18"/>
+        </w:rPr>
+        <w:t>dto</w:t>
+      </w:r>
+      <w:r>
+        <w:rPr>
+          <w:rFonts w:ascii="Consolas" w:hAnsi="Consolas"/>
+          <w:color w:val="000000"/>
+          <w:sz w:val="18"/>
+          <w:szCs w:val="18"/>
+        </w:rPr>
+        <w:t>,</w:t>
+      </w:r>
+    </w:p>
+    <w:p>
+      <w:pPr>
+        <w:pStyle w:val="NormalWeb"/>
+        <w:shd w:val="clear" w:color="auto" w:fill="FFFFFF"/>
+        <w:spacing w:before="0" w:beforeAutospacing="0" w:after="0" w:afterAutospacing="0"/>
+        <w:rPr>
+          <w:rFonts w:ascii="Consolas" w:hAnsi="Consolas"/>
+          <w:color w:val="000000"/>
+          <w:sz w:val="18"/>
+          <w:szCs w:val="18"/>
+        </w:rPr>
+      </w:pPr>
+      <w:r>
+        <w:rPr>
+          <w:rFonts w:ascii="Consolas" w:hAnsi="Consolas"/>
+          <w:color w:val="000000"/>
+          <w:sz w:val="18"/>
+          <w:szCs w:val="18"/>
+        </w:rPr>
+        <w:tab/>
+        <w:t xml:space="preserve">                             </w:t>
+      </w:r>
+      <w:r>
+        <w:rPr>
+          <w:rFonts w:ascii="Consolas" w:hAnsi="Consolas"/>
+          <w:color w:val="000000"/>
+          <w:sz w:val="18"/>
+          <w:szCs w:val="18"/>
+        </w:rPr>
+        <w:t xml:space="preserve">BindingResult </w:t>
+      </w:r>
+      <w:r>
+        <w:rPr>
+          <w:rFonts w:ascii="Consolas" w:hAnsi="Consolas"/>
+          <w:color w:val="6A3E3E"/>
+          <w:sz w:val="18"/>
+          <w:szCs w:val="18"/>
+        </w:rPr>
+        <w:t>result</w:t>
+      </w:r>
+      <w:r>
+        <w:rPr>
+          <w:rFonts w:ascii="Consolas" w:hAnsi="Consolas"/>
+          <w:color w:val="000000"/>
+          <w:sz w:val="18"/>
+          <w:szCs w:val="18"/>
+        </w:rPr>
+        <w:t>,</w:t>
+      </w:r>
+    </w:p>
+    <w:p>
+      <w:pPr>
+        <w:pStyle w:val="NormalWeb"/>
+        <w:shd w:val="clear" w:color="auto" w:fill="FFFFFF"/>
+        <w:spacing w:before="0" w:beforeAutospacing="0" w:after="0" w:afterAutospacing="0"/>
+        <w:rPr>
+          <w:rFonts w:ascii="Consolas" w:hAnsi="Consolas"/>
+          <w:color w:val="000000"/>
+          <w:sz w:val="18"/>
+          <w:szCs w:val="18"/>
+        </w:rPr>
+      </w:pPr>
+      <w:r>
+        <w:rPr>
+          <w:rFonts w:ascii="Consolas" w:hAnsi="Consolas"/>
+          <w:color w:val="000000"/>
+          <w:sz w:val="18"/>
+          <w:szCs w:val="18"/>
+        </w:rPr>
+        <w:tab/>
+        <w:t xml:space="preserve">                             Model </w:t>
+      </w:r>
+      <w:r>
+        <w:rPr>
+          <w:rFonts w:ascii="Consolas" w:hAnsi="Consolas"/>
+          <w:color w:val="6A3E3E"/>
+          <w:sz w:val="18"/>
+          <w:szCs w:val="18"/>
+        </w:rPr>
+        <w:t>model</w:t>
+      </w:r>
+      <w:r>
+        <w:rPr>
+          <w:rFonts w:ascii="Consolas" w:hAnsi="Consolas"/>
+          <w:color w:val="000000"/>
+          <w:sz w:val="18"/>
+          <w:szCs w:val="18"/>
+        </w:rPr>
+        <w:t>)</w:t>
+      </w:r>
+    </w:p>
+    <w:p>
+      <w:pPr>
+        <w:ind w:firstLine="708"/>
+      </w:pPr>
+    </w:p>
+    <w:p>
+      <w:pPr>
+        <w:ind w:firstLine="708"/>
+        <w:rPr>
+          <w:u w:val="single"/>
+        </w:rPr>
+      </w:pPr>
+      <w:hyperlink r:id="rId5" w:history="1">
+        <w:r>
+          <w:rPr>
+            <w:rFonts w:ascii="Consolas" w:eastAsia="Times New Roman" w:hAnsi="Consolas" w:cs="Times New Roman"/>
+            <w:u w:val="single"/>
+          </w:rPr>
+          <w:t>org</w:t>
+        </w:r>
+      </w:hyperlink>
+      <w:r>
+        <w:rPr>
+          <w:rFonts w:ascii="Consolas" w:hAnsi="Consolas" w:cs="Times New Roman"/>
+          <w:color w:val="000000"/>
+          <w:u w:val="single"/>
+        </w:rPr>
+        <w:t>.</w:t>
+      </w:r>
+      <w:hyperlink r:id="rId6" w:history="1">
+        <w:r>
+          <w:rPr>
+            <w:rFonts w:ascii="Consolas" w:eastAsia="Times New Roman" w:hAnsi="Consolas" w:cs="Times New Roman"/>
+            <w:u w:val="single"/>
+          </w:rPr>
+          <w:t>springframework</w:t>
+        </w:r>
+      </w:hyperlink>
+      <w:r>
+        <w:rPr>
+          <w:rFonts w:ascii="Consolas" w:hAnsi="Consolas" w:cs="Times New Roman"/>
+          <w:color w:val="000000"/>
+          <w:u w:val="single"/>
+        </w:rPr>
+        <w:t>.</w:t>
+      </w:r>
+      <w:hyperlink r:id="rId7" w:history="1">
+        <w:r>
+          <w:rPr>
+            <w:rFonts w:ascii="Consolas" w:eastAsia="Times New Roman" w:hAnsi="Consolas" w:cs="Times New Roman"/>
+            <w:u w:val="single"/>
+          </w:rPr>
+          <w:t>validation</w:t>
+        </w:r>
+      </w:hyperlink>
+      <w:r>
+        <w:rPr>
+          <w:rFonts w:ascii="Consolas" w:hAnsi="Consolas" w:cs="Times New Roman"/>
+          <w:color w:val="000000"/>
+          <w:u w:val="single"/>
+        </w:rPr>
+        <w:t>.</w:t>
+      </w:r>
+      <w:hyperlink r:id="rId8" w:history="1">
+        <w:r>
+          <w:rPr>
+            <w:rFonts w:ascii="Consolas" w:eastAsia="Times New Roman" w:hAnsi="Consolas" w:cs="Times New Roman"/>
+            <w:u w:val="single"/>
+          </w:rPr>
+          <w:t>beanvalidation</w:t>
+        </w:r>
+      </w:hyperlink>
+      <w:r>
+        <w:rPr>
+          <w:rFonts w:ascii="Consolas" w:hAnsi="Consolas" w:cs="Times New Roman"/>
+          <w:color w:val="000000"/>
+          <w:u w:val="single"/>
+        </w:rPr>
+        <w:t>.</w:t>
+      </w:r>
+      <w:hyperlink r:id="rId9" w:history="1">
+        <w:r>
+          <w:rPr>
+            <w:rFonts w:ascii="Consolas" w:eastAsia="Times New Roman" w:hAnsi="Consolas" w:cs="Times New Roman"/>
+            <w:u w:val="single"/>
+          </w:rPr>
+          <w:t>SpringValidatorAdapter</w:t>
+        </w:r>
+      </w:hyperlink>
+      <w:r>
+        <w:rPr>
+          <w:rFonts w:ascii="Consolas" w:hAnsi="Consolas" w:cs="Times New Roman"/>
+          <w:color w:val="000000"/>
+          <w:u w:val="single"/>
+        </w:rPr>
+        <w:t>.SpringValidatorAdapter</w:t>
+      </w:r>
+    </w:p>
+    <w:p>
+      <w:pPr>
+        <w:ind w:firstLine="708"/>
+      </w:pPr>
+      <w:r>
+        <w:t>Este SpringValidator lo empleamos cuando para un mismo DTO, las validaciones sean diferentes según las necesidades que tengamos identificadas.</w:t>
+      </w:r>
+    </w:p>
+    <w:p>
+      <w:pPr>
+        <w:pStyle w:val="NormalWeb"/>
+        <w:shd w:val="clear" w:color="auto" w:fill="FFFFFF"/>
+        <w:spacing w:before="0" w:beforeAutospacing="0" w:after="0" w:afterAutospacing="0"/>
+        <w:ind w:firstLine="708"/>
+        <w:rPr>
+          <w:rFonts w:asciiTheme="minorHAnsi" w:hAnsiTheme="minorHAnsi"/>
+        </w:rPr>
+      </w:pPr>
+      <w:r>
+        <w:rPr>
+          <w:rFonts w:asciiTheme="minorHAnsi" w:eastAsiaTheme="minorHAnsi" w:hAnsiTheme="minorHAnsi" w:cstheme="minorBidi"/>
+          <w:kern w:val="2"/>
+          <w:lang w:eastAsia="en-US"/>
+          <w14:ligatures w14:val="standardContextual"/>
+        </w:rPr>
+        <w:t xml:space="preserve">Tendremos que eliminar el @Valid de nuestros parámetros y diferenciar el </w:t>
+      </w:r>
+      <w:r>
+        <w:rPr>
+          <w:rFonts w:asciiTheme="minorHAnsi" w:eastAsiaTheme="minorHAnsi" w:hAnsiTheme="minorHAnsi" w:cstheme="minorBidi"/>
+          <w:kern w:val="2"/>
+          <w:lang w:eastAsia="en-US"/>
+          <w14:ligatures w14:val="standardContextual"/>
+        </w:rPr>
+        <w:t>comportamiento de las validaciones anotadas</w:t>
+      </w:r>
+      <w:r>
+        <w:rPr>
+          <w:rFonts w:asciiTheme="minorHAnsi" w:hAnsiTheme="minorHAnsi"/>
+        </w:rPr>
+        <w:t xml:space="preserve"> </w:t>
+      </w:r>
+      <w:r>
+        <w:rPr>
+          <w:rFonts w:asciiTheme="minorHAnsi" w:hAnsiTheme="minorHAnsi"/>
+        </w:rPr>
+        <w:t xml:space="preserve">añadiendo </w:t>
+      </w:r>
+      <w:r>
+        <w:rPr>
+          <w:rFonts w:asciiTheme="minorHAnsi" w:hAnsiTheme="minorHAnsi"/>
+        </w:rPr>
+        <w:t xml:space="preserve"> “groups”</w:t>
+      </w:r>
+      <w:r>
+        <w:rPr>
+          <w:rFonts w:asciiTheme="minorHAnsi" w:hAnsiTheme="minorHAnsi"/>
+        </w:rPr>
+        <w:t xml:space="preserve"> a la anotación en los DTO’s y que corresponderán con “Interfaces” que se deberán implementar</w:t>
+      </w:r>
+      <w:r>
+        <w:rPr>
+          <w:rFonts w:asciiTheme="minorHAnsi" w:hAnsiTheme="minorHAnsi"/>
+        </w:rPr>
+        <w:t>.</w:t>
+      </w:r>
+    </w:p>
+    <w:p>
+      <w:pPr>
+        <w:pStyle w:val="NormalWeb"/>
+        <w:shd w:val="clear" w:color="auto" w:fill="FFFFFF"/>
+        <w:spacing w:before="0" w:beforeAutospacing="0" w:after="0" w:afterAutospacing="0"/>
+        <w:ind w:firstLine="708"/>
+        <w:rPr>
+          <w:rFonts w:asciiTheme="minorHAnsi" w:hAnsiTheme="minorHAnsi"/>
+        </w:rPr>
+      </w:pPr>
+    </w:p>
+    <w:p>
+      <w:pPr>
+        <w:shd w:val="clear" w:color="auto" w:fill="FFFFFF"/>
+        <w:spacing w:after="0" w:line="240" w:lineRule="auto"/>
+        <w:ind w:firstLine="708"/>
+        <w:rPr>
+          <w:rFonts w:ascii="Consolas" w:eastAsia="Times New Roman" w:hAnsi="Consolas" w:cs="Times New Roman"/>
+          <w:color w:val="000000"/>
+          <w:kern w:val="0"/>
+          <w:sz w:val="20"/>
+          <w:szCs w:val="20"/>
+          <w:lang w:eastAsia="es-ES"/>
+          <w14:ligatures w14:val="none"/>
+        </w:rPr>
+      </w:pPr>
+      <w:r>
+        <w:rPr>
+          <w:rFonts w:ascii="Consolas" w:eastAsia="Times New Roman" w:hAnsi="Consolas" w:cs="Times New Roman"/>
+          <w:b/>
+          <w:bCs/>
+          <w:color w:val="7F0055"/>
+          <w:kern w:val="0"/>
+          <w:sz w:val="20"/>
+          <w:szCs w:val="20"/>
+          <w:lang w:eastAsia="es-ES"/>
+          <w14:ligatures w14:val="none"/>
+        </w:rPr>
+        <w:t>public</w:t>
+      </w:r>
+      <w:r>
+        <w:rPr>
+          <w:rFonts w:ascii="Consolas" w:eastAsia="Times New Roman" w:hAnsi="Consolas" w:cs="Times New Roman"/>
+          <w:color w:val="000000"/>
+          <w:kern w:val="0"/>
+          <w:sz w:val="20"/>
+          <w:szCs w:val="20"/>
+          <w:lang w:eastAsia="es-ES"/>
+          <w14:ligatures w14:val="none"/>
+        </w:rPr>
+        <w:t xml:space="preserve"> </w:t>
+      </w:r>
+      <w:r>
+        <w:rPr>
+          <w:rFonts w:ascii="Consolas" w:eastAsia="Times New Roman" w:hAnsi="Consolas" w:cs="Times New Roman"/>
+          <w:b/>
+          <w:bCs/>
+          <w:color w:val="7F0055"/>
+          <w:kern w:val="0"/>
+          <w:sz w:val="20"/>
+          <w:szCs w:val="20"/>
+          <w:lang w:eastAsia="es-ES"/>
+          <w14:ligatures w14:val="none"/>
+        </w:rPr>
+        <w:t>interface</w:t>
+      </w:r>
+      <w:r>
+        <w:rPr>
+          <w:rFonts w:ascii="Consolas" w:eastAsia="Times New Roman" w:hAnsi="Consolas" w:cs="Times New Roman"/>
+          <w:color w:val="000000"/>
+          <w:kern w:val="0"/>
+          <w:sz w:val="20"/>
+          <w:szCs w:val="20"/>
+          <w:lang w:eastAsia="es-ES"/>
+          <w14:ligatures w14:val="none"/>
+        </w:rPr>
+        <w:t xml:space="preserve"> OnCreate </w:t>
+      </w:r>
+      <w:r>
+        <w:rPr>
+          <w:rFonts w:ascii="Consolas" w:eastAsia="Times New Roman" w:hAnsi="Consolas" w:cs="Times New Roman"/>
+          <w:b/>
+          <w:bCs/>
+          <w:color w:val="7F0055"/>
+          <w:kern w:val="0"/>
+          <w:sz w:val="20"/>
+          <w:szCs w:val="20"/>
+          <w:lang w:eastAsia="es-ES"/>
+          <w14:ligatures w14:val="none"/>
+        </w:rPr>
+        <w:t>extends</w:t>
+      </w:r>
+      <w:r>
+        <w:rPr>
+          <w:rFonts w:ascii="Consolas" w:eastAsia="Times New Roman" w:hAnsi="Consolas" w:cs="Times New Roman"/>
+          <w:color w:val="000000"/>
+          <w:kern w:val="0"/>
+          <w:sz w:val="20"/>
+          <w:szCs w:val="20"/>
+          <w:lang w:eastAsia="es-ES"/>
+          <w14:ligatures w14:val="none"/>
+        </w:rPr>
+        <w:t xml:space="preserve"> Default {</w:t>
+      </w:r>
+    </w:p>
+    <w:p>
+      <w:pPr>
+        <w:shd w:val="clear" w:color="auto" w:fill="FFFFFF"/>
+        <w:spacing w:after="0" w:line="240" w:lineRule="auto"/>
+        <w:rPr>
+          <w:rFonts w:ascii="Consolas" w:eastAsia="Times New Roman" w:hAnsi="Consolas" w:cs="Times New Roman"/>
+          <w:color w:val="000000"/>
+          <w:kern w:val="0"/>
+          <w:sz w:val="20"/>
+          <w:szCs w:val="20"/>
+          <w:lang w:eastAsia="es-ES"/>
+          <w14:ligatures w14:val="none"/>
+        </w:rPr>
+      </w:pPr>
+    </w:p>
+    <w:p>
+      <w:pPr>
+        <w:shd w:val="clear" w:color="auto" w:fill="FFFFFF"/>
+        <w:spacing w:after="0" w:line="240" w:lineRule="auto"/>
+        <w:ind w:firstLine="708"/>
+        <w:rPr>
+          <w:rFonts w:ascii="Consolas" w:eastAsia="Times New Roman" w:hAnsi="Consolas" w:cs="Times New Roman"/>
+          <w:color w:val="000000"/>
+          <w:kern w:val="0"/>
+          <w:sz w:val="20"/>
+          <w:szCs w:val="20"/>
+          <w:lang w:eastAsia="es-ES"/>
+          <w14:ligatures w14:val="none"/>
+        </w:rPr>
+      </w:pPr>
+      <w:r>
+        <w:rPr>
+          <w:rFonts w:ascii="Consolas" w:eastAsia="Times New Roman" w:hAnsi="Consolas" w:cs="Times New Roman"/>
+          <w:color w:val="000000"/>
+          <w:kern w:val="0"/>
+          <w:sz w:val="20"/>
+          <w:szCs w:val="20"/>
+          <w:lang w:eastAsia="es-ES"/>
+          <w14:ligatures w14:val="none"/>
+        </w:rPr>
+        <w:t>}</w:t>
+      </w:r>
+    </w:p>
+    <w:p>
+      <w:pPr>
+        <w:pStyle w:val="NormalWeb"/>
+        <w:shd w:val="clear" w:color="auto" w:fill="FFFFFF"/>
+        <w:spacing w:before="0" w:beforeAutospacing="0" w:after="0" w:afterAutospacing="0"/>
+        <w:ind w:firstLine="708"/>
+        <w:rPr>
+          <w:rFonts w:asciiTheme="minorHAnsi" w:hAnsiTheme="minorHAnsi"/>
+        </w:rPr>
+      </w:pPr>
+    </w:p>
+    <w:p>
+      <w:pPr>
+        <w:shd w:val="clear" w:color="auto" w:fill="FFFFFF"/>
+        <w:spacing w:after="0" w:line="240" w:lineRule="auto"/>
+        <w:ind w:firstLine="708"/>
+        <w:rPr>
+          <w:rFonts w:ascii="Consolas" w:eastAsia="Times New Roman" w:hAnsi="Consolas" w:cs="Times New Roman"/>
+          <w:color w:val="000000"/>
+          <w:kern w:val="0"/>
+          <w:sz w:val="20"/>
+          <w:szCs w:val="20"/>
+          <w:lang w:eastAsia="es-ES"/>
+          <w14:ligatures w14:val="none"/>
+        </w:rPr>
+      </w:pPr>
+      <w:r>
+        <w:rPr>
+          <w:rFonts w:ascii="Consolas" w:eastAsia="Times New Roman" w:hAnsi="Consolas" w:cs="Times New Roman"/>
+          <w:b/>
+          <w:bCs/>
+          <w:color w:val="7F0055"/>
+          <w:kern w:val="0"/>
+          <w:sz w:val="20"/>
+          <w:szCs w:val="20"/>
+          <w:lang w:eastAsia="es-ES"/>
+          <w14:ligatures w14:val="none"/>
+        </w:rPr>
+        <w:t>public</w:t>
+      </w:r>
+      <w:r>
+        <w:rPr>
+          <w:rFonts w:ascii="Consolas" w:eastAsia="Times New Roman" w:hAnsi="Consolas" w:cs="Times New Roman"/>
+          <w:color w:val="000000"/>
+          <w:kern w:val="0"/>
+          <w:sz w:val="20"/>
+          <w:szCs w:val="20"/>
+          <w:lang w:eastAsia="es-ES"/>
+          <w14:ligatures w14:val="none"/>
+        </w:rPr>
+        <w:t xml:space="preserve"> </w:t>
+      </w:r>
+      <w:r>
+        <w:rPr>
+          <w:rFonts w:ascii="Consolas" w:eastAsia="Times New Roman" w:hAnsi="Consolas" w:cs="Times New Roman"/>
+          <w:b/>
+          <w:bCs/>
+          <w:color w:val="7F0055"/>
+          <w:kern w:val="0"/>
+          <w:sz w:val="20"/>
+          <w:szCs w:val="20"/>
+          <w:lang w:eastAsia="es-ES"/>
+          <w14:ligatures w14:val="none"/>
+        </w:rPr>
+        <w:t>interface</w:t>
+      </w:r>
+      <w:r>
+        <w:rPr>
+          <w:rFonts w:ascii="Consolas" w:eastAsia="Times New Roman" w:hAnsi="Consolas" w:cs="Times New Roman"/>
+          <w:color w:val="000000"/>
+          <w:kern w:val="0"/>
+          <w:sz w:val="20"/>
+          <w:szCs w:val="20"/>
+          <w:lang w:eastAsia="es-ES"/>
+          <w14:ligatures w14:val="none"/>
+        </w:rPr>
+        <w:t xml:space="preserve"> OnUpdate </w:t>
+      </w:r>
+      <w:r>
+        <w:rPr>
+          <w:rFonts w:ascii="Consolas" w:eastAsia="Times New Roman" w:hAnsi="Consolas" w:cs="Times New Roman"/>
+          <w:b/>
+          <w:bCs/>
+          <w:color w:val="7F0055"/>
+          <w:kern w:val="0"/>
+          <w:sz w:val="20"/>
+          <w:szCs w:val="20"/>
+          <w:lang w:eastAsia="es-ES"/>
+          <w14:ligatures w14:val="none"/>
+        </w:rPr>
+        <w:t>extends</w:t>
+      </w:r>
+      <w:r>
+        <w:rPr>
+          <w:rFonts w:ascii="Consolas" w:eastAsia="Times New Roman" w:hAnsi="Consolas" w:cs="Times New Roman"/>
+          <w:color w:val="000000"/>
+          <w:kern w:val="0"/>
+          <w:sz w:val="20"/>
+          <w:szCs w:val="20"/>
+          <w:lang w:eastAsia="es-ES"/>
+          <w14:ligatures w14:val="none"/>
+        </w:rPr>
+        <w:t xml:space="preserve"> Default{</w:t>
+      </w:r>
+    </w:p>
+    <w:p>
+      <w:pPr>
+        <w:shd w:val="clear" w:color="auto" w:fill="FFFFFF"/>
+        <w:spacing w:after="0" w:line="240" w:lineRule="auto"/>
+        <w:rPr>
+          <w:rFonts w:ascii="Consolas" w:eastAsia="Times New Roman" w:hAnsi="Consolas" w:cs="Times New Roman"/>
+          <w:color w:val="000000"/>
+          <w:kern w:val="0"/>
+          <w:sz w:val="20"/>
+          <w:szCs w:val="20"/>
+          <w:lang w:eastAsia="es-ES"/>
+          <w14:ligatures w14:val="none"/>
+        </w:rPr>
+      </w:pPr>
+    </w:p>
+    <w:p>
+      <w:pPr>
+        <w:shd w:val="clear" w:color="auto" w:fill="FFFFFF"/>
+        <w:spacing w:after="0" w:line="240" w:lineRule="auto"/>
+        <w:ind w:firstLine="708"/>
+        <w:rPr>
+          <w:rFonts w:ascii="Consolas" w:eastAsia="Times New Roman" w:hAnsi="Consolas" w:cs="Times New Roman"/>
+          <w:color w:val="000000"/>
+          <w:kern w:val="0"/>
+          <w:sz w:val="20"/>
+          <w:szCs w:val="20"/>
+          <w:lang w:eastAsia="es-ES"/>
+          <w14:ligatures w14:val="none"/>
+        </w:rPr>
+      </w:pPr>
+      <w:r>
+        <w:rPr>
+          <w:rFonts w:ascii="Consolas" w:eastAsia="Times New Roman" w:hAnsi="Consolas" w:cs="Times New Roman"/>
+          <w:color w:val="000000"/>
+          <w:kern w:val="0"/>
+          <w:sz w:val="20"/>
+          <w:szCs w:val="20"/>
+          <w:lang w:eastAsia="es-ES"/>
+          <w14:ligatures w14:val="none"/>
+        </w:rPr>
+        <w:t>}</w:t>
+      </w:r>
+    </w:p>
+    <w:p>
+      <w:pPr>
+        <w:pStyle w:val="NormalWeb"/>
+        <w:shd w:val="clear" w:color="auto" w:fill="FFFFFF"/>
+        <w:spacing w:before="0" w:beforeAutospacing="0" w:after="0" w:afterAutospacing="0"/>
+        <w:ind w:firstLine="708"/>
+        <w:rPr>
+          <w:rFonts w:ascii="Consolas" w:hAnsi="Consolas"/>
+          <w:color w:val="000000"/>
+          <w:u w:val="single"/>
+        </w:rPr>
+      </w:pPr>
+    </w:p>
+    <w:p>
+      <w:pPr>
+        <w:pStyle w:val="NormalWeb"/>
+        <w:shd w:val="clear" w:color="auto" w:fill="FFFFFF"/>
+        <w:spacing w:before="0" w:beforeAutospacing="0" w:after="0" w:afterAutospacing="0"/>
+        <w:ind w:firstLine="708"/>
+        <w:rPr>
+          <w:rFonts w:ascii="Consolas" w:hAnsi="Consolas"/>
+          <w:color w:val="000000"/>
+          <w:u w:val="single"/>
+        </w:rPr>
+      </w:pPr>
+      <w:r>
+        <w:rPr>
+          <w:rFonts w:ascii="Consolas" w:hAnsi="Consolas"/>
+          <w:color w:val="000000"/>
+          <w:u w:val="single"/>
+        </w:rPr>
+        <w:t>En el DTO, se anotará:</w:t>
+      </w:r>
+    </w:p>
+    <w:p>
+      <w:pPr>
+        <w:pStyle w:val="NormalWeb"/>
+        <w:shd w:val="clear" w:color="auto" w:fill="FFFFFF"/>
+        <w:spacing w:before="0" w:beforeAutospacing="0" w:after="0" w:afterAutospacing="0"/>
+        <w:ind w:firstLine="708"/>
+        <w:rPr>
+          <w:rFonts w:ascii="Consolas" w:hAnsi="Consolas"/>
+          <w:color w:val="000000"/>
+          <w:u w:val="single"/>
+        </w:rPr>
+      </w:pPr>
+    </w:p>
+    <w:p>
+      <w:pPr>
+        <w:pStyle w:val="NormalWeb"/>
+        <w:shd w:val="clear" w:color="auto" w:fill="FFFFFF"/>
+        <w:spacing w:before="0" w:beforeAutospacing="0" w:after="0" w:afterAutospacing="0"/>
+        <w:rPr>
+          <w:rFonts w:ascii="Consolas" w:hAnsi="Consolas"/>
+          <w:color w:val="000000"/>
+          <w:sz w:val="18"/>
+          <w:szCs w:val="18"/>
+        </w:rPr>
+      </w:pPr>
+      <w:r>
+        <w:rPr>
+          <w:rFonts w:ascii="Consolas" w:hAnsi="Consolas"/>
+          <w:color w:val="000000"/>
+        </w:rPr>
+        <w:t xml:space="preserve">   </w:t>
+      </w:r>
+      <w:r>
+        <w:rPr>
+          <w:rFonts w:ascii="Consolas" w:hAnsi="Consolas"/>
+          <w:color w:val="000000"/>
+        </w:rPr>
+        <w:t xml:space="preserve">   </w:t>
+      </w:r>
+      <w:r>
+        <w:rPr>
+          <w:rFonts w:ascii="Consolas" w:hAnsi="Consolas"/>
+          <w:color w:val="646464"/>
+          <w:sz w:val="18"/>
+          <w:szCs w:val="18"/>
+        </w:rPr>
+        <w:t>@NotBlank</w:t>
+      </w:r>
+      <w:r>
+        <w:rPr>
+          <w:rFonts w:ascii="Consolas" w:hAnsi="Consolas"/>
+          <w:color w:val="000000"/>
+          <w:sz w:val="18"/>
+          <w:szCs w:val="18"/>
+        </w:rPr>
+        <w:t xml:space="preserve">(message = </w:t>
+      </w:r>
+      <w:r>
+        <w:rPr>
+          <w:rFonts w:ascii="Consolas" w:hAnsi="Consolas"/>
+          <w:color w:val="2A00FF"/>
+          <w:sz w:val="18"/>
+          <w:szCs w:val="18"/>
+        </w:rPr>
+        <w:t>"{validations.message.password.mandatory}"</w:t>
+      </w:r>
+      <w:r>
+        <w:rPr>
+          <w:rFonts w:ascii="Consolas" w:hAnsi="Consolas"/>
+          <w:color w:val="000000"/>
+          <w:sz w:val="18"/>
+          <w:szCs w:val="18"/>
+        </w:rPr>
+        <w:t>,</w:t>
+      </w:r>
+      <w:r>
+        <w:rPr>
+          <w:rFonts w:ascii="Consolas" w:hAnsi="Consolas"/>
+          <w:color w:val="000000"/>
+          <w:sz w:val="18"/>
+          <w:szCs w:val="18"/>
+          <w:highlight w:val="yellow"/>
+        </w:rPr>
+        <w:t>groups = OnCreate.</w:t>
+      </w:r>
+      <w:r>
+        <w:rPr>
+          <w:rFonts w:ascii="Consolas" w:hAnsi="Consolas"/>
+          <w:b/>
+          <w:bCs/>
+          <w:color w:val="7F0055"/>
+          <w:sz w:val="18"/>
+          <w:szCs w:val="18"/>
+          <w:highlight w:val="yellow"/>
+        </w:rPr>
+        <w:t>class</w:t>
+      </w:r>
+      <w:r>
+        <w:rPr>
+          <w:rFonts w:ascii="Consolas" w:hAnsi="Consolas"/>
+          <w:color w:val="000000"/>
+          <w:sz w:val="18"/>
+          <w:szCs w:val="18"/>
+        </w:rPr>
+        <w:t>)</w:t>
+      </w:r>
+    </w:p>
+    <w:p>
+      <w:pPr>
+        <w:shd w:val="clear" w:color="auto" w:fill="FFFFFF"/>
+        <w:spacing w:after="0" w:line="240" w:lineRule="auto"/>
+        <w:rPr>
+          <w:rFonts w:ascii="Consolas" w:eastAsia="Times New Roman" w:hAnsi="Consolas" w:cs="Times New Roman"/>
+          <w:color w:val="000000"/>
+          <w:kern w:val="0"/>
+          <w:sz w:val="18"/>
+          <w:szCs w:val="18"/>
+          <w:lang w:eastAsia="es-ES"/>
+          <w14:ligatures w14:val="none"/>
+        </w:rPr>
+      </w:pPr>
+      <w:r>
+        <w:rPr>
+          <w:rFonts w:ascii="Consolas" w:eastAsia="Times New Roman" w:hAnsi="Consolas" w:cs="Times New Roman"/>
+          <w:color w:val="000000"/>
+          <w:kern w:val="0"/>
+          <w:sz w:val="18"/>
+          <w:szCs w:val="18"/>
+          <w:lang w:eastAsia="es-ES"/>
+          <w14:ligatures w14:val="none"/>
+        </w:rPr>
+        <w:t xml:space="preserve">    </w:t>
+      </w:r>
+      <w:r>
+        <w:rPr>
+          <w:rFonts w:ascii="Consolas" w:eastAsia="Times New Roman" w:hAnsi="Consolas" w:cs="Times New Roman"/>
+          <w:color w:val="646464"/>
+          <w:kern w:val="0"/>
+          <w:sz w:val="18"/>
+          <w:szCs w:val="18"/>
+          <w:lang w:eastAsia="es-ES"/>
+          <w14:ligatures w14:val="none"/>
+        </w:rPr>
+        <w:t>@Size</w:t>
+      </w:r>
+      <w:r>
+        <w:rPr>
+          <w:rFonts w:ascii="Consolas" w:eastAsia="Times New Roman" w:hAnsi="Consolas" w:cs="Times New Roman"/>
+          <w:color w:val="000000"/>
+          <w:kern w:val="0"/>
+          <w:sz w:val="18"/>
+          <w:szCs w:val="18"/>
+          <w:lang w:eastAsia="es-ES"/>
+          <w14:ligatures w14:val="none"/>
+        </w:rPr>
+        <w:t xml:space="preserve">(min = 6, message = </w:t>
+      </w:r>
+      <w:r>
+        <w:rPr>
+          <w:rFonts w:ascii="Consolas" w:eastAsia="Times New Roman" w:hAnsi="Consolas" w:cs="Times New Roman"/>
+          <w:color w:val="2A00FF"/>
+          <w:kern w:val="0"/>
+          <w:sz w:val="18"/>
+          <w:szCs w:val="18"/>
+          <w:lang w:eastAsia="es-ES"/>
+          <w14:ligatures w14:val="none"/>
+        </w:rPr>
+        <w:t>"{validations.message.password.validformat}"</w:t>
+      </w:r>
+      <w:r>
+        <w:rPr>
+          <w:rFonts w:ascii="Consolas" w:eastAsia="Times New Roman" w:hAnsi="Consolas" w:cs="Times New Roman"/>
+          <w:color w:val="000000"/>
+          <w:kern w:val="0"/>
+          <w:sz w:val="18"/>
+          <w:szCs w:val="18"/>
+          <w:lang w:eastAsia="es-ES"/>
+          <w14:ligatures w14:val="none"/>
+        </w:rPr>
+        <w:t>,</w:t>
+      </w:r>
+      <w:r>
+        <w:rPr>
+          <w:rFonts w:ascii="Consolas" w:eastAsia="Times New Roman" w:hAnsi="Consolas" w:cs="Times New Roman"/>
+          <w:color w:val="000000"/>
+          <w:kern w:val="0"/>
+          <w:sz w:val="18"/>
+          <w:szCs w:val="18"/>
+          <w:highlight w:val="yellow"/>
+          <w:lang w:eastAsia="es-ES"/>
+          <w14:ligatures w14:val="none"/>
+        </w:rPr>
+        <w:t>groups = OnCreate.</w:t>
+      </w:r>
+      <w:r>
+        <w:rPr>
+          <w:rFonts w:ascii="Consolas" w:eastAsia="Times New Roman" w:hAnsi="Consolas" w:cs="Times New Roman"/>
+          <w:b/>
+          <w:bCs/>
+          <w:color w:val="7F0055"/>
+          <w:kern w:val="0"/>
+          <w:sz w:val="18"/>
+          <w:szCs w:val="18"/>
+          <w:highlight w:val="yellow"/>
+          <w:lang w:eastAsia="es-ES"/>
+          <w14:ligatures w14:val="none"/>
+        </w:rPr>
+        <w:t>class</w:t>
+      </w:r>
+      <w:r>
+        <w:rPr>
+          <w:rFonts w:ascii="Consolas" w:eastAsia="Times New Roman" w:hAnsi="Consolas" w:cs="Times New Roman"/>
+          <w:color w:val="000000"/>
+          <w:kern w:val="0"/>
+          <w:sz w:val="18"/>
+          <w:szCs w:val="18"/>
+          <w:lang w:eastAsia="es-ES"/>
+          <w14:ligatures w14:val="none"/>
+        </w:rPr>
+        <w:t>)</w:t>
+      </w:r>
+    </w:p>
+    <w:p>
+      <w:pPr>
+        <w:shd w:val="clear" w:color="auto" w:fill="FFFFFF"/>
+        <w:spacing w:after="0" w:line="240" w:lineRule="auto"/>
+        <w:rPr>
+          <w:rFonts w:ascii="Consolas" w:eastAsia="Times New Roman" w:hAnsi="Consolas" w:cs="Times New Roman"/>
+          <w:color w:val="000000"/>
+          <w:kern w:val="0"/>
+          <w:sz w:val="18"/>
+          <w:szCs w:val="18"/>
+          <w:lang w:eastAsia="es-ES"/>
+          <w14:ligatures w14:val="none"/>
+        </w:rPr>
+      </w:pPr>
+      <w:r>
+        <w:rPr>
+          <w:rFonts w:ascii="Consolas" w:eastAsia="Times New Roman" w:hAnsi="Consolas" w:cs="Times New Roman"/>
+          <w:color w:val="000000"/>
+          <w:kern w:val="0"/>
+          <w:sz w:val="18"/>
+          <w:szCs w:val="18"/>
+          <w:lang w:eastAsia="es-ES"/>
+          <w14:ligatures w14:val="none"/>
+        </w:rPr>
+        <w:t xml:space="preserve">    </w:t>
+      </w:r>
+      <w:r>
+        <w:rPr>
+          <w:rFonts w:ascii="Consolas" w:eastAsia="Times New Roman" w:hAnsi="Consolas" w:cs="Times New Roman"/>
+          <w:b/>
+          <w:bCs/>
+          <w:color w:val="7F0055"/>
+          <w:kern w:val="0"/>
+          <w:sz w:val="18"/>
+          <w:szCs w:val="18"/>
+          <w:lang w:eastAsia="es-ES"/>
+          <w14:ligatures w14:val="none"/>
+        </w:rPr>
+        <w:t>private</w:t>
+      </w:r>
+      <w:r>
+        <w:rPr>
+          <w:rFonts w:ascii="Consolas" w:eastAsia="Times New Roman" w:hAnsi="Consolas" w:cs="Times New Roman"/>
+          <w:color w:val="000000"/>
+          <w:kern w:val="0"/>
+          <w:sz w:val="18"/>
+          <w:szCs w:val="18"/>
+          <w:lang w:eastAsia="es-ES"/>
+          <w14:ligatures w14:val="none"/>
+        </w:rPr>
+        <w:t xml:space="preserve"> String </w:t>
+      </w:r>
+      <w:r>
+        <w:rPr>
+          <w:rFonts w:ascii="Consolas" w:eastAsia="Times New Roman" w:hAnsi="Consolas" w:cs="Times New Roman"/>
+          <w:color w:val="0000C0"/>
+          <w:kern w:val="0"/>
+          <w:sz w:val="18"/>
+          <w:szCs w:val="18"/>
+          <w:lang w:eastAsia="es-ES"/>
+          <w14:ligatures w14:val="none"/>
+        </w:rPr>
+        <w:t>confirmPassword</w:t>
+      </w:r>
+      <w:r>
+        <w:rPr>
+          <w:rFonts w:ascii="Consolas" w:eastAsia="Times New Roman" w:hAnsi="Consolas" w:cs="Times New Roman"/>
+          <w:color w:val="000000"/>
+          <w:kern w:val="0"/>
+          <w:sz w:val="18"/>
+          <w:szCs w:val="18"/>
+          <w:lang w:eastAsia="es-ES"/>
+          <w14:ligatures w14:val="none"/>
+        </w:rPr>
+        <w:t>;</w:t>
+      </w:r>
+    </w:p>
+    <w:p>
+      <w:pPr>
+        <w:ind w:firstLine="708"/>
+      </w:pPr>
+    </w:p>
+    <w:p>
+      <w:pPr>
+        <w:ind w:firstLine="708"/>
+      </w:pPr>
+      <w:r>
+        <w:t>Y en nuestro método del controller se implementa como:</w:t>
+      </w:r>
+    </w:p>
+    <w:p>
+      <w:pPr>
+        <w:shd w:val="clear" w:color="auto" w:fill="FFFFFF"/>
+        <w:spacing w:after="0" w:line="240" w:lineRule="auto"/>
+        <w:rPr>
+          <w:rFonts w:ascii="Consolas" w:eastAsia="Times New Roman" w:hAnsi="Consolas" w:cs="Times New Roman"/>
+          <w:color w:val="000000"/>
+          <w:kern w:val="0"/>
+          <w:sz w:val="18"/>
+          <w:szCs w:val="18"/>
+          <w:lang w:eastAsia="es-ES"/>
+          <w14:ligatures w14:val="none"/>
+        </w:rPr>
+      </w:pPr>
+    </w:p>
+    <w:p>
+      <w:pPr>
+        <w:shd w:val="clear" w:color="auto" w:fill="FFFFFF"/>
+        <w:spacing w:after="0" w:line="240" w:lineRule="auto"/>
+        <w:rPr>
+          <w:rFonts w:ascii="Consolas" w:eastAsia="Times New Roman" w:hAnsi="Consolas" w:cs="Times New Roman"/>
+          <w:color w:val="000000"/>
+          <w:kern w:val="0"/>
+          <w:lang w:eastAsia="es-ES"/>
+          <w14:ligatures w14:val="none"/>
+        </w:rPr>
+      </w:pPr>
+      <w:r>
+        <w:rPr>
+          <w:rFonts w:ascii="Consolas" w:eastAsia="Times New Roman" w:hAnsi="Consolas" w:cs="Times New Roman"/>
+          <w:color w:val="3F7F5F"/>
+          <w:kern w:val="0"/>
+          <w:lang w:eastAsia="es-ES"/>
+          <w14:ligatures w14:val="none"/>
+        </w:rPr>
+        <w:t xml:space="preserve">// 1) </w:t>
+      </w:r>
+      <w:r>
+        <w:rPr>
+          <w:rFonts w:ascii="Consolas" w:eastAsia="Times New Roman" w:hAnsi="Consolas" w:cs="Times New Roman"/>
+          <w:color w:val="3F7F5F"/>
+          <w:kern w:val="0"/>
+          <w:u w:val="single"/>
+          <w:lang w:eastAsia="es-ES"/>
+          <w14:ligatures w14:val="none"/>
+        </w:rPr>
+        <w:t>Para</w:t>
+      </w:r>
+      <w:r>
+        <w:rPr>
+          <w:rFonts w:ascii="Consolas" w:eastAsia="Times New Roman" w:hAnsi="Consolas" w:cs="Times New Roman"/>
+          <w:color w:val="3F7F5F"/>
+          <w:kern w:val="0"/>
+          <w:lang w:eastAsia="es-ES"/>
+          <w14:ligatures w14:val="none"/>
+        </w:rPr>
+        <w:t xml:space="preserve"> </w:t>
+      </w:r>
+      <w:r>
+        <w:rPr>
+          <w:rFonts w:ascii="Consolas" w:eastAsia="Times New Roman" w:hAnsi="Consolas" w:cs="Times New Roman"/>
+          <w:color w:val="3F7F5F"/>
+          <w:kern w:val="0"/>
+          <w:u w:val="single"/>
+          <w:lang w:eastAsia="es-ES"/>
+          <w14:ligatures w14:val="none"/>
+        </w:rPr>
+        <w:t>utilizar</w:t>
+      </w:r>
+      <w:r>
+        <w:rPr>
+          <w:rFonts w:ascii="Consolas" w:eastAsia="Times New Roman" w:hAnsi="Consolas" w:cs="Times New Roman"/>
+          <w:color w:val="3F7F5F"/>
+          <w:kern w:val="0"/>
+          <w:lang w:eastAsia="es-ES"/>
+          <w14:ligatures w14:val="none"/>
+        </w:rPr>
+        <w:t xml:space="preserve"> el </w:t>
+      </w:r>
+      <w:r>
+        <w:rPr>
+          <w:rFonts w:ascii="Consolas" w:eastAsia="Times New Roman" w:hAnsi="Consolas" w:cs="Times New Roman"/>
+          <w:color w:val="3F7F5F"/>
+          <w:kern w:val="0"/>
+          <w:u w:val="single"/>
+          <w:lang w:eastAsia="es-ES"/>
+          <w14:ligatures w14:val="none"/>
+        </w:rPr>
+        <w:t>mismo</w:t>
+      </w:r>
+      <w:r>
+        <w:rPr>
+          <w:rFonts w:ascii="Consolas" w:eastAsia="Times New Roman" w:hAnsi="Consolas" w:cs="Times New Roman"/>
+          <w:color w:val="3F7F5F"/>
+          <w:kern w:val="0"/>
+          <w:lang w:eastAsia="es-ES"/>
+          <w14:ligatures w14:val="none"/>
+        </w:rPr>
+        <w:t xml:space="preserve"> DTO  </w:t>
+      </w:r>
+    </w:p>
+    <w:p>
+      <w:pPr>
+        <w:shd w:val="clear" w:color="auto" w:fill="FFFFFF"/>
+        <w:spacing w:after="0" w:line="240" w:lineRule="auto"/>
+        <w:rPr>
+          <w:rFonts w:ascii="Consolas" w:eastAsia="Times New Roman" w:hAnsi="Consolas" w:cs="Times New Roman"/>
+          <w:color w:val="000000"/>
+          <w:kern w:val="0"/>
+          <w:lang w:eastAsia="es-ES"/>
+          <w14:ligatures w14:val="none"/>
+        </w:rPr>
+      </w:pPr>
+      <w:r>
+        <w:rPr>
+          <w:rFonts w:ascii="Consolas" w:eastAsia="Times New Roman" w:hAnsi="Consolas" w:cs="Times New Roman"/>
+          <w:color w:val="3F7F5F"/>
+          <w:kern w:val="0"/>
+          <w:lang w:eastAsia="es-ES"/>
+          <w14:ligatures w14:val="none"/>
+        </w:rPr>
+        <w:t xml:space="preserve">//     </w:t>
+      </w:r>
+      <w:r>
+        <w:rPr>
+          <w:rFonts w:ascii="Consolas" w:eastAsia="Times New Roman" w:hAnsi="Consolas" w:cs="Times New Roman"/>
+          <w:color w:val="3F7F5F"/>
+          <w:kern w:val="0"/>
+          <w:u w:val="single"/>
+          <w:lang w:eastAsia="es-ES"/>
+          <w14:ligatures w14:val="none"/>
+        </w:rPr>
+        <w:t>Creación</w:t>
+      </w:r>
+      <w:r>
+        <w:rPr>
+          <w:rFonts w:ascii="Consolas" w:eastAsia="Times New Roman" w:hAnsi="Consolas" w:cs="Times New Roman"/>
+          <w:color w:val="3F7F5F"/>
+          <w:kern w:val="0"/>
+          <w:lang w:eastAsia="es-ES"/>
+          <w14:ligatures w14:val="none"/>
+        </w:rPr>
+        <w:t xml:space="preserve"> (</w:t>
+      </w:r>
+      <w:r>
+        <w:rPr>
+          <w:rFonts w:ascii="Consolas" w:eastAsia="Times New Roman" w:hAnsi="Consolas" w:cs="Times New Roman"/>
+          <w:color w:val="3F7F5F"/>
+          <w:kern w:val="0"/>
+          <w:u w:val="single"/>
+          <w:lang w:eastAsia="es-ES"/>
+          <w14:ligatures w14:val="none"/>
+        </w:rPr>
+        <w:t>con</w:t>
+      </w:r>
+      <w:r>
+        <w:rPr>
+          <w:rFonts w:ascii="Consolas" w:eastAsia="Times New Roman" w:hAnsi="Consolas" w:cs="Times New Roman"/>
+          <w:color w:val="3F7F5F"/>
+          <w:kern w:val="0"/>
+          <w:lang w:eastAsia="es-ES"/>
+          <w14:ligatures w14:val="none"/>
+        </w:rPr>
+        <w:t xml:space="preserve"> password) </w:t>
+      </w:r>
+    </w:p>
+    <w:p>
+      <w:pPr>
+        <w:shd w:val="clear" w:color="auto" w:fill="FFFFFF"/>
+        <w:spacing w:after="0" w:line="240" w:lineRule="auto"/>
+        <w:rPr>
+          <w:rFonts w:ascii="Consolas" w:eastAsia="Times New Roman" w:hAnsi="Consolas" w:cs="Times New Roman"/>
+          <w:color w:val="000000"/>
+          <w:kern w:val="0"/>
+          <w:lang w:eastAsia="es-ES"/>
+          <w14:ligatures w14:val="none"/>
+        </w:rPr>
+      </w:pPr>
+      <w:r>
+        <w:rPr>
+          <w:rFonts w:ascii="Consolas" w:eastAsia="Times New Roman" w:hAnsi="Consolas" w:cs="Times New Roman"/>
+          <w:color w:val="3F7F5F"/>
+          <w:kern w:val="0"/>
+          <w:lang w:eastAsia="es-ES"/>
+          <w14:ligatures w14:val="none"/>
+        </w:rPr>
+        <w:t xml:space="preserve">//     </w:t>
+      </w:r>
+      <w:r>
+        <w:rPr>
+          <w:rFonts w:ascii="Consolas" w:eastAsia="Times New Roman" w:hAnsi="Consolas" w:cs="Times New Roman"/>
+          <w:color w:val="3F7F5F"/>
+          <w:kern w:val="0"/>
+          <w:u w:val="single"/>
+          <w:lang w:eastAsia="es-ES"/>
+          <w14:ligatures w14:val="none"/>
+        </w:rPr>
+        <w:t>Modificación</w:t>
+      </w:r>
+      <w:r>
+        <w:rPr>
+          <w:rFonts w:ascii="Consolas" w:eastAsia="Times New Roman" w:hAnsi="Consolas" w:cs="Times New Roman"/>
+          <w:color w:val="3F7F5F"/>
+          <w:kern w:val="0"/>
+          <w:lang w:eastAsia="es-ES"/>
+          <w14:ligatures w14:val="none"/>
+        </w:rPr>
+        <w:t xml:space="preserve"> (sin password) y </w:t>
+      </w:r>
+      <w:r>
+        <w:rPr>
+          <w:rFonts w:ascii="Consolas" w:eastAsia="Times New Roman" w:hAnsi="Consolas" w:cs="Times New Roman"/>
+          <w:color w:val="3F7F5F"/>
+          <w:kern w:val="0"/>
+          <w:u w:val="single"/>
+          <w:lang w:eastAsia="es-ES"/>
+          <w14:ligatures w14:val="none"/>
+        </w:rPr>
+        <w:t>que</w:t>
+      </w:r>
+      <w:r>
+        <w:rPr>
+          <w:rFonts w:ascii="Consolas" w:eastAsia="Times New Roman" w:hAnsi="Consolas" w:cs="Times New Roman"/>
+          <w:color w:val="3F7F5F"/>
+          <w:kern w:val="0"/>
+          <w:u w:val="single"/>
+          <w:lang w:eastAsia="es-ES"/>
+          <w14:ligatures w14:val="none"/>
+        </w:rPr>
+        <w:t xml:space="preserve"> </w:t>
+      </w:r>
+      <w:r>
+        <w:rPr>
+          <w:rFonts w:ascii="Consolas" w:eastAsia="Times New Roman" w:hAnsi="Consolas" w:cs="Times New Roman"/>
+          <w:color w:val="3F7F5F"/>
+          <w:kern w:val="0"/>
+          <w:lang w:eastAsia="es-ES"/>
+          <w14:ligatures w14:val="none"/>
+        </w:rPr>
+        <w:t xml:space="preserve">no </w:t>
+      </w:r>
+      <w:r>
+        <w:rPr>
+          <w:rFonts w:ascii="Consolas" w:eastAsia="Times New Roman" w:hAnsi="Consolas" w:cs="Times New Roman"/>
+          <w:color w:val="3F7F5F"/>
+          <w:kern w:val="0"/>
+          <w:u w:val="single"/>
+          <w:lang w:eastAsia="es-ES"/>
+          <w14:ligatures w14:val="none"/>
+        </w:rPr>
+        <w:t>salte</w:t>
+      </w:r>
+      <w:r>
+        <w:rPr>
+          <w:rFonts w:ascii="Consolas" w:eastAsia="Times New Roman" w:hAnsi="Consolas" w:cs="Times New Roman"/>
+          <w:color w:val="3F7F5F"/>
+          <w:kern w:val="0"/>
+          <w:lang w:eastAsia="es-ES"/>
+          <w14:ligatures w14:val="none"/>
+        </w:rPr>
+        <w:t xml:space="preserve"> el @NotBlank </w:t>
+      </w:r>
+      <w:r>
+        <w:rPr>
+          <w:rFonts w:ascii="Consolas" w:eastAsia="Times New Roman" w:hAnsi="Consolas" w:cs="Times New Roman"/>
+          <w:color w:val="3F7F5F"/>
+          <w:kern w:val="0"/>
+          <w:u w:val="single"/>
+          <w:lang w:eastAsia="es-ES"/>
+          <w14:ligatures w14:val="none"/>
+        </w:rPr>
+        <w:t>del</w:t>
+      </w:r>
+      <w:r>
+        <w:rPr>
+          <w:rFonts w:ascii="Consolas" w:eastAsia="Times New Roman" w:hAnsi="Consolas" w:cs="Times New Roman"/>
+          <w:color w:val="3F7F5F"/>
+          <w:kern w:val="0"/>
+          <w:lang w:eastAsia="es-ES"/>
+          <w14:ligatures w14:val="none"/>
+        </w:rPr>
+        <w:t xml:space="preserve"> </w:t>
+      </w:r>
+      <w:r>
+        <w:rPr>
+          <w:rFonts w:ascii="Consolas" w:eastAsia="Times New Roman" w:hAnsi="Consolas" w:cs="Times New Roman"/>
+          <w:color w:val="3F7F5F"/>
+          <w:kern w:val="0"/>
+          <w:u w:val="single"/>
+          <w:lang w:eastAsia="es-ES"/>
+          <w14:ligatures w14:val="none"/>
+        </w:rPr>
+        <w:t>validator</w:t>
+      </w:r>
+    </w:p>
+    <w:p>
+      <w:pPr>
+        <w:shd w:val="clear" w:color="auto" w:fill="FFFFFF"/>
+        <w:spacing w:after="0" w:line="240" w:lineRule="auto"/>
+        <w:rPr>
+          <w:rFonts w:ascii="Consolas" w:eastAsia="Times New Roman" w:hAnsi="Consolas" w:cs="Times New Roman"/>
+          <w:color w:val="000000"/>
+          <w:kern w:val="0"/>
+          <w:lang w:eastAsia="es-ES"/>
+          <w14:ligatures w14:val="none"/>
+        </w:rPr>
+      </w:pPr>
+      <w:r>
+        <w:rPr>
+          <w:rFonts w:ascii="Consolas" w:eastAsia="Times New Roman" w:hAnsi="Consolas" w:cs="Times New Roman"/>
+          <w:color w:val="000000"/>
+          <w:kern w:val="0"/>
+          <w:lang w:eastAsia="es-ES"/>
+          <w14:ligatures w14:val="none"/>
+        </w:rPr>
+        <w:tab/>
+        <w:t xml:space="preserve">    Class&lt;?&gt; </w:t>
+      </w:r>
+      <w:r>
+        <w:rPr>
+          <w:rFonts w:ascii="Consolas" w:eastAsia="Times New Roman" w:hAnsi="Consolas" w:cs="Times New Roman"/>
+          <w:color w:val="6A3E3E"/>
+          <w:kern w:val="0"/>
+          <w:lang w:eastAsia="es-ES"/>
+          <w14:ligatures w14:val="none"/>
+        </w:rPr>
+        <w:t>grupo</w:t>
+      </w:r>
+      <w:r>
+        <w:rPr>
+          <w:rFonts w:ascii="Consolas" w:eastAsia="Times New Roman" w:hAnsi="Consolas" w:cs="Times New Roman"/>
+          <w:color w:val="000000"/>
+          <w:kern w:val="0"/>
+          <w:lang w:eastAsia="es-ES"/>
+          <w14:ligatures w14:val="none"/>
+        </w:rPr>
+        <w:t xml:space="preserve"> = (</w:t>
+      </w:r>
+      <w:r>
+        <w:rPr>
+          <w:rFonts w:ascii="Consolas" w:eastAsia="Times New Roman" w:hAnsi="Consolas" w:cs="Times New Roman"/>
+          <w:color w:val="6A3E3E"/>
+          <w:kern w:val="0"/>
+          <w:lang w:eastAsia="es-ES"/>
+          <w14:ligatures w14:val="none"/>
+        </w:rPr>
+        <w:t>form</w:t>
+      </w:r>
+      <w:r>
+        <w:rPr>
+          <w:rFonts w:ascii="Consolas" w:eastAsia="Times New Roman" w:hAnsi="Consolas" w:cs="Times New Roman"/>
+          <w:color w:val="000000"/>
+          <w:kern w:val="0"/>
+          <w:lang w:eastAsia="es-ES"/>
+          <w14:ligatures w14:val="none"/>
+        </w:rPr>
+        <w:t xml:space="preserve">.getId() == </w:t>
+      </w:r>
+      <w:r>
+        <w:rPr>
+          <w:rFonts w:ascii="Consolas" w:eastAsia="Times New Roman" w:hAnsi="Consolas" w:cs="Times New Roman"/>
+          <w:b/>
+          <w:bCs/>
+          <w:color w:val="7F0055"/>
+          <w:kern w:val="0"/>
+          <w:lang w:eastAsia="es-ES"/>
+          <w14:ligatures w14:val="none"/>
+        </w:rPr>
+        <w:t>null</w:t>
+      </w:r>
+      <w:r>
+        <w:rPr>
+          <w:rFonts w:ascii="Consolas" w:eastAsia="Times New Roman" w:hAnsi="Consolas" w:cs="Times New Roman"/>
+          <w:color w:val="000000"/>
+          <w:kern w:val="0"/>
+          <w:lang w:eastAsia="es-ES"/>
+          <w14:ligatures w14:val="none"/>
+        </w:rPr>
+        <w:t>) ? OnCreate.</w:t>
+      </w:r>
+      <w:r>
+        <w:rPr>
+          <w:rFonts w:ascii="Consolas" w:eastAsia="Times New Roman" w:hAnsi="Consolas" w:cs="Times New Roman"/>
+          <w:b/>
+          <w:bCs/>
+          <w:color w:val="7F0055"/>
+          <w:kern w:val="0"/>
+          <w:lang w:eastAsia="es-ES"/>
+          <w14:ligatures w14:val="none"/>
+        </w:rPr>
+        <w:t>class</w:t>
+      </w:r>
+      <w:r>
+        <w:rPr>
+          <w:rFonts w:ascii="Consolas" w:eastAsia="Times New Roman" w:hAnsi="Consolas" w:cs="Times New Roman"/>
+          <w:color w:val="000000"/>
+          <w:kern w:val="0"/>
+          <w:lang w:eastAsia="es-ES"/>
+          <w14:ligatures w14:val="none"/>
+        </w:rPr>
+        <w:t xml:space="preserve"> : OnUpdate.</w:t>
+      </w:r>
+      <w:r>
+        <w:rPr>
+          <w:rFonts w:ascii="Consolas" w:eastAsia="Times New Roman" w:hAnsi="Consolas" w:cs="Times New Roman"/>
+          <w:b/>
+          <w:bCs/>
+          <w:color w:val="7F0055"/>
+          <w:kern w:val="0"/>
+          <w:lang w:eastAsia="es-ES"/>
+          <w14:ligatures w14:val="none"/>
+        </w:rPr>
+        <w:t>class</w:t>
+      </w:r>
+      <w:r>
+        <w:rPr>
+          <w:rFonts w:ascii="Consolas" w:eastAsia="Times New Roman" w:hAnsi="Consolas" w:cs="Times New Roman"/>
+          <w:color w:val="000000"/>
+          <w:kern w:val="0"/>
+          <w:lang w:eastAsia="es-ES"/>
+          <w14:ligatures w14:val="none"/>
+        </w:rPr>
+        <w:t>;</w:t>
+      </w:r>
+    </w:p>
+    <w:p>
+      <w:pPr>
+        <w:shd w:val="clear" w:color="auto" w:fill="FFFFFF"/>
+        <w:spacing w:after="0" w:line="240" w:lineRule="auto"/>
+        <w:rPr>
+          <w:rFonts w:ascii="Consolas" w:eastAsia="Times New Roman" w:hAnsi="Consolas" w:cs="Times New Roman"/>
+          <w:color w:val="000000"/>
+          <w:kern w:val="0"/>
+          <w:lang w:eastAsia="es-ES"/>
+          <w14:ligatures w14:val="none"/>
+        </w:rPr>
+      </w:pPr>
+    </w:p>
+    <w:p>
+      <w:pPr>
+        <w:shd w:val="clear" w:color="auto" w:fill="FFFFFF"/>
+        <w:spacing w:after="0" w:line="240" w:lineRule="auto"/>
+        <w:rPr>
+          <w:rFonts w:ascii="Consolas" w:eastAsia="Times New Roman" w:hAnsi="Consolas" w:cs="Times New Roman"/>
+          <w:color w:val="000000"/>
+          <w:kern w:val="0"/>
+          <w:lang w:eastAsia="es-ES"/>
+          <w14:ligatures w14:val="none"/>
+        </w:rPr>
+      </w:pPr>
+      <w:r>
+        <w:rPr>
+          <w:rFonts w:ascii="Consolas" w:eastAsia="Times New Roman" w:hAnsi="Consolas" w:cs="Times New Roman"/>
+          <w:color w:val="3F7F5F"/>
+          <w:kern w:val="0"/>
+          <w:lang w:eastAsia="es-ES"/>
+          <w14:ligatures w14:val="none"/>
+        </w:rPr>
+        <w:t xml:space="preserve">// 2) </w:t>
+      </w:r>
+      <w:r>
+        <w:rPr>
+          <w:rFonts w:ascii="Consolas" w:eastAsia="Times New Roman" w:hAnsi="Consolas" w:cs="Times New Roman"/>
+          <w:color w:val="3F7F5F"/>
+          <w:kern w:val="0"/>
+          <w:u w:val="single"/>
+          <w:lang w:eastAsia="es-ES"/>
+          <w14:ligatures w14:val="none"/>
+        </w:rPr>
+        <w:t>Validar</w:t>
+      </w:r>
+      <w:r>
+        <w:rPr>
+          <w:rFonts w:ascii="Consolas" w:eastAsia="Times New Roman" w:hAnsi="Consolas" w:cs="Times New Roman"/>
+          <w:color w:val="3F7F5F"/>
+          <w:kern w:val="0"/>
+          <w:lang w:eastAsia="es-ES"/>
+          <w14:ligatures w14:val="none"/>
+        </w:rPr>
+        <w:t xml:space="preserve"> </w:t>
+      </w:r>
+      <w:r>
+        <w:rPr>
+          <w:rFonts w:ascii="Consolas" w:eastAsia="Times New Roman" w:hAnsi="Consolas" w:cs="Times New Roman"/>
+          <w:color w:val="3F7F5F"/>
+          <w:kern w:val="0"/>
+          <w:u w:val="single"/>
+          <w:lang w:eastAsia="es-ES"/>
+          <w14:ligatures w14:val="none"/>
+        </w:rPr>
+        <w:t>dinámicamente</w:t>
+      </w:r>
+      <w:r>
+        <w:rPr>
+          <w:rFonts w:ascii="Consolas" w:eastAsia="Times New Roman" w:hAnsi="Consolas" w:cs="Times New Roman"/>
+          <w:color w:val="3F7F5F"/>
+          <w:kern w:val="0"/>
+          <w:lang w:eastAsia="es-ES"/>
+          <w14:ligatures w14:val="none"/>
+        </w:rPr>
+        <w:t xml:space="preserve"> </w:t>
+      </w:r>
+      <w:r>
+        <w:rPr>
+          <w:rFonts w:ascii="Consolas" w:eastAsia="Times New Roman" w:hAnsi="Consolas" w:cs="Times New Roman"/>
+          <w:color w:val="3F7F5F"/>
+          <w:kern w:val="0"/>
+          <w:u w:val="single"/>
+          <w:lang w:eastAsia="es-ES"/>
+          <w14:ligatures w14:val="none"/>
+        </w:rPr>
+        <w:t>según</w:t>
+      </w:r>
+      <w:r>
+        <w:rPr>
+          <w:rFonts w:ascii="Consolas" w:eastAsia="Times New Roman" w:hAnsi="Consolas" w:cs="Times New Roman"/>
+          <w:color w:val="3F7F5F"/>
+          <w:kern w:val="0"/>
+          <w:lang w:eastAsia="es-ES"/>
+          <w14:ligatures w14:val="none"/>
+        </w:rPr>
+        <w:t xml:space="preserve"> el </w:t>
+      </w:r>
+      <w:r>
+        <w:rPr>
+          <w:rFonts w:ascii="Consolas" w:eastAsia="Times New Roman" w:hAnsi="Consolas" w:cs="Times New Roman"/>
+          <w:color w:val="3F7F5F"/>
+          <w:kern w:val="0"/>
+          <w:u w:val="single"/>
+          <w:lang w:eastAsia="es-ES"/>
+          <w14:ligatures w14:val="none"/>
+        </w:rPr>
+        <w:t>grupo</w:t>
+      </w:r>
+    </w:p>
+    <w:p>
+      <w:pPr>
+        <w:shd w:val="clear" w:color="auto" w:fill="FFFFFF"/>
+        <w:spacing w:after="0" w:line="240" w:lineRule="auto"/>
+        <w:rPr>
+          <w:rFonts w:ascii="Consolas" w:eastAsia="Times New Roman" w:hAnsi="Consolas" w:cs="Times New Roman"/>
+          <w:color w:val="000000"/>
+          <w:kern w:val="0"/>
+          <w:lang w:eastAsia="es-ES"/>
+          <w14:ligatures w14:val="none"/>
+        </w:rPr>
+      </w:pPr>
+      <w:r>
+        <w:rPr>
+          <w:rFonts w:ascii="Consolas" w:eastAsia="Times New Roman" w:hAnsi="Consolas" w:cs="Times New Roman"/>
+          <w:color w:val="000000"/>
+          <w:kern w:val="0"/>
+          <w:lang w:eastAsia="es-ES"/>
+          <w14:ligatures w14:val="none"/>
+        </w:rPr>
+        <w:tab/>
+        <w:t xml:space="preserve">    </w:t>
+      </w:r>
+      <w:r>
+        <w:rPr>
+          <w:rFonts w:ascii="Consolas" w:eastAsia="Times New Roman" w:hAnsi="Consolas" w:cs="Times New Roman"/>
+          <w:b/>
+          <w:bCs/>
+          <w:color w:val="7F0055"/>
+          <w:kern w:val="0"/>
+          <w:lang w:eastAsia="es-ES"/>
+          <w14:ligatures w14:val="none"/>
+        </w:rPr>
+        <w:t>new</w:t>
+      </w:r>
+      <w:r>
+        <w:rPr>
+          <w:rFonts w:ascii="Consolas" w:eastAsia="Times New Roman" w:hAnsi="Consolas" w:cs="Times New Roman"/>
+          <w:color w:val="000000"/>
+          <w:kern w:val="0"/>
+          <w:lang w:eastAsia="es-ES"/>
+          <w14:ligatures w14:val="none"/>
+        </w:rPr>
+        <w:t xml:space="preserve"> SpringValidatorAdapter(</w:t>
+      </w:r>
+      <w:r>
+        <w:rPr>
+          <w:rFonts w:ascii="Consolas" w:eastAsia="Times New Roman" w:hAnsi="Consolas" w:cs="Times New Roman"/>
+          <w:color w:val="0000C0"/>
+          <w:kern w:val="0"/>
+          <w:lang w:eastAsia="es-ES"/>
+          <w14:ligatures w14:val="none"/>
+        </w:rPr>
+        <w:t>validator</w:t>
+      </w:r>
+      <w:r>
+        <w:rPr>
+          <w:rFonts w:ascii="Consolas" w:eastAsia="Times New Roman" w:hAnsi="Consolas" w:cs="Times New Roman"/>
+          <w:color w:val="000000"/>
+          <w:kern w:val="0"/>
+          <w:lang w:eastAsia="es-ES"/>
+          <w14:ligatures w14:val="none"/>
+        </w:rPr>
+        <w:t>)</w:t>
+      </w:r>
+    </w:p>
+    <w:p>
+      <w:pPr>
+        <w:shd w:val="clear" w:color="auto" w:fill="FFFFFF"/>
+        <w:spacing w:after="0" w:line="240" w:lineRule="auto"/>
+        <w:rPr>
+          <w:rFonts w:ascii="Consolas" w:eastAsia="Times New Roman" w:hAnsi="Consolas" w:cs="Times New Roman"/>
+          <w:color w:val="000000"/>
+          <w:kern w:val="0"/>
+          <w:lang w:eastAsia="es-ES"/>
+          <w14:ligatures w14:val="none"/>
+        </w:rPr>
+      </w:pPr>
+      <w:r>
+        <w:rPr>
+          <w:rFonts w:ascii="Consolas" w:eastAsia="Times New Roman" w:hAnsi="Consolas" w:cs="Times New Roman"/>
+          <w:color w:val="000000"/>
+          <w:kern w:val="0"/>
+          <w:lang w:eastAsia="es-ES"/>
+          <w14:ligatures w14:val="none"/>
+        </w:rPr>
+        <w:tab/>
+        <w:t xml:space="preserve">            .validate(</w:t>
+      </w:r>
+      <w:r>
+        <w:rPr>
+          <w:rFonts w:ascii="Consolas" w:eastAsia="Times New Roman" w:hAnsi="Consolas" w:cs="Times New Roman"/>
+          <w:color w:val="6A3E3E"/>
+          <w:kern w:val="0"/>
+          <w:lang w:eastAsia="es-ES"/>
+          <w14:ligatures w14:val="none"/>
+        </w:rPr>
+        <w:t>form</w:t>
+      </w:r>
+      <w:r>
+        <w:rPr>
+          <w:rFonts w:ascii="Consolas" w:eastAsia="Times New Roman" w:hAnsi="Consolas" w:cs="Times New Roman"/>
+          <w:color w:val="000000"/>
+          <w:kern w:val="0"/>
+          <w:lang w:eastAsia="es-ES"/>
+          <w14:ligatures w14:val="none"/>
+        </w:rPr>
+        <w:t xml:space="preserve">, </w:t>
+      </w:r>
+      <w:r>
+        <w:rPr>
+          <w:rFonts w:ascii="Consolas" w:eastAsia="Times New Roman" w:hAnsi="Consolas" w:cs="Times New Roman"/>
+          <w:color w:val="6A3E3E"/>
+          <w:kern w:val="0"/>
+          <w:lang w:eastAsia="es-ES"/>
+          <w14:ligatures w14:val="none"/>
+        </w:rPr>
+        <w:t>result</w:t>
+      </w:r>
+      <w:r>
+        <w:rPr>
+          <w:rFonts w:ascii="Consolas" w:eastAsia="Times New Roman" w:hAnsi="Consolas" w:cs="Times New Roman"/>
+          <w:color w:val="000000"/>
+          <w:kern w:val="0"/>
+          <w:lang w:eastAsia="es-ES"/>
+          <w14:ligatures w14:val="none"/>
+        </w:rPr>
+        <w:t xml:space="preserve">, </w:t>
+      </w:r>
+      <w:r>
+        <w:rPr>
+          <w:rFonts w:ascii="Consolas" w:eastAsia="Times New Roman" w:hAnsi="Consolas" w:cs="Times New Roman"/>
+          <w:color w:val="6A3E3E"/>
+          <w:kern w:val="0"/>
+          <w:lang w:eastAsia="es-ES"/>
+          <w14:ligatures w14:val="none"/>
+        </w:rPr>
+        <w:t>grupo</w:t>
+      </w:r>
+      <w:r>
+        <w:rPr>
+          <w:rFonts w:ascii="Consolas" w:eastAsia="Times New Roman" w:hAnsi="Consolas" w:cs="Times New Roman"/>
+          <w:color w:val="000000"/>
+          <w:kern w:val="0"/>
+          <w:lang w:eastAsia="es-ES"/>
+          <w14:ligatures w14:val="none"/>
+        </w:rPr>
+        <w:t>);</w:t>
+      </w:r>
+    </w:p>
+    <w:p>
+      <w:pPr>
+        <w:shd w:val="clear" w:color="auto" w:fill="FFFFFF"/>
+        <w:spacing w:after="0" w:line="240" w:lineRule="auto"/>
+        <w:rPr>
+          <w:rFonts w:ascii="Consolas" w:eastAsia="Times New Roman" w:hAnsi="Consolas" w:cs="Times New Roman"/>
+          <w:color w:val="000000"/>
+          <w:kern w:val="0"/>
+          <w:sz w:val="18"/>
+          <w:szCs w:val="18"/>
+          <w:lang w:eastAsia="es-ES"/>
+          <w14:ligatures w14:val="none"/>
+        </w:rPr>
+      </w:pPr>
+    </w:p>
+    <w:p>
+      <w:pPr>
+        <w:pStyle w:val="NormalWeb"/>
+        <w:shd w:val="clear" w:color="auto" w:fill="FFFFFF"/>
+        <w:spacing w:before="0" w:beforeAutospacing="0" w:after="0" w:afterAutospacing="0"/>
+        <w:ind w:firstLine="708"/>
+        <w:rPr>
+          <w:rFonts w:ascii="Consolas" w:hAnsi="Consolas"/>
+          <w:color w:val="000000"/>
+          <w:u w:val="single"/>
+        </w:rPr>
+      </w:pPr>
+    </w:p>
+    <w:p>
+      <w:pPr>
+        <w:ind w:firstLine="708"/>
+      </w:pPr>
+      <w:r>
+        <w:t>Con este mecanismo y este ejemplo, se validará el campo “confirmPassword”, sólo si el “id” no existe, asignando al “validator” el grupo “OnCreate”, es decir, cuando es NUEVO.</w:t>
+      </w:r>
+      <w:r>
+        <w:t xml:space="preserve"> En los casos de modificación, se asigna el grupo “OnUpdate” y el validador obviará los asignado a otros grupos.</w:t>
+      </w:r>
+    </w:p>
+    <w:p>
+      <w:pPr>
+        <w:ind w:firstLine="708"/>
+      </w:pPr>
+      <w:r>
+        <w:t>Por defecto, todos los atributos están identificados con el grupo “Default” que ya incorpora Spring.</w:t>
+      </w:r>
+    </w:p>
+    <w:p>
+      <w:pPr>
+        <w:pStyle w:val="NormalWeb"/>
+        <w:shd w:val="clear" w:color="auto" w:fill="FFFFFF"/>
+        <w:spacing w:before="0" w:beforeAutospacing="0" w:after="0" w:afterAutospacing="0"/>
+        <w:rPr>
+          <w:rFonts w:ascii="Consolas" w:hAnsi="Consolas"/>
+          <w:color w:val="000000"/>
+          <w:u w:val="single"/>
+        </w:rPr>
+      </w:pPr>
+      <w:r>
+        <w:rPr>
+          <w:rFonts w:ascii="Consolas" w:hAnsi="Consolas"/>
+          <w:color w:val="000000"/>
+          <w:u w:val="single"/>
+        </w:rPr>
+        <w:t>Resultado de la validación</w:t>
+      </w:r>
+    </w:p>
+    <w:p>
+      <w:pPr>
+        <w:ind w:firstLine="708"/>
+      </w:pPr>
+    </w:p>
+    <w:p>
+      <w:pPr>
+        <w:ind w:firstLine="708"/>
+      </w:pPr>
+      <w:r>
+        <w:t>Si algun</w:t>
+      </w:r>
+      <w:r>
+        <w:t xml:space="preserve">a de las validaciones no se cumple, </w:t>
+      </w:r>
+      <w:r>
+        <w:t xml:space="preserve">por cualquier de los dos mecanismos descritos anteriormente, </w:t>
+      </w:r>
+      <w:r>
+        <w:t xml:space="preserve">se generan los mensajes </w:t>
+      </w:r>
+      <w:r>
+        <w:t xml:space="preserve">asociados a cada validación y </w:t>
+      </w:r>
+      <w:r>
+        <w:t xml:space="preserve"> </w:t>
+      </w:r>
+      <w:r>
+        <w:t xml:space="preserve">devolviéndose </w:t>
+      </w:r>
+      <w:r>
+        <w:t>a la vista</w:t>
+      </w:r>
+      <w:r>
+        <w:t>.</w:t>
+      </w:r>
+    </w:p>
+    <w:p>
+      <w:pPr>
+        <w:ind w:firstLine="708"/>
+      </w:pPr>
+      <w:r>
+        <w:t>Para ser mostrado, se añaden al formulario unos “divs” que son interpretados por “Thymeleaf” en nuestro caso, y que sólo se mostrarán cuando existan.</w:t>
+      </w:r>
+    </w:p>
+    <w:p>
+      <w:pPr>
+        <w:ind w:firstLine="708"/>
+      </w:pPr>
+      <w:r>
+        <w:t>Ejemplo de implementación</w:t>
+      </w:r>
+      <w:r>
+        <w:t>:</w:t>
+      </w:r>
+    </w:p>
+    <w:p>
+      <w:pPr>
+        <w:pStyle w:val="NormalWeb"/>
+        <w:shd w:val="clear" w:color="auto" w:fill="FFFFFF"/>
+        <w:spacing w:before="0" w:beforeAutospacing="0" w:after="0" w:afterAutospacing="0"/>
+        <w:ind w:firstLine="708"/>
+        <w:rPr>
+          <w:rFonts w:ascii="Consolas" w:hAnsi="Consolas"/>
+          <w:color w:val="000000"/>
           <w:sz w:val="20"/>
           <w:szCs w:val="20"/>
         </w:rPr>
@@ -1444,7 +3640,6 @@
           <w:szCs w:val="20"/>
           <w:shd w:val="clear" w:color="auto" w:fill="FFFFFF"/>
         </w:rPr>
-        <w:lastRenderedPageBreak/>
         <w:t>&lt;</w:t>
       </w:r>
       <w:r>
@@ -1641,6 +3836,7 @@
           <w:sz w:val="18"/>
           <w:szCs w:val="18"/>
         </w:rPr>
+        <w:lastRenderedPageBreak/>
         <w:t>@PostMapping</w:t>
       </w:r>
       <w:r>
@@ -2089,7 +4285,16 @@
           <w:sz w:val="18"/>
           <w:szCs w:val="18"/>
         </w:rPr>
-        <w:t>"/</w:t>
+        <w:t>"</w:t>
+      </w:r>
+      <w:r>
+        <w:rPr>
+          <w:rFonts w:ascii="Consolas" w:hAnsi="Consolas"/>
+          <w:color w:val="2A00FF"/>
+          <w:sz w:val="18"/>
+          <w:szCs w:val="18"/>
+        </w:rPr>
+        <w:t>vista_del_</w:t>
       </w:r>
       <w:r>
         <w:rPr>
@@ -2172,10 +4377,24 @@
     <w:p>
       <w:r>
         <w:tab/>
-        <w:t xml:space="preserve">Los datos del formulario pueden ser válidos en formato y demás, pero no cumplir las reglas de negocio que tenemos en nuestro modelo, en nuestro caso </w:t>
-      </w:r>
-      <w:r>
-        <w:t>en los “services”. En este caso, generaremos via “Exceptions” los errores que consideremos oportunos, aparte de errores de “RunTimeException” no controlados.</w:t>
+        <w:t xml:space="preserve">Los datos del formulario pueden ser válidos en formato </w:t>
+      </w:r>
+      <w:r>
+        <w:t>de acuerdo a lo determinado en sus atributos</w:t>
+      </w:r>
+      <w:r>
+        <w:t xml:space="preserve">, pero no cumplir las reglas de negocio que tenemos en nuestro modelo, en nuestro caso </w:t>
+      </w:r>
+      <w:r>
+        <w:t xml:space="preserve">en los “services”. </w:t>
+      </w:r>
+    </w:p>
+    <w:p>
+      <w:pPr>
+        <w:ind w:firstLine="708"/>
+      </w:pPr>
+      <w:r>
+        <w:t>En este caso, generaremos via “Exceptions” los errores que consideremos oportunos, aparte de errores de “RunTimeException” no controlados.</w:t>
       </w:r>
     </w:p>
     <w:p>
@@ -2751,22 +4970,335 @@
     <w:p>
       <w:pPr>
         <w:rPr>
-          <w:b/>
-          <w:bCs/>
-        </w:rPr>
-      </w:pPr>
-      <w:r>
-        <w:t>-</w:t>
-      </w:r>
-      <w:r>
-        <w:t xml:space="preserve">  </w:t>
-      </w:r>
-      <w:r>
-        <w:rPr>
-          <w:b/>
-          <w:bCs/>
-        </w:rPr>
+          <w:rFonts w:ascii="Consolas" w:hAnsi="Consolas"/>
+          <w:color w:val="646464"/>
+          <w:shd w:val="clear" w:color="auto" w:fill="FFFFFF"/>
+        </w:rPr>
+      </w:pPr>
+      <w:r>
+        <w:t xml:space="preserve">Para evitar “múltiples” </w:t>
+      </w:r>
+      <w:r>
         <w:t>try/catch en el Controller</w:t>
+      </w:r>
+      <w:r>
+        <w:t>, y sobre todo, la famosa página</w:t>
+      </w:r>
+      <w:r>
+        <w:rPr>
+          <w:b/>
+          <w:bCs/>
+        </w:rPr>
+        <w:t xml:space="preserve"> “ERROR 500”, </w:t>
+      </w:r>
+      <w:r>
+        <w:t>se ha implementado un manejador Global de excepciones en la clase</w:t>
+      </w:r>
+      <w:r>
+        <w:rPr>
+          <w:b/>
+          <w:bCs/>
+        </w:rPr>
+        <w:t xml:space="preserve"> </w:t>
+      </w:r>
+      <w:r>
+        <w:rPr>
+          <w:rFonts w:ascii="Consolas" w:hAnsi="Consolas"/>
+          <w:color w:val="000000"/>
+          <w:shd w:val="clear" w:color="auto" w:fill="FFFFFF"/>
+        </w:rPr>
+        <w:t>GlobalExceptionHandler</w:t>
+      </w:r>
+      <w:r>
+        <w:rPr>
+          <w:rFonts w:ascii="Consolas" w:hAnsi="Consolas"/>
+          <w:color w:val="000000"/>
+          <w:shd w:val="clear" w:color="auto" w:fill="FFFFFF"/>
+        </w:rPr>
+        <w:t xml:space="preserve">, </w:t>
+      </w:r>
+      <w:r>
+        <w:t>anotado como</w:t>
+      </w:r>
+      <w:r>
+        <w:rPr>
+          <w:rFonts w:ascii="Consolas" w:hAnsi="Consolas"/>
+          <w:color w:val="000000"/>
+          <w:shd w:val="clear" w:color="auto" w:fill="FFFFFF"/>
+        </w:rPr>
+        <w:t xml:space="preserve"> </w:t>
+      </w:r>
+      <w:r>
+        <w:rPr>
+          <w:rFonts w:ascii="Consolas" w:hAnsi="Consolas"/>
+          <w:color w:val="646464"/>
+          <w:shd w:val="clear" w:color="auto" w:fill="FFFFFF"/>
+        </w:rPr>
+        <w:t>@ControllerAdvice</w:t>
+      </w:r>
+      <w:r>
+        <w:rPr>
+          <w:rFonts w:ascii="Consolas" w:hAnsi="Consolas"/>
+          <w:color w:val="646464"/>
+          <w:shd w:val="clear" w:color="auto" w:fill="FFFFFF"/>
+        </w:rPr>
+        <w:t>.</w:t>
+      </w:r>
+    </w:p>
+    <w:p>
+      <w:pPr>
+        <w:rPr>
+          <w:rFonts w:ascii="Consolas" w:hAnsi="Consolas"/>
+          <w:color w:val="646464"/>
+          <w:shd w:val="clear" w:color="auto" w:fill="FFFFFF"/>
+        </w:rPr>
+      </w:pPr>
+      <w:r>
+        <w:t>Compartidas por</w:t>
+      </w:r>
+      <w:r>
+        <w:t xml:space="preserve"> todas las clases anotadas como</w:t>
+      </w:r>
+      <w:r>
+        <w:rPr>
+          <w:rFonts w:ascii="Consolas" w:hAnsi="Consolas"/>
+          <w:color w:val="646464"/>
+          <w:shd w:val="clear" w:color="auto" w:fill="FFFFFF"/>
+        </w:rPr>
+        <w:t xml:space="preserve"> @Controller.</w:t>
+      </w:r>
+    </w:p>
+    <w:p>
+      <w:pPr>
+        <w:rPr>
+          <w:rFonts w:ascii="Consolas" w:hAnsi="Consolas"/>
+          <w:color w:val="646464"/>
+          <w:shd w:val="clear" w:color="auto" w:fill="FFFFFF"/>
+        </w:rPr>
+      </w:pPr>
+      <w:r>
+        <w:rPr>
+          <w:noProof/>
+        </w:rPr>
+        <w:drawing>
+          <wp:inline distT="0" distB="0" distL="0" distR="0" wp14:anchorId="0547FE51" wp14:editId="35F42D03">
+            <wp:extent cx="3733333" cy="1780952"/>
+            <wp:effectExtent l="0" t="0" r="635" b="0"/>
+            <wp:docPr id="1" name="Imagen 1"/>
+            <wp:cNvGraphicFramePr>
+              <a:graphicFrameLocks xmlns:a="http://schemas.openxmlformats.org/drawingml/2006/main" noChangeAspect="1"/>
+            </wp:cNvGraphicFramePr>
+            <a:graphic xmlns:a="http://schemas.openxmlformats.org/drawingml/2006/main">
+              <a:graphicData uri="http://schemas.openxmlformats.org/drawingml/2006/picture">
+                <pic:pic xmlns:pic="http://schemas.openxmlformats.org/drawingml/2006/picture">
+                  <pic:nvPicPr>
+                    <pic:cNvPr id="1" name=""/>
+                    <pic:cNvPicPr/>
+                  </pic:nvPicPr>
+                  <pic:blipFill>
+                    <a:blip r:embed="rId10"/>
+                    <a:stretch>
+                      <a:fillRect/>
+                    </a:stretch>
+                  </pic:blipFill>
+                  <pic:spPr>
+                    <a:xfrm>
+                      <a:off x="0" y="0"/>
+                      <a:ext cx="3733333" cy="1780952"/>
+                    </a:xfrm>
+                    <a:prstGeom prst="rect">
+                      <a:avLst/>
+                    </a:prstGeom>
+                  </pic:spPr>
+                </pic:pic>
+              </a:graphicData>
+            </a:graphic>
+          </wp:inline>
+        </w:drawing>
+      </w:r>
+    </w:p>
+    <w:p>
+      <w:r>
+        <w:lastRenderedPageBreak/>
+        <w:t>Se incorpora a esta clase el “MessageSource” para poder devolver el mensaje en el “Locale” del usuario.</w:t>
+      </w:r>
+    </w:p>
+    <w:p>
+      <w:pPr>
+        <w:rPr>
+          <w:rFonts w:ascii="Consolas" w:hAnsi="Consolas"/>
+          <w:color w:val="646464"/>
+          <w:shd w:val="clear" w:color="auto" w:fill="FFFFFF"/>
+        </w:rPr>
+      </w:pPr>
+      <w:r>
+        <w:rPr>
+          <w:rFonts w:ascii="Consolas" w:hAnsi="Consolas"/>
+          <w:color w:val="646464"/>
+          <w:shd w:val="clear" w:color="auto" w:fill="FFFFFF"/>
+        </w:rPr>
+        <w:t>Esta clase manejará las excepciones de nuestra clase principal de Excepciones “AppGlogalException” (clase abstracta)</w:t>
+      </w:r>
+    </w:p>
+    <w:p>
+      <w:pPr>
+        <w:rPr>
+          <w:rFonts w:ascii="Consolas" w:hAnsi="Consolas"/>
+          <w:color w:val="646464"/>
+          <w:shd w:val="clear" w:color="auto" w:fill="FFFFFF"/>
+        </w:rPr>
+      </w:pPr>
+      <w:r>
+        <w:rPr>
+          <w:rFonts w:ascii="Consolas" w:hAnsi="Consolas"/>
+          <w:color w:val="646464"/>
+          <w:shd w:val="clear" w:color="auto" w:fill="FFFFFF"/>
+        </w:rPr>
+        <w:drawing>
+          <wp:inline distT="0" distB="0" distL="0" distR="0" wp14:anchorId="5CE92667" wp14:editId="04F6698D">
+            <wp:extent cx="5400040" cy="1658620"/>
+            <wp:effectExtent l="0" t="0" r="0" b="0"/>
+            <wp:docPr id="2" name="Imagen 2"/>
+            <wp:cNvGraphicFramePr>
+              <a:graphicFrameLocks xmlns:a="http://schemas.openxmlformats.org/drawingml/2006/main" noChangeAspect="1"/>
+            </wp:cNvGraphicFramePr>
+            <a:graphic xmlns:a="http://schemas.openxmlformats.org/drawingml/2006/main">
+              <a:graphicData uri="http://schemas.openxmlformats.org/drawingml/2006/picture">
+                <pic:pic xmlns:pic="http://schemas.openxmlformats.org/drawingml/2006/picture">
+                  <pic:nvPicPr>
+                    <pic:cNvPr id="1" name=""/>
+                    <pic:cNvPicPr/>
+                  </pic:nvPicPr>
+                  <pic:blipFill>
+                    <a:blip r:embed="rId11"/>
+                    <a:stretch>
+                      <a:fillRect/>
+                    </a:stretch>
+                  </pic:blipFill>
+                  <pic:spPr>
+                    <a:xfrm>
+                      <a:off x="0" y="0"/>
+                      <a:ext cx="5400040" cy="1658620"/>
+                    </a:xfrm>
+                    <a:prstGeom prst="rect">
+                      <a:avLst/>
+                    </a:prstGeom>
+                  </pic:spPr>
+                </pic:pic>
+              </a:graphicData>
+            </a:graphic>
+          </wp:inline>
+        </w:drawing>
+      </w:r>
+    </w:p>
+    <w:p>
+      <w:pPr>
+        <w:rPr>
+          <w:b/>
+          <w:bCs/>
+        </w:rPr>
+      </w:pPr>
+      <w:r>
+        <w:rPr>
+          <w:b/>
+          <w:bCs/>
+        </w:rPr>
+        <w:t>De la que hemos definidos 4 agrupaciones:</w:t>
+      </w:r>
+    </w:p>
+    <w:p>
+      <w:pPr>
+        <w:pStyle w:val="Prrafodelista"/>
+        <w:numPr>
+          <w:ilvl w:val="0"/>
+          <w:numId w:val="6"/>
+        </w:numPr>
+        <w:rPr>
+          <w:b/>
+          <w:bCs/>
+        </w:rPr>
+      </w:pPr>
+      <w:r>
+        <w:rPr>
+          <w:b/>
+          <w:bCs/>
+        </w:rPr>
+        <w:t>MandatoryDataException Para los datos que son obligatorios.</w:t>
+      </w:r>
+    </w:p>
+    <w:p>
+      <w:pPr>
+        <w:pStyle w:val="Prrafodelista"/>
+        <w:numPr>
+          <w:ilvl w:val="0"/>
+          <w:numId w:val="6"/>
+        </w:numPr>
+        <w:rPr>
+          <w:b/>
+          <w:bCs/>
+        </w:rPr>
+      </w:pPr>
+      <w:r>
+        <w:rPr>
+          <w:b/>
+          <w:bCs/>
+        </w:rPr>
+        <w:t>InconsistencyDataException Valores no coinciden con los esperados.</w:t>
+      </w:r>
+    </w:p>
+    <w:p>
+      <w:pPr>
+        <w:pStyle w:val="Prrafodelista"/>
+        <w:numPr>
+          <w:ilvl w:val="0"/>
+          <w:numId w:val="6"/>
+        </w:numPr>
+        <w:rPr>
+          <w:b/>
+          <w:bCs/>
+        </w:rPr>
+      </w:pPr>
+      <w:r>
+        <w:rPr>
+          <w:b/>
+          <w:bCs/>
+        </w:rPr>
+        <w:t>NotDataFoundException Valores no encontrados.</w:t>
+      </w:r>
+    </w:p>
+    <w:p>
+      <w:pPr>
+        <w:pStyle w:val="Prrafodelista"/>
+        <w:numPr>
+          <w:ilvl w:val="0"/>
+          <w:numId w:val="6"/>
+        </w:numPr>
+        <w:rPr>
+          <w:b/>
+          <w:bCs/>
+        </w:rPr>
+      </w:pPr>
+      <w:r>
+        <w:rPr>
+          <w:b/>
+          <w:bCs/>
+        </w:rPr>
+        <w:t>AlreadyExistException Valores ya existentes.</w:t>
+      </w:r>
+    </w:p>
+    <w:p>
+      <w:pPr>
+        <w:rPr>
+          <w:b/>
+          <w:bCs/>
+        </w:rPr>
+      </w:pPr>
+      <w:r>
+        <w:rPr>
+          <w:b/>
+          <w:bCs/>
+        </w:rPr>
+        <w:t xml:space="preserve">A partir de esta clase, se han “centralizado” todas las Excepciones propias en </w:t>
       </w:r>
     </w:p>
     <w:p>
@@ -3081,7 +5613,6 @@
           <w:sz w:val="20"/>
           <w:szCs w:val="20"/>
         </w:rPr>
-        <w:lastRenderedPageBreak/>
         <w:t>catch</w:t>
       </w:r>
       <w:r>
@@ -3364,6 +5895,7 @@
     </w:p>
     <w:p>
       <w:r>
+        <w:lastRenderedPageBreak/>
         <w:t xml:space="preserve">FileStorageService es un servicio encargado de gestionar el almacenamiento físico de archivos en el sistema de ficheros del servidor. Su responsabilidad principal es </w:t>
       </w:r>
       <w:r>
@@ -3631,6 +6163,7 @@
           <w:b/>
           <w:bCs/>
         </w:rPr>
+        <w:lastRenderedPageBreak/>
         <w:t>Thymeleaf tiene restricciones de seguridad para acceder a la petición actual desde fragmentos (como el header).</w:t>
       </w:r>
     </w:p>
@@ -3834,7 +6367,6 @@
           <w:b/>
           <w:bCs/>
         </w:rPr>
-        <w:lastRenderedPageBreak/>
         <w:t>En lugar de reconstruir la URL, le pedimos al objeto que modifique solo lo que necesitamos:</w:t>
       </w:r>
     </w:p>
@@ -3978,6 +6510,7 @@
           <w:b/>
           <w:bCs/>
         </w:rPr>
+        <w:lastRenderedPageBreak/>
         <w:t>Como el peso es relativo, tu fórmula en el Java (o en la Query) será algo como:</w:t>
       </w:r>
     </w:p>
@@ -4181,150 +6714,150 @@
           <w:b/>
           <w:bCs/>
         </w:rPr>
+        <w:t xml:space="preserve">        &lt;/a&gt;</w:t>
+      </w:r>
+    </w:p>
+    <w:p>
+      <w:pPr>
+        <w:rPr>
+          <w:b/>
+          <w:bCs/>
+        </w:rPr>
+      </w:pPr>
+      <w:r>
+        <w:rPr>
+          <w:b/>
+          <w:bCs/>
+        </w:rPr>
+        <w:t xml:space="preserve">        </w:t>
+      </w:r>
+    </w:p>
+    <w:p>
+      <w:pPr>
+        <w:rPr>
+          <w:b/>
+          <w:bCs/>
+        </w:rPr>
+      </w:pPr>
+      <w:r>
+        <w:rPr>
+          <w:b/>
+          <w:bCs/>
+        </w:rPr>
+        <w:t xml:space="preserve">        &lt;p th:if="${curso.tieneTareaPendiente}" class="text-muted small mt-1 mb-0 text-center"&gt;</w:t>
+      </w:r>
+    </w:p>
+    <w:p>
+      <w:pPr>
+        <w:rPr>
+          <w:b/>
+          <w:bCs/>
+        </w:rPr>
+      </w:pPr>
+      <w:r>
+        <w:rPr>
+          <w:b/>
+          <w:bCs/>
+        </w:rPr>
+        <w:t xml:space="preserve">            &lt;i class="bi bi-clock-history"&gt;&lt;/i&gt; Esperando nota del profesor...</w:t>
+      </w:r>
+    </w:p>
+    <w:p>
+      <w:pPr>
+        <w:rPr>
+          <w:b/>
+          <w:bCs/>
+        </w:rPr>
+      </w:pPr>
+      <w:r>
+        <w:rPr>
+          <w:b/>
+          <w:bCs/>
+        </w:rPr>
+        <w:t xml:space="preserve">        &lt;/p&gt;</w:t>
+      </w:r>
+    </w:p>
+    <w:p>
+      <w:pPr>
+        <w:rPr>
+          <w:b/>
+          <w:bCs/>
+        </w:rPr>
+      </w:pPr>
+      <w:r>
+        <w:rPr>
+          <w:b/>
+          <w:bCs/>
+        </w:rPr>
+        <w:t xml:space="preserve">    &lt;/div&gt;</w:t>
+      </w:r>
+    </w:p>
+    <w:p>
+      <w:pPr>
+        <w:rPr>
+          <w:b/>
+          <w:bCs/>
+        </w:rPr>
+      </w:pPr>
+    </w:p>
+    <w:p>
+      <w:pPr>
+        <w:rPr>
+          <w:b/>
+          <w:bCs/>
+        </w:rPr>
+      </w:pPr>
+      <w:r>
+        <w:rPr>
+          <w:b/>
+          <w:bCs/>
+        </w:rPr>
+        <w:t>&lt;/div&gt;</w:t>
+      </w:r>
+    </w:p>
+    <w:p>
+      <w:pPr>
+        <w:rPr>
+          <w:b/>
+          <w:bCs/>
+        </w:rPr>
+      </w:pPr>
+      <w:r>
+        <w:rPr>
+          <w:b/>
+          <w:bCs/>
+        </w:rPr>
+        <w:t>3. La Barra de Progreso con "Hitos"</w:t>
+      </w:r>
+    </w:p>
+    <w:p>
+      <w:pPr>
+        <w:rPr>
+          <w:b/>
+          <w:bCs/>
+        </w:rPr>
+      </w:pPr>
+      <w:r>
+        <w:rPr>
+          <w:b/>
+          <w:bCs/>
+        </w:rPr>
+        <w:t>Dado que usas módulos con peso, la barra de progreso "Slim" que comentamos antes se verá muy bien. Si quieres que sea más informativa, puedes añadir un pequeño efecto visual para indicar que hay algo "pendiente":</w:t>
+      </w:r>
+    </w:p>
+    <w:p>
+      <w:pPr>
+        <w:rPr>
+          <w:b/>
+          <w:bCs/>
+        </w:rPr>
+      </w:pPr>
+      <w:r>
+        <w:rPr>
+          <w:b/>
+          <w:bCs/>
+        </w:rPr>
         <w:lastRenderedPageBreak/>
-        <w:t xml:space="preserve">        &lt;/a&gt;</w:t>
-      </w:r>
-    </w:p>
-    <w:p>
-      <w:pPr>
-        <w:rPr>
-          <w:b/>
-          <w:bCs/>
-        </w:rPr>
-      </w:pPr>
-      <w:r>
-        <w:rPr>
-          <w:b/>
-          <w:bCs/>
-        </w:rPr>
-        <w:t xml:space="preserve">        </w:t>
-      </w:r>
-    </w:p>
-    <w:p>
-      <w:pPr>
-        <w:rPr>
-          <w:b/>
-          <w:bCs/>
-        </w:rPr>
-      </w:pPr>
-      <w:r>
-        <w:rPr>
-          <w:b/>
-          <w:bCs/>
-        </w:rPr>
-        <w:t xml:space="preserve">        &lt;p th:if="${curso.tieneTareaPendiente}" class="text-muted small mt-1 mb-0 text-center"&gt;</w:t>
-      </w:r>
-    </w:p>
-    <w:p>
-      <w:pPr>
-        <w:rPr>
-          <w:b/>
-          <w:bCs/>
-        </w:rPr>
-      </w:pPr>
-      <w:r>
-        <w:rPr>
-          <w:b/>
-          <w:bCs/>
-        </w:rPr>
-        <w:t xml:space="preserve">            &lt;i class="bi bi-clock-history"&gt;&lt;/i&gt; Esperando nota del profesor...</w:t>
-      </w:r>
-    </w:p>
-    <w:p>
-      <w:pPr>
-        <w:rPr>
-          <w:b/>
-          <w:bCs/>
-        </w:rPr>
-      </w:pPr>
-      <w:r>
-        <w:rPr>
-          <w:b/>
-          <w:bCs/>
-        </w:rPr>
-        <w:t xml:space="preserve">        &lt;/p&gt;</w:t>
-      </w:r>
-    </w:p>
-    <w:p>
-      <w:pPr>
-        <w:rPr>
-          <w:b/>
-          <w:bCs/>
-        </w:rPr>
-      </w:pPr>
-      <w:r>
-        <w:rPr>
-          <w:b/>
-          <w:bCs/>
-        </w:rPr>
-        <w:t xml:space="preserve">    &lt;/div&gt;</w:t>
-      </w:r>
-    </w:p>
-    <w:p>
-      <w:pPr>
-        <w:rPr>
-          <w:b/>
-          <w:bCs/>
-        </w:rPr>
-      </w:pPr>
-    </w:p>
-    <w:p>
-      <w:pPr>
-        <w:rPr>
-          <w:b/>
-          <w:bCs/>
-        </w:rPr>
-      </w:pPr>
-      <w:r>
-        <w:rPr>
-          <w:b/>
-          <w:bCs/>
-        </w:rPr>
-        <w:t>&lt;/div&gt;</w:t>
-      </w:r>
-    </w:p>
-    <w:p>
-      <w:pPr>
-        <w:rPr>
-          <w:b/>
-          <w:bCs/>
-        </w:rPr>
-      </w:pPr>
-      <w:r>
-        <w:rPr>
-          <w:b/>
-          <w:bCs/>
-        </w:rPr>
-        <w:t>3. La Barra de Progreso con "Hitos"</w:t>
-      </w:r>
-    </w:p>
-    <w:p>
-      <w:pPr>
-        <w:rPr>
-          <w:b/>
-          <w:bCs/>
-        </w:rPr>
-      </w:pPr>
-      <w:r>
-        <w:rPr>
-          <w:b/>
-          <w:bCs/>
-        </w:rPr>
-        <w:t>Dado que usas módulos con peso, la barra de progreso "Slim" que comentamos antes se verá muy bien. Si quieres que sea más informativa, puedes añadir un pequeño efecto visual para indicar que hay algo "pendiente":</w:t>
-      </w:r>
-    </w:p>
-    <w:p>
-      <w:pPr>
-        <w:rPr>
-          <w:b/>
-          <w:bCs/>
-        </w:rPr>
-      </w:pPr>
-      <w:r>
-        <w:rPr>
-          <w:b/>
-          <w:bCs/>
-        </w:rPr>
         <w:t>HTML</w:t>
       </w:r>
     </w:p>
@@ -4530,7 +7063,6 @@
           <w:b/>
           <w:bCs/>
         </w:rPr>
-        <w:lastRenderedPageBreak/>
         <w:t>Un detalle sobre la "Última Tarea"</w:t>
       </w:r>
     </w:p>
@@ -4600,8 +7132,120 @@
 </file>
 
 <file path=word/numbering.xml><?xml version="1.0" encoding="utf-8"?>
-<w:numbering xmlns:wpc="http://schemas.microsoft.com/office/word/2010/wordprocessingCanvas" xmlns:cx="http://schemas.microsoft.com/office/drawing/2014/chartex" xmlns:cx1="http://schemas.microsoft.com/office/drawing/2015/9/8/chartex" xmlns:cx2="http://schemas.microsoft.com/office/drawing/2015/10/21/chartex" xmlns:cx3="http://schemas.microsoft.com/office/drawing/2016/5/9/chartex" xmlns:cx4="http://schemas.microsoft.com/office/drawing/2016/5/10/chartex" xmlns:cx5="http://schemas.microsoft.com/office/drawing/2016/5/11/chartex" xmlns:cx6="http://schemas.microsoft.com/office/drawing/2016/5/12/chartex" xmlns:cx7="http://schemas.microsoft.com/office/drawing/2016/5/13/chartex" xmlns:cx8="http://schemas.microsoft.com/office/drawing/2016/5/14/chartex" xmlns:mc="http://schemas.openxmlformats.org/markup-compatibility/2006" xmlns:aink="http://schemas.microsoft.com/office/drawing/2016/ink" xmlns:am3d="http://schemas.microsoft.com/office/drawing/2017/model3d" xmlns:o="urn:schemas-microsoft-com:office:office" xmlns:oel="http://schemas.microsoft.com/office/2019/extlst" xmlns:r="http://schemas.openxmlformats.org/officeDocument/2006/relationships" xmlns:m="http://schemas.openxmlformats.org/officeDocument/2006/math" xmlns:v="urn:schemas-microsoft-com:vml" xmlns:wp14="http://schemas.microsoft.com/office/word/2010/wordprocessingDrawing" xmlns:wp="http://schemas.openxmlformats.org/drawingml/2006/wordprocessingDrawing" xmlns:w10="urn:schemas-microsoft-com:office:word" xmlns:w="http://schemas.openxmlformats.org/wordprocessingml/2006/main" xmlns:w14="http://schemas.microsoft.com/office/word/2010/wordml" xmlns:w15="http://schemas.microsoft.com/office/word/2012/wordml" xmlns:w16cex="http://schemas.microsoft.com/office/word/2018/wordml/cex" xmlns:w16cid="http://schemas.microsoft.com/office/word/2016/wordml/cid" xmlns:w16="http://schemas.microsoft.com/office/word/2018/wordml" xmlns:w16du="http://schemas.microsoft.com/office/word/2023/wordml/word16du" xmlns:w16sdtdh="http://schemas.microsoft.com/office/word/2020/wordml/sdtdatahash" xmlns:w16sdtfl="http://schemas.microsoft.com/office/word/2024/wordml/sdtformatlock" xmlns:w16se="http://schemas.microsoft.com/office/word/2015/wordml/symex" xmlns:wpg="http://schemas.microsoft.com/office/word/2010/wordprocessingGroup" xmlns:wpi="http://schemas.microsoft.com/office/word/2010/wordprocessingInk" xmlns:wne="http://schemas.microsoft.com/office/word/2006/wordml" xmlns:wps="http://schemas.microsoft.com/office/word/2010/wordprocessingShape" mc:Ignorable="w14 w15 w16se w16cid w16 w16cex w16sdtdh w16sdtfl w16du wp14">
+<w:numbering xmlns:wpc="http://schemas.microsoft.com/office/word/2010/wordprocessingCanvas" xmlns:cx="http://schemas.microsoft.com/office/drawing/2014/chartex" xmlns:cx1="http://schemas.microsoft.com/office/drawing/2015/9/8/chartex" xmlns:cx2="http://schemas.microsoft.com/office/drawing/2015/10/21/chartex" xmlns:cx3="http://schemas.microsoft.com/office/drawing/2016/5/9/chartex" xmlns:cx4="http://schemas.microsoft.com/office/drawing/2016/5/10/chartex" xmlns:cx5="http://schemas.microsoft.com/office/drawing/2016/5/11/chartex" xmlns:cx6="http://schemas.microsoft.com/office/drawing/2016/5/12/chartex" xmlns:cx7="http://schemas.microsoft.com/office/drawing/2016/5/13/chartex" xmlns:cx8="http://schemas.microsoft.com/office/drawing/2016/5/14/chartex" xmlns:mc="http://schemas.openxmlformats.org/markup-compatibility/2006" xmlns:aink="http://schemas.microsoft.com/office/drawing/2016/ink" xmlns:am3d="http://schemas.microsoft.com/office/drawing/2017/model3d" xmlns:o="urn:schemas-microsoft-com:office:office" xmlns:r="http://schemas.openxmlformats.org/officeDocument/2006/relationships" xmlns:m="http://schemas.openxmlformats.org/officeDocument/2006/math" xmlns:v="urn:schemas-microsoft-com:vml" xmlns:wp14="http://schemas.microsoft.com/office/word/2010/wordprocessingDrawing" xmlns:wp="http://schemas.openxmlformats.org/drawingml/2006/wordprocessingDrawing" xmlns:w10="urn:schemas-microsoft-com:office:word" xmlns:w="http://schemas.openxmlformats.org/wordprocessingml/2006/main" xmlns:w14="http://schemas.microsoft.com/office/word/2010/wordml" xmlns:w15="http://schemas.microsoft.com/office/word/2012/wordml" xmlns:w16cex="http://schemas.microsoft.com/office/word/2018/wordml/cex" xmlns:w16cid="http://schemas.microsoft.com/office/word/2016/wordml/cid" xmlns:w16="http://schemas.microsoft.com/office/word/2018/wordml" xmlns:w16sdtdh="http://schemas.microsoft.com/office/word/2020/wordml/sdtdatahash" xmlns:w16se="http://schemas.microsoft.com/office/word/2015/wordml/symex" xmlns:wpg="http://schemas.microsoft.com/office/word/2010/wordprocessingGroup" xmlns:wpi="http://schemas.microsoft.com/office/word/2010/wordprocessingInk" xmlns:wne="http://schemas.microsoft.com/office/word/2006/wordml" xmlns:wps="http://schemas.microsoft.com/office/word/2010/wordprocessingShape" mc:Ignorable="w14 w15 w16se w16cid w16 w16cex w16sdtdh wp14">
   <w:abstractNum w:abstractNumId="0" w15:restartNumberingAfterBreak="0">
+    <w:nsid w:val="237614E7"/>
+    <w:multiLevelType w:val="hybridMultilevel"/>
+    <w:tmpl w:val="5B0C3FCE"/>
+    <w:lvl w:ilvl="0" w:tplc="C07CC58E">
+      <w:numFmt w:val="bullet"/>
+      <w:lvlText w:val="-"/>
+      <w:lvlJc w:val="left"/>
+      <w:pPr>
+        <w:ind w:left="720" w:hanging="360"/>
+      </w:pPr>
+      <w:rPr>
+        <w:rFonts w:ascii="Aptos" w:eastAsiaTheme="minorHAnsi" w:hAnsi="Aptos" w:cstheme="minorBidi" w:hint="default"/>
+      </w:rPr>
+    </w:lvl>
+    <w:lvl w:ilvl="1" w:tplc="0C0A0003" w:tentative="1">
+      <w:start w:val="1"/>
+      <w:numFmt w:val="bullet"/>
+      <w:lvlText w:val="o"/>
+      <w:lvlJc w:val="left"/>
+      <w:pPr>
+        <w:ind w:left="1440" w:hanging="360"/>
+      </w:pPr>
+      <w:rPr>
+        <w:rFonts w:ascii="Courier New" w:hAnsi="Courier New" w:cs="Courier New" w:hint="default"/>
+      </w:rPr>
+    </w:lvl>
+    <w:lvl w:ilvl="2" w:tplc="0C0A0005" w:tentative="1">
+      <w:start w:val="1"/>
+      <w:numFmt w:val="bullet"/>
+      <w:lvlText w:val=""/>
+      <w:lvlJc w:val="left"/>
+      <w:pPr>
+        <w:ind w:left="2160" w:hanging="360"/>
+      </w:pPr>
+      <w:rPr>
+        <w:rFonts w:ascii="Wingdings" w:hAnsi="Wingdings" w:hint="default"/>
+      </w:rPr>
+    </w:lvl>
+    <w:lvl w:ilvl="3" w:tplc="0C0A0001" w:tentative="1">
+      <w:start w:val="1"/>
+      <w:numFmt w:val="bullet"/>
+      <w:lvlText w:val=""/>
+      <w:lvlJc w:val="left"/>
+      <w:pPr>
+        <w:ind w:left="2880" w:hanging="360"/>
+      </w:pPr>
+      <w:rPr>
+        <w:rFonts w:ascii="Symbol" w:hAnsi="Symbol" w:hint="default"/>
+      </w:rPr>
+    </w:lvl>
+    <w:lvl w:ilvl="4" w:tplc="0C0A0003" w:tentative="1">
+      <w:start w:val="1"/>
+      <w:numFmt w:val="bullet"/>
+      <w:lvlText w:val="o"/>
+      <w:lvlJc w:val="left"/>
+      <w:pPr>
+        <w:ind w:left="3600" w:hanging="360"/>
+      </w:pPr>
+      <w:rPr>
+        <w:rFonts w:ascii="Courier New" w:hAnsi="Courier New" w:cs="Courier New" w:hint="default"/>
+      </w:rPr>
+    </w:lvl>
+    <w:lvl w:ilvl="5" w:tplc="0C0A0005" w:tentative="1">
+      <w:start w:val="1"/>
+      <w:numFmt w:val="bullet"/>
+      <w:lvlText w:val=""/>
+      <w:lvlJc w:val="left"/>
+      <w:pPr>
+        <w:ind w:left="4320" w:hanging="360"/>
+      </w:pPr>
+      <w:rPr>
+        <w:rFonts w:ascii="Wingdings" w:hAnsi="Wingdings" w:hint="default"/>
+      </w:rPr>
+    </w:lvl>
+    <w:lvl w:ilvl="6" w:tplc="0C0A0001" w:tentative="1">
+      <w:start w:val="1"/>
+      <w:numFmt w:val="bullet"/>
+      <w:lvlText w:val=""/>
+      <w:lvlJc w:val="left"/>
+      <w:pPr>
+        <w:ind w:left="5040" w:hanging="360"/>
+      </w:pPr>
+      <w:rPr>
+        <w:rFonts w:ascii="Symbol" w:hAnsi="Symbol" w:hint="default"/>
+      </w:rPr>
+    </w:lvl>
+    <w:lvl w:ilvl="7" w:tplc="0C0A0003" w:tentative="1">
+      <w:start w:val="1"/>
+      <w:numFmt w:val="bullet"/>
+      <w:lvlText w:val="o"/>
+      <w:lvlJc w:val="left"/>
+      <w:pPr>
+        <w:ind w:left="5760" w:hanging="360"/>
+      </w:pPr>
+      <w:rPr>
+        <w:rFonts w:ascii="Courier New" w:hAnsi="Courier New" w:cs="Courier New" w:hint="default"/>
+      </w:rPr>
+    </w:lvl>
+    <w:lvl w:ilvl="8" w:tplc="0C0A0005" w:tentative="1">
+      <w:start w:val="1"/>
+      <w:numFmt w:val="bullet"/>
+      <w:lvlText w:val=""/>
+      <w:lvlJc w:val="left"/>
+      <w:pPr>
+        <w:ind w:left="6480" w:hanging="360"/>
+      </w:pPr>
+      <w:rPr>
+        <w:rFonts w:ascii="Wingdings" w:hAnsi="Wingdings" w:hint="default"/>
+      </w:rPr>
+    </w:lvl>
+  </w:abstractNum>
+  <w:abstractNum w:abstractNumId="1" w15:restartNumberingAfterBreak="0">
     <w:nsid w:val="2AF817A6"/>
     <w:multiLevelType w:val="multilevel"/>
     <w:tmpl w:val="BE101650"/>
@@ -4750,7 +7394,7 @@
       </w:rPr>
     </w:lvl>
   </w:abstractNum>
-  <w:abstractNum w:abstractNumId="1" w15:restartNumberingAfterBreak="0">
+  <w:abstractNum w:abstractNumId="2" w15:restartNumberingAfterBreak="0">
     <w:nsid w:val="33B0175A"/>
     <w:multiLevelType w:val="multilevel"/>
     <w:tmpl w:val="180CE15E"/>
@@ -4899,7 +7543,7 @@
       </w:rPr>
     </w:lvl>
   </w:abstractNum>
-  <w:abstractNum w:abstractNumId="2" w15:restartNumberingAfterBreak="0">
+  <w:abstractNum w:abstractNumId="3" w15:restartNumberingAfterBreak="0">
     <w:nsid w:val="5D752140"/>
     <w:multiLevelType w:val="multilevel"/>
     <w:tmpl w:val="81227134"/>
@@ -5048,7 +7692,7 @@
       </w:rPr>
     </w:lvl>
   </w:abstractNum>
-  <w:abstractNum w:abstractNumId="3" w15:restartNumberingAfterBreak="0">
+  <w:abstractNum w:abstractNumId="4" w15:restartNumberingAfterBreak="0">
     <w:nsid w:val="6C321A55"/>
     <w:multiLevelType w:val="multilevel"/>
     <w:tmpl w:val="C59219F6"/>
@@ -5197,7 +7841,7 @@
       </w:rPr>
     </w:lvl>
   </w:abstractNum>
-  <w:abstractNum w:abstractNumId="4" w15:restartNumberingAfterBreak="0">
+  <w:abstractNum w:abstractNumId="5" w15:restartNumberingAfterBreak="0">
     <w:nsid w:val="77497D85"/>
     <w:multiLevelType w:val="multilevel"/>
     <w:tmpl w:val="3192FBCE"/>
@@ -5346,26 +7990,29 @@
       </w:rPr>
     </w:lvl>
   </w:abstractNum>
-  <w:num w:numId="1" w16cid:durableId="611132744">
-    <w:abstractNumId w:val="0"/>
-  </w:num>
-  <w:num w:numId="2" w16cid:durableId="686949524">
+  <w:num w:numId="1">
     <w:abstractNumId w:val="1"/>
   </w:num>
-  <w:num w:numId="3" w16cid:durableId="451706654">
+  <w:num w:numId="2">
     <w:abstractNumId w:val="2"/>
   </w:num>
-  <w:num w:numId="4" w16cid:durableId="1481653089">
+  <w:num w:numId="3">
+    <w:abstractNumId w:val="3"/>
+  </w:num>
+  <w:num w:numId="4">
+    <w:abstractNumId w:val="5"/>
+  </w:num>
+  <w:num w:numId="5">
     <w:abstractNumId w:val="4"/>
   </w:num>
-  <w:num w:numId="5" w16cid:durableId="850533270">
-    <w:abstractNumId w:val="3"/>
+  <w:num w:numId="6">
+    <w:abstractNumId w:val="0"/>
   </w:num>
 </w:numbering>
 </file>
 
 <file path=word/styles.xml><?xml version="1.0" encoding="utf-8"?>
-<w:styles xmlns:mc="http://schemas.openxmlformats.org/markup-compatibility/2006" xmlns:r="http://schemas.openxmlformats.org/officeDocument/2006/relationships" xmlns:w="http://schemas.openxmlformats.org/wordprocessingml/2006/main" xmlns:w14="http://schemas.microsoft.com/office/word/2010/wordml" xmlns:w15="http://schemas.microsoft.com/office/word/2012/wordml" xmlns:w16cex="http://schemas.microsoft.com/office/word/2018/wordml/cex" xmlns:w16cid="http://schemas.microsoft.com/office/word/2016/wordml/cid" xmlns:w16="http://schemas.microsoft.com/office/word/2018/wordml" xmlns:w16du="http://schemas.microsoft.com/office/word/2023/wordml/word16du" xmlns:w16sdtdh="http://schemas.microsoft.com/office/word/2020/wordml/sdtdatahash" xmlns:w16sdtfl="http://schemas.microsoft.com/office/word/2024/wordml/sdtformatlock" xmlns:w16se="http://schemas.microsoft.com/office/word/2015/wordml/symex" mc:Ignorable="w14 w15 w16se w16cid w16 w16cex w16sdtdh w16sdtfl w16du">
+<w:styles xmlns:mc="http://schemas.openxmlformats.org/markup-compatibility/2006" xmlns:r="http://schemas.openxmlformats.org/officeDocument/2006/relationships" xmlns:w="http://schemas.openxmlformats.org/wordprocessingml/2006/main" xmlns:w14="http://schemas.microsoft.com/office/word/2010/wordml" xmlns:w15="http://schemas.microsoft.com/office/word/2012/wordml" xmlns:w16cex="http://schemas.microsoft.com/office/word/2018/wordml/cex" xmlns:w16cid="http://schemas.microsoft.com/office/word/2016/wordml/cid" xmlns:w16="http://schemas.microsoft.com/office/word/2018/wordml" xmlns:w16sdtdh="http://schemas.microsoft.com/office/word/2020/wordml/sdtdatahash" xmlns:w16se="http://schemas.microsoft.com/office/word/2015/wordml/symex" mc:Ignorable="w14 w15 w16se w16cid w16 w16cex w16sdtdh">
   <w:docDefaults>
     <w:rPrDefault>
       <w:rPr>
@@ -5966,6 +8613,7 @@
   <w:style w:type="character" w:default="1" w:styleId="Fuentedeprrafopredeter">
     <w:name w:val="Default Paragraph Font"/>
     <w:uiPriority w:val="1"/>
+    <w:semiHidden/>
     <w:unhideWhenUsed/>
   </w:style>
   <w:style w:type="table" w:default="1" w:styleId="Tablanormal">
@@ -6294,6 +8942,18 @@
       <w14:ligatures w14:val="none"/>
     </w:rPr>
   </w:style>
+  <w:style w:type="character" w:styleId="Hipervnculo">
+    <w:name w:val="Hyperlink"/>
+    <w:basedOn w:val="Fuentedeprrafopredeter"/>
+    <w:uiPriority w:val="99"/>
+    <w:semiHidden/>
+    <w:unhideWhenUsed/>
+    <w:rsid w:val="00DF4AF5"/>
+    <w:rPr>
+      <w:color w:val="0066CC"/>
+      <w:u w:val="single"/>
+    </w:rPr>
+  </w:style>
 </w:styles>
 </file>
 

</xml_diff>

<commit_message>
Se añade la gestión de estado del curso.
- Se añade el atributo a Curso.java
- Se modifican los DTO y el mapper.
- Se modifica el enum EstadoCursoModulo
- Se modifican las condiciones de visualización de los botones del curso
de acuerdo al estado y a las fechas establecidas para la inscripción en
el curso.
- Se elimina el fichero curso-card.html, se integran sus fragmentos en
cursofragments.html
- Se revisan las Excepciones.
</commit_message>
<xml_diff>
--- a/src/main/resources/static/docs/Memoria_aplicacion.docx
+++ b/src/main/resources/static/docs/Memoria_aplicacion.docx
@@ -24,15 +24,7 @@
         <w:t xml:space="preserve">Al acceder a la aplicación se visualizarán </w:t>
       </w:r>
       <w:r>
-        <w:t xml:space="preserve">la </w:t>
-      </w:r>
-      <w:proofErr w:type="gramStart"/>
-      <w:r>
-        <w:t>home pública</w:t>
-      </w:r>
-      <w:proofErr w:type="gramEnd"/>
-      <w:r>
-        <w:t xml:space="preserve"> </w:t>
+        <w:t xml:space="preserve">la home pública </w:t>
       </w:r>
     </w:p>
     <w:p>
@@ -90,21 +82,7 @@
         <w:rPr>
           <w:rStyle w:val="Ttulo2Car"/>
         </w:rPr>
-        <w:t xml:space="preserve">1.- </w:t>
-      </w:r>
-      <w:proofErr w:type="gramStart"/>
-      <w:r>
-        <w:rPr>
-          <w:rStyle w:val="Ttulo2Car"/>
-        </w:rPr>
-        <w:t>Link</w:t>
-      </w:r>
-      <w:proofErr w:type="gramEnd"/>
-      <w:r>
-        <w:rPr>
-          <w:rStyle w:val="Ttulo2Car"/>
-        </w:rPr>
-        <w:t xml:space="preserve"> a la Home</w:t>
+        <w:t>1.- Link a la Home</w:t>
       </w:r>
       <w:r>
         <w:t xml:space="preserve">. Desde cualquier parte de la aplicación se podrá volver a la “home” </w:t>
@@ -174,23 +152,7 @@
         <w:t>7.- Selector de idioma.</w:t>
       </w:r>
       <w:r>
-        <w:t xml:space="preserve"> Al desplegar la opción se podrá seleccionar uno de los dos idiomas disponibles (</w:t>
-      </w:r>
-      <w:proofErr w:type="gramStart"/>
-      <w:r>
-        <w:t>Español</w:t>
-      </w:r>
-      <w:proofErr w:type="gramEnd"/>
-      <w:r>
-        <w:t xml:space="preserve"> e </w:t>
-      </w:r>
-      <w:proofErr w:type="gramStart"/>
-      <w:r>
-        <w:t>Inglés</w:t>
-      </w:r>
-      <w:proofErr w:type="gramEnd"/>
-      <w:r>
-        <w:t>).</w:t>
+        <w:t xml:space="preserve"> Al desplegar la opción se podrá seleccionar uno de los dos idiomas disponibles (Español e Inglés).</w:t>
       </w:r>
     </w:p>
     <w:p>
@@ -235,15 +197,15 @@
         <w:t>Cursos con mayor participación. Los cursos con mayor número de estudiantes inscritos.</w:t>
       </w:r>
     </w:p>
+    <w:p>
+      <w:pPr>
+        <w:pStyle w:val="Ttulo1"/>
+      </w:pPr>
+      <w:r>
+        <w:t>Login</w:t>
+      </w:r>
+    </w:p>
     <w:p/>
-    <w:p>
-      <w:pPr>
-        <w:pStyle w:val="Ttulo1"/>
-      </w:pPr>
-      <w:r>
-        <w:t>Login</w:t>
-      </w:r>
-    </w:p>
     <w:p>
       <w:r>
         <w:t xml:space="preserve">Es la pantalla obligatoria para operar con la aplicación. </w:t>
@@ -409,209 +371,705 @@
         <w:jc w:val="center"/>
       </w:pPr>
     </w:p>
+    <w:p>
+      <w:pPr>
+        <w:pStyle w:val="Ttulo1"/>
+      </w:pPr>
+      <w:r>
+        <w:lastRenderedPageBreak/>
+        <w:t>Registro de Usuarios</w:t>
+      </w:r>
+    </w:p>
+    <w:p>
+      <w:r>
+        <w:t xml:space="preserve">La realizaremos desde la opción de menú “Acceso”-&gt;”Registrarse” o desde la pantalla de Login </w:t>
+      </w:r>
+      <w:r>
+        <w:drawing>
+          <wp:inline distT="0" distB="0" distL="0" distR="0" wp14:anchorId="67919EEC" wp14:editId="588AB1F4">
+            <wp:extent cx="1905266" cy="552527"/>
+            <wp:effectExtent l="0" t="0" r="0" b="0"/>
+            <wp:docPr id="713675037" name="Imagen 1"/>
+            <wp:cNvGraphicFramePr>
+              <a:graphicFrameLocks xmlns:a="http://schemas.openxmlformats.org/drawingml/2006/main" noChangeAspect="1"/>
+            </wp:cNvGraphicFramePr>
+            <a:graphic xmlns:a="http://schemas.openxmlformats.org/drawingml/2006/main">
+              <a:graphicData uri="http://schemas.openxmlformats.org/drawingml/2006/picture">
+                <pic:pic xmlns:pic="http://schemas.openxmlformats.org/drawingml/2006/picture">
+                  <pic:nvPicPr>
+                    <pic:cNvPr id="713675037" name=""/>
+                    <pic:cNvPicPr/>
+                  </pic:nvPicPr>
+                  <pic:blipFill>
+                    <a:blip r:embed="rId9"/>
+                    <a:stretch>
+                      <a:fillRect/>
+                    </a:stretch>
+                  </pic:blipFill>
+                  <pic:spPr>
+                    <a:xfrm>
+                      <a:off x="0" y="0"/>
+                      <a:ext cx="1905266" cy="552527"/>
+                    </a:xfrm>
+                    <a:prstGeom prst="rect">
+                      <a:avLst/>
+                    </a:prstGeom>
+                  </pic:spPr>
+                </pic:pic>
+              </a:graphicData>
+            </a:graphic>
+          </wp:inline>
+        </w:drawing>
+      </w:r>
+      <w:r>
+        <w:t>.</w:t>
+      </w:r>
+    </w:p>
+    <w:p>
+      <w:r>
+        <w:t>Se nos solicitará los datos básicos y necesarios para identificarse en el sistema:</w:t>
+      </w:r>
+    </w:p>
+    <w:p>
+      <w:r>
+        <w:drawing>
+          <wp:inline distT="0" distB="0" distL="0" distR="0" wp14:anchorId="31B1B5DC" wp14:editId="57154ADF">
+            <wp:extent cx="5400040" cy="3000375"/>
+            <wp:effectExtent l="0" t="0" r="0" b="9525"/>
+            <wp:docPr id="514475036" name="Imagen 1"/>
+            <wp:cNvGraphicFramePr>
+              <a:graphicFrameLocks xmlns:a="http://schemas.openxmlformats.org/drawingml/2006/main" noChangeAspect="1"/>
+            </wp:cNvGraphicFramePr>
+            <a:graphic xmlns:a="http://schemas.openxmlformats.org/drawingml/2006/main">
+              <a:graphicData uri="http://schemas.openxmlformats.org/drawingml/2006/picture">
+                <pic:pic xmlns:pic="http://schemas.openxmlformats.org/drawingml/2006/picture">
+                  <pic:nvPicPr>
+                    <pic:cNvPr id="514475036" name=""/>
+                    <pic:cNvPicPr/>
+                  </pic:nvPicPr>
+                  <pic:blipFill>
+                    <a:blip r:embed="rId10"/>
+                    <a:stretch>
+                      <a:fillRect/>
+                    </a:stretch>
+                  </pic:blipFill>
+                  <pic:spPr>
+                    <a:xfrm>
+                      <a:off x="0" y="0"/>
+                      <a:ext cx="5400040" cy="3000375"/>
+                    </a:xfrm>
+                    <a:prstGeom prst="rect">
+                      <a:avLst/>
+                    </a:prstGeom>
+                  </pic:spPr>
+                </pic:pic>
+              </a:graphicData>
+            </a:graphic>
+          </wp:inline>
+        </w:drawing>
+      </w:r>
+    </w:p>
+    <w:p>
+      <w:pPr>
+        <w:pStyle w:val="Prrafodelista"/>
+        <w:numPr>
+          <w:ilvl w:val="0"/>
+          <w:numId w:val="7"/>
+        </w:numPr>
+      </w:pPr>
+      <w:r>
+        <w:rPr>
+          <w:b/>
+          <w:bCs/>
+        </w:rPr>
+        <w:t>E-mail</w:t>
+      </w:r>
+      <w:r>
+        <w:t>. Que será en el futuro nuestra identificación de usuario.</w:t>
+      </w:r>
+    </w:p>
+    <w:p>
+      <w:pPr>
+        <w:pStyle w:val="Prrafodelista"/>
+        <w:numPr>
+          <w:ilvl w:val="0"/>
+          <w:numId w:val="7"/>
+        </w:numPr>
+      </w:pPr>
+      <w:r>
+        <w:rPr>
+          <w:b/>
+          <w:bCs/>
+        </w:rPr>
+        <w:t>Contraseña\Confirmar Contraseña</w:t>
+      </w:r>
+      <w:r>
+        <w:t xml:space="preserve">. La </w:t>
+      </w:r>
+      <w:proofErr w:type="spellStart"/>
+      <w:r>
+        <w:t>Password</w:t>
+      </w:r>
+      <w:proofErr w:type="spellEnd"/>
+      <w:r>
+        <w:t xml:space="preserve"> a utilizar.</w:t>
+      </w:r>
+    </w:p>
+    <w:p>
+      <w:pPr>
+        <w:pStyle w:val="Prrafodelista"/>
+        <w:numPr>
+          <w:ilvl w:val="0"/>
+          <w:numId w:val="7"/>
+        </w:numPr>
+      </w:pPr>
+      <w:r>
+        <w:rPr>
+          <w:b/>
+          <w:bCs/>
+        </w:rPr>
+        <w:t>Nombre</w:t>
+      </w:r>
+      <w:r>
+        <w:t>. Nombre de la persona a subscribir.</w:t>
+      </w:r>
+    </w:p>
+    <w:p>
+      <w:pPr>
+        <w:pStyle w:val="Prrafodelista"/>
+        <w:numPr>
+          <w:ilvl w:val="0"/>
+          <w:numId w:val="7"/>
+        </w:numPr>
+      </w:pPr>
+      <w:r>
+        <w:rPr>
+          <w:b/>
+          <w:bCs/>
+        </w:rPr>
+        <w:t>Apellidos</w:t>
+      </w:r>
+      <w:r>
+        <w:t>. Sólo el Primer Apellido es obligatorio.</w:t>
+      </w:r>
+    </w:p>
+    <w:p>
+      <w:pPr>
+        <w:pStyle w:val="Prrafodelista"/>
+        <w:numPr>
+          <w:ilvl w:val="0"/>
+          <w:numId w:val="7"/>
+        </w:numPr>
+      </w:pPr>
+      <w:r>
+        <w:rPr>
+          <w:b/>
+          <w:bCs/>
+        </w:rPr>
+        <w:t>Dirección</w:t>
+      </w:r>
+      <w:r>
+        <w:t>. Dirección postal.</w:t>
+      </w:r>
+    </w:p>
+    <w:p>
+      <w:pPr>
+        <w:pStyle w:val="Prrafodelista"/>
+        <w:numPr>
+          <w:ilvl w:val="0"/>
+          <w:numId w:val="7"/>
+        </w:numPr>
+      </w:pPr>
+      <w:r>
+        <w:rPr>
+          <w:b/>
+          <w:bCs/>
+        </w:rPr>
+        <w:t>Localidad</w:t>
+      </w:r>
+      <w:r>
+        <w:t>. Ciudad de residencia.</w:t>
+      </w:r>
+    </w:p>
+    <w:p>
+      <w:pPr>
+        <w:pStyle w:val="Prrafodelista"/>
+        <w:numPr>
+          <w:ilvl w:val="0"/>
+          <w:numId w:val="7"/>
+        </w:numPr>
+      </w:pPr>
+      <w:r>
+        <w:rPr>
+          <w:b/>
+          <w:bCs/>
+        </w:rPr>
+        <w:t>Provincia</w:t>
+      </w:r>
+      <w:r>
+        <w:t>. Provincia de residencia</w:t>
+      </w:r>
+    </w:p>
+    <w:p>
+      <w:pPr>
+        <w:pStyle w:val="Prrafodelista"/>
+        <w:numPr>
+          <w:ilvl w:val="0"/>
+          <w:numId w:val="7"/>
+        </w:numPr>
+      </w:pPr>
+      <w:r>
+        <w:rPr>
+          <w:b/>
+          <w:bCs/>
+        </w:rPr>
+        <w:t>Código Postal</w:t>
+      </w:r>
+      <w:r>
+        <w:t>. Código Postal</w:t>
+      </w:r>
+      <w:r>
+        <w:t>.</w:t>
+      </w:r>
+    </w:p>
     <w:p/>
+    <w:p>
+      <w:r>
+        <w:t>Proceso de registro de usuarios en sesión:</w:t>
+      </w:r>
+    </w:p>
+    <w:p>
+      <w:pPr>
+        <w:pStyle w:val="Ttulo1"/>
+      </w:pPr>
+      <w:r>
+        <w:t>Gestión de Módulos</w:t>
+      </w:r>
+    </w:p>
+    <w:p>
+      <w:pPr>
+        <w:pStyle w:val="Ttulo2"/>
+      </w:pPr>
+      <w:r>
+        <w:t>Nuevo Módulo</w:t>
+      </w:r>
+    </w:p>
+    <w:p>
+      <w:r>
+        <w:t>Se mostrará el formulario de datos para añadir un módulo al sistema</w:t>
+      </w:r>
+    </w:p>
+    <w:p>
+      <w:r>
+        <w:rPr>
+          <w:noProof/>
+        </w:rPr>
+        <w:lastRenderedPageBreak/>
+        <w:drawing>
+          <wp:inline distT="0" distB="0" distL="0" distR="0" wp14:anchorId="69BF6817" wp14:editId="410F6A6C">
+            <wp:extent cx="5400040" cy="2590165"/>
+            <wp:effectExtent l="0" t="0" r="0" b="635"/>
+            <wp:docPr id="80736383" name="Imagen 2"/>
+            <wp:cNvGraphicFramePr>
+              <a:graphicFrameLocks xmlns:a="http://schemas.openxmlformats.org/drawingml/2006/main" noChangeAspect="1"/>
+            </wp:cNvGraphicFramePr>
+            <a:graphic xmlns:a="http://schemas.openxmlformats.org/drawingml/2006/main">
+              <a:graphicData uri="http://schemas.openxmlformats.org/drawingml/2006/picture">
+                <pic:pic xmlns:pic="http://schemas.openxmlformats.org/drawingml/2006/picture">
+                  <pic:nvPicPr>
+                    <pic:cNvPr id="80736383" name=""/>
+                    <pic:cNvPicPr/>
+                  </pic:nvPicPr>
+                  <pic:blipFill>
+                    <a:blip r:embed="rId11">
+                      <a:extLst>
+                        <a:ext uri="{28A0092B-C50C-407E-A947-70E740481C1C}">
+                          <a14:useLocalDpi xmlns:a14="http://schemas.microsoft.com/office/drawing/2010/main" val="0"/>
+                        </a:ext>
+                      </a:extLst>
+                    </a:blip>
+                    <a:stretch>
+                      <a:fillRect/>
+                    </a:stretch>
+                  </pic:blipFill>
+                  <pic:spPr>
+                    <a:xfrm>
+                      <a:off x="0" y="0"/>
+                      <a:ext cx="5400040" cy="2590165"/>
+                    </a:xfrm>
+                    <a:prstGeom prst="rect">
+                      <a:avLst/>
+                    </a:prstGeom>
+                  </pic:spPr>
+                </pic:pic>
+              </a:graphicData>
+            </a:graphic>
+          </wp:inline>
+        </w:drawing>
+      </w:r>
+    </w:p>
+    <w:p>
+      <w:pPr>
+        <w:pStyle w:val="Prrafodelista"/>
+        <w:numPr>
+          <w:ilvl w:val="0"/>
+          <w:numId w:val="8"/>
+        </w:numPr>
+      </w:pPr>
+      <w:r>
+        <w:rPr>
+          <w:b/>
+          <w:bCs/>
+        </w:rPr>
+        <w:t>Título.</w:t>
+      </w:r>
+      <w:r>
+        <w:t xml:space="preserve"> El título del módulo que se mostrará en el curso.</w:t>
+      </w:r>
+    </w:p>
+    <w:p>
+      <w:pPr>
+        <w:pStyle w:val="Prrafodelista"/>
+        <w:numPr>
+          <w:ilvl w:val="0"/>
+          <w:numId w:val="8"/>
+        </w:numPr>
+      </w:pPr>
+      <w:r>
+        <w:rPr>
+          <w:b/>
+          <w:bCs/>
+        </w:rPr>
+        <w:t>Descripción corta</w:t>
+      </w:r>
+      <w:r>
+        <w:t>. Descripción “interna” del módulo.</w:t>
+      </w:r>
+    </w:p>
+    <w:p>
+      <w:pPr>
+        <w:pStyle w:val="Prrafodelista"/>
+        <w:numPr>
+          <w:ilvl w:val="0"/>
+          <w:numId w:val="8"/>
+        </w:numPr>
+      </w:pPr>
+      <w:r>
+        <w:rPr>
+          <w:b/>
+          <w:bCs/>
+        </w:rPr>
+        <w:t>Tipo de Módulo</w:t>
+      </w:r>
+      <w:r>
+        <w:t xml:space="preserve">. </w:t>
+      </w:r>
+    </w:p>
+    <w:p>
+      <w:pPr>
+        <w:pStyle w:val="Prrafodelista"/>
+        <w:numPr>
+          <w:ilvl w:val="1"/>
+          <w:numId w:val="8"/>
+        </w:numPr>
+      </w:pPr>
+      <w:r>
+        <w:rPr>
+          <w:i/>
+          <w:iCs/>
+        </w:rPr>
+        <w:t>ENTREGA_OBLIGATORIA</w:t>
+      </w:r>
+      <w:r>
+        <w:t>. Lleva asociada la entrega de un documento PDF por el alumno.</w:t>
+      </w:r>
+    </w:p>
+    <w:p>
+      <w:pPr>
+        <w:pStyle w:val="Prrafodelista"/>
+        <w:numPr>
+          <w:ilvl w:val="1"/>
+          <w:numId w:val="8"/>
+        </w:numPr>
+      </w:pPr>
+      <w:r>
+        <w:rPr>
+          <w:i/>
+          <w:iCs/>
+        </w:rPr>
+        <w:t>FINALIZACION_MANUAL</w:t>
+      </w:r>
+      <w:r>
+        <w:t>. El cierre del módulo será a disposición del alumno.</w:t>
+      </w:r>
+    </w:p>
+    <w:p>
+      <w:pPr>
+        <w:pStyle w:val="Prrafodelista"/>
+        <w:numPr>
+          <w:ilvl w:val="0"/>
+          <w:numId w:val="8"/>
+        </w:numPr>
+      </w:pPr>
+      <w:r>
+        <w:rPr>
+          <w:b/>
+          <w:bCs/>
+        </w:rPr>
+        <w:t>Contenido</w:t>
+      </w:r>
+      <w:r>
+        <w:t>. Texto del contenido del módulo.</w:t>
+      </w:r>
+    </w:p>
+    <w:p>
+      <w:r>
+        <w:t>Una ves “salvado” el contenido, si no hay errores, se mostrará el mensaje:</w:t>
+      </w:r>
+    </w:p>
     <w:p/>
     <w:p>
       <w:r>
-        <w:t>Proceso de registro de usuarios en sesión:</w:t>
+        <w:t>[Login Form]</w:t>
+      </w:r>
+    </w:p>
+    <w:p>
+      <w:r>
+        <w:t xml:space="preserve">    ↓</w:t>
+      </w:r>
+    </w:p>
+    <w:p>
+      <w:r>
+        <w:t>[</w:t>
+      </w:r>
+      <w:proofErr w:type="spellStart"/>
+      <w:r>
+        <w:t>UsernamePasswordAuthenticationFilter</w:t>
+      </w:r>
+      <w:proofErr w:type="spellEnd"/>
+      <w:r>
+        <w:t>]</w:t>
+      </w:r>
+    </w:p>
+    <w:p>
+      <w:r>
+        <w:t xml:space="preserve">    ↓ (autenticación OK)</w:t>
+      </w:r>
+    </w:p>
+    <w:p>
+      <w:r>
+        <w:t>[</w:t>
+      </w:r>
+      <w:proofErr w:type="spellStart"/>
+      <w:r>
+        <w:t>Authentication</w:t>
+      </w:r>
+      <w:proofErr w:type="spellEnd"/>
+      <w:r>
+        <w:t xml:space="preserve"> creado]</w:t>
+      </w:r>
+    </w:p>
+    <w:p>
+      <w:r>
+        <w:t xml:space="preserve">    ↓</w:t>
+      </w:r>
+    </w:p>
+    <w:p>
+      <w:r>
+        <w:t>[</w:t>
+      </w:r>
+      <w:proofErr w:type="spellStart"/>
+      <w:r>
+        <w:t>CustomLoginSuccessHandler</w:t>
+      </w:r>
+      <w:proofErr w:type="spellEnd"/>
+      <w:r>
+        <w:t>]</w:t>
+      </w:r>
+    </w:p>
+    <w:p>
+      <w:r>
+        <w:t xml:space="preserve">    ↓</w:t>
+      </w:r>
+    </w:p>
+    <w:p>
+      <w:proofErr w:type="spellStart"/>
+      <w:r>
+        <w:t>sessionStrategy.onAuthentication</w:t>
+      </w:r>
+      <w:proofErr w:type="spellEnd"/>
+      <w:r>
+        <w:t>()</w:t>
+      </w:r>
+    </w:p>
+    <w:p>
+      <w:r>
+        <w:t xml:space="preserve">    ↓</w:t>
+      </w:r>
+    </w:p>
+    <w:p>
+      <w:r>
+        <w:t>[</w:t>
+      </w:r>
+      <w:proofErr w:type="spellStart"/>
+      <w:r>
+        <w:t>RegisterSessionAuthenticationStrategy</w:t>
+      </w:r>
+      <w:proofErr w:type="spellEnd"/>
+      <w:r>
+        <w:t>]</w:t>
+      </w:r>
+    </w:p>
+    <w:p>
+      <w:r>
+        <w:t xml:space="preserve">    ↓</w:t>
+      </w:r>
+    </w:p>
+    <w:p>
+      <w:r>
+        <w:t>[</w:t>
+      </w:r>
+      <w:proofErr w:type="spellStart"/>
+      <w:r>
+        <w:t>SessionRegistry.registerNewSession</w:t>
+      </w:r>
+      <w:proofErr w:type="spellEnd"/>
+      <w:r>
+        <w:t>()]</w:t>
+      </w:r>
+    </w:p>
+    <w:p>
+      <w:r>
+        <w:t xml:space="preserve">    ↓</w:t>
+      </w:r>
+    </w:p>
+    <w:p>
+      <w:r>
+        <w:lastRenderedPageBreak/>
+        <w:t>[Usuario queda registrado como conectado]</w:t>
+      </w:r>
+    </w:p>
+    <w:p>
+      <w:r>
+        <w:t xml:space="preserve">    ↓</w:t>
+      </w:r>
+    </w:p>
+    <w:p>
+      <w:r>
+        <w:t>/</w:t>
+      </w:r>
+      <w:proofErr w:type="spellStart"/>
+      <w:r>
+        <w:t>admin</w:t>
+      </w:r>
+      <w:proofErr w:type="spellEnd"/>
+      <w:r>
+        <w:t>/</w:t>
+      </w:r>
+      <w:proofErr w:type="spellStart"/>
+      <w:r>
+        <w:t>usuarioconnected</w:t>
+      </w:r>
+      <w:proofErr w:type="spellEnd"/>
+      <w:r>
+        <w:t xml:space="preserve"> → </w:t>
+      </w:r>
+      <w:proofErr w:type="spellStart"/>
+      <w:r>
+        <w:t>getConnectedUsers</w:t>
+      </w:r>
+      <w:proofErr w:type="spellEnd"/>
+      <w:r>
+        <w:t>()</w:t>
       </w:r>
     </w:p>
     <w:p/>
     <w:p>
       <w:r>
-        <w:t>[Login Form]</w:t>
-      </w:r>
-    </w:p>
-    <w:p>
-      <w:r>
-        <w:t xml:space="preserve">    ↓</w:t>
-      </w:r>
-    </w:p>
-    <w:p>
-      <w:r>
-        <w:t>[</w:t>
-      </w:r>
-      <w:proofErr w:type="spellStart"/>
-      <w:r>
-        <w:t>UsernamePasswordAuthenticationFilter</w:t>
-      </w:r>
-      <w:proofErr w:type="spellEnd"/>
-      <w:r>
-        <w:t>]</w:t>
-      </w:r>
-    </w:p>
-    <w:p>
-      <w:r>
-        <w:t xml:space="preserve">    ↓ (autenticación OK)</w:t>
-      </w:r>
-    </w:p>
-    <w:p>
-      <w:r>
-        <w:t>[</w:t>
-      </w:r>
-      <w:proofErr w:type="spellStart"/>
-      <w:r>
-        <w:t>Authentication</w:t>
-      </w:r>
-      <w:proofErr w:type="spellEnd"/>
-      <w:r>
-        <w:t xml:space="preserve"> creado]</w:t>
-      </w:r>
-    </w:p>
-    <w:p>
-      <w:r>
-        <w:t xml:space="preserve">    ↓</w:t>
-      </w:r>
-    </w:p>
-    <w:p>
-      <w:r>
-        <w:t>[</w:t>
-      </w:r>
-      <w:proofErr w:type="spellStart"/>
-      <w:r>
-        <w:t>CustomLoginSuccessHandler</w:t>
-      </w:r>
-      <w:proofErr w:type="spellEnd"/>
-      <w:r>
-        <w:t>]</w:t>
-      </w:r>
-    </w:p>
-    <w:p>
-      <w:r>
-        <w:t xml:space="preserve">    ↓</w:t>
-      </w:r>
-    </w:p>
-    <w:p>
-      <w:proofErr w:type="spellStart"/>
-      <w:r>
-        <w:t>sessionStrategy.onAuthentication</w:t>
-      </w:r>
-      <w:proofErr w:type="spellEnd"/>
-      <w:r>
-        <w:t>()</w:t>
-      </w:r>
-    </w:p>
-    <w:p>
-      <w:r>
-        <w:t xml:space="preserve">    ↓</w:t>
-      </w:r>
-    </w:p>
-    <w:p>
-      <w:r>
-        <w:t>[</w:t>
-      </w:r>
-      <w:proofErr w:type="spellStart"/>
-      <w:r>
-        <w:t>RegisterSessionAuthenticationStrategy</w:t>
-      </w:r>
-      <w:proofErr w:type="spellEnd"/>
-      <w:r>
-        <w:t>]</w:t>
-      </w:r>
-    </w:p>
-    <w:p>
-      <w:r>
-        <w:t xml:space="preserve">    ↓</w:t>
-      </w:r>
-    </w:p>
-    <w:p>
-      <w:r>
-        <w:t>[</w:t>
-      </w:r>
-      <w:proofErr w:type="spellStart"/>
-      <w:r>
-        <w:t>SessionRegistry.registerNewSession</w:t>
-      </w:r>
-      <w:proofErr w:type="spellEnd"/>
-      <w:r>
-        <w:t>()]</w:t>
-      </w:r>
-    </w:p>
-    <w:p>
-      <w:r>
-        <w:t xml:space="preserve">    ↓</w:t>
-      </w:r>
-    </w:p>
-    <w:p>
-      <w:r>
-        <w:t>[Usuario queda registrado como conectado]</w:t>
-      </w:r>
-    </w:p>
-    <w:p>
-      <w:r>
-        <w:t xml:space="preserve">    ↓</w:t>
-      </w:r>
-    </w:p>
-    <w:p>
-      <w:r>
-        <w:t>/</w:t>
-      </w:r>
-      <w:proofErr w:type="spellStart"/>
-      <w:r>
-        <w:t>admin</w:t>
-      </w:r>
-      <w:proofErr w:type="spellEnd"/>
-      <w:r>
-        <w:t>/</w:t>
-      </w:r>
-      <w:proofErr w:type="spellStart"/>
-      <w:r>
-        <w:t>usuarioconnected</w:t>
-      </w:r>
-      <w:proofErr w:type="spellEnd"/>
-      <w:r>
-        <w:t xml:space="preserve"> → </w:t>
-      </w:r>
-      <w:proofErr w:type="spellStart"/>
-      <w:proofErr w:type="gramStart"/>
-      <w:r>
-        <w:t>getConnectedUsers</w:t>
-      </w:r>
-      <w:proofErr w:type="spellEnd"/>
-      <w:r>
-        <w:t>(</w:t>
-      </w:r>
-      <w:proofErr w:type="gramEnd"/>
-      <w:r>
-        <w:t>)</w:t>
+        <w:t xml:space="preserve">Proceso de </w:t>
+      </w:r>
+      <w:proofErr w:type="spellStart"/>
+      <w:r>
+        <w:t>logout</w:t>
+      </w:r>
+      <w:proofErr w:type="spellEnd"/>
+      <w:r>
+        <w:t xml:space="preserve"> y eliminación del registro de usuarios en sesión:</w:t>
       </w:r>
     </w:p>
     <w:p/>
     <w:p>
       <w:r>
-        <w:t xml:space="preserve">Proceso de </w:t>
+        <w:t>┌──────────────────────────────┐</w:t>
+      </w:r>
+    </w:p>
+    <w:p>
+      <w:r>
+        <w:t>│        Usuario (</w:t>
+      </w:r>
+      <w:proofErr w:type="spellStart"/>
+      <w:r>
+        <w:t>Logout</w:t>
+      </w:r>
+      <w:proofErr w:type="spellEnd"/>
+      <w:r>
+        <w:t>)      │</w:t>
+      </w:r>
+    </w:p>
+    <w:p>
+      <w:r>
+        <w:t>└───────────────</w:t>
+      </w:r>
+      <w:r>
+        <w:rPr>
+          <w:rFonts w:ascii="MS Gothic" w:eastAsia="MS Gothic" w:hAnsi="MS Gothic" w:cs="MS Gothic" w:hint="eastAsia"/>
+        </w:rPr>
+        <w:t>┬</w:t>
+      </w:r>
+      <w:r>
+        <w:rPr>
+          <w:rFonts w:ascii="Aptos" w:hAnsi="Aptos" w:cs="Aptos"/>
+        </w:rPr>
+        <w:t>──────────────┘</w:t>
+      </w:r>
+    </w:p>
+    <w:p>
+      <w:r>
+        <w:t xml:space="preserve">                │ Petición /</w:t>
       </w:r>
       <w:proofErr w:type="spellStart"/>
       <w:r>
         <w:t>logout</w:t>
       </w:r>
       <w:proofErr w:type="spellEnd"/>
-      <w:r>
-        <w:t xml:space="preserve"> y eliminación del registro de usuarios en sesión:</w:t>
-      </w:r>
-    </w:p>
-    <w:p/>
-    <w:p>
-      <w:r>
-        <w:t>┌──────────────────────────────┐</w:t>
-      </w:r>
-    </w:p>
-    <w:p>
-      <w:r>
-        <w:t>│        Usuario (</w:t>
-      </w:r>
-      <w:proofErr w:type="spellStart"/>
-      <w:proofErr w:type="gramStart"/>
-      <w:r>
-        <w:t>Logout</w:t>
-      </w:r>
-      <w:proofErr w:type="spellEnd"/>
-      <w:r>
-        <w:t xml:space="preserve">)   </w:t>
-      </w:r>
-      <w:proofErr w:type="gramEnd"/>
-      <w:r>
-        <w:t xml:space="preserve">   │</w:t>
+    </w:p>
+    <w:p>
+      <w:r>
+        <w:t xml:space="preserve">                </w:t>
+      </w:r>
+      <w:r>
+        <w:rPr>
+          <w:rFonts w:ascii="Arial" w:hAnsi="Arial" w:cs="Arial"/>
+        </w:rPr>
+        <w:t>▼</w:t>
+      </w:r>
+    </w:p>
+    <w:p>
+      <w:r>
+        <w:t>┌──────────────────────────────────────────┐</w:t>
+      </w:r>
+    </w:p>
+    <w:p>
+      <w:r>
+        <w:t xml:space="preserve">│              </w:t>
+      </w:r>
+      <w:proofErr w:type="spellStart"/>
+      <w:r>
+        <w:t>LogoutFilter</w:t>
+      </w:r>
+      <w:proofErr w:type="spellEnd"/>
+      <w:r>
+        <w:t xml:space="preserve">                │</w:t>
       </w:r>
     </w:p>
     <w:p>
@@ -628,18 +1086,13 @@
         <w:rPr>
           <w:rFonts w:ascii="Aptos" w:hAnsi="Aptos" w:cs="Aptos"/>
         </w:rPr>
-        <w:t>──────────────┘</w:t>
-      </w:r>
-    </w:p>
-    <w:p>
-      <w:r>
-        <w:t xml:space="preserve">                │ Petición /</w:t>
-      </w:r>
-      <w:proofErr w:type="spellStart"/>
-      <w:r>
-        <w:t>logout</w:t>
-      </w:r>
-      <w:proofErr w:type="spellEnd"/>
+        <w:t>──────────────────────────┘</w:t>
+      </w:r>
+    </w:p>
+    <w:p>
+      <w:r>
+        <w:t xml:space="preserve">                │</w:t>
+      </w:r>
     </w:p>
     <w:p>
       <w:r>
@@ -659,15 +1112,148 @@
     </w:p>
     <w:p>
       <w:r>
-        <w:t xml:space="preserve">│              </w:t>
-      </w:r>
-      <w:proofErr w:type="spellStart"/>
-      <w:r>
-        <w:t>LogoutFilter</w:t>
-      </w:r>
-      <w:proofErr w:type="spellEnd"/>
+        <w:t xml:space="preserve">│         </w:t>
+      </w:r>
+      <w:proofErr w:type="spellStart"/>
+      <w:r>
+        <w:t>CustomLogoutHandler</w:t>
+      </w:r>
+      <w:proofErr w:type="spellEnd"/>
+      <w:r>
+        <w:t xml:space="preserve">              │</w:t>
+      </w:r>
+    </w:p>
+    <w:p>
+      <w:r>
+        <w:t xml:space="preserve">│  - Obtiene </w:t>
+      </w:r>
+      <w:proofErr w:type="spellStart"/>
+      <w:r>
+        <w:t>sessionId</w:t>
+      </w:r>
+      <w:proofErr w:type="spellEnd"/>
+      <w:r>
+        <w:t xml:space="preserve">                     │</w:t>
+      </w:r>
+    </w:p>
+    <w:p>
+      <w:r>
+        <w:t xml:space="preserve">│  - </w:t>
+      </w:r>
+      <w:proofErr w:type="spellStart"/>
+      <w:r>
+        <w:t>sessionRegistry.removeSessionInfo</w:t>
+      </w:r>
+      <w:proofErr w:type="spellEnd"/>
+      <w:r>
+        <w:t>()   │</w:t>
+      </w:r>
+    </w:p>
+    <w:p>
+      <w:r>
+        <w:t>└───────────────</w:t>
+      </w:r>
+      <w:r>
+        <w:rPr>
+          <w:rFonts w:ascii="MS Gothic" w:eastAsia="MS Gothic" w:hAnsi="MS Gothic" w:cs="MS Gothic" w:hint="eastAsia"/>
+        </w:rPr>
+        <w:t>┬</w:t>
+      </w:r>
+      <w:r>
+        <w:rPr>
+          <w:rFonts w:ascii="Aptos" w:hAnsi="Aptos" w:cs="Aptos"/>
+        </w:rPr>
+        <w:t>──────────────────────────┘</w:t>
+      </w:r>
+    </w:p>
+    <w:p>
       <w:r>
         <w:t xml:space="preserve">                │</w:t>
+      </w:r>
+    </w:p>
+    <w:p>
+      <w:r>
+        <w:t xml:space="preserve">                </w:t>
+      </w:r>
+      <w:r>
+        <w:rPr>
+          <w:rFonts w:ascii="Arial" w:hAnsi="Arial" w:cs="Arial"/>
+        </w:rPr>
+        <w:t>▼</w:t>
+      </w:r>
+    </w:p>
+    <w:p>
+      <w:r>
+        <w:t>┌──────────────────────────────────────────┐</w:t>
+      </w:r>
+    </w:p>
+    <w:p>
+      <w:r>
+        <w:t xml:space="preserve">│           </w:t>
+      </w:r>
+      <w:proofErr w:type="spellStart"/>
+      <w:r>
+        <w:t>SessionRegistryImpl</w:t>
+      </w:r>
+      <w:proofErr w:type="spellEnd"/>
+      <w:r>
+        <w:t xml:space="preserve">            │</w:t>
+      </w:r>
+    </w:p>
+    <w:p>
+      <w:r>
+        <w:t>│  (Elimina la sesión del usuario)         │</w:t>
+      </w:r>
+    </w:p>
+    <w:p>
+      <w:r>
+        <w:t>└───────────────</w:t>
+      </w:r>
+      <w:r>
+        <w:rPr>
+          <w:rFonts w:ascii="MS Gothic" w:eastAsia="MS Gothic" w:hAnsi="MS Gothic" w:cs="MS Gothic" w:hint="eastAsia"/>
+        </w:rPr>
+        <w:t>┬</w:t>
+      </w:r>
+      <w:r>
+        <w:rPr>
+          <w:rFonts w:ascii="Aptos" w:hAnsi="Aptos" w:cs="Aptos"/>
+        </w:rPr>
+        <w:t>──────────────────────────┘</w:t>
+      </w:r>
+    </w:p>
+    <w:p>
+      <w:r>
+        <w:t xml:space="preserve">                │</w:t>
+      </w:r>
+    </w:p>
+    <w:p>
+      <w:r>
+        <w:t xml:space="preserve">                </w:t>
+      </w:r>
+      <w:r>
+        <w:rPr>
+          <w:rFonts w:ascii="Arial" w:hAnsi="Arial" w:cs="Arial"/>
+        </w:rPr>
+        <w:t>▼</w:t>
+      </w:r>
+    </w:p>
+    <w:p>
+      <w:r>
+        <w:t>┌──────────────────────────────────────────┐</w:t>
+      </w:r>
+    </w:p>
+    <w:p>
+      <w:r>
+        <w:t xml:space="preserve">│     </w:t>
+      </w:r>
+      <w:proofErr w:type="spellStart"/>
+      <w:r>
+        <w:t>HttpSession.invalidate</w:t>
+      </w:r>
+      <w:proofErr w:type="spellEnd"/>
+      <w:r>
+        <w:t>() (Spring)    │</w:t>
       </w:r>
     </w:p>
     <w:p>
@@ -711,226 +1297,6 @@
     </w:p>
     <w:p>
       <w:r>
-        <w:t xml:space="preserve">│         </w:t>
-      </w:r>
-      <w:proofErr w:type="spellStart"/>
-      <w:r>
-        <w:t>CustomLogoutHandler</w:t>
-      </w:r>
-      <w:proofErr w:type="spellEnd"/>
-      <w:r>
-        <w:t xml:space="preserve">              │</w:t>
-      </w:r>
-    </w:p>
-    <w:p>
-      <w:proofErr w:type="gramStart"/>
-      <w:r>
-        <w:t>│  -</w:t>
-      </w:r>
-      <w:proofErr w:type="gramEnd"/>
-      <w:r>
-        <w:t xml:space="preserve"> Obtiene </w:t>
-      </w:r>
-      <w:proofErr w:type="spellStart"/>
-      <w:r>
-        <w:t>sessionId</w:t>
-      </w:r>
-      <w:proofErr w:type="spellEnd"/>
-      <w:r>
-        <w:t xml:space="preserve">                     │</w:t>
-      </w:r>
-    </w:p>
-    <w:p>
-      <w:proofErr w:type="gramStart"/>
-      <w:r>
-        <w:t>│  -</w:t>
-      </w:r>
-      <w:proofErr w:type="gramEnd"/>
-      <w:r>
-        <w:t xml:space="preserve"> </w:t>
-      </w:r>
-      <w:proofErr w:type="spellStart"/>
-      <w:r>
-        <w:t>sessionRegistry.removeSessionInfo</w:t>
-      </w:r>
-      <w:proofErr w:type="spellEnd"/>
-      <w:proofErr w:type="gramStart"/>
-      <w:r>
-        <w:t xml:space="preserve">()   </w:t>
-      </w:r>
-      <w:proofErr w:type="gramEnd"/>
-      <w:r>
-        <w:t>│</w:t>
-      </w:r>
-    </w:p>
-    <w:p>
-      <w:r>
-        <w:t>└───────────────</w:t>
-      </w:r>
-      <w:r>
-        <w:rPr>
-          <w:rFonts w:ascii="MS Gothic" w:eastAsia="MS Gothic" w:hAnsi="MS Gothic" w:cs="MS Gothic" w:hint="eastAsia"/>
-        </w:rPr>
-        <w:t>┬</w:t>
-      </w:r>
-      <w:r>
-        <w:rPr>
-          <w:rFonts w:ascii="Aptos" w:hAnsi="Aptos" w:cs="Aptos"/>
-        </w:rPr>
-        <w:t>──────────────────────────┘</w:t>
-      </w:r>
-    </w:p>
-    <w:p>
-      <w:r>
-        <w:t xml:space="preserve">                │</w:t>
-      </w:r>
-    </w:p>
-    <w:p>
-      <w:r>
-        <w:t xml:space="preserve">                </w:t>
-      </w:r>
-      <w:r>
-        <w:rPr>
-          <w:rFonts w:ascii="Arial" w:hAnsi="Arial" w:cs="Arial"/>
-        </w:rPr>
-        <w:t>▼</w:t>
-      </w:r>
-    </w:p>
-    <w:p>
-      <w:r>
-        <w:t>┌──────────────────────────────────────────┐</w:t>
-      </w:r>
-    </w:p>
-    <w:p>
-      <w:r>
-        <w:t xml:space="preserve">│           </w:t>
-      </w:r>
-      <w:proofErr w:type="spellStart"/>
-      <w:r>
-        <w:t>SessionRegistryImpl</w:t>
-      </w:r>
-      <w:proofErr w:type="spellEnd"/>
-      <w:r>
-        <w:t xml:space="preserve">            │</w:t>
-      </w:r>
-    </w:p>
-    <w:p>
-      <w:proofErr w:type="gramStart"/>
-      <w:r>
-        <w:t>│  (</w:t>
-      </w:r>
-      <w:proofErr w:type="gramEnd"/>
-      <w:r>
-        <w:t xml:space="preserve">Elimina la sesión del </w:t>
-      </w:r>
-      <w:proofErr w:type="gramStart"/>
-      <w:r>
-        <w:t xml:space="preserve">usuario)   </w:t>
-      </w:r>
-      <w:proofErr w:type="gramEnd"/>
-      <w:r>
-        <w:t xml:space="preserve">      │</w:t>
-      </w:r>
-    </w:p>
-    <w:p>
-      <w:r>
-        <w:t>└───────────────</w:t>
-      </w:r>
-      <w:r>
-        <w:rPr>
-          <w:rFonts w:ascii="MS Gothic" w:eastAsia="MS Gothic" w:hAnsi="MS Gothic" w:cs="MS Gothic" w:hint="eastAsia"/>
-        </w:rPr>
-        <w:t>┬</w:t>
-      </w:r>
-      <w:r>
-        <w:rPr>
-          <w:rFonts w:ascii="Aptos" w:hAnsi="Aptos" w:cs="Aptos"/>
-        </w:rPr>
-        <w:t>──────────────────────────┘</w:t>
-      </w:r>
-    </w:p>
-    <w:p>
-      <w:r>
-        <w:t xml:space="preserve">                │</w:t>
-      </w:r>
-    </w:p>
-    <w:p>
-      <w:r>
-        <w:t xml:space="preserve">                </w:t>
-      </w:r>
-      <w:r>
-        <w:rPr>
-          <w:rFonts w:ascii="Arial" w:hAnsi="Arial" w:cs="Arial"/>
-        </w:rPr>
-        <w:t>▼</w:t>
-      </w:r>
-    </w:p>
-    <w:p>
-      <w:r>
-        <w:t>┌──────────────────────────────────────────┐</w:t>
-      </w:r>
-    </w:p>
-    <w:p>
-      <w:r>
-        <w:t xml:space="preserve">│     </w:t>
-      </w:r>
-      <w:proofErr w:type="spellStart"/>
-      <w:r>
-        <w:t>HttpSession.invalidate</w:t>
-      </w:r>
-      <w:proofErr w:type="spellEnd"/>
-      <w:r>
-        <w:t>() (</w:t>
-      </w:r>
-      <w:proofErr w:type="gramStart"/>
-      <w:r>
-        <w:t xml:space="preserve">Spring)   </w:t>
-      </w:r>
-      <w:proofErr w:type="gramEnd"/>
-      <w:r>
-        <w:t xml:space="preserve"> │</w:t>
-      </w:r>
-    </w:p>
-    <w:p>
-      <w:r>
-        <w:t>└───────────────</w:t>
-      </w:r>
-      <w:r>
-        <w:rPr>
-          <w:rFonts w:ascii="MS Gothic" w:eastAsia="MS Gothic" w:hAnsi="MS Gothic" w:cs="MS Gothic" w:hint="eastAsia"/>
-        </w:rPr>
-        <w:t>┬</w:t>
-      </w:r>
-      <w:r>
-        <w:rPr>
-          <w:rFonts w:ascii="Aptos" w:hAnsi="Aptos" w:cs="Aptos"/>
-        </w:rPr>
-        <w:t>──────────────────────────┘</w:t>
-      </w:r>
-    </w:p>
-    <w:p>
-      <w:r>
-        <w:t xml:space="preserve">                │</w:t>
-      </w:r>
-    </w:p>
-    <w:p>
-      <w:r>
-        <w:t xml:space="preserve">                </w:t>
-      </w:r>
-      <w:r>
-        <w:rPr>
-          <w:rFonts w:ascii="Arial" w:hAnsi="Arial" w:cs="Arial"/>
-        </w:rPr>
-        <w:t>▼</w:t>
-      </w:r>
-    </w:p>
-    <w:p>
-      <w:r>
-        <w:t>┌──────────────────────────────────────────┐</w:t>
-      </w:r>
-    </w:p>
-    <w:p>
-      <w:r>
         <w:t xml:space="preserve">│   </w:t>
       </w:r>
       <w:proofErr w:type="spellStart"/>
@@ -942,12 +1308,10 @@
         <w:t xml:space="preserve"> (/</w:t>
       </w:r>
       <w:proofErr w:type="spellStart"/>
-      <w:proofErr w:type="gramStart"/>
       <w:r>
         <w:t>login?logout</w:t>
       </w:r>
       <w:proofErr w:type="spellEnd"/>
-      <w:proofErr w:type="gramEnd"/>
       <w:r>
         <w:t>)       │</w:t>
       </w:r>
@@ -965,13 +1329,8 @@
     </w:p>
     <w:p>
       <w:r>
-        <w:t xml:space="preserve">Se implementa la validación de datos en </w:t>
-      </w:r>
-      <w:proofErr w:type="gramStart"/>
-      <w:r>
-        <w:t>las vis</w:t>
-      </w:r>
-      <w:proofErr w:type="gramEnd"/>
+        <w:t>Se implementa la validación de datos en las vis</w:t>
+      </w:r>
     </w:p>
     <w:p>
       <w:r>
@@ -995,7 +1354,6 @@
     </w:p>
     <w:p>
       <w:r>
-        <w:lastRenderedPageBreak/>
         <w:t>Errorgeneral.html</w:t>
       </w:r>
     </w:p>
@@ -1042,7 +1400,6 @@
         <w:t xml:space="preserve"> </w:t>
       </w:r>
       <w:proofErr w:type="spellStart"/>
-      <w:proofErr w:type="gramStart"/>
       <w:r>
         <w:rPr>
           <w:rFonts w:ascii="Consolas" w:hAnsi="Consolas"/>
@@ -1054,7 +1411,6 @@
         <w:t>th:fragment</w:t>
       </w:r>
       <w:proofErr w:type="spellEnd"/>
-      <w:proofErr w:type="gramEnd"/>
       <w:r>
         <w:rPr>
           <w:rFonts w:ascii="Consolas" w:hAnsi="Consolas"/>
@@ -1160,7 +1516,6 @@
         <w:t xml:space="preserve"> </w:t>
       </w:r>
       <w:proofErr w:type="spellStart"/>
-      <w:proofErr w:type="gramStart"/>
       <w:r>
         <w:rPr>
           <w:rFonts w:ascii="Consolas" w:hAnsi="Consolas"/>
@@ -1172,7 +1527,6 @@
         <w:t>th:if</w:t>
       </w:r>
       <w:proofErr w:type="spellEnd"/>
-      <w:proofErr w:type="gramEnd"/>
       <w:r>
         <w:rPr>
           <w:rFonts w:ascii="Consolas" w:hAnsi="Consolas"/>
@@ -1611,7 +1965,6 @@
         </w:rPr>
       </w:pPr>
       <w:proofErr w:type="spellStart"/>
-      <w:proofErr w:type="gramStart"/>
       <w:r>
         <w:rPr>
           <w:rFonts w:ascii="Courier New" w:eastAsia="Times New Roman" w:hAnsi="Courier New" w:cs="Courier New"/>
@@ -1622,7 +1975,6 @@
         <w:t>model.addAttribute</w:t>
       </w:r>
       <w:proofErr w:type="spellEnd"/>
-      <w:proofErr w:type="gramEnd"/>
       <w:r>
         <w:rPr>
           <w:rFonts w:ascii="Courier New" w:eastAsia="Times New Roman" w:hAnsi="Courier New" w:cs="Courier New"/>
@@ -1752,6 +2104,7 @@
         </w:rPr>
       </w:pPr>
       <w:r>
+        <w:lastRenderedPageBreak/>
         <w:t xml:space="preserve">En las clases editables en los formularios </w:t>
       </w:r>
       <w:r>
@@ -1767,13 +2120,8 @@
         <w:t xml:space="preserve"> mediante anotaciones “</w:t>
       </w:r>
       <w:proofErr w:type="spellStart"/>
-      <w:proofErr w:type="gramStart"/>
-      <w:r>
-        <w:t>jakarta.validation</w:t>
-      </w:r>
-      <w:proofErr w:type="gramEnd"/>
-      <w:r>
-        <w:t>.constraints</w:t>
+      <w:r>
+        <w:t>jakarta.validation.constraints</w:t>
       </w:r>
       <w:proofErr w:type="spellEnd"/>
       <w:r>
@@ -1929,15 +2277,7 @@
         <w:t>@FutureOrPresent</w:t>
       </w:r>
       <w:r>
-        <w:t xml:space="preserve"> Para fechas, que el valor sea mayor o igual </w:t>
-      </w:r>
-      <w:proofErr w:type="gramStart"/>
-      <w:r>
-        <w:t>al día de hoy</w:t>
-      </w:r>
-      <w:proofErr w:type="gramEnd"/>
-      <w:r>
-        <w:t>.</w:t>
+        <w:t xml:space="preserve"> Para fechas, que el valor sea mayor o igual al día de hoy.</w:t>
       </w:r>
     </w:p>
     <w:p>
@@ -2068,7 +2408,6 @@
         </w:rPr>
         <w:t>@</w:t>
       </w:r>
-      <w:proofErr w:type="gramStart"/>
       <w:r>
         <w:rPr>
           <w:rFonts w:ascii="Consolas" w:hAnsi="Consolas"/>
@@ -2086,17 +2425,7 @@
           <w:sz w:val="18"/>
           <w:szCs w:val="18"/>
         </w:rPr>
-        <w:t>(</w:t>
-      </w:r>
-      <w:proofErr w:type="gramEnd"/>
-      <w:r>
-        <w:rPr>
-          <w:rFonts w:ascii="Consolas" w:hAnsi="Consolas"/>
-          <w:color w:val="000000"/>
-          <w:sz w:val="18"/>
-          <w:szCs w:val="18"/>
-        </w:rPr>
-        <w:t xml:space="preserve">message = </w:t>
+        <w:t xml:space="preserve">(message = </w:t>
       </w:r>
       <w:r>
         <w:rPr>
@@ -2105,19 +2434,8 @@
           <w:sz w:val="18"/>
           <w:szCs w:val="18"/>
         </w:rPr>
-        <w:t>"{</w:t>
-      </w:r>
-      <w:proofErr w:type="gramStart"/>
-      <w:r>
-        <w:rPr>
-          <w:rFonts w:ascii="Consolas" w:hAnsi="Consolas"/>
-          <w:color w:val="2A00FF"/>
-          <w:sz w:val="18"/>
-          <w:szCs w:val="18"/>
-        </w:rPr>
-        <w:t>validations.mensaje</w:t>
-      </w:r>
-      <w:proofErr w:type="gramEnd"/>
+        <w:t>"{validations.mensaje</w:t>
+      </w:r>
       <w:r>
         <w:rPr>
           <w:rFonts w:ascii="Consolas" w:hAnsi="Consolas"/>
@@ -2254,7 +2572,6 @@
         </w:rPr>
         <w:t>@</w:t>
       </w:r>
-      <w:proofErr w:type="gramStart"/>
       <w:r>
         <w:rPr>
           <w:rFonts w:ascii="Consolas" w:hAnsi="Consolas"/>
@@ -2282,17 +2599,7 @@
           <w:sz w:val="18"/>
           <w:szCs w:val="18"/>
         </w:rPr>
-        <w:t>(</w:t>
-      </w:r>
-      <w:proofErr w:type="gramEnd"/>
-      <w:r>
-        <w:rPr>
-          <w:rFonts w:ascii="Consolas" w:hAnsi="Consolas"/>
-          <w:color w:val="000000"/>
-          <w:sz w:val="18"/>
-          <w:szCs w:val="18"/>
-        </w:rPr>
-        <w:t xml:space="preserve">message = </w:t>
+        <w:t xml:space="preserve">(message = </w:t>
       </w:r>
       <w:r>
         <w:rPr>
@@ -2301,19 +2608,8 @@
           <w:sz w:val="18"/>
           <w:szCs w:val="18"/>
         </w:rPr>
-        <w:t>"{</w:t>
-      </w:r>
-      <w:proofErr w:type="gramStart"/>
-      <w:r>
-        <w:rPr>
-          <w:rFonts w:ascii="Consolas" w:hAnsi="Consolas"/>
-          <w:color w:val="2A00FF"/>
-          <w:sz w:val="18"/>
-          <w:szCs w:val="18"/>
-        </w:rPr>
-        <w:t>validations.mensaje</w:t>
-      </w:r>
-      <w:proofErr w:type="gramEnd"/>
+        <w:t>"{validations.mensaje</w:t>
+      </w:r>
       <w:r>
         <w:rPr>
           <w:rFonts w:ascii="Consolas" w:hAnsi="Consolas"/>
@@ -2460,7 +2756,6 @@
           <w:sz w:val="18"/>
           <w:szCs w:val="18"/>
         </w:rPr>
-        <w:lastRenderedPageBreak/>
         <w:t xml:space="preserve">    </w:t>
       </w:r>
       <w:r>
@@ -2559,7 +2854,6 @@
         </w:rPr>
       </w:pPr>
       <w:proofErr w:type="spellStart"/>
-      <w:proofErr w:type="gramStart"/>
       <w:r>
         <w:rPr>
           <w:rFonts w:ascii="Consolas" w:hAnsi="Consolas"/>
@@ -2569,7 +2863,6 @@
         <w:t>Jakarta.validation.valid</w:t>
       </w:r>
       <w:proofErr w:type="spellEnd"/>
-      <w:proofErr w:type="gramEnd"/>
     </w:p>
     <w:p>
       <w:pPr>
@@ -2691,7 +2984,6 @@
         <w:t xml:space="preserve"> String </w:t>
       </w:r>
       <w:proofErr w:type="spellStart"/>
-      <w:proofErr w:type="gramStart"/>
       <w:r>
         <w:rPr>
           <w:rFonts w:ascii="Consolas" w:hAnsi="Consolas"/>
@@ -2711,7 +3003,6 @@
         </w:rPr>
         <w:t>(</w:t>
       </w:r>
-      <w:proofErr w:type="gramEnd"/>
       <w:r>
         <w:rPr>
           <w:rFonts w:ascii="Consolas" w:hAnsi="Consolas"/>
@@ -2998,7 +3289,7 @@
           <w:u w:val="single"/>
         </w:rPr>
       </w:pPr>
-      <w:hyperlink r:id="rId9" w:history="1">
+      <w:hyperlink r:id="rId12" w:history="1">
         <w:r>
           <w:rPr>
             <w:rFonts w:ascii="Consolas" w:eastAsia="Times New Roman" w:hAnsi="Consolas" w:cs="Times New Roman"/>
@@ -3015,7 +3306,7 @@
         </w:rPr>
         <w:t>.</w:t>
       </w:r>
-      <w:hyperlink r:id="rId10" w:history="1">
+      <w:hyperlink r:id="rId13" w:history="1">
         <w:r>
           <w:rPr>
             <w:rFonts w:ascii="Consolas" w:eastAsia="Times New Roman" w:hAnsi="Consolas" w:cs="Times New Roman"/>
@@ -3032,7 +3323,7 @@
         </w:rPr>
         <w:t>.</w:t>
       </w:r>
-      <w:hyperlink r:id="rId11" w:history="1">
+      <w:hyperlink r:id="rId14" w:history="1">
         <w:r>
           <w:rPr>
             <w:rFonts w:ascii="Consolas" w:eastAsia="Times New Roman" w:hAnsi="Consolas" w:cs="Times New Roman"/>
@@ -3049,7 +3340,7 @@
         </w:rPr>
         <w:t>.</w:t>
       </w:r>
-      <w:hyperlink r:id="rId12" w:history="1">
+      <w:hyperlink r:id="rId15" w:history="1">
         <w:r>
           <w:rPr>
             <w:rFonts w:ascii="Consolas" w:eastAsia="Times New Roman" w:hAnsi="Consolas" w:cs="Times New Roman"/>
@@ -3066,7 +3357,7 @@
         </w:rPr>
         <w:t>.</w:t>
       </w:r>
-      <w:hyperlink r:id="rId13" w:history="1">
+      <w:hyperlink r:id="rId16" w:history="1">
         <w:r>
           <w:rPr>
             <w:rFonts w:ascii="Consolas" w:eastAsia="Times New Roman" w:hAnsi="Consolas" w:cs="Times New Roman"/>
@@ -3134,7 +3425,6 @@
         </w:rPr>
         <w:t xml:space="preserve"> </w:t>
       </w:r>
-      <w:proofErr w:type="gramStart"/>
       <w:r>
         <w:rPr>
           <w:rFonts w:asciiTheme="minorHAnsi" w:hAnsiTheme="minorHAnsi"/>
@@ -3148,7 +3438,6 @@
         <w:t xml:space="preserve"> “</w:t>
       </w:r>
       <w:proofErr w:type="spellStart"/>
-      <w:proofErr w:type="gramEnd"/>
       <w:r>
         <w:rPr>
           <w:rFonts w:asciiTheme="minorHAnsi" w:hAnsiTheme="minorHAnsi"/>
@@ -3237,7 +3526,6 @@
         </w:rPr>
         <w:t xml:space="preserve"> </w:t>
       </w:r>
-      <w:proofErr w:type="gramStart"/>
       <w:r>
         <w:rPr>
           <w:rFonts w:ascii="Consolas" w:eastAsia="Times New Roman" w:hAnsi="Consolas" w:cs="Times New Roman"/>
@@ -3250,7 +3538,6 @@
         </w:rPr>
         <w:t>interface</w:t>
       </w:r>
-      <w:proofErr w:type="gramEnd"/>
       <w:r>
         <w:rPr>
           <w:rFonts w:ascii="Consolas" w:eastAsia="Times New Roman" w:hAnsi="Consolas" w:cs="Times New Roman"/>
@@ -3393,7 +3680,6 @@
         </w:rPr>
         <w:t xml:space="preserve"> </w:t>
       </w:r>
-      <w:proofErr w:type="gramStart"/>
       <w:r>
         <w:rPr>
           <w:rFonts w:ascii="Consolas" w:eastAsia="Times New Roman" w:hAnsi="Consolas" w:cs="Times New Roman"/>
@@ -3406,7 +3692,6 @@
         </w:rPr>
         <w:t>interface</w:t>
       </w:r>
-      <w:proofErr w:type="gramEnd"/>
       <w:r>
         <w:rPr>
           <w:rFonts w:ascii="Consolas" w:eastAsia="Times New Roman" w:hAnsi="Consolas" w:cs="Times New Roman"/>
@@ -3461,20 +3746,8 @@
           <w:szCs w:val="20"/>
           <w:lang w:eastAsia="es-ES"/>
         </w:rPr>
-        <w:t xml:space="preserve"> </w:t>
-      </w:r>
-      <w:proofErr w:type="gramStart"/>
-      <w:r>
-        <w:rPr>
-          <w:rFonts w:ascii="Consolas" w:eastAsia="Times New Roman" w:hAnsi="Consolas" w:cs="Times New Roman"/>
-          <w:color w:val="000000"/>
-          <w:sz w:val="20"/>
-          <w:szCs w:val="20"/>
-          <w:lang w:eastAsia="es-ES"/>
-        </w:rPr>
-        <w:t>Default{</w:t>
-      </w:r>
-      <w:proofErr w:type="gramEnd"/>
+        <w:t xml:space="preserve"> Default{</w:t>
+      </w:r>
     </w:p>
     <w:p>
       <w:pPr>
@@ -3593,36 +3866,16 @@
           <w:sz w:val="18"/>
           <w:szCs w:val="18"/>
         </w:rPr>
-        <w:t>@</w:t>
-      </w:r>
-      <w:proofErr w:type="gramStart"/>
-      <w:r>
-        <w:rPr>
-          <w:rFonts w:ascii="Consolas" w:hAnsi="Consolas"/>
-          <w:color w:val="646464"/>
-          <w:sz w:val="18"/>
-          <w:szCs w:val="18"/>
-        </w:rPr>
-        <w:t>NotBlank</w:t>
-      </w:r>
-      <w:r>
-        <w:rPr>
-          <w:rFonts w:ascii="Consolas" w:hAnsi="Consolas"/>
-          <w:color w:val="000000"/>
-          <w:sz w:val="18"/>
-          <w:szCs w:val="18"/>
-        </w:rPr>
-        <w:t>(</w:t>
-      </w:r>
-      <w:proofErr w:type="gramEnd"/>
-      <w:r>
-        <w:rPr>
-          <w:rFonts w:ascii="Consolas" w:hAnsi="Consolas"/>
-          <w:color w:val="000000"/>
-          <w:sz w:val="18"/>
-          <w:szCs w:val="18"/>
-        </w:rPr>
-        <w:t xml:space="preserve">message = </w:t>
+        <w:t>@NotBlank</w:t>
+      </w:r>
+      <w:r>
+        <w:rPr>
+          <w:rFonts w:ascii="Consolas" w:hAnsi="Consolas"/>
+          <w:color w:val="000000"/>
+          <w:sz w:val="18"/>
+          <w:szCs w:val="18"/>
+        </w:rPr>
+        <w:t xml:space="preserve">(message = </w:t>
       </w:r>
       <w:r>
         <w:rPr>
@@ -3634,7 +3887,6 @@
         <w:t>"{</w:t>
       </w:r>
       <w:proofErr w:type="spellStart"/>
-      <w:proofErr w:type="gramStart"/>
       <w:r>
         <w:rPr>
           <w:rFonts w:ascii="Consolas" w:hAnsi="Consolas"/>
@@ -3642,9 +3894,9 @@
           <w:sz w:val="18"/>
           <w:szCs w:val="18"/>
         </w:rPr>
-        <w:t>validations.message</w:t>
-      </w:r>
-      <w:proofErr w:type="gramEnd"/>
+        <w:t>validations.message.password.mandatory</w:t>
+      </w:r>
+      <w:proofErr w:type="spellEnd"/>
       <w:r>
         <w:rPr>
           <w:rFonts w:ascii="Consolas" w:hAnsi="Consolas"/>
@@ -3652,38 +3904,7 @@
           <w:sz w:val="18"/>
           <w:szCs w:val="18"/>
         </w:rPr>
-        <w:t>.</w:t>
-      </w:r>
-      <w:proofErr w:type="gramStart"/>
-      <w:r>
-        <w:rPr>
-          <w:rFonts w:ascii="Consolas" w:hAnsi="Consolas"/>
-          <w:color w:val="2A00FF"/>
-          <w:sz w:val="18"/>
-          <w:szCs w:val="18"/>
-        </w:rPr>
-        <w:t>password.mandatory</w:t>
-      </w:r>
-      <w:proofErr w:type="spellEnd"/>
-      <w:proofErr w:type="gramEnd"/>
-      <w:r>
-        <w:rPr>
-          <w:rFonts w:ascii="Consolas" w:hAnsi="Consolas"/>
-          <w:color w:val="2A00FF"/>
-          <w:sz w:val="18"/>
-          <w:szCs w:val="18"/>
-        </w:rPr>
-        <w:t>}</w:t>
-      </w:r>
-      <w:proofErr w:type="gramStart"/>
-      <w:r>
-        <w:rPr>
-          <w:rFonts w:ascii="Consolas" w:hAnsi="Consolas"/>
-          <w:color w:val="2A00FF"/>
-          <w:sz w:val="18"/>
-          <w:szCs w:val="18"/>
-        </w:rPr>
-        <w:t>"</w:t>
+        <w:t>}"</w:t>
       </w:r>
       <w:r>
         <w:rPr>
@@ -3706,7 +3927,6 @@
         <w:t>groups</w:t>
       </w:r>
       <w:proofErr w:type="spellEnd"/>
-      <w:proofErr w:type="gramEnd"/>
       <w:r>
         <w:rPr>
           <w:rFonts w:ascii="Consolas" w:hAnsi="Consolas"/>
@@ -3781,39 +4001,17 @@
           <w:szCs w:val="18"/>
           <w:lang w:eastAsia="es-ES"/>
         </w:rPr>
-        <w:t>@</w:t>
-      </w:r>
-      <w:proofErr w:type="gramStart"/>
+        <w:t>@Size</w:t>
+      </w:r>
       <w:r>
         <w:rPr>
           <w:rFonts w:ascii="Consolas" w:eastAsia="Times New Roman" w:hAnsi="Consolas" w:cs="Times New Roman"/>
-          <w:color w:val="646464"/>
+          <w:color w:val="000000"/>
           <w:sz w:val="18"/>
           <w:szCs w:val="18"/>
           <w:lang w:eastAsia="es-ES"/>
         </w:rPr>
-        <w:t>Size</w:t>
-      </w:r>
-      <w:r>
-        <w:rPr>
-          <w:rFonts w:ascii="Consolas" w:eastAsia="Times New Roman" w:hAnsi="Consolas" w:cs="Times New Roman"/>
-          <w:color w:val="000000"/>
-          <w:sz w:val="18"/>
-          <w:szCs w:val="18"/>
-          <w:lang w:eastAsia="es-ES"/>
-        </w:rPr>
-        <w:t>(</w:t>
-      </w:r>
-      <w:proofErr w:type="gramEnd"/>
-      <w:r>
-        <w:rPr>
-          <w:rFonts w:ascii="Consolas" w:eastAsia="Times New Roman" w:hAnsi="Consolas" w:cs="Times New Roman"/>
-          <w:color w:val="000000"/>
-          <w:sz w:val="18"/>
-          <w:szCs w:val="18"/>
-          <w:lang w:eastAsia="es-ES"/>
-        </w:rPr>
-        <w:t xml:space="preserve">min = 6, </w:t>
+        <w:t xml:space="preserve">(min = 6, </w:t>
       </w:r>
       <w:proofErr w:type="spellStart"/>
       <w:r>
@@ -3848,7 +4046,6 @@
         <w:t>"{</w:t>
       </w:r>
       <w:proofErr w:type="spellStart"/>
-      <w:proofErr w:type="gramStart"/>
       <w:r>
         <w:rPr>
           <w:rFonts w:ascii="Consolas" w:eastAsia="Times New Roman" w:hAnsi="Consolas" w:cs="Times New Roman"/>
@@ -3857,9 +4054,9 @@
           <w:szCs w:val="18"/>
           <w:lang w:eastAsia="es-ES"/>
         </w:rPr>
-        <w:t>validations.message</w:t>
-      </w:r>
-      <w:proofErr w:type="gramEnd"/>
+        <w:t>validations.message.password.validformat</w:t>
+      </w:r>
+      <w:proofErr w:type="spellEnd"/>
       <w:r>
         <w:rPr>
           <w:rFonts w:ascii="Consolas" w:eastAsia="Times New Roman" w:hAnsi="Consolas" w:cs="Times New Roman"/>
@@ -3868,41 +4065,7 @@
           <w:szCs w:val="18"/>
           <w:lang w:eastAsia="es-ES"/>
         </w:rPr>
-        <w:t>.</w:t>
-      </w:r>
-      <w:proofErr w:type="gramStart"/>
-      <w:r>
-        <w:rPr>
-          <w:rFonts w:ascii="Consolas" w:eastAsia="Times New Roman" w:hAnsi="Consolas" w:cs="Times New Roman"/>
-          <w:color w:val="2A00FF"/>
-          <w:sz w:val="18"/>
-          <w:szCs w:val="18"/>
-          <w:lang w:eastAsia="es-ES"/>
-        </w:rPr>
-        <w:t>password.validformat</w:t>
-      </w:r>
-      <w:proofErr w:type="spellEnd"/>
-      <w:proofErr w:type="gramEnd"/>
-      <w:r>
-        <w:rPr>
-          <w:rFonts w:ascii="Consolas" w:eastAsia="Times New Roman" w:hAnsi="Consolas" w:cs="Times New Roman"/>
-          <w:color w:val="2A00FF"/>
-          <w:sz w:val="18"/>
-          <w:szCs w:val="18"/>
-          <w:lang w:eastAsia="es-ES"/>
-        </w:rPr>
-        <w:t>}</w:t>
-      </w:r>
-      <w:proofErr w:type="gramStart"/>
-      <w:r>
-        <w:rPr>
-          <w:rFonts w:ascii="Consolas" w:eastAsia="Times New Roman" w:hAnsi="Consolas" w:cs="Times New Roman"/>
-          <w:color w:val="2A00FF"/>
-          <w:sz w:val="18"/>
-          <w:szCs w:val="18"/>
-          <w:lang w:eastAsia="es-ES"/>
-        </w:rPr>
-        <w:t>"</w:t>
+        <w:t>}"</w:t>
       </w:r>
       <w:r>
         <w:rPr>
@@ -3927,7 +4090,6 @@
         <w:t>groups</w:t>
       </w:r>
       <w:proofErr w:type="spellEnd"/>
-      <w:proofErr w:type="gramEnd"/>
       <w:r>
         <w:rPr>
           <w:rFonts w:ascii="Consolas" w:eastAsia="Times New Roman" w:hAnsi="Consolas" w:cs="Times New Roman"/>
@@ -4202,7 +4364,6 @@
         <w:t xml:space="preserve"> </w:t>
       </w:r>
       <w:proofErr w:type="spellStart"/>
-      <w:proofErr w:type="gramStart"/>
       <w:r>
         <w:rPr>
           <w:rFonts w:ascii="Consolas" w:eastAsia="Times New Roman" w:hAnsi="Consolas" w:cs="Times New Roman"/>
@@ -4212,7 +4373,6 @@
         <w:t>password</w:t>
       </w:r>
       <w:proofErr w:type="spellEnd"/>
-      <w:proofErr w:type="gramEnd"/>
       <w:r>
         <w:rPr>
           <w:rFonts w:ascii="Consolas" w:eastAsia="Times New Roman" w:hAnsi="Consolas" w:cs="Times New Roman"/>
@@ -4258,7 +4418,6 @@
         <w:t xml:space="preserve"> (sin </w:t>
       </w:r>
       <w:proofErr w:type="spellStart"/>
-      <w:proofErr w:type="gramStart"/>
       <w:r>
         <w:rPr>
           <w:rFonts w:ascii="Consolas" w:eastAsia="Times New Roman" w:hAnsi="Consolas" w:cs="Times New Roman"/>
@@ -4268,7 +4427,6 @@
         <w:t>password</w:t>
       </w:r>
       <w:proofErr w:type="spellEnd"/>
-      <w:proofErr w:type="gramEnd"/>
       <w:r>
         <w:rPr>
           <w:rFonts w:ascii="Consolas" w:eastAsia="Times New Roman" w:hAnsi="Consolas" w:cs="Times New Roman"/>
@@ -4385,7 +4543,6 @@
         <w:t xml:space="preserve"> = (</w:t>
       </w:r>
       <w:proofErr w:type="spellStart"/>
-      <w:proofErr w:type="gramStart"/>
       <w:r>
         <w:rPr>
           <w:rFonts w:ascii="Consolas" w:eastAsia="Times New Roman" w:hAnsi="Consolas" w:cs="Times New Roman"/>
@@ -4403,7 +4560,6 @@
         <w:t>.getId</w:t>
       </w:r>
       <w:proofErr w:type="spellEnd"/>
-      <w:proofErr w:type="gramEnd"/>
       <w:r>
         <w:rPr>
           <w:rFonts w:ascii="Consolas" w:eastAsia="Times New Roman" w:hAnsi="Consolas" w:cs="Times New Roman"/>
@@ -4424,26 +4580,15 @@
         <w:t>null</w:t>
       </w:r>
       <w:proofErr w:type="spellEnd"/>
-      <w:proofErr w:type="gramStart"/>
       <w:r>
         <w:rPr>
           <w:rFonts w:ascii="Consolas" w:eastAsia="Times New Roman" w:hAnsi="Consolas" w:cs="Times New Roman"/>
           <w:color w:val="000000"/>
           <w:lang w:eastAsia="es-ES"/>
         </w:rPr>
-        <w:t>) ?</w:t>
-      </w:r>
-      <w:proofErr w:type="gramEnd"/>
-      <w:r>
-        <w:rPr>
-          <w:rFonts w:ascii="Consolas" w:eastAsia="Times New Roman" w:hAnsi="Consolas" w:cs="Times New Roman"/>
-          <w:color w:val="000000"/>
-          <w:lang w:eastAsia="es-ES"/>
-        </w:rPr>
-        <w:t xml:space="preserve"> </w:t>
-      </w:r>
-      <w:proofErr w:type="spellStart"/>
-      <w:proofErr w:type="gramStart"/>
+        <w:t xml:space="preserve">) ? </w:t>
+      </w:r>
+      <w:proofErr w:type="spellStart"/>
       <w:r>
         <w:rPr>
           <w:rFonts w:ascii="Consolas" w:eastAsia="Times New Roman" w:hAnsi="Consolas" w:cs="Times New Roman"/>
@@ -4469,16 +4614,7 @@
           <w:color w:val="000000"/>
           <w:lang w:eastAsia="es-ES"/>
         </w:rPr>
-        <w:t xml:space="preserve"> :</w:t>
-      </w:r>
-      <w:proofErr w:type="gramEnd"/>
-      <w:r>
-        <w:rPr>
-          <w:rFonts w:ascii="Consolas" w:eastAsia="Times New Roman" w:hAnsi="Consolas" w:cs="Times New Roman"/>
-          <w:color w:val="000000"/>
-          <w:lang w:eastAsia="es-ES"/>
-        </w:rPr>
-        <w:t xml:space="preserve"> </w:t>
+        <w:t xml:space="preserve"> : </w:t>
       </w:r>
       <w:proofErr w:type="spellStart"/>
       <w:r>
@@ -4690,28 +4826,18 @@
           <w:lang w:eastAsia="es-ES"/>
         </w:rPr>
         <w:tab/>
-        <w:t xml:space="preserve">            </w:t>
-      </w:r>
-      <w:proofErr w:type="gramStart"/>
+        <w:t xml:space="preserve">            .</w:t>
+      </w:r>
+      <w:proofErr w:type="spellStart"/>
       <w:r>
         <w:rPr>
           <w:rFonts w:ascii="Consolas" w:eastAsia="Times New Roman" w:hAnsi="Consolas" w:cs="Times New Roman"/>
           <w:color w:val="000000"/>
           <w:lang w:eastAsia="es-ES"/>
         </w:rPr>
-        <w:t>.</w:t>
-      </w:r>
-      <w:proofErr w:type="spellStart"/>
-      <w:r>
-        <w:rPr>
-          <w:rFonts w:ascii="Consolas" w:eastAsia="Times New Roman" w:hAnsi="Consolas" w:cs="Times New Roman"/>
-          <w:color w:val="000000"/>
-          <w:lang w:eastAsia="es-ES"/>
-        </w:rPr>
         <w:t>validate</w:t>
       </w:r>
       <w:proofErr w:type="spellEnd"/>
-      <w:proofErr w:type="gramEnd"/>
       <w:r>
         <w:rPr>
           <w:rFonts w:ascii="Consolas" w:eastAsia="Times New Roman" w:hAnsi="Consolas" w:cs="Times New Roman"/>
@@ -4839,15 +4965,7 @@
       </w:r>
       <w:proofErr w:type="spellEnd"/>
       <w:r>
-        <w:t xml:space="preserve">” y el validador obviará </w:t>
-      </w:r>
-      <w:proofErr w:type="gramStart"/>
-      <w:r>
-        <w:t>los asignado</w:t>
-      </w:r>
-      <w:proofErr w:type="gramEnd"/>
-      <w:r>
-        <w:t xml:space="preserve"> a otros grupos.</w:t>
+        <w:t>” y el validador obviará los asignado a otros grupos.</w:t>
       </w:r>
     </w:p>
     <w:p>
@@ -4900,21 +5018,13 @@
         <w:t xml:space="preserve">se generan los mensajes </w:t>
       </w:r>
       <w:r>
-        <w:t xml:space="preserve">asociados a cada validación </w:t>
-      </w:r>
-      <w:proofErr w:type="gramStart"/>
-      <w:r>
-        <w:t xml:space="preserve">y </w:t>
+        <w:t xml:space="preserve">asociados a cada validación y </w:t>
       </w:r>
       <w:r>
         <w:t xml:space="preserve"> </w:t>
       </w:r>
       <w:r>
-        <w:t>devolviéndose</w:t>
-      </w:r>
-      <w:proofErr w:type="gramEnd"/>
-      <w:r>
-        <w:t xml:space="preserve"> </w:t>
+        <w:t xml:space="preserve">devolviéndose </w:t>
       </w:r>
       <w:r>
         <w:t>a la vista</w:t>
@@ -5074,7 +5184,6 @@
         <w:t xml:space="preserve"> </w:t>
       </w:r>
       <w:proofErr w:type="spellStart"/>
-      <w:proofErr w:type="gramStart"/>
       <w:r>
         <w:rPr>
           <w:rFonts w:ascii="Consolas" w:hAnsi="Consolas"/>
@@ -5086,7 +5195,6 @@
         <w:t>th:errors</w:t>
       </w:r>
       <w:proofErr w:type="spellEnd"/>
-      <w:proofErr w:type="gramEnd"/>
       <w:r>
         <w:rPr>
           <w:rFonts w:ascii="Consolas" w:hAnsi="Consolas"/>
@@ -5166,6 +5274,7 @@
         </w:rPr>
       </w:pPr>
       <w:r>
+        <w:lastRenderedPageBreak/>
         <w:t>-</w:t>
       </w:r>
       <w:r>
@@ -5313,7 +5422,6 @@
         <w:t xml:space="preserve"> String </w:t>
       </w:r>
       <w:proofErr w:type="spellStart"/>
-      <w:proofErr w:type="gramStart"/>
       <w:r>
         <w:rPr>
           <w:rFonts w:ascii="Consolas" w:hAnsi="Consolas"/>
@@ -5333,7 +5441,6 @@
         </w:rPr>
         <w:t>(</w:t>
       </w:r>
-      <w:proofErr w:type="gramEnd"/>
       <w:r>
         <w:rPr>
           <w:rFonts w:ascii="Consolas" w:hAnsi="Consolas"/>
@@ -5652,7 +5759,6 @@
         <w:t xml:space="preserve"> (</w:t>
       </w:r>
       <w:proofErr w:type="spellStart"/>
-      <w:proofErr w:type="gramStart"/>
       <w:r>
         <w:rPr>
           <w:rFonts w:ascii="Consolas" w:hAnsi="Consolas"/>
@@ -5672,7 +5778,6 @@
         <w:t>.hasErrors</w:t>
       </w:r>
       <w:proofErr w:type="spellEnd"/>
-      <w:proofErr w:type="gramEnd"/>
       <w:r>
         <w:rPr>
           <w:rFonts w:ascii="Consolas" w:hAnsi="Consolas"/>
@@ -5839,13 +5944,8 @@
         <w:tab/>
         <w:t xml:space="preserve">Los datos del formulario pueden ser válidos en formato </w:t>
       </w:r>
-      <w:proofErr w:type="gramStart"/>
-      <w:r>
-        <w:t>de acuerdo a</w:t>
-      </w:r>
-      <w:proofErr w:type="gramEnd"/>
-      <w:r>
-        <w:t xml:space="preserve"> lo determinado en sus atributos</w:t>
+      <w:r>
+        <w:t>de acuerdo a lo determinado en sus atributos</w:t>
       </w:r>
       <w:r>
         <w:t xml:space="preserve">, pero no cumplir las reglas de negocio que tenemos en nuestro modelo, en nuestro caso </w:t>
@@ -5896,7 +5996,6 @@
     </w:p>
     <w:p>
       <w:r>
-        <w:lastRenderedPageBreak/>
         <w:t>Ejemplo:</w:t>
       </w:r>
     </w:p>
@@ -5957,7 +6056,6 @@
         <w:t xml:space="preserve"> </w:t>
       </w:r>
       <w:proofErr w:type="spellStart"/>
-      <w:proofErr w:type="gramStart"/>
       <w:r>
         <w:rPr>
           <w:rFonts w:ascii="Consolas" w:hAnsi="Consolas"/>
@@ -5975,17 +6073,7 @@
           <w:sz w:val="18"/>
           <w:szCs w:val="18"/>
         </w:rPr>
-        <w:t>(</w:t>
-      </w:r>
-      <w:proofErr w:type="gramEnd"/>
-      <w:r>
-        <w:rPr>
-          <w:rFonts w:ascii="Consolas" w:hAnsi="Consolas"/>
-          <w:color w:val="000000"/>
-          <w:sz w:val="18"/>
-          <w:szCs w:val="18"/>
-        </w:rPr>
-        <w:t xml:space="preserve">Long </w:t>
+        <w:t xml:space="preserve">(Long </w:t>
       </w:r>
       <w:r>
         <w:rPr>
@@ -6130,7 +6218,6 @@
         <w:t xml:space="preserve"> = </w:t>
       </w:r>
       <w:proofErr w:type="spellStart"/>
-      <w:proofErr w:type="gramStart"/>
       <w:r>
         <w:rPr>
           <w:rFonts w:ascii="Consolas" w:hAnsi="Consolas"/>
@@ -6151,7 +6238,6 @@
         <w:t>.findById</w:t>
       </w:r>
       <w:proofErr w:type="spellEnd"/>
-      <w:proofErr w:type="gramEnd"/>
       <w:r>
         <w:rPr>
           <w:rFonts w:ascii="Consolas" w:hAnsi="Consolas"/>
@@ -6201,17 +6287,7 @@
           <w:sz w:val="18"/>
           <w:szCs w:val="18"/>
         </w:rPr>
-        <w:t xml:space="preserve">                </w:t>
-      </w:r>
-      <w:proofErr w:type="gramStart"/>
-      <w:r>
-        <w:rPr>
-          <w:rFonts w:ascii="Consolas" w:hAnsi="Consolas"/>
-          <w:color w:val="000000"/>
-          <w:sz w:val="18"/>
-          <w:szCs w:val="18"/>
-        </w:rPr>
-        <w:t>.</w:t>
+        <w:t xml:space="preserve">                .</w:t>
       </w:r>
       <w:proofErr w:type="spellStart"/>
       <w:r>
@@ -6224,7 +6300,6 @@
         <w:t>orElseThrow</w:t>
       </w:r>
       <w:proofErr w:type="spellEnd"/>
-      <w:proofErr w:type="gramEnd"/>
       <w:r>
         <w:rPr>
           <w:rFonts w:ascii="Consolas" w:hAnsi="Consolas"/>
@@ -6255,7 +6330,6 @@
         <w:t xml:space="preserve"> </w:t>
       </w:r>
       <w:proofErr w:type="spellStart"/>
-      <w:proofErr w:type="gramStart"/>
       <w:r>
         <w:rPr>
           <w:rFonts w:ascii="Consolas" w:hAnsi="Consolas"/>
@@ -6275,7 +6349,6 @@
         </w:rPr>
         <w:t>(</w:t>
       </w:r>
-      <w:proofErr w:type="gramEnd"/>
       <w:r>
         <w:rPr>
           <w:rFonts w:ascii="Consolas" w:hAnsi="Consolas"/>
@@ -6359,20 +6432,9 @@
           <w:sz w:val="18"/>
           <w:szCs w:val="18"/>
         </w:rPr>
-        <w:t>comprobación_de_</w:t>
-      </w:r>
-      <w:proofErr w:type="gramStart"/>
-      <w:r>
-        <w:rPr>
-          <w:rFonts w:ascii="Consolas" w:hAnsi="Consolas"/>
-          <w:color w:val="000000"/>
-          <w:sz w:val="18"/>
-          <w:szCs w:val="18"/>
-        </w:rPr>
-        <w:t>password</w:t>
-      </w:r>
-      <w:proofErr w:type="spellEnd"/>
-      <w:proofErr w:type="gramEnd"/>
+        <w:t>comprobación_de_password</w:t>
+      </w:r>
+      <w:proofErr w:type="spellEnd"/>
       <w:r>
         <w:rPr>
           <w:rFonts w:ascii="Consolas" w:hAnsi="Consolas"/>
@@ -6447,7 +6509,6 @@
         <w:t xml:space="preserve"> </w:t>
       </w:r>
       <w:proofErr w:type="spellStart"/>
-      <w:proofErr w:type="gramStart"/>
       <w:r>
         <w:rPr>
           <w:rFonts w:ascii="Consolas" w:hAnsi="Consolas"/>
@@ -6468,7 +6529,6 @@
         </w:rPr>
         <w:t>(</w:t>
       </w:r>
-      <w:proofErr w:type="gramEnd"/>
       <w:r>
         <w:rPr>
           <w:rFonts w:ascii="Consolas" w:hAnsi="Consolas"/>
@@ -6597,15 +6657,7 @@
       </w:r>
       <w:proofErr w:type="spellEnd"/>
       <w:r>
-        <w:t xml:space="preserve">, </w:t>
-      </w:r>
-      <w:proofErr w:type="gramStart"/>
-      <w:r>
-        <w:t>y</w:t>
-      </w:r>
-      <w:proofErr w:type="gramEnd"/>
-      <w:r>
-        <w:t xml:space="preserve"> sobre todo, la famosa página</w:t>
+        <w:t>, y sobre todo, la famosa página</w:t>
       </w:r>
       <w:r>
         <w:rPr>
@@ -6713,7 +6765,7 @@
                     <pic:cNvPicPr/>
                   </pic:nvPicPr>
                   <pic:blipFill>
-                    <a:blip r:embed="rId14"/>
+                    <a:blip r:embed="rId17"/>
                     <a:stretch>
                       <a:fillRect/>
                     </a:stretch>
@@ -6736,6 +6788,7 @@
     </w:p>
     <w:p>
       <w:r>
+        <w:lastRenderedPageBreak/>
         <w:t>Se incorpora a esta clase el “</w:t>
       </w:r>
       <w:proofErr w:type="spellStart"/>
@@ -6821,7 +6874,7 @@
                     <pic:cNvPicPr/>
                   </pic:nvPicPr>
                   <pic:blipFill>
-                    <a:blip r:embed="rId15"/>
+                    <a:blip r:embed="rId18"/>
                     <a:stretch>
                       <a:fillRect/>
                     </a:stretch>
@@ -6985,7 +7038,6 @@
           <w:b/>
           <w:bCs/>
         </w:rPr>
-        <w:lastRenderedPageBreak/>
         <w:t xml:space="preserve">A partir de esta clase, se han “centralizado” todas las Excepciones propias en </w:t>
       </w:r>
     </w:p>
@@ -7200,7 +7252,6 @@
         </w:rPr>
       </w:pPr>
       <w:proofErr w:type="spellStart"/>
-      <w:proofErr w:type="gramStart"/>
       <w:r>
         <w:rPr>
           <w:rFonts w:ascii="Consolas" w:hAnsi="Consolas"/>
@@ -7220,7 +7271,6 @@
         <w:t>.rejectValue</w:t>
       </w:r>
       <w:proofErr w:type="spellEnd"/>
-      <w:proofErr w:type="gramEnd"/>
       <w:r>
         <w:rPr>
           <w:rFonts w:ascii="Consolas" w:hAnsi="Consolas"/>
@@ -7250,7 +7300,6 @@
         <w:t>errorGlobal</w:t>
       </w:r>
       <w:proofErr w:type="spellEnd"/>
-      <w:proofErr w:type="gramStart"/>
       <w:r>
         <w:rPr>
           <w:rFonts w:ascii="Consolas" w:hAnsi="Consolas"/>
@@ -7289,7 +7338,6 @@
         <w:t>error.en</w:t>
       </w:r>
       <w:proofErr w:type="spellEnd"/>
-      <w:proofErr w:type="gramEnd"/>
       <w:r>
         <w:rPr>
           <w:rFonts w:ascii="Consolas" w:hAnsi="Consolas"/>
@@ -7338,7 +7386,6 @@
         <w:t xml:space="preserve"> </w:t>
       </w:r>
       <w:proofErr w:type="spellStart"/>
-      <w:proofErr w:type="gramStart"/>
       <w:r>
         <w:rPr>
           <w:rFonts w:ascii="Consolas" w:hAnsi="Consolas"/>
@@ -7358,7 +7405,6 @@
         <w:t>.getMessage</w:t>
       </w:r>
       <w:proofErr w:type="spellEnd"/>
-      <w:proofErr w:type="gramEnd"/>
       <w:r>
         <w:rPr>
           <w:rFonts w:ascii="Consolas" w:hAnsi="Consolas"/>
@@ -7512,7 +7558,6 @@
         <w:tab/>
       </w:r>
       <w:proofErr w:type="spellStart"/>
-      <w:proofErr w:type="gramStart"/>
       <w:r>
         <w:rPr>
           <w:rFonts w:ascii="Consolas" w:hAnsi="Consolas"/>
@@ -7532,7 +7577,6 @@
         <w:t>.rejectValue</w:t>
       </w:r>
       <w:proofErr w:type="spellEnd"/>
-      <w:proofErr w:type="gramEnd"/>
       <w:r>
         <w:rPr>
           <w:rFonts w:ascii="Consolas" w:hAnsi="Consolas"/>
@@ -7590,7 +7634,6 @@
         <w:t>"</w:t>
       </w:r>
       <w:proofErr w:type="spellStart"/>
-      <w:proofErr w:type="gramStart"/>
       <w:r>
         <w:rPr>
           <w:rFonts w:ascii="Consolas" w:hAnsi="Consolas"/>
@@ -7601,7 +7644,6 @@
         <w:t>error.enproperties</w:t>
       </w:r>
       <w:proofErr w:type="spellEnd"/>
-      <w:proofErr w:type="gramEnd"/>
       <w:r>
         <w:rPr>
           <w:rFonts w:ascii="Consolas" w:hAnsi="Consolas"/>
@@ -7621,7 +7663,6 @@
         <w:t xml:space="preserve">, </w:t>
       </w:r>
       <w:proofErr w:type="spellStart"/>
-      <w:proofErr w:type="gramStart"/>
       <w:r>
         <w:rPr>
           <w:rFonts w:ascii="Consolas" w:hAnsi="Consolas"/>
@@ -7641,7 +7682,6 @@
         <w:t>.getMessage</w:t>
       </w:r>
       <w:proofErr w:type="spellEnd"/>
-      <w:proofErr w:type="gramEnd"/>
       <w:r>
         <w:rPr>
           <w:rFonts w:ascii="Consolas" w:hAnsi="Consolas"/>
@@ -7690,7 +7730,6 @@
         <w:t>De esta forma al validar “</w:t>
       </w:r>
       <w:proofErr w:type="spellStart"/>
-      <w:proofErr w:type="gramStart"/>
       <w:r>
         <w:rPr>
           <w:rFonts w:ascii="Consolas" w:hAnsi="Consolas"/>
@@ -7710,7 +7749,6 @@
         <w:t>.hasErrors</w:t>
       </w:r>
       <w:proofErr w:type="spellEnd"/>
-      <w:proofErr w:type="gramEnd"/>
       <w:r>
         <w:rPr>
           <w:rFonts w:ascii="Consolas" w:hAnsi="Consolas"/>
@@ -7839,28 +7877,20 @@
         <w:t xml:space="preserve"> asociados a entidades </w:t>
       </w:r>
       <w:r>
-        <w:t xml:space="preserve">tales </w:t>
-      </w:r>
-      <w:proofErr w:type="gramStart"/>
-      <w:r>
-        <w:t xml:space="preserve">como </w:t>
+        <w:t xml:space="preserve">tales como </w:t>
       </w:r>
       <w:r>
         <w:t xml:space="preserve"> </w:t>
       </w:r>
       <w:r>
-        <w:t>Curso</w:t>
-      </w:r>
-      <w:proofErr w:type="gramEnd"/>
-      <w:r>
-        <w:t xml:space="preserve"> o de </w:t>
-      </w:r>
-      <w:proofErr w:type="spellStart"/>
-      <w:r>
-        <w:t>EstudianteCuros</w:t>
-      </w:r>
-      <w:r>
-        <w:t>dominio</w:t>
+        <w:t xml:space="preserve">Curso o de </w:t>
+      </w:r>
+      <w:proofErr w:type="spellStart"/>
+      <w:r>
+        <w:t>EstudianteCurs</w:t>
+      </w:r>
+      <w:r>
+        <w:t>oModulo</w:t>
       </w:r>
       <w:proofErr w:type="spellEnd"/>
       <w:r>
@@ -7877,6 +7907,7 @@
     </w:p>
     <w:p>
       <w:r>
+        <w:lastRenderedPageBreak/>
         <w:t>Este servicio centraliza:</w:t>
       </w:r>
     </w:p>
@@ -7976,29 +8007,19 @@
     </w:p>
     <w:p>
       <w:r>
-        <w:t xml:space="preserve">Clase utilitaria para encapsular los valores del </w:t>
-      </w:r>
-      <w:proofErr w:type="gramStart"/>
-      <w:r>
-        <w:t>fichero</w:t>
+        <w:t>Clase utilitaria para encapsular los valores del fichero</w:t>
       </w:r>
       <w:r>
         <w:t xml:space="preserve"> </w:t>
       </w:r>
       <w:r>
-        <w:t xml:space="preserve"> de</w:t>
-      </w:r>
-      <w:proofErr w:type="gramEnd"/>
-      <w:r>
-        <w:t xml:space="preserve"> configuración </w:t>
-      </w:r>
-      <w:proofErr w:type="spellStart"/>
-      <w:proofErr w:type="gramStart"/>
+        <w:t xml:space="preserve">de configuración </w:t>
+      </w:r>
+      <w:proofErr w:type="spellStart"/>
       <w:r>
         <w:t>application.properties</w:t>
       </w:r>
       <w:proofErr w:type="spellEnd"/>
-      <w:proofErr w:type="gramEnd"/>
       <w:r>
         <w:t>.</w:t>
       </w:r>
@@ -8032,45 +8053,27 @@
           <w:bCs/>
         </w:rPr>
       </w:pPr>
-      <w:proofErr w:type="gramStart"/>
-      <w:r>
-        <w:rPr>
-          <w:b/>
-          <w:bCs/>
-        </w:rPr>
-        <w:t>  Cambiar</w:t>
-      </w:r>
-      <w:proofErr w:type="gramEnd"/>
-      <w:r>
-        <w:rPr>
-          <w:b/>
-          <w:bCs/>
-        </w:rPr>
-        <w:t xml:space="preserve"> rutas sin tocar código</w:t>
-      </w:r>
-    </w:p>
-    <w:p>
-      <w:pPr>
-        <w:rPr>
-          <w:b/>
-          <w:bCs/>
-        </w:rPr>
-      </w:pPr>
-      <w:proofErr w:type="gramStart"/>
-      <w:r>
-        <w:rPr>
-          <w:b/>
-          <w:bCs/>
-        </w:rPr>
-        <w:t>  Configurar</w:t>
-      </w:r>
-      <w:proofErr w:type="gramEnd"/>
-      <w:r>
-        <w:rPr>
-          <w:b/>
-          <w:bCs/>
-        </w:rPr>
-        <w:t xml:space="preserve"> rutas distintas por entorno (</w:t>
+      <w:r>
+        <w:rPr>
+          <w:b/>
+          <w:bCs/>
+        </w:rPr>
+        <w:t>  Cambiar rutas sin tocar código</w:t>
+      </w:r>
+    </w:p>
+    <w:p>
+      <w:pPr>
+        <w:rPr>
+          <w:b/>
+          <w:bCs/>
+        </w:rPr>
+      </w:pPr>
+      <w:r>
+        <w:rPr>
+          <w:b/>
+          <w:bCs/>
+        </w:rPr>
+        <w:t>  Configurar rutas distintas por entorno (</w:t>
       </w:r>
       <w:proofErr w:type="spellStart"/>
       <w:r>
@@ -8112,21 +8115,12 @@
           <w:bCs/>
         </w:rPr>
       </w:pPr>
-      <w:proofErr w:type="gramStart"/>
-      <w:r>
-        <w:rPr>
-          <w:b/>
-          <w:bCs/>
-        </w:rPr>
-        <w:t>  Mantener</w:t>
-      </w:r>
-      <w:proofErr w:type="gramEnd"/>
-      <w:r>
-        <w:rPr>
-          <w:b/>
-          <w:bCs/>
-        </w:rPr>
-        <w:t xml:space="preserve"> el código limpio y portable</w:t>
+      <w:r>
+        <w:rPr>
+          <w:b/>
+          <w:bCs/>
+        </w:rPr>
+        <w:t>  Mantener el código limpio y portable</w:t>
       </w:r>
     </w:p>
     <w:p>
@@ -8370,6 +8364,7 @@
           <w:b/>
           <w:bCs/>
         </w:rPr>
+        <w:lastRenderedPageBreak/>
         <w:t>Usamos un @ControllerAdvice para que esta herramienta esté disponible en todas las vistas sin tener que añadirla método a método en cada controlador.</w:t>
       </w:r>
     </w:p>
@@ -8443,7 +8438,6 @@
         <w:t xml:space="preserve"> </w:t>
       </w:r>
       <w:proofErr w:type="spellStart"/>
-      <w:proofErr w:type="gramStart"/>
       <w:r>
         <w:rPr>
           <w:b/>
@@ -8457,15 +8451,7 @@
           <w:b/>
           <w:bCs/>
         </w:rPr>
-        <w:t>(</w:t>
-      </w:r>
-      <w:proofErr w:type="gramEnd"/>
-      <w:r>
-        <w:rPr>
-          <w:b/>
-          <w:bCs/>
-        </w:rPr>
-        <w:t>) {</w:t>
+        <w:t>() {</w:t>
       </w:r>
     </w:p>
     <w:p>
@@ -8542,7 +8528,6 @@
         </w:rPr>
       </w:pPr>
       <w:proofErr w:type="spellStart"/>
-      <w:proofErr w:type="gramStart"/>
       <w:r>
         <w:rPr>
           <w:b/>
@@ -8556,15 +8541,7 @@
           <w:b/>
           <w:bCs/>
         </w:rPr>
-        <w:t>(</w:t>
-      </w:r>
-      <w:proofErr w:type="gramEnd"/>
-      <w:r>
-        <w:rPr>
-          <w:b/>
-          <w:bCs/>
-        </w:rPr>
-        <w:t xml:space="preserve">): Captura la URL completa, incluyendo el </w:t>
+        <w:t xml:space="preserve">(): Captura la URL completa, incluyendo el </w:t>
       </w:r>
       <w:proofErr w:type="spellStart"/>
       <w:r>
@@ -8607,21 +8584,12 @@
         <w:t>ej</w:t>
       </w:r>
       <w:proofErr w:type="spellEnd"/>
-      <w:proofErr w:type="gramStart"/>
-      <w:r>
-        <w:rPr>
-          <w:b/>
-          <w:bCs/>
-        </w:rPr>
-        <w:t>: ?titulo</w:t>
-      </w:r>
-      <w:proofErr w:type="gramEnd"/>
-      <w:r>
-        <w:rPr>
-          <w:b/>
-          <w:bCs/>
-        </w:rPr>
-        <w:t>=</w:t>
+      <w:r>
+        <w:rPr>
+          <w:b/>
+          <w:bCs/>
+        </w:rPr>
+        <w:t>: ?titulo=</w:t>
       </w:r>
       <w:proofErr w:type="spellStart"/>
       <w:r>
@@ -8709,7 +8677,6 @@
         </w:rPr>
       </w:pPr>
       <w:proofErr w:type="spellStart"/>
-      <w:proofErr w:type="gramStart"/>
       <w:r>
         <w:rPr>
           <w:b/>
@@ -8718,7 +8685,6 @@
         <w:t>th:href</w:t>
       </w:r>
       <w:proofErr w:type="spellEnd"/>
-      <w:proofErr w:type="gramEnd"/>
       <w:r>
         <w:rPr>
           <w:b/>
@@ -8756,15 +8722,7 @@
           <w:b/>
           <w:bCs/>
         </w:rPr>
-        <w:t>', 'es'</w:t>
-      </w:r>
-      <w:proofErr w:type="gramStart"/>
-      <w:r>
-        <w:rPr>
-          <w:b/>
-          <w:bCs/>
-        </w:rPr>
-        <w:t>).</w:t>
+        <w:t>', 'es').</w:t>
       </w:r>
       <w:proofErr w:type="spellStart"/>
       <w:r>
@@ -8775,7 +8733,6 @@
         <w:t>toUriString</w:t>
       </w:r>
       <w:proofErr w:type="spellEnd"/>
-      <w:proofErr w:type="gramEnd"/>
       <w:r>
         <w:rPr>
           <w:b/>
@@ -8796,13 +8753,11 @@
         </w:rPr>
       </w:pPr>
       <w:proofErr w:type="spellStart"/>
-      <w:proofErr w:type="gramStart"/>
-      <w:r>
-        <w:rPr>
-          <w:b/>
-          <w:bCs/>
-        </w:rPr>
-        <w:lastRenderedPageBreak/>
+      <w:r>
+        <w:rPr>
+          <w:b/>
+          <w:bCs/>
+        </w:rPr>
         <w:t>replaceQueryParam</w:t>
       </w:r>
       <w:proofErr w:type="spellEnd"/>
@@ -8814,7 +8769,6 @@
         <w:t>(</w:t>
       </w:r>
       <w:proofErr w:type="spellStart"/>
-      <w:proofErr w:type="gramEnd"/>
       <w:r>
         <w:rPr>
           <w:b/>
@@ -8860,23 +8814,7 @@
           <w:b/>
           <w:bCs/>
         </w:rPr>
-        <w:t xml:space="preserve"> ya existe, lo cambia. Si no existe, lo añade. El resto de </w:t>
-      </w:r>
-      <w:proofErr w:type="gramStart"/>
-      <w:r>
-        <w:rPr>
-          <w:b/>
-          <w:bCs/>
-        </w:rPr>
-        <w:t>parámetros</w:t>
-      </w:r>
-      <w:proofErr w:type="gramEnd"/>
-      <w:r>
-        <w:rPr>
-          <w:b/>
-          <w:bCs/>
-        </w:rPr>
-        <w:t xml:space="preserve"> (filtros de búsqueda, nivel, etc.) se mantienen intactos.</w:t>
+        <w:t xml:space="preserve"> ya existe, lo cambia. Si no existe, lo añade. El resto de parámetros (filtros de búsqueda, nivel, etc.) se mantienen intactos.</w:t>
       </w:r>
     </w:p>
     <w:p>
@@ -8891,7 +8829,6 @@
         </w:rPr>
       </w:pPr>
       <w:proofErr w:type="spellStart"/>
-      <w:proofErr w:type="gramStart"/>
       <w:r>
         <w:rPr>
           <w:b/>
@@ -8905,15 +8842,7 @@
           <w:b/>
           <w:bCs/>
         </w:rPr>
-        <w:t>(</w:t>
-      </w:r>
-      <w:proofErr w:type="gramEnd"/>
-      <w:r>
-        <w:rPr>
-          <w:b/>
-          <w:bCs/>
-        </w:rPr>
-        <w:t xml:space="preserve">): Convierte el objeto de nuevo en una cadena de texto válida para el atributo </w:t>
+        <w:t xml:space="preserve">(): Convierte el objeto de nuevo en una cadena de texto válida para el atributo </w:t>
       </w:r>
       <w:proofErr w:type="spellStart"/>
       <w:r>
@@ -9038,7 +8967,6 @@
         <w:t>$$\</w:t>
       </w:r>
       <w:proofErr w:type="spellStart"/>
-      <w:proofErr w:type="gramStart"/>
       <w:r>
         <w:rPr>
           <w:b/>
@@ -9052,34 +8980,9 @@
           <w:b/>
           <w:bCs/>
         </w:rPr>
-        <w:t>{</w:t>
-      </w:r>
-      <w:proofErr w:type="gramEnd"/>
-      <w:r>
-        <w:rPr>
-          <w:b/>
-          <w:bCs/>
-        </w:rPr>
-        <w:t>Progreso} = \</w:t>
-      </w:r>
-      <w:proofErr w:type="gramStart"/>
-      <w:r>
-        <w:rPr>
-          <w:b/>
-          <w:bCs/>
-        </w:rPr>
-        <w:t>frac{</w:t>
-      </w:r>
-      <w:proofErr w:type="gramEnd"/>
-      <w:r>
-        <w:rPr>
-          <w:b/>
-          <w:bCs/>
-        </w:rPr>
-        <w:t>\sum (\</w:t>
-      </w:r>
-      <w:proofErr w:type="spellStart"/>
-      <w:proofErr w:type="gramStart"/>
+        <w:t>{Progreso} = \frac{\sum (\</w:t>
+      </w:r>
+      <w:proofErr w:type="spellStart"/>
       <w:r>
         <w:rPr>
           <w:b/>
@@ -9093,34 +8996,9 @@
           <w:b/>
           <w:bCs/>
         </w:rPr>
-        <w:t>{</w:t>
-      </w:r>
-      <w:proofErr w:type="gramEnd"/>
-      <w:r>
-        <w:rPr>
-          <w:b/>
-          <w:bCs/>
-        </w:rPr>
-        <w:t>Peso de Tareas Completadas}</w:t>
-      </w:r>
-      <w:proofErr w:type="gramStart"/>
-      <w:r>
-        <w:rPr>
-          <w:b/>
-          <w:bCs/>
-        </w:rPr>
-        <w:t>)}{</w:t>
-      </w:r>
-      <w:proofErr w:type="gramEnd"/>
-      <w:r>
-        <w:rPr>
-          <w:b/>
-          <w:bCs/>
-        </w:rPr>
-        <w:t>\sum (\</w:t>
-      </w:r>
-      <w:proofErr w:type="spellStart"/>
-      <w:proofErr w:type="gramStart"/>
+        <w:t>{Peso de Tareas Completadas})}{\sum (\</w:t>
+      </w:r>
+      <w:proofErr w:type="spellStart"/>
       <w:r>
         <w:rPr>
           <w:b/>
@@ -9134,15 +9012,7 @@
           <w:b/>
           <w:bCs/>
         </w:rPr>
-        <w:t>{</w:t>
-      </w:r>
-      <w:proofErr w:type="gramEnd"/>
-      <w:r>
-        <w:rPr>
-          <w:b/>
-          <w:bCs/>
-        </w:rPr>
-        <w:t>Peso Total de Tareas del Curso})} \times 100$$</w:t>
+        <w:t>{Peso Total de Tareas del Curso})} \times 100$$</w:t>
       </w:r>
     </w:p>
     <w:p>
@@ -9301,7 +9171,6 @@
         <w:t xml:space="preserve"> </w:t>
       </w:r>
       <w:proofErr w:type="spellStart"/>
-      <w:proofErr w:type="gramStart"/>
       <w:r>
         <w:rPr>
           <w:b/>
@@ -9310,7 +9179,6 @@
         <w:t>th:if</w:t>
       </w:r>
       <w:proofErr w:type="spellEnd"/>
-      <w:proofErr w:type="gramEnd"/>
       <w:r>
         <w:rPr>
           <w:b/>
@@ -9319,7 +9187,6 @@
         <w:t>="${</w:t>
       </w:r>
       <w:proofErr w:type="spellStart"/>
-      <w:proofErr w:type="gramStart"/>
       <w:r>
         <w:rPr>
           <w:b/>
@@ -9328,7 +9195,6 @@
         <w:t>curso.progreso</w:t>
       </w:r>
       <w:proofErr w:type="spellEnd"/>
-      <w:proofErr w:type="gramEnd"/>
       <w:r>
         <w:rPr>
           <w:b/>
@@ -9570,6 +9436,7 @@
           <w:b/>
           <w:bCs/>
         </w:rPr>
+        <w:lastRenderedPageBreak/>
         <w:t xml:space="preserve">    &lt;/</w:t>
       </w:r>
       <w:proofErr w:type="spellStart"/>
@@ -9628,7 +9495,6 @@
         <w:t xml:space="preserve"> </w:t>
       </w:r>
       <w:proofErr w:type="spellStart"/>
-      <w:proofErr w:type="gramStart"/>
       <w:r>
         <w:rPr>
           <w:b/>
@@ -9637,7 +9503,6 @@
         <w:t>th:if</w:t>
       </w:r>
       <w:proofErr w:type="spellEnd"/>
-      <w:proofErr w:type="gramEnd"/>
       <w:r>
         <w:rPr>
           <w:b/>
@@ -9646,7 +9511,6 @@
         <w:t>="${</w:t>
       </w:r>
       <w:proofErr w:type="spellStart"/>
-      <w:proofErr w:type="gramStart"/>
       <w:r>
         <w:rPr>
           <w:b/>
@@ -9655,7 +9519,6 @@
         <w:t>curso.progreso</w:t>
       </w:r>
       <w:proofErr w:type="spellEnd"/>
-      <w:proofErr w:type="gramEnd"/>
       <w:r>
         <w:rPr>
           <w:b/>
@@ -9679,7 +9542,6 @@
         <w:t xml:space="preserve">        &lt;a </w:t>
       </w:r>
       <w:proofErr w:type="spellStart"/>
-      <w:proofErr w:type="gramStart"/>
       <w:r>
         <w:rPr>
           <w:b/>
@@ -9688,7 +9550,6 @@
         <w:t>th:href</w:t>
       </w:r>
       <w:proofErr w:type="spellEnd"/>
-      <w:proofErr w:type="gramEnd"/>
       <w:r>
         <w:rPr>
           <w:b/>
@@ -9869,7 +9730,6 @@
         <w:t xml:space="preserve">        &lt;p </w:t>
       </w:r>
       <w:proofErr w:type="spellStart"/>
-      <w:proofErr w:type="gramStart"/>
       <w:r>
         <w:rPr>
           <w:b/>
@@ -9878,7 +9738,6 @@
         <w:t>th:if</w:t>
       </w:r>
       <w:proofErr w:type="spellEnd"/>
-      <w:proofErr w:type="gramEnd"/>
       <w:r>
         <w:rPr>
           <w:b/>
@@ -9887,7 +9746,6 @@
         <w:t>="${</w:t>
       </w:r>
       <w:proofErr w:type="spellStart"/>
-      <w:proofErr w:type="gramStart"/>
       <w:r>
         <w:rPr>
           <w:b/>
@@ -9896,7 +9754,6 @@
         <w:t>curso.tieneTareaPendiente</w:t>
       </w:r>
       <w:proofErr w:type="spellEnd"/>
-      <w:proofErr w:type="gramEnd"/>
       <w:r>
         <w:rPr>
           <w:b/>
@@ -10098,7 +9955,6 @@
           <w:b/>
           <w:bCs/>
         </w:rPr>
-        <w:lastRenderedPageBreak/>
         <w:t>&lt;/</w:t>
       </w:r>
       <w:proofErr w:type="spellStart"/>
@@ -10368,7 +10224,6 @@
         <w:t xml:space="preserve">         </w:t>
       </w:r>
       <w:proofErr w:type="spellStart"/>
-      <w:proofErr w:type="gramStart"/>
       <w:r>
         <w:rPr>
           <w:b/>
@@ -10377,7 +10232,6 @@
         <w:t>th:style</w:t>
       </w:r>
       <w:proofErr w:type="spellEnd"/>
-      <w:proofErr w:type="gramEnd"/>
       <w:r>
         <w:rPr>
           <w:b/>
@@ -10402,7 +10256,6 @@
         <w:t>: ' + ${</w:t>
       </w:r>
       <w:proofErr w:type="spellStart"/>
-      <w:proofErr w:type="gramStart"/>
       <w:r>
         <w:rPr>
           <w:b/>
@@ -10411,7 +10264,6 @@
         <w:t>curso.progreso</w:t>
       </w:r>
       <w:proofErr w:type="spellEnd"/>
-      <w:proofErr w:type="gramEnd"/>
       <w:r>
         <w:rPr>
           <w:b/>
@@ -10482,7 +10334,6 @@
         <w:t xml:space="preserve"> </w:t>
       </w:r>
       <w:proofErr w:type="spellStart"/>
-      <w:proofErr w:type="gramStart"/>
       <w:r>
         <w:rPr>
           <w:b/>
@@ -10491,7 +10342,6 @@
         <w:t>th:if</w:t>
       </w:r>
       <w:proofErr w:type="spellEnd"/>
-      <w:proofErr w:type="gramEnd"/>
       <w:r>
         <w:rPr>
           <w:b/>
@@ -10500,7 +10350,6 @@
         <w:t>="${</w:t>
       </w:r>
       <w:proofErr w:type="spellStart"/>
-      <w:proofErr w:type="gramStart"/>
       <w:r>
         <w:rPr>
           <w:b/>
@@ -10509,7 +10358,6 @@
         <w:t>curso.progresoPendiente</w:t>
       </w:r>
       <w:proofErr w:type="spellEnd"/>
-      <w:proofErr w:type="gramEnd"/>
       <w:r>
         <w:rPr>
           <w:b/>
@@ -10596,7 +10444,6 @@
         <w:t xml:space="preserve">         </w:t>
       </w:r>
       <w:proofErr w:type="spellStart"/>
-      <w:proofErr w:type="gramStart"/>
       <w:r>
         <w:rPr>
           <w:b/>
@@ -10605,7 +10452,6 @@
         <w:t>th:style</w:t>
       </w:r>
       <w:proofErr w:type="spellEnd"/>
-      <w:proofErr w:type="gramEnd"/>
       <w:r>
         <w:rPr>
           <w:b/>
@@ -10630,7 +10476,6 @@
         <w:t>: ' + ${</w:t>
       </w:r>
       <w:proofErr w:type="spellStart"/>
-      <w:proofErr w:type="gramStart"/>
       <w:r>
         <w:rPr>
           <w:b/>
@@ -10639,7 +10484,6 @@
         <w:t>curso.progresoPendiente</w:t>
       </w:r>
       <w:proofErr w:type="spellEnd"/>
-      <w:proofErr w:type="gramEnd"/>
       <w:r>
         <w:rPr>
           <w:b/>
@@ -10726,23 +10570,7 @@
           <w:b/>
           <w:bCs/>
         </w:rPr>
-        <w:t xml:space="preserve">Estado "Esperando Nota": Si el alumno ya terminó su </w:t>
-      </w:r>
-      <w:proofErr w:type="gramStart"/>
-      <w:r>
-        <w:rPr>
-          <w:b/>
-          <w:bCs/>
-        </w:rPr>
-        <w:t>parte</w:t>
-      </w:r>
-      <w:proofErr w:type="gramEnd"/>
-      <w:r>
-        <w:rPr>
-          <w:b/>
-          <w:bCs/>
-        </w:rPr>
-        <w:t xml:space="preserve"> pero el profesor no ha puntuado, es vital decírselo. Si no, verá que el progreso no sube y pensará que el sistema falla.</w:t>
+        <w:t>Estado "Esperando Nota": Si el alumno ya terminó su parte pero el profesor no ha puntuado, es vital decírselo. Si no, verá que el progreso no sube y pensará que el sistema falla.</w:t>
       </w:r>
     </w:p>
     <w:p>
@@ -10761,6 +10589,7 @@
           <w:b/>
           <w:bCs/>
         </w:rPr>
+        <w:lastRenderedPageBreak/>
         <w:t>El Trofeo: Cuando progreso == 100, el cambio de color de azul (acción) a verde o dorado (logro) da una descarga de dopamina necesaria para terminar el siguiente curso.</w:t>
       </w:r>
     </w:p>
@@ -11012,6 +10841,119 @@
     </w:lvl>
   </w:abstractNum>
   <w:abstractNum w:abstractNumId="1" w15:restartNumberingAfterBreak="0">
+    <w:nsid w:val="287F4F82"/>
+    <w:multiLevelType w:val="hybridMultilevel"/>
+    <w:tmpl w:val="FD2AB9C4"/>
+    <w:lvl w:ilvl="0" w:tplc="6840C52A">
+      <w:start w:val="5"/>
+      <w:numFmt w:val="bullet"/>
+      <w:lvlText w:val="-"/>
+      <w:lvlJc w:val="left"/>
+      <w:pPr>
+        <w:ind w:left="1065" w:hanging="360"/>
+      </w:pPr>
+      <w:rPr>
+        <w:rFonts w:ascii="Aptos" w:eastAsiaTheme="minorHAnsi" w:hAnsi="Aptos" w:cstheme="minorBidi" w:hint="default"/>
+      </w:rPr>
+    </w:lvl>
+    <w:lvl w:ilvl="1" w:tplc="0C0A0003">
+      <w:start w:val="1"/>
+      <w:numFmt w:val="bullet"/>
+      <w:lvlText w:val="o"/>
+      <w:lvlJc w:val="left"/>
+      <w:pPr>
+        <w:ind w:left="1440" w:hanging="360"/>
+      </w:pPr>
+      <w:rPr>
+        <w:rFonts w:ascii="Courier New" w:hAnsi="Courier New" w:cs="Courier New" w:hint="default"/>
+      </w:rPr>
+    </w:lvl>
+    <w:lvl w:ilvl="2" w:tplc="0C0A0005" w:tentative="1">
+      <w:start w:val="1"/>
+      <w:numFmt w:val="bullet"/>
+      <w:lvlText w:val=""/>
+      <w:lvlJc w:val="left"/>
+      <w:pPr>
+        <w:ind w:left="2160" w:hanging="360"/>
+      </w:pPr>
+      <w:rPr>
+        <w:rFonts w:ascii="Wingdings" w:hAnsi="Wingdings" w:hint="default"/>
+      </w:rPr>
+    </w:lvl>
+    <w:lvl w:ilvl="3" w:tplc="0C0A0001" w:tentative="1">
+      <w:start w:val="1"/>
+      <w:numFmt w:val="bullet"/>
+      <w:lvlText w:val=""/>
+      <w:lvlJc w:val="left"/>
+      <w:pPr>
+        <w:ind w:left="2880" w:hanging="360"/>
+      </w:pPr>
+      <w:rPr>
+        <w:rFonts w:ascii="Symbol" w:hAnsi="Symbol" w:hint="default"/>
+      </w:rPr>
+    </w:lvl>
+    <w:lvl w:ilvl="4" w:tplc="0C0A0003" w:tentative="1">
+      <w:start w:val="1"/>
+      <w:numFmt w:val="bullet"/>
+      <w:lvlText w:val="o"/>
+      <w:lvlJc w:val="left"/>
+      <w:pPr>
+        <w:ind w:left="3600" w:hanging="360"/>
+      </w:pPr>
+      <w:rPr>
+        <w:rFonts w:ascii="Courier New" w:hAnsi="Courier New" w:cs="Courier New" w:hint="default"/>
+      </w:rPr>
+    </w:lvl>
+    <w:lvl w:ilvl="5" w:tplc="0C0A0005" w:tentative="1">
+      <w:start w:val="1"/>
+      <w:numFmt w:val="bullet"/>
+      <w:lvlText w:val=""/>
+      <w:lvlJc w:val="left"/>
+      <w:pPr>
+        <w:ind w:left="4320" w:hanging="360"/>
+      </w:pPr>
+      <w:rPr>
+        <w:rFonts w:ascii="Wingdings" w:hAnsi="Wingdings" w:hint="default"/>
+      </w:rPr>
+    </w:lvl>
+    <w:lvl w:ilvl="6" w:tplc="0C0A0001" w:tentative="1">
+      <w:start w:val="1"/>
+      <w:numFmt w:val="bullet"/>
+      <w:lvlText w:val=""/>
+      <w:lvlJc w:val="left"/>
+      <w:pPr>
+        <w:ind w:left="5040" w:hanging="360"/>
+      </w:pPr>
+      <w:rPr>
+        <w:rFonts w:ascii="Symbol" w:hAnsi="Symbol" w:hint="default"/>
+      </w:rPr>
+    </w:lvl>
+    <w:lvl w:ilvl="7" w:tplc="0C0A0003" w:tentative="1">
+      <w:start w:val="1"/>
+      <w:numFmt w:val="bullet"/>
+      <w:lvlText w:val="o"/>
+      <w:lvlJc w:val="left"/>
+      <w:pPr>
+        <w:ind w:left="5760" w:hanging="360"/>
+      </w:pPr>
+      <w:rPr>
+        <w:rFonts w:ascii="Courier New" w:hAnsi="Courier New" w:cs="Courier New" w:hint="default"/>
+      </w:rPr>
+    </w:lvl>
+    <w:lvl w:ilvl="8" w:tplc="0C0A0005" w:tentative="1">
+      <w:start w:val="1"/>
+      <w:numFmt w:val="bullet"/>
+      <w:lvlText w:val=""/>
+      <w:lvlJc w:val="left"/>
+      <w:pPr>
+        <w:ind w:left="6480" w:hanging="360"/>
+      </w:pPr>
+      <w:rPr>
+        <w:rFonts w:ascii="Wingdings" w:hAnsi="Wingdings" w:hint="default"/>
+      </w:rPr>
+    </w:lvl>
+  </w:abstractNum>
+  <w:abstractNum w:abstractNumId="2" w15:restartNumberingAfterBreak="0">
     <w:nsid w:val="2AF817A6"/>
     <w:multiLevelType w:val="multilevel"/>
     <w:tmpl w:val="BE101650"/>
@@ -11160,7 +11102,7 @@
       </w:rPr>
     </w:lvl>
   </w:abstractNum>
-  <w:abstractNum w:abstractNumId="2" w15:restartNumberingAfterBreak="0">
+  <w:abstractNum w:abstractNumId="3" w15:restartNumberingAfterBreak="0">
     <w:nsid w:val="2FD83CAB"/>
     <w:multiLevelType w:val="hybridMultilevel"/>
     <w:tmpl w:val="5658D368"/>
@@ -11273,7 +11215,7 @@
       </w:rPr>
     </w:lvl>
   </w:abstractNum>
-  <w:abstractNum w:abstractNumId="3" w15:restartNumberingAfterBreak="0">
+  <w:abstractNum w:abstractNumId="4" w15:restartNumberingAfterBreak="0">
     <w:nsid w:val="33B0175A"/>
     <w:multiLevelType w:val="multilevel"/>
     <w:tmpl w:val="180CE15E"/>
@@ -11422,7 +11364,7 @@
       </w:rPr>
     </w:lvl>
   </w:abstractNum>
-  <w:abstractNum w:abstractNumId="4" w15:restartNumberingAfterBreak="0">
+  <w:abstractNum w:abstractNumId="5" w15:restartNumberingAfterBreak="0">
     <w:nsid w:val="5D752140"/>
     <w:multiLevelType w:val="multilevel"/>
     <w:tmpl w:val="81227134"/>
@@ -11571,7 +11513,7 @@
       </w:rPr>
     </w:lvl>
   </w:abstractNum>
-  <w:abstractNum w:abstractNumId="5" w15:restartNumberingAfterBreak="0">
+  <w:abstractNum w:abstractNumId="6" w15:restartNumberingAfterBreak="0">
     <w:nsid w:val="6C321A55"/>
     <w:multiLevelType w:val="multilevel"/>
     <w:tmpl w:val="C59219F6"/>
@@ -11720,7 +11662,7 @@
       </w:rPr>
     </w:lvl>
   </w:abstractNum>
-  <w:abstractNum w:abstractNumId="6" w15:restartNumberingAfterBreak="0">
+  <w:abstractNum w:abstractNumId="7" w15:restartNumberingAfterBreak="0">
     <w:nsid w:val="77497D85"/>
     <w:multiLevelType w:val="multilevel"/>
     <w:tmpl w:val="3192FBCE"/>
@@ -11870,25 +11812,28 @@
     </w:lvl>
   </w:abstractNum>
   <w:num w:numId="1" w16cid:durableId="1162085532">
-    <w:abstractNumId w:val="1"/>
+    <w:abstractNumId w:val="2"/>
   </w:num>
   <w:num w:numId="2" w16cid:durableId="175268269">
-    <w:abstractNumId w:val="3"/>
+    <w:abstractNumId w:val="4"/>
   </w:num>
   <w:num w:numId="3" w16cid:durableId="1547713183">
-    <w:abstractNumId w:val="4"/>
+    <w:abstractNumId w:val="5"/>
   </w:num>
   <w:num w:numId="4" w16cid:durableId="1009256128">
-    <w:abstractNumId w:val="6"/>
+    <w:abstractNumId w:val="7"/>
   </w:num>
   <w:num w:numId="5" w16cid:durableId="1344626117">
-    <w:abstractNumId w:val="5"/>
+    <w:abstractNumId w:val="6"/>
   </w:num>
   <w:num w:numId="6" w16cid:durableId="363025450">
     <w:abstractNumId w:val="0"/>
   </w:num>
   <w:num w:numId="7" w16cid:durableId="519389916">
-    <w:abstractNumId w:val="2"/>
+    <w:abstractNumId w:val="3"/>
+  </w:num>
+  <w:num w:numId="8" w16cid:durableId="1026709957">
+    <w:abstractNumId w:val="1"/>
   </w:num>
 </w:numbering>
 </file>

</xml_diff>

<commit_message>
Adaptación de la aplicación con perfil "pro"
Se elimina la clase "ServletInitializer.java" que generaba un error al
desplegar en tomcat local.

Se revisan los "redirect" y las urls con @{} que generaban rutas
incorrectas.
Se ajusta application-pro.properties para que funcione en tomcat
aislado.
</commit_message>
<xml_diff>
--- a/src/main/resources/static/docs/Memoria_aplicacion.docx
+++ b/src/main/resources/static/docs/Memoria_aplicacion.docx
@@ -24,7 +24,15 @@
         <w:t xml:space="preserve">Al acceder a la aplicación se visualizarán </w:t>
       </w:r>
       <w:r>
-        <w:t xml:space="preserve">la home pública </w:t>
+        <w:t xml:space="preserve">la </w:t>
+      </w:r>
+      <w:proofErr w:type="gramStart"/>
+      <w:r>
+        <w:t>home pública</w:t>
+      </w:r>
+      <w:proofErr w:type="gramEnd"/>
+      <w:r>
+        <w:t xml:space="preserve"> </w:t>
       </w:r>
     </w:p>
     <w:p>
@@ -82,7 +90,21 @@
         <w:rPr>
           <w:rStyle w:val="Ttulo2Car"/>
         </w:rPr>
-        <w:t>1.- Link a la Home</w:t>
+        <w:t xml:space="preserve">1.- </w:t>
+      </w:r>
+      <w:proofErr w:type="gramStart"/>
+      <w:r>
+        <w:rPr>
+          <w:rStyle w:val="Ttulo2Car"/>
+        </w:rPr>
+        <w:t>Link</w:t>
+      </w:r>
+      <w:proofErr w:type="gramEnd"/>
+      <w:r>
+        <w:rPr>
+          <w:rStyle w:val="Ttulo2Car"/>
+        </w:rPr>
+        <w:t xml:space="preserve"> a la Home</w:t>
       </w:r>
       <w:r>
         <w:t xml:space="preserve">. Desde cualquier parte de la aplicación se podrá volver a la “home” </w:t>
@@ -152,7 +174,23 @@
         <w:t>7.- Selector de idioma.</w:t>
       </w:r>
       <w:r>
-        <w:t xml:space="preserve"> Al desplegar la opción se podrá seleccionar uno de los dos idiomas disponibles (Español e Inglés).</w:t>
+        <w:t xml:space="preserve"> Al desplegar la opción se podrá seleccionar uno de los dos idiomas disponibles (</w:t>
+      </w:r>
+      <w:proofErr w:type="gramStart"/>
+      <w:r>
+        <w:t>Español</w:t>
+      </w:r>
+      <w:proofErr w:type="gramEnd"/>
+      <w:r>
+        <w:t xml:space="preserve"> e </w:t>
+      </w:r>
+      <w:proofErr w:type="gramStart"/>
+      <w:r>
+        <w:t>Inglés</w:t>
+      </w:r>
+      <w:proofErr w:type="gramEnd"/>
+      <w:r>
+        <w:t>).</w:t>
       </w:r>
     </w:p>
     <w:p>
@@ -382,7 +420,15 @@
     </w:p>
     <w:p>
       <w:r>
-        <w:t xml:space="preserve">La realizaremos desde la opción de menú “Acceso”-&gt;”Registrarse” o desde la pantalla de Login </w:t>
+        <w:t>La realizaremos desde la opción de menú “Acceso”-</w:t>
+      </w:r>
+      <w:proofErr w:type="gramStart"/>
+      <w:r>
+        <w:t>&gt;”Registrarse</w:t>
+      </w:r>
+      <w:proofErr w:type="gramEnd"/>
+      <w:r>
+        <w:t xml:space="preserve">” o desde la pantalla de Login </w:t>
       </w:r>
       <w:r>
         <w:drawing>
@@ -654,9 +700,27 @@
         <w:t>Nuevo Módulo</w:t>
       </w:r>
     </w:p>
-    <w:p>
-      <w:r>
-        <w:t>Se mostrará el formulario de datos para añadir un módulo al sistema</w:t>
+    <w:p/>
+    <w:p>
+      <w:r>
+        <w:t xml:space="preserve">Se mostrará el formulario </w:t>
+      </w:r>
+      <w:r>
+        <w:t xml:space="preserve">vacío con los </w:t>
+      </w:r>
+      <w:r>
+        <w:t xml:space="preserve">datos para </w:t>
+      </w:r>
+      <w:proofErr w:type="gramStart"/>
+      <w:r>
+        <w:t xml:space="preserve">definir </w:t>
+      </w:r>
+      <w:r>
+        <w:t xml:space="preserve"> un</w:t>
+      </w:r>
+      <w:proofErr w:type="gramEnd"/>
+      <w:r>
+        <w:t xml:space="preserve"> módulo al sistema</w:t>
       </w:r>
     </w:p>
     <w:p>
@@ -827,9 +891,74 @@
         <w:t>Una ves “salvado” el contenido, si no hay errores, se mostrará el mensaje:</w:t>
       </w:r>
     </w:p>
+    <w:p>
+      <w:pPr>
+        <w:jc w:val="center"/>
+      </w:pPr>
+      <w:r>
+        <w:rPr>
+          <w:noProof/>
+        </w:rPr>
+        <w:drawing>
+          <wp:inline distT="0" distB="0" distL="0" distR="0" wp14:anchorId="4846F7CD" wp14:editId="652998C9">
+            <wp:extent cx="3734321" cy="1019317"/>
+            <wp:effectExtent l="0" t="0" r="0" b="9525"/>
+            <wp:docPr id="2142561113" name="Imagen 3"/>
+            <wp:cNvGraphicFramePr>
+              <a:graphicFrameLocks xmlns:a="http://schemas.openxmlformats.org/drawingml/2006/main" noChangeAspect="1"/>
+            </wp:cNvGraphicFramePr>
+            <a:graphic xmlns:a="http://schemas.openxmlformats.org/drawingml/2006/main">
+              <a:graphicData uri="http://schemas.openxmlformats.org/drawingml/2006/picture">
+                <pic:pic xmlns:pic="http://schemas.openxmlformats.org/drawingml/2006/picture">
+                  <pic:nvPicPr>
+                    <pic:cNvPr id="2142561113" name=""/>
+                    <pic:cNvPicPr/>
+                  </pic:nvPicPr>
+                  <pic:blipFill>
+                    <a:blip r:embed="rId12">
+                      <a:extLst>
+                        <a:ext uri="{28A0092B-C50C-407E-A947-70E740481C1C}">
+                          <a14:useLocalDpi xmlns:a14="http://schemas.microsoft.com/office/drawing/2010/main" val="0"/>
+                        </a:ext>
+                      </a:extLst>
+                    </a:blip>
+                    <a:stretch>
+                      <a:fillRect/>
+                    </a:stretch>
+                  </pic:blipFill>
+                  <pic:spPr>
+                    <a:xfrm>
+                      <a:off x="0" y="0"/>
+                      <a:ext cx="3734321" cy="1019317"/>
+                    </a:xfrm>
+                    <a:prstGeom prst="rect">
+                      <a:avLst/>
+                    </a:prstGeom>
+                  </pic:spPr>
+                </pic:pic>
+              </a:graphicData>
+            </a:graphic>
+          </wp:inline>
+        </w:drawing>
+      </w:r>
+    </w:p>
+    <w:p>
+      <w:pPr>
+        <w:pStyle w:val="Ttulo2"/>
+      </w:pPr>
+      <w:r>
+        <w:t>Modificación de módulo</w:t>
+      </w:r>
+    </w:p>
     <w:p/>
     <w:p>
       <w:r>
+        <w:t>Se mostrará el formulario del módulo con los datos actuales para modificar los que se necesiten.</w:t>
+      </w:r>
+    </w:p>
+    <w:p/>
+    <w:p>
+      <w:r>
         <w:t>[Login Form]</w:t>
       </w:r>
     </w:p>
@@ -889,6 +1018,7 @@
     </w:p>
     <w:p>
       <w:r>
+        <w:lastRenderedPageBreak/>
         <w:t xml:space="preserve">    ↓</w:t>
       </w:r>
     </w:p>
@@ -945,392 +1075,444 @@
     </w:p>
     <w:p>
       <w:r>
+        <w:t>[Usuario queda registrado como conectado]</w:t>
+      </w:r>
+    </w:p>
+    <w:p>
+      <w:r>
+        <w:t xml:space="preserve">    ↓</w:t>
+      </w:r>
+    </w:p>
+    <w:p>
+      <w:r>
+        <w:t>/</w:t>
+      </w:r>
+      <w:proofErr w:type="spellStart"/>
+      <w:r>
+        <w:t>admin</w:t>
+      </w:r>
+      <w:proofErr w:type="spellEnd"/>
+      <w:r>
+        <w:t>/</w:t>
+      </w:r>
+      <w:proofErr w:type="spellStart"/>
+      <w:r>
+        <w:t>usuarioconnected</w:t>
+      </w:r>
+      <w:proofErr w:type="spellEnd"/>
+      <w:r>
+        <w:t xml:space="preserve"> → </w:t>
+      </w:r>
+      <w:proofErr w:type="spellStart"/>
+      <w:proofErr w:type="gramStart"/>
+      <w:r>
+        <w:t>getConnectedUsers</w:t>
+      </w:r>
+      <w:proofErr w:type="spellEnd"/>
+      <w:r>
+        <w:t>(</w:t>
+      </w:r>
+      <w:proofErr w:type="gramEnd"/>
+      <w:r>
+        <w:t>)</w:t>
+      </w:r>
+    </w:p>
+    <w:p/>
+    <w:p>
+      <w:r>
+        <w:t xml:space="preserve">Proceso de </w:t>
+      </w:r>
+      <w:proofErr w:type="spellStart"/>
+      <w:r>
+        <w:t>logout</w:t>
+      </w:r>
+      <w:proofErr w:type="spellEnd"/>
+      <w:r>
+        <w:t xml:space="preserve"> y eliminación del registro de usuarios en sesión:</w:t>
+      </w:r>
+    </w:p>
+    <w:p/>
+    <w:p>
+      <w:r>
+        <w:t>┌──────────────────────────────┐</w:t>
+      </w:r>
+    </w:p>
+    <w:p>
+      <w:r>
+        <w:t>│        Usuario (</w:t>
+      </w:r>
+      <w:proofErr w:type="spellStart"/>
+      <w:proofErr w:type="gramStart"/>
+      <w:r>
+        <w:t>Logout</w:t>
+      </w:r>
+      <w:proofErr w:type="spellEnd"/>
+      <w:r>
+        <w:t xml:space="preserve">)   </w:t>
+      </w:r>
+      <w:proofErr w:type="gramEnd"/>
+      <w:r>
+        <w:t xml:space="preserve">   │</w:t>
+      </w:r>
+    </w:p>
+    <w:p>
+      <w:r>
+        <w:t>└───────────────</w:t>
+      </w:r>
+      <w:r>
+        <w:rPr>
+          <w:rFonts w:ascii="MS Gothic" w:eastAsia="MS Gothic" w:hAnsi="MS Gothic" w:cs="MS Gothic" w:hint="eastAsia"/>
+        </w:rPr>
+        <w:t>┬</w:t>
+      </w:r>
+      <w:r>
+        <w:rPr>
+          <w:rFonts w:ascii="Aptos" w:hAnsi="Aptos" w:cs="Aptos"/>
+        </w:rPr>
+        <w:t>──────────────┘</w:t>
+      </w:r>
+    </w:p>
+    <w:p>
+      <w:r>
+        <w:t xml:space="preserve">                │ Petición /</w:t>
+      </w:r>
+      <w:proofErr w:type="spellStart"/>
+      <w:r>
+        <w:t>logout</w:t>
+      </w:r>
+      <w:proofErr w:type="spellEnd"/>
+    </w:p>
+    <w:p>
+      <w:r>
+        <w:t xml:space="preserve">                </w:t>
+      </w:r>
+      <w:r>
+        <w:rPr>
+          <w:rFonts w:ascii="Arial" w:hAnsi="Arial" w:cs="Arial"/>
+        </w:rPr>
+        <w:t>▼</w:t>
+      </w:r>
+    </w:p>
+    <w:p>
+      <w:r>
+        <w:t>┌──────────────────────────────────────────┐</w:t>
+      </w:r>
+    </w:p>
+    <w:p>
+      <w:r>
+        <w:t xml:space="preserve">│              </w:t>
+      </w:r>
+      <w:proofErr w:type="spellStart"/>
+      <w:r>
+        <w:t>LogoutFilter</w:t>
+      </w:r>
+      <w:proofErr w:type="spellEnd"/>
+      <w:r>
+        <w:t xml:space="preserve">                │</w:t>
+      </w:r>
+    </w:p>
+    <w:p>
+      <w:r>
+        <w:t>└───────────────</w:t>
+      </w:r>
+      <w:r>
+        <w:rPr>
+          <w:rFonts w:ascii="MS Gothic" w:eastAsia="MS Gothic" w:hAnsi="MS Gothic" w:cs="MS Gothic" w:hint="eastAsia"/>
+        </w:rPr>
+        <w:t>┬</w:t>
+      </w:r>
+      <w:r>
+        <w:rPr>
+          <w:rFonts w:ascii="Aptos" w:hAnsi="Aptos" w:cs="Aptos"/>
+        </w:rPr>
+        <w:t>──────────────────────────┘</w:t>
+      </w:r>
+    </w:p>
+    <w:p>
+      <w:r>
+        <w:t xml:space="preserve">                │</w:t>
+      </w:r>
+    </w:p>
+    <w:p>
+      <w:r>
+        <w:t xml:space="preserve">                </w:t>
+      </w:r>
+      <w:r>
+        <w:rPr>
+          <w:rFonts w:ascii="Arial" w:hAnsi="Arial" w:cs="Arial"/>
+        </w:rPr>
+        <w:t>▼</w:t>
+      </w:r>
+    </w:p>
+    <w:p>
+      <w:r>
+        <w:t>┌──────────────────────────────────────────┐</w:t>
+      </w:r>
+    </w:p>
+    <w:p>
+      <w:r>
+        <w:t xml:space="preserve">│         </w:t>
+      </w:r>
+      <w:proofErr w:type="spellStart"/>
+      <w:r>
+        <w:t>CustomLogoutHandler</w:t>
+      </w:r>
+      <w:proofErr w:type="spellEnd"/>
+      <w:r>
+        <w:t xml:space="preserve">              │</w:t>
+      </w:r>
+    </w:p>
+    <w:p>
+      <w:proofErr w:type="gramStart"/>
+      <w:r>
+        <w:t>│  -</w:t>
+      </w:r>
+      <w:proofErr w:type="gramEnd"/>
+      <w:r>
+        <w:t xml:space="preserve"> Obtiene </w:t>
+      </w:r>
+      <w:proofErr w:type="spellStart"/>
+      <w:r>
+        <w:t>sessionId</w:t>
+      </w:r>
+      <w:proofErr w:type="spellEnd"/>
+      <w:r>
+        <w:t xml:space="preserve">                     │</w:t>
+      </w:r>
+    </w:p>
+    <w:p>
+      <w:proofErr w:type="gramStart"/>
+      <w:r>
+        <w:t>│  -</w:t>
+      </w:r>
+      <w:proofErr w:type="gramEnd"/>
+      <w:r>
+        <w:t xml:space="preserve"> </w:t>
+      </w:r>
+      <w:proofErr w:type="spellStart"/>
+      <w:r>
+        <w:t>sessionRegistry.removeSessionInfo</w:t>
+      </w:r>
+      <w:proofErr w:type="spellEnd"/>
+      <w:proofErr w:type="gramStart"/>
+      <w:r>
+        <w:t xml:space="preserve">()   </w:t>
+      </w:r>
+      <w:proofErr w:type="gramEnd"/>
+      <w:r>
+        <w:t>│</w:t>
+      </w:r>
+    </w:p>
+    <w:p>
+      <w:r>
+        <w:t>└───────────────</w:t>
+      </w:r>
+      <w:r>
+        <w:rPr>
+          <w:rFonts w:ascii="MS Gothic" w:eastAsia="MS Gothic" w:hAnsi="MS Gothic" w:cs="MS Gothic" w:hint="eastAsia"/>
+        </w:rPr>
+        <w:t>┬</w:t>
+      </w:r>
+      <w:r>
+        <w:rPr>
+          <w:rFonts w:ascii="Aptos" w:hAnsi="Aptos" w:cs="Aptos"/>
+        </w:rPr>
+        <w:t>──────────────────────────┘</w:t>
+      </w:r>
+    </w:p>
+    <w:p>
+      <w:r>
+        <w:t xml:space="preserve">                │</w:t>
+      </w:r>
+    </w:p>
+    <w:p>
+      <w:r>
+        <w:t xml:space="preserve">                </w:t>
+      </w:r>
+      <w:r>
+        <w:rPr>
+          <w:rFonts w:ascii="Arial" w:hAnsi="Arial" w:cs="Arial"/>
+        </w:rPr>
+        <w:t>▼</w:t>
+      </w:r>
+    </w:p>
+    <w:p>
+      <w:r>
+        <w:t>┌──────────────────────────────────────────┐</w:t>
+      </w:r>
+    </w:p>
+    <w:p>
+      <w:r>
         <w:lastRenderedPageBreak/>
-        <w:t>[Usuario queda registrado como conectado]</w:t>
-      </w:r>
-    </w:p>
-    <w:p>
-      <w:r>
-        <w:t xml:space="preserve">    ↓</w:t>
-      </w:r>
-    </w:p>
-    <w:p>
-      <w:r>
-        <w:t>/</w:t>
-      </w:r>
-      <w:proofErr w:type="spellStart"/>
-      <w:r>
-        <w:t>admin</w:t>
-      </w:r>
-      <w:proofErr w:type="spellEnd"/>
-      <w:r>
-        <w:t>/</w:t>
-      </w:r>
-      <w:proofErr w:type="spellStart"/>
-      <w:r>
-        <w:t>usuarioconnected</w:t>
-      </w:r>
-      <w:proofErr w:type="spellEnd"/>
-      <w:r>
-        <w:t xml:space="preserve"> → </w:t>
-      </w:r>
-      <w:proofErr w:type="spellStart"/>
-      <w:r>
-        <w:t>getConnectedUsers</w:t>
-      </w:r>
-      <w:proofErr w:type="spellEnd"/>
-      <w:r>
-        <w:t>()</w:t>
+        <w:t xml:space="preserve">│           </w:t>
+      </w:r>
+      <w:proofErr w:type="spellStart"/>
+      <w:r>
+        <w:t>SessionRegistryImpl</w:t>
+      </w:r>
+      <w:proofErr w:type="spellEnd"/>
+      <w:r>
+        <w:t xml:space="preserve">            │</w:t>
+      </w:r>
+    </w:p>
+    <w:p>
+      <w:proofErr w:type="gramStart"/>
+      <w:r>
+        <w:t>│  (</w:t>
+      </w:r>
+      <w:proofErr w:type="gramEnd"/>
+      <w:r>
+        <w:t xml:space="preserve">Elimina la sesión del </w:t>
+      </w:r>
+      <w:proofErr w:type="gramStart"/>
+      <w:r>
+        <w:t xml:space="preserve">usuario)   </w:t>
+      </w:r>
+      <w:proofErr w:type="gramEnd"/>
+      <w:r>
+        <w:t xml:space="preserve">      │</w:t>
+      </w:r>
+    </w:p>
+    <w:p>
+      <w:r>
+        <w:t>└───────────────</w:t>
+      </w:r>
+      <w:r>
+        <w:rPr>
+          <w:rFonts w:ascii="MS Gothic" w:eastAsia="MS Gothic" w:hAnsi="MS Gothic" w:cs="MS Gothic" w:hint="eastAsia"/>
+        </w:rPr>
+        <w:t>┬</w:t>
+      </w:r>
+      <w:r>
+        <w:rPr>
+          <w:rFonts w:ascii="Aptos" w:hAnsi="Aptos" w:cs="Aptos"/>
+        </w:rPr>
+        <w:t>──────────────────────────┘</w:t>
+      </w:r>
+    </w:p>
+    <w:p>
+      <w:r>
+        <w:t xml:space="preserve">                │</w:t>
+      </w:r>
+    </w:p>
+    <w:p>
+      <w:r>
+        <w:t xml:space="preserve">                </w:t>
+      </w:r>
+      <w:r>
+        <w:rPr>
+          <w:rFonts w:ascii="Arial" w:hAnsi="Arial" w:cs="Arial"/>
+        </w:rPr>
+        <w:t>▼</w:t>
+      </w:r>
+    </w:p>
+    <w:p>
+      <w:r>
+        <w:t>┌──────────────────────────────────────────┐</w:t>
+      </w:r>
+    </w:p>
+    <w:p>
+      <w:r>
+        <w:t xml:space="preserve">│     </w:t>
+      </w:r>
+      <w:proofErr w:type="spellStart"/>
+      <w:r>
+        <w:t>HttpSession.invalidate</w:t>
+      </w:r>
+      <w:proofErr w:type="spellEnd"/>
+      <w:r>
+        <w:t>() (</w:t>
+      </w:r>
+      <w:proofErr w:type="gramStart"/>
+      <w:r>
+        <w:t xml:space="preserve">Spring)   </w:t>
+      </w:r>
+      <w:proofErr w:type="gramEnd"/>
+      <w:r>
+        <w:t xml:space="preserve"> │</w:t>
+      </w:r>
+    </w:p>
+    <w:p>
+      <w:r>
+        <w:t>└───────────────</w:t>
+      </w:r>
+      <w:r>
+        <w:rPr>
+          <w:rFonts w:ascii="MS Gothic" w:eastAsia="MS Gothic" w:hAnsi="MS Gothic" w:cs="MS Gothic" w:hint="eastAsia"/>
+        </w:rPr>
+        <w:t>┬</w:t>
+      </w:r>
+      <w:r>
+        <w:rPr>
+          <w:rFonts w:ascii="Aptos" w:hAnsi="Aptos" w:cs="Aptos"/>
+        </w:rPr>
+        <w:t>──────────────────────────┘</w:t>
+      </w:r>
+    </w:p>
+    <w:p>
+      <w:r>
+        <w:t xml:space="preserve">                │</w:t>
+      </w:r>
+    </w:p>
+    <w:p>
+      <w:r>
+        <w:t xml:space="preserve">                </w:t>
+      </w:r>
+      <w:r>
+        <w:rPr>
+          <w:rFonts w:ascii="Arial" w:hAnsi="Arial" w:cs="Arial"/>
+        </w:rPr>
+        <w:t>▼</w:t>
+      </w:r>
+    </w:p>
+    <w:p>
+      <w:r>
+        <w:t>┌──────────────────────────────────────────┐</w:t>
+      </w:r>
+    </w:p>
+    <w:p>
+      <w:r>
+        <w:t xml:space="preserve">│   </w:t>
+      </w:r>
+      <w:proofErr w:type="spellStart"/>
+      <w:r>
+        <w:t>LogoutSuccessUrl</w:t>
+      </w:r>
+      <w:proofErr w:type="spellEnd"/>
+      <w:r>
+        <w:t xml:space="preserve"> (/</w:t>
+      </w:r>
+      <w:proofErr w:type="spellStart"/>
+      <w:proofErr w:type="gramStart"/>
+      <w:r>
+        <w:t>login?logout</w:t>
+      </w:r>
+      <w:proofErr w:type="spellEnd"/>
+      <w:proofErr w:type="gramEnd"/>
+      <w:r>
+        <w:t>)       │</w:t>
+      </w:r>
+    </w:p>
+    <w:p>
+      <w:r>
+        <w:t>└──────────────────────────────────────────┘</w:t>
       </w:r>
     </w:p>
     <w:p/>
     <w:p>
       <w:r>
-        <w:t xml:space="preserve">Proceso de </w:t>
-      </w:r>
-      <w:proofErr w:type="spellStart"/>
-      <w:r>
-        <w:t>logout</w:t>
-      </w:r>
-      <w:proofErr w:type="spellEnd"/>
-      <w:r>
-        <w:t xml:space="preserve"> y eliminación del registro de usuarios en sesión:</w:t>
-      </w:r>
-    </w:p>
-    <w:p/>
-    <w:p>
-      <w:r>
-        <w:t>┌──────────────────────────────┐</w:t>
-      </w:r>
-    </w:p>
-    <w:p>
-      <w:r>
-        <w:t>│        Usuario (</w:t>
-      </w:r>
-      <w:proofErr w:type="spellStart"/>
-      <w:r>
-        <w:t>Logout</w:t>
-      </w:r>
-      <w:proofErr w:type="spellEnd"/>
-      <w:r>
-        <w:t>)      │</w:t>
-      </w:r>
-    </w:p>
-    <w:p>
-      <w:r>
-        <w:t>└───────────────</w:t>
-      </w:r>
-      <w:r>
-        <w:rPr>
-          <w:rFonts w:ascii="MS Gothic" w:eastAsia="MS Gothic" w:hAnsi="MS Gothic" w:cs="MS Gothic" w:hint="eastAsia"/>
-        </w:rPr>
-        <w:t>┬</w:t>
-      </w:r>
-      <w:r>
-        <w:rPr>
-          <w:rFonts w:ascii="Aptos" w:hAnsi="Aptos" w:cs="Aptos"/>
-        </w:rPr>
-        <w:t>──────────────┘</w:t>
-      </w:r>
-    </w:p>
-    <w:p>
-      <w:r>
-        <w:t xml:space="preserve">                │ Petición /</w:t>
-      </w:r>
-      <w:proofErr w:type="spellStart"/>
-      <w:r>
-        <w:t>logout</w:t>
-      </w:r>
-      <w:proofErr w:type="spellEnd"/>
-    </w:p>
-    <w:p>
-      <w:r>
-        <w:t xml:space="preserve">                </w:t>
-      </w:r>
-      <w:r>
-        <w:rPr>
-          <w:rFonts w:ascii="Arial" w:hAnsi="Arial" w:cs="Arial"/>
-        </w:rPr>
-        <w:t>▼</w:t>
-      </w:r>
-    </w:p>
-    <w:p>
-      <w:r>
-        <w:t>┌──────────────────────────────────────────┐</w:t>
-      </w:r>
-    </w:p>
-    <w:p>
-      <w:r>
-        <w:t xml:space="preserve">│              </w:t>
-      </w:r>
-      <w:proofErr w:type="spellStart"/>
-      <w:r>
-        <w:t>LogoutFilter</w:t>
-      </w:r>
-      <w:proofErr w:type="spellEnd"/>
-      <w:r>
-        <w:t xml:space="preserve">                │</w:t>
-      </w:r>
-    </w:p>
-    <w:p>
-      <w:r>
-        <w:t>└───────────────</w:t>
-      </w:r>
-      <w:r>
-        <w:rPr>
-          <w:rFonts w:ascii="MS Gothic" w:eastAsia="MS Gothic" w:hAnsi="MS Gothic" w:cs="MS Gothic" w:hint="eastAsia"/>
-        </w:rPr>
-        <w:t>┬</w:t>
-      </w:r>
-      <w:r>
-        <w:rPr>
-          <w:rFonts w:ascii="Aptos" w:hAnsi="Aptos" w:cs="Aptos"/>
-        </w:rPr>
-        <w:t>──────────────────────────┘</w:t>
-      </w:r>
-    </w:p>
-    <w:p>
-      <w:r>
-        <w:t xml:space="preserve">                │</w:t>
-      </w:r>
-    </w:p>
-    <w:p>
-      <w:r>
-        <w:t xml:space="preserve">                </w:t>
-      </w:r>
-      <w:r>
-        <w:rPr>
-          <w:rFonts w:ascii="Arial" w:hAnsi="Arial" w:cs="Arial"/>
-        </w:rPr>
-        <w:t>▼</w:t>
-      </w:r>
-    </w:p>
-    <w:p>
-      <w:r>
-        <w:t>┌──────────────────────────────────────────┐</w:t>
-      </w:r>
-    </w:p>
-    <w:p>
-      <w:r>
-        <w:t xml:space="preserve">│         </w:t>
-      </w:r>
-      <w:proofErr w:type="spellStart"/>
-      <w:r>
-        <w:t>CustomLogoutHandler</w:t>
-      </w:r>
-      <w:proofErr w:type="spellEnd"/>
-      <w:r>
-        <w:t xml:space="preserve">              │</w:t>
-      </w:r>
-    </w:p>
-    <w:p>
-      <w:r>
-        <w:t xml:space="preserve">│  - Obtiene </w:t>
-      </w:r>
-      <w:proofErr w:type="spellStart"/>
-      <w:r>
-        <w:t>sessionId</w:t>
-      </w:r>
-      <w:proofErr w:type="spellEnd"/>
-      <w:r>
-        <w:t xml:space="preserve">                     │</w:t>
-      </w:r>
-    </w:p>
-    <w:p>
-      <w:r>
-        <w:t xml:space="preserve">│  - </w:t>
-      </w:r>
-      <w:proofErr w:type="spellStart"/>
-      <w:r>
-        <w:t>sessionRegistry.removeSessionInfo</w:t>
-      </w:r>
-      <w:proofErr w:type="spellEnd"/>
-      <w:r>
-        <w:t>()   │</w:t>
-      </w:r>
-    </w:p>
-    <w:p>
-      <w:r>
-        <w:t>└───────────────</w:t>
-      </w:r>
-      <w:r>
-        <w:rPr>
-          <w:rFonts w:ascii="MS Gothic" w:eastAsia="MS Gothic" w:hAnsi="MS Gothic" w:cs="MS Gothic" w:hint="eastAsia"/>
-        </w:rPr>
-        <w:t>┬</w:t>
-      </w:r>
-      <w:r>
-        <w:rPr>
-          <w:rFonts w:ascii="Aptos" w:hAnsi="Aptos" w:cs="Aptos"/>
-        </w:rPr>
-        <w:t>──────────────────────────┘</w:t>
-      </w:r>
-    </w:p>
-    <w:p>
-      <w:r>
-        <w:t xml:space="preserve">                │</w:t>
-      </w:r>
-    </w:p>
-    <w:p>
-      <w:r>
-        <w:t xml:space="preserve">                </w:t>
-      </w:r>
-      <w:r>
-        <w:rPr>
-          <w:rFonts w:ascii="Arial" w:hAnsi="Arial" w:cs="Arial"/>
-        </w:rPr>
-        <w:t>▼</w:t>
-      </w:r>
-    </w:p>
-    <w:p>
-      <w:r>
-        <w:t>┌──────────────────────────────────────────┐</w:t>
-      </w:r>
-    </w:p>
-    <w:p>
-      <w:r>
-        <w:t xml:space="preserve">│           </w:t>
-      </w:r>
-      <w:proofErr w:type="spellStart"/>
-      <w:r>
-        <w:t>SessionRegistryImpl</w:t>
-      </w:r>
-      <w:proofErr w:type="spellEnd"/>
-      <w:r>
-        <w:t xml:space="preserve">            │</w:t>
-      </w:r>
-    </w:p>
-    <w:p>
-      <w:r>
-        <w:t>│  (Elimina la sesión del usuario)         │</w:t>
-      </w:r>
-    </w:p>
-    <w:p>
-      <w:r>
-        <w:t>└───────────────</w:t>
-      </w:r>
-      <w:r>
-        <w:rPr>
-          <w:rFonts w:ascii="MS Gothic" w:eastAsia="MS Gothic" w:hAnsi="MS Gothic" w:cs="MS Gothic" w:hint="eastAsia"/>
-        </w:rPr>
-        <w:t>┬</w:t>
-      </w:r>
-      <w:r>
-        <w:rPr>
-          <w:rFonts w:ascii="Aptos" w:hAnsi="Aptos" w:cs="Aptos"/>
-        </w:rPr>
-        <w:t>──────────────────────────┘</w:t>
-      </w:r>
-    </w:p>
-    <w:p>
-      <w:r>
-        <w:t xml:space="preserve">                │</w:t>
-      </w:r>
-    </w:p>
-    <w:p>
-      <w:r>
-        <w:t xml:space="preserve">                </w:t>
-      </w:r>
-      <w:r>
-        <w:rPr>
-          <w:rFonts w:ascii="Arial" w:hAnsi="Arial" w:cs="Arial"/>
-        </w:rPr>
-        <w:t>▼</w:t>
-      </w:r>
-    </w:p>
-    <w:p>
-      <w:r>
-        <w:t>┌──────────────────────────────────────────┐</w:t>
-      </w:r>
-    </w:p>
-    <w:p>
-      <w:r>
-        <w:t xml:space="preserve">│     </w:t>
-      </w:r>
-      <w:proofErr w:type="spellStart"/>
-      <w:r>
-        <w:t>HttpSession.invalidate</w:t>
-      </w:r>
-      <w:proofErr w:type="spellEnd"/>
-      <w:r>
-        <w:t>() (Spring)    │</w:t>
-      </w:r>
-    </w:p>
-    <w:p>
-      <w:r>
-        <w:lastRenderedPageBreak/>
-        <w:t>└───────────────</w:t>
-      </w:r>
-      <w:r>
-        <w:rPr>
-          <w:rFonts w:ascii="MS Gothic" w:eastAsia="MS Gothic" w:hAnsi="MS Gothic" w:cs="MS Gothic" w:hint="eastAsia"/>
-        </w:rPr>
-        <w:t>┬</w:t>
-      </w:r>
-      <w:r>
-        <w:rPr>
-          <w:rFonts w:ascii="Aptos" w:hAnsi="Aptos" w:cs="Aptos"/>
-        </w:rPr>
-        <w:t>──────────────────────────┘</w:t>
-      </w:r>
-    </w:p>
-    <w:p>
-      <w:r>
-        <w:t xml:space="preserve">                │</w:t>
-      </w:r>
-    </w:p>
-    <w:p>
-      <w:r>
-        <w:t xml:space="preserve">                </w:t>
-      </w:r>
-      <w:r>
-        <w:rPr>
-          <w:rFonts w:ascii="Arial" w:hAnsi="Arial" w:cs="Arial"/>
-        </w:rPr>
-        <w:t>▼</w:t>
-      </w:r>
-    </w:p>
-    <w:p>
-      <w:r>
-        <w:t>┌──────────────────────────────────────────┐</w:t>
-      </w:r>
-    </w:p>
-    <w:p>
-      <w:r>
-        <w:t xml:space="preserve">│   </w:t>
-      </w:r>
-      <w:proofErr w:type="spellStart"/>
-      <w:r>
-        <w:t>LogoutSuccessUrl</w:t>
-      </w:r>
-      <w:proofErr w:type="spellEnd"/>
-      <w:r>
-        <w:t xml:space="preserve"> (/</w:t>
-      </w:r>
-      <w:proofErr w:type="spellStart"/>
-      <w:r>
-        <w:t>login?logout</w:t>
-      </w:r>
-      <w:proofErr w:type="spellEnd"/>
-      <w:r>
-        <w:t>)       │</w:t>
-      </w:r>
-    </w:p>
-    <w:p>
-      <w:r>
-        <w:t>└──────────────────────────────────────────┘</w:t>
-      </w:r>
-    </w:p>
-    <w:p/>
-    <w:p>
-      <w:r>
         <w:t>Validación de datos y excepciones</w:t>
       </w:r>
     </w:p>
     <w:p>
       <w:r>
-        <w:t>Se implementa la validación de datos en las vis</w:t>
-      </w:r>
+        <w:t xml:space="preserve">Se implementa la validación de datos en </w:t>
+      </w:r>
+      <w:proofErr w:type="gramStart"/>
+      <w:r>
+        <w:t>las vis</w:t>
+      </w:r>
+      <w:proofErr w:type="gramEnd"/>
     </w:p>
     <w:p>
       <w:r>
@@ -1400,6 +1582,7 @@
         <w:t xml:space="preserve"> </w:t>
       </w:r>
       <w:proofErr w:type="spellStart"/>
+      <w:proofErr w:type="gramStart"/>
       <w:r>
         <w:rPr>
           <w:rFonts w:ascii="Consolas" w:hAnsi="Consolas"/>
@@ -1411,6 +1594,7 @@
         <w:t>th:fragment</w:t>
       </w:r>
       <w:proofErr w:type="spellEnd"/>
+      <w:proofErr w:type="gramEnd"/>
       <w:r>
         <w:rPr>
           <w:rFonts w:ascii="Consolas" w:hAnsi="Consolas"/>
@@ -1516,6 +1700,7 @@
         <w:t xml:space="preserve"> </w:t>
       </w:r>
       <w:proofErr w:type="spellStart"/>
+      <w:proofErr w:type="gramStart"/>
       <w:r>
         <w:rPr>
           <w:rFonts w:ascii="Consolas" w:hAnsi="Consolas"/>
@@ -1527,6 +1712,7 @@
         <w:t>th:if</w:t>
       </w:r>
       <w:proofErr w:type="spellEnd"/>
+      <w:proofErr w:type="gramEnd"/>
       <w:r>
         <w:rPr>
           <w:rFonts w:ascii="Consolas" w:hAnsi="Consolas"/>
@@ -1965,6 +2151,7 @@
         </w:rPr>
       </w:pPr>
       <w:proofErr w:type="spellStart"/>
+      <w:proofErr w:type="gramStart"/>
       <w:r>
         <w:rPr>
           <w:rFonts w:ascii="Courier New" w:eastAsia="Times New Roman" w:hAnsi="Courier New" w:cs="Courier New"/>
@@ -1975,6 +2162,7 @@
         <w:t>model.addAttribute</w:t>
       </w:r>
       <w:proofErr w:type="spellEnd"/>
+      <w:proofErr w:type="gramEnd"/>
       <w:r>
         <w:rPr>
           <w:rFonts w:ascii="Courier New" w:eastAsia="Times New Roman" w:hAnsi="Courier New" w:cs="Courier New"/>
@@ -2039,6 +2227,7 @@
     <w:p/>
     <w:p>
       <w:r>
+        <w:lastRenderedPageBreak/>
         <w:t>PATRONES UTILIZADOS</w:t>
       </w:r>
     </w:p>
@@ -2104,7 +2293,6 @@
         </w:rPr>
       </w:pPr>
       <w:r>
-        <w:lastRenderedPageBreak/>
         <w:t xml:space="preserve">En las clases editables en los formularios </w:t>
       </w:r>
       <w:r>
@@ -2120,8 +2308,13 @@
         <w:t xml:space="preserve"> mediante anotaciones “</w:t>
       </w:r>
       <w:proofErr w:type="spellStart"/>
-      <w:r>
-        <w:t>jakarta.validation.constraints</w:t>
+      <w:proofErr w:type="gramStart"/>
+      <w:r>
+        <w:t>jakarta.validation</w:t>
+      </w:r>
+      <w:proofErr w:type="gramEnd"/>
+      <w:r>
+        <w:t>.constraints</w:t>
       </w:r>
       <w:proofErr w:type="spellEnd"/>
       <w:r>
@@ -2277,7 +2470,15 @@
         <w:t>@FutureOrPresent</w:t>
       </w:r>
       <w:r>
-        <w:t xml:space="preserve"> Para fechas, que el valor sea mayor o igual al día de hoy.</w:t>
+        <w:t xml:space="preserve"> Para fechas, que el valor sea mayor o igual </w:t>
+      </w:r>
+      <w:proofErr w:type="gramStart"/>
+      <w:r>
+        <w:t>al día de hoy</w:t>
+      </w:r>
+      <w:proofErr w:type="gramEnd"/>
+      <w:r>
+        <w:t>.</w:t>
       </w:r>
     </w:p>
     <w:p>
@@ -2408,6 +2609,7 @@
         </w:rPr>
         <w:t>@</w:t>
       </w:r>
+      <w:proofErr w:type="gramStart"/>
       <w:r>
         <w:rPr>
           <w:rFonts w:ascii="Consolas" w:hAnsi="Consolas"/>
@@ -2425,7 +2627,17 @@
           <w:sz w:val="18"/>
           <w:szCs w:val="18"/>
         </w:rPr>
-        <w:t xml:space="preserve">(message = </w:t>
+        <w:t>(</w:t>
+      </w:r>
+      <w:proofErr w:type="gramEnd"/>
+      <w:r>
+        <w:rPr>
+          <w:rFonts w:ascii="Consolas" w:hAnsi="Consolas"/>
+          <w:color w:val="000000"/>
+          <w:sz w:val="18"/>
+          <w:szCs w:val="18"/>
+        </w:rPr>
+        <w:t xml:space="preserve">message = </w:t>
       </w:r>
       <w:r>
         <w:rPr>
@@ -2434,8 +2646,19 @@
           <w:sz w:val="18"/>
           <w:szCs w:val="18"/>
         </w:rPr>
-        <w:t>"{validations.mensaje</w:t>
-      </w:r>
+        <w:t>"{</w:t>
+      </w:r>
+      <w:proofErr w:type="gramStart"/>
+      <w:r>
+        <w:rPr>
+          <w:rFonts w:ascii="Consolas" w:hAnsi="Consolas"/>
+          <w:color w:val="2A00FF"/>
+          <w:sz w:val="18"/>
+          <w:szCs w:val="18"/>
+        </w:rPr>
+        <w:t>validations.mensaje</w:t>
+      </w:r>
+      <w:proofErr w:type="gramEnd"/>
       <w:r>
         <w:rPr>
           <w:rFonts w:ascii="Consolas" w:hAnsi="Consolas"/>
@@ -2572,6 +2795,7 @@
         </w:rPr>
         <w:t>@</w:t>
       </w:r>
+      <w:proofErr w:type="gramStart"/>
       <w:r>
         <w:rPr>
           <w:rFonts w:ascii="Consolas" w:hAnsi="Consolas"/>
@@ -2599,7 +2823,17 @@
           <w:sz w:val="18"/>
           <w:szCs w:val="18"/>
         </w:rPr>
-        <w:t xml:space="preserve">(message = </w:t>
+        <w:t>(</w:t>
+      </w:r>
+      <w:proofErr w:type="gramEnd"/>
+      <w:r>
+        <w:rPr>
+          <w:rFonts w:ascii="Consolas" w:hAnsi="Consolas"/>
+          <w:color w:val="000000"/>
+          <w:sz w:val="18"/>
+          <w:szCs w:val="18"/>
+        </w:rPr>
+        <w:t xml:space="preserve">message = </w:t>
       </w:r>
       <w:r>
         <w:rPr>
@@ -2608,8 +2842,19 @@
           <w:sz w:val="18"/>
           <w:szCs w:val="18"/>
         </w:rPr>
-        <w:t>"{validations.mensaje</w:t>
-      </w:r>
+        <w:t>"{</w:t>
+      </w:r>
+      <w:proofErr w:type="gramStart"/>
+      <w:r>
+        <w:rPr>
+          <w:rFonts w:ascii="Consolas" w:hAnsi="Consolas"/>
+          <w:color w:val="2A00FF"/>
+          <w:sz w:val="18"/>
+          <w:szCs w:val="18"/>
+        </w:rPr>
+        <w:t>validations.mensaje</w:t>
+      </w:r>
+      <w:proofErr w:type="gramEnd"/>
       <w:r>
         <w:rPr>
           <w:rFonts w:ascii="Consolas" w:hAnsi="Consolas"/>
@@ -2854,6 +3099,7 @@
         </w:rPr>
       </w:pPr>
       <w:proofErr w:type="spellStart"/>
+      <w:proofErr w:type="gramStart"/>
       <w:r>
         <w:rPr>
           <w:rFonts w:ascii="Consolas" w:hAnsi="Consolas"/>
@@ -2863,6 +3109,7 @@
         <w:t>Jakarta.validation.valid</w:t>
       </w:r>
       <w:proofErr w:type="spellEnd"/>
+      <w:proofErr w:type="gramEnd"/>
     </w:p>
     <w:p>
       <w:pPr>
@@ -2984,6 +3231,7 @@
         <w:t xml:space="preserve"> String </w:t>
       </w:r>
       <w:proofErr w:type="spellStart"/>
+      <w:proofErr w:type="gramStart"/>
       <w:r>
         <w:rPr>
           <w:rFonts w:ascii="Consolas" w:hAnsi="Consolas"/>
@@ -3003,6 +3251,7 @@
         </w:rPr>
         <w:t>(</w:t>
       </w:r>
+      <w:proofErr w:type="gramEnd"/>
       <w:r>
         <w:rPr>
           <w:rFonts w:ascii="Consolas" w:hAnsi="Consolas"/>
@@ -3289,7 +3538,7 @@
           <w:u w:val="single"/>
         </w:rPr>
       </w:pPr>
-      <w:hyperlink r:id="rId12" w:history="1">
+      <w:hyperlink r:id="rId13" w:history="1">
         <w:r>
           <w:rPr>
             <w:rFonts w:ascii="Consolas" w:eastAsia="Times New Roman" w:hAnsi="Consolas" w:cs="Times New Roman"/>
@@ -3306,7 +3555,7 @@
         </w:rPr>
         <w:t>.</w:t>
       </w:r>
-      <w:hyperlink r:id="rId13" w:history="1">
+      <w:hyperlink r:id="rId14" w:history="1">
         <w:r>
           <w:rPr>
             <w:rFonts w:ascii="Consolas" w:eastAsia="Times New Roman" w:hAnsi="Consolas" w:cs="Times New Roman"/>
@@ -3323,7 +3572,7 @@
         </w:rPr>
         <w:t>.</w:t>
       </w:r>
-      <w:hyperlink r:id="rId14" w:history="1">
+      <w:hyperlink r:id="rId15" w:history="1">
         <w:r>
           <w:rPr>
             <w:rFonts w:ascii="Consolas" w:eastAsia="Times New Roman" w:hAnsi="Consolas" w:cs="Times New Roman"/>
@@ -3340,7 +3589,7 @@
         </w:rPr>
         <w:t>.</w:t>
       </w:r>
-      <w:hyperlink r:id="rId15" w:history="1">
+      <w:hyperlink r:id="rId16" w:history="1">
         <w:r>
           <w:rPr>
             <w:rFonts w:ascii="Consolas" w:eastAsia="Times New Roman" w:hAnsi="Consolas" w:cs="Times New Roman"/>
@@ -3357,7 +3606,7 @@
         </w:rPr>
         <w:t>.</w:t>
       </w:r>
-      <w:hyperlink r:id="rId16" w:history="1">
+      <w:hyperlink r:id="rId17" w:history="1">
         <w:r>
           <w:rPr>
             <w:rFonts w:ascii="Consolas" w:eastAsia="Times New Roman" w:hAnsi="Consolas" w:cs="Times New Roman"/>
@@ -3425,6 +3674,7 @@
         </w:rPr>
         <w:t xml:space="preserve"> </w:t>
       </w:r>
+      <w:proofErr w:type="gramStart"/>
       <w:r>
         <w:rPr>
           <w:rFonts w:asciiTheme="minorHAnsi" w:hAnsiTheme="minorHAnsi"/>
@@ -3438,6 +3688,7 @@
         <w:t xml:space="preserve"> “</w:t>
       </w:r>
       <w:proofErr w:type="spellStart"/>
+      <w:proofErr w:type="gramEnd"/>
       <w:r>
         <w:rPr>
           <w:rFonts w:asciiTheme="minorHAnsi" w:hAnsiTheme="minorHAnsi"/>
@@ -3526,6 +3777,7 @@
         </w:rPr>
         <w:t xml:space="preserve"> </w:t>
       </w:r>
+      <w:proofErr w:type="gramStart"/>
       <w:r>
         <w:rPr>
           <w:rFonts w:ascii="Consolas" w:eastAsia="Times New Roman" w:hAnsi="Consolas" w:cs="Times New Roman"/>
@@ -3538,6 +3790,7 @@
         </w:rPr>
         <w:t>interface</w:t>
       </w:r>
+      <w:proofErr w:type="gramEnd"/>
       <w:r>
         <w:rPr>
           <w:rFonts w:ascii="Consolas" w:eastAsia="Times New Roman" w:hAnsi="Consolas" w:cs="Times New Roman"/>
@@ -3680,6 +3933,7 @@
         </w:rPr>
         <w:t xml:space="preserve"> </w:t>
       </w:r>
+      <w:proofErr w:type="gramStart"/>
       <w:r>
         <w:rPr>
           <w:rFonts w:ascii="Consolas" w:eastAsia="Times New Roman" w:hAnsi="Consolas" w:cs="Times New Roman"/>
@@ -3692,6 +3946,7 @@
         </w:rPr>
         <w:t>interface</w:t>
       </w:r>
+      <w:proofErr w:type="gramEnd"/>
       <w:r>
         <w:rPr>
           <w:rFonts w:ascii="Consolas" w:eastAsia="Times New Roman" w:hAnsi="Consolas" w:cs="Times New Roman"/>
@@ -3746,8 +4001,20 @@
           <w:szCs w:val="20"/>
           <w:lang w:eastAsia="es-ES"/>
         </w:rPr>
-        <w:t xml:space="preserve"> Default{</w:t>
-      </w:r>
+        <w:t xml:space="preserve"> </w:t>
+      </w:r>
+      <w:proofErr w:type="gramStart"/>
+      <w:r>
+        <w:rPr>
+          <w:rFonts w:ascii="Consolas" w:eastAsia="Times New Roman" w:hAnsi="Consolas" w:cs="Times New Roman"/>
+          <w:color w:val="000000"/>
+          <w:sz w:val="20"/>
+          <w:szCs w:val="20"/>
+          <w:lang w:eastAsia="es-ES"/>
+        </w:rPr>
+        <w:t>Default{</w:t>
+      </w:r>
+      <w:proofErr w:type="gramEnd"/>
     </w:p>
     <w:p>
       <w:pPr>
@@ -3866,16 +4133,36 @@
           <w:sz w:val="18"/>
           <w:szCs w:val="18"/>
         </w:rPr>
-        <w:t>@NotBlank</w:t>
-      </w:r>
-      <w:r>
-        <w:rPr>
-          <w:rFonts w:ascii="Consolas" w:hAnsi="Consolas"/>
-          <w:color w:val="000000"/>
-          <w:sz w:val="18"/>
-          <w:szCs w:val="18"/>
-        </w:rPr>
-        <w:t xml:space="preserve">(message = </w:t>
+        <w:t>@</w:t>
+      </w:r>
+      <w:proofErr w:type="gramStart"/>
+      <w:r>
+        <w:rPr>
+          <w:rFonts w:ascii="Consolas" w:hAnsi="Consolas"/>
+          <w:color w:val="646464"/>
+          <w:sz w:val="18"/>
+          <w:szCs w:val="18"/>
+        </w:rPr>
+        <w:t>NotBlank</w:t>
+      </w:r>
+      <w:r>
+        <w:rPr>
+          <w:rFonts w:ascii="Consolas" w:hAnsi="Consolas"/>
+          <w:color w:val="000000"/>
+          <w:sz w:val="18"/>
+          <w:szCs w:val="18"/>
+        </w:rPr>
+        <w:t>(</w:t>
+      </w:r>
+      <w:proofErr w:type="gramEnd"/>
+      <w:r>
+        <w:rPr>
+          <w:rFonts w:ascii="Consolas" w:hAnsi="Consolas"/>
+          <w:color w:val="000000"/>
+          <w:sz w:val="18"/>
+          <w:szCs w:val="18"/>
+        </w:rPr>
+        <w:t xml:space="preserve">message = </w:t>
       </w:r>
       <w:r>
         <w:rPr>
@@ -3887,6 +4174,7 @@
         <w:t>"{</w:t>
       </w:r>
       <w:proofErr w:type="spellStart"/>
+      <w:proofErr w:type="gramStart"/>
       <w:r>
         <w:rPr>
           <w:rFonts w:ascii="Consolas" w:hAnsi="Consolas"/>
@@ -3894,9 +4182,9 @@
           <w:sz w:val="18"/>
           <w:szCs w:val="18"/>
         </w:rPr>
-        <w:t>validations.message.password.mandatory</w:t>
-      </w:r>
-      <w:proofErr w:type="spellEnd"/>
+        <w:t>validations.message</w:t>
+      </w:r>
+      <w:proofErr w:type="gramEnd"/>
       <w:r>
         <w:rPr>
           <w:rFonts w:ascii="Consolas" w:hAnsi="Consolas"/>
@@ -3904,7 +4192,38 @@
           <w:sz w:val="18"/>
           <w:szCs w:val="18"/>
         </w:rPr>
-        <w:t>}"</w:t>
+        <w:t>.</w:t>
+      </w:r>
+      <w:proofErr w:type="gramStart"/>
+      <w:r>
+        <w:rPr>
+          <w:rFonts w:ascii="Consolas" w:hAnsi="Consolas"/>
+          <w:color w:val="2A00FF"/>
+          <w:sz w:val="18"/>
+          <w:szCs w:val="18"/>
+        </w:rPr>
+        <w:t>password.mandatory</w:t>
+      </w:r>
+      <w:proofErr w:type="spellEnd"/>
+      <w:proofErr w:type="gramEnd"/>
+      <w:r>
+        <w:rPr>
+          <w:rFonts w:ascii="Consolas" w:hAnsi="Consolas"/>
+          <w:color w:val="2A00FF"/>
+          <w:sz w:val="18"/>
+          <w:szCs w:val="18"/>
+        </w:rPr>
+        <w:t>}</w:t>
+      </w:r>
+      <w:proofErr w:type="gramStart"/>
+      <w:r>
+        <w:rPr>
+          <w:rFonts w:ascii="Consolas" w:hAnsi="Consolas"/>
+          <w:color w:val="2A00FF"/>
+          <w:sz w:val="18"/>
+          <w:szCs w:val="18"/>
+        </w:rPr>
+        <w:t>"</w:t>
       </w:r>
       <w:r>
         <w:rPr>
@@ -3927,6 +4246,7 @@
         <w:t>groups</w:t>
       </w:r>
       <w:proofErr w:type="spellEnd"/>
+      <w:proofErr w:type="gramEnd"/>
       <w:r>
         <w:rPr>
           <w:rFonts w:ascii="Consolas" w:hAnsi="Consolas"/>
@@ -4001,17 +4321,39 @@
           <w:szCs w:val="18"/>
           <w:lang w:eastAsia="es-ES"/>
         </w:rPr>
-        <w:t>@Size</w:t>
-      </w:r>
+        <w:t>@</w:t>
+      </w:r>
+      <w:proofErr w:type="gramStart"/>
       <w:r>
         <w:rPr>
           <w:rFonts w:ascii="Consolas" w:eastAsia="Times New Roman" w:hAnsi="Consolas" w:cs="Times New Roman"/>
-          <w:color w:val="000000"/>
+          <w:color w:val="646464"/>
           <w:sz w:val="18"/>
           <w:szCs w:val="18"/>
           <w:lang w:eastAsia="es-ES"/>
         </w:rPr>
-        <w:t xml:space="preserve">(min = 6, </w:t>
+        <w:t>Size</w:t>
+      </w:r>
+      <w:r>
+        <w:rPr>
+          <w:rFonts w:ascii="Consolas" w:eastAsia="Times New Roman" w:hAnsi="Consolas" w:cs="Times New Roman"/>
+          <w:color w:val="000000"/>
+          <w:sz w:val="18"/>
+          <w:szCs w:val="18"/>
+          <w:lang w:eastAsia="es-ES"/>
+        </w:rPr>
+        <w:t>(</w:t>
+      </w:r>
+      <w:proofErr w:type="gramEnd"/>
+      <w:r>
+        <w:rPr>
+          <w:rFonts w:ascii="Consolas" w:eastAsia="Times New Roman" w:hAnsi="Consolas" w:cs="Times New Roman"/>
+          <w:color w:val="000000"/>
+          <w:sz w:val="18"/>
+          <w:szCs w:val="18"/>
+          <w:lang w:eastAsia="es-ES"/>
+        </w:rPr>
+        <w:t xml:space="preserve">min = 6, </w:t>
       </w:r>
       <w:proofErr w:type="spellStart"/>
       <w:r>
@@ -4046,6 +4388,7 @@
         <w:t>"{</w:t>
       </w:r>
       <w:proofErr w:type="spellStart"/>
+      <w:proofErr w:type="gramStart"/>
       <w:r>
         <w:rPr>
           <w:rFonts w:ascii="Consolas" w:eastAsia="Times New Roman" w:hAnsi="Consolas" w:cs="Times New Roman"/>
@@ -4054,9 +4397,9 @@
           <w:szCs w:val="18"/>
           <w:lang w:eastAsia="es-ES"/>
         </w:rPr>
-        <w:t>validations.message.password.validformat</w:t>
-      </w:r>
-      <w:proofErr w:type="spellEnd"/>
+        <w:t>validations.message</w:t>
+      </w:r>
+      <w:proofErr w:type="gramEnd"/>
       <w:r>
         <w:rPr>
           <w:rFonts w:ascii="Consolas" w:eastAsia="Times New Roman" w:hAnsi="Consolas" w:cs="Times New Roman"/>
@@ -4065,7 +4408,41 @@
           <w:szCs w:val="18"/>
           <w:lang w:eastAsia="es-ES"/>
         </w:rPr>
-        <w:t>}"</w:t>
+        <w:t>.</w:t>
+      </w:r>
+      <w:proofErr w:type="gramStart"/>
+      <w:r>
+        <w:rPr>
+          <w:rFonts w:ascii="Consolas" w:eastAsia="Times New Roman" w:hAnsi="Consolas" w:cs="Times New Roman"/>
+          <w:color w:val="2A00FF"/>
+          <w:sz w:val="18"/>
+          <w:szCs w:val="18"/>
+          <w:lang w:eastAsia="es-ES"/>
+        </w:rPr>
+        <w:t>password.validformat</w:t>
+      </w:r>
+      <w:proofErr w:type="spellEnd"/>
+      <w:proofErr w:type="gramEnd"/>
+      <w:r>
+        <w:rPr>
+          <w:rFonts w:ascii="Consolas" w:eastAsia="Times New Roman" w:hAnsi="Consolas" w:cs="Times New Roman"/>
+          <w:color w:val="2A00FF"/>
+          <w:sz w:val="18"/>
+          <w:szCs w:val="18"/>
+          <w:lang w:eastAsia="es-ES"/>
+        </w:rPr>
+        <w:t>}</w:t>
+      </w:r>
+      <w:proofErr w:type="gramStart"/>
+      <w:r>
+        <w:rPr>
+          <w:rFonts w:ascii="Consolas" w:eastAsia="Times New Roman" w:hAnsi="Consolas" w:cs="Times New Roman"/>
+          <w:color w:val="2A00FF"/>
+          <w:sz w:val="18"/>
+          <w:szCs w:val="18"/>
+          <w:lang w:eastAsia="es-ES"/>
+        </w:rPr>
+        <w:t>"</w:t>
       </w:r>
       <w:r>
         <w:rPr>
@@ -4090,6 +4467,7 @@
         <w:t>groups</w:t>
       </w:r>
       <w:proofErr w:type="spellEnd"/>
+      <w:proofErr w:type="gramEnd"/>
       <w:r>
         <w:rPr>
           <w:rFonts w:ascii="Consolas" w:eastAsia="Times New Roman" w:hAnsi="Consolas" w:cs="Times New Roman"/>
@@ -4364,6 +4742,7 @@
         <w:t xml:space="preserve"> </w:t>
       </w:r>
       <w:proofErr w:type="spellStart"/>
+      <w:proofErr w:type="gramStart"/>
       <w:r>
         <w:rPr>
           <w:rFonts w:ascii="Consolas" w:eastAsia="Times New Roman" w:hAnsi="Consolas" w:cs="Times New Roman"/>
@@ -4373,6 +4752,7 @@
         <w:t>password</w:t>
       </w:r>
       <w:proofErr w:type="spellEnd"/>
+      <w:proofErr w:type="gramEnd"/>
       <w:r>
         <w:rPr>
           <w:rFonts w:ascii="Consolas" w:eastAsia="Times New Roman" w:hAnsi="Consolas" w:cs="Times New Roman"/>
@@ -4418,6 +4798,7 @@
         <w:t xml:space="preserve"> (sin </w:t>
       </w:r>
       <w:proofErr w:type="spellStart"/>
+      <w:proofErr w:type="gramStart"/>
       <w:r>
         <w:rPr>
           <w:rFonts w:ascii="Consolas" w:eastAsia="Times New Roman" w:hAnsi="Consolas" w:cs="Times New Roman"/>
@@ -4427,6 +4808,7 @@
         <w:t>password</w:t>
       </w:r>
       <w:proofErr w:type="spellEnd"/>
+      <w:proofErr w:type="gramEnd"/>
       <w:r>
         <w:rPr>
           <w:rFonts w:ascii="Consolas" w:eastAsia="Times New Roman" w:hAnsi="Consolas" w:cs="Times New Roman"/>
@@ -4543,6 +4925,7 @@
         <w:t xml:space="preserve"> = (</w:t>
       </w:r>
       <w:proofErr w:type="spellStart"/>
+      <w:proofErr w:type="gramStart"/>
       <w:r>
         <w:rPr>
           <w:rFonts w:ascii="Consolas" w:eastAsia="Times New Roman" w:hAnsi="Consolas" w:cs="Times New Roman"/>
@@ -4560,6 +4943,7 @@
         <w:t>.getId</w:t>
       </w:r>
       <w:proofErr w:type="spellEnd"/>
+      <w:proofErr w:type="gramEnd"/>
       <w:r>
         <w:rPr>
           <w:rFonts w:ascii="Consolas" w:eastAsia="Times New Roman" w:hAnsi="Consolas" w:cs="Times New Roman"/>
@@ -4580,15 +4964,26 @@
         <w:t>null</w:t>
       </w:r>
       <w:proofErr w:type="spellEnd"/>
+      <w:proofErr w:type="gramStart"/>
       <w:r>
         <w:rPr>
           <w:rFonts w:ascii="Consolas" w:eastAsia="Times New Roman" w:hAnsi="Consolas" w:cs="Times New Roman"/>
           <w:color w:val="000000"/>
           <w:lang w:eastAsia="es-ES"/>
         </w:rPr>
-        <w:t xml:space="preserve">) ? </w:t>
-      </w:r>
-      <w:proofErr w:type="spellStart"/>
+        <w:t>) ?</w:t>
+      </w:r>
+      <w:proofErr w:type="gramEnd"/>
+      <w:r>
+        <w:rPr>
+          <w:rFonts w:ascii="Consolas" w:eastAsia="Times New Roman" w:hAnsi="Consolas" w:cs="Times New Roman"/>
+          <w:color w:val="000000"/>
+          <w:lang w:eastAsia="es-ES"/>
+        </w:rPr>
+        <w:t xml:space="preserve"> </w:t>
+      </w:r>
+      <w:proofErr w:type="spellStart"/>
+      <w:proofErr w:type="gramStart"/>
       <w:r>
         <w:rPr>
           <w:rFonts w:ascii="Consolas" w:eastAsia="Times New Roman" w:hAnsi="Consolas" w:cs="Times New Roman"/>
@@ -4614,7 +5009,16 @@
           <w:color w:val="000000"/>
           <w:lang w:eastAsia="es-ES"/>
         </w:rPr>
-        <w:t xml:space="preserve"> : </w:t>
+        <w:t xml:space="preserve"> :</w:t>
+      </w:r>
+      <w:proofErr w:type="gramEnd"/>
+      <w:r>
+        <w:rPr>
+          <w:rFonts w:ascii="Consolas" w:eastAsia="Times New Roman" w:hAnsi="Consolas" w:cs="Times New Roman"/>
+          <w:color w:val="000000"/>
+          <w:lang w:eastAsia="es-ES"/>
+        </w:rPr>
+        <w:t xml:space="preserve"> </w:t>
       </w:r>
       <w:proofErr w:type="spellStart"/>
       <w:r>
@@ -4826,18 +5230,28 @@
           <w:lang w:eastAsia="es-ES"/>
         </w:rPr>
         <w:tab/>
-        <w:t xml:space="preserve">            .</w:t>
-      </w:r>
-      <w:proofErr w:type="spellStart"/>
+        <w:t xml:space="preserve">            </w:t>
+      </w:r>
+      <w:proofErr w:type="gramStart"/>
       <w:r>
         <w:rPr>
           <w:rFonts w:ascii="Consolas" w:eastAsia="Times New Roman" w:hAnsi="Consolas" w:cs="Times New Roman"/>
           <w:color w:val="000000"/>
           <w:lang w:eastAsia="es-ES"/>
         </w:rPr>
+        <w:t>.</w:t>
+      </w:r>
+      <w:proofErr w:type="spellStart"/>
+      <w:r>
+        <w:rPr>
+          <w:rFonts w:ascii="Consolas" w:eastAsia="Times New Roman" w:hAnsi="Consolas" w:cs="Times New Roman"/>
+          <w:color w:val="000000"/>
+          <w:lang w:eastAsia="es-ES"/>
+        </w:rPr>
         <w:t>validate</w:t>
       </w:r>
       <w:proofErr w:type="spellEnd"/>
+      <w:proofErr w:type="gramEnd"/>
       <w:r>
         <w:rPr>
           <w:rFonts w:ascii="Consolas" w:eastAsia="Times New Roman" w:hAnsi="Consolas" w:cs="Times New Roman"/>
@@ -4965,7 +5379,15 @@
       </w:r>
       <w:proofErr w:type="spellEnd"/>
       <w:r>
-        <w:t>” y el validador obviará los asignado a otros grupos.</w:t>
+        <w:t xml:space="preserve">” y el validador obviará </w:t>
+      </w:r>
+      <w:proofErr w:type="gramStart"/>
+      <w:r>
+        <w:t>los asignado</w:t>
+      </w:r>
+      <w:proofErr w:type="gramEnd"/>
+      <w:r>
+        <w:t xml:space="preserve"> a otros grupos.</w:t>
       </w:r>
     </w:p>
     <w:p>
@@ -5006,6 +5428,7 @@
         <w:ind w:firstLine="708"/>
       </w:pPr>
       <w:r>
+        <w:lastRenderedPageBreak/>
         <w:t>Si algun</w:t>
       </w:r>
       <w:r>
@@ -5018,13 +5441,21 @@
         <w:t xml:space="preserve">se generan los mensajes </w:t>
       </w:r>
       <w:r>
-        <w:t xml:space="preserve">asociados a cada validación y </w:t>
+        <w:t xml:space="preserve">asociados a cada validación </w:t>
+      </w:r>
+      <w:proofErr w:type="gramStart"/>
+      <w:r>
+        <w:t xml:space="preserve">y </w:t>
       </w:r>
       <w:r>
         <w:t xml:space="preserve"> </w:t>
       </w:r>
       <w:r>
-        <w:t xml:space="preserve">devolviéndose </w:t>
+        <w:t>devolviéndose</w:t>
+      </w:r>
+      <w:proofErr w:type="gramEnd"/>
+      <w:r>
+        <w:t xml:space="preserve"> </w:t>
       </w:r>
       <w:r>
         <w:t>a la vista</w:t>
@@ -5184,6 +5615,7 @@
         <w:t xml:space="preserve"> </w:t>
       </w:r>
       <w:proofErr w:type="spellStart"/>
+      <w:proofErr w:type="gramStart"/>
       <w:r>
         <w:rPr>
           <w:rFonts w:ascii="Consolas" w:hAnsi="Consolas"/>
@@ -5195,6 +5627,7 @@
         <w:t>th:errors</w:t>
       </w:r>
       <w:proofErr w:type="spellEnd"/>
+      <w:proofErr w:type="gramEnd"/>
       <w:r>
         <w:rPr>
           <w:rFonts w:ascii="Consolas" w:hAnsi="Consolas"/>
@@ -5274,7 +5707,6 @@
         </w:rPr>
       </w:pPr>
       <w:r>
-        <w:lastRenderedPageBreak/>
         <w:t>-</w:t>
       </w:r>
       <w:r>
@@ -5422,6 +5854,7 @@
         <w:t xml:space="preserve"> String </w:t>
       </w:r>
       <w:proofErr w:type="spellStart"/>
+      <w:proofErr w:type="gramStart"/>
       <w:r>
         <w:rPr>
           <w:rFonts w:ascii="Consolas" w:hAnsi="Consolas"/>
@@ -5441,6 +5874,7 @@
         </w:rPr>
         <w:t>(</w:t>
       </w:r>
+      <w:proofErr w:type="gramEnd"/>
       <w:r>
         <w:rPr>
           <w:rFonts w:ascii="Consolas" w:hAnsi="Consolas"/>
@@ -5759,6 +6193,7 @@
         <w:t xml:space="preserve"> (</w:t>
       </w:r>
       <w:proofErr w:type="spellStart"/>
+      <w:proofErr w:type="gramStart"/>
       <w:r>
         <w:rPr>
           <w:rFonts w:ascii="Consolas" w:hAnsi="Consolas"/>
@@ -5778,6 +6213,7 @@
         <w:t>.hasErrors</w:t>
       </w:r>
       <w:proofErr w:type="spellEnd"/>
+      <w:proofErr w:type="gramEnd"/>
       <w:r>
         <w:rPr>
           <w:rFonts w:ascii="Consolas" w:hAnsi="Consolas"/>
@@ -5944,8 +6380,13 @@
         <w:tab/>
         <w:t xml:space="preserve">Los datos del formulario pueden ser válidos en formato </w:t>
       </w:r>
-      <w:r>
-        <w:t>de acuerdo a lo determinado en sus atributos</w:t>
+      <w:proofErr w:type="gramStart"/>
+      <w:r>
+        <w:t>de acuerdo a</w:t>
+      </w:r>
+      <w:proofErr w:type="gramEnd"/>
+      <w:r>
+        <w:t xml:space="preserve"> lo determinado en sus atributos</w:t>
       </w:r>
       <w:r>
         <w:t xml:space="preserve">, pero no cumplir las reglas de negocio que tenemos en nuestro modelo, en nuestro caso </w:t>
@@ -6056,6 +6497,7 @@
         <w:t xml:space="preserve"> </w:t>
       </w:r>
       <w:proofErr w:type="spellStart"/>
+      <w:proofErr w:type="gramStart"/>
       <w:r>
         <w:rPr>
           <w:rFonts w:ascii="Consolas" w:hAnsi="Consolas"/>
@@ -6073,7 +6515,17 @@
           <w:sz w:val="18"/>
           <w:szCs w:val="18"/>
         </w:rPr>
-        <w:t xml:space="preserve">(Long </w:t>
+        <w:t>(</w:t>
+      </w:r>
+      <w:proofErr w:type="gramEnd"/>
+      <w:r>
+        <w:rPr>
+          <w:rFonts w:ascii="Consolas" w:hAnsi="Consolas"/>
+          <w:color w:val="000000"/>
+          <w:sz w:val="18"/>
+          <w:szCs w:val="18"/>
+        </w:rPr>
+        <w:t xml:space="preserve">Long </w:t>
       </w:r>
       <w:r>
         <w:rPr>
@@ -6218,6 +6670,7 @@
         <w:t xml:space="preserve"> = </w:t>
       </w:r>
       <w:proofErr w:type="spellStart"/>
+      <w:proofErr w:type="gramStart"/>
       <w:r>
         <w:rPr>
           <w:rFonts w:ascii="Consolas" w:hAnsi="Consolas"/>
@@ -6238,6 +6691,7 @@
         <w:t>.findById</w:t>
       </w:r>
       <w:proofErr w:type="spellEnd"/>
+      <w:proofErr w:type="gramEnd"/>
       <w:r>
         <w:rPr>
           <w:rFonts w:ascii="Consolas" w:hAnsi="Consolas"/>
@@ -6287,7 +6741,17 @@
           <w:sz w:val="18"/>
           <w:szCs w:val="18"/>
         </w:rPr>
-        <w:t xml:space="preserve">                .</w:t>
+        <w:t xml:space="preserve">                </w:t>
+      </w:r>
+      <w:proofErr w:type="gramStart"/>
+      <w:r>
+        <w:rPr>
+          <w:rFonts w:ascii="Consolas" w:hAnsi="Consolas"/>
+          <w:color w:val="000000"/>
+          <w:sz w:val="18"/>
+          <w:szCs w:val="18"/>
+        </w:rPr>
+        <w:t>.</w:t>
       </w:r>
       <w:proofErr w:type="spellStart"/>
       <w:r>
@@ -6300,6 +6764,7 @@
         <w:t>orElseThrow</w:t>
       </w:r>
       <w:proofErr w:type="spellEnd"/>
+      <w:proofErr w:type="gramEnd"/>
       <w:r>
         <w:rPr>
           <w:rFonts w:ascii="Consolas" w:hAnsi="Consolas"/>
@@ -6330,6 +6795,7 @@
         <w:t xml:space="preserve"> </w:t>
       </w:r>
       <w:proofErr w:type="spellStart"/>
+      <w:proofErr w:type="gramStart"/>
       <w:r>
         <w:rPr>
           <w:rFonts w:ascii="Consolas" w:hAnsi="Consolas"/>
@@ -6349,6 +6815,7 @@
         </w:rPr>
         <w:t>(</w:t>
       </w:r>
+      <w:proofErr w:type="gramEnd"/>
       <w:r>
         <w:rPr>
           <w:rFonts w:ascii="Consolas" w:hAnsi="Consolas"/>
@@ -6432,9 +6899,20 @@
           <w:sz w:val="18"/>
           <w:szCs w:val="18"/>
         </w:rPr>
-        <w:t>comprobación_de_password</w:t>
-      </w:r>
-      <w:proofErr w:type="spellEnd"/>
+        <w:t>comprobación_de_</w:t>
+      </w:r>
+      <w:proofErr w:type="gramStart"/>
+      <w:r>
+        <w:rPr>
+          <w:rFonts w:ascii="Consolas" w:hAnsi="Consolas"/>
+          <w:color w:val="000000"/>
+          <w:sz w:val="18"/>
+          <w:szCs w:val="18"/>
+        </w:rPr>
+        <w:t>password</w:t>
+      </w:r>
+      <w:proofErr w:type="spellEnd"/>
+      <w:proofErr w:type="gramEnd"/>
       <w:r>
         <w:rPr>
           <w:rFonts w:ascii="Consolas" w:hAnsi="Consolas"/>
@@ -6509,6 +6987,7 @@
         <w:t xml:space="preserve"> </w:t>
       </w:r>
       <w:proofErr w:type="spellStart"/>
+      <w:proofErr w:type="gramStart"/>
       <w:r>
         <w:rPr>
           <w:rFonts w:ascii="Consolas" w:hAnsi="Consolas"/>
@@ -6529,6 +7008,7 @@
         </w:rPr>
         <w:t>(</w:t>
       </w:r>
+      <w:proofErr w:type="gramEnd"/>
       <w:r>
         <w:rPr>
           <w:rFonts w:ascii="Consolas" w:hAnsi="Consolas"/>
@@ -6646,6 +7126,7 @@
         </w:rPr>
       </w:pPr>
       <w:r>
+        <w:lastRenderedPageBreak/>
         <w:t xml:space="preserve">Para evitar “múltiples” </w:t>
       </w:r>
       <w:r>
@@ -6657,7 +7138,15 @@
       </w:r>
       <w:proofErr w:type="spellEnd"/>
       <w:r>
-        <w:t>, y sobre todo, la famosa página</w:t>
+        <w:t xml:space="preserve">, </w:t>
+      </w:r>
+      <w:proofErr w:type="gramStart"/>
+      <w:r>
+        <w:t>y</w:t>
+      </w:r>
+      <w:proofErr w:type="gramEnd"/>
+      <w:r>
+        <w:t xml:space="preserve"> sobre todo, la famosa página</w:t>
       </w:r>
       <w:r>
         <w:rPr>
@@ -6754,115 +7243,6 @@
             <wp:extent cx="3733333" cy="1780952"/>
             <wp:effectExtent l="0" t="0" r="635" b="0"/>
             <wp:docPr id="1" name="Imagen 1"/>
-            <wp:cNvGraphicFramePr>
-              <a:graphicFrameLocks xmlns:a="http://schemas.openxmlformats.org/drawingml/2006/main" noChangeAspect="1"/>
-            </wp:cNvGraphicFramePr>
-            <a:graphic xmlns:a="http://schemas.openxmlformats.org/drawingml/2006/main">
-              <a:graphicData uri="http://schemas.openxmlformats.org/drawingml/2006/picture">
-                <pic:pic xmlns:pic="http://schemas.openxmlformats.org/drawingml/2006/picture">
-                  <pic:nvPicPr>
-                    <pic:cNvPr id="1" name=""/>
-                    <pic:cNvPicPr/>
-                  </pic:nvPicPr>
-                  <pic:blipFill>
-                    <a:blip r:embed="rId17"/>
-                    <a:stretch>
-                      <a:fillRect/>
-                    </a:stretch>
-                  </pic:blipFill>
-                  <pic:spPr>
-                    <a:xfrm>
-                      <a:off x="0" y="0"/>
-                      <a:ext cx="3733333" cy="1780952"/>
-                    </a:xfrm>
-                    <a:prstGeom prst="rect">
-                      <a:avLst/>
-                    </a:prstGeom>
-                  </pic:spPr>
-                </pic:pic>
-              </a:graphicData>
-            </a:graphic>
-          </wp:inline>
-        </w:drawing>
-      </w:r>
-    </w:p>
-    <w:p>
-      <w:r>
-        <w:lastRenderedPageBreak/>
-        <w:t>Se incorpora a esta clase el “</w:t>
-      </w:r>
-      <w:proofErr w:type="spellStart"/>
-      <w:r>
-        <w:t>MessageSource</w:t>
-      </w:r>
-      <w:proofErr w:type="spellEnd"/>
-      <w:r>
-        <w:t>” para poder devolver el mensaje en el “</w:t>
-      </w:r>
-      <w:proofErr w:type="spellStart"/>
-      <w:r>
-        <w:t>Locale</w:t>
-      </w:r>
-      <w:proofErr w:type="spellEnd"/>
-      <w:r>
-        <w:t>” del usuario.</w:t>
-      </w:r>
-    </w:p>
-    <w:p>
-      <w:pPr>
-        <w:rPr>
-          <w:rFonts w:ascii="Consolas" w:hAnsi="Consolas"/>
-          <w:color w:val="646464"/>
-          <w:shd w:val="clear" w:color="auto" w:fill="FFFFFF"/>
-        </w:rPr>
-      </w:pPr>
-      <w:r>
-        <w:rPr>
-          <w:rFonts w:ascii="Consolas" w:hAnsi="Consolas"/>
-          <w:color w:val="646464"/>
-          <w:shd w:val="clear" w:color="auto" w:fill="FFFFFF"/>
-        </w:rPr>
-        <w:t>Esta clase manejará las excepciones de nuestra clase principal de Excepciones “</w:t>
-      </w:r>
-      <w:proofErr w:type="spellStart"/>
-      <w:r>
-        <w:rPr>
-          <w:rFonts w:ascii="Consolas" w:hAnsi="Consolas"/>
-          <w:color w:val="646464"/>
-          <w:shd w:val="clear" w:color="auto" w:fill="FFFFFF"/>
-        </w:rPr>
-        <w:t>AppGlogalException</w:t>
-      </w:r>
-      <w:proofErr w:type="spellEnd"/>
-      <w:r>
-        <w:rPr>
-          <w:rFonts w:ascii="Consolas" w:hAnsi="Consolas"/>
-          <w:color w:val="646464"/>
-          <w:shd w:val="clear" w:color="auto" w:fill="FFFFFF"/>
-        </w:rPr>
-        <w:t>” (clase abstracta)</w:t>
-      </w:r>
-    </w:p>
-    <w:p>
-      <w:pPr>
-        <w:rPr>
-          <w:rFonts w:ascii="Consolas" w:hAnsi="Consolas"/>
-          <w:color w:val="646464"/>
-          <w:shd w:val="clear" w:color="auto" w:fill="FFFFFF"/>
-        </w:rPr>
-      </w:pPr>
-      <w:r>
-        <w:rPr>
-          <w:rFonts w:ascii="Consolas" w:hAnsi="Consolas"/>
-          <w:noProof/>
-          <w:color w:val="646464"/>
-          <w:shd w:val="clear" w:color="auto" w:fill="FFFFFF"/>
-        </w:rPr>
-        <w:drawing>
-          <wp:inline distT="0" distB="0" distL="0" distR="0" wp14:anchorId="5CE92667" wp14:editId="04F6698D">
-            <wp:extent cx="5400040" cy="1658620"/>
-            <wp:effectExtent l="0" t="0" r="0" b="0"/>
-            <wp:docPr id="2" name="Imagen 2"/>
             <wp:cNvGraphicFramePr>
               <a:graphicFrameLocks xmlns:a="http://schemas.openxmlformats.org/drawingml/2006/main" noChangeAspect="1"/>
             </wp:cNvGraphicFramePr>
@@ -6882,6 +7262,114 @@
                   <pic:spPr>
                     <a:xfrm>
                       <a:off x="0" y="0"/>
+                      <a:ext cx="3733333" cy="1780952"/>
+                    </a:xfrm>
+                    <a:prstGeom prst="rect">
+                      <a:avLst/>
+                    </a:prstGeom>
+                  </pic:spPr>
+                </pic:pic>
+              </a:graphicData>
+            </a:graphic>
+          </wp:inline>
+        </w:drawing>
+      </w:r>
+    </w:p>
+    <w:p>
+      <w:r>
+        <w:t>Se incorpora a esta clase el “</w:t>
+      </w:r>
+      <w:proofErr w:type="spellStart"/>
+      <w:r>
+        <w:t>MessageSource</w:t>
+      </w:r>
+      <w:proofErr w:type="spellEnd"/>
+      <w:r>
+        <w:t>” para poder devolver el mensaje en el “</w:t>
+      </w:r>
+      <w:proofErr w:type="spellStart"/>
+      <w:r>
+        <w:t>Locale</w:t>
+      </w:r>
+      <w:proofErr w:type="spellEnd"/>
+      <w:r>
+        <w:t>” del usuario.</w:t>
+      </w:r>
+    </w:p>
+    <w:p>
+      <w:pPr>
+        <w:rPr>
+          <w:rFonts w:ascii="Consolas" w:hAnsi="Consolas"/>
+          <w:color w:val="646464"/>
+          <w:shd w:val="clear" w:color="auto" w:fill="FFFFFF"/>
+        </w:rPr>
+      </w:pPr>
+      <w:r>
+        <w:rPr>
+          <w:rFonts w:ascii="Consolas" w:hAnsi="Consolas"/>
+          <w:color w:val="646464"/>
+          <w:shd w:val="clear" w:color="auto" w:fill="FFFFFF"/>
+        </w:rPr>
+        <w:t>Esta clase manejará las excepciones de nuestra clase principal de Excepciones “</w:t>
+      </w:r>
+      <w:proofErr w:type="spellStart"/>
+      <w:r>
+        <w:rPr>
+          <w:rFonts w:ascii="Consolas" w:hAnsi="Consolas"/>
+          <w:color w:val="646464"/>
+          <w:shd w:val="clear" w:color="auto" w:fill="FFFFFF"/>
+        </w:rPr>
+        <w:t>AppGlogalException</w:t>
+      </w:r>
+      <w:proofErr w:type="spellEnd"/>
+      <w:r>
+        <w:rPr>
+          <w:rFonts w:ascii="Consolas" w:hAnsi="Consolas"/>
+          <w:color w:val="646464"/>
+          <w:shd w:val="clear" w:color="auto" w:fill="FFFFFF"/>
+        </w:rPr>
+        <w:t>” (clase abstracta)</w:t>
+      </w:r>
+    </w:p>
+    <w:p>
+      <w:pPr>
+        <w:rPr>
+          <w:rFonts w:ascii="Consolas" w:hAnsi="Consolas"/>
+          <w:color w:val="646464"/>
+          <w:shd w:val="clear" w:color="auto" w:fill="FFFFFF"/>
+        </w:rPr>
+      </w:pPr>
+      <w:r>
+        <w:rPr>
+          <w:rFonts w:ascii="Consolas" w:hAnsi="Consolas"/>
+          <w:noProof/>
+          <w:color w:val="646464"/>
+          <w:shd w:val="clear" w:color="auto" w:fill="FFFFFF"/>
+        </w:rPr>
+        <w:drawing>
+          <wp:inline distT="0" distB="0" distL="0" distR="0" wp14:anchorId="5CE92667" wp14:editId="04F6698D">
+            <wp:extent cx="5400040" cy="1658620"/>
+            <wp:effectExtent l="0" t="0" r="0" b="0"/>
+            <wp:docPr id="2" name="Imagen 2"/>
+            <wp:cNvGraphicFramePr>
+              <a:graphicFrameLocks xmlns:a="http://schemas.openxmlformats.org/drawingml/2006/main" noChangeAspect="1"/>
+            </wp:cNvGraphicFramePr>
+            <a:graphic xmlns:a="http://schemas.openxmlformats.org/drawingml/2006/main">
+              <a:graphicData uri="http://schemas.openxmlformats.org/drawingml/2006/picture">
+                <pic:pic xmlns:pic="http://schemas.openxmlformats.org/drawingml/2006/picture">
+                  <pic:nvPicPr>
+                    <pic:cNvPr id="1" name=""/>
+                    <pic:cNvPicPr/>
+                  </pic:nvPicPr>
+                  <pic:blipFill>
+                    <a:blip r:embed="rId19"/>
+                    <a:stretch>
+                      <a:fillRect/>
+                    </a:stretch>
+                  </pic:blipFill>
+                  <pic:spPr>
+                    <a:xfrm>
+                      <a:off x="0" y="0"/>
                       <a:ext cx="5400040" cy="1658620"/>
                     </a:xfrm>
                     <a:prstGeom prst="rect">
@@ -7252,6 +7740,7 @@
         </w:rPr>
       </w:pPr>
       <w:proofErr w:type="spellStart"/>
+      <w:proofErr w:type="gramStart"/>
       <w:r>
         <w:rPr>
           <w:rFonts w:ascii="Consolas" w:hAnsi="Consolas"/>
@@ -7271,6 +7760,7 @@
         <w:t>.rejectValue</w:t>
       </w:r>
       <w:proofErr w:type="spellEnd"/>
+      <w:proofErr w:type="gramEnd"/>
       <w:r>
         <w:rPr>
           <w:rFonts w:ascii="Consolas" w:hAnsi="Consolas"/>
@@ -7300,6 +7790,7 @@
         <w:t>errorGlobal</w:t>
       </w:r>
       <w:proofErr w:type="spellEnd"/>
+      <w:proofErr w:type="gramStart"/>
       <w:r>
         <w:rPr>
           <w:rFonts w:ascii="Consolas" w:hAnsi="Consolas"/>
@@ -7338,6 +7829,7 @@
         <w:t>error.en</w:t>
       </w:r>
       <w:proofErr w:type="spellEnd"/>
+      <w:proofErr w:type="gramEnd"/>
       <w:r>
         <w:rPr>
           <w:rFonts w:ascii="Consolas" w:hAnsi="Consolas"/>
@@ -7386,6 +7878,7 @@
         <w:t xml:space="preserve"> </w:t>
       </w:r>
       <w:proofErr w:type="spellStart"/>
+      <w:proofErr w:type="gramStart"/>
       <w:r>
         <w:rPr>
           <w:rFonts w:ascii="Consolas" w:hAnsi="Consolas"/>
@@ -7405,6 +7898,7 @@
         <w:t>.getMessage</w:t>
       </w:r>
       <w:proofErr w:type="spellEnd"/>
+      <w:proofErr w:type="gramEnd"/>
       <w:r>
         <w:rPr>
           <w:rFonts w:ascii="Consolas" w:hAnsi="Consolas"/>
@@ -7558,6 +8052,7 @@
         <w:tab/>
       </w:r>
       <w:proofErr w:type="spellStart"/>
+      <w:proofErr w:type="gramStart"/>
       <w:r>
         <w:rPr>
           <w:rFonts w:ascii="Consolas" w:hAnsi="Consolas"/>
@@ -7577,6 +8072,7 @@
         <w:t>.rejectValue</w:t>
       </w:r>
       <w:proofErr w:type="spellEnd"/>
+      <w:proofErr w:type="gramEnd"/>
       <w:r>
         <w:rPr>
           <w:rFonts w:ascii="Consolas" w:hAnsi="Consolas"/>
@@ -7634,6 +8130,7 @@
         <w:t>"</w:t>
       </w:r>
       <w:proofErr w:type="spellStart"/>
+      <w:proofErr w:type="gramStart"/>
       <w:r>
         <w:rPr>
           <w:rFonts w:ascii="Consolas" w:hAnsi="Consolas"/>
@@ -7644,6 +8141,7 @@
         <w:t>error.enproperties</w:t>
       </w:r>
       <w:proofErr w:type="spellEnd"/>
+      <w:proofErr w:type="gramEnd"/>
       <w:r>
         <w:rPr>
           <w:rFonts w:ascii="Consolas" w:hAnsi="Consolas"/>
@@ -7663,6 +8161,7 @@
         <w:t xml:space="preserve">, </w:t>
       </w:r>
       <w:proofErr w:type="spellStart"/>
+      <w:proofErr w:type="gramStart"/>
       <w:r>
         <w:rPr>
           <w:rFonts w:ascii="Consolas" w:hAnsi="Consolas"/>
@@ -7682,6 +8181,7 @@
         <w:t>.getMessage</w:t>
       </w:r>
       <w:proofErr w:type="spellEnd"/>
+      <w:proofErr w:type="gramEnd"/>
       <w:r>
         <w:rPr>
           <w:rFonts w:ascii="Consolas" w:hAnsi="Consolas"/>
@@ -7727,9 +8227,11 @@
     <w:p/>
     <w:p>
       <w:r>
+        <w:lastRenderedPageBreak/>
         <w:t>De esta forma al validar “</w:t>
       </w:r>
       <w:proofErr w:type="spellStart"/>
+      <w:proofErr w:type="gramStart"/>
       <w:r>
         <w:rPr>
           <w:rFonts w:ascii="Consolas" w:hAnsi="Consolas"/>
@@ -7749,6 +8251,7 @@
         <w:t>.hasErrors</w:t>
       </w:r>
       <w:proofErr w:type="spellEnd"/>
+      <w:proofErr w:type="gramEnd"/>
       <w:r>
         <w:rPr>
           <w:rFonts w:ascii="Consolas" w:hAnsi="Consolas"/>
@@ -7877,13 +8380,21 @@
         <w:t xml:space="preserve"> asociados a entidades </w:t>
       </w:r>
       <w:r>
-        <w:t xml:space="preserve">tales como </w:t>
+        <w:t xml:space="preserve">tales </w:t>
+      </w:r>
+      <w:proofErr w:type="gramStart"/>
+      <w:r>
+        <w:t xml:space="preserve">como </w:t>
       </w:r>
       <w:r>
         <w:t xml:space="preserve"> </w:t>
       </w:r>
       <w:r>
-        <w:t xml:space="preserve">Curso o de </w:t>
+        <w:t>Curso</w:t>
+      </w:r>
+      <w:proofErr w:type="gramEnd"/>
+      <w:r>
+        <w:t xml:space="preserve"> o de </w:t>
       </w:r>
       <w:proofErr w:type="spellStart"/>
       <w:r>
@@ -7907,7 +8418,6 @@
     </w:p>
     <w:p>
       <w:r>
-        <w:lastRenderedPageBreak/>
         <w:t>Este servicio centraliza:</w:t>
       </w:r>
     </w:p>
@@ -8016,10 +8526,12 @@
         <w:t xml:space="preserve">de configuración </w:t>
       </w:r>
       <w:proofErr w:type="spellStart"/>
+      <w:proofErr w:type="gramStart"/>
       <w:r>
         <w:t>application.properties</w:t>
       </w:r>
       <w:proofErr w:type="spellEnd"/>
+      <w:proofErr w:type="gramEnd"/>
       <w:r>
         <w:t>.</w:t>
       </w:r>
@@ -8053,27 +8565,45 @@
           <w:bCs/>
         </w:rPr>
       </w:pPr>
-      <w:r>
-        <w:rPr>
-          <w:b/>
-          <w:bCs/>
-        </w:rPr>
-        <w:t>  Cambiar rutas sin tocar código</w:t>
-      </w:r>
-    </w:p>
-    <w:p>
-      <w:pPr>
-        <w:rPr>
-          <w:b/>
-          <w:bCs/>
-        </w:rPr>
-      </w:pPr>
-      <w:r>
-        <w:rPr>
-          <w:b/>
-          <w:bCs/>
-        </w:rPr>
-        <w:t>  Configurar rutas distintas por entorno (</w:t>
+      <w:proofErr w:type="gramStart"/>
+      <w:r>
+        <w:rPr>
+          <w:b/>
+          <w:bCs/>
+        </w:rPr>
+        <w:t>  Cambiar</w:t>
+      </w:r>
+      <w:proofErr w:type="gramEnd"/>
+      <w:r>
+        <w:rPr>
+          <w:b/>
+          <w:bCs/>
+        </w:rPr>
+        <w:t xml:space="preserve"> rutas sin tocar código</w:t>
+      </w:r>
+    </w:p>
+    <w:p>
+      <w:pPr>
+        <w:rPr>
+          <w:b/>
+          <w:bCs/>
+        </w:rPr>
+      </w:pPr>
+      <w:proofErr w:type="gramStart"/>
+      <w:r>
+        <w:rPr>
+          <w:b/>
+          <w:bCs/>
+        </w:rPr>
+        <w:t>  Configurar</w:t>
+      </w:r>
+      <w:proofErr w:type="gramEnd"/>
+      <w:r>
+        <w:rPr>
+          <w:b/>
+          <w:bCs/>
+        </w:rPr>
+        <w:t xml:space="preserve"> rutas distintas por entorno (</w:t>
       </w:r>
       <w:proofErr w:type="spellStart"/>
       <w:r>
@@ -8115,12 +8645,21 @@
           <w:bCs/>
         </w:rPr>
       </w:pPr>
-      <w:r>
-        <w:rPr>
-          <w:b/>
-          <w:bCs/>
-        </w:rPr>
-        <w:t>  Mantener el código limpio y portable</w:t>
+      <w:proofErr w:type="gramStart"/>
+      <w:r>
+        <w:rPr>
+          <w:b/>
+          <w:bCs/>
+        </w:rPr>
+        <w:t>  Mantener</w:t>
+      </w:r>
+      <w:proofErr w:type="gramEnd"/>
+      <w:r>
+        <w:rPr>
+          <w:b/>
+          <w:bCs/>
+        </w:rPr>
+        <w:t xml:space="preserve"> el código limpio y portable</w:t>
       </w:r>
     </w:p>
     <w:p>
@@ -8182,6 +8721,7 @@
           <w:b/>
           <w:bCs/>
         </w:rPr>
+        <w:lastRenderedPageBreak/>
         <w:t>1. El Problema Original</w:t>
       </w:r>
     </w:p>
@@ -8364,7 +8904,6 @@
           <w:b/>
           <w:bCs/>
         </w:rPr>
-        <w:lastRenderedPageBreak/>
         <w:t>Usamos un @ControllerAdvice para que esta herramienta esté disponible en todas las vistas sin tener que añadirla método a método en cada controlador.</w:t>
       </w:r>
     </w:p>
@@ -8438,6 +8977,7 @@
         <w:t xml:space="preserve"> </w:t>
       </w:r>
       <w:proofErr w:type="spellStart"/>
+      <w:proofErr w:type="gramStart"/>
       <w:r>
         <w:rPr>
           <w:b/>
@@ -8451,7 +8991,15 @@
           <w:b/>
           <w:bCs/>
         </w:rPr>
-        <w:t>() {</w:t>
+        <w:t>(</w:t>
+      </w:r>
+      <w:proofErr w:type="gramEnd"/>
+      <w:r>
+        <w:rPr>
+          <w:b/>
+          <w:bCs/>
+        </w:rPr>
+        <w:t>) {</w:t>
       </w:r>
     </w:p>
     <w:p>
@@ -8528,6 +9076,7 @@
         </w:rPr>
       </w:pPr>
       <w:proofErr w:type="spellStart"/>
+      <w:proofErr w:type="gramStart"/>
       <w:r>
         <w:rPr>
           <w:b/>
@@ -8541,7 +9090,15 @@
           <w:b/>
           <w:bCs/>
         </w:rPr>
-        <w:t xml:space="preserve">(): Captura la URL completa, incluyendo el </w:t>
+        <w:t>(</w:t>
+      </w:r>
+      <w:proofErr w:type="gramEnd"/>
+      <w:r>
+        <w:rPr>
+          <w:b/>
+          <w:bCs/>
+        </w:rPr>
+        <w:t xml:space="preserve">): Captura la URL completa, incluyendo el </w:t>
       </w:r>
       <w:proofErr w:type="spellStart"/>
       <w:r>
@@ -8584,12 +9141,21 @@
         <w:t>ej</w:t>
       </w:r>
       <w:proofErr w:type="spellEnd"/>
-      <w:r>
-        <w:rPr>
-          <w:b/>
-          <w:bCs/>
-        </w:rPr>
-        <w:t>: ?titulo=</w:t>
+      <w:proofErr w:type="gramStart"/>
+      <w:r>
+        <w:rPr>
+          <w:b/>
+          <w:bCs/>
+        </w:rPr>
+        <w:t>: ?titulo</w:t>
+      </w:r>
+      <w:proofErr w:type="gramEnd"/>
+      <w:r>
+        <w:rPr>
+          <w:b/>
+          <w:bCs/>
+        </w:rPr>
+        <w:t>=</w:t>
       </w:r>
       <w:proofErr w:type="spellStart"/>
       <w:r>
@@ -8677,6 +9243,7 @@
         </w:rPr>
       </w:pPr>
       <w:proofErr w:type="spellStart"/>
+      <w:proofErr w:type="gramStart"/>
       <w:r>
         <w:rPr>
           <w:b/>
@@ -8685,6 +9252,7 @@
         <w:t>th:href</w:t>
       </w:r>
       <w:proofErr w:type="spellEnd"/>
+      <w:proofErr w:type="gramEnd"/>
       <w:r>
         <w:rPr>
           <w:b/>
@@ -8722,7 +9290,15 @@
           <w:b/>
           <w:bCs/>
         </w:rPr>
-        <w:t>', 'es').</w:t>
+        <w:t>', 'es'</w:t>
+      </w:r>
+      <w:proofErr w:type="gramStart"/>
+      <w:r>
+        <w:rPr>
+          <w:b/>
+          <w:bCs/>
+        </w:rPr>
+        <w:t>).</w:t>
       </w:r>
       <w:proofErr w:type="spellStart"/>
       <w:r>
@@ -8733,6 +9309,7 @@
         <w:t>toUriString</w:t>
       </w:r>
       <w:proofErr w:type="spellEnd"/>
+      <w:proofErr w:type="gramEnd"/>
       <w:r>
         <w:rPr>
           <w:b/>
@@ -8753,6 +9330,7 @@
         </w:rPr>
       </w:pPr>
       <w:proofErr w:type="spellStart"/>
+      <w:proofErr w:type="gramStart"/>
       <w:r>
         <w:rPr>
           <w:b/>
@@ -8769,6 +9347,7 @@
         <w:t>(</w:t>
       </w:r>
       <w:proofErr w:type="spellStart"/>
+      <w:proofErr w:type="gramEnd"/>
       <w:r>
         <w:rPr>
           <w:b/>
@@ -8814,7 +9393,23 @@
           <w:b/>
           <w:bCs/>
         </w:rPr>
-        <w:t xml:space="preserve"> ya existe, lo cambia. Si no existe, lo añade. El resto de parámetros (filtros de búsqueda, nivel, etc.) se mantienen intactos.</w:t>
+        <w:t xml:space="preserve"> ya existe, lo cambia. Si no existe, lo añade. El resto de </w:t>
+      </w:r>
+      <w:proofErr w:type="gramStart"/>
+      <w:r>
+        <w:rPr>
+          <w:b/>
+          <w:bCs/>
+        </w:rPr>
+        <w:t>parámetros</w:t>
+      </w:r>
+      <w:proofErr w:type="gramEnd"/>
+      <w:r>
+        <w:rPr>
+          <w:b/>
+          <w:bCs/>
+        </w:rPr>
+        <w:t xml:space="preserve"> (filtros de búsqueda, nivel, etc.) se mantienen intactos.</w:t>
       </w:r>
     </w:p>
     <w:p>
@@ -8829,6 +9424,7 @@
         </w:rPr>
       </w:pPr>
       <w:proofErr w:type="spellStart"/>
+      <w:proofErr w:type="gramStart"/>
       <w:r>
         <w:rPr>
           <w:b/>
@@ -8842,7 +9438,15 @@
           <w:b/>
           <w:bCs/>
         </w:rPr>
-        <w:t xml:space="preserve">(): Convierte el objeto de nuevo en una cadena de texto válida para el atributo </w:t>
+        <w:t>(</w:t>
+      </w:r>
+      <w:proofErr w:type="gramEnd"/>
+      <w:r>
+        <w:rPr>
+          <w:b/>
+          <w:bCs/>
+        </w:rPr>
+        <w:t xml:space="preserve">): Convierte el objeto de nuevo en una cadena de texto válida para el atributo </w:t>
       </w:r>
       <w:proofErr w:type="spellStart"/>
       <w:r>
@@ -8949,6 +9553,7 @@
           <w:b/>
           <w:bCs/>
         </w:rPr>
+        <w:lastRenderedPageBreak/>
         <w:t>Como el peso es relativo, tu fórmula en el Java (o en la Query) será algo como:</w:t>
       </w:r>
     </w:p>
@@ -8967,6 +9572,7 @@
         <w:t>$$\</w:t>
       </w:r>
       <w:proofErr w:type="spellStart"/>
+      <w:proofErr w:type="gramStart"/>
       <w:r>
         <w:rPr>
           <w:b/>
@@ -8980,9 +9586,34 @@
           <w:b/>
           <w:bCs/>
         </w:rPr>
-        <w:t>{Progreso} = \frac{\sum (\</w:t>
-      </w:r>
-      <w:proofErr w:type="spellStart"/>
+        <w:t>{</w:t>
+      </w:r>
+      <w:proofErr w:type="gramEnd"/>
+      <w:r>
+        <w:rPr>
+          <w:b/>
+          <w:bCs/>
+        </w:rPr>
+        <w:t>Progreso} = \</w:t>
+      </w:r>
+      <w:proofErr w:type="gramStart"/>
+      <w:r>
+        <w:rPr>
+          <w:b/>
+          <w:bCs/>
+        </w:rPr>
+        <w:t>frac{</w:t>
+      </w:r>
+      <w:proofErr w:type="gramEnd"/>
+      <w:r>
+        <w:rPr>
+          <w:b/>
+          <w:bCs/>
+        </w:rPr>
+        <w:t>\sum (\</w:t>
+      </w:r>
+      <w:proofErr w:type="spellStart"/>
+      <w:proofErr w:type="gramStart"/>
       <w:r>
         <w:rPr>
           <w:b/>
@@ -8996,9 +9627,34 @@
           <w:b/>
           <w:bCs/>
         </w:rPr>
-        <w:t>{Peso de Tareas Completadas})}{\sum (\</w:t>
-      </w:r>
-      <w:proofErr w:type="spellStart"/>
+        <w:t>{</w:t>
+      </w:r>
+      <w:proofErr w:type="gramEnd"/>
+      <w:r>
+        <w:rPr>
+          <w:b/>
+          <w:bCs/>
+        </w:rPr>
+        <w:t>Peso de Tareas Completadas}</w:t>
+      </w:r>
+      <w:proofErr w:type="gramStart"/>
+      <w:r>
+        <w:rPr>
+          <w:b/>
+          <w:bCs/>
+        </w:rPr>
+        <w:t>)}{</w:t>
+      </w:r>
+      <w:proofErr w:type="gramEnd"/>
+      <w:r>
+        <w:rPr>
+          <w:b/>
+          <w:bCs/>
+        </w:rPr>
+        <w:t>\sum (\</w:t>
+      </w:r>
+      <w:proofErr w:type="spellStart"/>
+      <w:proofErr w:type="gramStart"/>
       <w:r>
         <w:rPr>
           <w:b/>
@@ -9012,7 +9668,15 @@
           <w:b/>
           <w:bCs/>
         </w:rPr>
-        <w:t>{Peso Total de Tareas del Curso})} \times 100$$</w:t>
+        <w:t>{</w:t>
+      </w:r>
+      <w:proofErr w:type="gramEnd"/>
+      <w:r>
+        <w:rPr>
+          <w:b/>
+          <w:bCs/>
+        </w:rPr>
+        <w:t>Peso Total de Tareas del Curso})} \times 100$$</w:t>
       </w:r>
     </w:p>
     <w:p>
@@ -9171,6 +9835,7 @@
         <w:t xml:space="preserve"> </w:t>
       </w:r>
       <w:proofErr w:type="spellStart"/>
+      <w:proofErr w:type="gramStart"/>
       <w:r>
         <w:rPr>
           <w:b/>
@@ -9179,6 +9844,7 @@
         <w:t>th:if</w:t>
       </w:r>
       <w:proofErr w:type="spellEnd"/>
+      <w:proofErr w:type="gramEnd"/>
       <w:r>
         <w:rPr>
           <w:b/>
@@ -9187,6 +9853,7 @@
         <w:t>="${</w:t>
       </w:r>
       <w:proofErr w:type="spellStart"/>
+      <w:proofErr w:type="gramStart"/>
       <w:r>
         <w:rPr>
           <w:b/>
@@ -9195,6 +9862,7 @@
         <w:t>curso.progreso</w:t>
       </w:r>
       <w:proofErr w:type="spellEnd"/>
+      <w:proofErr w:type="gramEnd"/>
       <w:r>
         <w:rPr>
           <w:b/>
@@ -9436,8 +10104,854 @@
           <w:b/>
           <w:bCs/>
         </w:rPr>
+        <w:t xml:space="preserve">    &lt;/</w:t>
+      </w:r>
+      <w:proofErr w:type="spellStart"/>
+      <w:r>
+        <w:rPr>
+          <w:b/>
+          <w:bCs/>
+        </w:rPr>
+        <w:t>div</w:t>
+      </w:r>
+      <w:proofErr w:type="spellEnd"/>
+      <w:r>
+        <w:rPr>
+          <w:b/>
+          <w:bCs/>
+        </w:rPr>
+        <w:t>&gt;</w:t>
+      </w:r>
+    </w:p>
+    <w:p>
+      <w:pPr>
+        <w:rPr>
+          <w:b/>
+          <w:bCs/>
+        </w:rPr>
+      </w:pPr>
+    </w:p>
+    <w:p>
+      <w:pPr>
+        <w:rPr>
+          <w:b/>
+          <w:bCs/>
+        </w:rPr>
+      </w:pPr>
+      <w:r>
+        <w:rPr>
+          <w:b/>
+          <w:bCs/>
+        </w:rPr>
+        <w:t xml:space="preserve">    &lt;</w:t>
+      </w:r>
+      <w:proofErr w:type="spellStart"/>
+      <w:r>
+        <w:rPr>
+          <w:b/>
+          <w:bCs/>
+        </w:rPr>
+        <w:t>div</w:t>
+      </w:r>
+      <w:proofErr w:type="spellEnd"/>
+      <w:r>
+        <w:rPr>
+          <w:b/>
+          <w:bCs/>
+        </w:rPr>
+        <w:t xml:space="preserve"> </w:t>
+      </w:r>
+      <w:proofErr w:type="spellStart"/>
+      <w:proofErr w:type="gramStart"/>
+      <w:r>
+        <w:rPr>
+          <w:b/>
+          <w:bCs/>
+        </w:rPr>
+        <w:t>th:if</w:t>
+      </w:r>
+      <w:proofErr w:type="spellEnd"/>
+      <w:proofErr w:type="gramEnd"/>
+      <w:r>
+        <w:rPr>
+          <w:b/>
+          <w:bCs/>
+        </w:rPr>
+        <w:t>="${</w:t>
+      </w:r>
+      <w:proofErr w:type="spellStart"/>
+      <w:proofErr w:type="gramStart"/>
+      <w:r>
+        <w:rPr>
+          <w:b/>
+          <w:bCs/>
+        </w:rPr>
+        <w:t>curso.progreso</w:t>
+      </w:r>
+      <w:proofErr w:type="spellEnd"/>
+      <w:proofErr w:type="gramEnd"/>
+      <w:r>
+        <w:rPr>
+          <w:b/>
+          <w:bCs/>
+        </w:rPr>
+        <w:t xml:space="preserve"> &lt; 100}"&gt;</w:t>
+      </w:r>
+    </w:p>
+    <w:p>
+      <w:pPr>
+        <w:rPr>
+          <w:b/>
+          <w:bCs/>
+        </w:rPr>
+      </w:pPr>
+      <w:r>
+        <w:rPr>
+          <w:b/>
+          <w:bCs/>
+        </w:rPr>
+        <w:t xml:space="preserve">        &lt;a </w:t>
+      </w:r>
+      <w:proofErr w:type="spellStart"/>
+      <w:proofErr w:type="gramStart"/>
+      <w:r>
+        <w:rPr>
+          <w:b/>
+          <w:bCs/>
+        </w:rPr>
+        <w:t>th:href</w:t>
+      </w:r>
+      <w:proofErr w:type="spellEnd"/>
+      <w:proofErr w:type="gramEnd"/>
+      <w:r>
+        <w:rPr>
+          <w:b/>
+          <w:bCs/>
+        </w:rPr>
+        <w:t>="@{/cursos/continuar/{id}(id=${</w:t>
+      </w:r>
+      <w:proofErr w:type="spellStart"/>
+      <w:r>
+        <w:rPr>
+          <w:b/>
+          <w:bCs/>
+        </w:rPr>
+        <w:t>curso.id</w:t>
+      </w:r>
+      <w:proofErr w:type="spellEnd"/>
+      <w:r>
+        <w:rPr>
+          <w:b/>
+          <w:bCs/>
+        </w:rPr>
+        <w:t xml:space="preserve">})}" </w:t>
+      </w:r>
+      <w:proofErr w:type="spellStart"/>
+      <w:r>
+        <w:rPr>
+          <w:b/>
+          <w:bCs/>
+        </w:rPr>
+        <w:t>class</w:t>
+      </w:r>
+      <w:proofErr w:type="spellEnd"/>
+      <w:r>
+        <w:rPr>
+          <w:b/>
+          <w:bCs/>
+        </w:rPr>
+        <w:t>="</w:t>
+      </w:r>
+      <w:proofErr w:type="spellStart"/>
+      <w:r>
+        <w:rPr>
+          <w:b/>
+          <w:bCs/>
+        </w:rPr>
+        <w:t>btn</w:t>
+      </w:r>
+      <w:proofErr w:type="spellEnd"/>
+      <w:r>
+        <w:rPr>
+          <w:b/>
+          <w:bCs/>
+        </w:rPr>
+        <w:t xml:space="preserve"> </w:t>
+      </w:r>
+      <w:proofErr w:type="spellStart"/>
+      <w:r>
+        <w:rPr>
+          <w:b/>
+          <w:bCs/>
+        </w:rPr>
+        <w:t>btn-primary</w:t>
+      </w:r>
+      <w:proofErr w:type="spellEnd"/>
+      <w:r>
+        <w:rPr>
+          <w:b/>
+          <w:bCs/>
+        </w:rPr>
+        <w:t xml:space="preserve"> w-100"&gt;</w:t>
+      </w:r>
+    </w:p>
+    <w:p>
+      <w:pPr>
+        <w:rPr>
+          <w:b/>
+          <w:bCs/>
+        </w:rPr>
+      </w:pPr>
+      <w:r>
+        <w:rPr>
+          <w:b/>
+          <w:bCs/>
+        </w:rPr>
+        <w:t xml:space="preserve">            &lt;i </w:t>
+      </w:r>
+      <w:proofErr w:type="spellStart"/>
+      <w:r>
+        <w:rPr>
+          <w:b/>
+          <w:bCs/>
+        </w:rPr>
+        <w:t>class</w:t>
+      </w:r>
+      <w:proofErr w:type="spellEnd"/>
+      <w:r>
+        <w:rPr>
+          <w:b/>
+          <w:bCs/>
+        </w:rPr>
+        <w:t>="</w:t>
+      </w:r>
+      <w:proofErr w:type="spellStart"/>
+      <w:r>
+        <w:rPr>
+          <w:b/>
+          <w:bCs/>
+        </w:rPr>
+        <w:t>bi</w:t>
+      </w:r>
+      <w:proofErr w:type="spellEnd"/>
+      <w:r>
+        <w:rPr>
+          <w:b/>
+          <w:bCs/>
+        </w:rPr>
+        <w:t xml:space="preserve"> </w:t>
+      </w:r>
+      <w:proofErr w:type="spellStart"/>
+      <w:r>
+        <w:rPr>
+          <w:b/>
+          <w:bCs/>
+        </w:rPr>
+        <w:t>bi-play-circle</w:t>
+      </w:r>
+      <w:proofErr w:type="spellEnd"/>
+      <w:r>
+        <w:rPr>
+          <w:b/>
+          <w:bCs/>
+        </w:rPr>
+        <w:t xml:space="preserve"> me-2"&gt;&lt;/i&gt; Continuar aprendiendo</w:t>
+      </w:r>
+    </w:p>
+    <w:p>
+      <w:pPr>
+        <w:rPr>
+          <w:b/>
+          <w:bCs/>
+        </w:rPr>
+      </w:pPr>
+      <w:r>
+        <w:rPr>
+          <w:b/>
+          <w:bCs/>
+        </w:rPr>
+        <w:t xml:space="preserve">        &lt;/a&gt;</w:t>
+      </w:r>
+    </w:p>
+    <w:p>
+      <w:pPr>
+        <w:rPr>
+          <w:b/>
+          <w:bCs/>
+        </w:rPr>
+      </w:pPr>
+      <w:r>
+        <w:rPr>
+          <w:b/>
+          <w:bCs/>
+        </w:rPr>
+        <w:t xml:space="preserve">        </w:t>
+      </w:r>
+    </w:p>
+    <w:p>
+      <w:pPr>
+        <w:rPr>
+          <w:b/>
+          <w:bCs/>
+        </w:rPr>
+      </w:pPr>
+      <w:r>
+        <w:rPr>
+          <w:b/>
+          <w:bCs/>
+        </w:rPr>
+        <w:t xml:space="preserve">        &lt;p </w:t>
+      </w:r>
+      <w:proofErr w:type="spellStart"/>
+      <w:proofErr w:type="gramStart"/>
+      <w:r>
+        <w:rPr>
+          <w:b/>
+          <w:bCs/>
+        </w:rPr>
+        <w:t>th:if</w:t>
+      </w:r>
+      <w:proofErr w:type="spellEnd"/>
+      <w:proofErr w:type="gramEnd"/>
+      <w:r>
+        <w:rPr>
+          <w:b/>
+          <w:bCs/>
+        </w:rPr>
+        <w:t>="${</w:t>
+      </w:r>
+      <w:proofErr w:type="spellStart"/>
+      <w:proofErr w:type="gramStart"/>
+      <w:r>
+        <w:rPr>
+          <w:b/>
+          <w:bCs/>
+        </w:rPr>
+        <w:t>curso.tieneTareaPendiente</w:t>
+      </w:r>
+      <w:proofErr w:type="spellEnd"/>
+      <w:proofErr w:type="gramEnd"/>
+      <w:r>
+        <w:rPr>
+          <w:b/>
+          <w:bCs/>
+        </w:rPr>
+        <w:t xml:space="preserve">}" </w:t>
+      </w:r>
+      <w:proofErr w:type="spellStart"/>
+      <w:r>
+        <w:rPr>
+          <w:b/>
+          <w:bCs/>
+        </w:rPr>
+        <w:t>class</w:t>
+      </w:r>
+      <w:proofErr w:type="spellEnd"/>
+      <w:r>
+        <w:rPr>
+          <w:b/>
+          <w:bCs/>
+        </w:rPr>
+        <w:t>="</w:t>
+      </w:r>
+      <w:proofErr w:type="spellStart"/>
+      <w:r>
+        <w:rPr>
+          <w:b/>
+          <w:bCs/>
+        </w:rPr>
+        <w:t>text-muted</w:t>
+      </w:r>
+      <w:proofErr w:type="spellEnd"/>
+      <w:r>
+        <w:rPr>
+          <w:b/>
+          <w:bCs/>
+        </w:rPr>
+        <w:t xml:space="preserve"> </w:t>
+      </w:r>
+      <w:proofErr w:type="spellStart"/>
+      <w:r>
+        <w:rPr>
+          <w:b/>
+          <w:bCs/>
+        </w:rPr>
+        <w:t>small</w:t>
+      </w:r>
+      <w:proofErr w:type="spellEnd"/>
+      <w:r>
+        <w:rPr>
+          <w:b/>
+          <w:bCs/>
+        </w:rPr>
+        <w:t xml:space="preserve"> mt-1 mb-0 </w:t>
+      </w:r>
+      <w:proofErr w:type="spellStart"/>
+      <w:r>
+        <w:rPr>
+          <w:b/>
+          <w:bCs/>
+        </w:rPr>
+        <w:t>text</w:t>
+      </w:r>
+      <w:proofErr w:type="spellEnd"/>
+      <w:r>
+        <w:rPr>
+          <w:b/>
+          <w:bCs/>
+        </w:rPr>
+        <w:t>-center"&gt;</w:t>
+      </w:r>
+    </w:p>
+    <w:p>
+      <w:pPr>
+        <w:rPr>
+          <w:b/>
+          <w:bCs/>
+        </w:rPr>
+      </w:pPr>
+      <w:r>
+        <w:rPr>
+          <w:b/>
+          <w:bCs/>
+        </w:rPr>
+        <w:t xml:space="preserve">            &lt;i </w:t>
+      </w:r>
+      <w:proofErr w:type="spellStart"/>
+      <w:r>
+        <w:rPr>
+          <w:b/>
+          <w:bCs/>
+        </w:rPr>
+        <w:t>class</w:t>
+      </w:r>
+      <w:proofErr w:type="spellEnd"/>
+      <w:r>
+        <w:rPr>
+          <w:b/>
+          <w:bCs/>
+        </w:rPr>
+        <w:t>="</w:t>
+      </w:r>
+      <w:proofErr w:type="spellStart"/>
+      <w:r>
+        <w:rPr>
+          <w:b/>
+          <w:bCs/>
+        </w:rPr>
+        <w:t>bi</w:t>
+      </w:r>
+      <w:proofErr w:type="spellEnd"/>
+      <w:r>
+        <w:rPr>
+          <w:b/>
+          <w:bCs/>
+        </w:rPr>
+        <w:t xml:space="preserve"> </w:t>
+      </w:r>
+      <w:proofErr w:type="spellStart"/>
+      <w:r>
+        <w:rPr>
+          <w:b/>
+          <w:bCs/>
+        </w:rPr>
+        <w:t>bi-clock-history</w:t>
+      </w:r>
+      <w:proofErr w:type="spellEnd"/>
+      <w:r>
+        <w:rPr>
+          <w:b/>
+          <w:bCs/>
+        </w:rPr>
+        <w:t>"&gt;&lt;/i&gt; Esperando nota del profesor...</w:t>
+      </w:r>
+    </w:p>
+    <w:p>
+      <w:pPr>
+        <w:rPr>
+          <w:b/>
+          <w:bCs/>
+        </w:rPr>
+      </w:pPr>
+      <w:r>
+        <w:rPr>
+          <w:b/>
+          <w:bCs/>
+        </w:rPr>
+        <w:t xml:space="preserve">        &lt;/p&gt;</w:t>
+      </w:r>
+    </w:p>
+    <w:p>
+      <w:pPr>
+        <w:rPr>
+          <w:b/>
+          <w:bCs/>
+        </w:rPr>
+      </w:pPr>
+      <w:r>
+        <w:rPr>
+          <w:b/>
+          <w:bCs/>
+        </w:rPr>
+        <w:t xml:space="preserve">    &lt;/</w:t>
+      </w:r>
+      <w:proofErr w:type="spellStart"/>
+      <w:r>
+        <w:rPr>
+          <w:b/>
+          <w:bCs/>
+        </w:rPr>
+        <w:t>div</w:t>
+      </w:r>
+      <w:proofErr w:type="spellEnd"/>
+      <w:r>
+        <w:rPr>
+          <w:b/>
+          <w:bCs/>
+        </w:rPr>
+        <w:t>&gt;</w:t>
+      </w:r>
+    </w:p>
+    <w:p>
+      <w:pPr>
+        <w:rPr>
+          <w:b/>
+          <w:bCs/>
+        </w:rPr>
+      </w:pPr>
+    </w:p>
+    <w:p>
+      <w:pPr>
+        <w:rPr>
+          <w:b/>
+          <w:bCs/>
+        </w:rPr>
+      </w:pPr>
+      <w:r>
+        <w:rPr>
+          <w:b/>
+          <w:bCs/>
+        </w:rPr>
+        <w:t>&lt;/</w:t>
+      </w:r>
+      <w:proofErr w:type="spellStart"/>
+      <w:r>
+        <w:rPr>
+          <w:b/>
+          <w:bCs/>
+        </w:rPr>
+        <w:t>div</w:t>
+      </w:r>
+      <w:proofErr w:type="spellEnd"/>
+      <w:r>
+        <w:rPr>
+          <w:b/>
+          <w:bCs/>
+        </w:rPr>
+        <w:t>&gt;</w:t>
+      </w:r>
+    </w:p>
+    <w:p>
+      <w:pPr>
+        <w:rPr>
+          <w:b/>
+          <w:bCs/>
+        </w:rPr>
+      </w:pPr>
+      <w:r>
+        <w:rPr>
+          <w:b/>
+          <w:bCs/>
+        </w:rPr>
+        <w:t>3. La Barra de Progreso con "Hitos"</w:t>
+      </w:r>
+    </w:p>
+    <w:p>
+      <w:pPr>
+        <w:rPr>
+          <w:b/>
+          <w:bCs/>
+        </w:rPr>
+      </w:pPr>
+      <w:r>
+        <w:rPr>
+          <w:b/>
+          <w:bCs/>
+        </w:rPr>
+        <w:t>Dado que usas módulos con peso, la barra de progreso "Slim" que comentamos antes se verá muy bien. Si quieres que sea más informativa, puedes añadir un pequeño efecto visual para indicar que hay algo "pendiente":</w:t>
+      </w:r>
+    </w:p>
+    <w:p>
+      <w:pPr>
+        <w:rPr>
+          <w:b/>
+          <w:bCs/>
+        </w:rPr>
+      </w:pPr>
+      <w:r>
+        <w:rPr>
+          <w:b/>
+          <w:bCs/>
+        </w:rPr>
+        <w:t>HTML</w:t>
+      </w:r>
+    </w:p>
+    <w:p>
+      <w:pPr>
+        <w:rPr>
+          <w:b/>
+          <w:bCs/>
+        </w:rPr>
+      </w:pPr>
+      <w:r>
+        <w:rPr>
+          <w:b/>
+          <w:bCs/>
+        </w:rPr>
+        <w:t>&lt;</w:t>
+      </w:r>
+      <w:proofErr w:type="spellStart"/>
+      <w:r>
+        <w:rPr>
+          <w:b/>
+          <w:bCs/>
+        </w:rPr>
+        <w:t>div</w:t>
+      </w:r>
+      <w:proofErr w:type="spellEnd"/>
+      <w:r>
+        <w:rPr>
+          <w:b/>
+          <w:bCs/>
+        </w:rPr>
+        <w:t xml:space="preserve"> </w:t>
+      </w:r>
+      <w:proofErr w:type="spellStart"/>
+      <w:r>
+        <w:rPr>
+          <w:b/>
+          <w:bCs/>
+        </w:rPr>
+        <w:t>class</w:t>
+      </w:r>
+      <w:proofErr w:type="spellEnd"/>
+      <w:r>
+        <w:rPr>
+          <w:b/>
+          <w:bCs/>
+        </w:rPr>
+        <w:t>="</w:t>
+      </w:r>
+      <w:proofErr w:type="spellStart"/>
+      <w:r>
+        <w:rPr>
+          <w:b/>
+          <w:bCs/>
+        </w:rPr>
+        <w:t>progress</w:t>
+      </w:r>
+      <w:proofErr w:type="spellEnd"/>
+      <w:r>
+        <w:rPr>
+          <w:b/>
+          <w:bCs/>
+        </w:rPr>
+        <w:t xml:space="preserve">" </w:t>
+      </w:r>
+      <w:proofErr w:type="spellStart"/>
+      <w:r>
+        <w:rPr>
+          <w:b/>
+          <w:bCs/>
+        </w:rPr>
+        <w:t>style</w:t>
+      </w:r>
+      <w:proofErr w:type="spellEnd"/>
+      <w:r>
+        <w:rPr>
+          <w:b/>
+          <w:bCs/>
+        </w:rPr>
+        <w:t>="</w:t>
+      </w:r>
+      <w:proofErr w:type="spellStart"/>
+      <w:r>
+        <w:rPr>
+          <w:b/>
+          <w:bCs/>
+        </w:rPr>
+        <w:t>height</w:t>
+      </w:r>
+      <w:proofErr w:type="spellEnd"/>
+      <w:r>
+        <w:rPr>
+          <w:b/>
+          <w:bCs/>
+        </w:rPr>
+        <w:t xml:space="preserve">: 6px; </w:t>
+      </w:r>
+      <w:proofErr w:type="spellStart"/>
+      <w:r>
+        <w:rPr>
+          <w:b/>
+          <w:bCs/>
+        </w:rPr>
+        <w:t>border-radius</w:t>
+      </w:r>
+      <w:proofErr w:type="spellEnd"/>
+      <w:r>
+        <w:rPr>
+          <w:b/>
+          <w:bCs/>
+        </w:rPr>
+        <w:t>: 0;"&gt;</w:t>
+      </w:r>
+    </w:p>
+    <w:p>
+      <w:pPr>
+        <w:rPr>
+          <w:b/>
+          <w:bCs/>
+        </w:rPr>
+      </w:pPr>
+      <w:r>
+        <w:rPr>
+          <w:b/>
+          <w:bCs/>
+        </w:rPr>
+        <w:t xml:space="preserve">    &lt;</w:t>
+      </w:r>
+      <w:proofErr w:type="spellStart"/>
+      <w:r>
+        <w:rPr>
+          <w:b/>
+          <w:bCs/>
+        </w:rPr>
+        <w:t>div</w:t>
+      </w:r>
+      <w:proofErr w:type="spellEnd"/>
+      <w:r>
+        <w:rPr>
+          <w:b/>
+          <w:bCs/>
+        </w:rPr>
+        <w:t xml:space="preserve"> </w:t>
+      </w:r>
+      <w:proofErr w:type="spellStart"/>
+      <w:r>
+        <w:rPr>
+          <w:b/>
+          <w:bCs/>
+        </w:rPr>
+        <w:t>class</w:t>
+      </w:r>
+      <w:proofErr w:type="spellEnd"/>
+      <w:r>
+        <w:rPr>
+          <w:b/>
+          <w:bCs/>
+        </w:rPr>
+        <w:t>="</w:t>
+      </w:r>
+      <w:proofErr w:type="spellStart"/>
+      <w:r>
+        <w:rPr>
+          <w:b/>
+          <w:bCs/>
+        </w:rPr>
+        <w:t>progress</w:t>
+      </w:r>
+      <w:proofErr w:type="spellEnd"/>
+      <w:r>
+        <w:rPr>
+          <w:b/>
+          <w:bCs/>
+        </w:rPr>
+        <w:t xml:space="preserve">-bar </w:t>
+      </w:r>
+      <w:proofErr w:type="spellStart"/>
+      <w:r>
+        <w:rPr>
+          <w:b/>
+          <w:bCs/>
+        </w:rPr>
+        <w:t>bg-primary</w:t>
+      </w:r>
+      <w:proofErr w:type="spellEnd"/>
+      <w:r>
+        <w:rPr>
+          <w:b/>
+          <w:bCs/>
+        </w:rPr>
+        <w:t xml:space="preserve">" </w:t>
+      </w:r>
+    </w:p>
+    <w:p>
+      <w:pPr>
+        <w:rPr>
+          <w:b/>
+          <w:bCs/>
+        </w:rPr>
+      </w:pPr>
+      <w:r>
+        <w:rPr>
+          <w:b/>
+          <w:bCs/>
+        </w:rPr>
         <w:lastRenderedPageBreak/>
-        <w:t xml:space="preserve">    &lt;/</w:t>
+        <w:t xml:space="preserve">         </w:t>
+      </w:r>
+      <w:proofErr w:type="spellStart"/>
+      <w:proofErr w:type="gramStart"/>
+      <w:r>
+        <w:rPr>
+          <w:b/>
+          <w:bCs/>
+        </w:rPr>
+        <w:t>th:style</w:t>
+      </w:r>
+      <w:proofErr w:type="spellEnd"/>
+      <w:proofErr w:type="gramEnd"/>
+      <w:r>
+        <w:rPr>
+          <w:b/>
+          <w:bCs/>
+        </w:rPr>
+        <w:t>="'</w:t>
+      </w:r>
+      <w:proofErr w:type="spellStart"/>
+      <w:r>
+        <w:rPr>
+          <w:b/>
+          <w:bCs/>
+        </w:rPr>
+        <w:t>width</w:t>
+      </w:r>
+      <w:proofErr w:type="spellEnd"/>
+      <w:r>
+        <w:rPr>
+          <w:b/>
+          <w:bCs/>
+        </w:rPr>
+        <w:t>: ' + ${</w:t>
+      </w:r>
+      <w:proofErr w:type="spellStart"/>
+      <w:proofErr w:type="gramStart"/>
+      <w:r>
+        <w:rPr>
+          <w:b/>
+          <w:bCs/>
+        </w:rPr>
+        <w:t>curso.progreso</w:t>
+      </w:r>
+      <w:proofErr w:type="spellEnd"/>
+      <w:proofErr w:type="gramEnd"/>
+      <w:r>
+        <w:rPr>
+          <w:b/>
+          <w:bCs/>
+        </w:rPr>
+        <w:t>} + '%'"&gt;&lt;/</w:t>
       </w:r>
       <w:proofErr w:type="spellStart"/>
       <w:r>
@@ -9463,6 +10977,13 @@
           <w:bCs/>
         </w:rPr>
       </w:pPr>
+      <w:r>
+        <w:rPr>
+          <w:b/>
+          <w:bCs/>
+        </w:rPr>
+        <w:t xml:space="preserve">    </w:t>
+      </w:r>
     </w:p>
     <w:p>
       <w:pPr>
@@ -9495,6 +11016,7 @@
         <w:t xml:space="preserve"> </w:t>
       </w:r>
       <w:proofErr w:type="spellStart"/>
+      <w:proofErr w:type="gramStart"/>
       <w:r>
         <w:rPr>
           <w:b/>
@@ -9503,6 +11025,7 @@
         <w:t>th:if</w:t>
       </w:r>
       <w:proofErr w:type="spellEnd"/>
+      <w:proofErr w:type="gramEnd"/>
       <w:r>
         <w:rPr>
           <w:b/>
@@ -9511,67 +11034,37 @@
         <w:t>="${</w:t>
       </w:r>
       <w:proofErr w:type="spellStart"/>
-      <w:r>
-        <w:rPr>
-          <w:b/>
-          <w:bCs/>
-        </w:rPr>
-        <w:t>curso.progreso</w:t>
-      </w:r>
-      <w:proofErr w:type="spellEnd"/>
-      <w:r>
-        <w:rPr>
-          <w:b/>
-          <w:bCs/>
-        </w:rPr>
-        <w:t xml:space="preserve"> &lt; 100}"&gt;</w:t>
-      </w:r>
-    </w:p>
-    <w:p>
-      <w:pPr>
-        <w:rPr>
-          <w:b/>
-          <w:bCs/>
-        </w:rPr>
-      </w:pPr>
-      <w:r>
-        <w:rPr>
-          <w:b/>
-          <w:bCs/>
-        </w:rPr>
-        <w:t xml:space="preserve">        &lt;a </w:t>
-      </w:r>
-      <w:proofErr w:type="spellStart"/>
-      <w:r>
-        <w:rPr>
-          <w:b/>
-          <w:bCs/>
-        </w:rPr>
-        <w:t>th:href</w:t>
-      </w:r>
-      <w:proofErr w:type="spellEnd"/>
-      <w:r>
-        <w:rPr>
-          <w:b/>
-          <w:bCs/>
-        </w:rPr>
-        <w:t>="@{/cursos/continuar/{id}(id=${</w:t>
-      </w:r>
-      <w:proofErr w:type="spellStart"/>
-      <w:r>
-        <w:rPr>
-          <w:b/>
-          <w:bCs/>
-        </w:rPr>
-        <w:t>curso.id</w:t>
-      </w:r>
-      <w:proofErr w:type="spellEnd"/>
-      <w:r>
-        <w:rPr>
-          <w:b/>
-          <w:bCs/>
-        </w:rPr>
-        <w:t xml:space="preserve">})}" </w:t>
+      <w:proofErr w:type="gramStart"/>
+      <w:r>
+        <w:rPr>
+          <w:b/>
+          <w:bCs/>
+        </w:rPr>
+        <w:t>curso.progresoPendiente</w:t>
+      </w:r>
+      <w:proofErr w:type="spellEnd"/>
+      <w:proofErr w:type="gramEnd"/>
+      <w:r>
+        <w:rPr>
+          <w:b/>
+          <w:bCs/>
+        </w:rPr>
+        <w:t xml:space="preserve"> &gt; 0}" </w:t>
+      </w:r>
+    </w:p>
+    <w:p>
+      <w:pPr>
+        <w:rPr>
+          <w:b/>
+          <w:bCs/>
+        </w:rPr>
+      </w:pPr>
+      <w:r>
+        <w:rPr>
+          <w:b/>
+          <w:bCs/>
+        </w:rPr>
+        <w:t xml:space="preserve">         </w:t>
       </w:r>
       <w:proofErr w:type="spellStart"/>
       <w:r>
@@ -9595,482 +11088,6 @@
           <w:b/>
           <w:bCs/>
         </w:rPr>
-        <w:t>btn</w:t>
-      </w:r>
-      <w:proofErr w:type="spellEnd"/>
-      <w:r>
-        <w:rPr>
-          <w:b/>
-          <w:bCs/>
-        </w:rPr>
-        <w:t xml:space="preserve"> </w:t>
-      </w:r>
-      <w:proofErr w:type="spellStart"/>
-      <w:r>
-        <w:rPr>
-          <w:b/>
-          <w:bCs/>
-        </w:rPr>
-        <w:t>btn-primary</w:t>
-      </w:r>
-      <w:proofErr w:type="spellEnd"/>
-      <w:r>
-        <w:rPr>
-          <w:b/>
-          <w:bCs/>
-        </w:rPr>
-        <w:t xml:space="preserve"> w-100"&gt;</w:t>
-      </w:r>
-    </w:p>
-    <w:p>
-      <w:pPr>
-        <w:rPr>
-          <w:b/>
-          <w:bCs/>
-        </w:rPr>
-      </w:pPr>
-      <w:r>
-        <w:rPr>
-          <w:b/>
-          <w:bCs/>
-        </w:rPr>
-        <w:t xml:space="preserve">            &lt;i </w:t>
-      </w:r>
-      <w:proofErr w:type="spellStart"/>
-      <w:r>
-        <w:rPr>
-          <w:b/>
-          <w:bCs/>
-        </w:rPr>
-        <w:t>class</w:t>
-      </w:r>
-      <w:proofErr w:type="spellEnd"/>
-      <w:r>
-        <w:rPr>
-          <w:b/>
-          <w:bCs/>
-        </w:rPr>
-        <w:t>="</w:t>
-      </w:r>
-      <w:proofErr w:type="spellStart"/>
-      <w:r>
-        <w:rPr>
-          <w:b/>
-          <w:bCs/>
-        </w:rPr>
-        <w:t>bi</w:t>
-      </w:r>
-      <w:proofErr w:type="spellEnd"/>
-      <w:r>
-        <w:rPr>
-          <w:b/>
-          <w:bCs/>
-        </w:rPr>
-        <w:t xml:space="preserve"> </w:t>
-      </w:r>
-      <w:proofErr w:type="spellStart"/>
-      <w:r>
-        <w:rPr>
-          <w:b/>
-          <w:bCs/>
-        </w:rPr>
-        <w:t>bi-play-circle</w:t>
-      </w:r>
-      <w:proofErr w:type="spellEnd"/>
-      <w:r>
-        <w:rPr>
-          <w:b/>
-          <w:bCs/>
-        </w:rPr>
-        <w:t xml:space="preserve"> me-2"&gt;&lt;/i&gt; Continuar aprendiendo</w:t>
-      </w:r>
-    </w:p>
-    <w:p>
-      <w:pPr>
-        <w:rPr>
-          <w:b/>
-          <w:bCs/>
-        </w:rPr>
-      </w:pPr>
-      <w:r>
-        <w:rPr>
-          <w:b/>
-          <w:bCs/>
-        </w:rPr>
-        <w:t xml:space="preserve">        &lt;/a&gt;</w:t>
-      </w:r>
-    </w:p>
-    <w:p>
-      <w:pPr>
-        <w:rPr>
-          <w:b/>
-          <w:bCs/>
-        </w:rPr>
-      </w:pPr>
-      <w:r>
-        <w:rPr>
-          <w:b/>
-          <w:bCs/>
-        </w:rPr>
-        <w:t xml:space="preserve">        </w:t>
-      </w:r>
-    </w:p>
-    <w:p>
-      <w:pPr>
-        <w:rPr>
-          <w:b/>
-          <w:bCs/>
-        </w:rPr>
-      </w:pPr>
-      <w:r>
-        <w:rPr>
-          <w:b/>
-          <w:bCs/>
-        </w:rPr>
-        <w:t xml:space="preserve">        &lt;p </w:t>
-      </w:r>
-      <w:proofErr w:type="spellStart"/>
-      <w:r>
-        <w:rPr>
-          <w:b/>
-          <w:bCs/>
-        </w:rPr>
-        <w:t>th:if</w:t>
-      </w:r>
-      <w:proofErr w:type="spellEnd"/>
-      <w:r>
-        <w:rPr>
-          <w:b/>
-          <w:bCs/>
-        </w:rPr>
-        <w:t>="${</w:t>
-      </w:r>
-      <w:proofErr w:type="spellStart"/>
-      <w:r>
-        <w:rPr>
-          <w:b/>
-          <w:bCs/>
-        </w:rPr>
-        <w:t>curso.tieneTareaPendiente</w:t>
-      </w:r>
-      <w:proofErr w:type="spellEnd"/>
-      <w:r>
-        <w:rPr>
-          <w:b/>
-          <w:bCs/>
-        </w:rPr>
-        <w:t xml:space="preserve">}" </w:t>
-      </w:r>
-      <w:proofErr w:type="spellStart"/>
-      <w:r>
-        <w:rPr>
-          <w:b/>
-          <w:bCs/>
-        </w:rPr>
-        <w:t>class</w:t>
-      </w:r>
-      <w:proofErr w:type="spellEnd"/>
-      <w:r>
-        <w:rPr>
-          <w:b/>
-          <w:bCs/>
-        </w:rPr>
-        <w:t>="</w:t>
-      </w:r>
-      <w:proofErr w:type="spellStart"/>
-      <w:r>
-        <w:rPr>
-          <w:b/>
-          <w:bCs/>
-        </w:rPr>
-        <w:t>text-muted</w:t>
-      </w:r>
-      <w:proofErr w:type="spellEnd"/>
-      <w:r>
-        <w:rPr>
-          <w:b/>
-          <w:bCs/>
-        </w:rPr>
-        <w:t xml:space="preserve"> </w:t>
-      </w:r>
-      <w:proofErr w:type="spellStart"/>
-      <w:r>
-        <w:rPr>
-          <w:b/>
-          <w:bCs/>
-        </w:rPr>
-        <w:t>small</w:t>
-      </w:r>
-      <w:proofErr w:type="spellEnd"/>
-      <w:r>
-        <w:rPr>
-          <w:b/>
-          <w:bCs/>
-        </w:rPr>
-        <w:t xml:space="preserve"> mt-1 mb-0 </w:t>
-      </w:r>
-      <w:proofErr w:type="spellStart"/>
-      <w:r>
-        <w:rPr>
-          <w:b/>
-          <w:bCs/>
-        </w:rPr>
-        <w:t>text</w:t>
-      </w:r>
-      <w:proofErr w:type="spellEnd"/>
-      <w:r>
-        <w:rPr>
-          <w:b/>
-          <w:bCs/>
-        </w:rPr>
-        <w:t>-center"&gt;</w:t>
-      </w:r>
-    </w:p>
-    <w:p>
-      <w:pPr>
-        <w:rPr>
-          <w:b/>
-          <w:bCs/>
-        </w:rPr>
-      </w:pPr>
-      <w:r>
-        <w:rPr>
-          <w:b/>
-          <w:bCs/>
-        </w:rPr>
-        <w:t xml:space="preserve">            &lt;i </w:t>
-      </w:r>
-      <w:proofErr w:type="spellStart"/>
-      <w:r>
-        <w:rPr>
-          <w:b/>
-          <w:bCs/>
-        </w:rPr>
-        <w:t>class</w:t>
-      </w:r>
-      <w:proofErr w:type="spellEnd"/>
-      <w:r>
-        <w:rPr>
-          <w:b/>
-          <w:bCs/>
-        </w:rPr>
-        <w:t>="</w:t>
-      </w:r>
-      <w:proofErr w:type="spellStart"/>
-      <w:r>
-        <w:rPr>
-          <w:b/>
-          <w:bCs/>
-        </w:rPr>
-        <w:t>bi</w:t>
-      </w:r>
-      <w:proofErr w:type="spellEnd"/>
-      <w:r>
-        <w:rPr>
-          <w:b/>
-          <w:bCs/>
-        </w:rPr>
-        <w:t xml:space="preserve"> </w:t>
-      </w:r>
-      <w:proofErr w:type="spellStart"/>
-      <w:r>
-        <w:rPr>
-          <w:b/>
-          <w:bCs/>
-        </w:rPr>
-        <w:t>bi-clock-history</w:t>
-      </w:r>
-      <w:proofErr w:type="spellEnd"/>
-      <w:r>
-        <w:rPr>
-          <w:b/>
-          <w:bCs/>
-        </w:rPr>
-        <w:t>"&gt;&lt;/i&gt; Esperando nota del profesor...</w:t>
-      </w:r>
-    </w:p>
-    <w:p>
-      <w:pPr>
-        <w:rPr>
-          <w:b/>
-          <w:bCs/>
-        </w:rPr>
-      </w:pPr>
-      <w:r>
-        <w:rPr>
-          <w:b/>
-          <w:bCs/>
-        </w:rPr>
-        <w:t xml:space="preserve">        &lt;/p&gt;</w:t>
-      </w:r>
-    </w:p>
-    <w:p>
-      <w:pPr>
-        <w:rPr>
-          <w:b/>
-          <w:bCs/>
-        </w:rPr>
-      </w:pPr>
-      <w:r>
-        <w:rPr>
-          <w:b/>
-          <w:bCs/>
-        </w:rPr>
-        <w:t xml:space="preserve">    &lt;/</w:t>
-      </w:r>
-      <w:proofErr w:type="spellStart"/>
-      <w:r>
-        <w:rPr>
-          <w:b/>
-          <w:bCs/>
-        </w:rPr>
-        <w:t>div</w:t>
-      </w:r>
-      <w:proofErr w:type="spellEnd"/>
-      <w:r>
-        <w:rPr>
-          <w:b/>
-          <w:bCs/>
-        </w:rPr>
-        <w:t>&gt;</w:t>
-      </w:r>
-    </w:p>
-    <w:p>
-      <w:pPr>
-        <w:rPr>
-          <w:b/>
-          <w:bCs/>
-        </w:rPr>
-      </w:pPr>
-    </w:p>
-    <w:p>
-      <w:pPr>
-        <w:rPr>
-          <w:b/>
-          <w:bCs/>
-        </w:rPr>
-      </w:pPr>
-      <w:r>
-        <w:rPr>
-          <w:b/>
-          <w:bCs/>
-        </w:rPr>
-        <w:t>&lt;/</w:t>
-      </w:r>
-      <w:proofErr w:type="spellStart"/>
-      <w:r>
-        <w:rPr>
-          <w:b/>
-          <w:bCs/>
-        </w:rPr>
-        <w:t>div</w:t>
-      </w:r>
-      <w:proofErr w:type="spellEnd"/>
-      <w:r>
-        <w:rPr>
-          <w:b/>
-          <w:bCs/>
-        </w:rPr>
-        <w:t>&gt;</w:t>
-      </w:r>
-    </w:p>
-    <w:p>
-      <w:pPr>
-        <w:rPr>
-          <w:b/>
-          <w:bCs/>
-        </w:rPr>
-      </w:pPr>
-      <w:r>
-        <w:rPr>
-          <w:b/>
-          <w:bCs/>
-        </w:rPr>
-        <w:t>3. La Barra de Progreso con "Hitos"</w:t>
-      </w:r>
-    </w:p>
-    <w:p>
-      <w:pPr>
-        <w:rPr>
-          <w:b/>
-          <w:bCs/>
-        </w:rPr>
-      </w:pPr>
-      <w:r>
-        <w:rPr>
-          <w:b/>
-          <w:bCs/>
-        </w:rPr>
-        <w:t>Dado que usas módulos con peso, la barra de progreso "Slim" que comentamos antes se verá muy bien. Si quieres que sea más informativa, puedes añadir un pequeño efecto visual para indicar que hay algo "pendiente":</w:t>
-      </w:r>
-    </w:p>
-    <w:p>
-      <w:pPr>
-        <w:rPr>
-          <w:b/>
-          <w:bCs/>
-        </w:rPr>
-      </w:pPr>
-      <w:r>
-        <w:rPr>
-          <w:b/>
-          <w:bCs/>
-        </w:rPr>
-        <w:t>HTML</w:t>
-      </w:r>
-    </w:p>
-    <w:p>
-      <w:pPr>
-        <w:rPr>
-          <w:b/>
-          <w:bCs/>
-        </w:rPr>
-      </w:pPr>
-      <w:r>
-        <w:rPr>
-          <w:b/>
-          <w:bCs/>
-        </w:rPr>
-        <w:t>&lt;</w:t>
-      </w:r>
-      <w:proofErr w:type="spellStart"/>
-      <w:r>
-        <w:rPr>
-          <w:b/>
-          <w:bCs/>
-        </w:rPr>
-        <w:t>div</w:t>
-      </w:r>
-      <w:proofErr w:type="spellEnd"/>
-      <w:r>
-        <w:rPr>
-          <w:b/>
-          <w:bCs/>
-        </w:rPr>
-        <w:t xml:space="preserve"> </w:t>
-      </w:r>
-      <w:proofErr w:type="spellStart"/>
-      <w:r>
-        <w:rPr>
-          <w:b/>
-          <w:bCs/>
-        </w:rPr>
-        <w:t>class</w:t>
-      </w:r>
-      <w:proofErr w:type="spellEnd"/>
-      <w:r>
-        <w:rPr>
-          <w:b/>
-          <w:bCs/>
-        </w:rPr>
-        <w:t>="</w:t>
-      </w:r>
-      <w:proofErr w:type="spellStart"/>
-      <w:r>
-        <w:rPr>
-          <w:b/>
-          <w:bCs/>
-        </w:rPr>
         <w:t>progress</w:t>
       </w:r>
       <w:proofErr w:type="spellEnd"/>
@@ -10079,117 +11096,6 @@
           <w:b/>
           <w:bCs/>
         </w:rPr>
-        <w:t xml:space="preserve">" </w:t>
-      </w:r>
-      <w:proofErr w:type="spellStart"/>
-      <w:r>
-        <w:rPr>
-          <w:b/>
-          <w:bCs/>
-        </w:rPr>
-        <w:t>style</w:t>
-      </w:r>
-      <w:proofErr w:type="spellEnd"/>
-      <w:r>
-        <w:rPr>
-          <w:b/>
-          <w:bCs/>
-        </w:rPr>
-        <w:t>="</w:t>
-      </w:r>
-      <w:proofErr w:type="spellStart"/>
-      <w:r>
-        <w:rPr>
-          <w:b/>
-          <w:bCs/>
-        </w:rPr>
-        <w:t>height</w:t>
-      </w:r>
-      <w:proofErr w:type="spellEnd"/>
-      <w:r>
-        <w:rPr>
-          <w:b/>
-          <w:bCs/>
-        </w:rPr>
-        <w:t xml:space="preserve">: 6px; </w:t>
-      </w:r>
-      <w:proofErr w:type="spellStart"/>
-      <w:r>
-        <w:rPr>
-          <w:b/>
-          <w:bCs/>
-        </w:rPr>
-        <w:t>border-radius</w:t>
-      </w:r>
-      <w:proofErr w:type="spellEnd"/>
-      <w:r>
-        <w:rPr>
-          <w:b/>
-          <w:bCs/>
-        </w:rPr>
-        <w:t>: 0;"&gt;</w:t>
-      </w:r>
-    </w:p>
-    <w:p>
-      <w:pPr>
-        <w:rPr>
-          <w:b/>
-          <w:bCs/>
-        </w:rPr>
-      </w:pPr>
-      <w:r>
-        <w:rPr>
-          <w:b/>
-          <w:bCs/>
-        </w:rPr>
-        <w:t xml:space="preserve">    &lt;</w:t>
-      </w:r>
-      <w:proofErr w:type="spellStart"/>
-      <w:r>
-        <w:rPr>
-          <w:b/>
-          <w:bCs/>
-        </w:rPr>
-        <w:t>div</w:t>
-      </w:r>
-      <w:proofErr w:type="spellEnd"/>
-      <w:r>
-        <w:rPr>
-          <w:b/>
-          <w:bCs/>
-        </w:rPr>
-        <w:t xml:space="preserve"> </w:t>
-      </w:r>
-      <w:proofErr w:type="spellStart"/>
-      <w:r>
-        <w:rPr>
-          <w:b/>
-          <w:bCs/>
-        </w:rPr>
-        <w:t>class</w:t>
-      </w:r>
-      <w:proofErr w:type="spellEnd"/>
-      <w:r>
-        <w:rPr>
-          <w:b/>
-          <w:bCs/>
-        </w:rPr>
-        <w:t>="</w:t>
-      </w:r>
-      <w:proofErr w:type="spellStart"/>
-      <w:r>
-        <w:rPr>
-          <w:b/>
-          <w:bCs/>
-        </w:rPr>
-        <w:t>progress</w:t>
-      </w:r>
-      <w:proofErr w:type="spellEnd"/>
-      <w:r>
-        <w:rPr>
-          <w:b/>
-          <w:bCs/>
-        </w:rPr>
         <w:t xml:space="preserve">-bar </w:t>
       </w:r>
       <w:proofErr w:type="spellStart"/>
@@ -10206,7 +11112,7 @@
           <w:b/>
           <w:bCs/>
         </w:rPr>
-        <w:t xml:space="preserve">" </w:t>
+        <w:t xml:space="preserve"> opacity-25" </w:t>
       </w:r>
     </w:p>
     <w:p>
@@ -10224,6 +11130,7 @@
         <w:t xml:space="preserve">         </w:t>
       </w:r>
       <w:proofErr w:type="spellStart"/>
+      <w:proofErr w:type="gramStart"/>
       <w:r>
         <w:rPr>
           <w:b/>
@@ -10232,6 +11139,7 @@
         <w:t>th:style</w:t>
       </w:r>
       <w:proofErr w:type="spellEnd"/>
+      <w:proofErr w:type="gramEnd"/>
       <w:r>
         <w:rPr>
           <w:b/>
@@ -10256,100 +11164,7 @@
         <w:t>: ' + ${</w:t>
       </w:r>
       <w:proofErr w:type="spellStart"/>
-      <w:r>
-        <w:rPr>
-          <w:b/>
-          <w:bCs/>
-        </w:rPr>
-        <w:t>curso.progreso</w:t>
-      </w:r>
-      <w:proofErr w:type="spellEnd"/>
-      <w:r>
-        <w:rPr>
-          <w:b/>
-          <w:bCs/>
-        </w:rPr>
-        <w:t>} + '%'"&gt;&lt;/</w:t>
-      </w:r>
-      <w:proofErr w:type="spellStart"/>
-      <w:r>
-        <w:rPr>
-          <w:b/>
-          <w:bCs/>
-        </w:rPr>
-        <w:t>div</w:t>
-      </w:r>
-      <w:proofErr w:type="spellEnd"/>
-      <w:r>
-        <w:rPr>
-          <w:b/>
-          <w:bCs/>
-        </w:rPr>
-        <w:t>&gt;</w:t>
-      </w:r>
-    </w:p>
-    <w:p>
-      <w:pPr>
-        <w:rPr>
-          <w:b/>
-          <w:bCs/>
-        </w:rPr>
-      </w:pPr>
-      <w:r>
-        <w:rPr>
-          <w:b/>
-          <w:bCs/>
-        </w:rPr>
-        <w:t xml:space="preserve">    </w:t>
-      </w:r>
-    </w:p>
-    <w:p>
-      <w:pPr>
-        <w:rPr>
-          <w:b/>
-          <w:bCs/>
-        </w:rPr>
-      </w:pPr>
-      <w:r>
-        <w:rPr>
-          <w:b/>
-          <w:bCs/>
-        </w:rPr>
-        <w:t xml:space="preserve">    &lt;</w:t>
-      </w:r>
-      <w:proofErr w:type="spellStart"/>
-      <w:r>
-        <w:rPr>
-          <w:b/>
-          <w:bCs/>
-        </w:rPr>
-        <w:t>div</w:t>
-      </w:r>
-      <w:proofErr w:type="spellEnd"/>
-      <w:r>
-        <w:rPr>
-          <w:b/>
-          <w:bCs/>
-        </w:rPr>
-        <w:t xml:space="preserve"> </w:t>
-      </w:r>
-      <w:proofErr w:type="spellStart"/>
-      <w:r>
-        <w:rPr>
-          <w:b/>
-          <w:bCs/>
-        </w:rPr>
-        <w:t>th:if</w:t>
-      </w:r>
-      <w:proofErr w:type="spellEnd"/>
-      <w:r>
-        <w:rPr>
-          <w:b/>
-          <w:bCs/>
-        </w:rPr>
-        <w:t>="${</w:t>
-      </w:r>
-      <w:proofErr w:type="spellStart"/>
+      <w:proofErr w:type="gramStart"/>
       <w:r>
         <w:rPr>
           <w:b/>
@@ -10358,132 +11173,7 @@
         <w:t>curso.progresoPendiente</w:t>
       </w:r>
       <w:proofErr w:type="spellEnd"/>
-      <w:r>
-        <w:rPr>
-          <w:b/>
-          <w:bCs/>
-        </w:rPr>
-        <w:t xml:space="preserve"> &gt; 0}" </w:t>
-      </w:r>
-    </w:p>
-    <w:p>
-      <w:pPr>
-        <w:rPr>
-          <w:b/>
-          <w:bCs/>
-        </w:rPr>
-      </w:pPr>
-      <w:r>
-        <w:rPr>
-          <w:b/>
-          <w:bCs/>
-        </w:rPr>
-        <w:t xml:space="preserve">         </w:t>
-      </w:r>
-      <w:proofErr w:type="spellStart"/>
-      <w:r>
-        <w:rPr>
-          <w:b/>
-          <w:bCs/>
-        </w:rPr>
-        <w:t>class</w:t>
-      </w:r>
-      <w:proofErr w:type="spellEnd"/>
-      <w:r>
-        <w:rPr>
-          <w:b/>
-          <w:bCs/>
-        </w:rPr>
-        <w:t>="</w:t>
-      </w:r>
-      <w:proofErr w:type="spellStart"/>
-      <w:r>
-        <w:rPr>
-          <w:b/>
-          <w:bCs/>
-        </w:rPr>
-        <w:t>progress</w:t>
-      </w:r>
-      <w:proofErr w:type="spellEnd"/>
-      <w:r>
-        <w:rPr>
-          <w:b/>
-          <w:bCs/>
-        </w:rPr>
-        <w:t xml:space="preserve">-bar </w:t>
-      </w:r>
-      <w:proofErr w:type="spellStart"/>
-      <w:r>
-        <w:rPr>
-          <w:b/>
-          <w:bCs/>
-        </w:rPr>
-        <w:t>bg-primary</w:t>
-      </w:r>
-      <w:proofErr w:type="spellEnd"/>
-      <w:r>
-        <w:rPr>
-          <w:b/>
-          <w:bCs/>
-        </w:rPr>
-        <w:t xml:space="preserve"> opacity-25" </w:t>
-      </w:r>
-    </w:p>
-    <w:p>
-      <w:pPr>
-        <w:rPr>
-          <w:b/>
-          <w:bCs/>
-        </w:rPr>
-      </w:pPr>
-      <w:r>
-        <w:rPr>
-          <w:b/>
-          <w:bCs/>
-        </w:rPr>
-        <w:t xml:space="preserve">         </w:t>
-      </w:r>
-      <w:proofErr w:type="spellStart"/>
-      <w:r>
-        <w:rPr>
-          <w:b/>
-          <w:bCs/>
-        </w:rPr>
-        <w:t>th:style</w:t>
-      </w:r>
-      <w:proofErr w:type="spellEnd"/>
-      <w:r>
-        <w:rPr>
-          <w:b/>
-          <w:bCs/>
-        </w:rPr>
-        <w:t>="'</w:t>
-      </w:r>
-      <w:proofErr w:type="spellStart"/>
-      <w:r>
-        <w:rPr>
-          <w:b/>
-          <w:bCs/>
-        </w:rPr>
-        <w:t>width</w:t>
-      </w:r>
-      <w:proofErr w:type="spellEnd"/>
-      <w:r>
-        <w:rPr>
-          <w:b/>
-          <w:bCs/>
-        </w:rPr>
-        <w:t>: ' + ${</w:t>
-      </w:r>
-      <w:proofErr w:type="spellStart"/>
-      <w:r>
-        <w:rPr>
-          <w:b/>
-          <w:bCs/>
-        </w:rPr>
-        <w:t>curso.progresoPendiente</w:t>
-      </w:r>
-      <w:proofErr w:type="spellEnd"/>
+      <w:proofErr w:type="gramEnd"/>
       <w:r>
         <w:rPr>
           <w:b/>
@@ -10570,7 +11260,23 @@
           <w:b/>
           <w:bCs/>
         </w:rPr>
-        <w:t>Estado "Esperando Nota": Si el alumno ya terminó su parte pero el profesor no ha puntuado, es vital decírselo. Si no, verá que el progreso no sube y pensará que el sistema falla.</w:t>
+        <w:t xml:space="preserve">Estado "Esperando Nota": Si el alumno ya terminó su </w:t>
+      </w:r>
+      <w:proofErr w:type="gramStart"/>
+      <w:r>
+        <w:rPr>
+          <w:b/>
+          <w:bCs/>
+        </w:rPr>
+        <w:t>parte</w:t>
+      </w:r>
+      <w:proofErr w:type="gramEnd"/>
+      <w:r>
+        <w:rPr>
+          <w:b/>
+          <w:bCs/>
+        </w:rPr>
+        <w:t xml:space="preserve"> pero el profesor no ha puntuado, es vital decírselo. Si no, verá que el progreso no sube y pensará que el sistema falla.</w:t>
       </w:r>
     </w:p>
     <w:p>
@@ -10589,7 +11295,6 @@
           <w:b/>
           <w:bCs/>
         </w:rPr>
-        <w:lastRenderedPageBreak/>
         <w:t>El Trofeo: Cuando progreso == 100, el cambio de color de azul (acción) a verde o dorado (logro) da una descarga de dopamina necesaria para terminar el siguiente curso.</w:t>
       </w:r>
     </w:p>

</xml_diff>

<commit_message>
Solventado problema excepción en subscripción.
Avance en memoria.
</commit_message>
<xml_diff>
--- a/src/main/resources/static/docs/Memoria_aplicacion.docx
+++ b/src/main/resources/static/docs/Memoria_aplicacion.docx
@@ -1,12 +1,1008 @@
 
 <file path=word/document.xml><?xml version="1.0" encoding="utf-8"?>
-<w:document xmlns:wpc="http://schemas.microsoft.com/office/word/2010/wordprocessingCanvas" xmlns:cx="http://schemas.microsoft.com/office/drawing/2014/chartex" xmlns:cx1="http://schemas.microsoft.com/office/drawing/2015/9/8/chartex" xmlns:cx2="http://schemas.microsoft.com/office/drawing/2015/10/21/chartex" xmlns:cx3="http://schemas.microsoft.com/office/drawing/2016/5/9/chartex" xmlns:cx4="http://schemas.microsoft.com/office/drawing/2016/5/10/chartex" xmlns:cx5="http://schemas.microsoft.com/office/drawing/2016/5/11/chartex" xmlns:cx6="http://schemas.microsoft.com/office/drawing/2016/5/12/chartex" xmlns:cx7="http://schemas.microsoft.com/office/drawing/2016/5/13/chartex" xmlns:cx8="http://schemas.microsoft.com/office/drawing/2016/5/14/chartex" xmlns:mc="http://schemas.openxmlformats.org/markup-compatibility/2006" xmlns:aink="http://schemas.microsoft.com/office/drawing/2016/ink" xmlns:am3d="http://schemas.microsoft.com/office/drawing/2017/model3d" xmlns:o="urn:schemas-microsoft-com:office:office" xmlns:oel="http://schemas.microsoft.com/office/2019/extlst" xmlns:r="http://schemas.openxmlformats.org/officeDocument/2006/relationships" xmlns:m="http://schemas.openxmlformats.org/officeDocument/2006/math" xmlns:v="urn:schemas-microsoft-com:vml" xmlns:wp14="http://schemas.microsoft.com/office/word/2010/wordprocessingDrawing" xmlns:wp="http://schemas.openxmlformats.org/drawingml/2006/wordprocessingDrawing" xmlns:w10="urn:schemas-microsoft-com:office:word" xmlns:w="http://schemas.openxmlformats.org/wordprocessingml/2006/main" xmlns:w14="http://schemas.microsoft.com/office/word/2010/wordml" xmlns:w15="http://schemas.microsoft.com/office/word/2012/wordml" xmlns:w16cex="http://schemas.microsoft.com/office/word/2018/wordml/cex" xmlns:w16cid="http://schemas.microsoft.com/office/word/2016/wordml/cid" xmlns:w16="http://schemas.microsoft.com/office/word/2018/wordml" xmlns:w16du="http://schemas.microsoft.com/office/word/2023/wordml/word16du" xmlns:w16sdtdh="http://schemas.microsoft.com/office/word/2020/wordml/sdtdatahash" xmlns:w16sdtfl="http://schemas.microsoft.com/office/word/2024/wordml/sdtformatlock" xmlns:w16se="http://schemas.microsoft.com/office/word/2015/wordml/symex" xmlns:wpg="http://schemas.microsoft.com/office/word/2010/wordprocessingGroup" xmlns:wpi="http://schemas.microsoft.com/office/word/2010/wordprocessingInk" xmlns:wne="http://schemas.microsoft.com/office/word/2006/wordml" xmlns:wps="http://schemas.microsoft.com/office/word/2010/wordprocessingShape" mc:Ignorable="w14 w15 w16se w16cid w16 w16cex w16sdtdh w16sdtfl w16du wp14">
+<w:document xmlns:wpc="http://schemas.microsoft.com/office/word/2010/wordprocessingCanvas" xmlns:cx="http://schemas.microsoft.com/office/drawing/2014/chartex" xmlns:cx1="http://schemas.microsoft.com/office/drawing/2015/9/8/chartex" xmlns:cx2="http://schemas.microsoft.com/office/drawing/2015/10/21/chartex" xmlns:cx3="http://schemas.microsoft.com/office/drawing/2016/5/9/chartex" xmlns:cx4="http://schemas.microsoft.com/office/drawing/2016/5/10/chartex" xmlns:cx5="http://schemas.microsoft.com/office/drawing/2016/5/11/chartex" xmlns:cx6="http://schemas.microsoft.com/office/drawing/2016/5/12/chartex" xmlns:cx7="http://schemas.microsoft.com/office/drawing/2016/5/13/chartex" xmlns:cx8="http://schemas.microsoft.com/office/drawing/2016/5/14/chartex" xmlns:mc="http://schemas.openxmlformats.org/markup-compatibility/2006" xmlns:aink="http://schemas.microsoft.com/office/drawing/2016/ink" xmlns:am3d="http://schemas.microsoft.com/office/drawing/2017/model3d" xmlns:o="urn:schemas-microsoft-com:office:office" xmlns:r="http://schemas.openxmlformats.org/officeDocument/2006/relationships" xmlns:m="http://schemas.openxmlformats.org/officeDocument/2006/math" xmlns:v="urn:schemas-microsoft-com:vml" xmlns:wp14="http://schemas.microsoft.com/office/word/2010/wordprocessingDrawing" xmlns:wp="http://schemas.openxmlformats.org/drawingml/2006/wordprocessingDrawing" xmlns:w10="urn:schemas-microsoft-com:office:word" xmlns:w="http://schemas.openxmlformats.org/wordprocessingml/2006/main" xmlns:w14="http://schemas.microsoft.com/office/word/2010/wordml" xmlns:w15="http://schemas.microsoft.com/office/word/2012/wordml" xmlns:w16cex="http://schemas.microsoft.com/office/word/2018/wordml/cex" xmlns:w16cid="http://schemas.microsoft.com/office/word/2016/wordml/cid" xmlns:w16="http://schemas.microsoft.com/office/word/2018/wordml" xmlns:w16sdtdh="http://schemas.microsoft.com/office/word/2020/wordml/sdtdatahash" xmlns:w16se="http://schemas.microsoft.com/office/word/2015/wordml/symex" xmlns:wpg="http://schemas.microsoft.com/office/word/2010/wordprocessingGroup" xmlns:wpi="http://schemas.microsoft.com/office/word/2010/wordprocessingInk" xmlns:wne="http://schemas.microsoft.com/office/word/2006/wordml" xmlns:wps="http://schemas.microsoft.com/office/word/2010/wordprocessingShape" mc:Ignorable="w14 w15 w16se w16cid w16 w16cex w16sdtdh wp14">
   <w:body>
+    <w:sdt>
+      <w:sdtPr>
+        <w:id w:val="-568661430"/>
+        <w:docPartObj>
+          <w:docPartGallery w:val="Cover Pages"/>
+          <w:docPartUnique/>
+        </w:docPartObj>
+      </w:sdtPr>
+      <w:sdtContent>
+        <w:p>
+          <w:pPr>
+            <w:rPr>
+              <w:rFonts w:asciiTheme="majorHAnsi" w:eastAsiaTheme="majorEastAsia" w:hAnsiTheme="majorHAnsi" w:cstheme="majorBidi"/>
+              <w:caps/>
+              <w:color w:val="0E2841" w:themeColor="text2"/>
+              <w:spacing w:val="-15"/>
+              <w:sz w:val="72"/>
+              <w:szCs w:val="72"/>
+            </w:rPr>
+          </w:pPr>
+          <w:r>
+            <w:rPr>
+              <w:rFonts w:asciiTheme="majorHAnsi" w:eastAsiaTheme="majorEastAsia" w:hAnsiTheme="majorHAnsi" w:cstheme="majorBidi"/>
+              <w:caps/>
+              <w:noProof/>
+              <w:color w:val="0E2841" w:themeColor="text2"/>
+              <w:spacing w:val="-15"/>
+              <w:sz w:val="72"/>
+              <w:szCs w:val="72"/>
+            </w:rPr>
+            <mc:AlternateContent>
+              <mc:Choice Requires="wps">
+                <w:drawing>
+                  <wp:anchor distT="0" distB="0" distL="114300" distR="114300" simplePos="0" relativeHeight="251659264" behindDoc="0" locked="0" layoutInCell="1" allowOverlap="1" wp14:anchorId="57D6EF3D" wp14:editId="6BA4CCE0">
+                    <wp:simplePos x="0" y="0"/>
+                    <wp:positionH relativeFrom="page">
+                      <wp:align>center</wp:align>
+                    </wp:positionH>
+                    <wp:positionV relativeFrom="page">
+                      <wp:align>center</wp:align>
+                    </wp:positionV>
+                    <wp:extent cx="1712890" cy="3840480"/>
+                    <wp:effectExtent l="0" t="0" r="1270" b="0"/>
+                    <wp:wrapNone/>
+                    <wp:docPr id="138" name="Cuadro de texto 138"/>
+                    <wp:cNvGraphicFramePr/>
+                    <a:graphic xmlns:a="http://schemas.openxmlformats.org/drawingml/2006/main">
+                      <a:graphicData uri="http://schemas.microsoft.com/office/word/2010/wordprocessingShape">
+                        <wps:wsp>
+                          <wps:cNvSpPr txBox="1"/>
+                          <wps:spPr>
+                            <a:xfrm>
+                              <a:off x="0" y="0"/>
+                              <a:ext cx="1712890" cy="3840480"/>
+                            </a:xfrm>
+                            <a:prstGeom prst="rect">
+                              <a:avLst/>
+                            </a:prstGeom>
+                            <a:solidFill>
+                              <a:schemeClr val="lt1"/>
+                            </a:solidFill>
+                            <a:ln w="6350">
+                              <a:noFill/>
+                            </a:ln>
+                            <a:effectLst/>
+                          </wps:spPr>
+                          <wps:style>
+                            <a:lnRef idx="0">
+                              <a:schemeClr val="accent1"/>
+                            </a:lnRef>
+                            <a:fillRef idx="0">
+                              <a:schemeClr val="accent1"/>
+                            </a:fillRef>
+                            <a:effectRef idx="0">
+                              <a:schemeClr val="accent1"/>
+                            </a:effectRef>
+                            <a:fontRef idx="minor">
+                              <a:schemeClr val="dk1"/>
+                            </a:fontRef>
+                          </wps:style>
+                          <wps:txbx>
+                            <w:txbxContent>
+                              <w:tbl>
+                                <w:tblPr>
+                                  <w:tblW w:w="5000" w:type="pct"/>
+                                  <w:jc w:val="center"/>
+                                  <w:tblBorders>
+                                    <w:insideV w:val="single" w:sz="12" w:space="0" w:color="E97132" w:themeColor="accent2"/>
+                                  </w:tblBorders>
+                                  <w:tblCellMar>
+                                    <w:top w:w="1296" w:type="dxa"/>
+                                    <w:left w:w="360" w:type="dxa"/>
+                                    <w:bottom w:w="1296" w:type="dxa"/>
+                                    <w:right w:w="360" w:type="dxa"/>
+                                  </w:tblCellMar>
+                                  <w:tblLook w:val="04A0" w:firstRow="1" w:lastRow="0" w:firstColumn="1" w:lastColumn="0" w:noHBand="0" w:noVBand="1"/>
+                                </w:tblPr>
+                                <w:tblGrid>
+                                  <w:gridCol w:w="5910"/>
+                                  <w:gridCol w:w="3554"/>
+                                </w:tblGrid>
+                                <w:tr>
+                                  <w:trPr>
+                                    <w:jc w:val="center"/>
+                                  </w:trPr>
+                                  <w:tc>
+                                    <w:tcPr>
+                                      <w:tcW w:w="2568" w:type="pct"/>
+                                      <w:vAlign w:val="center"/>
+                                    </w:tcPr>
+                                    <w:p>
+                                      <w:pPr>
+                                        <w:jc w:val="right"/>
+                                      </w:pPr>
+                                      <w:r>
+                                        <w:rPr>
+                                          <w:noProof/>
+                                        </w:rPr>
+                                        <w:drawing>
+                                          <wp:inline distT="0" distB="0" distL="0" distR="0" wp14:anchorId="41DFA482" wp14:editId="0E7FB153">
+                                            <wp:extent cx="3295896" cy="2847975"/>
+                                            <wp:effectExtent l="0" t="0" r="0" b="0"/>
+                                            <wp:docPr id="3" name="Imagen 3"/>
+                                            <wp:cNvGraphicFramePr>
+                                              <a:graphicFrameLocks xmlns:a="http://schemas.openxmlformats.org/drawingml/2006/main" noChangeAspect="1"/>
+                                            </wp:cNvGraphicFramePr>
+                                            <a:graphic xmlns:a="http://schemas.openxmlformats.org/drawingml/2006/main">
+                                              <a:graphicData uri="http://schemas.openxmlformats.org/drawingml/2006/picture">
+                                                <pic:pic xmlns:pic="http://schemas.openxmlformats.org/drawingml/2006/picture">
+                                                  <pic:nvPicPr>
+                                                    <pic:cNvPr id="1" name=""/>
+                                                    <pic:cNvPicPr/>
+                                                  </pic:nvPicPr>
+                                                  <pic:blipFill>
+                                                    <a:blip r:embed="rId6"/>
+                                                    <a:stretch>
+                                                      <a:fillRect/>
+                                                    </a:stretch>
+                                                  </pic:blipFill>
+                                                  <pic:spPr>
+                                                    <a:xfrm>
+                                                      <a:off x="0" y="0"/>
+                                                      <a:ext cx="3327208" cy="2875032"/>
+                                                    </a:xfrm>
+                                                    <a:prstGeom prst="rect">
+                                                      <a:avLst/>
+                                                    </a:prstGeom>
+                                                  </pic:spPr>
+                                                </pic:pic>
+                                              </a:graphicData>
+                                            </a:graphic>
+                                          </wp:inline>
+                                        </w:drawing>
+                                      </w:r>
+                                    </w:p>
+                                    <w:sdt>
+                                      <w:sdtPr>
+                                        <w:rPr>
+                                          <w:caps/>
+                                          <w:color w:val="191919" w:themeColor="text1" w:themeTint="E6"/>
+                                          <w:sz w:val="40"/>
+                                          <w:szCs w:val="40"/>
+                                        </w:rPr>
+                                        <w:alias w:val="Título"/>
+                                        <w:tag w:val=""/>
+                                        <w:id w:val="-438379639"/>
+                                        <w:dataBinding w:prefixMappings="xmlns:ns0='http://purl.org/dc/elements/1.1/' xmlns:ns1='http://schemas.openxmlformats.org/package/2006/metadata/core-properties' " w:xpath="/ns1:coreProperties[1]/ns0:title[1]" w:storeItemID="{6C3C8BC8-F283-45AE-878A-BAB7291924A1}"/>
+                                        <w:text/>
+                                      </w:sdtPr>
+                                      <w:sdtContent>
+                                        <w:p>
+                                          <w:pPr>
+                                            <w:pStyle w:val="Sinespaciado"/>
+                                            <w:spacing w:line="312" w:lineRule="auto"/>
+                                            <w:jc w:val="right"/>
+                                            <w:rPr>
+                                              <w:caps/>
+                                              <w:color w:val="191919" w:themeColor="text1" w:themeTint="E6"/>
+                                              <w:sz w:val="40"/>
+                                              <w:szCs w:val="40"/>
+                                            </w:rPr>
+                                          </w:pPr>
+                                          <w:r>
+                                            <w:rPr>
+                                              <w:caps/>
+                                              <w:color w:val="191919" w:themeColor="text1" w:themeTint="E6"/>
+                                              <w:sz w:val="40"/>
+                                              <w:szCs w:val="40"/>
+                                            </w:rPr>
+                                            <w:t>Memoria proyecto aplicaciones web</w:t>
+                                          </w:r>
+                                        </w:p>
+                                      </w:sdtContent>
+                                    </w:sdt>
+                                    <w:sdt>
+                                      <w:sdtPr>
+                                        <w:rPr>
+                                          <w:color w:val="000000" w:themeColor="text1"/>
+                                          <w:sz w:val="24"/>
+                                          <w:szCs w:val="24"/>
+                                        </w:rPr>
+                                        <w:alias w:val="Subtítulo"/>
+                                        <w:tag w:val=""/>
+                                        <w:id w:val="1354072561"/>
+                                        <w:dataBinding w:prefixMappings="xmlns:ns0='http://purl.org/dc/elements/1.1/' xmlns:ns1='http://schemas.openxmlformats.org/package/2006/metadata/core-properties' " w:xpath="/ns1:coreProperties[1]/ns0:subject[1]" w:storeItemID="{6C3C8BC8-F283-45AE-878A-BAB7291924A1}"/>
+                                        <w:text/>
+                                      </w:sdtPr>
+                                      <w:sdtContent>
+                                        <w:p>
+                                          <w:pPr>
+                                            <w:jc w:val="right"/>
+                                            <w:rPr>
+                                              <w:sz w:val="24"/>
+                                              <w:szCs w:val="24"/>
+                                            </w:rPr>
+                                          </w:pPr>
+                                          <w:r>
+                                            <w:rPr>
+                                              <w:color w:val="000000" w:themeColor="text1"/>
+                                              <w:sz w:val="24"/>
+                                              <w:szCs w:val="24"/>
+                                            </w:rPr>
+                                            <w:t>Trabajo de entrega obligatoria</w:t>
+                                          </w:r>
+                                        </w:p>
+                                      </w:sdtContent>
+                                    </w:sdt>
+                                  </w:tc>
+                                  <w:tc>
+                                    <w:tcPr>
+                                      <w:tcW w:w="2432" w:type="pct"/>
+                                      <w:vAlign w:val="center"/>
+                                    </w:tcPr>
+                                    <w:p>
+                                      <w:pPr>
+                                        <w:pStyle w:val="Sinespaciado"/>
+                                        <w:rPr>
+                                          <w:caps/>
+                                          <w:color w:val="E97132" w:themeColor="accent2"/>
+                                          <w:sz w:val="26"/>
+                                          <w:szCs w:val="26"/>
+                                        </w:rPr>
+                                      </w:pPr>
+                                      <w:r>
+                                        <w:rPr>
+                                          <w:caps/>
+                                          <w:color w:val="E97132" w:themeColor="accent2"/>
+                                          <w:sz w:val="26"/>
+                                          <w:szCs w:val="26"/>
+                                        </w:rPr>
+                                        <w:t>Descripción breve</w:t>
+                                      </w:r>
+                                    </w:p>
+                                    <w:sdt>
+                                      <w:sdtPr>
+                                        <w:rPr>
+                                          <w:color w:val="000000" w:themeColor="text1"/>
+                                        </w:rPr>
+                                        <w:alias w:val="Descripción breve"/>
+                                        <w:tag w:val=""/>
+                                        <w:id w:val="-2036181933"/>
+                                        <w:dataBinding w:prefixMappings="xmlns:ns0='http://schemas.microsoft.com/office/2006/coverPageProps' " w:xpath="/ns0:CoverPageProperties[1]/ns0:Abstract[1]" w:storeItemID="{55AF091B-3C7A-41E3-B477-F2FDAA23CFDA}"/>
+                                        <w:text/>
+                                      </w:sdtPr>
+                                      <w:sdtContent>
+                                        <w:p>
+                                          <w:pPr>
+                                            <w:rPr>
+                                              <w:color w:val="000000" w:themeColor="text1"/>
+                                            </w:rPr>
+                                          </w:pPr>
+                                          <w:r>
+                                            <w:rPr>
+                                              <w:color w:val="000000" w:themeColor="text1"/>
+                                            </w:rPr>
+                                            <w:t>Memoria técnica y Manual de usuario de</w:t>
+                                          </w:r>
+                                          <w:r>
+                                            <w:rPr>
+                                              <w:color w:val="000000" w:themeColor="text1"/>
+                                            </w:rPr>
+                                            <w:t xml:space="preserve"> la aplicación de </w:t>
+                                          </w:r>
+                                          <w:proofErr w:type="spellStart"/>
+                                          <w:r>
+                                            <w:rPr>
+                                              <w:color w:val="000000" w:themeColor="text1"/>
+                                            </w:rPr>
+                                            <w:t>Uned</w:t>
+                                          </w:r>
+                                          <w:proofErr w:type="spellEnd"/>
+                                          <w:r>
+                                            <w:rPr>
+                                              <w:color w:val="000000" w:themeColor="text1"/>
+                                            </w:rPr>
+                                            <w:t xml:space="preserve"> Cursos Web</w:t>
+                                          </w:r>
+                                          <w:r>
+                                            <w:rPr>
+                                              <w:color w:val="000000" w:themeColor="text1"/>
+                                            </w:rPr>
+                                            <w:t xml:space="preserve"> (UCW)</w:t>
+                                          </w:r>
+                                          <w:r>
+                                            <w:rPr>
+                                              <w:color w:val="000000" w:themeColor="text1"/>
+                                            </w:rPr>
+                                            <w:t>.</w:t>
+                                          </w:r>
+                                          <w:r>
+                                            <w:rPr>
+                                              <w:color w:val="000000" w:themeColor="text1"/>
+                                            </w:rPr>
+                                            <w:t xml:space="preserve"> </w:t>
+                                          </w:r>
+                                        </w:p>
+                                      </w:sdtContent>
+                                    </w:sdt>
+                                    <w:sdt>
+                                      <w:sdtPr>
+                                        <w:rPr>
+                                          <w:color w:val="E97132" w:themeColor="accent2"/>
+                                          <w:sz w:val="26"/>
+                                          <w:szCs w:val="26"/>
+                                        </w:rPr>
+                                        <w:alias w:val="Autor"/>
+                                        <w:tag w:val=""/>
+                                        <w:id w:val="-279026076"/>
+                                        <w:dataBinding w:prefixMappings="xmlns:ns0='http://purl.org/dc/elements/1.1/' xmlns:ns1='http://schemas.openxmlformats.org/package/2006/metadata/core-properties' " w:xpath="/ns1:coreProperties[1]/ns0:creator[1]" w:storeItemID="{6C3C8BC8-F283-45AE-878A-BAB7291924A1}"/>
+                                        <w:text/>
+                                      </w:sdtPr>
+                                      <w:sdtContent>
+                                        <w:p>
+                                          <w:pPr>
+                                            <w:pStyle w:val="Sinespaciado"/>
+                                            <w:rPr>
+                                              <w:color w:val="E97132" w:themeColor="accent2"/>
+                                              <w:sz w:val="26"/>
+                                              <w:szCs w:val="26"/>
+                                            </w:rPr>
+                                          </w:pPr>
+                                          <w:r>
+                                            <w:rPr>
+                                              <w:color w:val="E97132" w:themeColor="accent2"/>
+                                              <w:sz w:val="26"/>
+                                              <w:szCs w:val="26"/>
+                                            </w:rPr>
+                                            <w:t>FRANCISCO JAVIER MARTINEZ SANCHEZ</w:t>
+                                          </w:r>
+                                        </w:p>
+                                      </w:sdtContent>
+                                    </w:sdt>
+                                    <w:p>
+                                      <w:pPr>
+                                        <w:pStyle w:val="Sinespaciado"/>
+                                      </w:pPr>
+                                      <w:sdt>
+                                        <w:sdtPr>
+                                          <w:rPr>
+                                            <w:color w:val="0E2841" w:themeColor="text2"/>
+                                          </w:rPr>
+                                          <w:alias w:val="Curso"/>
+                                          <w:tag w:val="Curso"/>
+                                          <w:id w:val="-710501431"/>
+                                          <w:dataBinding w:prefixMappings="xmlns:ns0='http://purl.org/dc/elements/1.1/' xmlns:ns1='http://schemas.openxmlformats.org/package/2006/metadata/core-properties' " w:xpath="/ns1:coreProperties[1]/ns1:category[1]" w:storeItemID="{6C3C8BC8-F283-45AE-878A-BAB7291924A1}"/>
+                                          <w:text/>
+                                        </w:sdtPr>
+                                        <w:sdtContent>
+                                          <w:r>
+                                            <w:rPr>
+                                              <w:color w:val="0E2841" w:themeColor="text2"/>
+                                            </w:rPr>
+                                            <w:t>fmartinez320</w:t>
+                                          </w:r>
+                                          <w:r>
+                                            <w:rPr>
+                                              <w:color w:val="0E2841" w:themeColor="text2"/>
+                                            </w:rPr>
+                                            <w:t>@alumno.uned.es</w:t>
+                                          </w:r>
+                                        </w:sdtContent>
+                                      </w:sdt>
+                                    </w:p>
+                                  </w:tc>
+                                </w:tr>
+                              </w:tbl>
+                              <w:p/>
+                            </w:txbxContent>
+                          </wps:txbx>
+                          <wps:bodyPr rot="0" spcFirstLastPara="0" vertOverflow="overflow" horzOverflow="overflow" vert="horz" wrap="square" lIns="0" tIns="0" rIns="0" bIns="0" numCol="1" spcCol="0" rtlCol="0" fromWordArt="0" anchor="ctr" anchorCtr="0" forceAA="0" compatLnSpc="1">
+                            <a:prstTxWarp prst="textNoShape">
+                              <a:avLst/>
+                            </a:prstTxWarp>
+                            <a:noAutofit/>
+                          </wps:bodyPr>
+                        </wps:wsp>
+                      </a:graphicData>
+                    </a:graphic>
+                    <wp14:sizeRelH relativeFrom="page">
+                      <wp14:pctWidth>94100</wp14:pctWidth>
+                    </wp14:sizeRelH>
+                    <wp14:sizeRelV relativeFrom="page">
+                      <wp14:pctHeight>77300</wp14:pctHeight>
+                    </wp14:sizeRelV>
+                  </wp:anchor>
+                </w:drawing>
+              </mc:Choice>
+              <mc:Fallback>
+                <w:pict>
+                  <v:shapetype w14:anchorId="57D6EF3D" id="_x0000_t202" coordsize="21600,21600" o:spt="202" path="m,l,21600r21600,l21600,xe">
+                    <v:stroke joinstyle="miter"/>
+                    <v:path gradientshapeok="t" o:connecttype="rect"/>
+                  </v:shapetype>
+                  <v:shape id="Cuadro de texto 138" o:spid="_x0000_s1026" type="#_x0000_t202" style="position:absolute;margin-left:0;margin-top:0;width:134.85pt;height:302.4pt;z-index:251659264;visibility:visible;mso-wrap-style:square;mso-width-percent:941;mso-height-percent:773;mso-wrap-distance-left:9pt;mso-wrap-distance-top:0;mso-wrap-distance-right:9pt;mso-wrap-distance-bottom:0;mso-position-horizontal:center;mso-position-horizontal-relative:page;mso-position-vertical:center;mso-position-vertical-relative:page;mso-width-percent:941;mso-height-percent:773;mso-width-relative:page;mso-height-relative:page;v-text-anchor:middle" o:gfxdata="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" fillcolor="white [3201]" stroked="f" strokeweight=".5pt">
+                    <v:textbox inset="0,0,0,0">
+                      <w:txbxContent>
+                        <w:tbl>
+                          <w:tblPr>
+                            <w:tblW w:w="5000" w:type="pct"/>
+                            <w:jc w:val="center"/>
+                            <w:tblBorders>
+                              <w:insideV w:val="single" w:sz="12" w:space="0" w:color="E97132" w:themeColor="accent2"/>
+                            </w:tblBorders>
+                            <w:tblCellMar>
+                              <w:top w:w="1296" w:type="dxa"/>
+                              <w:left w:w="360" w:type="dxa"/>
+                              <w:bottom w:w="1296" w:type="dxa"/>
+                              <w:right w:w="360" w:type="dxa"/>
+                            </w:tblCellMar>
+                            <w:tblLook w:val="04A0" w:firstRow="1" w:lastRow="0" w:firstColumn="1" w:lastColumn="0" w:noHBand="0" w:noVBand="1"/>
+                          </w:tblPr>
+                          <w:tblGrid>
+                            <w:gridCol w:w="5910"/>
+                            <w:gridCol w:w="3554"/>
+                          </w:tblGrid>
+                          <w:tr>
+                            <w:trPr>
+                              <w:jc w:val="center"/>
+                            </w:trPr>
+                            <w:tc>
+                              <w:tcPr>
+                                <w:tcW w:w="2568" w:type="pct"/>
+                                <w:vAlign w:val="center"/>
+                              </w:tcPr>
+                              <w:p>
+                                <w:pPr>
+                                  <w:jc w:val="right"/>
+                                </w:pPr>
+                                <w:r>
+                                  <w:rPr>
+                                    <w:noProof/>
+                                  </w:rPr>
+                                  <w:drawing>
+                                    <wp:inline distT="0" distB="0" distL="0" distR="0" wp14:anchorId="41DFA482" wp14:editId="0E7FB153">
+                                      <wp:extent cx="3295896" cy="2847975"/>
+                                      <wp:effectExtent l="0" t="0" r="0" b="0"/>
+                                      <wp:docPr id="3" name="Imagen 3"/>
+                                      <wp:cNvGraphicFramePr>
+                                        <a:graphicFrameLocks xmlns:a="http://schemas.openxmlformats.org/drawingml/2006/main" noChangeAspect="1"/>
+                                      </wp:cNvGraphicFramePr>
+                                      <a:graphic xmlns:a="http://schemas.openxmlformats.org/drawingml/2006/main">
+                                        <a:graphicData uri="http://schemas.openxmlformats.org/drawingml/2006/picture">
+                                          <pic:pic xmlns:pic="http://schemas.openxmlformats.org/drawingml/2006/picture">
+                                            <pic:nvPicPr>
+                                              <pic:cNvPr id="1" name=""/>
+                                              <pic:cNvPicPr/>
+                                            </pic:nvPicPr>
+                                            <pic:blipFill>
+                                              <a:blip r:embed="rId6"/>
+                                              <a:stretch>
+                                                <a:fillRect/>
+                                              </a:stretch>
+                                            </pic:blipFill>
+                                            <pic:spPr>
+                                              <a:xfrm>
+                                                <a:off x="0" y="0"/>
+                                                <a:ext cx="3327208" cy="2875032"/>
+                                              </a:xfrm>
+                                              <a:prstGeom prst="rect">
+                                                <a:avLst/>
+                                              </a:prstGeom>
+                                            </pic:spPr>
+                                          </pic:pic>
+                                        </a:graphicData>
+                                      </a:graphic>
+                                    </wp:inline>
+                                  </w:drawing>
+                                </w:r>
+                              </w:p>
+                              <w:sdt>
+                                <w:sdtPr>
+                                  <w:rPr>
+                                    <w:caps/>
+                                    <w:color w:val="191919" w:themeColor="text1" w:themeTint="E6"/>
+                                    <w:sz w:val="40"/>
+                                    <w:szCs w:val="40"/>
+                                  </w:rPr>
+                                  <w:alias w:val="Título"/>
+                                  <w:tag w:val=""/>
+                                  <w:id w:val="-438379639"/>
+                                  <w:dataBinding w:prefixMappings="xmlns:ns0='http://purl.org/dc/elements/1.1/' xmlns:ns1='http://schemas.openxmlformats.org/package/2006/metadata/core-properties' " w:xpath="/ns1:coreProperties[1]/ns0:title[1]" w:storeItemID="{6C3C8BC8-F283-45AE-878A-BAB7291924A1}"/>
+                                  <w:text/>
+                                </w:sdtPr>
+                                <w:sdtContent>
+                                  <w:p>
+                                    <w:pPr>
+                                      <w:pStyle w:val="Sinespaciado"/>
+                                      <w:spacing w:line="312" w:lineRule="auto"/>
+                                      <w:jc w:val="right"/>
+                                      <w:rPr>
+                                        <w:caps/>
+                                        <w:color w:val="191919" w:themeColor="text1" w:themeTint="E6"/>
+                                        <w:sz w:val="40"/>
+                                        <w:szCs w:val="40"/>
+                                      </w:rPr>
+                                    </w:pPr>
+                                    <w:r>
+                                      <w:rPr>
+                                        <w:caps/>
+                                        <w:color w:val="191919" w:themeColor="text1" w:themeTint="E6"/>
+                                        <w:sz w:val="40"/>
+                                        <w:szCs w:val="40"/>
+                                      </w:rPr>
+                                      <w:t>Memoria proyecto aplicaciones web</w:t>
+                                    </w:r>
+                                  </w:p>
+                                </w:sdtContent>
+                              </w:sdt>
+                              <w:sdt>
+                                <w:sdtPr>
+                                  <w:rPr>
+                                    <w:color w:val="000000" w:themeColor="text1"/>
+                                    <w:sz w:val="24"/>
+                                    <w:szCs w:val="24"/>
+                                  </w:rPr>
+                                  <w:alias w:val="Subtítulo"/>
+                                  <w:tag w:val=""/>
+                                  <w:id w:val="1354072561"/>
+                                  <w:dataBinding w:prefixMappings="xmlns:ns0='http://purl.org/dc/elements/1.1/' xmlns:ns1='http://schemas.openxmlformats.org/package/2006/metadata/core-properties' " w:xpath="/ns1:coreProperties[1]/ns0:subject[1]" w:storeItemID="{6C3C8BC8-F283-45AE-878A-BAB7291924A1}"/>
+                                  <w:text/>
+                                </w:sdtPr>
+                                <w:sdtContent>
+                                  <w:p>
+                                    <w:pPr>
+                                      <w:jc w:val="right"/>
+                                      <w:rPr>
+                                        <w:sz w:val="24"/>
+                                        <w:szCs w:val="24"/>
+                                      </w:rPr>
+                                    </w:pPr>
+                                    <w:r>
+                                      <w:rPr>
+                                        <w:color w:val="000000" w:themeColor="text1"/>
+                                        <w:sz w:val="24"/>
+                                        <w:szCs w:val="24"/>
+                                      </w:rPr>
+                                      <w:t>Trabajo de entrega obligatoria</w:t>
+                                    </w:r>
+                                  </w:p>
+                                </w:sdtContent>
+                              </w:sdt>
+                            </w:tc>
+                            <w:tc>
+                              <w:tcPr>
+                                <w:tcW w:w="2432" w:type="pct"/>
+                                <w:vAlign w:val="center"/>
+                              </w:tcPr>
+                              <w:p>
+                                <w:pPr>
+                                  <w:pStyle w:val="Sinespaciado"/>
+                                  <w:rPr>
+                                    <w:caps/>
+                                    <w:color w:val="E97132" w:themeColor="accent2"/>
+                                    <w:sz w:val="26"/>
+                                    <w:szCs w:val="26"/>
+                                  </w:rPr>
+                                </w:pPr>
+                                <w:r>
+                                  <w:rPr>
+                                    <w:caps/>
+                                    <w:color w:val="E97132" w:themeColor="accent2"/>
+                                    <w:sz w:val="26"/>
+                                    <w:szCs w:val="26"/>
+                                  </w:rPr>
+                                  <w:t>Descripción breve</w:t>
+                                </w:r>
+                              </w:p>
+                              <w:sdt>
+                                <w:sdtPr>
+                                  <w:rPr>
+                                    <w:color w:val="000000" w:themeColor="text1"/>
+                                  </w:rPr>
+                                  <w:alias w:val="Descripción breve"/>
+                                  <w:tag w:val=""/>
+                                  <w:id w:val="-2036181933"/>
+                                  <w:dataBinding w:prefixMappings="xmlns:ns0='http://schemas.microsoft.com/office/2006/coverPageProps' " w:xpath="/ns0:CoverPageProperties[1]/ns0:Abstract[1]" w:storeItemID="{55AF091B-3C7A-41E3-B477-F2FDAA23CFDA}"/>
+                                  <w:text/>
+                                </w:sdtPr>
+                                <w:sdtContent>
+                                  <w:p>
+                                    <w:pPr>
+                                      <w:rPr>
+                                        <w:color w:val="000000" w:themeColor="text1"/>
+                                      </w:rPr>
+                                    </w:pPr>
+                                    <w:r>
+                                      <w:rPr>
+                                        <w:color w:val="000000" w:themeColor="text1"/>
+                                      </w:rPr>
+                                      <w:t>Memoria técnica y Manual de usuario de</w:t>
+                                    </w:r>
+                                    <w:r>
+                                      <w:rPr>
+                                        <w:color w:val="000000" w:themeColor="text1"/>
+                                      </w:rPr>
+                                      <w:t xml:space="preserve"> la aplicación de </w:t>
+                                    </w:r>
+                                    <w:proofErr w:type="spellStart"/>
+                                    <w:r>
+                                      <w:rPr>
+                                        <w:color w:val="000000" w:themeColor="text1"/>
+                                      </w:rPr>
+                                      <w:t>Uned</w:t>
+                                    </w:r>
+                                    <w:proofErr w:type="spellEnd"/>
+                                    <w:r>
+                                      <w:rPr>
+                                        <w:color w:val="000000" w:themeColor="text1"/>
+                                      </w:rPr>
+                                      <w:t xml:space="preserve"> Cursos Web</w:t>
+                                    </w:r>
+                                    <w:r>
+                                      <w:rPr>
+                                        <w:color w:val="000000" w:themeColor="text1"/>
+                                      </w:rPr>
+                                      <w:t xml:space="preserve"> (UCW)</w:t>
+                                    </w:r>
+                                    <w:r>
+                                      <w:rPr>
+                                        <w:color w:val="000000" w:themeColor="text1"/>
+                                      </w:rPr>
+                                      <w:t>.</w:t>
+                                    </w:r>
+                                    <w:r>
+                                      <w:rPr>
+                                        <w:color w:val="000000" w:themeColor="text1"/>
+                                      </w:rPr>
+                                      <w:t xml:space="preserve"> </w:t>
+                                    </w:r>
+                                  </w:p>
+                                </w:sdtContent>
+                              </w:sdt>
+                              <w:sdt>
+                                <w:sdtPr>
+                                  <w:rPr>
+                                    <w:color w:val="E97132" w:themeColor="accent2"/>
+                                    <w:sz w:val="26"/>
+                                    <w:szCs w:val="26"/>
+                                  </w:rPr>
+                                  <w:alias w:val="Autor"/>
+                                  <w:tag w:val=""/>
+                                  <w:id w:val="-279026076"/>
+                                  <w:dataBinding w:prefixMappings="xmlns:ns0='http://purl.org/dc/elements/1.1/' xmlns:ns1='http://schemas.openxmlformats.org/package/2006/metadata/core-properties' " w:xpath="/ns1:coreProperties[1]/ns0:creator[1]" w:storeItemID="{6C3C8BC8-F283-45AE-878A-BAB7291924A1}"/>
+                                  <w:text/>
+                                </w:sdtPr>
+                                <w:sdtContent>
+                                  <w:p>
+                                    <w:pPr>
+                                      <w:pStyle w:val="Sinespaciado"/>
+                                      <w:rPr>
+                                        <w:color w:val="E97132" w:themeColor="accent2"/>
+                                        <w:sz w:val="26"/>
+                                        <w:szCs w:val="26"/>
+                                      </w:rPr>
+                                    </w:pPr>
+                                    <w:r>
+                                      <w:rPr>
+                                        <w:color w:val="E97132" w:themeColor="accent2"/>
+                                        <w:sz w:val="26"/>
+                                        <w:szCs w:val="26"/>
+                                      </w:rPr>
+                                      <w:t>FRANCISCO JAVIER MARTINEZ SANCHEZ</w:t>
+                                    </w:r>
+                                  </w:p>
+                                </w:sdtContent>
+                              </w:sdt>
+                              <w:p>
+                                <w:pPr>
+                                  <w:pStyle w:val="Sinespaciado"/>
+                                </w:pPr>
+                                <w:sdt>
+                                  <w:sdtPr>
+                                    <w:rPr>
+                                      <w:color w:val="0E2841" w:themeColor="text2"/>
+                                    </w:rPr>
+                                    <w:alias w:val="Curso"/>
+                                    <w:tag w:val="Curso"/>
+                                    <w:id w:val="-710501431"/>
+                                    <w:dataBinding w:prefixMappings="xmlns:ns0='http://purl.org/dc/elements/1.1/' xmlns:ns1='http://schemas.openxmlformats.org/package/2006/metadata/core-properties' " w:xpath="/ns1:coreProperties[1]/ns1:category[1]" w:storeItemID="{6C3C8BC8-F283-45AE-878A-BAB7291924A1}"/>
+                                    <w:text/>
+                                  </w:sdtPr>
+                                  <w:sdtContent>
+                                    <w:r>
+                                      <w:rPr>
+                                        <w:color w:val="0E2841" w:themeColor="text2"/>
+                                      </w:rPr>
+                                      <w:t>fmartinez320</w:t>
+                                    </w:r>
+                                    <w:r>
+                                      <w:rPr>
+                                        <w:color w:val="0E2841" w:themeColor="text2"/>
+                                      </w:rPr>
+                                      <w:t>@alumno.uned.es</w:t>
+                                    </w:r>
+                                  </w:sdtContent>
+                                </w:sdt>
+                              </w:p>
+                            </w:tc>
+                          </w:tr>
+                        </w:tbl>
+                        <w:p/>
+                      </w:txbxContent>
+                    </v:textbox>
+                    <w10:wrap anchorx="page" anchory="page"/>
+                  </v:shape>
+                </w:pict>
+              </mc:Fallback>
+            </mc:AlternateContent>
+          </w:r>
+          <w:r>
+            <w:br w:type="page"/>
+          </w:r>
+        </w:p>
+      </w:sdtContent>
+    </w:sdt>
     <w:p>
       <w:pPr>
         <w:pStyle w:val="Ttulo"/>
         <w:jc w:val="center"/>
       </w:pPr>
+    </w:p>
+    <w:p>
+      <w:pPr>
+        <w:pStyle w:val="Ttulo"/>
+        <w:jc w:val="center"/>
+      </w:pPr>
+      <w:r>
+        <w:t>PLAN DE PROYECTO</w:t>
+      </w:r>
+    </w:p>
+    <w:p>
+      <w:pPr>
+        <w:pStyle w:val="Ttulo1"/>
+      </w:pPr>
+      <w:r>
+        <w:t>1.- Datos básicos de la aplicación</w:t>
+      </w:r>
+    </w:p>
+    <w:p>
+      <w:r>
+        <w:t>- Aplicación:</w:t>
+      </w:r>
+      <w:r>
+        <w:t xml:space="preserve"> UCW (</w:t>
+      </w:r>
+      <w:proofErr w:type="spellStart"/>
+      <w:r>
+        <w:t>Uned</w:t>
+      </w:r>
+      <w:proofErr w:type="spellEnd"/>
+      <w:r>
+        <w:t xml:space="preserve"> Cursos Web.</w:t>
+      </w:r>
+    </w:p>
+    <w:p>
+      <w:r>
+        <w:t>- Descripción:</w:t>
+      </w:r>
+      <w:r>
+        <w:tab/>
+        <w:t>Plataforma de formación a través de cursos orientados al aprendizaje y conocimiento de diversas materias.</w:t>
+      </w:r>
+    </w:p>
+    <w:p>
+      <w:r>
+        <w:t>- Fecha prevista de entrega:</w:t>
+      </w:r>
+      <w:r>
+        <w:t xml:space="preserve"> 06/06/2026</w:t>
+      </w:r>
+    </w:p>
+    <w:p>
+      <w:r>
+        <w:t xml:space="preserve">- Responsable del proyecto: Francisco Javier Martínez Sánchez (24200346E). </w:t>
+      </w:r>
+    </w:p>
+    <w:p>
+      <w:r>
+        <w:tab/>
+        <w:t>e-mail: fmartinez320@alumno.uned.es</w:t>
+      </w:r>
+    </w:p>
+    <w:p>
+      <w:pPr>
+        <w:pStyle w:val="Ttulo2"/>
+      </w:pPr>
+      <w:r>
+        <w:t>2.- Enunciado de la práctica</w:t>
+      </w:r>
+    </w:p>
+    <w:p/>
+    <w:p>
+      <w:r>
+        <w:tab/>
+        <w:t>Se solicita la i</w:t>
+      </w:r>
+      <w:r>
+        <w:t xml:space="preserve">mplementación de una plataforma web de formación online que permita a los usuarios acceder a un catálogo de cursos a través de un dispositivo con conexión a Internet. </w:t>
+      </w:r>
+    </w:p>
+    <w:p>
+      <w:pPr>
+        <w:ind w:firstLine="708"/>
+      </w:pPr>
+      <w:r>
+        <w:t xml:space="preserve">La plataforma estará orientada a la gestión integral del proceso formativo, desde la consulta de la oferta de cursos hasta el seguimiento del progreso de los usuarios inscritos. La plataforma ofrecerá a los usuarios una experiencia personalizada. En el momento del registro, los usuarios podrán indicar sus intereses formativos, tales como áreas de conocimiento o temáticas de preferencia. A partir de esta información inicial, y en función de la actividad del usuario en la plataforma (cursos realizados, progreso, valoraciones), el sistema podrá adaptar progresivamente la presentación de los cursos, facilitando el acceso a aquellos contenidos más acordes con sus intereses y trayectoria formativa. </w:t>
+      </w:r>
+    </w:p>
+    <w:p>
+      <w:pPr>
+        <w:ind w:firstLine="708"/>
+      </w:pPr>
+      <w:r>
+        <w:t xml:space="preserve">Los usuarios registrados podrán explorar el catálogo de cursos, inscribirse en aquellos de su interés y acceder a los contenidos asociados a cada curso. Asimismo, dispondrán de herramientas para realizar búsquedas y filtrados avanzados que les permitan localizar cursos por distintos criterios, como temática, nivel o responsable del curso, mejorando así la usabilidad y accesibilidad de la plataforma. </w:t>
+      </w:r>
+    </w:p>
+    <w:p>
+      <w:pPr>
+        <w:ind w:firstLine="708"/>
+      </w:pPr>
+      <w:r>
+        <w:t>De forma complementaria, la plataforma contará con perfiles de usuario con diferentes responsabilidades, que permitirán la gestión de los cursos y de los usuarios, así como la consulta de información agregada sobre el uso de la plataforma. Todo ello se integrará en una aplicación web que deberá seguir principios de buen diseño y buenas prácticas de ingeniería del software, acordes con los contenidos de la asignatura.</w:t>
+      </w:r>
+    </w:p>
+    <w:p>
+      <w:pPr>
+        <w:ind w:firstLine="708"/>
+      </w:pPr>
+    </w:p>
+    <w:p>
+      <w:pPr>
+        <w:pStyle w:val="Ttulo2"/>
+      </w:pPr>
+      <w:r>
+        <w:t xml:space="preserve">3.- </w:t>
+      </w:r>
+      <w:r>
+        <w:t xml:space="preserve">Alcance del proyecto. </w:t>
+      </w:r>
+      <w:r>
+        <w:t>Casos de Uso</w:t>
+      </w:r>
+    </w:p>
+    <w:p>
+      <w:pPr>
+        <w:ind w:firstLine="708"/>
+      </w:pPr>
+      <w:r>
+        <w:t xml:space="preserve">De acuerdo a los requerimientos iniciales se establece este diagrama de CU (casos de uso) a ser implementados por la </w:t>
+      </w:r>
+      <w:proofErr w:type="spellStart"/>
+      <w:r>
+        <w:t>aplicación.</w:t>
+      </w:r>
+      <w:r>
+        <w:t>Requisitos</w:t>
+      </w:r>
+      <w:proofErr w:type="spellEnd"/>
+      <w:r>
+        <w:t xml:space="preserve"> de usuario del Proyecto</w:t>
+      </w:r>
+    </w:p>
+    <w:p>
+      <w:pPr>
+        <w:ind w:firstLine="708"/>
+      </w:pPr>
+      <w:r>
+        <w:drawing>
+          <wp:inline distT="0" distB="0" distL="0" distR="0" wp14:anchorId="0BD20DB9" wp14:editId="20A2DA1F">
+            <wp:extent cx="5400040" cy="4529455"/>
+            <wp:effectExtent l="0" t="0" r="0" b="4445"/>
+            <wp:docPr id="4" name="Imagen 4"/>
+            <wp:cNvGraphicFramePr>
+              <a:graphicFrameLocks xmlns:a="http://schemas.openxmlformats.org/drawingml/2006/main" noChangeAspect="1"/>
+            </wp:cNvGraphicFramePr>
+            <a:graphic xmlns:a="http://schemas.openxmlformats.org/drawingml/2006/main">
+              <a:graphicData uri="http://schemas.openxmlformats.org/drawingml/2006/picture">
+                <pic:pic xmlns:pic="http://schemas.openxmlformats.org/drawingml/2006/picture">
+                  <pic:nvPicPr>
+                    <pic:cNvPr id="1" name=""/>
+                    <pic:cNvPicPr/>
+                  </pic:nvPicPr>
+                  <pic:blipFill>
+                    <a:blip r:embed="rId7"/>
+                    <a:stretch>
+                      <a:fillRect/>
+                    </a:stretch>
+                  </pic:blipFill>
+                  <pic:spPr>
+                    <a:xfrm>
+                      <a:off x="0" y="0"/>
+                      <a:ext cx="5400040" cy="4529455"/>
+                    </a:xfrm>
+                    <a:prstGeom prst="rect">
+                      <a:avLst/>
+                    </a:prstGeom>
+                  </pic:spPr>
+                </pic:pic>
+              </a:graphicData>
+            </a:graphic>
+          </wp:inline>
+        </w:drawing>
+      </w:r>
+    </w:p>
+    <w:p>
+      <w:r>
+        <w:t>4.- Requisitos Funcionales</w:t>
+      </w:r>
+    </w:p>
+    <w:p/>
+    <w:p>
+      <w:r>
+        <w:t>Requisitos no funcionales</w:t>
+      </w:r>
+    </w:p>
+    <w:p>
+      <w:r>
+        <w:t>5.- Solución técnica elegida</w:t>
+      </w:r>
+    </w:p>
+    <w:p>
+      <w:r>
+        <w:t>6.- Dimensionamiento previsto del proyecto</w:t>
+      </w:r>
+    </w:p>
+    <w:p>
+      <w:r>
+        <w:t>6.1- Descripción de actividades principales y recursos necesarios</w:t>
+      </w:r>
+    </w:p>
+    <w:p>
+      <w:r>
+        <w:t>6.2- Cálculo inicial de esfuerzo</w:t>
+      </w:r>
+    </w:p>
+    <w:p>
+      <w:r>
+        <w:t>6.3- Planificación aproximada</w:t>
+      </w:r>
+    </w:p>
+    <w:p>
+      <w:r>
+        <w:t>6.4. Estrategia de desarrollo</w:t>
+      </w:r>
+    </w:p>
+    <w:p>
+      <w:r>
+        <w:t>7.- Diagrama de contexto</w:t>
+      </w:r>
+    </w:p>
+    <w:p>
+      <w:r>
+        <w:t>8.- Interfaces de usuario</w:t>
+      </w:r>
+    </w:p>
+    <w:p>
+      <w:r>
+        <w:t>9.- Modelo de datos (ERD)</w:t>
+      </w:r>
+    </w:p>
+    <w:p>
+      <w:r>
+        <w:t>10.- Arquitectura del sistema</w:t>
+      </w:r>
+    </w:p>
+    <w:p>
+      <w:r>
+        <w:t>11.- Módulos de la aplicación.</w:t>
+      </w:r>
+    </w:p>
+    <w:p>
+      <w:r>
+        <w:t>12.- Diagrama de clases</w:t>
+      </w:r>
+    </w:p>
+    <w:p/>
+    <w:p>
+      <w:pPr>
+        <w:pStyle w:val="Ttulo"/>
+        <w:jc w:val="center"/>
+      </w:pPr>
       <w:r>
         <w:t>MANUAL DE USUARIO</w:t>
       </w:r>
@@ -24,15 +1020,7 @@
         <w:t xml:space="preserve">Al acceder a la aplicación se visualizarán </w:t>
       </w:r>
       <w:r>
-        <w:t xml:space="preserve">la </w:t>
-      </w:r>
-      <w:proofErr w:type="gramStart"/>
-      <w:r>
-        <w:t>home pública</w:t>
-      </w:r>
-      <w:proofErr w:type="gramEnd"/>
-      <w:r>
-        <w:t xml:space="preserve"> </w:t>
+        <w:t xml:space="preserve">la home pública </w:t>
       </w:r>
     </w:p>
     <w:p>
@@ -56,7 +1044,7 @@
                     <pic:cNvPicPr/>
                   </pic:nvPicPr>
                   <pic:blipFill>
-                    <a:blip r:embed="rId5">
+                    <a:blip r:embed="rId8">
                       <a:extLst>
                         <a:ext uri="{28A0092B-C50C-407E-A947-70E740481C1C}">
                           <a14:useLocalDpi xmlns:a14="http://schemas.microsoft.com/office/drawing/2010/main" val="0"/>
@@ -90,21 +1078,7 @@
         <w:rPr>
           <w:rStyle w:val="Ttulo2Car"/>
         </w:rPr>
-        <w:t xml:space="preserve">1.- </w:t>
-      </w:r>
-      <w:proofErr w:type="gramStart"/>
-      <w:r>
-        <w:rPr>
-          <w:rStyle w:val="Ttulo2Car"/>
-        </w:rPr>
-        <w:t>Link</w:t>
-      </w:r>
-      <w:proofErr w:type="gramEnd"/>
-      <w:r>
-        <w:rPr>
-          <w:rStyle w:val="Ttulo2Car"/>
-        </w:rPr>
-        <w:t xml:space="preserve"> a la Home</w:t>
+        <w:t>1.- Link a la Home</w:t>
       </w:r>
       <w:r>
         <w:t xml:space="preserve">. Desde cualquier parte de la aplicación se podrá volver a la “home” </w:t>
@@ -174,23 +1148,7 @@
         <w:t>7.- Selector de idioma.</w:t>
       </w:r>
       <w:r>
-        <w:t xml:space="preserve"> Al desplegar la opción se podrá seleccionar uno de los dos idiomas disponibles (</w:t>
-      </w:r>
-      <w:proofErr w:type="gramStart"/>
-      <w:r>
-        <w:t>Español</w:t>
-      </w:r>
-      <w:proofErr w:type="gramEnd"/>
-      <w:r>
-        <w:t xml:space="preserve"> e </w:t>
-      </w:r>
-      <w:proofErr w:type="gramStart"/>
-      <w:r>
-        <w:t>Inglés</w:t>
-      </w:r>
-      <w:proofErr w:type="gramEnd"/>
-      <w:r>
-        <w:t>).</w:t>
+        <w:t xml:space="preserve"> Al desplegar la opción se podrá seleccionar uno de los dos idiomas disponibles (Español e Inglés).</w:t>
       </w:r>
     </w:p>
     <w:p>
@@ -207,7 +1165,6 @@
         </w:numPr>
       </w:pPr>
       <w:r>
-        <w:lastRenderedPageBreak/>
         <w:t>Cursos más populares. Ordenados por el número de visitas.</w:t>
       </w:r>
     </w:p>
@@ -259,6 +1216,9 @@
         <w:jc w:val="center"/>
       </w:pPr>
       <w:r>
+        <w:rPr>
+          <w:noProof/>
+        </w:rPr>
         <w:drawing>
           <wp:inline distT="0" distB="0" distL="0" distR="0" wp14:anchorId="1CE9C2FC" wp14:editId="4EE9F5BE">
             <wp:extent cx="2457793" cy="2829320"/>
@@ -275,7 +1235,7 @@
                     <pic:cNvPicPr/>
                   </pic:nvPicPr>
                   <pic:blipFill>
-                    <a:blip r:embed="rId6"/>
+                    <a:blip r:embed="rId9"/>
                     <a:stretch>
                       <a:fillRect/>
                     </a:stretch>
@@ -319,6 +1279,9 @@
         <w:jc w:val="center"/>
       </w:pPr>
       <w:r>
+        <w:rPr>
+          <w:noProof/>
+        </w:rPr>
         <w:drawing>
           <wp:inline distT="0" distB="0" distL="0" distR="0" wp14:anchorId="3E5F2810" wp14:editId="6390C627">
             <wp:extent cx="2086266" cy="1028844"/>
@@ -335,7 +1298,7 @@
                     <pic:cNvPicPr/>
                   </pic:nvPicPr>
                   <pic:blipFill>
-                    <a:blip r:embed="rId7"/>
+                    <a:blip r:embed="rId10"/>
                     <a:stretch>
                       <a:fillRect/>
                     </a:stretch>
@@ -367,6 +1330,9 @@
         <w:jc w:val="center"/>
       </w:pPr>
       <w:r>
+        <w:rPr>
+          <w:noProof/>
+        </w:rPr>
         <w:drawing>
           <wp:inline distT="0" distB="0" distL="0" distR="0" wp14:anchorId="60CF4710" wp14:editId="0AE62375">
             <wp:extent cx="3429479" cy="971686"/>
@@ -383,7 +1349,7 @@
                     <pic:cNvPicPr/>
                   </pic:nvPicPr>
                   <pic:blipFill>
-                    <a:blip r:embed="rId8"/>
+                    <a:blip r:embed="rId11"/>
                     <a:stretch>
                       <a:fillRect/>
                     </a:stretch>
@@ -414,23 +1380,17 @@
         <w:pStyle w:val="Ttulo1"/>
       </w:pPr>
       <w:r>
-        <w:lastRenderedPageBreak/>
         <w:t>Registro de Usuarios</w:t>
       </w:r>
     </w:p>
     <w:p>
       <w:r>
-        <w:t>La realizaremos desde la opción de menú “Acceso”-</w:t>
-      </w:r>
-      <w:proofErr w:type="gramStart"/>
-      <w:r>
-        <w:t>&gt;”Registrarse</w:t>
-      </w:r>
-      <w:proofErr w:type="gramEnd"/>
-      <w:r>
-        <w:t xml:space="preserve">” o desde la pantalla de Login </w:t>
-      </w:r>
-      <w:r>
+        <w:t xml:space="preserve">La realizaremos desde la opción de menú “Acceso”-&gt;”Registrarse” o desde la pantalla de Login </w:t>
+      </w:r>
+      <w:r>
+        <w:rPr>
+          <w:noProof/>
+        </w:rPr>
         <w:drawing>
           <wp:inline distT="0" distB="0" distL="0" distR="0" wp14:anchorId="67919EEC" wp14:editId="588AB1F4">
             <wp:extent cx="1905266" cy="552527"/>
@@ -447,7 +1407,7 @@
                     <pic:cNvPicPr/>
                   </pic:nvPicPr>
                   <pic:blipFill>
-                    <a:blip r:embed="rId9"/>
+                    <a:blip r:embed="rId12"/>
                     <a:stretch>
                       <a:fillRect/>
                     </a:stretch>
@@ -478,6 +1438,9 @@
     </w:p>
     <w:p>
       <w:r>
+        <w:rPr>
+          <w:noProof/>
+        </w:rPr>
         <w:drawing>
           <wp:inline distT="0" distB="0" distL="0" distR="0" wp14:anchorId="31B1B5DC" wp14:editId="57154ADF">
             <wp:extent cx="5400040" cy="3000375"/>
@@ -494,7 +1457,7 @@
                     <pic:cNvPicPr/>
                   </pic:nvPicPr>
                   <pic:blipFill>
-                    <a:blip r:embed="rId10"/>
+                    <a:blip r:embed="rId13"/>
                     <a:stretch>
                       <a:fillRect/>
                     </a:stretch>
@@ -711,16 +1674,11 @@
       <w:r>
         <w:t xml:space="preserve">datos para </w:t>
       </w:r>
-      <w:proofErr w:type="gramStart"/>
       <w:r>
         <w:t xml:space="preserve">definir </w:t>
       </w:r>
       <w:r>
-        <w:t xml:space="preserve"> un</w:t>
-      </w:r>
-      <w:proofErr w:type="gramEnd"/>
-      <w:r>
-        <w:t xml:space="preserve"> módulo al sistema</w:t>
+        <w:t xml:space="preserve"> un módulo al sistema</w:t>
       </w:r>
     </w:p>
     <w:p>
@@ -728,7 +1686,6 @@
         <w:rPr>
           <w:noProof/>
         </w:rPr>
-        <w:lastRenderedPageBreak/>
         <w:drawing>
           <wp:inline distT="0" distB="0" distL="0" distR="0" wp14:anchorId="69BF6817" wp14:editId="410F6A6C">
             <wp:extent cx="5400040" cy="2590165"/>
@@ -745,7 +1702,7 @@
                     <pic:cNvPicPr/>
                   </pic:nvPicPr>
                   <pic:blipFill>
-                    <a:blip r:embed="rId11">
+                    <a:blip r:embed="rId14">
                       <a:extLst>
                         <a:ext uri="{28A0092B-C50C-407E-A947-70E740481C1C}">
                           <a14:useLocalDpi xmlns:a14="http://schemas.microsoft.com/office/drawing/2010/main" val="0"/>
@@ -915,7 +1872,7 @@
                     <pic:cNvPicPr/>
                   </pic:nvPicPr>
                   <pic:blipFill>
-                    <a:blip r:embed="rId12">
+                    <a:blip r:embed="rId15">
                       <a:extLst>
                         <a:ext uri="{28A0092B-C50C-407E-A947-70E740481C1C}">
                           <a14:useLocalDpi xmlns:a14="http://schemas.microsoft.com/office/drawing/2010/main" val="0"/>
@@ -1018,7 +1975,6 @@
     </w:p>
     <w:p>
       <w:r>
-        <w:lastRenderedPageBreak/>
         <w:t xml:space="preserve">    ↓</w:t>
       </w:r>
     </w:p>
@@ -1104,17 +2060,12 @@
         <w:t xml:space="preserve"> → </w:t>
       </w:r>
       <w:proofErr w:type="spellStart"/>
-      <w:proofErr w:type="gramStart"/>
       <w:r>
         <w:t>getConnectedUsers</w:t>
       </w:r>
       <w:proofErr w:type="spellEnd"/>
       <w:r>
-        <w:t>(</w:t>
-      </w:r>
-      <w:proofErr w:type="gramEnd"/>
-      <w:r>
-        <w:t>)</w:t>
+        <w:t>()</w:t>
       </w:r>
     </w:p>
     <w:p/>
@@ -1142,17 +2093,12 @@
         <w:t>│        Usuario (</w:t>
       </w:r>
       <w:proofErr w:type="spellStart"/>
-      <w:proofErr w:type="gramStart"/>
       <w:r>
         <w:t>Logout</w:t>
       </w:r>
       <w:proofErr w:type="spellEnd"/>
       <w:r>
-        <w:t xml:space="preserve">)   </w:t>
-      </w:r>
-      <w:proofErr w:type="gramEnd"/>
-      <w:r>
-        <w:t xml:space="preserve">   │</w:t>
+        <w:t>)      │</w:t>
       </w:r>
     </w:p>
     <w:p>
@@ -1263,13 +2209,8 @@
       </w:r>
     </w:p>
     <w:p>
-      <w:proofErr w:type="gramStart"/>
-      <w:r>
-        <w:t>│  -</w:t>
-      </w:r>
-      <w:proofErr w:type="gramEnd"/>
-      <w:r>
-        <w:t xml:space="preserve"> Obtiene </w:t>
+      <w:r>
+        <w:t xml:space="preserve">│  - Obtiene </w:t>
       </w:r>
       <w:proofErr w:type="spellStart"/>
       <w:r>
@@ -1281,26 +2222,16 @@
       </w:r>
     </w:p>
     <w:p>
-      <w:proofErr w:type="gramStart"/>
-      <w:r>
-        <w:t>│  -</w:t>
-      </w:r>
-      <w:proofErr w:type="gramEnd"/>
-      <w:r>
-        <w:t xml:space="preserve"> </w:t>
+      <w:r>
+        <w:t xml:space="preserve">│  - </w:t>
       </w:r>
       <w:proofErr w:type="spellStart"/>
       <w:r>
         <w:t>sessionRegistry.removeSessionInfo</w:t>
       </w:r>
       <w:proofErr w:type="spellEnd"/>
-      <w:proofErr w:type="gramStart"/>
-      <w:r>
-        <w:t xml:space="preserve">()   </w:t>
-      </w:r>
-      <w:proofErr w:type="gramEnd"/>
-      <w:r>
-        <w:t>│</w:t>
+      <w:r>
+        <w:t>()   │</w:t>
       </w:r>
     </w:p>
     <w:p>
@@ -1343,7 +2274,6 @@
     </w:p>
     <w:p>
       <w:r>
-        <w:lastRenderedPageBreak/>
         <w:t xml:space="preserve">│           </w:t>
       </w:r>
       <w:proofErr w:type="spellStart"/>
@@ -1356,21 +2286,8 @@
       </w:r>
     </w:p>
     <w:p>
-      <w:proofErr w:type="gramStart"/>
-      <w:r>
-        <w:t>│  (</w:t>
-      </w:r>
-      <w:proofErr w:type="gramEnd"/>
-      <w:r>
-        <w:t xml:space="preserve">Elimina la sesión del </w:t>
-      </w:r>
-      <w:proofErr w:type="gramStart"/>
-      <w:r>
-        <w:t xml:space="preserve">usuario)   </w:t>
-      </w:r>
-      <w:proofErr w:type="gramEnd"/>
-      <w:r>
-        <w:t xml:space="preserve">      │</w:t>
+      <w:r>
+        <w:t>│  (Elimina la sesión del usuario)         │</w:t>
       </w:r>
     </w:p>
     <w:p>
@@ -1421,15 +2338,7 @@
       </w:r>
       <w:proofErr w:type="spellEnd"/>
       <w:r>
-        <w:t>() (</w:t>
-      </w:r>
-      <w:proofErr w:type="gramStart"/>
-      <w:r>
-        <w:t xml:space="preserve">Spring)   </w:t>
-      </w:r>
-      <w:proofErr w:type="gramEnd"/>
-      <w:r>
-        <w:t xml:space="preserve"> │</w:t>
+        <w:t>() (Spring)    │</w:t>
       </w:r>
     </w:p>
     <w:p>
@@ -1483,12 +2392,10 @@
         <w:t xml:space="preserve"> (/</w:t>
       </w:r>
       <w:proofErr w:type="spellStart"/>
-      <w:proofErr w:type="gramStart"/>
       <w:r>
         <w:t>login?logout</w:t>
       </w:r>
       <w:proofErr w:type="spellEnd"/>
-      <w:proofErr w:type="gramEnd"/>
       <w:r>
         <w:t>)       │</w:t>
       </w:r>
@@ -1506,13 +2413,8 @@
     </w:p>
     <w:p>
       <w:r>
-        <w:t xml:space="preserve">Se implementa la validación de datos en </w:t>
-      </w:r>
-      <w:proofErr w:type="gramStart"/>
-      <w:r>
-        <w:t>las vis</w:t>
-      </w:r>
-      <w:proofErr w:type="gramEnd"/>
+        <w:t>Se implementa la validación de datos en las vis</w:t>
+      </w:r>
     </w:p>
     <w:p>
       <w:r>
@@ -1582,7 +2484,6 @@
         <w:t xml:space="preserve"> </w:t>
       </w:r>
       <w:proofErr w:type="spellStart"/>
-      <w:proofErr w:type="gramStart"/>
       <w:r>
         <w:rPr>
           <w:rFonts w:ascii="Consolas" w:hAnsi="Consolas"/>
@@ -1594,7 +2495,6 @@
         <w:t>th:fragment</w:t>
       </w:r>
       <w:proofErr w:type="spellEnd"/>
-      <w:proofErr w:type="gramEnd"/>
       <w:r>
         <w:rPr>
           <w:rFonts w:ascii="Consolas" w:hAnsi="Consolas"/>
@@ -1700,7 +2600,6 @@
         <w:t xml:space="preserve"> </w:t>
       </w:r>
       <w:proofErr w:type="spellStart"/>
-      <w:proofErr w:type="gramStart"/>
       <w:r>
         <w:rPr>
           <w:rFonts w:ascii="Consolas" w:hAnsi="Consolas"/>
@@ -1712,7 +2611,6 @@
         <w:t>th:if</w:t>
       </w:r>
       <w:proofErr w:type="spellEnd"/>
-      <w:proofErr w:type="gramEnd"/>
       <w:r>
         <w:rPr>
           <w:rFonts w:ascii="Consolas" w:hAnsi="Consolas"/>
@@ -2151,7 +3049,6 @@
         </w:rPr>
       </w:pPr>
       <w:proofErr w:type="spellStart"/>
-      <w:proofErr w:type="gramStart"/>
       <w:r>
         <w:rPr>
           <w:rFonts w:ascii="Courier New" w:eastAsia="Times New Roman" w:hAnsi="Courier New" w:cs="Courier New"/>
@@ -2162,7 +3059,6 @@
         <w:t>model.addAttribute</w:t>
       </w:r>
       <w:proofErr w:type="spellEnd"/>
-      <w:proofErr w:type="gramEnd"/>
       <w:r>
         <w:rPr>
           <w:rFonts w:ascii="Courier New" w:eastAsia="Times New Roman" w:hAnsi="Courier New" w:cs="Courier New"/>
@@ -2227,7 +3123,6 @@
     <w:p/>
     <w:p>
       <w:r>
-        <w:lastRenderedPageBreak/>
         <w:t>PATRONES UTILIZADOS</w:t>
       </w:r>
     </w:p>
@@ -2308,13 +3203,8 @@
         <w:t xml:space="preserve"> mediante anotaciones “</w:t>
       </w:r>
       <w:proofErr w:type="spellStart"/>
-      <w:proofErr w:type="gramStart"/>
-      <w:r>
-        <w:t>jakarta.validation</w:t>
-      </w:r>
-      <w:proofErr w:type="gramEnd"/>
-      <w:r>
-        <w:t>.constraints</w:t>
+      <w:r>
+        <w:t>jakarta.validation.constraints</w:t>
       </w:r>
       <w:proofErr w:type="spellEnd"/>
       <w:r>
@@ -2470,15 +3360,7 @@
         <w:t>@FutureOrPresent</w:t>
       </w:r>
       <w:r>
-        <w:t xml:space="preserve"> Para fechas, que el valor sea mayor o igual </w:t>
-      </w:r>
-      <w:proofErr w:type="gramStart"/>
-      <w:r>
-        <w:t>al día de hoy</w:t>
-      </w:r>
-      <w:proofErr w:type="gramEnd"/>
-      <w:r>
-        <w:t>.</w:t>
+        <w:t xml:space="preserve"> Para fechas, que el valor sea mayor o igual al día de hoy.</w:t>
       </w:r>
     </w:p>
     <w:p>
@@ -2609,7 +3491,6 @@
         </w:rPr>
         <w:t>@</w:t>
       </w:r>
-      <w:proofErr w:type="gramStart"/>
       <w:r>
         <w:rPr>
           <w:rFonts w:ascii="Consolas" w:hAnsi="Consolas"/>
@@ -2627,17 +3508,7 @@
           <w:sz w:val="18"/>
           <w:szCs w:val="18"/>
         </w:rPr>
-        <w:t>(</w:t>
-      </w:r>
-      <w:proofErr w:type="gramEnd"/>
-      <w:r>
-        <w:rPr>
-          <w:rFonts w:ascii="Consolas" w:hAnsi="Consolas"/>
-          <w:color w:val="000000"/>
-          <w:sz w:val="18"/>
-          <w:szCs w:val="18"/>
-        </w:rPr>
-        <w:t xml:space="preserve">message = </w:t>
+        <w:t xml:space="preserve">(message = </w:t>
       </w:r>
       <w:r>
         <w:rPr>
@@ -2646,19 +3517,8 @@
           <w:sz w:val="18"/>
           <w:szCs w:val="18"/>
         </w:rPr>
-        <w:t>"{</w:t>
-      </w:r>
-      <w:proofErr w:type="gramStart"/>
-      <w:r>
-        <w:rPr>
-          <w:rFonts w:ascii="Consolas" w:hAnsi="Consolas"/>
-          <w:color w:val="2A00FF"/>
-          <w:sz w:val="18"/>
-          <w:szCs w:val="18"/>
-        </w:rPr>
-        <w:t>validations.mensaje</w:t>
-      </w:r>
-      <w:proofErr w:type="gramEnd"/>
+        <w:t>"{validations.mensaje</w:t>
+      </w:r>
       <w:r>
         <w:rPr>
           <w:rFonts w:ascii="Consolas" w:hAnsi="Consolas"/>
@@ -2729,7 +3589,27 @@
           <w:sz w:val="18"/>
           <w:szCs w:val="18"/>
         </w:rPr>
-        <w:t xml:space="preserve"> String </w:t>
+        <w:t xml:space="preserve"> </w:t>
+      </w:r>
+      <w:proofErr w:type="spellStart"/>
+      <w:r>
+        <w:rPr>
+          <w:rFonts w:ascii="Consolas" w:hAnsi="Consolas"/>
+          <w:color w:val="000000"/>
+          <w:sz w:val="18"/>
+          <w:szCs w:val="18"/>
+        </w:rPr>
+        <w:t>String</w:t>
+      </w:r>
+      <w:proofErr w:type="spellEnd"/>
+      <w:r>
+        <w:rPr>
+          <w:rFonts w:ascii="Consolas" w:hAnsi="Consolas"/>
+          <w:color w:val="000000"/>
+          <w:sz w:val="18"/>
+          <w:szCs w:val="18"/>
+        </w:rPr>
+        <w:t xml:space="preserve"> </w:t>
       </w:r>
       <w:r>
         <w:rPr>
@@ -2795,7 +3675,6 @@
         </w:rPr>
         <w:t>@</w:t>
       </w:r>
-      <w:proofErr w:type="gramStart"/>
       <w:r>
         <w:rPr>
           <w:rFonts w:ascii="Consolas" w:hAnsi="Consolas"/>
@@ -2823,17 +3702,7 @@
           <w:sz w:val="18"/>
           <w:szCs w:val="18"/>
         </w:rPr>
-        <w:t>(</w:t>
-      </w:r>
-      <w:proofErr w:type="gramEnd"/>
-      <w:r>
-        <w:rPr>
-          <w:rFonts w:ascii="Consolas" w:hAnsi="Consolas"/>
-          <w:color w:val="000000"/>
-          <w:sz w:val="18"/>
-          <w:szCs w:val="18"/>
-        </w:rPr>
-        <w:t xml:space="preserve">message = </w:t>
+        <w:t xml:space="preserve">(message = </w:t>
       </w:r>
       <w:r>
         <w:rPr>
@@ -2842,19 +3711,8 @@
           <w:sz w:val="18"/>
           <w:szCs w:val="18"/>
         </w:rPr>
-        <w:t>"{</w:t>
-      </w:r>
-      <w:proofErr w:type="gramStart"/>
-      <w:r>
-        <w:rPr>
-          <w:rFonts w:ascii="Consolas" w:hAnsi="Consolas"/>
-          <w:color w:val="2A00FF"/>
-          <w:sz w:val="18"/>
-          <w:szCs w:val="18"/>
-        </w:rPr>
-        <w:t>validations.mensaje</w:t>
-      </w:r>
-      <w:proofErr w:type="gramEnd"/>
+        <w:t>"{validations.mensaje</w:t>
+      </w:r>
       <w:r>
         <w:rPr>
           <w:rFonts w:ascii="Consolas" w:hAnsi="Consolas"/>
@@ -3099,7 +3957,6 @@
         </w:rPr>
       </w:pPr>
       <w:proofErr w:type="spellStart"/>
-      <w:proofErr w:type="gramStart"/>
       <w:r>
         <w:rPr>
           <w:rFonts w:ascii="Consolas" w:hAnsi="Consolas"/>
@@ -3109,7 +3966,6 @@
         <w:t>Jakarta.validation.valid</w:t>
       </w:r>
       <w:proofErr w:type="spellEnd"/>
-      <w:proofErr w:type="gramEnd"/>
     </w:p>
     <w:p>
       <w:pPr>
@@ -3228,10 +4084,29 @@
           <w:sz w:val="18"/>
           <w:szCs w:val="18"/>
         </w:rPr>
-        <w:t xml:space="preserve"> String </w:t>
-      </w:r>
-      <w:proofErr w:type="spellStart"/>
-      <w:proofErr w:type="gramStart"/>
+        <w:t xml:space="preserve"> </w:t>
+      </w:r>
+      <w:proofErr w:type="spellStart"/>
+      <w:r>
+        <w:rPr>
+          <w:rFonts w:ascii="Consolas" w:hAnsi="Consolas"/>
+          <w:color w:val="000000"/>
+          <w:sz w:val="18"/>
+          <w:szCs w:val="18"/>
+        </w:rPr>
+        <w:t>String</w:t>
+      </w:r>
+      <w:proofErr w:type="spellEnd"/>
+      <w:r>
+        <w:rPr>
+          <w:rFonts w:ascii="Consolas" w:hAnsi="Consolas"/>
+          <w:color w:val="000000"/>
+          <w:sz w:val="18"/>
+          <w:szCs w:val="18"/>
+        </w:rPr>
+        <w:t xml:space="preserve"> </w:t>
+      </w:r>
+      <w:proofErr w:type="spellStart"/>
       <w:r>
         <w:rPr>
           <w:rFonts w:ascii="Consolas" w:hAnsi="Consolas"/>
@@ -3251,7 +4126,6 @@
         </w:rPr>
         <w:t>(</w:t>
       </w:r>
-      <w:proofErr w:type="gramEnd"/>
       <w:r>
         <w:rPr>
           <w:rFonts w:ascii="Consolas" w:hAnsi="Consolas"/>
@@ -3503,7 +4377,27 @@
           <w:szCs w:val="18"/>
         </w:rPr>
         <w:tab/>
-        <w:t xml:space="preserve">                             Model </w:t>
+        <w:t xml:space="preserve">                             </w:t>
+      </w:r>
+      <w:proofErr w:type="spellStart"/>
+      <w:r>
+        <w:rPr>
+          <w:rFonts w:ascii="Consolas" w:hAnsi="Consolas"/>
+          <w:color w:val="000000"/>
+          <w:sz w:val="18"/>
+          <w:szCs w:val="18"/>
+        </w:rPr>
+        <w:t>Model</w:t>
+      </w:r>
+      <w:proofErr w:type="spellEnd"/>
+      <w:r>
+        <w:rPr>
+          <w:rFonts w:ascii="Consolas" w:hAnsi="Consolas"/>
+          <w:color w:val="000000"/>
+          <w:sz w:val="18"/>
+          <w:szCs w:val="18"/>
+        </w:rPr>
+        <w:t xml:space="preserve"> </w:t>
       </w:r>
       <w:proofErr w:type="spellStart"/>
       <w:r>
@@ -3538,7 +4432,7 @@
           <w:u w:val="single"/>
         </w:rPr>
       </w:pPr>
-      <w:hyperlink r:id="rId13" w:history="1">
+      <w:hyperlink r:id="rId16" w:history="1">
         <w:r>
           <w:rPr>
             <w:rFonts w:ascii="Consolas" w:eastAsia="Times New Roman" w:hAnsi="Consolas" w:cs="Times New Roman"/>
@@ -3555,7 +4449,7 @@
         </w:rPr>
         <w:t>.</w:t>
       </w:r>
-      <w:hyperlink r:id="rId14" w:history="1">
+      <w:hyperlink r:id="rId17" w:history="1">
         <w:r>
           <w:rPr>
             <w:rFonts w:ascii="Consolas" w:eastAsia="Times New Roman" w:hAnsi="Consolas" w:cs="Times New Roman"/>
@@ -3572,7 +4466,7 @@
         </w:rPr>
         <w:t>.</w:t>
       </w:r>
-      <w:hyperlink r:id="rId15" w:history="1">
+      <w:hyperlink r:id="rId18" w:history="1">
         <w:r>
           <w:rPr>
             <w:rFonts w:ascii="Consolas" w:eastAsia="Times New Roman" w:hAnsi="Consolas" w:cs="Times New Roman"/>
@@ -3589,7 +4483,7 @@
         </w:rPr>
         <w:t>.</w:t>
       </w:r>
-      <w:hyperlink r:id="rId16" w:history="1">
+      <w:hyperlink r:id="rId19" w:history="1">
         <w:r>
           <w:rPr>
             <w:rFonts w:ascii="Consolas" w:eastAsia="Times New Roman" w:hAnsi="Consolas" w:cs="Times New Roman"/>
@@ -3606,7 +4500,7 @@
         </w:rPr>
         <w:t>.</w:t>
       </w:r>
-      <w:hyperlink r:id="rId17" w:history="1">
+      <w:hyperlink r:id="rId20" w:history="1">
         <w:r>
           <w:rPr>
             <w:rFonts w:ascii="Consolas" w:eastAsia="Times New Roman" w:hAnsi="Consolas" w:cs="Times New Roman"/>
@@ -3674,7 +4568,6 @@
         </w:rPr>
         <w:t xml:space="preserve"> </w:t>
       </w:r>
-      <w:proofErr w:type="gramStart"/>
       <w:r>
         <w:rPr>
           <w:rFonts w:asciiTheme="minorHAnsi" w:hAnsiTheme="minorHAnsi"/>
@@ -3688,7 +4581,6 @@
         <w:t xml:space="preserve"> “</w:t>
       </w:r>
       <w:proofErr w:type="spellStart"/>
-      <w:proofErr w:type="gramEnd"/>
       <w:r>
         <w:rPr>
           <w:rFonts w:asciiTheme="minorHAnsi" w:hAnsiTheme="minorHAnsi"/>
@@ -3777,7 +4669,6 @@
         </w:rPr>
         <w:t xml:space="preserve"> </w:t>
       </w:r>
-      <w:proofErr w:type="gramStart"/>
       <w:r>
         <w:rPr>
           <w:rFonts w:ascii="Consolas" w:eastAsia="Times New Roman" w:hAnsi="Consolas" w:cs="Times New Roman"/>
@@ -3790,7 +4681,6 @@
         </w:rPr>
         <w:t>interface</w:t>
       </w:r>
-      <w:proofErr w:type="gramEnd"/>
       <w:r>
         <w:rPr>
           <w:rFonts w:ascii="Consolas" w:eastAsia="Times New Roman" w:hAnsi="Consolas" w:cs="Times New Roman"/>
@@ -3933,7 +4823,6 @@
         </w:rPr>
         <w:t xml:space="preserve"> </w:t>
       </w:r>
-      <w:proofErr w:type="gramStart"/>
       <w:r>
         <w:rPr>
           <w:rFonts w:ascii="Consolas" w:eastAsia="Times New Roman" w:hAnsi="Consolas" w:cs="Times New Roman"/>
@@ -3946,7 +4835,6 @@
         </w:rPr>
         <w:t>interface</w:t>
       </w:r>
-      <w:proofErr w:type="gramEnd"/>
       <w:r>
         <w:rPr>
           <w:rFonts w:ascii="Consolas" w:eastAsia="Times New Roman" w:hAnsi="Consolas" w:cs="Times New Roman"/>
@@ -4001,20 +4889,8 @@
           <w:szCs w:val="20"/>
           <w:lang w:eastAsia="es-ES"/>
         </w:rPr>
-        <w:t xml:space="preserve"> </w:t>
-      </w:r>
-      <w:proofErr w:type="gramStart"/>
-      <w:r>
-        <w:rPr>
-          <w:rFonts w:ascii="Consolas" w:eastAsia="Times New Roman" w:hAnsi="Consolas" w:cs="Times New Roman"/>
-          <w:color w:val="000000"/>
-          <w:sz w:val="20"/>
-          <w:szCs w:val="20"/>
-          <w:lang w:eastAsia="es-ES"/>
-        </w:rPr>
-        <w:t>Default{</w:t>
-      </w:r>
-      <w:proofErr w:type="gramEnd"/>
+        <w:t xml:space="preserve"> Default{</w:t>
+      </w:r>
     </w:p>
     <w:p>
       <w:pPr>
@@ -4133,36 +5009,16 @@
           <w:sz w:val="18"/>
           <w:szCs w:val="18"/>
         </w:rPr>
-        <w:t>@</w:t>
-      </w:r>
-      <w:proofErr w:type="gramStart"/>
-      <w:r>
-        <w:rPr>
-          <w:rFonts w:ascii="Consolas" w:hAnsi="Consolas"/>
-          <w:color w:val="646464"/>
-          <w:sz w:val="18"/>
-          <w:szCs w:val="18"/>
-        </w:rPr>
-        <w:t>NotBlank</w:t>
-      </w:r>
-      <w:r>
-        <w:rPr>
-          <w:rFonts w:ascii="Consolas" w:hAnsi="Consolas"/>
-          <w:color w:val="000000"/>
-          <w:sz w:val="18"/>
-          <w:szCs w:val="18"/>
-        </w:rPr>
-        <w:t>(</w:t>
-      </w:r>
-      <w:proofErr w:type="gramEnd"/>
-      <w:r>
-        <w:rPr>
-          <w:rFonts w:ascii="Consolas" w:hAnsi="Consolas"/>
-          <w:color w:val="000000"/>
-          <w:sz w:val="18"/>
-          <w:szCs w:val="18"/>
-        </w:rPr>
-        <w:t xml:space="preserve">message = </w:t>
+        <w:t>@NotBlank</w:t>
+      </w:r>
+      <w:r>
+        <w:rPr>
+          <w:rFonts w:ascii="Consolas" w:hAnsi="Consolas"/>
+          <w:color w:val="000000"/>
+          <w:sz w:val="18"/>
+          <w:szCs w:val="18"/>
+        </w:rPr>
+        <w:t xml:space="preserve">(message = </w:t>
       </w:r>
       <w:r>
         <w:rPr>
@@ -4174,7 +5030,6 @@
         <w:t>"{</w:t>
       </w:r>
       <w:proofErr w:type="spellStart"/>
-      <w:proofErr w:type="gramStart"/>
       <w:r>
         <w:rPr>
           <w:rFonts w:ascii="Consolas" w:hAnsi="Consolas"/>
@@ -4182,9 +5037,9 @@
           <w:sz w:val="18"/>
           <w:szCs w:val="18"/>
         </w:rPr>
-        <w:t>validations.message</w:t>
-      </w:r>
-      <w:proofErr w:type="gramEnd"/>
+        <w:t>validations.message.password.mandatory</w:t>
+      </w:r>
+      <w:proofErr w:type="spellEnd"/>
       <w:r>
         <w:rPr>
           <w:rFonts w:ascii="Consolas" w:hAnsi="Consolas"/>
@@ -4192,38 +5047,7 @@
           <w:sz w:val="18"/>
           <w:szCs w:val="18"/>
         </w:rPr>
-        <w:t>.</w:t>
-      </w:r>
-      <w:proofErr w:type="gramStart"/>
-      <w:r>
-        <w:rPr>
-          <w:rFonts w:ascii="Consolas" w:hAnsi="Consolas"/>
-          <w:color w:val="2A00FF"/>
-          <w:sz w:val="18"/>
-          <w:szCs w:val="18"/>
-        </w:rPr>
-        <w:t>password.mandatory</w:t>
-      </w:r>
-      <w:proofErr w:type="spellEnd"/>
-      <w:proofErr w:type="gramEnd"/>
-      <w:r>
-        <w:rPr>
-          <w:rFonts w:ascii="Consolas" w:hAnsi="Consolas"/>
-          <w:color w:val="2A00FF"/>
-          <w:sz w:val="18"/>
-          <w:szCs w:val="18"/>
-        </w:rPr>
-        <w:t>}</w:t>
-      </w:r>
-      <w:proofErr w:type="gramStart"/>
-      <w:r>
-        <w:rPr>
-          <w:rFonts w:ascii="Consolas" w:hAnsi="Consolas"/>
-          <w:color w:val="2A00FF"/>
-          <w:sz w:val="18"/>
-          <w:szCs w:val="18"/>
-        </w:rPr>
-        <w:t>"</w:t>
+        <w:t>}"</w:t>
       </w:r>
       <w:r>
         <w:rPr>
@@ -4246,7 +5070,6 @@
         <w:t>groups</w:t>
       </w:r>
       <w:proofErr w:type="spellEnd"/>
-      <w:proofErr w:type="gramEnd"/>
       <w:r>
         <w:rPr>
           <w:rFonts w:ascii="Consolas" w:hAnsi="Consolas"/>
@@ -4321,39 +5144,17 @@
           <w:szCs w:val="18"/>
           <w:lang w:eastAsia="es-ES"/>
         </w:rPr>
-        <w:t>@</w:t>
-      </w:r>
-      <w:proofErr w:type="gramStart"/>
+        <w:t>@Size</w:t>
+      </w:r>
       <w:r>
         <w:rPr>
           <w:rFonts w:ascii="Consolas" w:eastAsia="Times New Roman" w:hAnsi="Consolas" w:cs="Times New Roman"/>
-          <w:color w:val="646464"/>
+          <w:color w:val="000000"/>
           <w:sz w:val="18"/>
           <w:szCs w:val="18"/>
           <w:lang w:eastAsia="es-ES"/>
         </w:rPr>
-        <w:t>Size</w:t>
-      </w:r>
-      <w:r>
-        <w:rPr>
-          <w:rFonts w:ascii="Consolas" w:eastAsia="Times New Roman" w:hAnsi="Consolas" w:cs="Times New Roman"/>
-          <w:color w:val="000000"/>
-          <w:sz w:val="18"/>
-          <w:szCs w:val="18"/>
-          <w:lang w:eastAsia="es-ES"/>
-        </w:rPr>
-        <w:t>(</w:t>
-      </w:r>
-      <w:proofErr w:type="gramEnd"/>
-      <w:r>
-        <w:rPr>
-          <w:rFonts w:ascii="Consolas" w:eastAsia="Times New Roman" w:hAnsi="Consolas" w:cs="Times New Roman"/>
-          <w:color w:val="000000"/>
-          <w:sz w:val="18"/>
-          <w:szCs w:val="18"/>
-          <w:lang w:eastAsia="es-ES"/>
-        </w:rPr>
-        <w:t xml:space="preserve">min = 6, </w:t>
+        <w:t xml:space="preserve">(min = 6, </w:t>
       </w:r>
       <w:proofErr w:type="spellStart"/>
       <w:r>
@@ -4388,7 +5189,6 @@
         <w:t>"{</w:t>
       </w:r>
       <w:proofErr w:type="spellStart"/>
-      <w:proofErr w:type="gramStart"/>
       <w:r>
         <w:rPr>
           <w:rFonts w:ascii="Consolas" w:eastAsia="Times New Roman" w:hAnsi="Consolas" w:cs="Times New Roman"/>
@@ -4397,9 +5197,9 @@
           <w:szCs w:val="18"/>
           <w:lang w:eastAsia="es-ES"/>
         </w:rPr>
-        <w:t>validations.message</w:t>
-      </w:r>
-      <w:proofErr w:type="gramEnd"/>
+        <w:t>validations.message.password.validformat</w:t>
+      </w:r>
+      <w:proofErr w:type="spellEnd"/>
       <w:r>
         <w:rPr>
           <w:rFonts w:ascii="Consolas" w:eastAsia="Times New Roman" w:hAnsi="Consolas" w:cs="Times New Roman"/>
@@ -4408,41 +5208,7 @@
           <w:szCs w:val="18"/>
           <w:lang w:eastAsia="es-ES"/>
         </w:rPr>
-        <w:t>.</w:t>
-      </w:r>
-      <w:proofErr w:type="gramStart"/>
-      <w:r>
-        <w:rPr>
-          <w:rFonts w:ascii="Consolas" w:eastAsia="Times New Roman" w:hAnsi="Consolas" w:cs="Times New Roman"/>
-          <w:color w:val="2A00FF"/>
-          <w:sz w:val="18"/>
-          <w:szCs w:val="18"/>
-          <w:lang w:eastAsia="es-ES"/>
-        </w:rPr>
-        <w:t>password.validformat</w:t>
-      </w:r>
-      <w:proofErr w:type="spellEnd"/>
-      <w:proofErr w:type="gramEnd"/>
-      <w:r>
-        <w:rPr>
-          <w:rFonts w:ascii="Consolas" w:eastAsia="Times New Roman" w:hAnsi="Consolas" w:cs="Times New Roman"/>
-          <w:color w:val="2A00FF"/>
-          <w:sz w:val="18"/>
-          <w:szCs w:val="18"/>
-          <w:lang w:eastAsia="es-ES"/>
-        </w:rPr>
-        <w:t>}</w:t>
-      </w:r>
-      <w:proofErr w:type="gramStart"/>
-      <w:r>
-        <w:rPr>
-          <w:rFonts w:ascii="Consolas" w:eastAsia="Times New Roman" w:hAnsi="Consolas" w:cs="Times New Roman"/>
-          <w:color w:val="2A00FF"/>
-          <w:sz w:val="18"/>
-          <w:szCs w:val="18"/>
-          <w:lang w:eastAsia="es-ES"/>
-        </w:rPr>
-        <w:t>"</w:t>
+        <w:t>}"</w:t>
       </w:r>
       <w:r>
         <w:rPr>
@@ -4467,7 +5233,6 @@
         <w:t>groups</w:t>
       </w:r>
       <w:proofErr w:type="spellEnd"/>
-      <w:proofErr w:type="gramEnd"/>
       <w:r>
         <w:rPr>
           <w:rFonts w:ascii="Consolas" w:eastAsia="Times New Roman" w:hAnsi="Consolas" w:cs="Times New Roman"/>
@@ -4560,7 +5325,29 @@
           <w:szCs w:val="18"/>
           <w:lang w:eastAsia="es-ES"/>
         </w:rPr>
-        <w:t xml:space="preserve"> String </w:t>
+        <w:t xml:space="preserve"> </w:t>
+      </w:r>
+      <w:proofErr w:type="spellStart"/>
+      <w:r>
+        <w:rPr>
+          <w:rFonts w:ascii="Consolas" w:eastAsia="Times New Roman" w:hAnsi="Consolas" w:cs="Times New Roman"/>
+          <w:color w:val="000000"/>
+          <w:sz w:val="18"/>
+          <w:szCs w:val="18"/>
+          <w:lang w:eastAsia="es-ES"/>
+        </w:rPr>
+        <w:t>String</w:t>
+      </w:r>
+      <w:proofErr w:type="spellEnd"/>
+      <w:r>
+        <w:rPr>
+          <w:rFonts w:ascii="Consolas" w:eastAsia="Times New Roman" w:hAnsi="Consolas" w:cs="Times New Roman"/>
+          <w:color w:val="000000"/>
+          <w:sz w:val="18"/>
+          <w:szCs w:val="18"/>
+          <w:lang w:eastAsia="es-ES"/>
+        </w:rPr>
+        <w:t xml:space="preserve"> </w:t>
       </w:r>
       <w:proofErr w:type="spellStart"/>
       <w:r>
@@ -4742,7 +5529,6 @@
         <w:t xml:space="preserve"> </w:t>
       </w:r>
       <w:proofErr w:type="spellStart"/>
-      <w:proofErr w:type="gramStart"/>
       <w:r>
         <w:rPr>
           <w:rFonts w:ascii="Consolas" w:eastAsia="Times New Roman" w:hAnsi="Consolas" w:cs="Times New Roman"/>
@@ -4752,7 +5538,6 @@
         <w:t>password</w:t>
       </w:r>
       <w:proofErr w:type="spellEnd"/>
-      <w:proofErr w:type="gramEnd"/>
       <w:r>
         <w:rPr>
           <w:rFonts w:ascii="Consolas" w:eastAsia="Times New Roman" w:hAnsi="Consolas" w:cs="Times New Roman"/>
@@ -4798,7 +5583,6 @@
         <w:t xml:space="preserve"> (sin </w:t>
       </w:r>
       <w:proofErr w:type="spellStart"/>
-      <w:proofErr w:type="gramStart"/>
       <w:r>
         <w:rPr>
           <w:rFonts w:ascii="Consolas" w:eastAsia="Times New Roman" w:hAnsi="Consolas" w:cs="Times New Roman"/>
@@ -4808,7 +5592,6 @@
         <w:t>password</w:t>
       </w:r>
       <w:proofErr w:type="spellEnd"/>
-      <w:proofErr w:type="gramEnd"/>
       <w:r>
         <w:rPr>
           <w:rFonts w:ascii="Consolas" w:eastAsia="Times New Roman" w:hAnsi="Consolas" w:cs="Times New Roman"/>
@@ -4925,7 +5708,6 @@
         <w:t xml:space="preserve"> = (</w:t>
       </w:r>
       <w:proofErr w:type="spellStart"/>
-      <w:proofErr w:type="gramStart"/>
       <w:r>
         <w:rPr>
           <w:rFonts w:ascii="Consolas" w:eastAsia="Times New Roman" w:hAnsi="Consolas" w:cs="Times New Roman"/>
@@ -4943,7 +5725,6 @@
         <w:t>.getId</w:t>
       </w:r>
       <w:proofErr w:type="spellEnd"/>
-      <w:proofErr w:type="gramEnd"/>
       <w:r>
         <w:rPr>
           <w:rFonts w:ascii="Consolas" w:eastAsia="Times New Roman" w:hAnsi="Consolas" w:cs="Times New Roman"/>
@@ -4964,26 +5745,15 @@
         <w:t>null</w:t>
       </w:r>
       <w:proofErr w:type="spellEnd"/>
-      <w:proofErr w:type="gramStart"/>
       <w:r>
         <w:rPr>
           <w:rFonts w:ascii="Consolas" w:eastAsia="Times New Roman" w:hAnsi="Consolas" w:cs="Times New Roman"/>
           <w:color w:val="000000"/>
           <w:lang w:eastAsia="es-ES"/>
         </w:rPr>
-        <w:t>) ?</w:t>
-      </w:r>
-      <w:proofErr w:type="gramEnd"/>
-      <w:r>
-        <w:rPr>
-          <w:rFonts w:ascii="Consolas" w:eastAsia="Times New Roman" w:hAnsi="Consolas" w:cs="Times New Roman"/>
-          <w:color w:val="000000"/>
-          <w:lang w:eastAsia="es-ES"/>
-        </w:rPr>
-        <w:t xml:space="preserve"> </w:t>
-      </w:r>
-      <w:proofErr w:type="spellStart"/>
-      <w:proofErr w:type="gramStart"/>
+        <w:t xml:space="preserve">) ? </w:t>
+      </w:r>
+      <w:proofErr w:type="spellStart"/>
       <w:r>
         <w:rPr>
           <w:rFonts w:ascii="Consolas" w:eastAsia="Times New Roman" w:hAnsi="Consolas" w:cs="Times New Roman"/>
@@ -5009,16 +5779,7 @@
           <w:color w:val="000000"/>
           <w:lang w:eastAsia="es-ES"/>
         </w:rPr>
-        <w:t xml:space="preserve"> :</w:t>
-      </w:r>
-      <w:proofErr w:type="gramEnd"/>
-      <w:r>
-        <w:rPr>
-          <w:rFonts w:ascii="Consolas" w:eastAsia="Times New Roman" w:hAnsi="Consolas" w:cs="Times New Roman"/>
-          <w:color w:val="000000"/>
-          <w:lang w:eastAsia="es-ES"/>
-        </w:rPr>
-        <w:t xml:space="preserve"> </w:t>
+        <w:t xml:space="preserve"> : </w:t>
       </w:r>
       <w:proofErr w:type="spellStart"/>
       <w:r>
@@ -5230,28 +5991,18 @@
           <w:lang w:eastAsia="es-ES"/>
         </w:rPr>
         <w:tab/>
-        <w:t xml:space="preserve">            </w:t>
-      </w:r>
-      <w:proofErr w:type="gramStart"/>
+        <w:t xml:space="preserve">            .</w:t>
+      </w:r>
+      <w:proofErr w:type="spellStart"/>
       <w:r>
         <w:rPr>
           <w:rFonts w:ascii="Consolas" w:eastAsia="Times New Roman" w:hAnsi="Consolas" w:cs="Times New Roman"/>
           <w:color w:val="000000"/>
           <w:lang w:eastAsia="es-ES"/>
         </w:rPr>
-        <w:t>.</w:t>
-      </w:r>
-      <w:proofErr w:type="spellStart"/>
-      <w:r>
-        <w:rPr>
-          <w:rFonts w:ascii="Consolas" w:eastAsia="Times New Roman" w:hAnsi="Consolas" w:cs="Times New Roman"/>
-          <w:color w:val="000000"/>
-          <w:lang w:eastAsia="es-ES"/>
-        </w:rPr>
         <w:t>validate</w:t>
       </w:r>
       <w:proofErr w:type="spellEnd"/>
-      <w:proofErr w:type="gramEnd"/>
       <w:r>
         <w:rPr>
           <w:rFonts w:ascii="Consolas" w:eastAsia="Times New Roman" w:hAnsi="Consolas" w:cs="Times New Roman"/>
@@ -5379,15 +6130,7 @@
       </w:r>
       <w:proofErr w:type="spellEnd"/>
       <w:r>
-        <w:t xml:space="preserve">” y el validador obviará </w:t>
-      </w:r>
-      <w:proofErr w:type="gramStart"/>
-      <w:r>
-        <w:t>los asignado</w:t>
-      </w:r>
-      <w:proofErr w:type="gramEnd"/>
-      <w:r>
-        <w:t xml:space="preserve"> a otros grupos.</w:t>
+        <w:t>” y el validador obviará los asignado a otros grupos.</w:t>
       </w:r>
     </w:p>
     <w:p>
@@ -5428,7 +6171,6 @@
         <w:ind w:firstLine="708"/>
       </w:pPr>
       <w:r>
-        <w:lastRenderedPageBreak/>
         <w:t>Si algun</w:t>
       </w:r>
       <w:r>
@@ -5441,21 +6183,13 @@
         <w:t xml:space="preserve">se generan los mensajes </w:t>
       </w:r>
       <w:r>
-        <w:t xml:space="preserve">asociados a cada validación </w:t>
-      </w:r>
-      <w:proofErr w:type="gramStart"/>
-      <w:r>
-        <w:t xml:space="preserve">y </w:t>
+        <w:t xml:space="preserve">asociados a cada validación y </w:t>
       </w:r>
       <w:r>
         <w:t xml:space="preserve"> </w:t>
       </w:r>
       <w:r>
-        <w:t>devolviéndose</w:t>
-      </w:r>
-      <w:proofErr w:type="gramEnd"/>
-      <w:r>
-        <w:t xml:space="preserve"> </w:t>
+        <w:t xml:space="preserve">devolviéndose </w:t>
       </w:r>
       <w:r>
         <w:t>a la vista</w:t>
@@ -5615,7 +6349,6 @@
         <w:t xml:space="preserve"> </w:t>
       </w:r>
       <w:proofErr w:type="spellStart"/>
-      <w:proofErr w:type="gramStart"/>
       <w:r>
         <w:rPr>
           <w:rFonts w:ascii="Consolas" w:hAnsi="Consolas"/>
@@ -5627,7 +6360,6 @@
         <w:t>th:errors</w:t>
       </w:r>
       <w:proofErr w:type="spellEnd"/>
-      <w:proofErr w:type="gramEnd"/>
       <w:r>
         <w:rPr>
           <w:rFonts w:ascii="Consolas" w:hAnsi="Consolas"/>
@@ -5851,10 +6583,29 @@
           <w:sz w:val="18"/>
           <w:szCs w:val="18"/>
         </w:rPr>
-        <w:t xml:space="preserve"> String </w:t>
-      </w:r>
-      <w:proofErr w:type="spellStart"/>
-      <w:proofErr w:type="gramStart"/>
+        <w:t xml:space="preserve"> </w:t>
+      </w:r>
+      <w:proofErr w:type="spellStart"/>
+      <w:r>
+        <w:rPr>
+          <w:rFonts w:ascii="Consolas" w:hAnsi="Consolas"/>
+          <w:color w:val="000000"/>
+          <w:sz w:val="18"/>
+          <w:szCs w:val="18"/>
+        </w:rPr>
+        <w:t>String</w:t>
+      </w:r>
+      <w:proofErr w:type="spellEnd"/>
+      <w:r>
+        <w:rPr>
+          <w:rFonts w:ascii="Consolas" w:hAnsi="Consolas"/>
+          <w:color w:val="000000"/>
+          <w:sz w:val="18"/>
+          <w:szCs w:val="18"/>
+        </w:rPr>
+        <w:t xml:space="preserve"> </w:t>
+      </w:r>
+      <w:proofErr w:type="spellStart"/>
       <w:r>
         <w:rPr>
           <w:rFonts w:ascii="Consolas" w:hAnsi="Consolas"/>
@@ -5874,7 +6625,6 @@
         </w:rPr>
         <w:t>(</w:t>
       </w:r>
-      <w:proofErr w:type="gramEnd"/>
       <w:r>
         <w:rPr>
           <w:rFonts w:ascii="Consolas" w:hAnsi="Consolas"/>
@@ -6129,7 +6879,27 @@
           <w:szCs w:val="18"/>
         </w:rPr>
         <w:tab/>
-        <w:t xml:space="preserve">                             Model </w:t>
+        <w:t xml:space="preserve">                             </w:t>
+      </w:r>
+      <w:proofErr w:type="spellStart"/>
+      <w:r>
+        <w:rPr>
+          <w:rFonts w:ascii="Consolas" w:hAnsi="Consolas"/>
+          <w:color w:val="000000"/>
+          <w:sz w:val="18"/>
+          <w:szCs w:val="18"/>
+        </w:rPr>
+        <w:t>Model</w:t>
+      </w:r>
+      <w:proofErr w:type="spellEnd"/>
+      <w:r>
+        <w:rPr>
+          <w:rFonts w:ascii="Consolas" w:hAnsi="Consolas"/>
+          <w:color w:val="000000"/>
+          <w:sz w:val="18"/>
+          <w:szCs w:val="18"/>
+        </w:rPr>
+        <w:t xml:space="preserve"> </w:t>
       </w:r>
       <w:proofErr w:type="spellStart"/>
       <w:r>
@@ -6193,7 +6963,6 @@
         <w:t xml:space="preserve"> (</w:t>
       </w:r>
       <w:proofErr w:type="spellStart"/>
-      <w:proofErr w:type="gramStart"/>
       <w:r>
         <w:rPr>
           <w:rFonts w:ascii="Consolas" w:hAnsi="Consolas"/>
@@ -6213,7 +6982,6 @@
         <w:t>.hasErrors</w:t>
       </w:r>
       <w:proofErr w:type="spellEnd"/>
-      <w:proofErr w:type="gramEnd"/>
       <w:r>
         <w:rPr>
           <w:rFonts w:ascii="Consolas" w:hAnsi="Consolas"/>
@@ -6380,13 +7148,8 @@
         <w:tab/>
         <w:t xml:space="preserve">Los datos del formulario pueden ser válidos en formato </w:t>
       </w:r>
-      <w:proofErr w:type="gramStart"/>
-      <w:r>
-        <w:t>de acuerdo a</w:t>
-      </w:r>
-      <w:proofErr w:type="gramEnd"/>
-      <w:r>
-        <w:t xml:space="preserve"> lo determinado en sus atributos</w:t>
+      <w:r>
+        <w:t>de acuerdo a lo determinado en sus atributos</w:t>
       </w:r>
       <w:r>
         <w:t xml:space="preserve">, pero no cumplir las reglas de negocio que tenemos en nuestro modelo, en nuestro caso </w:t>
@@ -6497,7 +7260,6 @@
         <w:t xml:space="preserve"> </w:t>
       </w:r>
       <w:proofErr w:type="spellStart"/>
-      <w:proofErr w:type="gramStart"/>
       <w:r>
         <w:rPr>
           <w:rFonts w:ascii="Consolas" w:hAnsi="Consolas"/>
@@ -6515,17 +7277,7 @@
           <w:sz w:val="18"/>
           <w:szCs w:val="18"/>
         </w:rPr>
-        <w:t>(</w:t>
-      </w:r>
-      <w:proofErr w:type="gramEnd"/>
-      <w:r>
-        <w:rPr>
-          <w:rFonts w:ascii="Consolas" w:hAnsi="Consolas"/>
-          <w:color w:val="000000"/>
-          <w:sz w:val="18"/>
-          <w:szCs w:val="18"/>
-        </w:rPr>
-        <w:t xml:space="preserve">Long </w:t>
+        <w:t xml:space="preserve">(Long </w:t>
       </w:r>
       <w:r>
         <w:rPr>
@@ -6670,7 +7422,6 @@
         <w:t xml:space="preserve"> = </w:t>
       </w:r>
       <w:proofErr w:type="spellStart"/>
-      <w:proofErr w:type="gramStart"/>
       <w:r>
         <w:rPr>
           <w:rFonts w:ascii="Consolas" w:hAnsi="Consolas"/>
@@ -6691,7 +7442,6 @@
         <w:t>.findById</w:t>
       </w:r>
       <w:proofErr w:type="spellEnd"/>
-      <w:proofErr w:type="gramEnd"/>
       <w:r>
         <w:rPr>
           <w:rFonts w:ascii="Consolas" w:hAnsi="Consolas"/>
@@ -6741,17 +7491,7 @@
           <w:sz w:val="18"/>
           <w:szCs w:val="18"/>
         </w:rPr>
-        <w:t xml:space="preserve">                </w:t>
-      </w:r>
-      <w:proofErr w:type="gramStart"/>
-      <w:r>
-        <w:rPr>
-          <w:rFonts w:ascii="Consolas" w:hAnsi="Consolas"/>
-          <w:color w:val="000000"/>
-          <w:sz w:val="18"/>
-          <w:szCs w:val="18"/>
-        </w:rPr>
-        <w:t>.</w:t>
+        <w:t xml:space="preserve">                .</w:t>
       </w:r>
       <w:proofErr w:type="spellStart"/>
       <w:r>
@@ -6764,7 +7504,6 @@
         <w:t>orElseThrow</w:t>
       </w:r>
       <w:proofErr w:type="spellEnd"/>
-      <w:proofErr w:type="gramEnd"/>
       <w:r>
         <w:rPr>
           <w:rFonts w:ascii="Consolas" w:hAnsi="Consolas"/>
@@ -6795,7 +7534,6 @@
         <w:t xml:space="preserve"> </w:t>
       </w:r>
       <w:proofErr w:type="spellStart"/>
-      <w:proofErr w:type="gramStart"/>
       <w:r>
         <w:rPr>
           <w:rFonts w:ascii="Consolas" w:hAnsi="Consolas"/>
@@ -6815,7 +7553,6 @@
         </w:rPr>
         <w:t>(</w:t>
       </w:r>
-      <w:proofErr w:type="gramEnd"/>
       <w:r>
         <w:rPr>
           <w:rFonts w:ascii="Consolas" w:hAnsi="Consolas"/>
@@ -6899,20 +7636,9 @@
           <w:sz w:val="18"/>
           <w:szCs w:val="18"/>
         </w:rPr>
-        <w:t>comprobación_de_</w:t>
-      </w:r>
-      <w:proofErr w:type="gramStart"/>
-      <w:r>
-        <w:rPr>
-          <w:rFonts w:ascii="Consolas" w:hAnsi="Consolas"/>
-          <w:color w:val="000000"/>
-          <w:sz w:val="18"/>
-          <w:szCs w:val="18"/>
-        </w:rPr>
-        <w:t>password</w:t>
-      </w:r>
-      <w:proofErr w:type="spellEnd"/>
-      <w:proofErr w:type="gramEnd"/>
+        <w:t>comprobación_de_password</w:t>
+      </w:r>
+      <w:proofErr w:type="spellEnd"/>
       <w:r>
         <w:rPr>
           <w:rFonts w:ascii="Consolas" w:hAnsi="Consolas"/>
@@ -6987,7 +7713,6 @@
         <w:t xml:space="preserve"> </w:t>
       </w:r>
       <w:proofErr w:type="spellStart"/>
-      <w:proofErr w:type="gramStart"/>
       <w:r>
         <w:rPr>
           <w:rFonts w:ascii="Consolas" w:hAnsi="Consolas"/>
@@ -7008,7 +7733,6 @@
         </w:rPr>
         <w:t>(</w:t>
       </w:r>
-      <w:proofErr w:type="gramEnd"/>
       <w:r>
         <w:rPr>
           <w:rFonts w:ascii="Consolas" w:hAnsi="Consolas"/>
@@ -7126,7 +7850,6 @@
         </w:rPr>
       </w:pPr>
       <w:r>
-        <w:lastRenderedPageBreak/>
         <w:t xml:space="preserve">Para evitar “múltiples” </w:t>
       </w:r>
       <w:r>
@@ -7138,15 +7861,7 @@
       </w:r>
       <w:proofErr w:type="spellEnd"/>
       <w:r>
-        <w:t xml:space="preserve">, </w:t>
-      </w:r>
-      <w:proofErr w:type="gramStart"/>
-      <w:r>
-        <w:t>y</w:t>
-      </w:r>
-      <w:proofErr w:type="gramEnd"/>
-      <w:r>
-        <w:t xml:space="preserve"> sobre todo, la famosa página</w:t>
+        <w:t>, y sobre todo, la famosa página</w:t>
       </w:r>
       <w:r>
         <w:rPr>
@@ -7254,7 +7969,7 @@
                     <pic:cNvPicPr/>
                   </pic:nvPicPr>
                   <pic:blipFill>
-                    <a:blip r:embed="rId18"/>
+                    <a:blip r:embed="rId21"/>
                     <a:stretch>
                       <a:fillRect/>
                     </a:stretch>
@@ -7362,7 +8077,7 @@
                     <pic:cNvPicPr/>
                   </pic:nvPicPr>
                   <pic:blipFill>
-                    <a:blip r:embed="rId19"/>
+                    <a:blip r:embed="rId22"/>
                     <a:stretch>
                       <a:fillRect/>
                     </a:stretch>
@@ -7740,7 +8455,6 @@
         </w:rPr>
       </w:pPr>
       <w:proofErr w:type="spellStart"/>
-      <w:proofErr w:type="gramStart"/>
       <w:r>
         <w:rPr>
           <w:rFonts w:ascii="Consolas" w:hAnsi="Consolas"/>
@@ -7760,7 +8474,6 @@
         <w:t>.rejectValue</w:t>
       </w:r>
       <w:proofErr w:type="spellEnd"/>
-      <w:proofErr w:type="gramEnd"/>
       <w:r>
         <w:rPr>
           <w:rFonts w:ascii="Consolas" w:hAnsi="Consolas"/>
@@ -7790,7 +8503,6 @@
         <w:t>errorGlobal</w:t>
       </w:r>
       <w:proofErr w:type="spellEnd"/>
-      <w:proofErr w:type="gramStart"/>
       <w:r>
         <w:rPr>
           <w:rFonts w:ascii="Consolas" w:hAnsi="Consolas"/>
@@ -7829,7 +8541,6 @@
         <w:t>error.en</w:t>
       </w:r>
       <w:proofErr w:type="spellEnd"/>
-      <w:proofErr w:type="gramEnd"/>
       <w:r>
         <w:rPr>
           <w:rFonts w:ascii="Consolas" w:hAnsi="Consolas"/>
@@ -7878,7 +8589,6 @@
         <w:t xml:space="preserve"> </w:t>
       </w:r>
       <w:proofErr w:type="spellStart"/>
-      <w:proofErr w:type="gramStart"/>
       <w:r>
         <w:rPr>
           <w:rFonts w:ascii="Consolas" w:hAnsi="Consolas"/>
@@ -7898,7 +8608,6 @@
         <w:t>.getMessage</w:t>
       </w:r>
       <w:proofErr w:type="spellEnd"/>
-      <w:proofErr w:type="gramEnd"/>
       <w:r>
         <w:rPr>
           <w:rFonts w:ascii="Consolas" w:hAnsi="Consolas"/>
@@ -8052,7 +8761,6 @@
         <w:tab/>
       </w:r>
       <w:proofErr w:type="spellStart"/>
-      <w:proofErr w:type="gramStart"/>
       <w:r>
         <w:rPr>
           <w:rFonts w:ascii="Consolas" w:hAnsi="Consolas"/>
@@ -8072,7 +8780,6 @@
         <w:t>.rejectValue</w:t>
       </w:r>
       <w:proofErr w:type="spellEnd"/>
-      <w:proofErr w:type="gramEnd"/>
       <w:r>
         <w:rPr>
           <w:rFonts w:ascii="Consolas" w:hAnsi="Consolas"/>
@@ -8130,7 +8837,6 @@
         <w:t>"</w:t>
       </w:r>
       <w:proofErr w:type="spellStart"/>
-      <w:proofErr w:type="gramStart"/>
       <w:r>
         <w:rPr>
           <w:rFonts w:ascii="Consolas" w:hAnsi="Consolas"/>
@@ -8141,7 +8847,6 @@
         <w:t>error.enproperties</w:t>
       </w:r>
       <w:proofErr w:type="spellEnd"/>
-      <w:proofErr w:type="gramEnd"/>
       <w:r>
         <w:rPr>
           <w:rFonts w:ascii="Consolas" w:hAnsi="Consolas"/>
@@ -8161,7 +8866,6 @@
         <w:t xml:space="preserve">, </w:t>
       </w:r>
       <w:proofErr w:type="spellStart"/>
-      <w:proofErr w:type="gramStart"/>
       <w:r>
         <w:rPr>
           <w:rFonts w:ascii="Consolas" w:hAnsi="Consolas"/>
@@ -8181,7 +8885,6 @@
         <w:t>.getMessage</w:t>
       </w:r>
       <w:proofErr w:type="spellEnd"/>
-      <w:proofErr w:type="gramEnd"/>
       <w:r>
         <w:rPr>
           <w:rFonts w:ascii="Consolas" w:hAnsi="Consolas"/>
@@ -8227,11 +8930,9 @@
     <w:p/>
     <w:p>
       <w:r>
-        <w:lastRenderedPageBreak/>
         <w:t>De esta forma al validar “</w:t>
       </w:r>
       <w:proofErr w:type="spellStart"/>
-      <w:proofErr w:type="gramStart"/>
       <w:r>
         <w:rPr>
           <w:rFonts w:ascii="Consolas" w:hAnsi="Consolas"/>
@@ -8251,7 +8952,6 @@
         <w:t>.hasErrors</w:t>
       </w:r>
       <w:proofErr w:type="spellEnd"/>
-      <w:proofErr w:type="gramEnd"/>
       <w:r>
         <w:rPr>
           <w:rFonts w:ascii="Consolas" w:hAnsi="Consolas"/>
@@ -8380,21 +9080,13 @@
         <w:t xml:space="preserve"> asociados a entidades </w:t>
       </w:r>
       <w:r>
-        <w:t xml:space="preserve">tales </w:t>
-      </w:r>
-      <w:proofErr w:type="gramStart"/>
-      <w:r>
-        <w:t xml:space="preserve">como </w:t>
+        <w:t xml:space="preserve">tales como </w:t>
       </w:r>
       <w:r>
         <w:t xml:space="preserve"> </w:t>
       </w:r>
       <w:r>
-        <w:t>Curso</w:t>
-      </w:r>
-      <w:proofErr w:type="gramEnd"/>
-      <w:r>
-        <w:t xml:space="preserve"> o de </w:t>
+        <w:t xml:space="preserve">Curso o de </w:t>
       </w:r>
       <w:proofErr w:type="spellStart"/>
       <w:r>
@@ -8526,12 +9218,10 @@
         <w:t xml:space="preserve">de configuración </w:t>
       </w:r>
       <w:proofErr w:type="spellStart"/>
-      <w:proofErr w:type="gramStart"/>
       <w:r>
         <w:t>application.properties</w:t>
       </w:r>
       <w:proofErr w:type="spellEnd"/>
-      <w:proofErr w:type="gramEnd"/>
       <w:r>
         <w:t>.</w:t>
       </w:r>
@@ -8565,45 +9255,27 @@
           <w:bCs/>
         </w:rPr>
       </w:pPr>
-      <w:proofErr w:type="gramStart"/>
-      <w:r>
-        <w:rPr>
-          <w:b/>
-          <w:bCs/>
-        </w:rPr>
-        <w:t>  Cambiar</w:t>
-      </w:r>
-      <w:proofErr w:type="gramEnd"/>
-      <w:r>
-        <w:rPr>
-          <w:b/>
-          <w:bCs/>
-        </w:rPr>
-        <w:t xml:space="preserve"> rutas sin tocar código</w:t>
-      </w:r>
-    </w:p>
-    <w:p>
-      <w:pPr>
-        <w:rPr>
-          <w:b/>
-          <w:bCs/>
-        </w:rPr>
-      </w:pPr>
-      <w:proofErr w:type="gramStart"/>
-      <w:r>
-        <w:rPr>
-          <w:b/>
-          <w:bCs/>
-        </w:rPr>
-        <w:t>  Configurar</w:t>
-      </w:r>
-      <w:proofErr w:type="gramEnd"/>
-      <w:r>
-        <w:rPr>
-          <w:b/>
-          <w:bCs/>
-        </w:rPr>
-        <w:t xml:space="preserve"> rutas distintas por entorno (</w:t>
+      <w:r>
+        <w:rPr>
+          <w:b/>
+          <w:bCs/>
+        </w:rPr>
+        <w:t>  Cambiar rutas sin tocar código</w:t>
+      </w:r>
+    </w:p>
+    <w:p>
+      <w:pPr>
+        <w:rPr>
+          <w:b/>
+          <w:bCs/>
+        </w:rPr>
+      </w:pPr>
+      <w:r>
+        <w:rPr>
+          <w:b/>
+          <w:bCs/>
+        </w:rPr>
+        <w:t>  Configurar rutas distintas por entorno (</w:t>
       </w:r>
       <w:proofErr w:type="spellStart"/>
       <w:r>
@@ -8645,21 +9317,12 @@
           <w:bCs/>
         </w:rPr>
       </w:pPr>
-      <w:proofErr w:type="gramStart"/>
-      <w:r>
-        <w:rPr>
-          <w:b/>
-          <w:bCs/>
-        </w:rPr>
-        <w:t>  Mantener</w:t>
-      </w:r>
-      <w:proofErr w:type="gramEnd"/>
-      <w:r>
-        <w:rPr>
-          <w:b/>
-          <w:bCs/>
-        </w:rPr>
-        <w:t xml:space="preserve"> el código limpio y portable</w:t>
+      <w:r>
+        <w:rPr>
+          <w:b/>
+          <w:bCs/>
+        </w:rPr>
+        <w:t>  Mantener el código limpio y portable</w:t>
       </w:r>
     </w:p>
     <w:p>
@@ -8721,7 +9384,6 @@
           <w:b/>
           <w:bCs/>
         </w:rPr>
-        <w:lastRenderedPageBreak/>
         <w:t>1. El Problema Original</w:t>
       </w:r>
     </w:p>
@@ -8977,7 +9639,6 @@
         <w:t xml:space="preserve"> </w:t>
       </w:r>
       <w:proofErr w:type="spellStart"/>
-      <w:proofErr w:type="gramStart"/>
       <w:r>
         <w:rPr>
           <w:b/>
@@ -8991,15 +9652,7 @@
           <w:b/>
           <w:bCs/>
         </w:rPr>
-        <w:t>(</w:t>
-      </w:r>
-      <w:proofErr w:type="gramEnd"/>
-      <w:r>
-        <w:rPr>
-          <w:b/>
-          <w:bCs/>
-        </w:rPr>
-        <w:t>) {</w:t>
+        <w:t>() {</w:t>
       </w:r>
     </w:p>
     <w:p>
@@ -9076,7 +9729,6 @@
         </w:rPr>
       </w:pPr>
       <w:proofErr w:type="spellStart"/>
-      <w:proofErr w:type="gramStart"/>
       <w:r>
         <w:rPr>
           <w:b/>
@@ -9090,15 +9742,7 @@
           <w:b/>
           <w:bCs/>
         </w:rPr>
-        <w:t>(</w:t>
-      </w:r>
-      <w:proofErr w:type="gramEnd"/>
-      <w:r>
-        <w:rPr>
-          <w:b/>
-          <w:bCs/>
-        </w:rPr>
-        <w:t xml:space="preserve">): Captura la URL completa, incluyendo el </w:t>
+        <w:t xml:space="preserve">(): Captura la URL completa, incluyendo el </w:t>
       </w:r>
       <w:proofErr w:type="spellStart"/>
       <w:r>
@@ -9141,21 +9785,12 @@
         <w:t>ej</w:t>
       </w:r>
       <w:proofErr w:type="spellEnd"/>
-      <w:proofErr w:type="gramStart"/>
-      <w:r>
-        <w:rPr>
-          <w:b/>
-          <w:bCs/>
-        </w:rPr>
-        <w:t>: ?titulo</w:t>
-      </w:r>
-      <w:proofErr w:type="gramEnd"/>
-      <w:r>
-        <w:rPr>
-          <w:b/>
-          <w:bCs/>
-        </w:rPr>
-        <w:t>=</w:t>
+      <w:r>
+        <w:rPr>
+          <w:b/>
+          <w:bCs/>
+        </w:rPr>
+        <w:t>: ?titulo=</w:t>
       </w:r>
       <w:proofErr w:type="spellStart"/>
       <w:r>
@@ -9243,7 +9878,6 @@
         </w:rPr>
       </w:pPr>
       <w:proofErr w:type="spellStart"/>
-      <w:proofErr w:type="gramStart"/>
       <w:r>
         <w:rPr>
           <w:b/>
@@ -9252,7 +9886,6 @@
         <w:t>th:href</w:t>
       </w:r>
       <w:proofErr w:type="spellEnd"/>
-      <w:proofErr w:type="gramEnd"/>
       <w:r>
         <w:rPr>
           <w:b/>
@@ -9290,15 +9923,7 @@
           <w:b/>
           <w:bCs/>
         </w:rPr>
-        <w:t>', 'es'</w:t>
-      </w:r>
-      <w:proofErr w:type="gramStart"/>
-      <w:r>
-        <w:rPr>
-          <w:b/>
-          <w:bCs/>
-        </w:rPr>
-        <w:t>).</w:t>
+        <w:t>', 'es').</w:t>
       </w:r>
       <w:proofErr w:type="spellStart"/>
       <w:r>
@@ -9309,7 +9934,6 @@
         <w:t>toUriString</w:t>
       </w:r>
       <w:proofErr w:type="spellEnd"/>
-      <w:proofErr w:type="gramEnd"/>
       <w:r>
         <w:rPr>
           <w:b/>
@@ -9330,7 +9954,6 @@
         </w:rPr>
       </w:pPr>
       <w:proofErr w:type="spellStart"/>
-      <w:proofErr w:type="gramStart"/>
       <w:r>
         <w:rPr>
           <w:b/>
@@ -9347,7 +9970,6 @@
         <w:t>(</w:t>
       </w:r>
       <w:proofErr w:type="spellStart"/>
-      <w:proofErr w:type="gramEnd"/>
       <w:r>
         <w:rPr>
           <w:b/>
@@ -9393,23 +10015,7 @@
           <w:b/>
           <w:bCs/>
         </w:rPr>
-        <w:t xml:space="preserve"> ya existe, lo cambia. Si no existe, lo añade. El resto de </w:t>
-      </w:r>
-      <w:proofErr w:type="gramStart"/>
-      <w:r>
-        <w:rPr>
-          <w:b/>
-          <w:bCs/>
-        </w:rPr>
-        <w:t>parámetros</w:t>
-      </w:r>
-      <w:proofErr w:type="gramEnd"/>
-      <w:r>
-        <w:rPr>
-          <w:b/>
-          <w:bCs/>
-        </w:rPr>
-        <w:t xml:space="preserve"> (filtros de búsqueda, nivel, etc.) se mantienen intactos.</w:t>
+        <w:t xml:space="preserve"> ya existe, lo cambia. Si no existe, lo añade. El resto de parámetros (filtros de búsqueda, nivel, etc.) se mantienen intactos.</w:t>
       </w:r>
     </w:p>
     <w:p>
@@ -9424,7 +10030,6 @@
         </w:rPr>
       </w:pPr>
       <w:proofErr w:type="spellStart"/>
-      <w:proofErr w:type="gramStart"/>
       <w:r>
         <w:rPr>
           <w:b/>
@@ -9438,15 +10043,7 @@
           <w:b/>
           <w:bCs/>
         </w:rPr>
-        <w:t>(</w:t>
-      </w:r>
-      <w:proofErr w:type="gramEnd"/>
-      <w:r>
-        <w:rPr>
-          <w:b/>
-          <w:bCs/>
-        </w:rPr>
-        <w:t xml:space="preserve">): Convierte el objeto de nuevo en una cadena de texto válida para el atributo </w:t>
+        <w:t xml:space="preserve">(): Convierte el objeto de nuevo en una cadena de texto válida para el atributo </w:t>
       </w:r>
       <w:proofErr w:type="spellStart"/>
       <w:r>
@@ -9553,7 +10150,6 @@
           <w:b/>
           <w:bCs/>
         </w:rPr>
-        <w:lastRenderedPageBreak/>
         <w:t>Como el peso es relativo, tu fórmula en el Java (o en la Query) será algo como:</w:t>
       </w:r>
     </w:p>
@@ -9572,7 +10168,6 @@
         <w:t>$$\</w:t>
       </w:r>
       <w:proofErr w:type="spellStart"/>
-      <w:proofErr w:type="gramStart"/>
       <w:r>
         <w:rPr>
           <w:b/>
@@ -9586,34 +10181,9 @@
           <w:b/>
           <w:bCs/>
         </w:rPr>
-        <w:t>{</w:t>
-      </w:r>
-      <w:proofErr w:type="gramEnd"/>
-      <w:r>
-        <w:rPr>
-          <w:b/>
-          <w:bCs/>
-        </w:rPr>
-        <w:t>Progreso} = \</w:t>
-      </w:r>
-      <w:proofErr w:type="gramStart"/>
-      <w:r>
-        <w:rPr>
-          <w:b/>
-          <w:bCs/>
-        </w:rPr>
-        <w:t>frac{</w:t>
-      </w:r>
-      <w:proofErr w:type="gramEnd"/>
-      <w:r>
-        <w:rPr>
-          <w:b/>
-          <w:bCs/>
-        </w:rPr>
-        <w:t>\sum (\</w:t>
-      </w:r>
-      <w:proofErr w:type="spellStart"/>
-      <w:proofErr w:type="gramStart"/>
+        <w:t>{Progreso} = \frac{\sum (\</w:t>
+      </w:r>
+      <w:proofErr w:type="spellStart"/>
       <w:r>
         <w:rPr>
           <w:b/>
@@ -9627,34 +10197,9 @@
           <w:b/>
           <w:bCs/>
         </w:rPr>
-        <w:t>{</w:t>
-      </w:r>
-      <w:proofErr w:type="gramEnd"/>
-      <w:r>
-        <w:rPr>
-          <w:b/>
-          <w:bCs/>
-        </w:rPr>
-        <w:t>Peso de Tareas Completadas}</w:t>
-      </w:r>
-      <w:proofErr w:type="gramStart"/>
-      <w:r>
-        <w:rPr>
-          <w:b/>
-          <w:bCs/>
-        </w:rPr>
-        <w:t>)}{</w:t>
-      </w:r>
-      <w:proofErr w:type="gramEnd"/>
-      <w:r>
-        <w:rPr>
-          <w:b/>
-          <w:bCs/>
-        </w:rPr>
-        <w:t>\sum (\</w:t>
-      </w:r>
-      <w:proofErr w:type="spellStart"/>
-      <w:proofErr w:type="gramStart"/>
+        <w:t>{Peso de Tareas Completadas})}{\sum (\</w:t>
+      </w:r>
+      <w:proofErr w:type="spellStart"/>
       <w:r>
         <w:rPr>
           <w:b/>
@@ -9668,15 +10213,7 @@
           <w:b/>
           <w:bCs/>
         </w:rPr>
-        <w:t>{</w:t>
-      </w:r>
-      <w:proofErr w:type="gramEnd"/>
-      <w:r>
-        <w:rPr>
-          <w:b/>
-          <w:bCs/>
-        </w:rPr>
-        <w:t>Peso Total de Tareas del Curso})} \times 100$$</w:t>
+        <w:t>{Peso Total de Tareas del Curso})} \times 100$$</w:t>
       </w:r>
     </w:p>
     <w:p>
@@ -9835,7 +10372,6 @@
         <w:t xml:space="preserve"> </w:t>
       </w:r>
       <w:proofErr w:type="spellStart"/>
-      <w:proofErr w:type="gramStart"/>
       <w:r>
         <w:rPr>
           <w:b/>
@@ -9844,7 +10380,6 @@
         <w:t>th:if</w:t>
       </w:r>
       <w:proofErr w:type="spellEnd"/>
-      <w:proofErr w:type="gramEnd"/>
       <w:r>
         <w:rPr>
           <w:b/>
@@ -9853,7 +10388,6 @@
         <w:t>="${</w:t>
       </w:r>
       <w:proofErr w:type="spellStart"/>
-      <w:proofErr w:type="gramStart"/>
       <w:r>
         <w:rPr>
           <w:b/>
@@ -9862,7 +10396,6 @@
         <w:t>curso.progreso</w:t>
       </w:r>
       <w:proofErr w:type="spellEnd"/>
-      <w:proofErr w:type="gramEnd"/>
       <w:r>
         <w:rPr>
           <w:b/>
@@ -10162,7 +10695,6 @@
         <w:t xml:space="preserve"> </w:t>
       </w:r>
       <w:proofErr w:type="spellStart"/>
-      <w:proofErr w:type="gramStart"/>
       <w:r>
         <w:rPr>
           <w:b/>
@@ -10171,7 +10703,6 @@
         <w:t>th:if</w:t>
       </w:r>
       <w:proofErr w:type="spellEnd"/>
-      <w:proofErr w:type="gramEnd"/>
       <w:r>
         <w:rPr>
           <w:b/>
@@ -10180,7 +10711,6 @@
         <w:t>="${</w:t>
       </w:r>
       <w:proofErr w:type="spellStart"/>
-      <w:proofErr w:type="gramStart"/>
       <w:r>
         <w:rPr>
           <w:b/>
@@ -10189,7 +10719,6 @@
         <w:t>curso.progreso</w:t>
       </w:r>
       <w:proofErr w:type="spellEnd"/>
-      <w:proofErr w:type="gramEnd"/>
       <w:r>
         <w:rPr>
           <w:b/>
@@ -10213,7 +10742,6 @@
         <w:t xml:space="preserve">        &lt;a </w:t>
       </w:r>
       <w:proofErr w:type="spellStart"/>
-      <w:proofErr w:type="gramStart"/>
       <w:r>
         <w:rPr>
           <w:b/>
@@ -10222,7 +10750,6 @@
         <w:t>th:href</w:t>
       </w:r>
       <w:proofErr w:type="spellEnd"/>
-      <w:proofErr w:type="gramEnd"/>
       <w:r>
         <w:rPr>
           <w:b/>
@@ -10403,7 +10930,6 @@
         <w:t xml:space="preserve">        &lt;p </w:t>
       </w:r>
       <w:proofErr w:type="spellStart"/>
-      <w:proofErr w:type="gramStart"/>
       <w:r>
         <w:rPr>
           <w:b/>
@@ -10412,7 +10938,6 @@
         <w:t>th:if</w:t>
       </w:r>
       <w:proofErr w:type="spellEnd"/>
-      <w:proofErr w:type="gramEnd"/>
       <w:r>
         <w:rPr>
           <w:b/>
@@ -10421,7 +10946,6 @@
         <w:t>="${</w:t>
       </w:r>
       <w:proofErr w:type="spellStart"/>
-      <w:proofErr w:type="gramStart"/>
       <w:r>
         <w:rPr>
           <w:b/>
@@ -10430,7 +10954,6 @@
         <w:t>curso.tieneTareaPendiente</w:t>
       </w:r>
       <w:proofErr w:type="spellEnd"/>
-      <w:proofErr w:type="gramEnd"/>
       <w:r>
         <w:rPr>
           <w:b/>
@@ -10898,11 +11421,9 @@
           <w:b/>
           <w:bCs/>
         </w:rPr>
-        <w:lastRenderedPageBreak/>
         <w:t xml:space="preserve">         </w:t>
       </w:r>
       <w:proofErr w:type="spellStart"/>
-      <w:proofErr w:type="gramStart"/>
       <w:r>
         <w:rPr>
           <w:b/>
@@ -10911,7 +11432,6 @@
         <w:t>th:style</w:t>
       </w:r>
       <w:proofErr w:type="spellEnd"/>
-      <w:proofErr w:type="gramEnd"/>
       <w:r>
         <w:rPr>
           <w:b/>
@@ -10936,7 +11456,6 @@
         <w:t>: ' + ${</w:t>
       </w:r>
       <w:proofErr w:type="spellStart"/>
-      <w:proofErr w:type="gramStart"/>
       <w:r>
         <w:rPr>
           <w:b/>
@@ -10945,7 +11464,6 @@
         <w:t>curso.progreso</w:t>
       </w:r>
       <w:proofErr w:type="spellEnd"/>
-      <w:proofErr w:type="gramEnd"/>
       <w:r>
         <w:rPr>
           <w:b/>
@@ -11016,7 +11534,6 @@
         <w:t xml:space="preserve"> </w:t>
       </w:r>
       <w:proofErr w:type="spellStart"/>
-      <w:proofErr w:type="gramStart"/>
       <w:r>
         <w:rPr>
           <w:b/>
@@ -11025,7 +11542,6 @@
         <w:t>th:if</w:t>
       </w:r>
       <w:proofErr w:type="spellEnd"/>
-      <w:proofErr w:type="gramEnd"/>
       <w:r>
         <w:rPr>
           <w:b/>
@@ -11034,7 +11550,6 @@
         <w:t>="${</w:t>
       </w:r>
       <w:proofErr w:type="spellStart"/>
-      <w:proofErr w:type="gramStart"/>
       <w:r>
         <w:rPr>
           <w:b/>
@@ -11043,7 +11558,6 @@
         <w:t>curso.progresoPendiente</w:t>
       </w:r>
       <w:proofErr w:type="spellEnd"/>
-      <w:proofErr w:type="gramEnd"/>
       <w:r>
         <w:rPr>
           <w:b/>
@@ -11130,7 +11644,6 @@
         <w:t xml:space="preserve">         </w:t>
       </w:r>
       <w:proofErr w:type="spellStart"/>
-      <w:proofErr w:type="gramStart"/>
       <w:r>
         <w:rPr>
           <w:b/>
@@ -11139,7 +11652,6 @@
         <w:t>th:style</w:t>
       </w:r>
       <w:proofErr w:type="spellEnd"/>
-      <w:proofErr w:type="gramEnd"/>
       <w:r>
         <w:rPr>
           <w:b/>
@@ -11164,7 +11676,6 @@
         <w:t>: ' + ${</w:t>
       </w:r>
       <w:proofErr w:type="spellStart"/>
-      <w:proofErr w:type="gramStart"/>
       <w:r>
         <w:rPr>
           <w:b/>
@@ -11173,7 +11684,6 @@
         <w:t>curso.progresoPendiente</w:t>
       </w:r>
       <w:proofErr w:type="spellEnd"/>
-      <w:proofErr w:type="gramEnd"/>
       <w:r>
         <w:rPr>
           <w:b/>
@@ -11260,23 +11770,7 @@
           <w:b/>
           <w:bCs/>
         </w:rPr>
-        <w:t xml:space="preserve">Estado "Esperando Nota": Si el alumno ya terminó su </w:t>
-      </w:r>
-      <w:proofErr w:type="gramStart"/>
-      <w:r>
-        <w:rPr>
-          <w:b/>
-          <w:bCs/>
-        </w:rPr>
-        <w:t>parte</w:t>
-      </w:r>
-      <w:proofErr w:type="gramEnd"/>
-      <w:r>
-        <w:rPr>
-          <w:b/>
-          <w:bCs/>
-        </w:rPr>
-        <w:t xml:space="preserve"> pero el profesor no ha puntuado, es vital decírselo. Si no, verá que el progreso no sube y pensará que el sistema falla.</w:t>
+        <w:t>Estado "Esperando Nota": Si el alumno ya terminó su parte pero el profesor no ha puntuado, es vital decírselo. Si no, verá que el progreso no sube y pensará que el sistema falla.</w:t>
       </w:r>
     </w:p>
     <w:p>
@@ -11424,7 +11918,9 @@
     <w:sectPr>
       <w:pgSz w:w="11906" w:h="16838"/>
       <w:pgMar w:top="1417" w:right="1701" w:bottom="1417" w:left="1701" w:header="708" w:footer="708" w:gutter="0"/>
+      <w:pgNumType w:start="0"/>
       <w:cols w:space="708"/>
+      <w:titlePg/>
       <w:docGrid w:linePitch="360"/>
     </w:sectPr>
   </w:body>
@@ -11432,7 +11928,7 @@
 </file>
 
 <file path=word/numbering.xml><?xml version="1.0" encoding="utf-8"?>
-<w:numbering xmlns:wpc="http://schemas.microsoft.com/office/word/2010/wordprocessingCanvas" xmlns:cx="http://schemas.microsoft.com/office/drawing/2014/chartex" xmlns:cx1="http://schemas.microsoft.com/office/drawing/2015/9/8/chartex" xmlns:cx2="http://schemas.microsoft.com/office/drawing/2015/10/21/chartex" xmlns:cx3="http://schemas.microsoft.com/office/drawing/2016/5/9/chartex" xmlns:cx4="http://schemas.microsoft.com/office/drawing/2016/5/10/chartex" xmlns:cx5="http://schemas.microsoft.com/office/drawing/2016/5/11/chartex" xmlns:cx6="http://schemas.microsoft.com/office/drawing/2016/5/12/chartex" xmlns:cx7="http://schemas.microsoft.com/office/drawing/2016/5/13/chartex" xmlns:cx8="http://schemas.microsoft.com/office/drawing/2016/5/14/chartex" xmlns:mc="http://schemas.openxmlformats.org/markup-compatibility/2006" xmlns:aink="http://schemas.microsoft.com/office/drawing/2016/ink" xmlns:am3d="http://schemas.microsoft.com/office/drawing/2017/model3d" xmlns:o="urn:schemas-microsoft-com:office:office" xmlns:oel="http://schemas.microsoft.com/office/2019/extlst" xmlns:r="http://schemas.openxmlformats.org/officeDocument/2006/relationships" xmlns:m="http://schemas.openxmlformats.org/officeDocument/2006/math" xmlns:v="urn:schemas-microsoft-com:vml" xmlns:wp14="http://schemas.microsoft.com/office/word/2010/wordprocessingDrawing" xmlns:wp="http://schemas.openxmlformats.org/drawingml/2006/wordprocessingDrawing" xmlns:w10="urn:schemas-microsoft-com:office:word" xmlns:w="http://schemas.openxmlformats.org/wordprocessingml/2006/main" xmlns:w14="http://schemas.microsoft.com/office/word/2010/wordml" xmlns:w15="http://schemas.microsoft.com/office/word/2012/wordml" xmlns:w16cex="http://schemas.microsoft.com/office/word/2018/wordml/cex" xmlns:w16cid="http://schemas.microsoft.com/office/word/2016/wordml/cid" xmlns:w16="http://schemas.microsoft.com/office/word/2018/wordml" xmlns:w16du="http://schemas.microsoft.com/office/word/2023/wordml/word16du" xmlns:w16sdtdh="http://schemas.microsoft.com/office/word/2020/wordml/sdtdatahash" xmlns:w16sdtfl="http://schemas.microsoft.com/office/word/2024/wordml/sdtformatlock" xmlns:w16se="http://schemas.microsoft.com/office/word/2015/wordml/symex" xmlns:wpg="http://schemas.microsoft.com/office/word/2010/wordprocessingGroup" xmlns:wpi="http://schemas.microsoft.com/office/word/2010/wordprocessingInk" xmlns:wne="http://schemas.microsoft.com/office/word/2006/wordml" xmlns:wps="http://schemas.microsoft.com/office/word/2010/wordprocessingShape" mc:Ignorable="w14 w15 w16se w16cid w16 w16cex w16sdtdh w16sdtfl w16du wp14">
+<w:numbering xmlns:wpc="http://schemas.microsoft.com/office/word/2010/wordprocessingCanvas" xmlns:cx="http://schemas.microsoft.com/office/drawing/2014/chartex" xmlns:cx1="http://schemas.microsoft.com/office/drawing/2015/9/8/chartex" xmlns:cx2="http://schemas.microsoft.com/office/drawing/2015/10/21/chartex" xmlns:cx3="http://schemas.microsoft.com/office/drawing/2016/5/9/chartex" xmlns:cx4="http://schemas.microsoft.com/office/drawing/2016/5/10/chartex" xmlns:cx5="http://schemas.microsoft.com/office/drawing/2016/5/11/chartex" xmlns:cx6="http://schemas.microsoft.com/office/drawing/2016/5/12/chartex" xmlns:cx7="http://schemas.microsoft.com/office/drawing/2016/5/13/chartex" xmlns:cx8="http://schemas.microsoft.com/office/drawing/2016/5/14/chartex" xmlns:mc="http://schemas.openxmlformats.org/markup-compatibility/2006" xmlns:aink="http://schemas.microsoft.com/office/drawing/2016/ink" xmlns:am3d="http://schemas.microsoft.com/office/drawing/2017/model3d" xmlns:o="urn:schemas-microsoft-com:office:office" xmlns:r="http://schemas.openxmlformats.org/officeDocument/2006/relationships" xmlns:m="http://schemas.openxmlformats.org/officeDocument/2006/math" xmlns:v="urn:schemas-microsoft-com:vml" xmlns:wp14="http://schemas.microsoft.com/office/word/2010/wordprocessingDrawing" xmlns:wp="http://schemas.openxmlformats.org/drawingml/2006/wordprocessingDrawing" xmlns:w10="urn:schemas-microsoft-com:office:word" xmlns:w="http://schemas.openxmlformats.org/wordprocessingml/2006/main" xmlns:w14="http://schemas.microsoft.com/office/word/2010/wordml" xmlns:w15="http://schemas.microsoft.com/office/word/2012/wordml" xmlns:w16cex="http://schemas.microsoft.com/office/word/2018/wordml/cex" xmlns:w16cid="http://schemas.microsoft.com/office/word/2016/wordml/cid" xmlns:w16="http://schemas.microsoft.com/office/word/2018/wordml" xmlns:w16sdtdh="http://schemas.microsoft.com/office/word/2020/wordml/sdtdatahash" xmlns:w16se="http://schemas.microsoft.com/office/word/2015/wordml/symex" xmlns:wpg="http://schemas.microsoft.com/office/word/2010/wordprocessingGroup" xmlns:wpi="http://schemas.microsoft.com/office/word/2010/wordprocessingInk" xmlns:wne="http://schemas.microsoft.com/office/word/2006/wordml" xmlns:wps="http://schemas.microsoft.com/office/word/2010/wordprocessingShape" mc:Ignorable="w14 w15 w16se w16cid w16 w16cex w16sdtdh wp14">
   <w:abstractNum w:abstractNumId="0" w15:restartNumberingAfterBreak="0">
     <w:nsid w:val="237614E7"/>
     <w:multiLevelType w:val="hybridMultilevel"/>
@@ -12516,35 +13012,151 @@
       </w:rPr>
     </w:lvl>
   </w:abstractNum>
-  <w:num w:numId="1" w16cid:durableId="1162085532">
+  <w:abstractNum w:abstractNumId="8" w15:restartNumberingAfterBreak="0">
+    <w:nsid w:val="7EEA3310"/>
+    <w:multiLevelType w:val="hybridMultilevel"/>
+    <w:tmpl w:val="6A5CE6DC"/>
+    <w:lvl w:ilvl="0" w:tplc="60286C18">
+      <w:start w:val="1"/>
+      <w:numFmt w:val="bullet"/>
+      <w:lvlText w:val="-"/>
+      <w:lvlJc w:val="left"/>
+      <w:pPr>
+        <w:ind w:left="720" w:hanging="360"/>
+      </w:pPr>
+      <w:rPr>
+        <w:rFonts w:ascii="Aptos" w:eastAsiaTheme="minorEastAsia" w:hAnsi="Aptos" w:cstheme="minorBidi" w:hint="default"/>
+      </w:rPr>
+    </w:lvl>
+    <w:lvl w:ilvl="1" w:tplc="0C0A0003" w:tentative="1">
+      <w:start w:val="1"/>
+      <w:numFmt w:val="bullet"/>
+      <w:lvlText w:val="o"/>
+      <w:lvlJc w:val="left"/>
+      <w:pPr>
+        <w:ind w:left="1440" w:hanging="360"/>
+      </w:pPr>
+      <w:rPr>
+        <w:rFonts w:ascii="Courier New" w:hAnsi="Courier New" w:cs="Courier New" w:hint="default"/>
+      </w:rPr>
+    </w:lvl>
+    <w:lvl w:ilvl="2" w:tplc="0C0A0005" w:tentative="1">
+      <w:start w:val="1"/>
+      <w:numFmt w:val="bullet"/>
+      <w:lvlText w:val=""/>
+      <w:lvlJc w:val="left"/>
+      <w:pPr>
+        <w:ind w:left="2160" w:hanging="360"/>
+      </w:pPr>
+      <w:rPr>
+        <w:rFonts w:ascii="Wingdings" w:hAnsi="Wingdings" w:hint="default"/>
+      </w:rPr>
+    </w:lvl>
+    <w:lvl w:ilvl="3" w:tplc="0C0A0001" w:tentative="1">
+      <w:start w:val="1"/>
+      <w:numFmt w:val="bullet"/>
+      <w:lvlText w:val=""/>
+      <w:lvlJc w:val="left"/>
+      <w:pPr>
+        <w:ind w:left="2880" w:hanging="360"/>
+      </w:pPr>
+      <w:rPr>
+        <w:rFonts w:ascii="Symbol" w:hAnsi="Symbol" w:hint="default"/>
+      </w:rPr>
+    </w:lvl>
+    <w:lvl w:ilvl="4" w:tplc="0C0A0003" w:tentative="1">
+      <w:start w:val="1"/>
+      <w:numFmt w:val="bullet"/>
+      <w:lvlText w:val="o"/>
+      <w:lvlJc w:val="left"/>
+      <w:pPr>
+        <w:ind w:left="3600" w:hanging="360"/>
+      </w:pPr>
+      <w:rPr>
+        <w:rFonts w:ascii="Courier New" w:hAnsi="Courier New" w:cs="Courier New" w:hint="default"/>
+      </w:rPr>
+    </w:lvl>
+    <w:lvl w:ilvl="5" w:tplc="0C0A0005" w:tentative="1">
+      <w:start w:val="1"/>
+      <w:numFmt w:val="bullet"/>
+      <w:lvlText w:val=""/>
+      <w:lvlJc w:val="left"/>
+      <w:pPr>
+        <w:ind w:left="4320" w:hanging="360"/>
+      </w:pPr>
+      <w:rPr>
+        <w:rFonts w:ascii="Wingdings" w:hAnsi="Wingdings" w:hint="default"/>
+      </w:rPr>
+    </w:lvl>
+    <w:lvl w:ilvl="6" w:tplc="0C0A0001" w:tentative="1">
+      <w:start w:val="1"/>
+      <w:numFmt w:val="bullet"/>
+      <w:lvlText w:val=""/>
+      <w:lvlJc w:val="left"/>
+      <w:pPr>
+        <w:ind w:left="5040" w:hanging="360"/>
+      </w:pPr>
+      <w:rPr>
+        <w:rFonts w:ascii="Symbol" w:hAnsi="Symbol" w:hint="default"/>
+      </w:rPr>
+    </w:lvl>
+    <w:lvl w:ilvl="7" w:tplc="0C0A0003" w:tentative="1">
+      <w:start w:val="1"/>
+      <w:numFmt w:val="bullet"/>
+      <w:lvlText w:val="o"/>
+      <w:lvlJc w:val="left"/>
+      <w:pPr>
+        <w:ind w:left="5760" w:hanging="360"/>
+      </w:pPr>
+      <w:rPr>
+        <w:rFonts w:ascii="Courier New" w:hAnsi="Courier New" w:cs="Courier New" w:hint="default"/>
+      </w:rPr>
+    </w:lvl>
+    <w:lvl w:ilvl="8" w:tplc="0C0A0005" w:tentative="1">
+      <w:start w:val="1"/>
+      <w:numFmt w:val="bullet"/>
+      <w:lvlText w:val=""/>
+      <w:lvlJc w:val="left"/>
+      <w:pPr>
+        <w:ind w:left="6480" w:hanging="360"/>
+      </w:pPr>
+      <w:rPr>
+        <w:rFonts w:ascii="Wingdings" w:hAnsi="Wingdings" w:hint="default"/>
+      </w:rPr>
+    </w:lvl>
+  </w:abstractNum>
+  <w:num w:numId="1">
     <w:abstractNumId w:val="2"/>
   </w:num>
-  <w:num w:numId="2" w16cid:durableId="175268269">
+  <w:num w:numId="2">
     <w:abstractNumId w:val="4"/>
   </w:num>
-  <w:num w:numId="3" w16cid:durableId="1547713183">
+  <w:num w:numId="3">
     <w:abstractNumId w:val="5"/>
   </w:num>
-  <w:num w:numId="4" w16cid:durableId="1009256128">
+  <w:num w:numId="4">
     <w:abstractNumId w:val="7"/>
   </w:num>
-  <w:num w:numId="5" w16cid:durableId="1344626117">
+  <w:num w:numId="5">
     <w:abstractNumId w:val="6"/>
   </w:num>
-  <w:num w:numId="6" w16cid:durableId="363025450">
+  <w:num w:numId="6">
     <w:abstractNumId w:val="0"/>
   </w:num>
-  <w:num w:numId="7" w16cid:durableId="519389916">
+  <w:num w:numId="7">
     <w:abstractNumId w:val="3"/>
   </w:num>
-  <w:num w:numId="8" w16cid:durableId="1026709957">
+  <w:num w:numId="8">
     <w:abstractNumId w:val="1"/>
+  </w:num>
+  <w:num w:numId="9">
+    <w:abstractNumId w:val="8"/>
   </w:num>
 </w:numbering>
 </file>
 
 <file path=word/styles.xml><?xml version="1.0" encoding="utf-8"?>
-<w:styles xmlns:mc="http://schemas.openxmlformats.org/markup-compatibility/2006" xmlns:r="http://schemas.openxmlformats.org/officeDocument/2006/relationships" xmlns:w="http://schemas.openxmlformats.org/wordprocessingml/2006/main" xmlns:w14="http://schemas.microsoft.com/office/word/2010/wordml" xmlns:w15="http://schemas.microsoft.com/office/word/2012/wordml" xmlns:w16cex="http://schemas.microsoft.com/office/word/2018/wordml/cex" xmlns:w16cid="http://schemas.microsoft.com/office/word/2016/wordml/cid" xmlns:w16="http://schemas.microsoft.com/office/word/2018/wordml" xmlns:w16du="http://schemas.microsoft.com/office/word/2023/wordml/word16du" xmlns:w16sdtdh="http://schemas.microsoft.com/office/word/2020/wordml/sdtdatahash" xmlns:w16sdtfl="http://schemas.microsoft.com/office/word/2024/wordml/sdtformatlock" xmlns:w16se="http://schemas.microsoft.com/office/word/2015/wordml/symex" mc:Ignorable="w14 w15 w16se w16cid w16 w16cex w16sdtdh w16sdtfl w16du">
+<w:styles xmlns:mc="http://schemas.openxmlformats.org/markup-compatibility/2006" xmlns:r="http://schemas.openxmlformats.org/officeDocument/2006/relationships" xmlns:w="http://schemas.openxmlformats.org/wordprocessingml/2006/main" xmlns:w14="http://schemas.microsoft.com/office/word/2010/wordml" xmlns:w15="http://schemas.microsoft.com/office/word/2012/wordml" xmlns:w16cex="http://schemas.microsoft.com/office/word/2018/wordml/cex" xmlns:w16cid="http://schemas.microsoft.com/office/word/2016/wordml/cid" xmlns:w16="http://schemas.microsoft.com/office/word/2018/wordml" xmlns:w16sdtdh="http://schemas.microsoft.com/office/word/2020/wordml/sdtdatahash" xmlns:w16se="http://schemas.microsoft.com/office/word/2015/wordml/symex" mc:Ignorable="w14 w15 w16se w16cid w16 w16cex w16sdtdh">
   <w:docDefaults>
     <w:rPrDefault>
       <w:rPr>
@@ -13518,7 +14130,7 @@
       <w:color w:val="0E2841" w:themeColor="text2"/>
     </w:rPr>
   </w:style>
-  <w:style w:type="character" w:styleId="Fuerte">
+  <w:style w:type="character" w:styleId="Textoennegrita">
     <w:name w:val="Strong"/>
     <w:basedOn w:val="Fuentedeprrafopredeter"/>
     <w:uiPriority w:val="22"/>
@@ -13542,6 +14154,7 @@
   </w:style>
   <w:style w:type="paragraph" w:styleId="Sinespaciado">
     <w:name w:val="No Spacing"/>
+    <w:link w:val="SinespaciadoCar"/>
     <w:uiPriority w:val="1"/>
     <w:qFormat/>
     <w:rsid w:val="00295186"/>
@@ -13599,6 +14212,13 @@
     <w:pPr>
       <w:outlineLvl w:val="9"/>
     </w:pPr>
+  </w:style>
+  <w:style w:type="character" w:customStyle="1" w:styleId="SinespaciadoCar">
+    <w:name w:val="Sin espaciado Car"/>
+    <w:basedOn w:val="Fuentedeprrafopredeter"/>
+    <w:link w:val="Sinespaciado"/>
+    <w:uiPriority w:val="1"/>
+    <w:rsid w:val="00CE07CC"/>
   </w:style>
 </w:styles>
 </file>
@@ -13916,4 +14536,23 @@
     </a:ext>
   </a:extLst>
 </a:theme>
+</file>
+
+<file path=customXml/item1.xml><?xml version="1.0" encoding="utf-8"?>
+<CoverPageProperties xmlns="http://schemas.microsoft.com/office/2006/coverPageProps">
+  <PublishDate/>
+  <Abstract>Memoria técnica y Manual de usuario de la aplicación de Uned Cursos Web (UCW). </Abstract>
+  <CompanyAddress/>
+  <CompanyPhone/>
+  <CompanyFax/>
+  <CompanyEmail/>
+</CoverPageProperties>
+</file>
+
+<file path=customXml/itemProps1.xml><?xml version="1.0" encoding="utf-8"?>
+<ds:datastoreItem xmlns:ds="http://schemas.openxmlformats.org/officeDocument/2006/customXml" ds:itemID="{55AF091B-3C7A-41E3-B477-F2FDAA23CFDA}">
+  <ds:schemaRefs>
+    <ds:schemaRef ds:uri="http://schemas.microsoft.com/office/2006/coverPageProps"/>
+  </ds:schemaRefs>
+</ds:datastoreItem>
 </file>
</xml_diff>

<commit_message>
Se añade la generación de Javadocs
Se corrigen comentarios incorrectos.
Se añade a Security el directorio de javadocs

Se retoca "miperfil" y cambio de password.
</commit_message>
<xml_diff>
--- a/src/main/resources/static/docs/Memoria_aplicacion.docx
+++ b/src/main/resources/static/docs/Memoria_aplicacion.docx
@@ -10,6 +10,7 @@
           <w:docPartUnique/>
         </w:docPartObj>
       </w:sdtPr>
+      <w:sdtEndPr/>
       <w:sdtContent>
         <w:p>
           <w:pPr>
@@ -136,7 +137,7 @@
                                                     <pic:cNvPicPr/>
                                                   </pic:nvPicPr>
                                                   <pic:blipFill>
-                                                    <a:blip r:embed="rId6"/>
+                                                    <a:blip r:embed="rId8"/>
                                                     <a:stretch>
                                                       <a:fillRect/>
                                                     </a:stretch>
@@ -168,9 +169,11 @@
                                         <w:alias w:val="Título"/>
                                         <w:tag w:val=""/>
                                         <w:id w:val="-438379639"/>
+                                        <w:showingPlcHdr/>
                                         <w:dataBinding w:prefixMappings="xmlns:ns0='http://purl.org/dc/elements/1.1/' xmlns:ns1='http://schemas.openxmlformats.org/package/2006/metadata/core-properties' " w:xpath="/ns1:coreProperties[1]/ns0:title[1]" w:storeItemID="{6C3C8BC8-F283-45AE-878A-BAB7291924A1}"/>
                                         <w:text/>
                                       </w:sdtPr>
+                                      <w:sdtEndPr/>
                                       <w:sdtContent>
                                         <w:p>
                                           <w:pPr>
@@ -191,7 +194,7 @@
                                               <w:sz w:val="40"/>
                                               <w:szCs w:val="40"/>
                                             </w:rPr>
-                                            <w:t>Memoria proyecto aplicaciones web</w:t>
+                                            <w:t xml:space="preserve">     </w:t>
                                           </w:r>
                                         </w:p>
                                       </w:sdtContent>
@@ -209,6 +212,7 @@
                                         <w:dataBinding w:prefixMappings="xmlns:ns0='http://purl.org/dc/elements/1.1/' xmlns:ns1='http://schemas.openxmlformats.org/package/2006/metadata/core-properties' " w:xpath="/ns1:coreProperties[1]/ns0:subject[1]" w:storeItemID="{6C3C8BC8-F283-45AE-878A-BAB7291924A1}"/>
                                         <w:text/>
                                       </w:sdtPr>
+                                      <w:sdtEndPr/>
                                       <w:sdtContent>
                                         <w:p>
                                           <w:pPr>
@@ -266,6 +270,7 @@
                                         <w:dataBinding w:prefixMappings="xmlns:ns0='http://schemas.microsoft.com/office/2006/coverPageProps' " w:xpath="/ns0:CoverPageProperties[1]/ns0:Abstract[1]" w:storeItemID="{55AF091B-3C7A-41E3-B477-F2FDAA23CFDA}"/>
                                         <w:text/>
                                       </w:sdtPr>
+                                      <w:sdtEndPr/>
                                       <w:sdtContent>
                                         <w:p>
                                           <w:pPr>
@@ -333,6 +338,7 @@
                                         <w:dataBinding w:prefixMappings="xmlns:ns0='http://purl.org/dc/elements/1.1/' xmlns:ns1='http://schemas.openxmlformats.org/package/2006/metadata/core-properties' " w:xpath="/ns1:coreProperties[1]/ns0:creator[1]" w:storeItemID="{6C3C8BC8-F283-45AE-878A-BAB7291924A1}"/>
                                         <w:text/>
                                       </w:sdtPr>
+                                      <w:sdtEndPr/>
                                       <w:sdtContent>
                                         <w:p>
                                           <w:pPr>
@@ -369,6 +375,7 @@
                                           <w:dataBinding w:prefixMappings="xmlns:ns0='http://purl.org/dc/elements/1.1/' xmlns:ns1='http://schemas.openxmlformats.org/package/2006/metadata/core-properties' " w:xpath="/ns1:coreProperties[1]/ns1:category[1]" w:storeItemID="{6C3C8BC8-F283-45AE-878A-BAB7291924A1}"/>
                                           <w:text/>
                                         </w:sdtPr>
+                                        <w:sdtEndPr/>
                                         <w:sdtContent>
                                           <w:r>
                                             <w:rPr>
@@ -470,7 +477,7 @@
                                               <pic:cNvPicPr/>
                                             </pic:nvPicPr>
                                             <pic:blipFill>
-                                              <a:blip r:embed="rId6"/>
+                                              <a:blip r:embed="rId8"/>
                                               <a:stretch>
                                                 <a:fillRect/>
                                               </a:stretch>
@@ -502,9 +509,11 @@
                                   <w:alias w:val="Título"/>
                                   <w:tag w:val=""/>
                                   <w:id w:val="-438379639"/>
+                                  <w:showingPlcHdr/>
                                   <w:dataBinding w:prefixMappings="xmlns:ns0='http://purl.org/dc/elements/1.1/' xmlns:ns1='http://schemas.openxmlformats.org/package/2006/metadata/core-properties' " w:xpath="/ns1:coreProperties[1]/ns0:title[1]" w:storeItemID="{6C3C8BC8-F283-45AE-878A-BAB7291924A1}"/>
                                   <w:text/>
                                 </w:sdtPr>
+                                <w:sdtEndPr/>
                                 <w:sdtContent>
                                   <w:p>
                                     <w:pPr>
@@ -525,7 +534,7 @@
                                         <w:sz w:val="40"/>
                                         <w:szCs w:val="40"/>
                                       </w:rPr>
-                                      <w:t>Memoria proyecto aplicaciones web</w:t>
+                                      <w:t xml:space="preserve">     </w:t>
                                     </w:r>
                                   </w:p>
                                 </w:sdtContent>
@@ -543,6 +552,7 @@
                                   <w:dataBinding w:prefixMappings="xmlns:ns0='http://purl.org/dc/elements/1.1/' xmlns:ns1='http://schemas.openxmlformats.org/package/2006/metadata/core-properties' " w:xpath="/ns1:coreProperties[1]/ns0:subject[1]" w:storeItemID="{6C3C8BC8-F283-45AE-878A-BAB7291924A1}"/>
                                   <w:text/>
                                 </w:sdtPr>
+                                <w:sdtEndPr/>
                                 <w:sdtContent>
                                   <w:p>
                                     <w:pPr>
@@ -600,6 +610,7 @@
                                   <w:dataBinding w:prefixMappings="xmlns:ns0='http://schemas.microsoft.com/office/2006/coverPageProps' " w:xpath="/ns0:CoverPageProperties[1]/ns0:Abstract[1]" w:storeItemID="{55AF091B-3C7A-41E3-B477-F2FDAA23CFDA}"/>
                                   <w:text/>
                                 </w:sdtPr>
+                                <w:sdtEndPr/>
                                 <w:sdtContent>
                                   <w:p>
                                     <w:pPr>
@@ -667,6 +678,7 @@
                                   <w:dataBinding w:prefixMappings="xmlns:ns0='http://purl.org/dc/elements/1.1/' xmlns:ns1='http://schemas.openxmlformats.org/package/2006/metadata/core-properties' " w:xpath="/ns1:coreProperties[1]/ns0:creator[1]" w:storeItemID="{6C3C8BC8-F283-45AE-878A-BAB7291924A1}"/>
                                   <w:text/>
                                 </w:sdtPr>
+                                <w:sdtEndPr/>
                                 <w:sdtContent>
                                   <w:p>
                                     <w:pPr>
@@ -703,6 +715,7 @@
                                     <w:dataBinding w:prefixMappings="xmlns:ns0='http://purl.org/dc/elements/1.1/' xmlns:ns1='http://schemas.openxmlformats.org/package/2006/metadata/core-properties' " w:xpath="/ns1:coreProperties[1]/ns1:category[1]" w:storeItemID="{6C3C8BC8-F283-45AE-878A-BAB7291924A1}"/>
                                     <w:text/>
                                   </w:sdtPr>
+                                  <w:sdtEndPr/>
                                   <w:sdtContent>
                                     <w:r>
                                       <w:rPr>
@@ -795,7 +808,15 @@
     </w:p>
     <w:p>
       <w:r>
-        <w:t xml:space="preserve">- Responsable del proyecto: Francisco Javier Martínez Sánchez (24200346E). </w:t>
+        <w:t xml:space="preserve">- </w:t>
+      </w:r>
+      <w:proofErr w:type="gramStart"/>
+      <w:r>
+        <w:t>Responsable</w:t>
+      </w:r>
+      <w:proofErr w:type="gramEnd"/>
+      <w:r>
+        <w:t xml:space="preserve"> del proyecto: Francisco Javier Martínez Sánchez (24200346E). </w:t>
       </w:r>
     </w:p>
     <w:p>
@@ -873,6 +894,7 @@
         <w:t xml:space="preserve">De acuerdo a los requerimientos iniciales se establece este diagrama de CU (casos de uso) a ser implementados por la </w:t>
       </w:r>
       <w:proofErr w:type="spellStart"/>
+      <w:proofErr w:type="gramStart"/>
       <w:r>
         <w:t>aplicación.</w:t>
       </w:r>
@@ -880,6 +902,7 @@
         <w:t>Requisitos</w:t>
       </w:r>
       <w:proofErr w:type="spellEnd"/>
+      <w:proofErr w:type="gramEnd"/>
       <w:r>
         <w:t xml:space="preserve"> de usuario del Proyecto</w:t>
       </w:r>
@@ -889,6 +912,9 @@
         <w:ind w:firstLine="708"/>
       </w:pPr>
       <w:r>
+        <w:rPr>
+          <w:noProof/>
+        </w:rPr>
         <w:drawing>
           <wp:inline distT="0" distB="0" distL="0" distR="0" wp14:anchorId="0BD20DB9" wp14:editId="20A2DA1F">
             <wp:extent cx="5400040" cy="4529455"/>
@@ -905,7 +931,7 @@
                     <pic:cNvPicPr/>
                   </pic:nvPicPr>
                   <pic:blipFill>
-                    <a:blip r:embed="rId7"/>
+                    <a:blip r:embed="rId9"/>
                     <a:stretch>
                       <a:fillRect/>
                     </a:stretch>
@@ -1020,7 +1046,15 @@
         <w:t xml:space="preserve">Al acceder a la aplicación se visualizarán </w:t>
       </w:r>
       <w:r>
-        <w:t xml:space="preserve">la home pública </w:t>
+        <w:t xml:space="preserve">la </w:t>
+      </w:r>
+      <w:proofErr w:type="gramStart"/>
+      <w:r>
+        <w:t>home pública</w:t>
+      </w:r>
+      <w:proofErr w:type="gramEnd"/>
+      <w:r>
+        <w:t xml:space="preserve"> </w:t>
       </w:r>
     </w:p>
     <w:p>
@@ -1044,7 +1078,7 @@
                     <pic:cNvPicPr/>
                   </pic:nvPicPr>
                   <pic:blipFill>
-                    <a:blip r:embed="rId8">
+                    <a:blip r:embed="rId10">
                       <a:extLst>
                         <a:ext uri="{28A0092B-C50C-407E-A947-70E740481C1C}">
                           <a14:useLocalDpi xmlns:a14="http://schemas.microsoft.com/office/drawing/2010/main" val="0"/>
@@ -1148,7 +1182,15 @@
         <w:t>7.- Selector de idioma.</w:t>
       </w:r>
       <w:r>
-        <w:t xml:space="preserve"> Al desplegar la opción se podrá seleccionar uno de los dos idiomas disponibles (Español e Inglés).</w:t>
+        <w:t xml:space="preserve"> Al desplegar la opción se podrá seleccionar uno de los dos idiomas disponibles (</w:t>
+      </w:r>
+      <w:proofErr w:type="gramStart"/>
+      <w:r>
+        <w:t>Español</w:t>
+      </w:r>
+      <w:proofErr w:type="gramEnd"/>
+      <w:r>
+        <w:t xml:space="preserve"> e Inglés).</w:t>
       </w:r>
     </w:p>
     <w:p>
@@ -1235,7 +1277,7 @@
                     <pic:cNvPicPr/>
                   </pic:nvPicPr>
                   <pic:blipFill>
-                    <a:blip r:embed="rId9"/>
+                    <a:blip r:embed="rId11"/>
                     <a:stretch>
                       <a:fillRect/>
                     </a:stretch>
@@ -1298,7 +1340,7 @@
                     <pic:cNvPicPr/>
                   </pic:nvPicPr>
                   <pic:blipFill>
-                    <a:blip r:embed="rId10"/>
+                    <a:blip r:embed="rId12"/>
                     <a:stretch>
                       <a:fillRect/>
                     </a:stretch>
@@ -1349,7 +1391,7 @@
                     <pic:cNvPicPr/>
                   </pic:nvPicPr>
                   <pic:blipFill>
-                    <a:blip r:embed="rId11"/>
+                    <a:blip r:embed="rId13"/>
                     <a:stretch>
                       <a:fillRect/>
                     </a:stretch>
@@ -1385,7 +1427,15 @@
     </w:p>
     <w:p>
       <w:r>
-        <w:t xml:space="preserve">La realizaremos desde la opción de menú “Acceso”-&gt;”Registrarse” o desde la pantalla de Login </w:t>
+        <w:t>La realizaremos desde la opción de menú “Acceso”-</w:t>
+      </w:r>
+      <w:proofErr w:type="gramStart"/>
+      <w:r>
+        <w:t>&gt;”Registrarse</w:t>
+      </w:r>
+      <w:proofErr w:type="gramEnd"/>
+      <w:r>
+        <w:t xml:space="preserve">” o desde la pantalla de Login </w:t>
       </w:r>
       <w:r>
         <w:rPr>
@@ -1407,7 +1457,7 @@
                     <pic:cNvPicPr/>
                   </pic:nvPicPr>
                   <pic:blipFill>
-                    <a:blip r:embed="rId12"/>
+                    <a:blip r:embed="rId14"/>
                     <a:stretch>
                       <a:fillRect/>
                     </a:stretch>
@@ -1457,7 +1507,7 @@
                     <pic:cNvPicPr/>
                   </pic:nvPicPr>
                   <pic:blipFill>
-                    <a:blip r:embed="rId13"/>
+                    <a:blip r:embed="rId15"/>
                     <a:stretch>
                       <a:fillRect/>
                     </a:stretch>
@@ -1674,11 +1724,16 @@
       <w:r>
         <w:t xml:space="preserve">datos para </w:t>
       </w:r>
+      <w:proofErr w:type="gramStart"/>
       <w:r>
         <w:t xml:space="preserve">definir </w:t>
       </w:r>
       <w:r>
-        <w:t xml:space="preserve"> un módulo al sistema</w:t>
+        <w:t xml:space="preserve"> un</w:t>
+      </w:r>
+      <w:proofErr w:type="gramEnd"/>
+      <w:r>
+        <w:t xml:space="preserve"> módulo al sistema</w:t>
       </w:r>
     </w:p>
     <w:p>
@@ -1702,7 +1757,7 @@
                     <pic:cNvPicPr/>
                   </pic:nvPicPr>
                   <pic:blipFill>
-                    <a:blip r:embed="rId14">
+                    <a:blip r:embed="rId16">
                       <a:extLst>
                         <a:ext uri="{28A0092B-C50C-407E-A947-70E740481C1C}">
                           <a14:useLocalDpi xmlns:a14="http://schemas.microsoft.com/office/drawing/2010/main" val="0"/>
@@ -1872,7 +1927,7 @@
                     <pic:cNvPicPr/>
                   </pic:nvPicPr>
                   <pic:blipFill>
-                    <a:blip r:embed="rId15">
+                    <a:blip r:embed="rId17">
                       <a:extLst>
                         <a:ext uri="{28A0092B-C50C-407E-A947-70E740481C1C}">
                           <a14:useLocalDpi xmlns:a14="http://schemas.microsoft.com/office/drawing/2010/main" val="0"/>
@@ -1913,9 +1968,1217 @@
         <w:t>Se mostrará el formulario del módulo con los datos actuales para modificar los que se necesiten.</w:t>
       </w:r>
     </w:p>
+    <w:p>
+      <w:pPr>
+        <w:pStyle w:val="Ttulo1"/>
+      </w:pPr>
+      <w:r>
+        <w:t>Gestión de Cursos</w:t>
+      </w:r>
+    </w:p>
+    <w:p>
+      <w:r>
+        <w:tab/>
+        <w:t xml:space="preserve">Se accederá desde </w:t>
+      </w:r>
+      <w:proofErr w:type="gramStart"/>
+      <w:r>
+        <w:t>la home</w:t>
+      </w:r>
+      <w:proofErr w:type="gramEnd"/>
+      <w:r>
+        <w:t xml:space="preserve"> de Administración y/o Profesores</w:t>
+      </w:r>
+    </w:p>
+    <w:p>
+      <w:r>
+        <w:t>ADMINISTRADOR</w:t>
+      </w:r>
+    </w:p>
+    <w:p>
+      <w:r>
+        <w:drawing>
+          <wp:inline distT="0" distB="0" distL="0" distR="0" wp14:anchorId="2BE4E292" wp14:editId="49B35605">
+            <wp:extent cx="5400040" cy="2000250"/>
+            <wp:effectExtent l="0" t="0" r="0" b="0"/>
+            <wp:docPr id="14" name="Imagen 14"/>
+            <wp:cNvGraphicFramePr>
+              <a:graphicFrameLocks xmlns:a="http://schemas.openxmlformats.org/drawingml/2006/main" noChangeAspect="1"/>
+            </wp:cNvGraphicFramePr>
+            <a:graphic xmlns:a="http://schemas.openxmlformats.org/drawingml/2006/main">
+              <a:graphicData uri="http://schemas.openxmlformats.org/drawingml/2006/picture">
+                <pic:pic xmlns:pic="http://schemas.openxmlformats.org/drawingml/2006/picture">
+                  <pic:nvPicPr>
+                    <pic:cNvPr id="1" name=""/>
+                    <pic:cNvPicPr/>
+                  </pic:nvPicPr>
+                  <pic:blipFill>
+                    <a:blip r:embed="rId18"/>
+                    <a:stretch>
+                      <a:fillRect/>
+                    </a:stretch>
+                  </pic:blipFill>
+                  <pic:spPr>
+                    <a:xfrm>
+                      <a:off x="0" y="0"/>
+                      <a:ext cx="5400040" cy="2000250"/>
+                    </a:xfrm>
+                    <a:prstGeom prst="rect">
+                      <a:avLst/>
+                    </a:prstGeom>
+                  </pic:spPr>
+                </pic:pic>
+              </a:graphicData>
+            </a:graphic>
+          </wp:inline>
+        </w:drawing>
+      </w:r>
+    </w:p>
     <w:p/>
     <w:p>
       <w:r>
+        <w:t>PROFESOR</w:t>
+      </w:r>
+    </w:p>
+    <w:p/>
+    <w:p>
+      <w:r>
+        <w:drawing>
+          <wp:inline distT="0" distB="0" distL="0" distR="0" wp14:anchorId="6BC7F0EB" wp14:editId="7A07465F">
+            <wp:extent cx="5400040" cy="1259205"/>
+            <wp:effectExtent l="0" t="0" r="0" b="0"/>
+            <wp:docPr id="5" name="Imagen 5"/>
+            <wp:cNvGraphicFramePr>
+              <a:graphicFrameLocks xmlns:a="http://schemas.openxmlformats.org/drawingml/2006/main" noChangeAspect="1"/>
+            </wp:cNvGraphicFramePr>
+            <a:graphic xmlns:a="http://schemas.openxmlformats.org/drawingml/2006/main">
+              <a:graphicData uri="http://schemas.openxmlformats.org/drawingml/2006/picture">
+                <pic:pic xmlns:pic="http://schemas.openxmlformats.org/drawingml/2006/picture">
+                  <pic:nvPicPr>
+                    <pic:cNvPr id="1" name=""/>
+                    <pic:cNvPicPr/>
+                  </pic:nvPicPr>
+                  <pic:blipFill>
+                    <a:blip r:embed="rId19"/>
+                    <a:stretch>
+                      <a:fillRect/>
+                    </a:stretch>
+                  </pic:blipFill>
+                  <pic:spPr>
+                    <a:xfrm>
+                      <a:off x="0" y="0"/>
+                      <a:ext cx="5400040" cy="1259205"/>
+                    </a:xfrm>
+                    <a:prstGeom prst="rect">
+                      <a:avLst/>
+                    </a:prstGeom>
+                  </pic:spPr>
+                </pic:pic>
+              </a:graphicData>
+            </a:graphic>
+          </wp:inline>
+        </w:drawing>
+      </w:r>
+    </w:p>
+    <w:p>
+      <w:pPr>
+        <w:rPr>
+          <w:noProof/>
+        </w:rPr>
+      </w:pPr>
+      <w:r>
+        <w:t>Al acceder se nos mostrarán los cursos en los que es responsable el Profesor “logado”, permitiéndonos.</w:t>
+      </w:r>
+      <w:r>
+        <w:rPr>
+          <w:noProof/>
+        </w:rPr>
+        <w:t xml:space="preserve"> </w:t>
+      </w:r>
+    </w:p>
+    <w:p>
+      <w:pPr>
+        <w:pStyle w:val="Ttulo2"/>
+      </w:pPr>
+      <w:r>
+        <w:t>Nuevo</w:t>
+      </w:r>
+      <w:r>
+        <w:t xml:space="preserve"> Curso</w:t>
+      </w:r>
+    </w:p>
+    <w:p/>
+    <w:p>
+      <w:pPr>
+        <w:pStyle w:val="Prrafodelista"/>
+        <w:numPr>
+          <w:ilvl w:val="0"/>
+          <w:numId w:val="8"/>
+        </w:numPr>
+      </w:pPr>
+      <w:r>
+        <w:t>Dar de alta un nuevo curso</w:t>
+      </w:r>
+      <w:r>
+        <w:rPr>
+          <w:noProof/>
+        </w:rPr>
+        <w:drawing>
+          <wp:inline distT="0" distB="0" distL="0" distR="0" wp14:anchorId="1D9ADB76" wp14:editId="58E212D6">
+            <wp:extent cx="1390844" cy="419158"/>
+            <wp:effectExtent l="0" t="0" r="0" b="0"/>
+            <wp:docPr id="6" name="Imagen 6"/>
+            <wp:cNvGraphicFramePr>
+              <a:graphicFrameLocks xmlns:a="http://schemas.openxmlformats.org/drawingml/2006/main" noChangeAspect="1"/>
+            </wp:cNvGraphicFramePr>
+            <a:graphic xmlns:a="http://schemas.openxmlformats.org/drawingml/2006/main">
+              <a:graphicData uri="http://schemas.openxmlformats.org/drawingml/2006/picture">
+                <pic:pic xmlns:pic="http://schemas.openxmlformats.org/drawingml/2006/picture">
+                  <pic:nvPicPr>
+                    <pic:cNvPr id="6" name=""/>
+                    <pic:cNvPicPr/>
+                  </pic:nvPicPr>
+                  <pic:blipFill>
+                    <a:blip r:embed="rId20">
+                      <a:extLst>
+                        <a:ext uri="{28A0092B-C50C-407E-A947-70E740481C1C}">
+                          <a14:useLocalDpi xmlns:a14="http://schemas.microsoft.com/office/drawing/2010/main" val="0"/>
+                        </a:ext>
+                      </a:extLst>
+                    </a:blip>
+                    <a:stretch>
+                      <a:fillRect/>
+                    </a:stretch>
+                  </pic:blipFill>
+                  <pic:spPr>
+                    <a:xfrm>
+                      <a:off x="0" y="0"/>
+                      <a:ext cx="1390844" cy="419158"/>
+                    </a:xfrm>
+                    <a:prstGeom prst="rect">
+                      <a:avLst/>
+                    </a:prstGeom>
+                  </pic:spPr>
+                </pic:pic>
+              </a:graphicData>
+            </a:graphic>
+          </wp:inline>
+        </w:drawing>
+      </w:r>
+    </w:p>
+    <w:p>
+      <w:pPr>
+        <w:ind w:left="705"/>
+      </w:pPr>
+      <w:r>
+        <w:t>Se mostrará el formulario de alta del curso</w:t>
+      </w:r>
+    </w:p>
+    <w:p>
+      <w:pPr>
+        <w:ind w:left="705"/>
+      </w:pPr>
+      <w:r>
+        <w:drawing>
+          <wp:inline distT="0" distB="0" distL="0" distR="0" wp14:anchorId="7B0A367F" wp14:editId="38D8DEDA">
+            <wp:extent cx="5400040" cy="3664585"/>
+            <wp:effectExtent l="0" t="0" r="0" b="0"/>
+            <wp:docPr id="8" name="Imagen 8"/>
+            <wp:cNvGraphicFramePr>
+              <a:graphicFrameLocks xmlns:a="http://schemas.openxmlformats.org/drawingml/2006/main" noChangeAspect="1"/>
+            </wp:cNvGraphicFramePr>
+            <a:graphic xmlns:a="http://schemas.openxmlformats.org/drawingml/2006/main">
+              <a:graphicData uri="http://schemas.openxmlformats.org/drawingml/2006/picture">
+                <pic:pic xmlns:pic="http://schemas.openxmlformats.org/drawingml/2006/picture">
+                  <pic:nvPicPr>
+                    <pic:cNvPr id="1" name=""/>
+                    <pic:cNvPicPr/>
+                  </pic:nvPicPr>
+                  <pic:blipFill>
+                    <a:blip r:embed="rId21"/>
+                    <a:stretch>
+                      <a:fillRect/>
+                    </a:stretch>
+                  </pic:blipFill>
+                  <pic:spPr>
+                    <a:xfrm>
+                      <a:off x="0" y="0"/>
+                      <a:ext cx="5400040" cy="3664585"/>
+                    </a:xfrm>
+                    <a:prstGeom prst="rect">
+                      <a:avLst/>
+                    </a:prstGeom>
+                  </pic:spPr>
+                </pic:pic>
+              </a:graphicData>
+            </a:graphic>
+          </wp:inline>
+        </w:drawing>
+      </w:r>
+    </w:p>
+    <w:p>
+      <w:pPr>
+        <w:ind w:left="705"/>
+      </w:pPr>
+      <w:r>
+        <w:t>1.- Imagen del curso. Se seleccionará un fichero gráfico para mostrar como imagen del curso.</w:t>
+      </w:r>
+    </w:p>
+    <w:p>
+      <w:pPr>
+        <w:ind w:left="705"/>
+      </w:pPr>
+      <w:r>
+        <w:t>2.- Datos generales del curso:</w:t>
+      </w:r>
+    </w:p>
+    <w:p>
+      <w:pPr>
+        <w:ind w:left="705"/>
+      </w:pPr>
+      <w:r>
+        <w:tab/>
+      </w:r>
+      <w:r>
+        <w:tab/>
+        <w:t>2.1 Título</w:t>
+      </w:r>
+    </w:p>
+    <w:p>
+      <w:pPr>
+        <w:ind w:left="705"/>
+      </w:pPr>
+      <w:r>
+        <w:tab/>
+      </w:r>
+      <w:r>
+        <w:tab/>
+        <w:t>2.2 Descripción larga.</w:t>
+      </w:r>
+    </w:p>
+    <w:p>
+      <w:pPr>
+        <w:ind w:left="705"/>
+      </w:pPr>
+      <w:r>
+        <w:tab/>
+      </w:r>
+      <w:r>
+        <w:tab/>
+        <w:t>2.3 Área Temática</w:t>
+      </w:r>
+    </w:p>
+    <w:p>
+      <w:pPr>
+        <w:ind w:left="705"/>
+      </w:pPr>
+      <w:r>
+        <w:tab/>
+      </w:r>
+      <w:r>
+        <w:tab/>
+        <w:t>2.4 Nivel</w:t>
+      </w:r>
+    </w:p>
+    <w:p>
+      <w:pPr>
+        <w:ind w:left="705"/>
+      </w:pPr>
+      <w:r>
+        <w:tab/>
+      </w:r>
+      <w:r>
+        <w:tab/>
+        <w:t>2.5 Duración en horas.</w:t>
+      </w:r>
+    </w:p>
+    <w:p>
+      <w:pPr>
+        <w:ind w:left="705"/>
+      </w:pPr>
+      <w:r>
+        <w:tab/>
+      </w:r>
+      <w:r>
+        <w:tab/>
+        <w:t>2.6 Fecha de inicio periodo de subscripción.</w:t>
+      </w:r>
+    </w:p>
+    <w:p>
+      <w:pPr>
+        <w:ind w:left="705"/>
+      </w:pPr>
+      <w:r>
+        <w:tab/>
+      </w:r>
+      <w:r>
+        <w:tab/>
+        <w:t>2.7 Fecha Final periodo de subscripción.</w:t>
+      </w:r>
+    </w:p>
+    <w:p>
+      <w:pPr>
+        <w:ind w:left="705"/>
+      </w:pPr>
+      <w:r>
+        <w:t xml:space="preserve">3.- Estado (ACTIVO se puede subscribir, BLOQUEADO No se permite nuevas </w:t>
+      </w:r>
+      <w:proofErr w:type="spellStart"/>
+      <w:r>
+        <w:t>subscrpciones</w:t>
+      </w:r>
+      <w:proofErr w:type="spellEnd"/>
+      <w:r>
+        <w:t>.</w:t>
+      </w:r>
+    </w:p>
+    <w:p>
+      <w:pPr>
+        <w:ind w:left="705"/>
+      </w:pPr>
+      <w:r>
+        <w:t>4.- Módulos. Módulos del curso.</w:t>
+      </w:r>
+    </w:p>
+    <w:p>
+      <w:pPr>
+        <w:ind w:left="705"/>
+      </w:pPr>
+      <w:r>
+        <w:drawing>
+          <wp:inline distT="0" distB="0" distL="0" distR="0" wp14:anchorId="191FA314" wp14:editId="69206A5B">
+            <wp:extent cx="5400040" cy="4176395"/>
+            <wp:effectExtent l="0" t="0" r="0" b="0"/>
+            <wp:docPr id="10" name="Imagen 10"/>
+            <wp:cNvGraphicFramePr>
+              <a:graphicFrameLocks xmlns:a="http://schemas.openxmlformats.org/drawingml/2006/main" noChangeAspect="1"/>
+            </wp:cNvGraphicFramePr>
+            <a:graphic xmlns:a="http://schemas.openxmlformats.org/drawingml/2006/main">
+              <a:graphicData uri="http://schemas.openxmlformats.org/drawingml/2006/picture">
+                <pic:pic xmlns:pic="http://schemas.openxmlformats.org/drawingml/2006/picture">
+                  <pic:nvPicPr>
+                    <pic:cNvPr id="1" name=""/>
+                    <pic:cNvPicPr/>
+                  </pic:nvPicPr>
+                  <pic:blipFill>
+                    <a:blip r:embed="rId22"/>
+                    <a:stretch>
+                      <a:fillRect/>
+                    </a:stretch>
+                  </pic:blipFill>
+                  <pic:spPr>
+                    <a:xfrm>
+                      <a:off x="0" y="0"/>
+                      <a:ext cx="5400040" cy="4176395"/>
+                    </a:xfrm>
+                    <a:prstGeom prst="rect">
+                      <a:avLst/>
+                    </a:prstGeom>
+                  </pic:spPr>
+                </pic:pic>
+              </a:graphicData>
+            </a:graphic>
+          </wp:inline>
+        </w:drawing>
+      </w:r>
+    </w:p>
+    <w:p>
+      <w:pPr>
+        <w:ind w:left="705"/>
+      </w:pPr>
+      <w:r>
+        <w:tab/>
+      </w:r>
+      <w:r>
+        <w:tab/>
+        <w:t>4.1. Selector de módulos</w:t>
+      </w:r>
+    </w:p>
+    <w:p>
+      <w:pPr>
+        <w:ind w:left="705"/>
+      </w:pPr>
+      <w:r>
+        <w:tab/>
+      </w:r>
+      <w:r>
+        <w:tab/>
+        <w:t xml:space="preserve">4.2. </w:t>
+      </w:r>
+      <w:proofErr w:type="gramStart"/>
+      <w:r>
+        <w:t>”Añadir</w:t>
+      </w:r>
+      <w:proofErr w:type="gramEnd"/>
+      <w:r>
+        <w:t xml:space="preserve"> el módulo seleccionado.</w:t>
+      </w:r>
+    </w:p>
+    <w:p>
+      <w:pPr>
+        <w:ind w:left="705"/>
+      </w:pPr>
+      <w:r>
+        <w:tab/>
+      </w:r>
+      <w:r>
+        <w:tab/>
+        <w:t>4.3. Orden del módulo en el curso</w:t>
+      </w:r>
+    </w:p>
+    <w:p>
+      <w:pPr>
+        <w:ind w:left="705"/>
+      </w:pPr>
+      <w:r>
+        <w:tab/>
+      </w:r>
+      <w:r>
+        <w:tab/>
+        <w:t>4.4 Peso de cada módulo (distribuir para alcanzar el 100%)</w:t>
+      </w:r>
+    </w:p>
+    <w:p>
+      <w:pPr>
+        <w:ind w:left="705"/>
+      </w:pPr>
+    </w:p>
+    <w:p>
+      <w:pPr>
+        <w:ind w:left="705"/>
+      </w:pPr>
+      <w:r>
+        <w:t xml:space="preserve">5.- Contenidos Extras del curso.  </w:t>
+      </w:r>
+    </w:p>
+    <w:p>
+      <w:pPr>
+        <w:ind w:left="705"/>
+      </w:pPr>
+      <w:r>
+        <w:drawing>
+          <wp:inline distT="0" distB="0" distL="0" distR="0" wp14:anchorId="1F32B620" wp14:editId="0C485DB5">
+            <wp:extent cx="5400040" cy="1424305"/>
+            <wp:effectExtent l="0" t="0" r="0" b="4445"/>
+            <wp:docPr id="12" name="Imagen 12"/>
+            <wp:cNvGraphicFramePr>
+              <a:graphicFrameLocks xmlns:a="http://schemas.openxmlformats.org/drawingml/2006/main" noChangeAspect="1"/>
+            </wp:cNvGraphicFramePr>
+            <a:graphic xmlns:a="http://schemas.openxmlformats.org/drawingml/2006/main">
+              <a:graphicData uri="http://schemas.openxmlformats.org/drawingml/2006/picture">
+                <pic:pic xmlns:pic="http://schemas.openxmlformats.org/drawingml/2006/picture">
+                  <pic:nvPicPr>
+                    <pic:cNvPr id="1" name=""/>
+                    <pic:cNvPicPr/>
+                  </pic:nvPicPr>
+                  <pic:blipFill>
+                    <a:blip r:embed="rId23"/>
+                    <a:stretch>
+                      <a:fillRect/>
+                    </a:stretch>
+                  </pic:blipFill>
+                  <pic:spPr>
+                    <a:xfrm>
+                      <a:off x="0" y="0"/>
+                      <a:ext cx="5400040" cy="1424305"/>
+                    </a:xfrm>
+                    <a:prstGeom prst="rect">
+                      <a:avLst/>
+                    </a:prstGeom>
+                  </pic:spPr>
+                </pic:pic>
+              </a:graphicData>
+            </a:graphic>
+          </wp:inline>
+        </w:drawing>
+      </w:r>
+    </w:p>
+    <w:p>
+      <w:pPr>
+        <w:ind w:left="705"/>
+      </w:pPr>
+      <w:r>
+        <w:tab/>
+      </w:r>
+      <w:r>
+        <w:tab/>
+        <w:t>5.1. “Añadir Contenidos Extra”</w:t>
+      </w:r>
+    </w:p>
+    <w:p>
+      <w:pPr>
+        <w:ind w:left="705"/>
+      </w:pPr>
+      <w:r>
+        <w:tab/>
+      </w:r>
+      <w:r>
+        <w:tab/>
+        <w:t>5.2. Contenido “Externo”</w:t>
+      </w:r>
+    </w:p>
+    <w:p>
+      <w:pPr>
+        <w:ind w:left="705"/>
+      </w:pPr>
+      <w:r>
+        <w:tab/>
+      </w:r>
+      <w:r>
+        <w:tab/>
+        <w:t xml:space="preserve">5.3 </w:t>
+      </w:r>
+      <w:proofErr w:type="spellStart"/>
+      <w:r>
+        <w:t>Url</w:t>
+      </w:r>
+      <w:proofErr w:type="spellEnd"/>
+      <w:r>
+        <w:t xml:space="preserve"> del contenido externo</w:t>
+      </w:r>
+    </w:p>
+    <w:p>
+      <w:pPr>
+        <w:ind w:left="705"/>
+      </w:pPr>
+      <w:r>
+        <w:tab/>
+      </w:r>
+      <w:r>
+        <w:tab/>
+        <w:t>5.4 Contenido “Propio”</w:t>
+      </w:r>
+    </w:p>
+    <w:p>
+      <w:pPr>
+        <w:ind w:left="705"/>
+      </w:pPr>
+      <w:r>
+        <w:tab/>
+      </w:r>
+      <w:r>
+        <w:tab/>
+        <w:t>5.5 Selección de fichero propio.</w:t>
+      </w:r>
+    </w:p>
+    <w:p>
+      <w:pPr>
+        <w:ind w:left="705"/>
+      </w:pPr>
+    </w:p>
+    <w:p>
+      <w:pPr>
+        <w:ind w:left="705"/>
+      </w:pPr>
+      <w:r>
+        <w:t>Una vez se guarde la información se recargará el curso indicándonos el mensaje de “Datos guardados correctamente”</w:t>
+      </w:r>
+    </w:p>
+    <w:p>
+      <w:pPr>
+        <w:ind w:left="705"/>
+      </w:pPr>
+      <w:r>
+        <w:drawing>
+          <wp:inline distT="0" distB="0" distL="0" distR="0" wp14:anchorId="74A5D872" wp14:editId="196D7EEF">
+            <wp:extent cx="3829584" cy="4763165"/>
+            <wp:effectExtent l="0" t="0" r="0" b="0"/>
+            <wp:docPr id="13" name="Imagen 13"/>
+            <wp:cNvGraphicFramePr>
+              <a:graphicFrameLocks xmlns:a="http://schemas.openxmlformats.org/drawingml/2006/main" noChangeAspect="1"/>
+            </wp:cNvGraphicFramePr>
+            <a:graphic xmlns:a="http://schemas.openxmlformats.org/drawingml/2006/main">
+              <a:graphicData uri="http://schemas.openxmlformats.org/drawingml/2006/picture">
+                <pic:pic xmlns:pic="http://schemas.openxmlformats.org/drawingml/2006/picture">
+                  <pic:nvPicPr>
+                    <pic:cNvPr id="1" name=""/>
+                    <pic:cNvPicPr/>
+                  </pic:nvPicPr>
+                  <pic:blipFill>
+                    <a:blip r:embed="rId24"/>
+                    <a:stretch>
+                      <a:fillRect/>
+                    </a:stretch>
+                  </pic:blipFill>
+                  <pic:spPr>
+                    <a:xfrm>
+                      <a:off x="0" y="0"/>
+                      <a:ext cx="3829584" cy="4763165"/>
+                    </a:xfrm>
+                    <a:prstGeom prst="rect">
+                      <a:avLst/>
+                    </a:prstGeom>
+                  </pic:spPr>
+                </pic:pic>
+              </a:graphicData>
+            </a:graphic>
+          </wp:inline>
+        </w:drawing>
+      </w:r>
+    </w:p>
+    <w:p>
+      <w:pPr>
+        <w:ind w:left="705"/>
+      </w:pPr>
+      <w:r>
+        <w:t>Si no se han cumplido las validaciones de los valores introducidos se recibirán los correspondientes mensajes:</w:t>
+      </w:r>
+    </w:p>
+    <w:p>
+      <w:pPr>
+        <w:ind w:left="705"/>
+      </w:pPr>
+      <w:r>
+        <w:drawing>
+          <wp:inline distT="0" distB="0" distL="0" distR="0" wp14:anchorId="18C69080" wp14:editId="27E111AB">
+            <wp:extent cx="5400040" cy="2099310"/>
+            <wp:effectExtent l="0" t="0" r="0" b="0"/>
+            <wp:docPr id="15" name="Imagen 15"/>
+            <wp:cNvGraphicFramePr>
+              <a:graphicFrameLocks xmlns:a="http://schemas.openxmlformats.org/drawingml/2006/main" noChangeAspect="1"/>
+            </wp:cNvGraphicFramePr>
+            <a:graphic xmlns:a="http://schemas.openxmlformats.org/drawingml/2006/main">
+              <a:graphicData uri="http://schemas.openxmlformats.org/drawingml/2006/picture">
+                <pic:pic xmlns:pic="http://schemas.openxmlformats.org/drawingml/2006/picture">
+                  <pic:nvPicPr>
+                    <pic:cNvPr id="1" name=""/>
+                    <pic:cNvPicPr/>
+                  </pic:nvPicPr>
+                  <pic:blipFill>
+                    <a:blip r:embed="rId25"/>
+                    <a:stretch>
+                      <a:fillRect/>
+                    </a:stretch>
+                  </pic:blipFill>
+                  <pic:spPr>
+                    <a:xfrm>
+                      <a:off x="0" y="0"/>
+                      <a:ext cx="5400040" cy="2099310"/>
+                    </a:xfrm>
+                    <a:prstGeom prst="rect">
+                      <a:avLst/>
+                    </a:prstGeom>
+                  </pic:spPr>
+                </pic:pic>
+              </a:graphicData>
+            </a:graphic>
+          </wp:inline>
+        </w:drawing>
+      </w:r>
+    </w:p>
+    <w:p>
+      <w:pPr>
+        <w:ind w:left="705"/>
+      </w:pPr>
+    </w:p>
+    <w:p>
+      <w:pPr>
+        <w:ind w:left="705"/>
+      </w:pPr>
+      <w:r>
+        <w:t xml:space="preserve">En el caso de ser dado de alta por un PROFESOR, se le asignará automáticamente a él, en el caso de ser dado de alta por un ADMINISTRADOR, se nos mostrará un campo adicional: </w:t>
+      </w:r>
+      <w:r>
+        <w:drawing>
+          <wp:inline distT="0" distB="0" distL="0" distR="0" wp14:anchorId="0E65965C" wp14:editId="6A460A55">
+            <wp:extent cx="2391109" cy="962159"/>
+            <wp:effectExtent l="0" t="0" r="9525" b="9525"/>
+            <wp:docPr id="16" name="Imagen 16"/>
+            <wp:cNvGraphicFramePr>
+              <a:graphicFrameLocks xmlns:a="http://schemas.openxmlformats.org/drawingml/2006/main" noChangeAspect="1"/>
+            </wp:cNvGraphicFramePr>
+            <a:graphic xmlns:a="http://schemas.openxmlformats.org/drawingml/2006/main">
+              <a:graphicData uri="http://schemas.openxmlformats.org/drawingml/2006/picture">
+                <pic:pic xmlns:pic="http://schemas.openxmlformats.org/drawingml/2006/picture">
+                  <pic:nvPicPr>
+                    <pic:cNvPr id="1" name=""/>
+                    <pic:cNvPicPr/>
+                  </pic:nvPicPr>
+                  <pic:blipFill>
+                    <a:blip r:embed="rId26"/>
+                    <a:stretch>
+                      <a:fillRect/>
+                    </a:stretch>
+                  </pic:blipFill>
+                  <pic:spPr>
+                    <a:xfrm>
+                      <a:off x="0" y="0"/>
+                      <a:ext cx="2391109" cy="962159"/>
+                    </a:xfrm>
+                    <a:prstGeom prst="rect">
+                      <a:avLst/>
+                    </a:prstGeom>
+                  </pic:spPr>
+                </pic:pic>
+              </a:graphicData>
+            </a:graphic>
+          </wp:inline>
+        </w:drawing>
+      </w:r>
+    </w:p>
+    <w:p>
+      <w:pPr>
+        <w:ind w:left="705"/>
+      </w:pPr>
+      <w:r>
+        <w:t xml:space="preserve">Para </w:t>
+      </w:r>
+      <w:r>
+        <w:t>indicar el Profesor responsable del mismo.</w:t>
+      </w:r>
+    </w:p>
+    <w:p>
+      <w:pPr>
+        <w:pStyle w:val="Ttulo2"/>
+      </w:pPr>
+      <w:r>
+        <w:t>Modificación de un curso</w:t>
+      </w:r>
+    </w:p>
+    <w:p>
+      <w:r>
+        <w:tab/>
+        <w:t>Desde el listado de cursos disponible se seleccionará mediante el “icono” correspondiente el curso deseado</w:t>
+      </w:r>
+      <w:r>
+        <w:t xml:space="preserve">: </w:t>
+      </w:r>
+      <w:r>
+        <w:drawing>
+          <wp:inline distT="0" distB="0" distL="0" distR="0" wp14:anchorId="040779E4" wp14:editId="2DDBE3CA">
+            <wp:extent cx="752580" cy="438211"/>
+            <wp:effectExtent l="0" t="0" r="9525" b="0"/>
+            <wp:docPr id="7" name="Imagen 7"/>
+            <wp:cNvGraphicFramePr>
+              <a:graphicFrameLocks xmlns:a="http://schemas.openxmlformats.org/drawingml/2006/main" noChangeAspect="1"/>
+            </wp:cNvGraphicFramePr>
+            <a:graphic xmlns:a="http://schemas.openxmlformats.org/drawingml/2006/main">
+              <a:graphicData uri="http://schemas.openxmlformats.org/drawingml/2006/picture">
+                <pic:pic xmlns:pic="http://schemas.openxmlformats.org/drawingml/2006/picture">
+                  <pic:nvPicPr>
+                    <pic:cNvPr id="1" name=""/>
+                    <pic:cNvPicPr/>
+                  </pic:nvPicPr>
+                  <pic:blipFill>
+                    <a:blip r:embed="rId27"/>
+                    <a:stretch>
+                      <a:fillRect/>
+                    </a:stretch>
+                  </pic:blipFill>
+                  <pic:spPr>
+                    <a:xfrm>
+                      <a:off x="0" y="0"/>
+                      <a:ext cx="752580" cy="438211"/>
+                    </a:xfrm>
+                    <a:prstGeom prst="rect">
+                      <a:avLst/>
+                    </a:prstGeom>
+                  </pic:spPr>
+                </pic:pic>
+              </a:graphicData>
+            </a:graphic>
+          </wp:inline>
+        </w:drawing>
+      </w:r>
+    </w:p>
+    <w:p>
+      <w:r>
+        <w:tab/>
+        <w:t>Nos mostrará la información actual y podremos modificar los datos existentes, añadir/eliminar módulos, pesos y orden. También se podrán añadir/eliminar/modificar los contenidos extras existentes.</w:t>
+      </w:r>
+    </w:p>
+    <w:p/>
+    <w:p>
+      <w:pPr>
+        <w:pStyle w:val="Ttulo1"/>
+      </w:pPr>
+      <w:r>
+        <w:t>Gestión de usuarios</w:t>
+      </w:r>
+    </w:p>
+    <w:p>
+      <w:r>
+        <w:tab/>
+        <w:t>Esta opción sólo es accesible por el perfil de ADMIN, se accederá desde el panel de Administración:</w:t>
+      </w:r>
+    </w:p>
+    <w:p>
+      <w:pPr>
+        <w:jc w:val="center"/>
+      </w:pPr>
+      <w:r>
+        <w:drawing>
+          <wp:inline distT="0" distB="0" distL="0" distR="0" wp14:anchorId="6C0448D8" wp14:editId="7B6B8432">
+            <wp:extent cx="4372585" cy="2048161"/>
+            <wp:effectExtent l="0" t="0" r="0" b="9525"/>
+            <wp:docPr id="22" name="Imagen 22"/>
+            <wp:cNvGraphicFramePr>
+              <a:graphicFrameLocks xmlns:a="http://schemas.openxmlformats.org/drawingml/2006/main" noChangeAspect="1"/>
+            </wp:cNvGraphicFramePr>
+            <a:graphic xmlns:a="http://schemas.openxmlformats.org/drawingml/2006/main">
+              <a:graphicData uri="http://schemas.openxmlformats.org/drawingml/2006/picture">
+                <pic:pic xmlns:pic="http://schemas.openxmlformats.org/drawingml/2006/picture">
+                  <pic:nvPicPr>
+                    <pic:cNvPr id="1" name=""/>
+                    <pic:cNvPicPr/>
+                  </pic:nvPicPr>
+                  <pic:blipFill>
+                    <a:blip r:embed="rId28"/>
+                    <a:stretch>
+                      <a:fillRect/>
+                    </a:stretch>
+                  </pic:blipFill>
+                  <pic:spPr>
+                    <a:xfrm>
+                      <a:off x="0" y="0"/>
+                      <a:ext cx="4372585" cy="2048161"/>
+                    </a:xfrm>
+                    <a:prstGeom prst="rect">
+                      <a:avLst/>
+                    </a:prstGeom>
+                  </pic:spPr>
+                </pic:pic>
+              </a:graphicData>
+            </a:graphic>
+          </wp:inline>
+        </w:drawing>
+      </w:r>
+    </w:p>
+    <w:p>
+      <w:r>
+        <w:tab/>
+        <w:t>Obtendremos la lista actual de usuarios de forma paginada, con opciones de búsqueda para filtrar resultados y para añadir y/o modificar un usuario.</w:t>
+      </w:r>
+    </w:p>
+    <w:p>
+      <w:r>
+        <w:drawing>
+          <wp:inline distT="0" distB="0" distL="0" distR="0" wp14:anchorId="497E2C0A" wp14:editId="25FE44DD">
+            <wp:extent cx="5400040" cy="2870200"/>
+            <wp:effectExtent l="0" t="0" r="0" b="6350"/>
+            <wp:docPr id="21" name="Imagen 21"/>
+            <wp:cNvGraphicFramePr>
+              <a:graphicFrameLocks xmlns:a="http://schemas.openxmlformats.org/drawingml/2006/main" noChangeAspect="1"/>
+            </wp:cNvGraphicFramePr>
+            <a:graphic xmlns:a="http://schemas.openxmlformats.org/drawingml/2006/main">
+              <a:graphicData uri="http://schemas.openxmlformats.org/drawingml/2006/picture">
+                <pic:pic xmlns:pic="http://schemas.openxmlformats.org/drawingml/2006/picture">
+                  <pic:nvPicPr>
+                    <pic:cNvPr id="1" name=""/>
+                    <pic:cNvPicPr/>
+                  </pic:nvPicPr>
+                  <pic:blipFill>
+                    <a:blip r:embed="rId29"/>
+                    <a:stretch>
+                      <a:fillRect/>
+                    </a:stretch>
+                  </pic:blipFill>
+                  <pic:spPr>
+                    <a:xfrm>
+                      <a:off x="0" y="0"/>
+                      <a:ext cx="5400040" cy="2870200"/>
+                    </a:xfrm>
+                    <a:prstGeom prst="rect">
+                      <a:avLst/>
+                    </a:prstGeom>
+                  </pic:spPr>
+                </pic:pic>
+              </a:graphicData>
+            </a:graphic>
+          </wp:inline>
+        </w:drawing>
+      </w:r>
+    </w:p>
+    <w:p>
+      <w:pPr>
+        <w:pStyle w:val="Ttulo2"/>
+      </w:pPr>
+      <w:r>
+        <w:t>Nuevo Usuario</w:t>
+      </w:r>
+    </w:p>
+    <w:p>
+      <w:r>
+        <w:tab/>
+        <w:t>Seleccionaremos la opción:</w:t>
+      </w:r>
+    </w:p>
+    <w:p>
+      <w:r>
+        <w:t>Nos mostrará el formulario de datos de un usuario.</w:t>
+      </w:r>
+    </w:p>
+    <w:p>
+      <w:r>
+        <w:drawing>
+          <wp:inline distT="0" distB="0" distL="0" distR="0" wp14:anchorId="677AE431" wp14:editId="64886359">
+            <wp:extent cx="5727315" cy="2533650"/>
+            <wp:effectExtent l="0" t="0" r="6985" b="0"/>
+            <wp:docPr id="18" name="Imagen 18"/>
+            <wp:cNvGraphicFramePr>
+              <a:graphicFrameLocks xmlns:a="http://schemas.openxmlformats.org/drawingml/2006/main" noChangeAspect="1"/>
+            </wp:cNvGraphicFramePr>
+            <a:graphic xmlns:a="http://schemas.openxmlformats.org/drawingml/2006/main">
+              <a:graphicData uri="http://schemas.openxmlformats.org/drawingml/2006/picture">
+                <pic:pic xmlns:pic="http://schemas.openxmlformats.org/drawingml/2006/picture">
+                  <pic:nvPicPr>
+                    <pic:cNvPr id="1" name=""/>
+                    <pic:cNvPicPr/>
+                  </pic:nvPicPr>
+                  <pic:blipFill>
+                    <a:blip r:embed="rId30"/>
+                    <a:stretch>
+                      <a:fillRect/>
+                    </a:stretch>
+                  </pic:blipFill>
+                  <pic:spPr>
+                    <a:xfrm>
+                      <a:off x="0" y="0"/>
+                      <a:ext cx="5738162" cy="2538449"/>
+                    </a:xfrm>
+                    <a:prstGeom prst="rect">
+                      <a:avLst/>
+                    </a:prstGeom>
+                  </pic:spPr>
+                </pic:pic>
+              </a:graphicData>
+            </a:graphic>
+          </wp:inline>
+        </w:drawing>
+      </w:r>
+    </w:p>
+    <w:p>
+      <w:r>
+        <w:t>Al pulsar en “Salvar” se realizarán las validaciones correspondientes según la siguiente pantalla:</w:t>
+      </w:r>
+    </w:p>
+    <w:p>
+      <w:r>
+        <w:tab/>
+        <w:t>1.- Email. Será el identificador de usuario, no debe de existir actualmente.</w:t>
+      </w:r>
+    </w:p>
+    <w:p>
+      <w:r>
+        <w:tab/>
+        <w:t>2.- Rol. Rol del usuario (ADMIN, PROFE, ESTUD).</w:t>
+      </w:r>
+    </w:p>
+    <w:p>
+      <w:r>
+        <w:tab/>
+        <w:t>3.- Estado. (Activo/Inactivo).</w:t>
+      </w:r>
+    </w:p>
+    <w:p>
+      <w:r>
+        <w:tab/>
+        <w:t>4.- Contraseña. Mínimo 6 caracteres.</w:t>
+      </w:r>
+    </w:p>
+    <w:p>
+      <w:r>
+        <w:tab/>
+        <w:t>5.- Confirmar contraseña. Deberá coincidir con la anterior.</w:t>
+      </w:r>
+    </w:p>
+    <w:p>
+      <w:r>
+        <w:tab/>
+        <w:t>6.- Nombre. Nombre del usuario.</w:t>
+      </w:r>
+    </w:p>
+    <w:p>
+      <w:r>
+        <w:tab/>
+        <w:t>7.- Apellido 1.</w:t>
+      </w:r>
+    </w:p>
+    <w:p>
+      <w:r>
+        <w:t>Si los datos son correctos, se recargará la pantalla con el mensaje de “Datos guardados correctamente”:</w:t>
+      </w:r>
+    </w:p>
+    <w:p>
+      <w:r>
+        <w:drawing>
+          <wp:inline distT="0" distB="0" distL="0" distR="0" wp14:anchorId="571275A5" wp14:editId="3DB3C289">
+            <wp:extent cx="6145081" cy="1943100"/>
+            <wp:effectExtent l="0" t="0" r="8255" b="0"/>
+            <wp:docPr id="19" name="Imagen 19"/>
+            <wp:cNvGraphicFramePr>
+              <a:graphicFrameLocks xmlns:a="http://schemas.openxmlformats.org/drawingml/2006/main" noChangeAspect="1"/>
+            </wp:cNvGraphicFramePr>
+            <a:graphic xmlns:a="http://schemas.openxmlformats.org/drawingml/2006/main">
+              <a:graphicData uri="http://schemas.openxmlformats.org/drawingml/2006/picture">
+                <pic:pic xmlns:pic="http://schemas.openxmlformats.org/drawingml/2006/picture">
+                  <pic:nvPicPr>
+                    <pic:cNvPr id="1" name=""/>
+                    <pic:cNvPicPr/>
+                  </pic:nvPicPr>
+                  <pic:blipFill>
+                    <a:blip r:embed="rId31"/>
+                    <a:stretch>
+                      <a:fillRect/>
+                    </a:stretch>
+                  </pic:blipFill>
+                  <pic:spPr>
+                    <a:xfrm>
+                      <a:off x="0" y="0"/>
+                      <a:ext cx="6149026" cy="1944347"/>
+                    </a:xfrm>
+                    <a:prstGeom prst="rect">
+                      <a:avLst/>
+                    </a:prstGeom>
+                  </pic:spPr>
+                </pic:pic>
+              </a:graphicData>
+            </a:graphic>
+          </wp:inline>
+        </w:drawing>
+      </w:r>
+    </w:p>
+    <w:p/>
+    <w:p>
+      <w:pPr>
+        <w:pStyle w:val="Ttulo2"/>
+      </w:pPr>
+      <w:r>
+        <w:t>Modificación de</w:t>
+      </w:r>
+      <w:r>
+        <w:t xml:space="preserve"> Usuario</w:t>
+      </w:r>
+    </w:p>
+    <w:p/>
+    <w:p>
+      <w:r>
+        <w:tab/>
+        <w:t>Se seleccionará desde el listado de usuarios pulsando el icono:</w:t>
+      </w:r>
+    </w:p>
+    <w:p/>
+    <w:p>
+      <w:r>
+        <w:tab/>
+        <w:t>Se mostrarán los datos de usuario, pudiendo modificarlos.</w:t>
+      </w:r>
+    </w:p>
+    <w:p>
+      <w:r>
+        <w:tab/>
+        <w:t>La contraseña se modificará desde esta pantalla, se nos solicitará la nueva contraseña y la confirmación de la misma.</w:t>
+      </w:r>
+    </w:p>
+    <w:p>
+      <w:r>
+        <w:drawing>
+          <wp:inline distT="0" distB="0" distL="0" distR="0" wp14:anchorId="2440018E" wp14:editId="468870DD">
+            <wp:extent cx="5296639" cy="3524742"/>
+            <wp:effectExtent l="0" t="0" r="0" b="0"/>
+            <wp:docPr id="20" name="Imagen 20"/>
+            <wp:cNvGraphicFramePr>
+              <a:graphicFrameLocks xmlns:a="http://schemas.openxmlformats.org/drawingml/2006/main" noChangeAspect="1"/>
+            </wp:cNvGraphicFramePr>
+            <a:graphic xmlns:a="http://schemas.openxmlformats.org/drawingml/2006/main">
+              <a:graphicData uri="http://schemas.openxmlformats.org/drawingml/2006/picture">
+                <pic:pic xmlns:pic="http://schemas.openxmlformats.org/drawingml/2006/picture">
+                  <pic:nvPicPr>
+                    <pic:cNvPr id="1" name=""/>
+                    <pic:cNvPicPr/>
+                  </pic:nvPicPr>
+                  <pic:blipFill>
+                    <a:blip r:embed="rId32"/>
+                    <a:stretch>
+                      <a:fillRect/>
+                    </a:stretch>
+                  </pic:blipFill>
+                  <pic:spPr>
+                    <a:xfrm>
+                      <a:off x="0" y="0"/>
+                      <a:ext cx="5296639" cy="3524742"/>
+                    </a:xfrm>
+                    <a:prstGeom prst="rect">
+                      <a:avLst/>
+                    </a:prstGeom>
+                  </pic:spPr>
+                </pic:pic>
+              </a:graphicData>
+            </a:graphic>
+          </wp:inline>
+        </w:drawing>
+      </w:r>
+    </w:p>
+    <w:p>
+      <w:r>
+        <w:tab/>
+        <w:t>Al pulsar sobre “Salvar” se comprobará que tanto la contraseña como la confirmación de la misma tienen al mínimo 6 caracteres y son idénticas.</w:t>
+      </w:r>
+    </w:p>
+    <w:p>
+      <w:pPr>
+        <w:pStyle w:val="Ttulo2"/>
+      </w:pPr>
+      <w:r>
+        <w:t>Baja de Usuario</w:t>
+      </w:r>
+    </w:p>
+    <w:p>
+      <w:r>
+        <w:tab/>
+        <w:t>No existe baja de usuario como tal, la “baja” consistirá en “desactivar” la cuenta del usuario a través de la opción de Modificación de usuario.</w:t>
+      </w:r>
+    </w:p>
+    <w:p>
+      <w:pPr>
+        <w:jc w:val="center"/>
+      </w:pPr>
+      <w:r>
+        <w:drawing>
+          <wp:inline distT="0" distB="0" distL="0" distR="0" wp14:anchorId="2B6E3A64" wp14:editId="3EC2E64B">
+            <wp:extent cx="1438476" cy="1381318"/>
+            <wp:effectExtent l="0" t="0" r="9525" b="9525"/>
+            <wp:docPr id="23" name="Imagen 23"/>
+            <wp:cNvGraphicFramePr>
+              <a:graphicFrameLocks xmlns:a="http://schemas.openxmlformats.org/drawingml/2006/main" noChangeAspect="1"/>
+            </wp:cNvGraphicFramePr>
+            <a:graphic xmlns:a="http://schemas.openxmlformats.org/drawingml/2006/main">
+              <a:graphicData uri="http://schemas.openxmlformats.org/drawingml/2006/picture">
+                <pic:pic xmlns:pic="http://schemas.openxmlformats.org/drawingml/2006/picture">
+                  <pic:nvPicPr>
+                    <pic:cNvPr id="1" name=""/>
+                    <pic:cNvPicPr/>
+                  </pic:nvPicPr>
+                  <pic:blipFill>
+                    <a:blip r:embed="rId33"/>
+                    <a:stretch>
+                      <a:fillRect/>
+                    </a:stretch>
+                  </pic:blipFill>
+                  <pic:spPr>
+                    <a:xfrm>
+                      <a:off x="0" y="0"/>
+                      <a:ext cx="1438476" cy="1381318"/>
+                    </a:xfrm>
+                    <a:prstGeom prst="rect">
+                      <a:avLst/>
+                    </a:prstGeom>
+                  </pic:spPr>
+                </pic:pic>
+              </a:graphicData>
+            </a:graphic>
+          </wp:inline>
+        </w:drawing>
+      </w:r>
+    </w:p>
+    <w:p>
+      <w:r>
+        <w:t>Mientras el usuario esté desactivado, no podrá acceder a la plataforma.</w:t>
+      </w:r>
+    </w:p>
+    <w:p/>
+    <w:p>
+      <w:r>
         <w:t>[Login Form]</w:t>
       </w:r>
     </w:p>
@@ -2060,12 +3323,17 @@
         <w:t xml:space="preserve"> → </w:t>
       </w:r>
       <w:proofErr w:type="spellStart"/>
+      <w:proofErr w:type="gramStart"/>
       <w:r>
         <w:t>getConnectedUsers</w:t>
       </w:r>
       <w:proofErr w:type="spellEnd"/>
       <w:r>
-        <w:t>()</w:t>
+        <w:t>(</w:t>
+      </w:r>
+      <w:proofErr w:type="gramEnd"/>
+      <w:r>
+        <w:t>)</w:t>
       </w:r>
     </w:p>
     <w:p/>
@@ -2093,12 +3361,17 @@
         <w:t>│        Usuario (</w:t>
       </w:r>
       <w:proofErr w:type="spellStart"/>
+      <w:proofErr w:type="gramStart"/>
       <w:r>
         <w:t>Logout</w:t>
       </w:r>
       <w:proofErr w:type="spellEnd"/>
       <w:r>
-        <w:t>)      │</w:t>
+        <w:t xml:space="preserve">)   </w:t>
+      </w:r>
+      <w:proofErr w:type="gramEnd"/>
+      <w:r>
+        <w:t xml:space="preserve">   │</w:t>
       </w:r>
     </w:p>
     <w:p>
@@ -2209,8 +3482,13 @@
       </w:r>
     </w:p>
     <w:p>
-      <w:r>
-        <w:t xml:space="preserve">│  - Obtiene </w:t>
+      <w:proofErr w:type="gramStart"/>
+      <w:r>
+        <w:t>│  -</w:t>
+      </w:r>
+      <w:proofErr w:type="gramEnd"/>
+      <w:r>
+        <w:t xml:space="preserve"> Obtiene </w:t>
       </w:r>
       <w:proofErr w:type="spellStart"/>
       <w:r>
@@ -2222,8 +3500,13 @@
       </w:r>
     </w:p>
     <w:p>
-      <w:r>
-        <w:t xml:space="preserve">│  - </w:t>
+      <w:proofErr w:type="gramStart"/>
+      <w:r>
+        <w:t>│  -</w:t>
+      </w:r>
+      <w:proofErr w:type="gramEnd"/>
+      <w:r>
+        <w:t xml:space="preserve"> </w:t>
       </w:r>
       <w:proofErr w:type="spellStart"/>
       <w:r>
@@ -2286,8 +3569,13 @@
       </w:r>
     </w:p>
     <w:p>
-      <w:r>
-        <w:t>│  (Elimina la sesión del usuario)         │</w:t>
+      <w:proofErr w:type="gramStart"/>
+      <w:r>
+        <w:t>│  (</w:t>
+      </w:r>
+      <w:proofErr w:type="gramEnd"/>
+      <w:r>
+        <w:t>Elimina la sesión del usuario)         │</w:t>
       </w:r>
     </w:p>
     <w:p>
@@ -2338,7 +3626,15 @@
       </w:r>
       <w:proofErr w:type="spellEnd"/>
       <w:r>
-        <w:t>() (Spring)    │</w:t>
+        <w:t>() (</w:t>
+      </w:r>
+      <w:proofErr w:type="gramStart"/>
+      <w:r>
+        <w:t xml:space="preserve">Spring)   </w:t>
+      </w:r>
+      <w:proofErr w:type="gramEnd"/>
+      <w:r>
+        <w:t xml:space="preserve"> │</w:t>
       </w:r>
     </w:p>
     <w:p>
@@ -2392,10 +3688,12 @@
         <w:t xml:space="preserve"> (/</w:t>
       </w:r>
       <w:proofErr w:type="spellStart"/>
+      <w:proofErr w:type="gramStart"/>
       <w:r>
         <w:t>login?logout</w:t>
       </w:r>
       <w:proofErr w:type="spellEnd"/>
+      <w:proofErr w:type="gramEnd"/>
       <w:r>
         <w:t>)       │</w:t>
       </w:r>
@@ -2413,8 +3711,13 @@
     </w:p>
     <w:p>
       <w:r>
-        <w:t>Se implementa la validación de datos en las vis</w:t>
-      </w:r>
+        <w:t xml:space="preserve">Se implementa la validación de datos en </w:t>
+      </w:r>
+      <w:proofErr w:type="gramStart"/>
+      <w:r>
+        <w:t>las vis</w:t>
+      </w:r>
+      <w:proofErr w:type="gramEnd"/>
     </w:p>
     <w:p>
       <w:r>
@@ -2484,6 +3787,7 @@
         <w:t xml:space="preserve"> </w:t>
       </w:r>
       <w:proofErr w:type="spellStart"/>
+      <w:proofErr w:type="gramStart"/>
       <w:r>
         <w:rPr>
           <w:rFonts w:ascii="Consolas" w:hAnsi="Consolas"/>
@@ -2495,6 +3799,7 @@
         <w:t>th:fragment</w:t>
       </w:r>
       <w:proofErr w:type="spellEnd"/>
+      <w:proofErr w:type="gramEnd"/>
       <w:r>
         <w:rPr>
           <w:rFonts w:ascii="Consolas" w:hAnsi="Consolas"/>
@@ -2600,6 +3905,7 @@
         <w:t xml:space="preserve"> </w:t>
       </w:r>
       <w:proofErr w:type="spellStart"/>
+      <w:proofErr w:type="gramStart"/>
       <w:r>
         <w:rPr>
           <w:rFonts w:ascii="Consolas" w:hAnsi="Consolas"/>
@@ -2611,6 +3917,7 @@
         <w:t>th:if</w:t>
       </w:r>
       <w:proofErr w:type="spellEnd"/>
+      <w:proofErr w:type="gramEnd"/>
       <w:r>
         <w:rPr>
           <w:rFonts w:ascii="Consolas" w:hAnsi="Consolas"/>
@@ -3049,6 +4356,7 @@
         </w:rPr>
       </w:pPr>
       <w:proofErr w:type="spellStart"/>
+      <w:proofErr w:type="gramStart"/>
       <w:r>
         <w:rPr>
           <w:rFonts w:ascii="Courier New" w:eastAsia="Times New Roman" w:hAnsi="Courier New" w:cs="Courier New"/>
@@ -3059,6 +4367,7 @@
         <w:t>model.addAttribute</w:t>
       </w:r>
       <w:proofErr w:type="spellEnd"/>
+      <w:proofErr w:type="gramEnd"/>
       <w:r>
         <w:rPr>
           <w:rFonts w:ascii="Courier New" w:eastAsia="Times New Roman" w:hAnsi="Courier New" w:cs="Courier New"/>
@@ -3203,8 +4512,13 @@
         <w:t xml:space="preserve"> mediante anotaciones “</w:t>
       </w:r>
       <w:proofErr w:type="spellStart"/>
-      <w:r>
-        <w:t>jakarta.validation.constraints</w:t>
+      <w:proofErr w:type="gramStart"/>
+      <w:r>
+        <w:t>jakarta.validation</w:t>
+      </w:r>
+      <w:proofErr w:type="gramEnd"/>
+      <w:r>
+        <w:t>.constraints</w:t>
       </w:r>
       <w:proofErr w:type="spellEnd"/>
       <w:r>
@@ -3491,6 +4805,7 @@
         </w:rPr>
         <w:t>@</w:t>
       </w:r>
+      <w:proofErr w:type="gramStart"/>
       <w:r>
         <w:rPr>
           <w:rFonts w:ascii="Consolas" w:hAnsi="Consolas"/>
@@ -3508,7 +4823,17 @@
           <w:sz w:val="18"/>
           <w:szCs w:val="18"/>
         </w:rPr>
-        <w:t xml:space="preserve">(message = </w:t>
+        <w:t>(</w:t>
+      </w:r>
+      <w:proofErr w:type="gramEnd"/>
+      <w:r>
+        <w:rPr>
+          <w:rFonts w:ascii="Consolas" w:hAnsi="Consolas"/>
+          <w:color w:val="000000"/>
+          <w:sz w:val="18"/>
+          <w:szCs w:val="18"/>
+        </w:rPr>
+        <w:t xml:space="preserve">message = </w:t>
       </w:r>
       <w:r>
         <w:rPr>
@@ -3675,6 +5000,7 @@
         </w:rPr>
         <w:t>@</w:t>
       </w:r>
+      <w:proofErr w:type="gramStart"/>
       <w:r>
         <w:rPr>
           <w:rFonts w:ascii="Consolas" w:hAnsi="Consolas"/>
@@ -3702,7 +5028,17 @@
           <w:sz w:val="18"/>
           <w:szCs w:val="18"/>
         </w:rPr>
-        <w:t xml:space="preserve">(message = </w:t>
+        <w:t>(</w:t>
+      </w:r>
+      <w:proofErr w:type="gramEnd"/>
+      <w:r>
+        <w:rPr>
+          <w:rFonts w:ascii="Consolas" w:hAnsi="Consolas"/>
+          <w:color w:val="000000"/>
+          <w:sz w:val="18"/>
+          <w:szCs w:val="18"/>
+        </w:rPr>
+        <w:t xml:space="preserve">message = </w:t>
       </w:r>
       <w:r>
         <w:rPr>
@@ -3957,6 +5293,7 @@
         </w:rPr>
       </w:pPr>
       <w:proofErr w:type="spellStart"/>
+      <w:proofErr w:type="gramStart"/>
       <w:r>
         <w:rPr>
           <w:rFonts w:ascii="Consolas" w:hAnsi="Consolas"/>
@@ -3966,6 +5303,7 @@
         <w:t>Jakarta.validation.valid</w:t>
       </w:r>
       <w:proofErr w:type="spellEnd"/>
+      <w:proofErr w:type="gramEnd"/>
     </w:p>
     <w:p>
       <w:pPr>
@@ -4107,6 +5445,7 @@
         <w:t xml:space="preserve"> </w:t>
       </w:r>
       <w:proofErr w:type="spellStart"/>
+      <w:proofErr w:type="gramStart"/>
       <w:r>
         <w:rPr>
           <w:rFonts w:ascii="Consolas" w:hAnsi="Consolas"/>
@@ -4126,6 +5465,7 @@
         </w:rPr>
         <w:t>(</w:t>
       </w:r>
+      <w:proofErr w:type="gramEnd"/>
       <w:r>
         <w:rPr>
           <w:rFonts w:ascii="Consolas" w:hAnsi="Consolas"/>
@@ -4432,7 +5772,7 @@
           <w:u w:val="single"/>
         </w:rPr>
       </w:pPr>
-      <w:hyperlink r:id="rId16" w:history="1">
+      <w:hyperlink r:id="rId34" w:history="1">
         <w:r>
           <w:rPr>
             <w:rFonts w:ascii="Consolas" w:eastAsia="Times New Roman" w:hAnsi="Consolas" w:cs="Times New Roman"/>
@@ -4449,7 +5789,7 @@
         </w:rPr>
         <w:t>.</w:t>
       </w:r>
-      <w:hyperlink r:id="rId17" w:history="1">
+      <w:hyperlink r:id="rId35" w:history="1">
         <w:r>
           <w:rPr>
             <w:rFonts w:ascii="Consolas" w:eastAsia="Times New Roman" w:hAnsi="Consolas" w:cs="Times New Roman"/>
@@ -4466,7 +5806,7 @@
         </w:rPr>
         <w:t>.</w:t>
       </w:r>
-      <w:hyperlink r:id="rId18" w:history="1">
+      <w:hyperlink r:id="rId36" w:history="1">
         <w:r>
           <w:rPr>
             <w:rFonts w:ascii="Consolas" w:eastAsia="Times New Roman" w:hAnsi="Consolas" w:cs="Times New Roman"/>
@@ -4483,7 +5823,7 @@
         </w:rPr>
         <w:t>.</w:t>
       </w:r>
-      <w:hyperlink r:id="rId19" w:history="1">
+      <w:hyperlink r:id="rId37" w:history="1">
         <w:r>
           <w:rPr>
             <w:rFonts w:ascii="Consolas" w:eastAsia="Times New Roman" w:hAnsi="Consolas" w:cs="Times New Roman"/>
@@ -4500,7 +5840,7 @@
         </w:rPr>
         <w:t>.</w:t>
       </w:r>
-      <w:hyperlink r:id="rId20" w:history="1">
+      <w:hyperlink r:id="rId38" w:history="1">
         <w:r>
           <w:rPr>
             <w:rFonts w:ascii="Consolas" w:eastAsia="Times New Roman" w:hAnsi="Consolas" w:cs="Times New Roman"/>
@@ -4568,6 +5908,7 @@
         </w:rPr>
         <w:t xml:space="preserve"> </w:t>
       </w:r>
+      <w:proofErr w:type="gramStart"/>
       <w:r>
         <w:rPr>
           <w:rFonts w:asciiTheme="minorHAnsi" w:hAnsiTheme="minorHAnsi"/>
@@ -4581,6 +5922,7 @@
         <w:t xml:space="preserve"> “</w:t>
       </w:r>
       <w:proofErr w:type="spellStart"/>
+      <w:proofErr w:type="gramEnd"/>
       <w:r>
         <w:rPr>
           <w:rFonts w:asciiTheme="minorHAnsi" w:hAnsiTheme="minorHAnsi"/>
@@ -4889,8 +6231,20 @@
           <w:szCs w:val="20"/>
           <w:lang w:eastAsia="es-ES"/>
         </w:rPr>
-        <w:t xml:space="preserve"> Default{</w:t>
-      </w:r>
+        <w:t xml:space="preserve"> </w:t>
+      </w:r>
+      <w:proofErr w:type="gramStart"/>
+      <w:r>
+        <w:rPr>
+          <w:rFonts w:ascii="Consolas" w:eastAsia="Times New Roman" w:hAnsi="Consolas" w:cs="Times New Roman"/>
+          <w:color w:val="000000"/>
+          <w:sz w:val="20"/>
+          <w:szCs w:val="20"/>
+          <w:lang w:eastAsia="es-ES"/>
+        </w:rPr>
+        <w:t>Default{</w:t>
+      </w:r>
+      <w:proofErr w:type="gramEnd"/>
     </w:p>
     <w:p>
       <w:pPr>
@@ -5009,16 +6363,36 @@
           <w:sz w:val="18"/>
           <w:szCs w:val="18"/>
         </w:rPr>
-        <w:t>@NotBlank</w:t>
-      </w:r>
-      <w:r>
-        <w:rPr>
-          <w:rFonts w:ascii="Consolas" w:hAnsi="Consolas"/>
-          <w:color w:val="000000"/>
-          <w:sz w:val="18"/>
-          <w:szCs w:val="18"/>
-        </w:rPr>
-        <w:t xml:space="preserve">(message = </w:t>
+        <w:t>@</w:t>
+      </w:r>
+      <w:proofErr w:type="gramStart"/>
+      <w:r>
+        <w:rPr>
+          <w:rFonts w:ascii="Consolas" w:hAnsi="Consolas"/>
+          <w:color w:val="646464"/>
+          <w:sz w:val="18"/>
+          <w:szCs w:val="18"/>
+        </w:rPr>
+        <w:t>NotBlank</w:t>
+      </w:r>
+      <w:r>
+        <w:rPr>
+          <w:rFonts w:ascii="Consolas" w:hAnsi="Consolas"/>
+          <w:color w:val="000000"/>
+          <w:sz w:val="18"/>
+          <w:szCs w:val="18"/>
+        </w:rPr>
+        <w:t>(</w:t>
+      </w:r>
+      <w:proofErr w:type="gramEnd"/>
+      <w:r>
+        <w:rPr>
+          <w:rFonts w:ascii="Consolas" w:hAnsi="Consolas"/>
+          <w:color w:val="000000"/>
+          <w:sz w:val="18"/>
+          <w:szCs w:val="18"/>
+        </w:rPr>
+        <w:t xml:space="preserve">message = </w:t>
       </w:r>
       <w:r>
         <w:rPr>
@@ -5144,17 +6518,39 @@
           <w:szCs w:val="18"/>
           <w:lang w:eastAsia="es-ES"/>
         </w:rPr>
-        <w:t>@Size</w:t>
-      </w:r>
+        <w:t>@</w:t>
+      </w:r>
+      <w:proofErr w:type="gramStart"/>
       <w:r>
         <w:rPr>
           <w:rFonts w:ascii="Consolas" w:eastAsia="Times New Roman" w:hAnsi="Consolas" w:cs="Times New Roman"/>
-          <w:color w:val="000000"/>
+          <w:color w:val="646464"/>
           <w:sz w:val="18"/>
           <w:szCs w:val="18"/>
           <w:lang w:eastAsia="es-ES"/>
         </w:rPr>
-        <w:t xml:space="preserve">(min = 6, </w:t>
+        <w:t>Size</w:t>
+      </w:r>
+      <w:r>
+        <w:rPr>
+          <w:rFonts w:ascii="Consolas" w:eastAsia="Times New Roman" w:hAnsi="Consolas" w:cs="Times New Roman"/>
+          <w:color w:val="000000"/>
+          <w:sz w:val="18"/>
+          <w:szCs w:val="18"/>
+          <w:lang w:eastAsia="es-ES"/>
+        </w:rPr>
+        <w:t>(</w:t>
+      </w:r>
+      <w:proofErr w:type="gramEnd"/>
+      <w:r>
+        <w:rPr>
+          <w:rFonts w:ascii="Consolas" w:eastAsia="Times New Roman" w:hAnsi="Consolas" w:cs="Times New Roman"/>
+          <w:color w:val="000000"/>
+          <w:sz w:val="18"/>
+          <w:szCs w:val="18"/>
+          <w:lang w:eastAsia="es-ES"/>
+        </w:rPr>
+        <w:t xml:space="preserve">min = 6, </w:t>
       </w:r>
       <w:proofErr w:type="spellStart"/>
       <w:r>
@@ -5708,6 +7104,7 @@
         <w:t xml:space="preserve"> = (</w:t>
       </w:r>
       <w:proofErr w:type="spellStart"/>
+      <w:proofErr w:type="gramStart"/>
       <w:r>
         <w:rPr>
           <w:rFonts w:ascii="Consolas" w:eastAsia="Times New Roman" w:hAnsi="Consolas" w:cs="Times New Roman"/>
@@ -5725,6 +7122,7 @@
         <w:t>.getId</w:t>
       </w:r>
       <w:proofErr w:type="spellEnd"/>
+      <w:proofErr w:type="gramEnd"/>
       <w:r>
         <w:rPr>
           <w:rFonts w:ascii="Consolas" w:eastAsia="Times New Roman" w:hAnsi="Consolas" w:cs="Times New Roman"/>
@@ -5754,6 +7152,7 @@
         <w:t xml:space="preserve">) ? </w:t>
       </w:r>
       <w:proofErr w:type="spellStart"/>
+      <w:proofErr w:type="gramStart"/>
       <w:r>
         <w:rPr>
           <w:rFonts w:ascii="Consolas" w:eastAsia="Times New Roman" w:hAnsi="Consolas" w:cs="Times New Roman"/>
@@ -5779,7 +7178,16 @@
           <w:color w:val="000000"/>
           <w:lang w:eastAsia="es-ES"/>
         </w:rPr>
-        <w:t xml:space="preserve"> : </w:t>
+        <w:t xml:space="preserve"> :</w:t>
+      </w:r>
+      <w:proofErr w:type="gramEnd"/>
+      <w:r>
+        <w:rPr>
+          <w:rFonts w:ascii="Consolas" w:eastAsia="Times New Roman" w:hAnsi="Consolas" w:cs="Times New Roman"/>
+          <w:color w:val="000000"/>
+          <w:lang w:eastAsia="es-ES"/>
+        </w:rPr>
+        <w:t xml:space="preserve"> </w:t>
       </w:r>
       <w:proofErr w:type="spellStart"/>
       <w:r>
@@ -5991,18 +7399,28 @@
           <w:lang w:eastAsia="es-ES"/>
         </w:rPr>
         <w:tab/>
-        <w:t xml:space="preserve">            .</w:t>
-      </w:r>
-      <w:proofErr w:type="spellStart"/>
+        <w:t xml:space="preserve">            </w:t>
+      </w:r>
+      <w:proofErr w:type="gramStart"/>
       <w:r>
         <w:rPr>
           <w:rFonts w:ascii="Consolas" w:eastAsia="Times New Roman" w:hAnsi="Consolas" w:cs="Times New Roman"/>
           <w:color w:val="000000"/>
           <w:lang w:eastAsia="es-ES"/>
         </w:rPr>
+        <w:t>.</w:t>
+      </w:r>
+      <w:proofErr w:type="spellStart"/>
+      <w:r>
+        <w:rPr>
+          <w:rFonts w:ascii="Consolas" w:eastAsia="Times New Roman" w:hAnsi="Consolas" w:cs="Times New Roman"/>
+          <w:color w:val="000000"/>
+          <w:lang w:eastAsia="es-ES"/>
+        </w:rPr>
         <w:t>validate</w:t>
       </w:r>
       <w:proofErr w:type="spellEnd"/>
+      <w:proofErr w:type="gramEnd"/>
       <w:r>
         <w:rPr>
           <w:rFonts w:ascii="Consolas" w:eastAsia="Times New Roman" w:hAnsi="Consolas" w:cs="Times New Roman"/>
@@ -6130,7 +7548,15 @@
       </w:r>
       <w:proofErr w:type="spellEnd"/>
       <w:r>
-        <w:t>” y el validador obviará los asignado a otros grupos.</w:t>
+        <w:t xml:space="preserve">” y el validador obviará </w:t>
+      </w:r>
+      <w:proofErr w:type="gramStart"/>
+      <w:r>
+        <w:t>los asignado</w:t>
+      </w:r>
+      <w:proofErr w:type="gramEnd"/>
+      <w:r>
+        <w:t xml:space="preserve"> a otros grupos.</w:t>
       </w:r>
     </w:p>
     <w:p>
@@ -6183,13 +7609,21 @@
         <w:t xml:space="preserve">se generan los mensajes </w:t>
       </w:r>
       <w:r>
-        <w:t xml:space="preserve">asociados a cada validación y </w:t>
+        <w:t xml:space="preserve">asociados a cada validación </w:t>
+      </w:r>
+      <w:proofErr w:type="gramStart"/>
+      <w:r>
+        <w:t xml:space="preserve">y </w:t>
       </w:r>
       <w:r>
         <w:t xml:space="preserve"> </w:t>
       </w:r>
       <w:r>
-        <w:t xml:space="preserve">devolviéndose </w:t>
+        <w:t>devolviéndose</w:t>
+      </w:r>
+      <w:proofErr w:type="gramEnd"/>
+      <w:r>
+        <w:t xml:space="preserve"> </w:t>
       </w:r>
       <w:r>
         <w:t>a la vista</w:t>
@@ -6349,6 +7783,7 @@
         <w:t xml:space="preserve"> </w:t>
       </w:r>
       <w:proofErr w:type="spellStart"/>
+      <w:proofErr w:type="gramStart"/>
       <w:r>
         <w:rPr>
           <w:rFonts w:ascii="Consolas" w:hAnsi="Consolas"/>
@@ -6360,6 +7795,7 @@
         <w:t>th:errors</w:t>
       </w:r>
       <w:proofErr w:type="spellEnd"/>
+      <w:proofErr w:type="gramEnd"/>
       <w:r>
         <w:rPr>
           <w:rFonts w:ascii="Consolas" w:hAnsi="Consolas"/>
@@ -6606,6 +8042,7 @@
         <w:t xml:space="preserve"> </w:t>
       </w:r>
       <w:proofErr w:type="spellStart"/>
+      <w:proofErr w:type="gramStart"/>
       <w:r>
         <w:rPr>
           <w:rFonts w:ascii="Consolas" w:hAnsi="Consolas"/>
@@ -6625,6 +8062,7 @@
         </w:rPr>
         <w:t>(</w:t>
       </w:r>
+      <w:proofErr w:type="gramEnd"/>
       <w:r>
         <w:rPr>
           <w:rFonts w:ascii="Consolas" w:hAnsi="Consolas"/>
@@ -6963,6 +8401,7 @@
         <w:t xml:space="preserve"> (</w:t>
       </w:r>
       <w:proofErr w:type="spellStart"/>
+      <w:proofErr w:type="gramStart"/>
       <w:r>
         <w:rPr>
           <w:rFonts w:ascii="Consolas" w:hAnsi="Consolas"/>
@@ -6982,6 +8421,7 @@
         <w:t>.hasErrors</w:t>
       </w:r>
       <w:proofErr w:type="spellEnd"/>
+      <w:proofErr w:type="gramEnd"/>
       <w:r>
         <w:rPr>
           <w:rFonts w:ascii="Consolas" w:hAnsi="Consolas"/>
@@ -7260,6 +8700,7 @@
         <w:t xml:space="preserve"> </w:t>
       </w:r>
       <w:proofErr w:type="spellStart"/>
+      <w:proofErr w:type="gramStart"/>
       <w:r>
         <w:rPr>
           <w:rFonts w:ascii="Consolas" w:hAnsi="Consolas"/>
@@ -7277,7 +8718,17 @@
           <w:sz w:val="18"/>
           <w:szCs w:val="18"/>
         </w:rPr>
-        <w:t xml:space="preserve">(Long </w:t>
+        <w:t>(</w:t>
+      </w:r>
+      <w:proofErr w:type="gramEnd"/>
+      <w:r>
+        <w:rPr>
+          <w:rFonts w:ascii="Consolas" w:hAnsi="Consolas"/>
+          <w:color w:val="000000"/>
+          <w:sz w:val="18"/>
+          <w:szCs w:val="18"/>
+        </w:rPr>
+        <w:t xml:space="preserve">Long </w:t>
       </w:r>
       <w:r>
         <w:rPr>
@@ -7422,6 +8873,7 @@
         <w:t xml:space="preserve"> = </w:t>
       </w:r>
       <w:proofErr w:type="spellStart"/>
+      <w:proofErr w:type="gramStart"/>
       <w:r>
         <w:rPr>
           <w:rFonts w:ascii="Consolas" w:hAnsi="Consolas"/>
@@ -7442,6 +8894,7 @@
         <w:t>.findById</w:t>
       </w:r>
       <w:proofErr w:type="spellEnd"/>
+      <w:proofErr w:type="gramEnd"/>
       <w:r>
         <w:rPr>
           <w:rFonts w:ascii="Consolas" w:hAnsi="Consolas"/>
@@ -7491,7 +8944,17 @@
           <w:sz w:val="18"/>
           <w:szCs w:val="18"/>
         </w:rPr>
-        <w:t xml:space="preserve">                .</w:t>
+        <w:t xml:space="preserve">                </w:t>
+      </w:r>
+      <w:proofErr w:type="gramStart"/>
+      <w:r>
+        <w:rPr>
+          <w:rFonts w:ascii="Consolas" w:hAnsi="Consolas"/>
+          <w:color w:val="000000"/>
+          <w:sz w:val="18"/>
+          <w:szCs w:val="18"/>
+        </w:rPr>
+        <w:t>.</w:t>
       </w:r>
       <w:proofErr w:type="spellStart"/>
       <w:r>
@@ -7504,6 +8967,7 @@
         <w:t>orElseThrow</w:t>
       </w:r>
       <w:proofErr w:type="spellEnd"/>
+      <w:proofErr w:type="gramEnd"/>
       <w:r>
         <w:rPr>
           <w:rFonts w:ascii="Consolas" w:hAnsi="Consolas"/>
@@ -7713,6 +9177,7 @@
         <w:t xml:space="preserve"> </w:t>
       </w:r>
       <w:proofErr w:type="spellStart"/>
+      <w:proofErr w:type="gramStart"/>
       <w:r>
         <w:rPr>
           <w:rFonts w:ascii="Consolas" w:hAnsi="Consolas"/>
@@ -7733,6 +9198,7 @@
         </w:rPr>
         <w:t>(</w:t>
       </w:r>
+      <w:proofErr w:type="gramEnd"/>
       <w:r>
         <w:rPr>
           <w:rFonts w:ascii="Consolas" w:hAnsi="Consolas"/>
@@ -7861,7 +9327,15 @@
       </w:r>
       <w:proofErr w:type="spellEnd"/>
       <w:r>
-        <w:t>, y sobre todo, la famosa página</w:t>
+        <w:t xml:space="preserve">, </w:t>
+      </w:r>
+      <w:proofErr w:type="gramStart"/>
+      <w:r>
+        <w:t>y</w:t>
+      </w:r>
+      <w:proofErr w:type="gramEnd"/>
+      <w:r>
+        <w:t xml:space="preserve"> sobre todo, la famosa página</w:t>
       </w:r>
       <w:r>
         <w:rPr>
@@ -7969,7 +9443,7 @@
                     <pic:cNvPicPr/>
                   </pic:nvPicPr>
                   <pic:blipFill>
-                    <a:blip r:embed="rId21"/>
+                    <a:blip r:embed="rId39"/>
                     <a:stretch>
                       <a:fillRect/>
                     </a:stretch>
@@ -8077,7 +9551,7 @@
                     <pic:cNvPicPr/>
                   </pic:nvPicPr>
                   <pic:blipFill>
-                    <a:blip r:embed="rId22"/>
+                    <a:blip r:embed="rId40"/>
                     <a:stretch>
                       <a:fillRect/>
                     </a:stretch>
@@ -8455,6 +9929,7 @@
         </w:rPr>
       </w:pPr>
       <w:proofErr w:type="spellStart"/>
+      <w:proofErr w:type="gramStart"/>
       <w:r>
         <w:rPr>
           <w:rFonts w:ascii="Consolas" w:hAnsi="Consolas"/>
@@ -8474,6 +9949,7 @@
         <w:t>.rejectValue</w:t>
       </w:r>
       <w:proofErr w:type="spellEnd"/>
+      <w:proofErr w:type="gramEnd"/>
       <w:r>
         <w:rPr>
           <w:rFonts w:ascii="Consolas" w:hAnsi="Consolas"/>
@@ -8761,6 +10237,7 @@
         <w:tab/>
       </w:r>
       <w:proofErr w:type="spellStart"/>
+      <w:proofErr w:type="gramStart"/>
       <w:r>
         <w:rPr>
           <w:rFonts w:ascii="Consolas" w:hAnsi="Consolas"/>
@@ -8780,6 +10257,7 @@
         <w:t>.rejectValue</w:t>
       </w:r>
       <w:proofErr w:type="spellEnd"/>
+      <w:proofErr w:type="gramEnd"/>
       <w:r>
         <w:rPr>
           <w:rFonts w:ascii="Consolas" w:hAnsi="Consolas"/>
@@ -8933,6 +10411,7 @@
         <w:t>De esta forma al validar “</w:t>
       </w:r>
       <w:proofErr w:type="spellStart"/>
+      <w:proofErr w:type="gramStart"/>
       <w:r>
         <w:rPr>
           <w:rFonts w:ascii="Consolas" w:hAnsi="Consolas"/>
@@ -8952,6 +10431,7 @@
         <w:t>.hasErrors</w:t>
       </w:r>
       <w:proofErr w:type="spellEnd"/>
+      <w:proofErr w:type="gramEnd"/>
       <w:r>
         <w:rPr>
           <w:rFonts w:ascii="Consolas" w:hAnsi="Consolas"/>
@@ -9080,13 +10560,21 @@
         <w:t xml:space="preserve"> asociados a entidades </w:t>
       </w:r>
       <w:r>
-        <w:t xml:space="preserve">tales como </w:t>
+        <w:t xml:space="preserve">tales </w:t>
+      </w:r>
+      <w:proofErr w:type="gramStart"/>
+      <w:r>
+        <w:t xml:space="preserve">como </w:t>
       </w:r>
       <w:r>
         <w:t xml:space="preserve"> </w:t>
       </w:r>
       <w:r>
-        <w:t xml:space="preserve">Curso o de </w:t>
+        <w:t>Curso</w:t>
+      </w:r>
+      <w:proofErr w:type="gramEnd"/>
+      <w:r>
+        <w:t xml:space="preserve"> o de </w:t>
       </w:r>
       <w:proofErr w:type="spellStart"/>
       <w:r>
@@ -9218,10 +10706,12 @@
         <w:t xml:space="preserve">de configuración </w:t>
       </w:r>
       <w:proofErr w:type="spellStart"/>
+      <w:proofErr w:type="gramStart"/>
       <w:r>
         <w:t>application.properties</w:t>
       </w:r>
       <w:proofErr w:type="spellEnd"/>
+      <w:proofErr w:type="gramEnd"/>
       <w:r>
         <w:t>.</w:t>
       </w:r>
@@ -9255,27 +10745,45 @@
           <w:bCs/>
         </w:rPr>
       </w:pPr>
-      <w:r>
-        <w:rPr>
-          <w:b/>
-          <w:bCs/>
-        </w:rPr>
-        <w:t>  Cambiar rutas sin tocar código</w:t>
-      </w:r>
-    </w:p>
-    <w:p>
-      <w:pPr>
-        <w:rPr>
-          <w:b/>
-          <w:bCs/>
-        </w:rPr>
-      </w:pPr>
-      <w:r>
-        <w:rPr>
-          <w:b/>
-          <w:bCs/>
-        </w:rPr>
-        <w:t>  Configurar rutas distintas por entorno (</w:t>
+      <w:proofErr w:type="gramStart"/>
+      <w:r>
+        <w:rPr>
+          <w:b/>
+          <w:bCs/>
+        </w:rPr>
+        <w:t>  Cambiar</w:t>
+      </w:r>
+      <w:proofErr w:type="gramEnd"/>
+      <w:r>
+        <w:rPr>
+          <w:b/>
+          <w:bCs/>
+        </w:rPr>
+        <w:t xml:space="preserve"> rutas sin tocar código</w:t>
+      </w:r>
+    </w:p>
+    <w:p>
+      <w:pPr>
+        <w:rPr>
+          <w:b/>
+          <w:bCs/>
+        </w:rPr>
+      </w:pPr>
+      <w:proofErr w:type="gramStart"/>
+      <w:r>
+        <w:rPr>
+          <w:b/>
+          <w:bCs/>
+        </w:rPr>
+        <w:t>  Configurar</w:t>
+      </w:r>
+      <w:proofErr w:type="gramEnd"/>
+      <w:r>
+        <w:rPr>
+          <w:b/>
+          <w:bCs/>
+        </w:rPr>
+        <w:t xml:space="preserve"> rutas distintas por entorno (</w:t>
       </w:r>
       <w:proofErr w:type="spellStart"/>
       <w:r>
@@ -9317,12 +10825,21 @@
           <w:bCs/>
         </w:rPr>
       </w:pPr>
-      <w:r>
-        <w:rPr>
-          <w:b/>
-          <w:bCs/>
-        </w:rPr>
-        <w:t>  Mantener el código limpio y portable</w:t>
+      <w:proofErr w:type="gramStart"/>
+      <w:r>
+        <w:rPr>
+          <w:b/>
+          <w:bCs/>
+        </w:rPr>
+        <w:t>  Mantener</w:t>
+      </w:r>
+      <w:proofErr w:type="gramEnd"/>
+      <w:r>
+        <w:rPr>
+          <w:b/>
+          <w:bCs/>
+        </w:rPr>
+        <w:t xml:space="preserve"> el código limpio y portable</w:t>
       </w:r>
     </w:p>
     <w:p>
@@ -9639,6 +11156,7 @@
         <w:t xml:space="preserve"> </w:t>
       </w:r>
       <w:proofErr w:type="spellStart"/>
+      <w:proofErr w:type="gramStart"/>
       <w:r>
         <w:rPr>
           <w:b/>
@@ -9652,7 +11170,15 @@
           <w:b/>
           <w:bCs/>
         </w:rPr>
-        <w:t>() {</w:t>
+        <w:t>(</w:t>
+      </w:r>
+      <w:proofErr w:type="gramEnd"/>
+      <w:r>
+        <w:rPr>
+          <w:b/>
+          <w:bCs/>
+        </w:rPr>
+        <w:t>) {</w:t>
       </w:r>
     </w:p>
     <w:p>
@@ -9729,6 +11255,7 @@
         </w:rPr>
       </w:pPr>
       <w:proofErr w:type="spellStart"/>
+      <w:proofErr w:type="gramStart"/>
       <w:r>
         <w:rPr>
           <w:b/>
@@ -9742,7 +11269,15 @@
           <w:b/>
           <w:bCs/>
         </w:rPr>
-        <w:t xml:space="preserve">(): Captura la URL completa, incluyendo el </w:t>
+        <w:t>(</w:t>
+      </w:r>
+      <w:proofErr w:type="gramEnd"/>
+      <w:r>
+        <w:rPr>
+          <w:b/>
+          <w:bCs/>
+        </w:rPr>
+        <w:t xml:space="preserve">): Captura la URL completa, incluyendo el </w:t>
       </w:r>
       <w:proofErr w:type="spellStart"/>
       <w:r>
@@ -9878,6 +11413,7 @@
         </w:rPr>
       </w:pPr>
       <w:proofErr w:type="spellStart"/>
+      <w:proofErr w:type="gramStart"/>
       <w:r>
         <w:rPr>
           <w:b/>
@@ -9886,6 +11422,7 @@
         <w:t>th:href</w:t>
       </w:r>
       <w:proofErr w:type="spellEnd"/>
+      <w:proofErr w:type="gramEnd"/>
       <w:r>
         <w:rPr>
           <w:b/>
@@ -9954,6 +11491,7 @@
         </w:rPr>
       </w:pPr>
       <w:proofErr w:type="spellStart"/>
+      <w:proofErr w:type="gramStart"/>
       <w:r>
         <w:rPr>
           <w:b/>
@@ -9970,6 +11508,7 @@
         <w:t>(</w:t>
       </w:r>
       <w:proofErr w:type="spellStart"/>
+      <w:proofErr w:type="gramEnd"/>
       <w:r>
         <w:rPr>
           <w:b/>
@@ -10030,6 +11569,7 @@
         </w:rPr>
       </w:pPr>
       <w:proofErr w:type="spellStart"/>
+      <w:proofErr w:type="gramStart"/>
       <w:r>
         <w:rPr>
           <w:b/>
@@ -10043,7 +11583,15 @@
           <w:b/>
           <w:bCs/>
         </w:rPr>
-        <w:t xml:space="preserve">(): Convierte el objeto de nuevo en una cadena de texto válida para el atributo </w:t>
+        <w:t>(</w:t>
+      </w:r>
+      <w:proofErr w:type="gramEnd"/>
+      <w:r>
+        <w:rPr>
+          <w:b/>
+          <w:bCs/>
+        </w:rPr>
+        <w:t xml:space="preserve">): Convierte el objeto de nuevo en una cadena de texto válida para el atributo </w:t>
       </w:r>
       <w:proofErr w:type="spellStart"/>
       <w:r>
@@ -10168,6 +11716,7 @@
         <w:t>$$\</w:t>
       </w:r>
       <w:proofErr w:type="spellStart"/>
+      <w:proofErr w:type="gramStart"/>
       <w:r>
         <w:rPr>
           <w:b/>
@@ -10181,7 +11730,15 @@
           <w:b/>
           <w:bCs/>
         </w:rPr>
-        <w:t>{Progreso} = \frac{\sum (\</w:t>
+        <w:t>{</w:t>
+      </w:r>
+      <w:proofErr w:type="gramEnd"/>
+      <w:r>
+        <w:rPr>
+          <w:b/>
+          <w:bCs/>
+        </w:rPr>
+        <w:t>Progreso} = \frac{\sum (\</w:t>
       </w:r>
       <w:proofErr w:type="spellStart"/>
       <w:r>
@@ -10372,6 +11929,7 @@
         <w:t xml:space="preserve"> </w:t>
       </w:r>
       <w:proofErr w:type="spellStart"/>
+      <w:proofErr w:type="gramStart"/>
       <w:r>
         <w:rPr>
           <w:b/>
@@ -10380,6 +11938,7 @@
         <w:t>th:if</w:t>
       </w:r>
       <w:proofErr w:type="spellEnd"/>
+      <w:proofErr w:type="gramEnd"/>
       <w:r>
         <w:rPr>
           <w:b/>
@@ -10695,6 +12254,7 @@
         <w:t xml:space="preserve"> </w:t>
       </w:r>
       <w:proofErr w:type="spellStart"/>
+      <w:proofErr w:type="gramStart"/>
       <w:r>
         <w:rPr>
           <w:b/>
@@ -10703,6 +12263,7 @@
         <w:t>th:if</w:t>
       </w:r>
       <w:proofErr w:type="spellEnd"/>
+      <w:proofErr w:type="gramEnd"/>
       <w:r>
         <w:rPr>
           <w:b/>
@@ -10742,6 +12303,7 @@
         <w:t xml:space="preserve">        &lt;a </w:t>
       </w:r>
       <w:proofErr w:type="spellStart"/>
+      <w:proofErr w:type="gramStart"/>
       <w:r>
         <w:rPr>
           <w:b/>
@@ -10750,6 +12312,7 @@
         <w:t>th:href</w:t>
       </w:r>
       <w:proofErr w:type="spellEnd"/>
+      <w:proofErr w:type="gramEnd"/>
       <w:r>
         <w:rPr>
           <w:b/>
@@ -10930,6 +12493,7 @@
         <w:t xml:space="preserve">        &lt;p </w:t>
       </w:r>
       <w:proofErr w:type="spellStart"/>
+      <w:proofErr w:type="gramStart"/>
       <w:r>
         <w:rPr>
           <w:b/>
@@ -10938,6 +12502,7 @@
         <w:t>th:if</w:t>
       </w:r>
       <w:proofErr w:type="spellEnd"/>
+      <w:proofErr w:type="gramEnd"/>
       <w:r>
         <w:rPr>
           <w:b/>
@@ -11424,6 +12989,7 @@
         <w:t xml:space="preserve">         </w:t>
       </w:r>
       <w:proofErr w:type="spellStart"/>
+      <w:proofErr w:type="gramStart"/>
       <w:r>
         <w:rPr>
           <w:b/>
@@ -11432,6 +12998,7 @@
         <w:t>th:style</w:t>
       </w:r>
       <w:proofErr w:type="spellEnd"/>
+      <w:proofErr w:type="gramEnd"/>
       <w:r>
         <w:rPr>
           <w:b/>
@@ -11534,6 +13101,7 @@
         <w:t xml:space="preserve"> </w:t>
       </w:r>
       <w:proofErr w:type="spellStart"/>
+      <w:proofErr w:type="gramStart"/>
       <w:r>
         <w:rPr>
           <w:b/>
@@ -11542,6 +13110,7 @@
         <w:t>th:if</w:t>
       </w:r>
       <w:proofErr w:type="spellEnd"/>
+      <w:proofErr w:type="gramEnd"/>
       <w:r>
         <w:rPr>
           <w:b/>
@@ -11644,6 +13213,7 @@
         <w:t xml:space="preserve">         </w:t>
       </w:r>
       <w:proofErr w:type="spellStart"/>
+      <w:proofErr w:type="gramStart"/>
       <w:r>
         <w:rPr>
           <w:b/>
@@ -11652,6 +13222,7 @@
         <w:t>th:style</w:t>
       </w:r>
       <w:proofErr w:type="spellEnd"/>
+      <w:proofErr w:type="gramEnd"/>
       <w:r>
         <w:rPr>
           <w:b/>
@@ -11770,7 +13341,23 @@
           <w:b/>
           <w:bCs/>
         </w:rPr>
-        <w:t>Estado "Esperando Nota": Si el alumno ya terminó su parte pero el profesor no ha puntuado, es vital decírselo. Si no, verá que el progreso no sube y pensará que el sistema falla.</w:t>
+        <w:t xml:space="preserve">Estado "Esperando Nota": Si el alumno ya terminó su </w:t>
+      </w:r>
+      <w:proofErr w:type="gramStart"/>
+      <w:r>
+        <w:rPr>
+          <w:b/>
+          <w:bCs/>
+        </w:rPr>
+        <w:t>parte</w:t>
+      </w:r>
+      <w:proofErr w:type="gramEnd"/>
+      <w:r>
+        <w:rPr>
+          <w:b/>
+          <w:bCs/>
+        </w:rPr>
+        <w:t xml:space="preserve"> pero el profesor no ha puntuado, es vital decírselo. Si no, verá que el progreso no sube y pensará que el sistema falla.</w:t>
       </w:r>
     </w:p>
     <w:p>
@@ -11915,7 +13502,1617 @@
         </w:rPr>
       </w:pPr>
     </w:p>
+    <w:p>
+      <w:pPr>
+        <w:pStyle w:val="Ttulo1"/>
+      </w:pPr>
+      <w:r>
+        <w:t>ENTORNO DE PRUEBAS</w:t>
+      </w:r>
+    </w:p>
+    <w:p>
+      <w:pPr>
+        <w:rPr>
+          <w:b/>
+          <w:bCs/>
+        </w:rPr>
+      </w:pPr>
+    </w:p>
+    <w:p>
+      <w:pPr>
+        <w:rPr>
+          <w:b/>
+          <w:bCs/>
+        </w:rPr>
+      </w:pPr>
+      <w:r>
+        <w:rPr>
+          <w:b/>
+          <w:bCs/>
+        </w:rPr>
+        <w:tab/>
+      </w:r>
+      <w:r>
+        <w:t>La aplicación se entrega “autogestionada”, no requiere de ningún recurso externo.</w:t>
+      </w:r>
+    </w:p>
+    <w:p>
+      <w:pPr>
+        <w:pStyle w:val="Ttulo2"/>
+      </w:pPr>
+      <w:r>
+        <w:t>Usuarios</w:t>
+      </w:r>
+    </w:p>
+    <w:p>
+      <w:pPr>
+        <w:rPr>
+          <w:b/>
+          <w:bCs/>
+        </w:rPr>
+      </w:pPr>
+      <w:r>
+        <w:rPr>
+          <w:b/>
+          <w:bCs/>
+        </w:rPr>
+        <w:tab/>
+      </w:r>
+      <w:r>
+        <w:t>Para las pruebas se han generado unos usuarios “iniciales” con los que poder realizar todas las pruebas funcionales.</w:t>
+      </w:r>
+    </w:p>
+    <w:tbl>
+      <w:tblPr>
+        <w:tblW w:w="9534" w:type="dxa"/>
+        <w:tblInd w:w="-572" w:type="dxa"/>
+        <w:tblCellMar>
+          <w:left w:w="70" w:type="dxa"/>
+          <w:right w:w="70" w:type="dxa"/>
+        </w:tblCellMar>
+        <w:tblLook w:val="04A0" w:firstRow="1" w:lastRow="0" w:firstColumn="1" w:lastColumn="0" w:noHBand="0" w:noVBand="1"/>
+      </w:tblPr>
+      <w:tblGrid>
+        <w:gridCol w:w="4297"/>
+        <w:gridCol w:w="4297"/>
+        <w:gridCol w:w="940"/>
+      </w:tblGrid>
+      <w:tr>
+        <w:trPr>
+          <w:trHeight w:val="300"/>
+        </w:trPr>
+        <w:tc>
+          <w:tcPr>
+            <w:tcW w:w="4297" w:type="dxa"/>
+            <w:tcBorders>
+              <w:top w:val="single" w:sz="4" w:space="0" w:color="A5A5A5"/>
+              <w:left w:val="single" w:sz="4" w:space="0" w:color="A5A5A5"/>
+              <w:bottom w:val="nil"/>
+              <w:right w:val="nil"/>
+            </w:tcBorders>
+            <w:shd w:val="clear" w:color="A5A5A5" w:fill="A5A5A5"/>
+            <w:noWrap/>
+            <w:vAlign w:val="bottom"/>
+            <w:hideMark/>
+          </w:tcPr>
+          <w:p>
+            <w:pPr>
+              <w:spacing w:after="0" w:line="240" w:lineRule="auto"/>
+              <w:rPr>
+                <w:rFonts w:ascii="Calibri" w:eastAsia="Times New Roman" w:hAnsi="Calibri" w:cs="Calibri"/>
+                <w:b/>
+                <w:bCs/>
+                <w:color w:val="FFFFFF"/>
+                <w:lang w:eastAsia="es-ES"/>
+              </w:rPr>
+            </w:pPr>
+            <w:r>
+              <w:rPr>
+                <w:rFonts w:ascii="Calibri" w:eastAsia="Times New Roman" w:hAnsi="Calibri" w:cs="Calibri"/>
+                <w:b/>
+                <w:bCs/>
+                <w:color w:val="FFFFFF"/>
+                <w:lang w:eastAsia="es-ES"/>
+              </w:rPr>
+              <w:t>E-MAIL</w:t>
+            </w:r>
+          </w:p>
+        </w:tc>
+        <w:tc>
+          <w:tcPr>
+            <w:tcW w:w="4297" w:type="dxa"/>
+            <w:tcBorders>
+              <w:top w:val="single" w:sz="4" w:space="0" w:color="A5A5A5"/>
+              <w:left w:val="nil"/>
+              <w:bottom w:val="nil"/>
+              <w:right w:val="nil"/>
+            </w:tcBorders>
+            <w:shd w:val="clear" w:color="A5A5A5" w:fill="A5A5A5"/>
+            <w:noWrap/>
+            <w:vAlign w:val="bottom"/>
+            <w:hideMark/>
+          </w:tcPr>
+          <w:p>
+            <w:pPr>
+              <w:spacing w:after="0" w:line="240" w:lineRule="auto"/>
+              <w:rPr>
+                <w:rFonts w:ascii="Calibri" w:eastAsia="Times New Roman" w:hAnsi="Calibri" w:cs="Calibri"/>
+                <w:b/>
+                <w:bCs/>
+                <w:color w:val="FFFFFF"/>
+                <w:lang w:eastAsia="es-ES"/>
+              </w:rPr>
+            </w:pPr>
+            <w:r>
+              <w:rPr>
+                <w:rFonts w:ascii="Calibri" w:eastAsia="Times New Roman" w:hAnsi="Calibri" w:cs="Calibri"/>
+                <w:b/>
+                <w:bCs/>
+                <w:color w:val="FFFFFF"/>
+                <w:lang w:eastAsia="es-ES"/>
+              </w:rPr>
+              <w:t>PASSWORD</w:t>
+            </w:r>
+          </w:p>
+        </w:tc>
+        <w:tc>
+          <w:tcPr>
+            <w:tcW w:w="940" w:type="dxa"/>
+            <w:tcBorders>
+              <w:top w:val="single" w:sz="4" w:space="0" w:color="A5A5A5"/>
+              <w:left w:val="nil"/>
+              <w:bottom w:val="nil"/>
+              <w:right w:val="nil"/>
+            </w:tcBorders>
+            <w:shd w:val="clear" w:color="A5A5A5" w:fill="A5A5A5"/>
+            <w:noWrap/>
+            <w:vAlign w:val="bottom"/>
+            <w:hideMark/>
+          </w:tcPr>
+          <w:p>
+            <w:pPr>
+              <w:spacing w:after="0" w:line="240" w:lineRule="auto"/>
+              <w:rPr>
+                <w:rFonts w:ascii="Calibri" w:eastAsia="Times New Roman" w:hAnsi="Calibri" w:cs="Calibri"/>
+                <w:b/>
+                <w:bCs/>
+                <w:color w:val="FFFFFF"/>
+                <w:lang w:eastAsia="es-ES"/>
+              </w:rPr>
+            </w:pPr>
+            <w:r>
+              <w:rPr>
+                <w:rFonts w:ascii="Calibri" w:eastAsia="Times New Roman" w:hAnsi="Calibri" w:cs="Calibri"/>
+                <w:b/>
+                <w:bCs/>
+                <w:color w:val="FFFFFF"/>
+                <w:lang w:eastAsia="es-ES"/>
+              </w:rPr>
+              <w:t>ROL</w:t>
+            </w:r>
+          </w:p>
+        </w:tc>
+      </w:tr>
+      <w:tr>
+        <w:trPr>
+          <w:trHeight w:val="300"/>
+        </w:trPr>
+        <w:tc>
+          <w:tcPr>
+            <w:tcW w:w="4297" w:type="dxa"/>
+            <w:tcBorders>
+              <w:top w:val="single" w:sz="4" w:space="0" w:color="A5A5A5"/>
+              <w:left w:val="single" w:sz="4" w:space="0" w:color="A5A5A5"/>
+              <w:bottom w:val="nil"/>
+              <w:right w:val="nil"/>
+            </w:tcBorders>
+            <w:shd w:val="clear" w:color="A5A5A5" w:fill="A5A5A5"/>
+            <w:noWrap/>
+            <w:vAlign w:val="bottom"/>
+          </w:tcPr>
+          <w:p>
+            <w:pPr>
+              <w:spacing w:after="0" w:line="240" w:lineRule="auto"/>
+              <w:rPr>
+                <w:rFonts w:ascii="Calibri" w:eastAsia="Times New Roman" w:hAnsi="Calibri" w:cs="Calibri"/>
+                <w:b/>
+                <w:bCs/>
+                <w:color w:val="FFFFFF"/>
+                <w:lang w:eastAsia="es-ES"/>
+              </w:rPr>
+            </w:pPr>
+          </w:p>
+        </w:tc>
+        <w:tc>
+          <w:tcPr>
+            <w:tcW w:w="4297" w:type="dxa"/>
+            <w:tcBorders>
+              <w:top w:val="single" w:sz="4" w:space="0" w:color="A5A5A5"/>
+              <w:left w:val="nil"/>
+              <w:bottom w:val="nil"/>
+              <w:right w:val="nil"/>
+            </w:tcBorders>
+            <w:shd w:val="clear" w:color="A5A5A5" w:fill="A5A5A5"/>
+            <w:noWrap/>
+            <w:vAlign w:val="bottom"/>
+          </w:tcPr>
+          <w:p>
+            <w:pPr>
+              <w:spacing w:after="0" w:line="240" w:lineRule="auto"/>
+              <w:rPr>
+                <w:rFonts w:ascii="Calibri" w:eastAsia="Times New Roman" w:hAnsi="Calibri" w:cs="Calibri"/>
+                <w:b/>
+                <w:bCs/>
+                <w:color w:val="FFFFFF"/>
+                <w:lang w:eastAsia="es-ES"/>
+              </w:rPr>
+            </w:pPr>
+          </w:p>
+        </w:tc>
+        <w:tc>
+          <w:tcPr>
+            <w:tcW w:w="940" w:type="dxa"/>
+            <w:tcBorders>
+              <w:top w:val="single" w:sz="4" w:space="0" w:color="A5A5A5"/>
+              <w:left w:val="nil"/>
+              <w:bottom w:val="nil"/>
+              <w:right w:val="nil"/>
+            </w:tcBorders>
+            <w:shd w:val="clear" w:color="A5A5A5" w:fill="A5A5A5"/>
+            <w:noWrap/>
+            <w:vAlign w:val="bottom"/>
+          </w:tcPr>
+          <w:p>
+            <w:pPr>
+              <w:spacing w:after="0" w:line="240" w:lineRule="auto"/>
+              <w:rPr>
+                <w:rFonts w:ascii="Calibri" w:eastAsia="Times New Roman" w:hAnsi="Calibri" w:cs="Calibri"/>
+                <w:b/>
+                <w:bCs/>
+                <w:color w:val="FFFFFF"/>
+                <w:lang w:eastAsia="es-ES"/>
+              </w:rPr>
+            </w:pPr>
+          </w:p>
+        </w:tc>
+      </w:tr>
+      <w:tr>
+        <w:trPr>
+          <w:trHeight w:val="375"/>
+        </w:trPr>
+        <w:tc>
+          <w:tcPr>
+            <w:tcW w:w="4297" w:type="dxa"/>
+            <w:tcBorders>
+              <w:top w:val="single" w:sz="4" w:space="0" w:color="A5A5A5"/>
+              <w:left w:val="single" w:sz="4" w:space="0" w:color="A5A5A5"/>
+              <w:bottom w:val="nil"/>
+              <w:right w:val="nil"/>
+            </w:tcBorders>
+            <w:shd w:val="clear" w:color="auto" w:fill="auto"/>
+            <w:noWrap/>
+            <w:vAlign w:val="bottom"/>
+            <w:hideMark/>
+          </w:tcPr>
+          <w:p>
+            <w:pPr>
+              <w:spacing w:after="0" w:line="240" w:lineRule="auto"/>
+              <w:rPr>
+                <w:rFonts w:ascii="Consolas" w:eastAsia="Times New Roman" w:hAnsi="Consolas" w:cs="Calibri"/>
+                <w:color w:val="000000"/>
+                <w:sz w:val="28"/>
+                <w:szCs w:val="28"/>
+                <w:lang w:eastAsia="es-ES"/>
+              </w:rPr>
+            </w:pPr>
+            <w:r>
+              <w:rPr>
+                <w:rFonts w:ascii="Consolas" w:eastAsia="Times New Roman" w:hAnsi="Consolas" w:cs="Calibri"/>
+                <w:color w:val="000000"/>
+                <w:sz w:val="28"/>
+                <w:szCs w:val="28"/>
+                <w:lang w:eastAsia="es-ES"/>
+              </w:rPr>
+              <w:t>admin@correo.es</w:t>
+            </w:r>
+          </w:p>
+        </w:tc>
+        <w:tc>
+          <w:tcPr>
+            <w:tcW w:w="4297" w:type="dxa"/>
+            <w:tcBorders>
+              <w:top w:val="single" w:sz="4" w:space="0" w:color="A5A5A5"/>
+              <w:left w:val="nil"/>
+              <w:bottom w:val="nil"/>
+              <w:right w:val="nil"/>
+            </w:tcBorders>
+            <w:shd w:val="clear" w:color="auto" w:fill="auto"/>
+            <w:noWrap/>
+            <w:vAlign w:val="bottom"/>
+            <w:hideMark/>
+          </w:tcPr>
+          <w:p>
+            <w:pPr>
+              <w:spacing w:after="0" w:line="240" w:lineRule="auto"/>
+              <w:rPr>
+                <w:rFonts w:ascii="Consolas" w:eastAsia="Times New Roman" w:hAnsi="Consolas" w:cs="Calibri"/>
+                <w:color w:val="000000"/>
+                <w:sz w:val="28"/>
+                <w:szCs w:val="28"/>
+                <w:lang w:eastAsia="es-ES"/>
+              </w:rPr>
+            </w:pPr>
+            <w:r>
+              <w:rPr>
+                <w:rFonts w:ascii="Consolas" w:eastAsia="Times New Roman" w:hAnsi="Consolas" w:cs="Calibri"/>
+                <w:color w:val="000000"/>
+                <w:sz w:val="28"/>
+                <w:szCs w:val="28"/>
+                <w:lang w:eastAsia="es-ES"/>
+              </w:rPr>
+              <w:t>admin@correo.es</w:t>
+            </w:r>
+          </w:p>
+        </w:tc>
+        <w:tc>
+          <w:tcPr>
+            <w:tcW w:w="940" w:type="dxa"/>
+            <w:tcBorders>
+              <w:top w:val="single" w:sz="4" w:space="0" w:color="A5A5A5"/>
+              <w:left w:val="nil"/>
+              <w:bottom w:val="nil"/>
+              <w:right w:val="nil"/>
+            </w:tcBorders>
+            <w:shd w:val="clear" w:color="auto" w:fill="auto"/>
+            <w:noWrap/>
+            <w:vAlign w:val="bottom"/>
+            <w:hideMark/>
+          </w:tcPr>
+          <w:p>
+            <w:pPr>
+              <w:spacing w:after="0" w:line="240" w:lineRule="auto"/>
+              <w:rPr>
+                <w:rFonts w:ascii="Consolas" w:eastAsia="Times New Roman" w:hAnsi="Consolas" w:cs="Calibri"/>
+                <w:color w:val="2A00FF"/>
+                <w:sz w:val="28"/>
+                <w:szCs w:val="28"/>
+                <w:lang w:eastAsia="es-ES"/>
+              </w:rPr>
+            </w:pPr>
+            <w:r>
+              <w:rPr>
+                <w:rFonts w:ascii="Consolas" w:eastAsia="Times New Roman" w:hAnsi="Consolas" w:cs="Calibri"/>
+                <w:color w:val="2A00FF"/>
+                <w:sz w:val="28"/>
+                <w:szCs w:val="28"/>
+                <w:lang w:eastAsia="es-ES"/>
+              </w:rPr>
+              <w:t>ADMIN</w:t>
+            </w:r>
+          </w:p>
+        </w:tc>
+      </w:tr>
+      <w:tr>
+        <w:trPr>
+          <w:trHeight w:val="375"/>
+        </w:trPr>
+        <w:tc>
+          <w:tcPr>
+            <w:tcW w:w="4297" w:type="dxa"/>
+            <w:tcBorders>
+              <w:top w:val="single" w:sz="4" w:space="0" w:color="A5A5A5"/>
+              <w:left w:val="single" w:sz="4" w:space="0" w:color="A5A5A5"/>
+              <w:bottom w:val="nil"/>
+              <w:right w:val="nil"/>
+            </w:tcBorders>
+            <w:shd w:val="clear" w:color="auto" w:fill="auto"/>
+            <w:noWrap/>
+            <w:vAlign w:val="bottom"/>
+            <w:hideMark/>
+          </w:tcPr>
+          <w:p>
+            <w:pPr>
+              <w:spacing w:after="0" w:line="240" w:lineRule="auto"/>
+              <w:rPr>
+                <w:rFonts w:ascii="Consolas" w:eastAsia="Times New Roman" w:hAnsi="Consolas" w:cs="Calibri"/>
+                <w:color w:val="000000"/>
+                <w:sz w:val="28"/>
+                <w:szCs w:val="28"/>
+                <w:lang w:eastAsia="es-ES"/>
+              </w:rPr>
+            </w:pPr>
+            <w:r>
+              <w:rPr>
+                <w:rFonts w:ascii="Consolas" w:eastAsia="Times New Roman" w:hAnsi="Consolas" w:cs="Calibri"/>
+                <w:color w:val="000000"/>
+                <w:sz w:val="28"/>
+                <w:szCs w:val="28"/>
+                <w:lang w:eastAsia="es-ES"/>
+              </w:rPr>
+              <w:t>profe1@correo.es</w:t>
+            </w:r>
+          </w:p>
+        </w:tc>
+        <w:tc>
+          <w:tcPr>
+            <w:tcW w:w="4297" w:type="dxa"/>
+            <w:tcBorders>
+              <w:top w:val="single" w:sz="4" w:space="0" w:color="A5A5A5"/>
+              <w:left w:val="nil"/>
+              <w:bottom w:val="nil"/>
+              <w:right w:val="nil"/>
+            </w:tcBorders>
+            <w:shd w:val="clear" w:color="auto" w:fill="auto"/>
+            <w:noWrap/>
+            <w:vAlign w:val="bottom"/>
+            <w:hideMark/>
+          </w:tcPr>
+          <w:p>
+            <w:pPr>
+              <w:spacing w:after="0" w:line="240" w:lineRule="auto"/>
+              <w:rPr>
+                <w:rFonts w:ascii="Consolas" w:eastAsia="Times New Roman" w:hAnsi="Consolas" w:cs="Calibri"/>
+                <w:color w:val="000000"/>
+                <w:sz w:val="28"/>
+                <w:szCs w:val="28"/>
+                <w:lang w:eastAsia="es-ES"/>
+              </w:rPr>
+            </w:pPr>
+            <w:r>
+              <w:rPr>
+                <w:rFonts w:ascii="Consolas" w:eastAsia="Times New Roman" w:hAnsi="Consolas" w:cs="Calibri"/>
+                <w:color w:val="000000"/>
+                <w:sz w:val="28"/>
+                <w:szCs w:val="28"/>
+                <w:lang w:eastAsia="es-ES"/>
+              </w:rPr>
+              <w:t>profe1@correo.es</w:t>
+            </w:r>
+          </w:p>
+        </w:tc>
+        <w:tc>
+          <w:tcPr>
+            <w:tcW w:w="940" w:type="dxa"/>
+            <w:tcBorders>
+              <w:top w:val="single" w:sz="4" w:space="0" w:color="A5A5A5"/>
+              <w:left w:val="nil"/>
+              <w:bottom w:val="nil"/>
+              <w:right w:val="nil"/>
+            </w:tcBorders>
+            <w:shd w:val="clear" w:color="auto" w:fill="auto"/>
+            <w:noWrap/>
+            <w:vAlign w:val="bottom"/>
+            <w:hideMark/>
+          </w:tcPr>
+          <w:p>
+            <w:pPr>
+              <w:spacing w:after="0" w:line="240" w:lineRule="auto"/>
+              <w:rPr>
+                <w:rFonts w:ascii="Consolas" w:eastAsia="Times New Roman" w:hAnsi="Consolas" w:cs="Calibri"/>
+                <w:color w:val="2A00FF"/>
+                <w:sz w:val="28"/>
+                <w:szCs w:val="28"/>
+                <w:lang w:eastAsia="es-ES"/>
+              </w:rPr>
+            </w:pPr>
+            <w:r>
+              <w:rPr>
+                <w:rFonts w:ascii="Consolas" w:eastAsia="Times New Roman" w:hAnsi="Consolas" w:cs="Calibri"/>
+                <w:color w:val="2A00FF"/>
+                <w:sz w:val="28"/>
+                <w:szCs w:val="28"/>
+                <w:lang w:eastAsia="es-ES"/>
+              </w:rPr>
+              <w:t>PROFE</w:t>
+            </w:r>
+          </w:p>
+        </w:tc>
+      </w:tr>
+      <w:tr>
+        <w:trPr>
+          <w:trHeight w:val="375"/>
+        </w:trPr>
+        <w:tc>
+          <w:tcPr>
+            <w:tcW w:w="4297" w:type="dxa"/>
+            <w:tcBorders>
+              <w:top w:val="single" w:sz="4" w:space="0" w:color="A5A5A5"/>
+              <w:left w:val="single" w:sz="4" w:space="0" w:color="A5A5A5"/>
+              <w:bottom w:val="nil"/>
+              <w:right w:val="nil"/>
+            </w:tcBorders>
+            <w:shd w:val="clear" w:color="auto" w:fill="auto"/>
+            <w:noWrap/>
+            <w:vAlign w:val="bottom"/>
+            <w:hideMark/>
+          </w:tcPr>
+          <w:p>
+            <w:pPr>
+              <w:spacing w:after="0" w:line="240" w:lineRule="auto"/>
+              <w:rPr>
+                <w:rFonts w:ascii="Consolas" w:eastAsia="Times New Roman" w:hAnsi="Consolas" w:cs="Calibri"/>
+                <w:color w:val="000000"/>
+                <w:sz w:val="28"/>
+                <w:szCs w:val="28"/>
+                <w:lang w:eastAsia="es-ES"/>
+              </w:rPr>
+            </w:pPr>
+            <w:r>
+              <w:rPr>
+                <w:rFonts w:ascii="Consolas" w:eastAsia="Times New Roman" w:hAnsi="Consolas" w:cs="Calibri"/>
+                <w:color w:val="000000"/>
+                <w:sz w:val="28"/>
+                <w:szCs w:val="28"/>
+                <w:lang w:eastAsia="es-ES"/>
+              </w:rPr>
+              <w:t>profe2@correo.es</w:t>
+            </w:r>
+          </w:p>
+        </w:tc>
+        <w:tc>
+          <w:tcPr>
+            <w:tcW w:w="4297" w:type="dxa"/>
+            <w:tcBorders>
+              <w:top w:val="single" w:sz="4" w:space="0" w:color="A5A5A5"/>
+              <w:left w:val="nil"/>
+              <w:bottom w:val="nil"/>
+              <w:right w:val="nil"/>
+            </w:tcBorders>
+            <w:shd w:val="clear" w:color="auto" w:fill="auto"/>
+            <w:noWrap/>
+            <w:vAlign w:val="bottom"/>
+            <w:hideMark/>
+          </w:tcPr>
+          <w:p>
+            <w:pPr>
+              <w:spacing w:after="0" w:line="240" w:lineRule="auto"/>
+              <w:rPr>
+                <w:rFonts w:ascii="Consolas" w:eastAsia="Times New Roman" w:hAnsi="Consolas" w:cs="Calibri"/>
+                <w:color w:val="000000"/>
+                <w:sz w:val="28"/>
+                <w:szCs w:val="28"/>
+                <w:lang w:eastAsia="es-ES"/>
+              </w:rPr>
+            </w:pPr>
+            <w:r>
+              <w:rPr>
+                <w:rFonts w:ascii="Consolas" w:eastAsia="Times New Roman" w:hAnsi="Consolas" w:cs="Calibri"/>
+                <w:color w:val="000000"/>
+                <w:sz w:val="28"/>
+                <w:szCs w:val="28"/>
+                <w:lang w:eastAsia="es-ES"/>
+              </w:rPr>
+              <w:t>profe2@correo.es</w:t>
+            </w:r>
+          </w:p>
+        </w:tc>
+        <w:tc>
+          <w:tcPr>
+            <w:tcW w:w="940" w:type="dxa"/>
+            <w:tcBorders>
+              <w:top w:val="single" w:sz="4" w:space="0" w:color="A5A5A5"/>
+              <w:left w:val="nil"/>
+              <w:bottom w:val="nil"/>
+              <w:right w:val="nil"/>
+            </w:tcBorders>
+            <w:shd w:val="clear" w:color="auto" w:fill="auto"/>
+            <w:noWrap/>
+            <w:vAlign w:val="bottom"/>
+            <w:hideMark/>
+          </w:tcPr>
+          <w:p>
+            <w:pPr>
+              <w:spacing w:after="0" w:line="240" w:lineRule="auto"/>
+              <w:rPr>
+                <w:rFonts w:ascii="Consolas" w:eastAsia="Times New Roman" w:hAnsi="Consolas" w:cs="Calibri"/>
+                <w:color w:val="2A00FF"/>
+                <w:sz w:val="28"/>
+                <w:szCs w:val="28"/>
+                <w:lang w:eastAsia="es-ES"/>
+              </w:rPr>
+            </w:pPr>
+            <w:r>
+              <w:rPr>
+                <w:rFonts w:ascii="Consolas" w:eastAsia="Times New Roman" w:hAnsi="Consolas" w:cs="Calibri"/>
+                <w:color w:val="2A00FF"/>
+                <w:sz w:val="28"/>
+                <w:szCs w:val="28"/>
+                <w:lang w:eastAsia="es-ES"/>
+              </w:rPr>
+              <w:t>PROFE</w:t>
+            </w:r>
+          </w:p>
+        </w:tc>
+      </w:tr>
+      <w:tr>
+        <w:trPr>
+          <w:trHeight w:val="375"/>
+        </w:trPr>
+        <w:tc>
+          <w:tcPr>
+            <w:tcW w:w="4297" w:type="dxa"/>
+            <w:tcBorders>
+              <w:top w:val="single" w:sz="4" w:space="0" w:color="A5A5A5"/>
+              <w:left w:val="single" w:sz="4" w:space="0" w:color="A5A5A5"/>
+              <w:bottom w:val="nil"/>
+              <w:right w:val="nil"/>
+            </w:tcBorders>
+            <w:shd w:val="clear" w:color="auto" w:fill="auto"/>
+            <w:noWrap/>
+            <w:vAlign w:val="bottom"/>
+            <w:hideMark/>
+          </w:tcPr>
+          <w:p>
+            <w:pPr>
+              <w:spacing w:after="0" w:line="240" w:lineRule="auto"/>
+              <w:rPr>
+                <w:rFonts w:ascii="Consolas" w:eastAsia="Times New Roman" w:hAnsi="Consolas" w:cs="Calibri"/>
+                <w:color w:val="000000"/>
+                <w:sz w:val="28"/>
+                <w:szCs w:val="28"/>
+                <w:lang w:eastAsia="es-ES"/>
+              </w:rPr>
+            </w:pPr>
+            <w:r>
+              <w:rPr>
+                <w:rFonts w:ascii="Consolas" w:eastAsia="Times New Roman" w:hAnsi="Consolas" w:cs="Calibri"/>
+                <w:color w:val="000000"/>
+                <w:sz w:val="28"/>
+                <w:szCs w:val="28"/>
+                <w:lang w:eastAsia="es-ES"/>
+              </w:rPr>
+              <w:t>estudiante1@correo.es</w:t>
+            </w:r>
+          </w:p>
+        </w:tc>
+        <w:tc>
+          <w:tcPr>
+            <w:tcW w:w="4297" w:type="dxa"/>
+            <w:tcBorders>
+              <w:top w:val="single" w:sz="4" w:space="0" w:color="A5A5A5"/>
+              <w:left w:val="nil"/>
+              <w:bottom w:val="nil"/>
+              <w:right w:val="nil"/>
+            </w:tcBorders>
+            <w:shd w:val="clear" w:color="auto" w:fill="auto"/>
+            <w:noWrap/>
+            <w:vAlign w:val="bottom"/>
+            <w:hideMark/>
+          </w:tcPr>
+          <w:p>
+            <w:pPr>
+              <w:spacing w:after="0" w:line="240" w:lineRule="auto"/>
+              <w:rPr>
+                <w:rFonts w:ascii="Consolas" w:eastAsia="Times New Roman" w:hAnsi="Consolas" w:cs="Calibri"/>
+                <w:color w:val="000000"/>
+                <w:sz w:val="28"/>
+                <w:szCs w:val="28"/>
+                <w:lang w:eastAsia="es-ES"/>
+              </w:rPr>
+            </w:pPr>
+            <w:hyperlink r:id="rId41" w:history="1">
+              <w:r>
+                <w:rPr>
+                  <w:rFonts w:ascii="Consolas" w:eastAsia="Times New Roman" w:hAnsi="Consolas" w:cs="Calibri"/>
+                  <w:color w:val="000000"/>
+                  <w:sz w:val="28"/>
+                  <w:szCs w:val="28"/>
+                  <w:lang w:eastAsia="es-ES"/>
+                </w:rPr>
+                <w:t>estudiante1@correo.es</w:t>
+              </w:r>
+            </w:hyperlink>
+          </w:p>
+        </w:tc>
+        <w:tc>
+          <w:tcPr>
+            <w:tcW w:w="940" w:type="dxa"/>
+            <w:tcBorders>
+              <w:top w:val="single" w:sz="4" w:space="0" w:color="A5A5A5"/>
+              <w:left w:val="nil"/>
+              <w:bottom w:val="nil"/>
+              <w:right w:val="nil"/>
+            </w:tcBorders>
+            <w:shd w:val="clear" w:color="auto" w:fill="auto"/>
+            <w:noWrap/>
+            <w:vAlign w:val="bottom"/>
+            <w:hideMark/>
+          </w:tcPr>
+          <w:p>
+            <w:pPr>
+              <w:spacing w:after="0" w:line="240" w:lineRule="auto"/>
+              <w:rPr>
+                <w:rFonts w:ascii="Consolas" w:eastAsia="Times New Roman" w:hAnsi="Consolas" w:cs="Calibri"/>
+                <w:color w:val="2A00FF"/>
+                <w:sz w:val="28"/>
+                <w:szCs w:val="28"/>
+                <w:lang w:eastAsia="es-ES"/>
+              </w:rPr>
+            </w:pPr>
+            <w:r>
+              <w:rPr>
+                <w:rFonts w:ascii="Consolas" w:eastAsia="Times New Roman" w:hAnsi="Consolas" w:cs="Calibri"/>
+                <w:color w:val="2A00FF"/>
+                <w:sz w:val="28"/>
+                <w:szCs w:val="28"/>
+                <w:lang w:eastAsia="es-ES"/>
+              </w:rPr>
+              <w:t>ESTUD</w:t>
+            </w:r>
+          </w:p>
+        </w:tc>
+      </w:tr>
+      <w:tr>
+        <w:trPr>
+          <w:trHeight w:val="375"/>
+        </w:trPr>
+        <w:tc>
+          <w:tcPr>
+            <w:tcW w:w="4297" w:type="dxa"/>
+            <w:tcBorders>
+              <w:top w:val="single" w:sz="4" w:space="0" w:color="A5A5A5"/>
+              <w:left w:val="single" w:sz="4" w:space="0" w:color="A5A5A5"/>
+              <w:bottom w:val="nil"/>
+              <w:right w:val="nil"/>
+            </w:tcBorders>
+            <w:shd w:val="clear" w:color="auto" w:fill="auto"/>
+            <w:noWrap/>
+            <w:vAlign w:val="bottom"/>
+            <w:hideMark/>
+          </w:tcPr>
+          <w:p>
+            <w:pPr>
+              <w:spacing w:after="0" w:line="240" w:lineRule="auto"/>
+              <w:rPr>
+                <w:rFonts w:ascii="Consolas" w:eastAsia="Times New Roman" w:hAnsi="Consolas" w:cs="Calibri"/>
+                <w:color w:val="000000"/>
+                <w:sz w:val="28"/>
+                <w:szCs w:val="28"/>
+                <w:lang w:eastAsia="es-ES"/>
+              </w:rPr>
+            </w:pPr>
+            <w:hyperlink r:id="rId42" w:history="1">
+              <w:r>
+                <w:rPr>
+                  <w:rFonts w:ascii="Consolas" w:eastAsia="Times New Roman" w:hAnsi="Consolas" w:cs="Calibri"/>
+                  <w:color w:val="000000"/>
+                  <w:sz w:val="28"/>
+                  <w:szCs w:val="28"/>
+                  <w:lang w:eastAsia="es-ES"/>
+                </w:rPr>
+                <w:t>luis.estudiante@correo.es</w:t>
+              </w:r>
+            </w:hyperlink>
+          </w:p>
+        </w:tc>
+        <w:tc>
+          <w:tcPr>
+            <w:tcW w:w="4297" w:type="dxa"/>
+            <w:tcBorders>
+              <w:top w:val="single" w:sz="4" w:space="0" w:color="A5A5A5"/>
+              <w:left w:val="nil"/>
+              <w:bottom w:val="nil"/>
+              <w:right w:val="nil"/>
+            </w:tcBorders>
+            <w:shd w:val="clear" w:color="auto" w:fill="auto"/>
+            <w:noWrap/>
+            <w:vAlign w:val="bottom"/>
+            <w:hideMark/>
+          </w:tcPr>
+          <w:p>
+            <w:pPr>
+              <w:spacing w:after="0" w:line="240" w:lineRule="auto"/>
+              <w:rPr>
+                <w:rFonts w:ascii="Consolas" w:eastAsia="Times New Roman" w:hAnsi="Consolas" w:cs="Calibri"/>
+                <w:color w:val="000000"/>
+                <w:sz w:val="28"/>
+                <w:szCs w:val="28"/>
+                <w:lang w:eastAsia="es-ES"/>
+              </w:rPr>
+            </w:pPr>
+            <w:r>
+              <w:rPr>
+                <w:rFonts w:ascii="Consolas" w:eastAsia="Times New Roman" w:hAnsi="Consolas" w:cs="Calibri"/>
+                <w:color w:val="000000"/>
+                <w:sz w:val="28"/>
+                <w:szCs w:val="28"/>
+                <w:lang w:eastAsia="es-ES"/>
+              </w:rPr>
+              <w:t>luis.estudiante@correo.es</w:t>
+            </w:r>
+          </w:p>
+        </w:tc>
+        <w:tc>
+          <w:tcPr>
+            <w:tcW w:w="940" w:type="dxa"/>
+            <w:tcBorders>
+              <w:top w:val="single" w:sz="4" w:space="0" w:color="A5A5A5"/>
+              <w:left w:val="nil"/>
+              <w:bottom w:val="nil"/>
+              <w:right w:val="nil"/>
+            </w:tcBorders>
+            <w:shd w:val="clear" w:color="auto" w:fill="auto"/>
+            <w:noWrap/>
+            <w:vAlign w:val="bottom"/>
+            <w:hideMark/>
+          </w:tcPr>
+          <w:p>
+            <w:pPr>
+              <w:spacing w:after="0" w:line="240" w:lineRule="auto"/>
+              <w:rPr>
+                <w:rFonts w:ascii="Consolas" w:eastAsia="Times New Roman" w:hAnsi="Consolas" w:cs="Calibri"/>
+                <w:color w:val="2A00FF"/>
+                <w:sz w:val="28"/>
+                <w:szCs w:val="28"/>
+                <w:lang w:eastAsia="es-ES"/>
+              </w:rPr>
+            </w:pPr>
+            <w:r>
+              <w:rPr>
+                <w:rFonts w:ascii="Consolas" w:eastAsia="Times New Roman" w:hAnsi="Consolas" w:cs="Calibri"/>
+                <w:color w:val="2A00FF"/>
+                <w:sz w:val="28"/>
+                <w:szCs w:val="28"/>
+                <w:lang w:eastAsia="es-ES"/>
+              </w:rPr>
+              <w:t>ESTUD</w:t>
+            </w:r>
+          </w:p>
+        </w:tc>
+      </w:tr>
+      <w:tr>
+        <w:trPr>
+          <w:trHeight w:val="375"/>
+        </w:trPr>
+        <w:tc>
+          <w:tcPr>
+            <w:tcW w:w="4297" w:type="dxa"/>
+            <w:tcBorders>
+              <w:top w:val="single" w:sz="4" w:space="0" w:color="A5A5A5"/>
+              <w:left w:val="single" w:sz="4" w:space="0" w:color="A5A5A5"/>
+              <w:bottom w:val="nil"/>
+              <w:right w:val="nil"/>
+            </w:tcBorders>
+            <w:shd w:val="clear" w:color="auto" w:fill="auto"/>
+            <w:noWrap/>
+            <w:vAlign w:val="bottom"/>
+            <w:hideMark/>
+          </w:tcPr>
+          <w:p>
+            <w:pPr>
+              <w:spacing w:after="0" w:line="240" w:lineRule="auto"/>
+              <w:rPr>
+                <w:rFonts w:ascii="Consolas" w:eastAsia="Times New Roman" w:hAnsi="Consolas" w:cs="Calibri"/>
+                <w:color w:val="000000"/>
+                <w:sz w:val="28"/>
+                <w:szCs w:val="28"/>
+                <w:lang w:eastAsia="es-ES"/>
+              </w:rPr>
+            </w:pPr>
+            <w:hyperlink r:id="rId43" w:history="1">
+              <w:r>
+                <w:rPr>
+                  <w:rFonts w:ascii="Consolas" w:eastAsia="Times New Roman" w:hAnsi="Consolas" w:cs="Calibri"/>
+                  <w:color w:val="000000"/>
+                  <w:sz w:val="28"/>
+                  <w:szCs w:val="28"/>
+                  <w:lang w:eastAsia="es-ES"/>
+                </w:rPr>
+                <w:t>maria.estudiante@correo.es</w:t>
+              </w:r>
+            </w:hyperlink>
+          </w:p>
+        </w:tc>
+        <w:tc>
+          <w:tcPr>
+            <w:tcW w:w="4297" w:type="dxa"/>
+            <w:tcBorders>
+              <w:top w:val="single" w:sz="4" w:space="0" w:color="A5A5A5"/>
+              <w:left w:val="nil"/>
+              <w:bottom w:val="nil"/>
+              <w:right w:val="nil"/>
+            </w:tcBorders>
+            <w:shd w:val="clear" w:color="auto" w:fill="auto"/>
+            <w:noWrap/>
+            <w:vAlign w:val="bottom"/>
+            <w:hideMark/>
+          </w:tcPr>
+          <w:p>
+            <w:pPr>
+              <w:spacing w:after="0" w:line="240" w:lineRule="auto"/>
+              <w:rPr>
+                <w:rFonts w:ascii="Consolas" w:eastAsia="Times New Roman" w:hAnsi="Consolas" w:cs="Calibri"/>
+                <w:color w:val="000000"/>
+                <w:sz w:val="28"/>
+                <w:szCs w:val="28"/>
+                <w:lang w:eastAsia="es-ES"/>
+              </w:rPr>
+            </w:pPr>
+            <w:r>
+              <w:rPr>
+                <w:rFonts w:ascii="Consolas" w:eastAsia="Times New Roman" w:hAnsi="Consolas" w:cs="Calibri"/>
+                <w:color w:val="000000"/>
+                <w:sz w:val="28"/>
+                <w:szCs w:val="28"/>
+                <w:lang w:eastAsia="es-ES"/>
+              </w:rPr>
+              <w:t>maria.estudiante@correo.es</w:t>
+            </w:r>
+          </w:p>
+        </w:tc>
+        <w:tc>
+          <w:tcPr>
+            <w:tcW w:w="940" w:type="dxa"/>
+            <w:tcBorders>
+              <w:top w:val="single" w:sz="4" w:space="0" w:color="A5A5A5"/>
+              <w:left w:val="nil"/>
+              <w:bottom w:val="nil"/>
+              <w:right w:val="nil"/>
+            </w:tcBorders>
+            <w:shd w:val="clear" w:color="auto" w:fill="auto"/>
+            <w:noWrap/>
+            <w:vAlign w:val="bottom"/>
+            <w:hideMark/>
+          </w:tcPr>
+          <w:p>
+            <w:pPr>
+              <w:spacing w:after="0" w:line="240" w:lineRule="auto"/>
+              <w:rPr>
+                <w:rFonts w:ascii="Consolas" w:eastAsia="Times New Roman" w:hAnsi="Consolas" w:cs="Calibri"/>
+                <w:color w:val="2A00FF"/>
+                <w:sz w:val="28"/>
+                <w:szCs w:val="28"/>
+                <w:lang w:eastAsia="es-ES"/>
+              </w:rPr>
+            </w:pPr>
+            <w:r>
+              <w:rPr>
+                <w:rFonts w:ascii="Consolas" w:eastAsia="Times New Roman" w:hAnsi="Consolas" w:cs="Calibri"/>
+                <w:color w:val="2A00FF"/>
+                <w:sz w:val="28"/>
+                <w:szCs w:val="28"/>
+                <w:lang w:eastAsia="es-ES"/>
+              </w:rPr>
+              <w:t>ESTUD</w:t>
+            </w:r>
+          </w:p>
+        </w:tc>
+      </w:tr>
+      <w:tr>
+        <w:trPr>
+          <w:trHeight w:val="375"/>
+        </w:trPr>
+        <w:tc>
+          <w:tcPr>
+            <w:tcW w:w="4297" w:type="dxa"/>
+            <w:tcBorders>
+              <w:top w:val="single" w:sz="4" w:space="0" w:color="A5A5A5"/>
+              <w:left w:val="single" w:sz="4" w:space="0" w:color="A5A5A5"/>
+              <w:bottom w:val="nil"/>
+              <w:right w:val="nil"/>
+            </w:tcBorders>
+            <w:shd w:val="clear" w:color="auto" w:fill="auto"/>
+            <w:noWrap/>
+            <w:vAlign w:val="bottom"/>
+            <w:hideMark/>
+          </w:tcPr>
+          <w:p>
+            <w:pPr>
+              <w:spacing w:after="0" w:line="240" w:lineRule="auto"/>
+              <w:rPr>
+                <w:rFonts w:ascii="Consolas" w:eastAsia="Times New Roman" w:hAnsi="Consolas" w:cs="Calibri"/>
+                <w:color w:val="000000"/>
+                <w:sz w:val="28"/>
+                <w:szCs w:val="28"/>
+                <w:lang w:eastAsia="es-ES"/>
+              </w:rPr>
+            </w:pPr>
+            <w:r>
+              <w:rPr>
+                <w:rFonts w:ascii="Consolas" w:eastAsia="Times New Roman" w:hAnsi="Consolas" w:cs="Calibri"/>
+                <w:color w:val="000000"/>
+                <w:sz w:val="28"/>
+                <w:szCs w:val="28"/>
+                <w:lang w:eastAsia="es-ES"/>
+              </w:rPr>
+              <w:t>julian.estudiante@correo.es</w:t>
+            </w:r>
+          </w:p>
+        </w:tc>
+        <w:tc>
+          <w:tcPr>
+            <w:tcW w:w="4297" w:type="dxa"/>
+            <w:tcBorders>
+              <w:top w:val="single" w:sz="4" w:space="0" w:color="A5A5A5"/>
+              <w:left w:val="nil"/>
+              <w:bottom w:val="nil"/>
+              <w:right w:val="nil"/>
+            </w:tcBorders>
+            <w:shd w:val="clear" w:color="auto" w:fill="auto"/>
+            <w:noWrap/>
+            <w:vAlign w:val="bottom"/>
+            <w:hideMark/>
+          </w:tcPr>
+          <w:p>
+            <w:pPr>
+              <w:spacing w:after="0" w:line="240" w:lineRule="auto"/>
+              <w:rPr>
+                <w:rFonts w:ascii="Consolas" w:eastAsia="Times New Roman" w:hAnsi="Consolas" w:cs="Calibri"/>
+                <w:color w:val="000000"/>
+                <w:sz w:val="28"/>
+                <w:szCs w:val="28"/>
+                <w:lang w:eastAsia="es-ES"/>
+              </w:rPr>
+            </w:pPr>
+            <w:r>
+              <w:rPr>
+                <w:rFonts w:ascii="Consolas" w:eastAsia="Times New Roman" w:hAnsi="Consolas" w:cs="Calibri"/>
+                <w:color w:val="000000"/>
+                <w:sz w:val="28"/>
+                <w:szCs w:val="28"/>
+                <w:lang w:eastAsia="es-ES"/>
+              </w:rPr>
+              <w:t>julian.estudiante@correo.es</w:t>
+            </w:r>
+          </w:p>
+        </w:tc>
+        <w:tc>
+          <w:tcPr>
+            <w:tcW w:w="940" w:type="dxa"/>
+            <w:tcBorders>
+              <w:top w:val="single" w:sz="4" w:space="0" w:color="A5A5A5"/>
+              <w:left w:val="nil"/>
+              <w:bottom w:val="nil"/>
+              <w:right w:val="nil"/>
+            </w:tcBorders>
+            <w:shd w:val="clear" w:color="auto" w:fill="auto"/>
+            <w:noWrap/>
+            <w:vAlign w:val="bottom"/>
+            <w:hideMark/>
+          </w:tcPr>
+          <w:p>
+            <w:pPr>
+              <w:spacing w:after="0" w:line="240" w:lineRule="auto"/>
+              <w:rPr>
+                <w:rFonts w:ascii="Consolas" w:eastAsia="Times New Roman" w:hAnsi="Consolas" w:cs="Calibri"/>
+                <w:color w:val="2A00FF"/>
+                <w:sz w:val="28"/>
+                <w:szCs w:val="28"/>
+                <w:lang w:eastAsia="es-ES"/>
+              </w:rPr>
+            </w:pPr>
+            <w:r>
+              <w:rPr>
+                <w:rFonts w:ascii="Consolas" w:eastAsia="Times New Roman" w:hAnsi="Consolas" w:cs="Calibri"/>
+                <w:color w:val="2A00FF"/>
+                <w:sz w:val="28"/>
+                <w:szCs w:val="28"/>
+                <w:lang w:eastAsia="es-ES"/>
+              </w:rPr>
+              <w:t>ESTUD</w:t>
+            </w:r>
+          </w:p>
+        </w:tc>
+      </w:tr>
+    </w:tbl>
+    <w:p>
+      <w:pPr>
+        <w:rPr>
+          <w:b/>
+          <w:bCs/>
+        </w:rPr>
+      </w:pPr>
+    </w:p>
+    <w:p>
+      <w:pPr>
+        <w:pStyle w:val="Ttulo2"/>
+      </w:pPr>
+      <w:r>
+        <w:t>Imágenes</w:t>
+      </w:r>
+    </w:p>
+    <w:p/>
+    <w:p>
+      <w:r>
+        <w:tab/>
+        <w:t xml:space="preserve">Las imágenes de los cursos “precargados” se han incluido inicialmente en el directorio </w:t>
+      </w:r>
+    </w:p>
+    <w:p>
+      <w:r>
+        <w:drawing>
+          <wp:inline distT="0" distB="0" distL="0" distR="0" wp14:anchorId="43230A01" wp14:editId="57B0EFE8">
+            <wp:extent cx="5400040" cy="4671060"/>
+            <wp:effectExtent l="0" t="0" r="0" b="0"/>
+            <wp:docPr id="25" name="Imagen 25"/>
+            <wp:cNvGraphicFramePr>
+              <a:graphicFrameLocks xmlns:a="http://schemas.openxmlformats.org/drawingml/2006/main" noChangeAspect="1"/>
+            </wp:cNvGraphicFramePr>
+            <a:graphic xmlns:a="http://schemas.openxmlformats.org/drawingml/2006/main">
+              <a:graphicData uri="http://schemas.openxmlformats.org/drawingml/2006/picture">
+                <pic:pic xmlns:pic="http://schemas.openxmlformats.org/drawingml/2006/picture">
+                  <pic:nvPicPr>
+                    <pic:cNvPr id="1" name=""/>
+                    <pic:cNvPicPr/>
+                  </pic:nvPicPr>
+                  <pic:blipFill>
+                    <a:blip r:embed="rId44"/>
+                    <a:stretch>
+                      <a:fillRect/>
+                    </a:stretch>
+                  </pic:blipFill>
+                  <pic:spPr>
+                    <a:xfrm>
+                      <a:off x="0" y="0"/>
+                      <a:ext cx="5400040" cy="4671060"/>
+                    </a:xfrm>
+                    <a:prstGeom prst="rect">
+                      <a:avLst/>
+                    </a:prstGeom>
+                  </pic:spPr>
+                </pic:pic>
+              </a:graphicData>
+            </a:graphic>
+          </wp:inline>
+        </w:drawing>
+      </w:r>
+    </w:p>
+    <w:p>
+      <w:pPr>
+        <w:pStyle w:val="Ttulo2"/>
+      </w:pPr>
+      <w:proofErr w:type="spellStart"/>
+      <w:r>
+        <w:t>JavaDoc</w:t>
+      </w:r>
+      <w:proofErr w:type="spellEnd"/>
+    </w:p>
+    <w:p/>
+    <w:p>
+      <w:pPr>
+        <w:rPr>
+          <w:rFonts w:ascii="Consolas" w:hAnsi="Consolas"/>
+          <w:color w:val="93A1A1"/>
+          <w:shd w:val="clear" w:color="auto" w:fill="FFFFFF"/>
+        </w:rPr>
+      </w:pPr>
+      <w:r>
+        <w:tab/>
+        <w:t xml:space="preserve">Se incluyen los “JAVADOCS” generados por el plugin de Maven: </w:t>
+      </w:r>
+      <w:proofErr w:type="spellStart"/>
+      <w:r>
+        <w:rPr>
+          <w:rFonts w:ascii="Consolas" w:hAnsi="Consolas"/>
+          <w:color w:val="93A1A1"/>
+          <w:shd w:val="clear" w:color="auto" w:fill="FFFFFF"/>
+        </w:rPr>
+        <w:t>maven</w:t>
+      </w:r>
+      <w:proofErr w:type="spellEnd"/>
+      <w:r>
+        <w:rPr>
+          <w:rFonts w:ascii="Consolas" w:hAnsi="Consolas"/>
+          <w:color w:val="93A1A1"/>
+          <w:shd w:val="clear" w:color="auto" w:fill="FFFFFF"/>
+        </w:rPr>
+        <w:t>-</w:t>
+      </w:r>
+      <w:proofErr w:type="spellStart"/>
+      <w:r>
+        <w:rPr>
+          <w:rFonts w:ascii="Consolas" w:hAnsi="Consolas"/>
+          <w:color w:val="93A1A1"/>
+          <w:shd w:val="clear" w:color="auto" w:fill="FFFFFF"/>
+        </w:rPr>
+        <w:t>javadoc</w:t>
+      </w:r>
+      <w:proofErr w:type="spellEnd"/>
+      <w:r>
+        <w:rPr>
+          <w:rFonts w:ascii="Consolas" w:hAnsi="Consolas"/>
+          <w:color w:val="93A1A1"/>
+          <w:shd w:val="clear" w:color="auto" w:fill="FFFFFF"/>
+        </w:rPr>
+        <w:t>-plugin</w:t>
+      </w:r>
+    </w:p>
+    <w:p>
+      <w:pPr>
+        <w:rPr>
+          <w:rFonts w:ascii="Consolas" w:hAnsi="Consolas"/>
+          <w:color w:val="93A1A1"/>
+          <w:shd w:val="clear" w:color="auto" w:fill="FFFFFF"/>
+        </w:rPr>
+      </w:pPr>
+      <w:r>
+        <w:rPr>
+          <w:rFonts w:ascii="Consolas" w:hAnsi="Consolas"/>
+          <w:color w:val="93A1A1"/>
+          <w:shd w:val="clear" w:color="auto" w:fill="FFFFFF"/>
+        </w:rPr>
+        <w:tab/>
+        <w:t>Aunque no es lo habitual, se ha incluido en el directorio “/</w:t>
+      </w:r>
+      <w:proofErr w:type="spellStart"/>
+      <w:r>
+        <w:rPr>
+          <w:rFonts w:ascii="Consolas" w:hAnsi="Consolas"/>
+          <w:color w:val="93A1A1"/>
+          <w:shd w:val="clear" w:color="auto" w:fill="FFFFFF"/>
+        </w:rPr>
+        <w:t>resource</w:t>
+      </w:r>
+      <w:proofErr w:type="spellEnd"/>
+      <w:r>
+        <w:rPr>
+          <w:rFonts w:ascii="Consolas" w:hAnsi="Consolas"/>
+          <w:color w:val="93A1A1"/>
+          <w:shd w:val="clear" w:color="auto" w:fill="FFFFFF"/>
+        </w:rPr>
+        <w:t>/</w:t>
+      </w:r>
+      <w:proofErr w:type="spellStart"/>
+      <w:r>
+        <w:rPr>
+          <w:rFonts w:ascii="Consolas" w:hAnsi="Consolas"/>
+          <w:color w:val="93A1A1"/>
+          <w:shd w:val="clear" w:color="auto" w:fill="FFFFFF"/>
+        </w:rPr>
+        <w:t>static</w:t>
+      </w:r>
+      <w:proofErr w:type="spellEnd"/>
+      <w:r>
+        <w:rPr>
+          <w:rFonts w:ascii="Consolas" w:hAnsi="Consolas"/>
+          <w:color w:val="93A1A1"/>
+          <w:shd w:val="clear" w:color="auto" w:fill="FFFFFF"/>
+        </w:rPr>
+        <w:t>”.</w:t>
+      </w:r>
+    </w:p>
+    <w:p>
+      <w:pPr>
+        <w:rPr>
+          <w:rFonts w:ascii="Consolas" w:hAnsi="Consolas"/>
+          <w:color w:val="93A1A1"/>
+          <w:shd w:val="clear" w:color="auto" w:fill="FFFFFF"/>
+        </w:rPr>
+      </w:pPr>
+      <w:r>
+        <w:rPr>
+          <w:rFonts w:ascii="Consolas" w:hAnsi="Consolas"/>
+          <w:color w:val="93A1A1"/>
+          <w:shd w:val="clear" w:color="auto" w:fill="FFFFFF"/>
+        </w:rPr>
+        <w:tab/>
+        <w:t xml:space="preserve">Accederemos directamente desde la aplicación arrancada: </w:t>
+      </w:r>
+    </w:p>
+    <w:p>
+      <w:pPr>
+        <w:rPr>
+          <w:rFonts w:ascii="Consolas" w:hAnsi="Consolas"/>
+          <w:color w:val="93A1A1"/>
+          <w:shd w:val="clear" w:color="auto" w:fill="FFFFFF"/>
+        </w:rPr>
+      </w:pPr>
+    </w:p>
+    <w:p>
+      <w:pPr>
+        <w:rPr>
+          <w:rFonts w:ascii="Consolas" w:hAnsi="Consolas"/>
+          <w:color w:val="93A1A1"/>
+          <w:shd w:val="clear" w:color="auto" w:fill="FFFFFF"/>
+        </w:rPr>
+      </w:pPr>
+      <w:hyperlink r:id="rId45" w:history="1">
+        <w:r>
+          <w:rPr>
+            <w:rStyle w:val="Hipervnculo"/>
+            <w:rFonts w:ascii="Consolas" w:hAnsi="Consolas"/>
+            <w:shd w:val="clear" w:color="auto" w:fill="FFFFFF"/>
+          </w:rPr>
+          <w:t>http://localhost:8080/app/javadocs/apidocs/index.htm</w:t>
+        </w:r>
+        <w:r>
+          <w:rPr>
+            <w:rStyle w:val="Hipervnculo"/>
+            <w:rFonts w:ascii="Consolas" w:hAnsi="Consolas"/>
+            <w:shd w:val="clear" w:color="auto" w:fill="FFFFFF"/>
+          </w:rPr>
+          <w:t>l</w:t>
+        </w:r>
+      </w:hyperlink>
+    </w:p>
+    <w:p>
+      <w:pPr>
+        <w:rPr>
+          <w:rFonts w:ascii="Consolas" w:hAnsi="Consolas"/>
+          <w:color w:val="93A1A1"/>
+          <w:shd w:val="clear" w:color="auto" w:fill="FFFFFF"/>
+        </w:rPr>
+      </w:pPr>
+    </w:p>
+    <w:p>
+      <w:pPr>
+        <w:jc w:val="center"/>
+        <w:rPr>
+          <w:rFonts w:ascii="Consolas" w:hAnsi="Consolas"/>
+          <w:color w:val="93A1A1"/>
+          <w:shd w:val="clear" w:color="auto" w:fill="FFFFFF"/>
+        </w:rPr>
+      </w:pPr>
+      <w:r>
+        <w:rPr>
+          <w:rFonts w:ascii="Consolas" w:hAnsi="Consolas"/>
+          <w:color w:val="93A1A1"/>
+          <w:shd w:val="clear" w:color="auto" w:fill="FFFFFF"/>
+        </w:rPr>
+        <w:drawing>
+          <wp:inline distT="0" distB="0" distL="0" distR="0" wp14:anchorId="5AABB4C5" wp14:editId="0842C2CF">
+            <wp:extent cx="4782217" cy="6192114"/>
+            <wp:effectExtent l="0" t="0" r="0" b="0"/>
+            <wp:docPr id="26" name="Imagen 26"/>
+            <wp:cNvGraphicFramePr>
+              <a:graphicFrameLocks xmlns:a="http://schemas.openxmlformats.org/drawingml/2006/main" noChangeAspect="1"/>
+            </wp:cNvGraphicFramePr>
+            <a:graphic xmlns:a="http://schemas.openxmlformats.org/drawingml/2006/main">
+              <a:graphicData uri="http://schemas.openxmlformats.org/drawingml/2006/picture">
+                <pic:pic xmlns:pic="http://schemas.openxmlformats.org/drawingml/2006/picture">
+                  <pic:nvPicPr>
+                    <pic:cNvPr id="1" name=""/>
+                    <pic:cNvPicPr/>
+                  </pic:nvPicPr>
+                  <pic:blipFill>
+                    <a:blip r:embed="rId46"/>
+                    <a:stretch>
+                      <a:fillRect/>
+                    </a:stretch>
+                  </pic:blipFill>
+                  <pic:spPr>
+                    <a:xfrm>
+                      <a:off x="0" y="0"/>
+                      <a:ext cx="4782217" cy="6192114"/>
+                    </a:xfrm>
+                    <a:prstGeom prst="rect">
+                      <a:avLst/>
+                    </a:prstGeom>
+                  </pic:spPr>
+                </pic:pic>
+              </a:graphicData>
+            </a:graphic>
+          </wp:inline>
+        </w:drawing>
+      </w:r>
+    </w:p>
+    <w:p>
+      <w:pPr>
+        <w:ind w:firstLine="708"/>
+      </w:pPr>
+      <w:r>
+        <w:t>Nos m</w:t>
+      </w:r>
+      <w:r>
+        <w:t>ostrará los paquetes en los que está definido la aplicación.</w:t>
+      </w:r>
+    </w:p>
+    <w:p>
+      <w:pPr>
+        <w:pStyle w:val="Ttulo2"/>
+      </w:pPr>
+      <w:proofErr w:type="spellStart"/>
+      <w:r>
+        <w:t>Sources</w:t>
+      </w:r>
+      <w:proofErr w:type="spellEnd"/>
+    </w:p>
+    <w:p>
+      <w:r>
+        <w:tab/>
+      </w:r>
+    </w:p>
+    <w:p>
+      <w:pPr>
+        <w:ind w:firstLine="708"/>
+      </w:pPr>
+      <w:r>
+        <w:t xml:space="preserve">Se incluye en el </w:t>
+      </w:r>
+      <w:proofErr w:type="spellStart"/>
+      <w:r>
+        <w:t>war</w:t>
+      </w:r>
+      <w:proofErr w:type="spellEnd"/>
+      <w:r>
+        <w:t xml:space="preserve"> entregado en la carpeta: </w:t>
+      </w:r>
+    </w:p>
+    <w:p>
+      <w:pPr>
+        <w:ind w:firstLine="708"/>
+      </w:pPr>
+    </w:p>
+    <w:p>
+      <w:pPr>
+        <w:ind w:firstLine="708"/>
+      </w:pPr>
+      <w:r>
+        <w:drawing>
+          <wp:inline distT="0" distB="0" distL="0" distR="0" wp14:anchorId="79B03F17" wp14:editId="79713F00">
+            <wp:extent cx="3724795" cy="1448002"/>
+            <wp:effectExtent l="0" t="0" r="9525" b="0"/>
+            <wp:docPr id="24" name="Imagen 24"/>
+            <wp:cNvGraphicFramePr>
+              <a:graphicFrameLocks xmlns:a="http://schemas.openxmlformats.org/drawingml/2006/main" noChangeAspect="1"/>
+            </wp:cNvGraphicFramePr>
+            <a:graphic xmlns:a="http://schemas.openxmlformats.org/drawingml/2006/main">
+              <a:graphicData uri="http://schemas.openxmlformats.org/drawingml/2006/picture">
+                <pic:pic xmlns:pic="http://schemas.openxmlformats.org/drawingml/2006/picture">
+                  <pic:nvPicPr>
+                    <pic:cNvPr id="1" name=""/>
+                    <pic:cNvPicPr/>
+                  </pic:nvPicPr>
+                  <pic:blipFill>
+                    <a:blip r:embed="rId47"/>
+                    <a:stretch>
+                      <a:fillRect/>
+                    </a:stretch>
+                  </pic:blipFill>
+                  <pic:spPr>
+                    <a:xfrm>
+                      <a:off x="0" y="0"/>
+                      <a:ext cx="3724795" cy="1448002"/>
+                    </a:xfrm>
+                    <a:prstGeom prst="rect">
+                      <a:avLst/>
+                    </a:prstGeom>
+                  </pic:spPr>
+                </pic:pic>
+              </a:graphicData>
+            </a:graphic>
+          </wp:inline>
+        </w:drawing>
+      </w:r>
+    </w:p>
+    <w:p>
+      <w:pPr>
+        <w:pStyle w:val="Ttulo1"/>
+      </w:pPr>
+      <w:r>
+        <w:t>CONCLUSIONES</w:t>
+      </w:r>
+    </w:p>
+    <w:p>
+      <w:pPr>
+        <w:pStyle w:val="Ttulo1"/>
+      </w:pPr>
+      <w:r>
+        <w:t>RECURSOS EXTERNOS UTILIZADOS</w:t>
+      </w:r>
+    </w:p>
+    <w:p>
+      <w:r>
+        <w:tab/>
+        <w:t xml:space="preserve">Se ha recurrido a la información oficial de los </w:t>
+      </w:r>
+      <w:proofErr w:type="spellStart"/>
+      <w:r>
+        <w:t>FrameWorks</w:t>
+      </w:r>
+      <w:proofErr w:type="spellEnd"/>
+      <w:r>
+        <w:t xml:space="preserve"> utilizados en el desarrollo de la aplicación.</w:t>
+      </w:r>
+    </w:p>
+    <w:p>
+      <w:pPr>
+        <w:pStyle w:val="Prrafodelista"/>
+        <w:numPr>
+          <w:ilvl w:val="0"/>
+          <w:numId w:val="6"/>
+        </w:numPr>
+        <w:rPr>
+          <w:b/>
+          <w:bCs/>
+        </w:rPr>
+      </w:pPr>
+      <w:r>
+        <w:rPr>
+          <w:b/>
+          <w:bCs/>
+        </w:rPr>
+        <w:t xml:space="preserve">Spring </w:t>
+      </w:r>
+      <w:proofErr w:type="spellStart"/>
+      <w:r>
+        <w:rPr>
+          <w:b/>
+          <w:bCs/>
+        </w:rPr>
+        <w:t>Boot</w:t>
+      </w:r>
+      <w:proofErr w:type="spellEnd"/>
+    </w:p>
+    <w:p>
+      <w:pPr>
+        <w:pStyle w:val="Prrafodelista"/>
+        <w:numPr>
+          <w:ilvl w:val="0"/>
+          <w:numId w:val="6"/>
+        </w:numPr>
+        <w:rPr>
+          <w:b/>
+          <w:bCs/>
+        </w:rPr>
+      </w:pPr>
+      <w:proofErr w:type="spellStart"/>
+      <w:r>
+        <w:rPr>
+          <w:b/>
+          <w:bCs/>
+        </w:rPr>
+        <w:t>ThymeLeaf</w:t>
+      </w:r>
+      <w:proofErr w:type="spellEnd"/>
+    </w:p>
+    <w:p>
+      <w:pPr>
+        <w:pStyle w:val="Prrafodelista"/>
+        <w:numPr>
+          <w:ilvl w:val="0"/>
+          <w:numId w:val="6"/>
+        </w:numPr>
+        <w:rPr>
+          <w:b/>
+          <w:bCs/>
+        </w:rPr>
+      </w:pPr>
+      <w:proofErr w:type="spellStart"/>
+      <w:r>
+        <w:rPr>
+          <w:b/>
+          <w:bCs/>
+        </w:rPr>
+        <w:t>BootStrap</w:t>
+      </w:r>
+      <w:proofErr w:type="spellEnd"/>
+    </w:p>
+    <w:p>
+      <w:pPr>
+        <w:pStyle w:val="Prrafodelista"/>
+        <w:numPr>
+          <w:ilvl w:val="0"/>
+          <w:numId w:val="6"/>
+        </w:numPr>
+        <w:rPr>
+          <w:b/>
+          <w:bCs/>
+        </w:rPr>
+      </w:pPr>
+      <w:r>
+        <w:rPr>
+          <w:b/>
+          <w:bCs/>
+        </w:rPr>
+        <w:t>Docker</w:t>
+      </w:r>
+    </w:p>
+    <w:p>
+      <w:pPr>
+        <w:rPr>
+          <w:b/>
+          <w:bCs/>
+        </w:rPr>
+      </w:pPr>
+    </w:p>
     <w:sectPr>
+      <w:headerReference w:type="even" r:id="rId48"/>
+      <w:headerReference w:type="default" r:id="rId49"/>
+      <w:footerReference w:type="even" r:id="rId50"/>
+      <w:footerReference w:type="default" r:id="rId51"/>
+      <w:headerReference w:type="first" r:id="rId52"/>
+      <w:footerReference w:type="first" r:id="rId53"/>
       <w:pgSz w:w="11906" w:h="16838"/>
       <w:pgMar w:top="1417" w:right="1701" w:bottom="1417" w:left="1701" w:header="708" w:footer="708" w:gutter="0"/>
       <w:pgNumType w:start="0"/>
@@ -11925,6 +15122,119 @@
     </w:sectPr>
   </w:body>
 </w:document>
+</file>
+
+<file path=word/endnotes.xml><?xml version="1.0" encoding="utf-8"?>
+<w:endnotes xmlns:wpc="http://schemas.microsoft.com/office/word/2010/wordprocessingCanvas" xmlns:cx="http://schemas.microsoft.com/office/drawing/2014/chartex" xmlns:cx1="http://schemas.microsoft.com/office/drawing/2015/9/8/chartex" xmlns:cx2="http://schemas.microsoft.com/office/drawing/2015/10/21/chartex" xmlns:cx3="http://schemas.microsoft.com/office/drawing/2016/5/9/chartex" xmlns:cx4="http://schemas.microsoft.com/office/drawing/2016/5/10/chartex" xmlns:cx5="http://schemas.microsoft.com/office/drawing/2016/5/11/chartex" xmlns:cx6="http://schemas.microsoft.com/office/drawing/2016/5/12/chartex" xmlns:cx7="http://schemas.microsoft.com/office/drawing/2016/5/13/chartex" xmlns:cx8="http://schemas.microsoft.com/office/drawing/2016/5/14/chartex" xmlns:mc="http://schemas.openxmlformats.org/markup-compatibility/2006" xmlns:aink="http://schemas.microsoft.com/office/drawing/2016/ink" xmlns:am3d="http://schemas.microsoft.com/office/drawing/2017/model3d" xmlns:o="urn:schemas-microsoft-com:office:office" xmlns:r="http://schemas.openxmlformats.org/officeDocument/2006/relationships" xmlns:m="http://schemas.openxmlformats.org/officeDocument/2006/math" xmlns:v="urn:schemas-microsoft-com:vml" xmlns:wp14="http://schemas.microsoft.com/office/word/2010/wordprocessingDrawing" xmlns:wp="http://schemas.openxmlformats.org/drawingml/2006/wordprocessingDrawing" xmlns:w10="urn:schemas-microsoft-com:office:word" xmlns:w="http://schemas.openxmlformats.org/wordprocessingml/2006/main" xmlns:w14="http://schemas.microsoft.com/office/word/2010/wordml" xmlns:w15="http://schemas.microsoft.com/office/word/2012/wordml" xmlns:w16cex="http://schemas.microsoft.com/office/word/2018/wordml/cex" xmlns:w16cid="http://schemas.microsoft.com/office/word/2016/wordml/cid" xmlns:w16="http://schemas.microsoft.com/office/word/2018/wordml" xmlns:w16sdtdh="http://schemas.microsoft.com/office/word/2020/wordml/sdtdatahash" xmlns:w16se="http://schemas.microsoft.com/office/word/2015/wordml/symex" xmlns:wpg="http://schemas.microsoft.com/office/word/2010/wordprocessingGroup" xmlns:wpi="http://schemas.microsoft.com/office/word/2010/wordprocessingInk" xmlns:wne="http://schemas.microsoft.com/office/word/2006/wordml" xmlns:wps="http://schemas.microsoft.com/office/word/2010/wordprocessingShape" mc:Ignorable="w14 w15 w16se w16cid w16 w16cex w16sdtdh wp14">
+  <w:endnote w:type="separator" w:id="-1">
+    <w:p>
+      <w:pPr>
+        <w:spacing w:after="0" w:line="240" w:lineRule="auto"/>
+      </w:pPr>
+      <w:r>
+        <w:separator/>
+      </w:r>
+    </w:p>
+  </w:endnote>
+  <w:endnote w:type="continuationSeparator" w:id="0">
+    <w:p>
+      <w:pPr>
+        <w:spacing w:after="0" w:line="240" w:lineRule="auto"/>
+      </w:pPr>
+      <w:r>
+        <w:continuationSeparator/>
+      </w:r>
+    </w:p>
+  </w:endnote>
+</w:endnotes>
+</file>
+
+<file path=word/footer1.xml><?xml version="1.0" encoding="utf-8"?>
+<w:ftr xmlns:wpc="http://schemas.microsoft.com/office/word/2010/wordprocessingCanvas" xmlns:cx="http://schemas.microsoft.com/office/drawing/2014/chartex" xmlns:cx1="http://schemas.microsoft.com/office/drawing/2015/9/8/chartex" xmlns:cx2="http://schemas.microsoft.com/office/drawing/2015/10/21/chartex" xmlns:cx3="http://schemas.microsoft.com/office/drawing/2016/5/9/chartex" xmlns:cx4="http://schemas.microsoft.com/office/drawing/2016/5/10/chartex" xmlns:cx5="http://schemas.microsoft.com/office/drawing/2016/5/11/chartex" xmlns:cx6="http://schemas.microsoft.com/office/drawing/2016/5/12/chartex" xmlns:cx7="http://schemas.microsoft.com/office/drawing/2016/5/13/chartex" xmlns:cx8="http://schemas.microsoft.com/office/drawing/2016/5/14/chartex" xmlns:mc="http://schemas.openxmlformats.org/markup-compatibility/2006" xmlns:aink="http://schemas.microsoft.com/office/drawing/2016/ink" xmlns:am3d="http://schemas.microsoft.com/office/drawing/2017/model3d" xmlns:o="urn:schemas-microsoft-com:office:office" xmlns:r="http://schemas.openxmlformats.org/officeDocument/2006/relationships" xmlns:m="http://schemas.openxmlformats.org/officeDocument/2006/math" xmlns:v="urn:schemas-microsoft-com:vml" xmlns:wp14="http://schemas.microsoft.com/office/word/2010/wordprocessingDrawing" xmlns:wp="http://schemas.openxmlformats.org/drawingml/2006/wordprocessingDrawing" xmlns:w10="urn:schemas-microsoft-com:office:word" xmlns:w="http://schemas.openxmlformats.org/wordprocessingml/2006/main" xmlns:w14="http://schemas.microsoft.com/office/word/2010/wordml" xmlns:w15="http://schemas.microsoft.com/office/word/2012/wordml" xmlns:w16cex="http://schemas.microsoft.com/office/word/2018/wordml/cex" xmlns:w16cid="http://schemas.microsoft.com/office/word/2016/wordml/cid" xmlns:w16="http://schemas.microsoft.com/office/word/2018/wordml" xmlns:w16sdtdh="http://schemas.microsoft.com/office/word/2020/wordml/sdtdatahash" xmlns:w16se="http://schemas.microsoft.com/office/word/2015/wordml/symex" xmlns:wpg="http://schemas.microsoft.com/office/word/2010/wordprocessingGroup" xmlns:wpi="http://schemas.microsoft.com/office/word/2010/wordprocessingInk" xmlns:wne="http://schemas.microsoft.com/office/word/2006/wordml" xmlns:wps="http://schemas.microsoft.com/office/word/2010/wordprocessingShape" mc:Ignorable="w14 w15 w16se w16cid w16 w16cex w16sdtdh wp14">
+  <w:p>
+    <w:pPr>
+      <w:pStyle w:val="Piedepgina"/>
+    </w:pPr>
+  </w:p>
+</w:ftr>
+</file>
+
+<file path=word/footer2.xml><?xml version="1.0" encoding="utf-8"?>
+<w:ftr xmlns:wpc="http://schemas.microsoft.com/office/word/2010/wordprocessingCanvas" xmlns:cx="http://schemas.microsoft.com/office/drawing/2014/chartex" xmlns:cx1="http://schemas.microsoft.com/office/drawing/2015/9/8/chartex" xmlns:cx2="http://schemas.microsoft.com/office/drawing/2015/10/21/chartex" xmlns:cx3="http://schemas.microsoft.com/office/drawing/2016/5/9/chartex" xmlns:cx4="http://schemas.microsoft.com/office/drawing/2016/5/10/chartex" xmlns:cx5="http://schemas.microsoft.com/office/drawing/2016/5/11/chartex" xmlns:cx6="http://schemas.microsoft.com/office/drawing/2016/5/12/chartex" xmlns:cx7="http://schemas.microsoft.com/office/drawing/2016/5/13/chartex" xmlns:cx8="http://schemas.microsoft.com/office/drawing/2016/5/14/chartex" xmlns:mc="http://schemas.openxmlformats.org/markup-compatibility/2006" xmlns:aink="http://schemas.microsoft.com/office/drawing/2016/ink" xmlns:am3d="http://schemas.microsoft.com/office/drawing/2017/model3d" xmlns:o="urn:schemas-microsoft-com:office:office" xmlns:r="http://schemas.openxmlformats.org/officeDocument/2006/relationships" xmlns:m="http://schemas.openxmlformats.org/officeDocument/2006/math" xmlns:v="urn:schemas-microsoft-com:vml" xmlns:wp14="http://schemas.microsoft.com/office/word/2010/wordprocessingDrawing" xmlns:wp="http://schemas.openxmlformats.org/drawingml/2006/wordprocessingDrawing" xmlns:w10="urn:schemas-microsoft-com:office:word" xmlns:w="http://schemas.openxmlformats.org/wordprocessingml/2006/main" xmlns:w14="http://schemas.microsoft.com/office/word/2010/wordml" xmlns:w15="http://schemas.microsoft.com/office/word/2012/wordml" xmlns:w16cex="http://schemas.microsoft.com/office/word/2018/wordml/cex" xmlns:w16cid="http://schemas.microsoft.com/office/word/2016/wordml/cid" xmlns:w16="http://schemas.microsoft.com/office/word/2018/wordml" xmlns:w16sdtdh="http://schemas.microsoft.com/office/word/2020/wordml/sdtdatahash" xmlns:w16se="http://schemas.microsoft.com/office/word/2015/wordml/symex" xmlns:wpg="http://schemas.microsoft.com/office/word/2010/wordprocessingGroup" xmlns:wpi="http://schemas.microsoft.com/office/word/2010/wordprocessingInk" xmlns:wne="http://schemas.microsoft.com/office/word/2006/wordml" xmlns:wps="http://schemas.microsoft.com/office/word/2010/wordprocessingShape" mc:Ignorable="w14 w15 w16se w16cid w16 w16cex w16sdtdh wp14">
+  <w:p>
+    <w:pPr>
+      <w:pStyle w:val="Piedepgina"/>
+    </w:pPr>
+  </w:p>
+</w:ftr>
+</file>
+
+<file path=word/footer3.xml><?xml version="1.0" encoding="utf-8"?>
+<w:ftr xmlns:wpc="http://schemas.microsoft.com/office/word/2010/wordprocessingCanvas" xmlns:cx="http://schemas.microsoft.com/office/drawing/2014/chartex" xmlns:cx1="http://schemas.microsoft.com/office/drawing/2015/9/8/chartex" xmlns:cx2="http://schemas.microsoft.com/office/drawing/2015/10/21/chartex" xmlns:cx3="http://schemas.microsoft.com/office/drawing/2016/5/9/chartex" xmlns:cx4="http://schemas.microsoft.com/office/drawing/2016/5/10/chartex" xmlns:cx5="http://schemas.microsoft.com/office/drawing/2016/5/11/chartex" xmlns:cx6="http://schemas.microsoft.com/office/drawing/2016/5/12/chartex" xmlns:cx7="http://schemas.microsoft.com/office/drawing/2016/5/13/chartex" xmlns:cx8="http://schemas.microsoft.com/office/drawing/2016/5/14/chartex" xmlns:mc="http://schemas.openxmlformats.org/markup-compatibility/2006" xmlns:aink="http://schemas.microsoft.com/office/drawing/2016/ink" xmlns:am3d="http://schemas.microsoft.com/office/drawing/2017/model3d" xmlns:o="urn:schemas-microsoft-com:office:office" xmlns:r="http://schemas.openxmlformats.org/officeDocument/2006/relationships" xmlns:m="http://schemas.openxmlformats.org/officeDocument/2006/math" xmlns:v="urn:schemas-microsoft-com:vml" xmlns:wp14="http://schemas.microsoft.com/office/word/2010/wordprocessingDrawing" xmlns:wp="http://schemas.openxmlformats.org/drawingml/2006/wordprocessingDrawing" xmlns:w10="urn:schemas-microsoft-com:office:word" xmlns:w="http://schemas.openxmlformats.org/wordprocessingml/2006/main" xmlns:w14="http://schemas.microsoft.com/office/word/2010/wordml" xmlns:w15="http://schemas.microsoft.com/office/word/2012/wordml" xmlns:w16cex="http://schemas.microsoft.com/office/word/2018/wordml/cex" xmlns:w16cid="http://schemas.microsoft.com/office/word/2016/wordml/cid" xmlns:w16="http://schemas.microsoft.com/office/word/2018/wordml" xmlns:w16sdtdh="http://schemas.microsoft.com/office/word/2020/wordml/sdtdatahash" xmlns:w16se="http://schemas.microsoft.com/office/word/2015/wordml/symex" xmlns:wpg="http://schemas.microsoft.com/office/word/2010/wordprocessingGroup" xmlns:wpi="http://schemas.microsoft.com/office/word/2010/wordprocessingInk" xmlns:wne="http://schemas.microsoft.com/office/word/2006/wordml" xmlns:wps="http://schemas.microsoft.com/office/word/2010/wordprocessingShape" mc:Ignorable="w14 w15 w16se w16cid w16 w16cex w16sdtdh wp14">
+  <w:p>
+    <w:pPr>
+      <w:pStyle w:val="Piedepgina"/>
+    </w:pPr>
+  </w:p>
+</w:ftr>
+</file>
+
+<file path=word/footnotes.xml><?xml version="1.0" encoding="utf-8"?>
+<w:footnotes xmlns:wpc="http://schemas.microsoft.com/office/word/2010/wordprocessingCanvas" xmlns:cx="http://schemas.microsoft.com/office/drawing/2014/chartex" xmlns:cx1="http://schemas.microsoft.com/office/drawing/2015/9/8/chartex" xmlns:cx2="http://schemas.microsoft.com/office/drawing/2015/10/21/chartex" xmlns:cx3="http://schemas.microsoft.com/office/drawing/2016/5/9/chartex" xmlns:cx4="http://schemas.microsoft.com/office/drawing/2016/5/10/chartex" xmlns:cx5="http://schemas.microsoft.com/office/drawing/2016/5/11/chartex" xmlns:cx6="http://schemas.microsoft.com/office/drawing/2016/5/12/chartex" xmlns:cx7="http://schemas.microsoft.com/office/drawing/2016/5/13/chartex" xmlns:cx8="http://schemas.microsoft.com/office/drawing/2016/5/14/chartex" xmlns:mc="http://schemas.openxmlformats.org/markup-compatibility/2006" xmlns:aink="http://schemas.microsoft.com/office/drawing/2016/ink" xmlns:am3d="http://schemas.microsoft.com/office/drawing/2017/model3d" xmlns:o="urn:schemas-microsoft-com:office:office" xmlns:r="http://schemas.openxmlformats.org/officeDocument/2006/relationships" xmlns:m="http://schemas.openxmlformats.org/officeDocument/2006/math" xmlns:v="urn:schemas-microsoft-com:vml" xmlns:wp14="http://schemas.microsoft.com/office/word/2010/wordprocessingDrawing" xmlns:wp="http://schemas.openxmlformats.org/drawingml/2006/wordprocessingDrawing" xmlns:w10="urn:schemas-microsoft-com:office:word" xmlns:w="http://schemas.openxmlformats.org/wordprocessingml/2006/main" xmlns:w14="http://schemas.microsoft.com/office/word/2010/wordml" xmlns:w15="http://schemas.microsoft.com/office/word/2012/wordml" xmlns:w16cex="http://schemas.microsoft.com/office/word/2018/wordml/cex" xmlns:w16cid="http://schemas.microsoft.com/office/word/2016/wordml/cid" xmlns:w16="http://schemas.microsoft.com/office/word/2018/wordml" xmlns:w16sdtdh="http://schemas.microsoft.com/office/word/2020/wordml/sdtdatahash" xmlns:w16se="http://schemas.microsoft.com/office/word/2015/wordml/symex" xmlns:wpg="http://schemas.microsoft.com/office/word/2010/wordprocessingGroup" xmlns:wpi="http://schemas.microsoft.com/office/word/2010/wordprocessingInk" xmlns:wne="http://schemas.microsoft.com/office/word/2006/wordml" xmlns:wps="http://schemas.microsoft.com/office/word/2010/wordprocessingShape" mc:Ignorable="w14 w15 w16se w16cid w16 w16cex w16sdtdh wp14">
+  <w:footnote w:type="separator" w:id="-1">
+    <w:p>
+      <w:pPr>
+        <w:spacing w:after="0" w:line="240" w:lineRule="auto"/>
+      </w:pPr>
+      <w:r>
+        <w:separator/>
+      </w:r>
+    </w:p>
+  </w:footnote>
+  <w:footnote w:type="continuationSeparator" w:id="0">
+    <w:p>
+      <w:pPr>
+        <w:spacing w:after="0" w:line="240" w:lineRule="auto"/>
+      </w:pPr>
+      <w:r>
+        <w:continuationSeparator/>
+      </w:r>
+    </w:p>
+  </w:footnote>
+</w:footnotes>
+</file>
+
+<file path=word/header1.xml><?xml version="1.0" encoding="utf-8"?>
+<w:hdr xmlns:wpc="http://schemas.microsoft.com/office/word/2010/wordprocessingCanvas" xmlns:cx="http://schemas.microsoft.com/office/drawing/2014/chartex" xmlns:cx1="http://schemas.microsoft.com/office/drawing/2015/9/8/chartex" xmlns:cx2="http://schemas.microsoft.com/office/drawing/2015/10/21/chartex" xmlns:cx3="http://schemas.microsoft.com/office/drawing/2016/5/9/chartex" xmlns:cx4="http://schemas.microsoft.com/office/drawing/2016/5/10/chartex" xmlns:cx5="http://schemas.microsoft.com/office/drawing/2016/5/11/chartex" xmlns:cx6="http://schemas.microsoft.com/office/drawing/2016/5/12/chartex" xmlns:cx7="http://schemas.microsoft.com/office/drawing/2016/5/13/chartex" xmlns:cx8="http://schemas.microsoft.com/office/drawing/2016/5/14/chartex" xmlns:mc="http://schemas.openxmlformats.org/markup-compatibility/2006" xmlns:aink="http://schemas.microsoft.com/office/drawing/2016/ink" xmlns:am3d="http://schemas.microsoft.com/office/drawing/2017/model3d" xmlns:o="urn:schemas-microsoft-com:office:office" xmlns:r="http://schemas.openxmlformats.org/officeDocument/2006/relationships" xmlns:m="http://schemas.openxmlformats.org/officeDocument/2006/math" xmlns:v="urn:schemas-microsoft-com:vml" xmlns:wp14="http://schemas.microsoft.com/office/word/2010/wordprocessingDrawing" xmlns:wp="http://schemas.openxmlformats.org/drawingml/2006/wordprocessingDrawing" xmlns:w10="urn:schemas-microsoft-com:office:word" xmlns:w="http://schemas.openxmlformats.org/wordprocessingml/2006/main" xmlns:w14="http://schemas.microsoft.com/office/word/2010/wordml" xmlns:w15="http://schemas.microsoft.com/office/word/2012/wordml" xmlns:w16cex="http://schemas.microsoft.com/office/word/2018/wordml/cex" xmlns:w16cid="http://schemas.microsoft.com/office/word/2016/wordml/cid" xmlns:w16="http://schemas.microsoft.com/office/word/2018/wordml" xmlns:w16sdtdh="http://schemas.microsoft.com/office/word/2020/wordml/sdtdatahash" xmlns:w16se="http://schemas.microsoft.com/office/word/2015/wordml/symex" xmlns:wpg="http://schemas.microsoft.com/office/word/2010/wordprocessingGroup" xmlns:wpi="http://schemas.microsoft.com/office/word/2010/wordprocessingInk" xmlns:wne="http://schemas.microsoft.com/office/word/2006/wordml" xmlns:wps="http://schemas.microsoft.com/office/word/2010/wordprocessingShape" mc:Ignorable="w14 w15 w16se w16cid w16 w16cex w16sdtdh wp14">
+  <w:p>
+    <w:pPr>
+      <w:pStyle w:val="Encabezado"/>
+    </w:pPr>
+  </w:p>
+</w:hdr>
+</file>
+
+<file path=word/header2.xml><?xml version="1.0" encoding="utf-8"?>
+<w:hdr xmlns:wpc="http://schemas.microsoft.com/office/word/2010/wordprocessingCanvas" xmlns:cx="http://schemas.microsoft.com/office/drawing/2014/chartex" xmlns:cx1="http://schemas.microsoft.com/office/drawing/2015/9/8/chartex" xmlns:cx2="http://schemas.microsoft.com/office/drawing/2015/10/21/chartex" xmlns:cx3="http://schemas.microsoft.com/office/drawing/2016/5/9/chartex" xmlns:cx4="http://schemas.microsoft.com/office/drawing/2016/5/10/chartex" xmlns:cx5="http://schemas.microsoft.com/office/drawing/2016/5/11/chartex" xmlns:cx6="http://schemas.microsoft.com/office/drawing/2016/5/12/chartex" xmlns:cx7="http://schemas.microsoft.com/office/drawing/2016/5/13/chartex" xmlns:cx8="http://schemas.microsoft.com/office/drawing/2016/5/14/chartex" xmlns:mc="http://schemas.openxmlformats.org/markup-compatibility/2006" xmlns:aink="http://schemas.microsoft.com/office/drawing/2016/ink" xmlns:am3d="http://schemas.microsoft.com/office/drawing/2017/model3d" xmlns:o="urn:schemas-microsoft-com:office:office" xmlns:r="http://schemas.openxmlformats.org/officeDocument/2006/relationships" xmlns:m="http://schemas.openxmlformats.org/officeDocument/2006/math" xmlns:v="urn:schemas-microsoft-com:vml" xmlns:wp14="http://schemas.microsoft.com/office/word/2010/wordprocessingDrawing" xmlns:wp="http://schemas.openxmlformats.org/drawingml/2006/wordprocessingDrawing" xmlns:w10="urn:schemas-microsoft-com:office:word" xmlns:w="http://schemas.openxmlformats.org/wordprocessingml/2006/main" xmlns:w14="http://schemas.microsoft.com/office/word/2010/wordml" xmlns:w15="http://schemas.microsoft.com/office/word/2012/wordml" xmlns:w16cex="http://schemas.microsoft.com/office/word/2018/wordml/cex" xmlns:w16cid="http://schemas.microsoft.com/office/word/2016/wordml/cid" xmlns:w16="http://schemas.microsoft.com/office/word/2018/wordml" xmlns:w16sdtdh="http://schemas.microsoft.com/office/word/2020/wordml/sdtdatahash" xmlns:w16se="http://schemas.microsoft.com/office/word/2015/wordml/symex" xmlns:wpg="http://schemas.microsoft.com/office/word/2010/wordprocessingGroup" xmlns:wpi="http://schemas.microsoft.com/office/word/2010/wordprocessingInk" xmlns:wne="http://schemas.microsoft.com/office/word/2006/wordml" xmlns:wps="http://schemas.microsoft.com/office/word/2010/wordprocessingShape" mc:Ignorable="w14 w15 w16se w16cid w16 w16cex w16sdtdh wp14">
+  <w:p>
+    <w:pPr>
+      <w:pStyle w:val="Encabezado"/>
+    </w:pPr>
+    <w:r>
+      <w:t>Tecnologías Web. Práctica 2025-2026 Francisco Javier Martínez Sánchez</w:t>
+    </w:r>
+  </w:p>
+</w:hdr>
+</file>
+
+<file path=word/header3.xml><?xml version="1.0" encoding="utf-8"?>
+<w:hdr xmlns:wpc="http://schemas.microsoft.com/office/word/2010/wordprocessingCanvas" xmlns:cx="http://schemas.microsoft.com/office/drawing/2014/chartex" xmlns:cx1="http://schemas.microsoft.com/office/drawing/2015/9/8/chartex" xmlns:cx2="http://schemas.microsoft.com/office/drawing/2015/10/21/chartex" xmlns:cx3="http://schemas.microsoft.com/office/drawing/2016/5/9/chartex" xmlns:cx4="http://schemas.microsoft.com/office/drawing/2016/5/10/chartex" xmlns:cx5="http://schemas.microsoft.com/office/drawing/2016/5/11/chartex" xmlns:cx6="http://schemas.microsoft.com/office/drawing/2016/5/12/chartex" xmlns:cx7="http://schemas.microsoft.com/office/drawing/2016/5/13/chartex" xmlns:cx8="http://schemas.microsoft.com/office/drawing/2016/5/14/chartex" xmlns:mc="http://schemas.openxmlformats.org/markup-compatibility/2006" xmlns:aink="http://schemas.microsoft.com/office/drawing/2016/ink" xmlns:am3d="http://schemas.microsoft.com/office/drawing/2017/model3d" xmlns:o="urn:schemas-microsoft-com:office:office" xmlns:r="http://schemas.openxmlformats.org/officeDocument/2006/relationships" xmlns:m="http://schemas.openxmlformats.org/officeDocument/2006/math" xmlns:v="urn:schemas-microsoft-com:vml" xmlns:wp14="http://schemas.microsoft.com/office/word/2010/wordprocessingDrawing" xmlns:wp="http://schemas.openxmlformats.org/drawingml/2006/wordprocessingDrawing" xmlns:w10="urn:schemas-microsoft-com:office:word" xmlns:w="http://schemas.openxmlformats.org/wordprocessingml/2006/main" xmlns:w14="http://schemas.microsoft.com/office/word/2010/wordml" xmlns:w15="http://schemas.microsoft.com/office/word/2012/wordml" xmlns:w16cex="http://schemas.microsoft.com/office/word/2018/wordml/cex" xmlns:w16cid="http://schemas.microsoft.com/office/word/2016/wordml/cid" xmlns:w16="http://schemas.microsoft.com/office/word/2018/wordml" xmlns:w16sdtdh="http://schemas.microsoft.com/office/word/2020/wordml/sdtdatahash" xmlns:w16se="http://schemas.microsoft.com/office/word/2015/wordml/symex" xmlns:wpg="http://schemas.microsoft.com/office/word/2010/wordprocessingGroup" xmlns:wpi="http://schemas.microsoft.com/office/word/2010/wordprocessingInk" xmlns:wne="http://schemas.microsoft.com/office/word/2006/wordml" xmlns:wps="http://schemas.microsoft.com/office/word/2010/wordprocessingShape" mc:Ignorable="w14 w15 w16se w16cid w16 w16cex w16sdtdh wp14">
+  <w:p>
+    <w:pPr>
+      <w:pStyle w:val="Encabezado"/>
+    </w:pPr>
+  </w:p>
+</w:hdr>
 </file>
 
 <file path=word/numbering.xml><?xml version="1.0" encoding="utf-8"?>
@@ -14103,7 +17413,6 @@
     <w:name w:val="Hyperlink"/>
     <w:basedOn w:val="Fuentedeprrafopredeter"/>
     <w:uiPriority w:val="99"/>
-    <w:semiHidden/>
     <w:unhideWhenUsed/>
     <w:rsid w:val="00DF4AF5"/>
     <w:rPr>
@@ -14219,6 +17528,62 @@
     <w:link w:val="Sinespaciado"/>
     <w:uiPriority w:val="1"/>
     <w:rsid w:val="00CE07CC"/>
+  </w:style>
+  <w:style w:type="character" w:styleId="Mencinsinresolver">
+    <w:name w:val="Unresolved Mention"/>
+    <w:basedOn w:val="Fuentedeprrafopredeter"/>
+    <w:uiPriority w:val="99"/>
+    <w:semiHidden/>
+    <w:unhideWhenUsed/>
+    <w:rsid w:val="008B3A9B"/>
+    <w:rPr>
+      <w:color w:val="605E5C"/>
+      <w:shd w:val="clear" w:color="auto" w:fill="E1DFDD"/>
+    </w:rPr>
+  </w:style>
+  <w:style w:type="paragraph" w:styleId="Encabezado">
+    <w:name w:val="header"/>
+    <w:basedOn w:val="Normal"/>
+    <w:link w:val="EncabezadoCar"/>
+    <w:uiPriority w:val="99"/>
+    <w:unhideWhenUsed/>
+    <w:rsid w:val="00EE7F74"/>
+    <w:pPr>
+      <w:tabs>
+        <w:tab w:val="center" w:pos="4252"/>
+        <w:tab w:val="right" w:pos="8504"/>
+      </w:tabs>
+      <w:spacing w:after="0" w:line="240" w:lineRule="auto"/>
+    </w:pPr>
+  </w:style>
+  <w:style w:type="character" w:customStyle="1" w:styleId="EncabezadoCar">
+    <w:name w:val="Encabezado Car"/>
+    <w:basedOn w:val="Fuentedeprrafopredeter"/>
+    <w:link w:val="Encabezado"/>
+    <w:uiPriority w:val="99"/>
+    <w:rsid w:val="00EE7F74"/>
+  </w:style>
+  <w:style w:type="paragraph" w:styleId="Piedepgina">
+    <w:name w:val="footer"/>
+    <w:basedOn w:val="Normal"/>
+    <w:link w:val="PiedepginaCar"/>
+    <w:uiPriority w:val="99"/>
+    <w:unhideWhenUsed/>
+    <w:rsid w:val="00EE7F74"/>
+    <w:pPr>
+      <w:tabs>
+        <w:tab w:val="center" w:pos="4252"/>
+        <w:tab w:val="right" w:pos="8504"/>
+      </w:tabs>
+      <w:spacing w:after="0" w:line="240" w:lineRule="auto"/>
+    </w:pPr>
+  </w:style>
+  <w:style w:type="character" w:customStyle="1" w:styleId="PiedepginaCar">
+    <w:name w:val="Pie de página Car"/>
+    <w:basedOn w:val="Fuentedeprrafopredeter"/>
+    <w:link w:val="Piedepgina"/>
+    <w:uiPriority w:val="99"/>
+    <w:rsid w:val="00EE7F74"/>
   </w:style>
 </w:styles>
 </file>

</xml_diff>

<commit_message>
documentos para la memoria
</commit_message>
<xml_diff>
--- a/src/main/resources/static/docs/Memoria_aplicacion.docx
+++ b/src/main/resources/static/docs/Memoria_aplicacion.docx
@@ -951,6 +951,16 @@
           </wp:inline>
         </w:drawing>
       </w:r>
+    </w:p>
+    <w:p>
+      <w:pPr>
+        <w:ind w:firstLine="708"/>
+      </w:pPr>
+    </w:p>
+    <w:p>
+      <w:pPr>
+        <w:ind w:firstLine="708"/>
+      </w:pPr>
     </w:p>
     <w:p>
       <w:r>
@@ -15107,12 +15117,7 @@
       </w:pPr>
     </w:p>
     <w:sectPr>
-      <w:headerReference w:type="even" r:id="rId48"/>
-      <w:headerReference w:type="default" r:id="rId49"/>
-      <w:footerReference w:type="even" r:id="rId50"/>
-      <w:footerReference w:type="default" r:id="rId51"/>
-      <w:headerReference w:type="first" r:id="rId52"/>
-      <w:footerReference w:type="first" r:id="rId53"/>
+      <w:headerReference w:type="default" r:id="rId48"/>
       <w:pgSz w:w="11906" w:h="16838"/>
       <w:pgMar w:top="1417" w:right="1701" w:bottom="1417" w:left="1701" w:header="708" w:footer="708" w:gutter="0"/>
       <w:pgNumType w:start="0"/>
@@ -15149,36 +15154,6 @@
 </w:endnotes>
 </file>
 
-<file path=word/footer1.xml><?xml version="1.0" encoding="utf-8"?>
-<w:ftr xmlns:wpc="http://schemas.microsoft.com/office/word/2010/wordprocessingCanvas" xmlns:cx="http://schemas.microsoft.com/office/drawing/2014/chartex" xmlns:cx1="http://schemas.microsoft.com/office/drawing/2015/9/8/chartex" xmlns:cx2="http://schemas.microsoft.com/office/drawing/2015/10/21/chartex" xmlns:cx3="http://schemas.microsoft.com/office/drawing/2016/5/9/chartex" xmlns:cx4="http://schemas.microsoft.com/office/drawing/2016/5/10/chartex" xmlns:cx5="http://schemas.microsoft.com/office/drawing/2016/5/11/chartex" xmlns:cx6="http://schemas.microsoft.com/office/drawing/2016/5/12/chartex" xmlns:cx7="http://schemas.microsoft.com/office/drawing/2016/5/13/chartex" xmlns:cx8="http://schemas.microsoft.com/office/drawing/2016/5/14/chartex" xmlns:mc="http://schemas.openxmlformats.org/markup-compatibility/2006" xmlns:aink="http://schemas.microsoft.com/office/drawing/2016/ink" xmlns:am3d="http://schemas.microsoft.com/office/drawing/2017/model3d" xmlns:o="urn:schemas-microsoft-com:office:office" xmlns:r="http://schemas.openxmlformats.org/officeDocument/2006/relationships" xmlns:m="http://schemas.openxmlformats.org/officeDocument/2006/math" xmlns:v="urn:schemas-microsoft-com:vml" xmlns:wp14="http://schemas.microsoft.com/office/word/2010/wordprocessingDrawing" xmlns:wp="http://schemas.openxmlformats.org/drawingml/2006/wordprocessingDrawing" xmlns:w10="urn:schemas-microsoft-com:office:word" xmlns:w="http://schemas.openxmlformats.org/wordprocessingml/2006/main" xmlns:w14="http://schemas.microsoft.com/office/word/2010/wordml" xmlns:w15="http://schemas.microsoft.com/office/word/2012/wordml" xmlns:w16cex="http://schemas.microsoft.com/office/word/2018/wordml/cex" xmlns:w16cid="http://schemas.microsoft.com/office/word/2016/wordml/cid" xmlns:w16="http://schemas.microsoft.com/office/word/2018/wordml" xmlns:w16sdtdh="http://schemas.microsoft.com/office/word/2020/wordml/sdtdatahash" xmlns:w16se="http://schemas.microsoft.com/office/word/2015/wordml/symex" xmlns:wpg="http://schemas.microsoft.com/office/word/2010/wordprocessingGroup" xmlns:wpi="http://schemas.microsoft.com/office/word/2010/wordprocessingInk" xmlns:wne="http://schemas.microsoft.com/office/word/2006/wordml" xmlns:wps="http://schemas.microsoft.com/office/word/2010/wordprocessingShape" mc:Ignorable="w14 w15 w16se w16cid w16 w16cex w16sdtdh wp14">
-  <w:p>
-    <w:pPr>
-      <w:pStyle w:val="Piedepgina"/>
-    </w:pPr>
-  </w:p>
-</w:ftr>
-</file>
-
-<file path=word/footer2.xml><?xml version="1.0" encoding="utf-8"?>
-<w:ftr xmlns:wpc="http://schemas.microsoft.com/office/word/2010/wordprocessingCanvas" xmlns:cx="http://schemas.microsoft.com/office/drawing/2014/chartex" xmlns:cx1="http://schemas.microsoft.com/office/drawing/2015/9/8/chartex" xmlns:cx2="http://schemas.microsoft.com/office/drawing/2015/10/21/chartex" xmlns:cx3="http://schemas.microsoft.com/office/drawing/2016/5/9/chartex" xmlns:cx4="http://schemas.microsoft.com/office/drawing/2016/5/10/chartex" xmlns:cx5="http://schemas.microsoft.com/office/drawing/2016/5/11/chartex" xmlns:cx6="http://schemas.microsoft.com/office/drawing/2016/5/12/chartex" xmlns:cx7="http://schemas.microsoft.com/office/drawing/2016/5/13/chartex" xmlns:cx8="http://schemas.microsoft.com/office/drawing/2016/5/14/chartex" xmlns:mc="http://schemas.openxmlformats.org/markup-compatibility/2006" xmlns:aink="http://schemas.microsoft.com/office/drawing/2016/ink" xmlns:am3d="http://schemas.microsoft.com/office/drawing/2017/model3d" xmlns:o="urn:schemas-microsoft-com:office:office" xmlns:r="http://schemas.openxmlformats.org/officeDocument/2006/relationships" xmlns:m="http://schemas.openxmlformats.org/officeDocument/2006/math" xmlns:v="urn:schemas-microsoft-com:vml" xmlns:wp14="http://schemas.microsoft.com/office/word/2010/wordprocessingDrawing" xmlns:wp="http://schemas.openxmlformats.org/drawingml/2006/wordprocessingDrawing" xmlns:w10="urn:schemas-microsoft-com:office:word" xmlns:w="http://schemas.openxmlformats.org/wordprocessingml/2006/main" xmlns:w14="http://schemas.microsoft.com/office/word/2010/wordml" xmlns:w15="http://schemas.microsoft.com/office/word/2012/wordml" xmlns:w16cex="http://schemas.microsoft.com/office/word/2018/wordml/cex" xmlns:w16cid="http://schemas.microsoft.com/office/word/2016/wordml/cid" xmlns:w16="http://schemas.microsoft.com/office/word/2018/wordml" xmlns:w16sdtdh="http://schemas.microsoft.com/office/word/2020/wordml/sdtdatahash" xmlns:w16se="http://schemas.microsoft.com/office/word/2015/wordml/symex" xmlns:wpg="http://schemas.microsoft.com/office/word/2010/wordprocessingGroup" xmlns:wpi="http://schemas.microsoft.com/office/word/2010/wordprocessingInk" xmlns:wne="http://schemas.microsoft.com/office/word/2006/wordml" xmlns:wps="http://schemas.microsoft.com/office/word/2010/wordprocessingShape" mc:Ignorable="w14 w15 w16se w16cid w16 w16cex w16sdtdh wp14">
-  <w:p>
-    <w:pPr>
-      <w:pStyle w:val="Piedepgina"/>
-    </w:pPr>
-  </w:p>
-</w:ftr>
-</file>
-
-<file path=word/footer3.xml><?xml version="1.0" encoding="utf-8"?>
-<w:ftr xmlns:wpc="http://schemas.microsoft.com/office/word/2010/wordprocessingCanvas" xmlns:cx="http://schemas.microsoft.com/office/drawing/2014/chartex" xmlns:cx1="http://schemas.microsoft.com/office/drawing/2015/9/8/chartex" xmlns:cx2="http://schemas.microsoft.com/office/drawing/2015/10/21/chartex" xmlns:cx3="http://schemas.microsoft.com/office/drawing/2016/5/9/chartex" xmlns:cx4="http://schemas.microsoft.com/office/drawing/2016/5/10/chartex" xmlns:cx5="http://schemas.microsoft.com/office/drawing/2016/5/11/chartex" xmlns:cx6="http://schemas.microsoft.com/office/drawing/2016/5/12/chartex" xmlns:cx7="http://schemas.microsoft.com/office/drawing/2016/5/13/chartex" xmlns:cx8="http://schemas.microsoft.com/office/drawing/2016/5/14/chartex" xmlns:mc="http://schemas.openxmlformats.org/markup-compatibility/2006" xmlns:aink="http://schemas.microsoft.com/office/drawing/2016/ink" xmlns:am3d="http://schemas.microsoft.com/office/drawing/2017/model3d" xmlns:o="urn:schemas-microsoft-com:office:office" xmlns:r="http://schemas.openxmlformats.org/officeDocument/2006/relationships" xmlns:m="http://schemas.openxmlformats.org/officeDocument/2006/math" xmlns:v="urn:schemas-microsoft-com:vml" xmlns:wp14="http://schemas.microsoft.com/office/word/2010/wordprocessingDrawing" xmlns:wp="http://schemas.openxmlformats.org/drawingml/2006/wordprocessingDrawing" xmlns:w10="urn:schemas-microsoft-com:office:word" xmlns:w="http://schemas.openxmlformats.org/wordprocessingml/2006/main" xmlns:w14="http://schemas.microsoft.com/office/word/2010/wordml" xmlns:w15="http://schemas.microsoft.com/office/word/2012/wordml" xmlns:w16cex="http://schemas.microsoft.com/office/word/2018/wordml/cex" xmlns:w16cid="http://schemas.microsoft.com/office/word/2016/wordml/cid" xmlns:w16="http://schemas.microsoft.com/office/word/2018/wordml" xmlns:w16sdtdh="http://schemas.microsoft.com/office/word/2020/wordml/sdtdatahash" xmlns:w16se="http://schemas.microsoft.com/office/word/2015/wordml/symex" xmlns:wpg="http://schemas.microsoft.com/office/word/2010/wordprocessingGroup" xmlns:wpi="http://schemas.microsoft.com/office/word/2010/wordprocessingInk" xmlns:wne="http://schemas.microsoft.com/office/word/2006/wordml" xmlns:wps="http://schemas.microsoft.com/office/word/2010/wordprocessingShape" mc:Ignorable="w14 w15 w16se w16cid w16 w16cex w16sdtdh wp14">
-  <w:p>
-    <w:pPr>
-      <w:pStyle w:val="Piedepgina"/>
-    </w:pPr>
-  </w:p>
-</w:ftr>
-</file>
-
 <file path=word/footnotes.xml><?xml version="1.0" encoding="utf-8"?>
 <w:footnotes xmlns:wpc="http://schemas.microsoft.com/office/word/2010/wordprocessingCanvas" xmlns:cx="http://schemas.microsoft.com/office/drawing/2014/chartex" xmlns:cx1="http://schemas.microsoft.com/office/drawing/2015/9/8/chartex" xmlns:cx2="http://schemas.microsoft.com/office/drawing/2015/10/21/chartex" xmlns:cx3="http://schemas.microsoft.com/office/drawing/2016/5/9/chartex" xmlns:cx4="http://schemas.microsoft.com/office/drawing/2016/5/10/chartex" xmlns:cx5="http://schemas.microsoft.com/office/drawing/2016/5/11/chartex" xmlns:cx6="http://schemas.microsoft.com/office/drawing/2016/5/12/chartex" xmlns:cx7="http://schemas.microsoft.com/office/drawing/2016/5/13/chartex" xmlns:cx8="http://schemas.microsoft.com/office/drawing/2016/5/14/chartex" xmlns:mc="http://schemas.openxmlformats.org/markup-compatibility/2006" xmlns:aink="http://schemas.microsoft.com/office/drawing/2016/ink" xmlns:am3d="http://schemas.microsoft.com/office/drawing/2017/model3d" xmlns:o="urn:schemas-microsoft-com:office:office" xmlns:r="http://schemas.openxmlformats.org/officeDocument/2006/relationships" xmlns:m="http://schemas.openxmlformats.org/officeDocument/2006/math" xmlns:v="urn:schemas-microsoft-com:vml" xmlns:wp14="http://schemas.microsoft.com/office/word/2010/wordprocessingDrawing" xmlns:wp="http://schemas.openxmlformats.org/drawingml/2006/wordprocessingDrawing" xmlns:w10="urn:schemas-microsoft-com:office:word" xmlns:w="http://schemas.openxmlformats.org/wordprocessingml/2006/main" xmlns:w14="http://schemas.microsoft.com/office/word/2010/wordml" xmlns:w15="http://schemas.microsoft.com/office/word/2012/wordml" xmlns:w16cex="http://schemas.microsoft.com/office/word/2018/wordml/cex" xmlns:w16cid="http://schemas.microsoft.com/office/word/2016/wordml/cid" xmlns:w16="http://schemas.microsoft.com/office/word/2018/wordml" xmlns:w16sdtdh="http://schemas.microsoft.com/office/word/2020/wordml/sdtdatahash" xmlns:w16se="http://schemas.microsoft.com/office/word/2015/wordml/symex" xmlns:wpg="http://schemas.microsoft.com/office/word/2010/wordprocessingGroup" xmlns:wpi="http://schemas.microsoft.com/office/word/2010/wordprocessingInk" xmlns:wne="http://schemas.microsoft.com/office/word/2006/wordml" xmlns:wps="http://schemas.microsoft.com/office/word/2010/wordprocessingShape" mc:Ignorable="w14 w15 w16se w16cid w16 w16cex w16sdtdh wp14">
   <w:footnote w:type="separator" w:id="-1">
@@ -15210,29 +15185,9 @@
     <w:pPr>
       <w:pStyle w:val="Encabezado"/>
     </w:pPr>
-  </w:p>
-</w:hdr>
-</file>
-
-<file path=word/header2.xml><?xml version="1.0" encoding="utf-8"?>
-<w:hdr xmlns:wpc="http://schemas.microsoft.com/office/word/2010/wordprocessingCanvas" xmlns:cx="http://schemas.microsoft.com/office/drawing/2014/chartex" xmlns:cx1="http://schemas.microsoft.com/office/drawing/2015/9/8/chartex" xmlns:cx2="http://schemas.microsoft.com/office/drawing/2015/10/21/chartex" xmlns:cx3="http://schemas.microsoft.com/office/drawing/2016/5/9/chartex" xmlns:cx4="http://schemas.microsoft.com/office/drawing/2016/5/10/chartex" xmlns:cx5="http://schemas.microsoft.com/office/drawing/2016/5/11/chartex" xmlns:cx6="http://schemas.microsoft.com/office/drawing/2016/5/12/chartex" xmlns:cx7="http://schemas.microsoft.com/office/drawing/2016/5/13/chartex" xmlns:cx8="http://schemas.microsoft.com/office/drawing/2016/5/14/chartex" xmlns:mc="http://schemas.openxmlformats.org/markup-compatibility/2006" xmlns:aink="http://schemas.microsoft.com/office/drawing/2016/ink" xmlns:am3d="http://schemas.microsoft.com/office/drawing/2017/model3d" xmlns:o="urn:schemas-microsoft-com:office:office" xmlns:r="http://schemas.openxmlformats.org/officeDocument/2006/relationships" xmlns:m="http://schemas.openxmlformats.org/officeDocument/2006/math" xmlns:v="urn:schemas-microsoft-com:vml" xmlns:wp14="http://schemas.microsoft.com/office/word/2010/wordprocessingDrawing" xmlns:wp="http://schemas.openxmlformats.org/drawingml/2006/wordprocessingDrawing" xmlns:w10="urn:schemas-microsoft-com:office:word" xmlns:w="http://schemas.openxmlformats.org/wordprocessingml/2006/main" xmlns:w14="http://schemas.microsoft.com/office/word/2010/wordml" xmlns:w15="http://schemas.microsoft.com/office/word/2012/wordml" xmlns:w16cex="http://schemas.microsoft.com/office/word/2018/wordml/cex" xmlns:w16cid="http://schemas.microsoft.com/office/word/2016/wordml/cid" xmlns:w16="http://schemas.microsoft.com/office/word/2018/wordml" xmlns:w16sdtdh="http://schemas.microsoft.com/office/word/2020/wordml/sdtdatahash" xmlns:w16se="http://schemas.microsoft.com/office/word/2015/wordml/symex" xmlns:wpg="http://schemas.microsoft.com/office/word/2010/wordprocessingGroup" xmlns:wpi="http://schemas.microsoft.com/office/word/2010/wordprocessingInk" xmlns:wne="http://schemas.microsoft.com/office/word/2006/wordml" xmlns:wps="http://schemas.microsoft.com/office/word/2010/wordprocessingShape" mc:Ignorable="w14 w15 w16se w16cid w16 w16cex w16sdtdh wp14">
-  <w:p>
-    <w:pPr>
-      <w:pStyle w:val="Encabezado"/>
-    </w:pPr>
     <w:r>
       <w:t>Tecnologías Web. Práctica 2025-2026 Francisco Javier Martínez Sánchez</w:t>
     </w:r>
-  </w:p>
-</w:hdr>
-</file>
-
-<file path=word/header3.xml><?xml version="1.0" encoding="utf-8"?>
-<w:hdr xmlns:wpc="http://schemas.microsoft.com/office/word/2010/wordprocessingCanvas" xmlns:cx="http://schemas.microsoft.com/office/drawing/2014/chartex" xmlns:cx1="http://schemas.microsoft.com/office/drawing/2015/9/8/chartex" xmlns:cx2="http://schemas.microsoft.com/office/drawing/2015/10/21/chartex" xmlns:cx3="http://schemas.microsoft.com/office/drawing/2016/5/9/chartex" xmlns:cx4="http://schemas.microsoft.com/office/drawing/2016/5/10/chartex" xmlns:cx5="http://schemas.microsoft.com/office/drawing/2016/5/11/chartex" xmlns:cx6="http://schemas.microsoft.com/office/drawing/2016/5/12/chartex" xmlns:cx7="http://schemas.microsoft.com/office/drawing/2016/5/13/chartex" xmlns:cx8="http://schemas.microsoft.com/office/drawing/2016/5/14/chartex" xmlns:mc="http://schemas.openxmlformats.org/markup-compatibility/2006" xmlns:aink="http://schemas.microsoft.com/office/drawing/2016/ink" xmlns:am3d="http://schemas.microsoft.com/office/drawing/2017/model3d" xmlns:o="urn:schemas-microsoft-com:office:office" xmlns:r="http://schemas.openxmlformats.org/officeDocument/2006/relationships" xmlns:m="http://schemas.openxmlformats.org/officeDocument/2006/math" xmlns:v="urn:schemas-microsoft-com:vml" xmlns:wp14="http://schemas.microsoft.com/office/word/2010/wordprocessingDrawing" xmlns:wp="http://schemas.openxmlformats.org/drawingml/2006/wordprocessingDrawing" xmlns:w10="urn:schemas-microsoft-com:office:word" xmlns:w="http://schemas.openxmlformats.org/wordprocessingml/2006/main" xmlns:w14="http://schemas.microsoft.com/office/word/2010/wordml" xmlns:w15="http://schemas.microsoft.com/office/word/2012/wordml" xmlns:w16cex="http://schemas.microsoft.com/office/word/2018/wordml/cex" xmlns:w16cid="http://schemas.microsoft.com/office/word/2016/wordml/cid" xmlns:w16="http://schemas.microsoft.com/office/word/2018/wordml" xmlns:w16sdtdh="http://schemas.microsoft.com/office/word/2020/wordml/sdtdatahash" xmlns:w16se="http://schemas.microsoft.com/office/word/2015/wordml/symex" xmlns:wpg="http://schemas.microsoft.com/office/word/2010/wordprocessingGroup" xmlns:wpi="http://schemas.microsoft.com/office/word/2010/wordprocessingInk" xmlns:wne="http://schemas.microsoft.com/office/word/2006/wordml" xmlns:wps="http://schemas.microsoft.com/office/word/2010/wordprocessingShape" mc:Ignorable="w14 w15 w16se w16cid w16 w16cex w16sdtdh wp14">
-  <w:p>
-    <w:pPr>
-      <w:pStyle w:val="Encabezado"/>
-    </w:pPr>
   </w:p>
 </w:hdr>
 </file>

</xml_diff>